<commit_message>
fixed answer divorce action plan template, step docx templates still need formatting but everything is working now
</commit_message>
<xml_diff>
--- a/docassemble/RespondingCaseToEndYourMarriageActionPlan/data/templates/responding_ending_marriage_action_plan.docx
+++ b/docassemble/RespondingCaseToEndYourMarriageActionPlan/data/templates/responding_ending_marriage_action_plan.docx
@@ -512,8 +512,21 @@
               <w:t>{{</w:t>
             </w:r>
             <w:r>
-              <w:t xml:space="preserve"> len(step_list) </w:t>
-            </w:r>
+              <w:t xml:space="preserve"> </w:t>
+            </w:r>
+            <w:proofErr w:type="spellStart"/>
+            <w:r>
+              <w:t>step_list</w:t>
+            </w:r>
+            <w:proofErr w:type="spellEnd"/>
+            <w:r>
+              <w:t xml:space="preserve"> | </w:t>
+            </w:r>
+            <w:r>
+              <w:t xml:space="preserve">length </w:t>
+            </w:r>
+            <w:bookmarkStart w:id="0" w:name="_GoBack"/>
+            <w:bookmarkEnd w:id="0"/>
             <w:r>
               <w:t>}}</w:t>
             </w:r>
@@ -572,7 +585,23 @@
               <w:spacing w:before="0" w:after="0"/>
             </w:pPr>
             <w:r>
-              <w:t>{%tr if user_need == 'answer divorce' and type_of_response['stay married'] %}</w:t>
+              <w:t>{%</w:t>
+            </w:r>
+            <w:proofErr w:type="spellStart"/>
+            <w:r>
+              <w:t>tr</w:t>
+            </w:r>
+            <w:proofErr w:type="spellEnd"/>
+            <w:r>
+              <w:t xml:space="preserve"> if </w:t>
+            </w:r>
+            <w:proofErr w:type="spellStart"/>
+            <w:r>
+              <w:t>user_need</w:t>
+            </w:r>
+            <w:proofErr w:type="spellEnd"/>
+            <w:r>
+              <w:t xml:space="preserve"> == 'answer divorce' and type_of_response['stay married'] %}</w:t>
             </w:r>
           </w:p>
         </w:tc>
@@ -627,13 +656,29 @@
               <w:outlineLvl w:val="1"/>
             </w:pPr>
             <w:r>
-              <w:t>{{ want_help_to_agree</w:t>
+              <w:t>{</w:t>
+            </w:r>
+            <w:proofErr w:type="gramStart"/>
+            <w:r>
+              <w:t xml:space="preserve">{ </w:t>
+            </w:r>
+            <w:proofErr w:type="spellStart"/>
+            <w:r>
+              <w:t>want</w:t>
+            </w:r>
+            <w:proofErr w:type="gramEnd"/>
+            <w:r>
+              <w:t>_help_to_agree</w:t>
             </w:r>
             <w:r>
               <w:t>_</w:t>
             </w:r>
             <w:r>
-              <w:t>step.subject }}</w:t>
+              <w:t>step.subject</w:t>
+            </w:r>
+            <w:proofErr w:type="spellEnd"/>
+            <w:r>
+              <w:t xml:space="preserve"> }}</w:t>
             </w:r>
           </w:p>
         </w:tc>
@@ -667,7 +712,13 @@
               </w:rPr>
             </w:pPr>
             <w:r>
-              <w:t>{{p (include_docx_template("docassemble.AKA2JBranding: want_help_to_agree_content</w:t>
+              <w:t>{{p (include_docx_template</w:t>
+            </w:r>
+            <w:r>
+              <w:t>("docassemble.AKA2JBranding:</w:t>
+            </w:r>
+            <w:r>
+              <w:t>want_help_to_agree_content</w:t>
             </w:r>
             <w:r>
               <w:t>.docx</w:t>
@@ -703,7 +754,23 @@
               <w:spacing w:before="0" w:after="0"/>
             </w:pPr>
             <w:r>
-              <w:t>{%tr endif %}</w:t>
+              <w:t>{%</w:t>
+            </w:r>
+            <w:proofErr w:type="spellStart"/>
+            <w:r>
+              <w:t>tr</w:t>
+            </w:r>
+            <w:proofErr w:type="spellEnd"/>
+            <w:r>
+              <w:t xml:space="preserve"> </w:t>
+            </w:r>
+            <w:proofErr w:type="spellStart"/>
+            <w:r>
+              <w:t>endif</w:t>
+            </w:r>
+            <w:proofErr w:type="spellEnd"/>
+            <w:r>
+              <w:t xml:space="preserve"> %}</w:t>
             </w:r>
           </w:p>
         </w:tc>
@@ -761,7 +828,35 @@
               <w:rPr>
                 <w:shd w:val="clear" w:color="auto" w:fill="FFFFFF"/>
               </w:rPr>
-              <w:t>{%tr if type_of_response['wrong state'] or (type_of_response['case in 2 states'] and stage_of_other_case in('still going', '</w:t>
+              <w:t>{%</w:t>
+            </w:r>
+            <w:proofErr w:type="spellStart"/>
+            <w:r>
+              <w:rPr>
+                <w:shd w:val="clear" w:color="auto" w:fill="FFFFFF"/>
+              </w:rPr>
+              <w:t>tr</w:t>
+            </w:r>
+            <w:proofErr w:type="spellEnd"/>
+            <w:r>
+              <w:rPr>
+                <w:shd w:val="clear" w:color="auto" w:fill="FFFFFF"/>
+              </w:rPr>
+              <w:t xml:space="preserve"> if type_of_response['wrong state'] or (type_of_response['case in 2 states'] and </w:t>
+            </w:r>
+            <w:proofErr w:type="spellStart"/>
+            <w:r>
+              <w:rPr>
+                <w:shd w:val="clear" w:color="auto" w:fill="FFFFFF"/>
+              </w:rPr>
+              <w:t>stage_of_other_case</w:t>
+            </w:r>
+            <w:proofErr w:type="spellEnd"/>
+            <w:r>
+              <w:rPr>
+                <w:shd w:val="clear" w:color="auto" w:fill="FFFFFF"/>
+              </w:rPr>
+              <w:t xml:space="preserve"> in('still going', '</w:t>
             </w:r>
             <w:r>
               <w:rPr>
@@ -803,7 +898,15 @@
               <w:t>Green</w:t>
             </w:r>
             <w:r>
-              <w:t xml:space="preserve"> = thinks wrong place; no other case or (other_case and ongoing == 'no') </w:t>
+              <w:t xml:space="preserve"> = thinks wrong place; no other case or (</w:t>
+            </w:r>
+            <w:proofErr w:type="spellStart"/>
+            <w:r>
+              <w:t>other_case</w:t>
+            </w:r>
+            <w:proofErr w:type="spellEnd"/>
+            <w:r>
+              <w:t xml:space="preserve"> and ongoing == 'no') </w:t>
             </w:r>
           </w:p>
           <w:p>
@@ -860,9 +963,11 @@
                 <w:highlight w:val="white"/>
               </w:rPr>
             </w:pPr>
+            <w:proofErr w:type="spellStart"/>
             <w:r>
               <w:t>answer_jurisdiction_step</w:t>
             </w:r>
+            <w:proofErr w:type="spellEnd"/>
           </w:p>
         </w:tc>
       </w:tr>
@@ -891,17 +996,27 @@
               <w:outlineLvl w:val="1"/>
             </w:pPr>
             <w:r>
-              <w:t>{{</w:t>
+              <w:t>{</w:t>
+            </w:r>
+            <w:proofErr w:type="gramStart"/>
+            <w:r>
+              <w:t>{</w:t>
             </w:r>
             <w:r>
               <w:t xml:space="preserve"> </w:t>
             </w:r>
-            <w:r>
-              <w:t>answer_jurisdiction_ste</w:t>
+            <w:proofErr w:type="spellStart"/>
+            <w:r>
+              <w:t>answer</w:t>
+            </w:r>
+            <w:proofErr w:type="gramEnd"/>
+            <w:r>
+              <w:t>_jurisdiction_ste</w:t>
             </w:r>
             <w:r>
               <w:t>p.subject</w:t>
             </w:r>
+            <w:proofErr w:type="spellEnd"/>
             <w:r>
               <w:t xml:space="preserve"> }}</w:t>
             </w:r>
@@ -984,7 +1099,23 @@
               <w:spacing w:before="0" w:after="0"/>
             </w:pPr>
             <w:r>
-              <w:t>{%tr endif %}</w:t>
+              <w:t>{%</w:t>
+            </w:r>
+            <w:proofErr w:type="spellStart"/>
+            <w:r>
+              <w:t>tr</w:t>
+            </w:r>
+            <w:proofErr w:type="spellEnd"/>
+            <w:r>
+              <w:t xml:space="preserve"> </w:t>
+            </w:r>
+            <w:proofErr w:type="spellStart"/>
+            <w:r>
+              <w:t>endif</w:t>
+            </w:r>
+            <w:proofErr w:type="spellEnd"/>
+            <w:r>
+              <w:t xml:space="preserve"> %}</w:t>
             </w:r>
           </w:p>
         </w:tc>
@@ -1039,7 +1170,15 @@
               <w:spacing w:before="0" w:after="0"/>
             </w:pPr>
             <w:r>
-              <w:t>{%tr if</w:t>
+              <w:t>{%</w:t>
+            </w:r>
+            <w:proofErr w:type="spellStart"/>
+            <w:r>
+              <w:t>tr</w:t>
+            </w:r>
+            <w:proofErr w:type="spellEnd"/>
+            <w:r>
+              <w:t xml:space="preserve"> if</w:t>
             </w:r>
             <w:r>
               <w:t xml:space="preserve"> </w:t>
@@ -1096,9 +1235,11 @@
                 <w:highlight w:val="white"/>
               </w:rPr>
             </w:pPr>
+            <w:proofErr w:type="spellStart"/>
             <w:r>
               <w:t>proper_service_step</w:t>
             </w:r>
+            <w:proofErr w:type="spellEnd"/>
           </w:p>
         </w:tc>
       </w:tr>
@@ -1127,14 +1268,27 @@
               <w:outlineLvl w:val="1"/>
             </w:pPr>
             <w:r>
-              <w:t xml:space="preserve">{{ </w:t>
-            </w:r>
+              <w:t>{</w:t>
+            </w:r>
+            <w:proofErr w:type="gramStart"/>
+            <w:r>
+              <w:t xml:space="preserve">{ </w:t>
+            </w:r>
+            <w:proofErr w:type="spellStart"/>
             <w:r>
               <w:lastRenderedPageBreak/>
-              <w:t>proper_service_step</w:t>
-            </w:r>
-            <w:r>
-              <w:t>.subject }}</w:t>
+              <w:t>proper</w:t>
+            </w:r>
+            <w:proofErr w:type="gramEnd"/>
+            <w:r>
+              <w:t>_service_step</w:t>
+            </w:r>
+            <w:r>
+              <w:t>.subject</w:t>
+            </w:r>
+            <w:proofErr w:type="spellEnd"/>
+            <w:r>
+              <w:t xml:space="preserve"> }}</w:t>
             </w:r>
           </w:p>
         </w:tc>
@@ -1172,7 +1326,7 @@
               <w:t>docassemble.AKA2JBranding:</w:t>
             </w:r>
             <w:r>
-              <w:t>proper_service_step</w:t>
+              <w:t>proper_service</w:t>
             </w:r>
             <w:r>
               <w:t>_content.docx")) }}</w:t>
@@ -1209,7 +1363,23 @@
             </w:pPr>
             <w:r>
               <w:lastRenderedPageBreak/>
-              <w:t>{%tr endif %}</w:t>
+              <w:t>{%</w:t>
+            </w:r>
+            <w:proofErr w:type="spellStart"/>
+            <w:r>
+              <w:t>tr</w:t>
+            </w:r>
+            <w:proofErr w:type="spellEnd"/>
+            <w:r>
+              <w:t xml:space="preserve"> </w:t>
+            </w:r>
+            <w:proofErr w:type="spellStart"/>
+            <w:r>
+              <w:t>endif</w:t>
+            </w:r>
+            <w:proofErr w:type="spellEnd"/>
+            <w:r>
+              <w:t xml:space="preserve"> %}</w:t>
             </w:r>
           </w:p>
         </w:tc>
@@ -1267,16 +1437,29 @@
               </w:rPr>
             </w:pPr>
             <w:r>
-              <w:t>{%tr if</w:t>
+              <w:t>{%</w:t>
+            </w:r>
+            <w:proofErr w:type="spellStart"/>
+            <w:r>
+              <w:t>tr</w:t>
+            </w:r>
+            <w:proofErr w:type="spellEnd"/>
+            <w:r>
+              <w:t xml:space="preserve"> if</w:t>
             </w:r>
             <w:r>
               <w:t xml:space="preserve"> </w:t>
             </w:r>
+            <w:proofErr w:type="spellStart"/>
             <w:r>
               <w:t>type_of_response</w:t>
             </w:r>
             <w:r>
-              <w:t>.all_true('</w:t>
+              <w:t>.all_true</w:t>
+            </w:r>
+            <w:proofErr w:type="spellEnd"/>
+            <w:r>
+              <w:t>('</w:t>
             </w:r>
             <w:r>
               <w:t>improper</w:t>
@@ -1314,9 +1497,11 @@
             <w:pPr>
               <w:pStyle w:val="Body"/>
             </w:pPr>
+            <w:proofErr w:type="spellStart"/>
             <w:r>
               <w:t>decide_after_improper_service_step</w:t>
             </w:r>
+            <w:proofErr w:type="spellEnd"/>
           </w:p>
         </w:tc>
       </w:tr>
@@ -1352,11 +1537,25 @@
                 <w:rFonts w:eastAsia="Calibri"/>
                 <w:shd w:val="clear" w:color="auto" w:fill="FFFFFF"/>
               </w:rPr>
-              <w:t xml:space="preserve">{{ </w:t>
-            </w:r>
-            <w:r>
-              <w:t>decide_after_improper_service_step</w:t>
-            </w:r>
+              <w:t>{</w:t>
+            </w:r>
+            <w:proofErr w:type="gramStart"/>
+            <w:r>
+              <w:rPr>
+                <w:rFonts w:eastAsia="Calibri"/>
+                <w:shd w:val="clear" w:color="auto" w:fill="FFFFFF"/>
+              </w:rPr>
+              <w:t xml:space="preserve">{ </w:t>
+            </w:r>
+            <w:proofErr w:type="spellStart"/>
+            <w:r>
+              <w:t>decide</w:t>
+            </w:r>
+            <w:proofErr w:type="gramEnd"/>
+            <w:r>
+              <w:t>_after_improper_service_step</w:t>
+            </w:r>
+            <w:proofErr w:type="spellEnd"/>
             <w:r>
               <w:t xml:space="preserve"> }}</w:t>
             </w:r>
@@ -1428,7 +1627,23 @@
               <w:spacing w:before="0" w:after="0"/>
             </w:pPr>
             <w:r>
-              <w:t>{%tr endif %}</w:t>
+              <w:t>{%</w:t>
+            </w:r>
+            <w:proofErr w:type="spellStart"/>
+            <w:r>
+              <w:t>tr</w:t>
+            </w:r>
+            <w:proofErr w:type="spellEnd"/>
+            <w:r>
+              <w:t xml:space="preserve"> </w:t>
+            </w:r>
+            <w:proofErr w:type="spellStart"/>
+            <w:r>
+              <w:t>endif</w:t>
+            </w:r>
+            <w:proofErr w:type="spellEnd"/>
+            <w:r>
+              <w:t xml:space="preserve"> %}</w:t>
             </w:r>
           </w:p>
         </w:tc>
@@ -1480,7 +1695,15 @@
               <w:spacing w:before="0" w:after="0"/>
             </w:pPr>
             <w:r>
-              <w:t xml:space="preserve">{%tr </w:t>
+              <w:t>{%</w:t>
+            </w:r>
+            <w:proofErr w:type="spellStart"/>
+            <w:r>
+              <w:t>tr</w:t>
+            </w:r>
+            <w:proofErr w:type="spellEnd"/>
+            <w:r>
+              <w:t xml:space="preserve"> </w:t>
             </w:r>
             <w:r>
               <w:rPr>
@@ -1494,11 +1717,19 @@
               </w:rPr>
               <w:t xml:space="preserve">type_of_response['case in 2 states'] and </w:t>
             </w:r>
+            <w:proofErr w:type="spellStart"/>
             <w:r>
               <w:rPr>
                 <w:rStyle w:val="interviewvariable"/>
               </w:rPr>
-              <w:t>stage_of_other_case == 'still going'</w:t>
+              <w:t>stage_of_other_case</w:t>
+            </w:r>
+            <w:proofErr w:type="spellEnd"/>
+            <w:r>
+              <w:rPr>
+                <w:rStyle w:val="interviewvariable"/>
+              </w:rPr>
+              <w:t xml:space="preserve"> == 'still going'</w:t>
             </w:r>
             <w:r>
               <w:t xml:space="preserve"> %}</w:t>
@@ -1560,10 +1791,22 @@
                 <w:rFonts w:eastAsia="Calibri"/>
                 <w:shd w:val="clear" w:color="auto" w:fill="FFFFFF"/>
               </w:rPr>
-              <w:t xml:space="preserve">{{ </w:t>
-            </w:r>
-            <w:r>
-              <w:t>case_in_2_states_step</w:t>
+              <w:t>{</w:t>
+            </w:r>
+            <w:proofErr w:type="gramStart"/>
+            <w:r>
+              <w:rPr>
+                <w:rFonts w:eastAsia="Calibri"/>
+                <w:shd w:val="clear" w:color="auto" w:fill="FFFFFF"/>
+              </w:rPr>
+              <w:t xml:space="preserve">{ </w:t>
+            </w:r>
+            <w:r>
+              <w:t>case</w:t>
+            </w:r>
+            <w:proofErr w:type="gramEnd"/>
+            <w:r>
+              <w:t>_in_2_states_step</w:t>
             </w:r>
             <w:r>
               <w:t>.subject</w:t>
@@ -1601,13 +1844,18 @@
           <w:p>
             <w:pPr>
               <w:pStyle w:val="Body"/>
-              <w:spacing w:before="0" w:after="0"/>
-            </w:pPr>
-            <w:r>
-              <w:t>{{p (include_docx_template("docassemble.AKA2JBranding:</w:t>
-            </w:r>
-            <w:r>
-              <w:t xml:space="preserve"> case_in_2_states_</w:t>
+            </w:pPr>
+            <w:r>
+              <w:t>{{p (</w:t>
+            </w:r>
+            <w:r>
+              <w:t>include</w:t>
+            </w:r>
+            <w:r>
+              <w:t>_docx_template("docassemble.AKA2JBranding:</w:t>
+            </w:r>
+            <w:r>
+              <w:t>case_in_2_states_</w:t>
             </w:r>
             <w:r>
               <w:t>content.docx")) }}</w:t>
@@ -1640,7 +1888,23 @@
               <w:spacing w:before="0" w:after="0"/>
             </w:pPr>
             <w:r>
-              <w:t>{%tr endif %}</w:t>
+              <w:t>{%</w:t>
+            </w:r>
+            <w:proofErr w:type="spellStart"/>
+            <w:r>
+              <w:t>tr</w:t>
+            </w:r>
+            <w:proofErr w:type="spellEnd"/>
+            <w:r>
+              <w:t xml:space="preserve"> </w:t>
+            </w:r>
+            <w:proofErr w:type="spellStart"/>
+            <w:r>
+              <w:t>endif</w:t>
+            </w:r>
+            <w:proofErr w:type="spellEnd"/>
+            <w:r>
+              <w:t xml:space="preserve"> %}</w:t>
             </w:r>
           </w:p>
         </w:tc>
@@ -1695,7 +1959,21 @@
               <w:rPr>
                 <w:shd w:val="clear" w:color="auto" w:fill="FFFFFF"/>
               </w:rPr>
-              <w:t>{%tr if type_of_response['default'] %}</w:t>
+              <w:t>{%</w:t>
+            </w:r>
+            <w:proofErr w:type="spellStart"/>
+            <w:r>
+              <w:rPr>
+                <w:shd w:val="clear" w:color="auto" w:fill="FFFFFF"/>
+              </w:rPr>
+              <w:t>tr</w:t>
+            </w:r>
+            <w:proofErr w:type="spellEnd"/>
+            <w:r>
+              <w:rPr>
+                <w:shd w:val="clear" w:color="auto" w:fill="FFFFFF"/>
+              </w:rPr>
+              <w:t xml:space="preserve"> if type_of_response['default'] %}</w:t>
             </w:r>
           </w:p>
         </w:tc>
@@ -1719,9 +1997,11 @@
               <w:pStyle w:val="Body"/>
               <w:spacing w:before="0" w:after="0"/>
             </w:pPr>
+            <w:proofErr w:type="spellStart"/>
             <w:r>
               <w:t>default_options_step</w:t>
             </w:r>
+            <w:proofErr w:type="spellEnd"/>
           </w:p>
         </w:tc>
       </w:tr>
@@ -1749,19 +2029,32 @@
               <w:pStyle w:val="Heading2"/>
               <w:outlineLvl w:val="1"/>
             </w:pPr>
-            <w:bookmarkStart w:id="0" w:name="_Hlk226106247"/>
+            <w:bookmarkStart w:id="1" w:name="_Hlk226106247"/>
             <w:r>
               <w:rPr>
                 <w:rFonts w:eastAsia="Calibri"/>
               </w:rPr>
-              <w:t xml:space="preserve">{{ </w:t>
-            </w:r>
-            <w:r>
-              <w:t>default_options_step</w:t>
+              <w:t>{</w:t>
+            </w:r>
+            <w:proofErr w:type="gramStart"/>
+            <w:r>
+              <w:rPr>
+                <w:rFonts w:eastAsia="Calibri"/>
+              </w:rPr>
+              <w:t xml:space="preserve">{ </w:t>
+            </w:r>
+            <w:proofErr w:type="spellStart"/>
+            <w:r>
+              <w:t>default</w:t>
+            </w:r>
+            <w:proofErr w:type="gramEnd"/>
+            <w:r>
+              <w:t>_options_step</w:t>
             </w:r>
             <w:r>
               <w:t>.subject</w:t>
             </w:r>
+            <w:proofErr w:type="spellEnd"/>
             <w:r>
               <w:rPr>
                 <w:rFonts w:eastAsia="Calibri"/>
@@ -1800,15 +2093,15 @@
               <w:t>{{p (include_docx_template("docassemble.AKA2JBranding:</w:t>
             </w:r>
             <w:r>
-              <w:t xml:space="preserve"> default_options _</w:t>
-            </w:r>
-            <w:r>
-              <w:t>content.docx")) }}</w:t>
+              <w:t>default_options_content.docx</w:t>
+            </w:r>
+            <w:r>
+              <w:t>")) }}</w:t>
             </w:r>
           </w:p>
         </w:tc>
       </w:tr>
-      <w:bookmarkEnd w:id="0"/>
+      <w:bookmarkEnd w:id="1"/>
       <w:tr>
         <w:trPr>
           <w:jc w:val="center"/>
@@ -1834,7 +2127,23 @@
               <w:spacing w:before="0" w:after="0"/>
             </w:pPr>
             <w:r>
-              <w:t>{%tr endif %}</w:t>
+              <w:t>{%</w:t>
+            </w:r>
+            <w:proofErr w:type="spellStart"/>
+            <w:r>
+              <w:t>tr</w:t>
+            </w:r>
+            <w:proofErr w:type="spellEnd"/>
+            <w:r>
+              <w:t xml:space="preserve"> </w:t>
+            </w:r>
+            <w:proofErr w:type="spellStart"/>
+            <w:r>
+              <w:t>endif</w:t>
+            </w:r>
+            <w:proofErr w:type="spellEnd"/>
+            <w:r>
+              <w:t xml:space="preserve"> %}</w:t>
             </w:r>
           </w:p>
         </w:tc>
@@ -1888,38 +2197,90 @@
               <w:rPr>
                 <w:color w:val="FF0000"/>
               </w:rPr>
-              <w:t xml:space="preserve">{%tr </w:t>
-            </w:r>
+              <w:t>{%</w:t>
+            </w:r>
+            <w:proofErr w:type="spellStart"/>
             <w:r>
               <w:rPr>
                 <w:color w:val="FF0000"/>
               </w:rPr>
-              <w:t>if user_need == 'answer divorce' and type_of_response['ak divorce case'] and case_type</w:t>
-            </w:r>
+              <w:t>tr</w:t>
+            </w:r>
+            <w:proofErr w:type="spellEnd"/>
             <w:r>
               <w:rPr>
                 <w:color w:val="FF0000"/>
               </w:rPr>
-              <w:t xml:space="preserve"> == 'legal </w:t>
+              <w:t xml:space="preserve"> </w:t>
             </w:r>
             <w:r>
               <w:rPr>
                 <w:color w:val="FF0000"/>
               </w:rPr>
+              <w:t xml:space="preserve">if </w:t>
+            </w:r>
+            <w:proofErr w:type="spellStart"/>
+            <w:r>
+              <w:rPr>
+                <w:color w:val="FF0000"/>
+              </w:rPr>
+              <w:t>user_need</w:t>
+            </w:r>
+            <w:proofErr w:type="spellEnd"/>
+            <w:r>
+              <w:rPr>
+                <w:color w:val="FF0000"/>
+              </w:rPr>
+              <w:t xml:space="preserve"> == 'answer divorce' and type_of_response['</w:t>
+            </w:r>
+            <w:proofErr w:type="spellStart"/>
+            <w:r>
+              <w:rPr>
+                <w:color w:val="FF0000"/>
+              </w:rPr>
+              <w:t>ak</w:t>
+            </w:r>
+            <w:proofErr w:type="spellEnd"/>
+            <w:r>
+              <w:rPr>
+                <w:color w:val="FF0000"/>
+              </w:rPr>
+              <w:t xml:space="preserve"> divorce case'] and </w:t>
+            </w:r>
+            <w:proofErr w:type="spellStart"/>
+            <w:r>
+              <w:rPr>
+                <w:color w:val="FF0000"/>
+              </w:rPr>
+              <w:t>case_type</w:t>
+            </w:r>
+            <w:proofErr w:type="spellEnd"/>
+            <w:r>
+              <w:rPr>
+                <w:color w:val="FF0000"/>
+              </w:rPr>
+              <w:t xml:space="preserve"> == 'legal separation' </w:t>
+            </w:r>
+            <w:r>
+              <w:rPr>
+                <w:color w:val="FF0000"/>
+              </w:rPr>
+              <w:t xml:space="preserve">and </w:t>
+            </w:r>
+            <w:proofErr w:type="spellStart"/>
+            <w:r>
+              <w:rPr>
+                <w:color w:val="FF0000"/>
+              </w:rPr>
               <w:lastRenderedPageBreak/>
-              <w:t xml:space="preserve">separation' </w:t>
-            </w:r>
+              <w:t>want_legal_separation</w:t>
+            </w:r>
+            <w:proofErr w:type="spellEnd"/>
             <w:r>
               <w:rPr>
                 <w:color w:val="FF0000"/>
               </w:rPr>
-              <w:t xml:space="preserve">and </w:t>
-            </w:r>
-            <w:r>
-              <w:rPr>
-                <w:color w:val="FF0000"/>
-              </w:rPr>
-              <w:t>want_legal_separation == '</w:t>
+              <w:t xml:space="preserve"> == '</w:t>
             </w:r>
             <w:r>
               <w:rPr>
@@ -1967,10 +2328,12 @@
               <w:pStyle w:val="Body"/>
               <w:spacing w:before="0" w:after="0"/>
             </w:pPr>
+            <w:proofErr w:type="spellStart"/>
             <w:r>
               <w:lastRenderedPageBreak/>
               <w:t>divorce_legal_separation_diff_step</w:t>
             </w:r>
+            <w:proofErr w:type="spellEnd"/>
           </w:p>
         </w:tc>
       </w:tr>
@@ -2000,13 +2363,26 @@
             </w:pPr>
             <w:r>
               <w:lastRenderedPageBreak/>
-              <w:t xml:space="preserve">{{ </w:t>
-            </w:r>
-            <w:r>
-              <w:t>divorce_legal_separation_diff_step</w:t>
-            </w:r>
-            <w:r>
-              <w:t>.subject }}</w:t>
+              <w:t>{</w:t>
+            </w:r>
+            <w:proofErr w:type="gramStart"/>
+            <w:r>
+              <w:t xml:space="preserve">{ </w:t>
+            </w:r>
+            <w:proofErr w:type="spellStart"/>
+            <w:r>
+              <w:t>divorce</w:t>
+            </w:r>
+            <w:proofErr w:type="gramEnd"/>
+            <w:r>
+              <w:t>_legal_separation_diff_step</w:t>
+            </w:r>
+            <w:r>
+              <w:t>.subject</w:t>
+            </w:r>
+            <w:proofErr w:type="spellEnd"/>
+            <w:r>
+              <w:t xml:space="preserve"> }}</w:t>
             </w:r>
           </w:p>
         </w:tc>
@@ -2076,7 +2452,35 @@
               <w:rPr>
                 <w:color w:val="FF0000"/>
               </w:rPr>
-              <w:t>{% if not minor_children and wife_is_pregnant == 'not pregnant'</w:t>
+              <w:t xml:space="preserve">{% if not </w:t>
+            </w:r>
+            <w:proofErr w:type="spellStart"/>
+            <w:r>
+              <w:rPr>
+                <w:color w:val="FF0000"/>
+              </w:rPr>
+              <w:t>minor_children</w:t>
+            </w:r>
+            <w:proofErr w:type="spellEnd"/>
+            <w:r>
+              <w:rPr>
+                <w:color w:val="FF0000"/>
+              </w:rPr>
+              <w:t xml:space="preserve"> and </w:t>
+            </w:r>
+            <w:proofErr w:type="spellStart"/>
+            <w:r>
+              <w:rPr>
+                <w:color w:val="FF0000"/>
+              </w:rPr>
+              <w:t>wife_is_pregnant</w:t>
+            </w:r>
+            <w:proofErr w:type="spellEnd"/>
+            <w:r>
+              <w:rPr>
+                <w:color w:val="FF0000"/>
+              </w:rPr>
+              <w:t xml:space="preserve"> == 'not pregnant'</w:t>
             </w:r>
             <w:r>
               <w:rPr>
@@ -2175,8 +2579,16 @@
               <w:rPr>
                 <w:color w:val="FF0000"/>
               </w:rPr>
-              <w:t>% endif</w:t>
-            </w:r>
+              <w:t xml:space="preserve">% </w:t>
+            </w:r>
+            <w:proofErr w:type="spellStart"/>
+            <w:r>
+              <w:rPr>
+                <w:color w:val="FF0000"/>
+              </w:rPr>
+              <w:t>endif</w:t>
+            </w:r>
+            <w:proofErr w:type="spellEnd"/>
             <w:r>
               <w:rPr>
                 <w:color w:val="FF0000"/>
@@ -2241,7 +2653,35 @@
               <w:rPr>
                 <w:color w:val="FF0000"/>
               </w:rPr>
-              <w:t>{%tr endif %}</w:t>
+              <w:t>{%</w:t>
+            </w:r>
+            <w:proofErr w:type="spellStart"/>
+            <w:r>
+              <w:rPr>
+                <w:color w:val="FF0000"/>
+              </w:rPr>
+              <w:t>tr</w:t>
+            </w:r>
+            <w:proofErr w:type="spellEnd"/>
+            <w:r>
+              <w:rPr>
+                <w:color w:val="FF0000"/>
+              </w:rPr>
+              <w:t xml:space="preserve"> </w:t>
+            </w:r>
+            <w:proofErr w:type="spellStart"/>
+            <w:r>
+              <w:rPr>
+                <w:color w:val="FF0000"/>
+              </w:rPr>
+              <w:t>endif</w:t>
+            </w:r>
+            <w:proofErr w:type="spellEnd"/>
+            <w:r>
+              <w:rPr>
+                <w:color w:val="FF0000"/>
+              </w:rPr>
+              <w:t xml:space="preserve"> %}</w:t>
             </w:r>
           </w:p>
         </w:tc>
@@ -2300,8 +2740,27 @@
                 <w:sz w:val="20"/>
                 <w:szCs w:val="20"/>
               </w:rPr>
-              <w:t>{%tr if (</w:t>
-            </w:r>
+              <w:t>{%</w:t>
+            </w:r>
+            <w:proofErr w:type="spellStart"/>
+            <w:r>
+              <w:rPr>
+                <w:color w:val="FF0000"/>
+                <w:sz w:val="20"/>
+                <w:szCs w:val="20"/>
+              </w:rPr>
+              <w:t>tr</w:t>
+            </w:r>
+            <w:proofErr w:type="spellEnd"/>
+            <w:r>
+              <w:rPr>
+                <w:color w:val="FF0000"/>
+                <w:sz w:val="20"/>
+                <w:szCs w:val="20"/>
+              </w:rPr>
+              <w:t xml:space="preserve"> if (</w:t>
+            </w:r>
+            <w:proofErr w:type="spellStart"/>
             <w:r>
               <w:rPr>
                 <w:color w:val="34A853"/>
@@ -2310,13 +2769,22 @@
               </w:rPr>
               <w:t>user_need</w:t>
             </w:r>
+            <w:proofErr w:type="spellEnd"/>
             <w:r>
               <w:rPr>
                 <w:color w:val="FF0000"/>
                 <w:sz w:val="20"/>
                 <w:szCs w:val="20"/>
               </w:rPr>
-              <w:t xml:space="preserve"> == </w:t>
+              <w:t xml:space="preserve"> == 'answer divorce' </w:t>
+            </w:r>
+            <w:r>
+              <w:rPr>
+                <w:color w:val="FF9900"/>
+                <w:sz w:val="20"/>
+                <w:szCs w:val="20"/>
+              </w:rPr>
+              <w:t>and</w:t>
             </w:r>
             <w:r>
               <w:rPr>
@@ -2324,8 +2792,7 @@
                 <w:sz w:val="20"/>
                 <w:szCs w:val="20"/>
               </w:rPr>
-              <w:lastRenderedPageBreak/>
-              <w:t xml:space="preserve">'answer divorce' </w:t>
+              <w:t xml:space="preserve"> </w:t>
             </w:r>
             <w:r>
               <w:rPr>
@@ -2333,7 +2800,15 @@
                 <w:sz w:val="20"/>
                 <w:szCs w:val="20"/>
               </w:rPr>
-              <w:t>and</w:t>
+              <w:t>(</w:t>
+            </w:r>
+            <w:r>
+              <w:rPr>
+                <w:color w:val="34A853"/>
+                <w:sz w:val="20"/>
+                <w:szCs w:val="20"/>
+              </w:rPr>
+              <w:t>type_of_response</w:t>
             </w:r>
             <w:r>
               <w:rPr>
@@ -2341,7 +2816,184 @@
                 <w:sz w:val="20"/>
                 <w:szCs w:val="20"/>
               </w:rPr>
+              <w:t xml:space="preserve">['stay married'] </w:t>
+            </w:r>
+            <w:r>
+              <w:rPr>
+                <w:color w:val="34A853"/>
+                <w:sz w:val="20"/>
+                <w:szCs w:val="20"/>
+              </w:rPr>
+              <w:t>or</w:t>
+            </w:r>
+            <w:r>
+              <w:rPr>
+                <w:color w:val="FF0000"/>
+                <w:sz w:val="20"/>
+                <w:szCs w:val="20"/>
+              </w:rPr>
               <w:t xml:space="preserve"> </w:t>
+            </w:r>
+            <w:r>
+              <w:rPr>
+                <w:color w:val="34A853"/>
+                <w:sz w:val="20"/>
+                <w:szCs w:val="20"/>
+              </w:rPr>
+              <w:lastRenderedPageBreak/>
+              <w:t>(type_of_response</w:t>
+            </w:r>
+            <w:r>
+              <w:rPr>
+                <w:color w:val="FF0000"/>
+                <w:sz w:val="20"/>
+                <w:szCs w:val="20"/>
+              </w:rPr>
+              <w:t>[</w:t>
+            </w:r>
+            <w:r>
+              <w:rPr>
+                <w:color w:val="FF0000"/>
+                <w:sz w:val="20"/>
+                <w:szCs w:val="20"/>
+              </w:rPr>
+              <w:t>'</w:t>
+            </w:r>
+            <w:proofErr w:type="spellStart"/>
+            <w:r>
+              <w:rPr>
+                <w:color w:val="FF0000"/>
+                <w:sz w:val="20"/>
+                <w:szCs w:val="20"/>
+              </w:rPr>
+              <w:t>ak</w:t>
+            </w:r>
+            <w:proofErr w:type="spellEnd"/>
+            <w:r>
+              <w:rPr>
+                <w:color w:val="FF0000"/>
+                <w:sz w:val="20"/>
+                <w:szCs w:val="20"/>
+              </w:rPr>
+              <w:t xml:space="preserve"> divorce case'</w:t>
+            </w:r>
+            <w:r>
+              <w:rPr>
+                <w:color w:val="FF0000"/>
+                <w:sz w:val="20"/>
+                <w:szCs w:val="20"/>
+              </w:rPr>
+              <w:t>]</w:t>
+            </w:r>
+            <w:r>
+              <w:rPr>
+                <w:color w:val="FF0000"/>
+                <w:sz w:val="20"/>
+                <w:szCs w:val="20"/>
+              </w:rPr>
+              <w:t xml:space="preserve"> </w:t>
+            </w:r>
+            <w:r>
+              <w:rPr>
+                <w:color w:val="4285F4"/>
+                <w:sz w:val="20"/>
+                <w:szCs w:val="20"/>
+              </w:rPr>
+              <w:t>and</w:t>
+            </w:r>
+            <w:r>
+              <w:rPr>
+                <w:color w:val="FF0000"/>
+                <w:sz w:val="20"/>
+                <w:szCs w:val="20"/>
+              </w:rPr>
+              <w:t xml:space="preserve"> </w:t>
+            </w:r>
+            <w:proofErr w:type="spellStart"/>
+            <w:r>
+              <w:rPr>
+                <w:color w:val="34A853"/>
+                <w:sz w:val="20"/>
+                <w:szCs w:val="20"/>
+              </w:rPr>
+              <w:t>case_type</w:t>
+            </w:r>
+            <w:proofErr w:type="spellEnd"/>
+            <w:r>
+              <w:rPr>
+                <w:color w:val="FF0000"/>
+                <w:sz w:val="20"/>
+                <w:szCs w:val="20"/>
+              </w:rPr>
+              <w:t xml:space="preserve"> == 'legal separation' </w:t>
+            </w:r>
+            <w:r>
+              <w:rPr>
+                <w:color w:val="4285F4"/>
+                <w:sz w:val="20"/>
+                <w:szCs w:val="20"/>
+              </w:rPr>
+              <w:t>and</w:t>
+            </w:r>
+            <w:r>
+              <w:rPr>
+                <w:color w:val="FF0000"/>
+                <w:sz w:val="20"/>
+                <w:szCs w:val="20"/>
+              </w:rPr>
+              <w:t xml:space="preserve"> </w:t>
+            </w:r>
+            <w:proofErr w:type="spellStart"/>
+            <w:r>
+              <w:rPr>
+                <w:color w:val="34A853"/>
+                <w:sz w:val="20"/>
+                <w:szCs w:val="20"/>
+              </w:rPr>
+              <w:t>want_legal_separation</w:t>
+            </w:r>
+            <w:proofErr w:type="spellEnd"/>
+            <w:r>
+              <w:rPr>
+                <w:color w:val="FF0000"/>
+                <w:sz w:val="20"/>
+                <w:szCs w:val="20"/>
+              </w:rPr>
+              <w:t xml:space="preserve"> in('no', 'unsure') </w:t>
+            </w:r>
+            <w:r>
+              <w:rPr>
+                <w:color w:val="4285F4"/>
+                <w:sz w:val="20"/>
+                <w:szCs w:val="20"/>
+              </w:rPr>
+              <w:t>and</w:t>
+            </w:r>
+            <w:r>
+              <w:rPr>
+                <w:color w:val="FF0000"/>
+                <w:sz w:val="20"/>
+                <w:szCs w:val="20"/>
+              </w:rPr>
+              <w:t xml:space="preserve"> </w:t>
+            </w:r>
+            <w:proofErr w:type="spellStart"/>
+            <w:r>
+              <w:rPr>
+                <w:color w:val="34A853"/>
+                <w:sz w:val="20"/>
+                <w:szCs w:val="20"/>
+              </w:rPr>
+              <w:t>want_help_to_agree</w:t>
+            </w:r>
+            <w:proofErr w:type="spellEnd"/>
+            <w:r>
+              <w:rPr>
+                <w:color w:val="34A853"/>
+                <w:sz w:val="20"/>
+                <w:szCs w:val="20"/>
+              </w:rPr>
+              <w:t>)</w:t>
             </w:r>
             <w:r>
               <w:rPr>
@@ -2349,23 +3001,48 @@
                 <w:sz w:val="20"/>
                 <w:szCs w:val="20"/>
               </w:rPr>
-              <w:t>(</w:t>
-            </w:r>
+              <w:t>)</w:t>
+            </w:r>
+            <w:r>
+              <w:rPr>
+                <w:color w:val="FF0000"/>
+                <w:sz w:val="20"/>
+                <w:szCs w:val="20"/>
+              </w:rPr>
+              <w:t>) or (</w:t>
+            </w:r>
+            <w:proofErr w:type="spellStart"/>
             <w:r>
               <w:rPr>
                 <w:color w:val="34A853"/>
                 <w:sz w:val="20"/>
                 <w:szCs w:val="20"/>
               </w:rPr>
-              <w:t>type_of_response</w:t>
-            </w:r>
-            <w:r>
-              <w:rPr>
-                <w:color w:val="FF0000"/>
+              <w:t>user_need</w:t>
+            </w:r>
+            <w:proofErr w:type="spellEnd"/>
+            <w:r>
+              <w:rPr>
+                <w:color w:val="FF9900"/>
                 <w:sz w:val="20"/>
                 <w:szCs w:val="20"/>
               </w:rPr>
-              <w:t xml:space="preserve">['stay married'] </w:t>
+              <w:t xml:space="preserve"> </w:t>
+            </w:r>
+            <w:r>
+              <w:rPr>
+                <w:sz w:val="20"/>
+                <w:szCs w:val="20"/>
+              </w:rPr>
+              <w:t>in('answer custody', 'answer divorce')</w:t>
+            </w:r>
+            <w:r>
+              <w:rPr>
+                <w:color w:val="FF9900"/>
+                <w:sz w:val="20"/>
+                <w:szCs w:val="20"/>
+              </w:rPr>
+              <w:t xml:space="preserve"> and (</w:t>
             </w:r>
             <w:r>
               <w:rPr>
@@ -2373,15 +3050,106 @@
                 <w:sz w:val="20"/>
                 <w:szCs w:val="20"/>
               </w:rPr>
-              <w:t>or</w:t>
-            </w:r>
-            <w:r>
-              <w:rPr>
-                <w:color w:val="FF0000"/>
+              <w:t>type_of_response</w:t>
+            </w:r>
+            <w:r>
+              <w:rPr>
                 <w:sz w:val="20"/>
                 <w:szCs w:val="20"/>
               </w:rPr>
+              <w:t xml:space="preserve">['None'] </w:t>
+            </w:r>
+            <w:r>
+              <w:rPr>
+                <w:color w:val="00B050"/>
+                <w:sz w:val="20"/>
+                <w:szCs w:val="20"/>
+              </w:rPr>
+              <w:t>or</w:t>
+            </w:r>
+            <w:r>
+              <w:rPr>
+                <w:color w:val="92D050"/>
+                <w:sz w:val="20"/>
+                <w:szCs w:val="20"/>
+              </w:rPr>
               <w:t xml:space="preserve"> </w:t>
+            </w:r>
+            <w:r>
+              <w:rPr>
+                <w:color w:val="00B050"/>
+                <w:sz w:val="20"/>
+                <w:szCs w:val="20"/>
+              </w:rPr>
+              <w:t>(</w:t>
+            </w:r>
+            <w:r>
+              <w:rPr>
+                <w:color w:val="00B0F0"/>
+                <w:sz w:val="20"/>
+                <w:szCs w:val="20"/>
+              </w:rPr>
+              <w:t>(</w:t>
+            </w:r>
+            <w:r>
+              <w:rPr>
+                <w:color w:val="9900FF"/>
+                <w:sz w:val="20"/>
+                <w:szCs w:val="20"/>
+              </w:rPr>
+              <w:t>type_of_response</w:t>
+            </w:r>
+            <w:r>
+              <w:rPr>
+                <w:sz w:val="20"/>
+                <w:szCs w:val="20"/>
+              </w:rPr>
+              <w:t>[</w:t>
+            </w:r>
+            <w:r>
+              <w:rPr>
+                <w:sz w:val="20"/>
+                <w:szCs w:val="20"/>
+              </w:rPr>
+              <w:t>'</w:t>
+            </w:r>
+            <w:proofErr w:type="spellStart"/>
+            <w:r>
+              <w:rPr>
+                <w:sz w:val="20"/>
+                <w:szCs w:val="20"/>
+              </w:rPr>
+              <w:t>ak</w:t>
+            </w:r>
+            <w:proofErr w:type="spellEnd"/>
+            <w:r>
+              <w:rPr>
+                <w:sz w:val="20"/>
+                <w:szCs w:val="20"/>
+              </w:rPr>
+              <w:t xml:space="preserve"> custody case'</w:t>
+            </w:r>
+            <w:r>
+              <w:rPr>
+                <w:sz w:val="20"/>
+                <w:szCs w:val="20"/>
+              </w:rPr>
+              <w:t>]</w:t>
+            </w:r>
+            <w:r>
+              <w:rPr>
+                <w:sz w:val="20"/>
+                <w:szCs w:val="20"/>
+              </w:rPr>
+              <w:t xml:space="preserve"> </w:t>
+            </w:r>
+            <w:r>
+              <w:rPr>
+                <w:color w:val="9900FF"/>
+                <w:sz w:val="20"/>
+                <w:szCs w:val="20"/>
+              </w:rPr>
+              <w:t>or (</w:t>
             </w:r>
             <w:r>
               <w:rPr>
@@ -2389,11 +3157,11 @@
                 <w:sz w:val="20"/>
                 <w:szCs w:val="20"/>
               </w:rPr>
-              <w:t>(type_of_response</w:t>
-            </w:r>
-            <w:r>
-              <w:rPr>
-                <w:color w:val="FF0000"/>
+              <w:t>type_of_response</w:t>
+            </w:r>
+            <w:r>
+              <w:rPr>
+                <w:color w:val="34A853"/>
                 <w:sz w:val="20"/>
                 <w:szCs w:val="20"/>
               </w:rPr>
@@ -2401,27 +3169,232 @@
             </w:r>
             <w:r>
               <w:rPr>
-                <w:color w:val="FF0000"/>
                 <w:sz w:val="20"/>
                 <w:szCs w:val="20"/>
               </w:rPr>
-              <w:t>'ak divorce case'</w:t>
-            </w:r>
-            <w:r>
-              <w:rPr>
-                <w:color w:val="FF0000"/>
+              <w:t>'</w:t>
+            </w:r>
+            <w:proofErr w:type="spellStart"/>
+            <w:r>
+              <w:rPr>
                 <w:sz w:val="20"/>
                 <w:szCs w:val="20"/>
               </w:rPr>
-              <w:t>]</w:t>
-            </w:r>
-            <w:r>
-              <w:rPr>
-                <w:color w:val="FF0000"/>
+              <w:t>ak</w:t>
+            </w:r>
+            <w:proofErr w:type="spellEnd"/>
+            <w:r>
+              <w:rPr>
                 <w:sz w:val="20"/>
                 <w:szCs w:val="20"/>
               </w:rPr>
+              <w:t xml:space="preserve"> divorce case'</w:t>
+            </w:r>
+            <w:r>
+              <w:rPr>
+                <w:sz w:val="20"/>
+                <w:szCs w:val="20"/>
+              </w:rPr>
+              <w:t>]</w:t>
+            </w:r>
+            <w:r>
+              <w:rPr>
+                <w:sz w:val="20"/>
+                <w:szCs w:val="20"/>
+              </w:rPr>
+              <w:t xml:space="preserve"> and </w:t>
+            </w:r>
+            <w:proofErr w:type="spellStart"/>
+            <w:r>
+              <w:rPr>
+                <w:color w:val="34A853"/>
+                <w:sz w:val="20"/>
+                <w:szCs w:val="20"/>
+              </w:rPr>
+              <w:t>case_type</w:t>
+            </w:r>
+            <w:proofErr w:type="spellEnd"/>
+            <w:r>
+              <w:rPr>
+                <w:color w:val="34A853"/>
+                <w:sz w:val="20"/>
+                <w:szCs w:val="20"/>
+              </w:rPr>
               <w:t xml:space="preserve"> </w:t>
+            </w:r>
+            <w:r>
+              <w:rPr>
+                <w:sz w:val="20"/>
+                <w:szCs w:val="20"/>
+              </w:rPr>
+              <w:t>== 'divorce'</w:t>
+            </w:r>
+            <w:r>
+              <w:rPr>
+                <w:color w:val="9900FF"/>
+                <w:sz w:val="20"/>
+                <w:szCs w:val="20"/>
+              </w:rPr>
+              <w:t>) or (</w:t>
+            </w:r>
+            <w:r>
+              <w:rPr>
+                <w:color w:val="34A853"/>
+                <w:sz w:val="20"/>
+                <w:szCs w:val="20"/>
+              </w:rPr>
+              <w:t>type_of_response</w:t>
+            </w:r>
+            <w:r>
+              <w:rPr>
+                <w:color w:val="34A853"/>
+                <w:sz w:val="20"/>
+                <w:szCs w:val="20"/>
+              </w:rPr>
+              <w:t>[</w:t>
+            </w:r>
+            <w:r>
+              <w:rPr>
+                <w:sz w:val="20"/>
+                <w:szCs w:val="20"/>
+              </w:rPr>
+              <w:t>'</w:t>
+            </w:r>
+            <w:proofErr w:type="spellStart"/>
+            <w:r>
+              <w:rPr>
+                <w:sz w:val="20"/>
+                <w:szCs w:val="20"/>
+              </w:rPr>
+              <w:t>ak</w:t>
+            </w:r>
+            <w:proofErr w:type="spellEnd"/>
+            <w:r>
+              <w:rPr>
+                <w:sz w:val="20"/>
+                <w:szCs w:val="20"/>
+              </w:rPr>
+              <w:t xml:space="preserve"> divorce case'</w:t>
+            </w:r>
+            <w:r>
+              <w:rPr>
+                <w:sz w:val="20"/>
+                <w:szCs w:val="20"/>
+              </w:rPr>
+              <w:t>]</w:t>
+            </w:r>
+            <w:r>
+              <w:rPr>
+                <w:sz w:val="20"/>
+                <w:szCs w:val="20"/>
+              </w:rPr>
+              <w:t xml:space="preserve"> and </w:t>
+            </w:r>
+            <w:proofErr w:type="spellStart"/>
+            <w:r>
+              <w:rPr>
+                <w:color w:val="34A853"/>
+                <w:sz w:val="20"/>
+                <w:szCs w:val="20"/>
+              </w:rPr>
+              <w:t>case_type</w:t>
+            </w:r>
+            <w:proofErr w:type="spellEnd"/>
+            <w:r>
+              <w:rPr>
+                <w:color w:val="34A853"/>
+                <w:sz w:val="20"/>
+                <w:szCs w:val="20"/>
+              </w:rPr>
+              <w:t xml:space="preserve"> </w:t>
+            </w:r>
+            <w:r>
+              <w:rPr>
+                <w:sz w:val="20"/>
+                <w:szCs w:val="20"/>
+              </w:rPr>
+              <w:t xml:space="preserve">== 'legal separation' and </w:t>
+            </w:r>
+            <w:proofErr w:type="spellStart"/>
+            <w:r>
+              <w:rPr>
+                <w:color w:val="34A853"/>
+                <w:sz w:val="20"/>
+                <w:szCs w:val="20"/>
+              </w:rPr>
+              <w:t>want_legal_separation</w:t>
+            </w:r>
+            <w:proofErr w:type="spellEnd"/>
+            <w:r>
+              <w:rPr>
+                <w:color w:val="34A853"/>
+                <w:sz w:val="20"/>
+                <w:szCs w:val="20"/>
+              </w:rPr>
+              <w:t xml:space="preserve"> </w:t>
+            </w:r>
+            <w:r>
+              <w:rPr>
+                <w:sz w:val="20"/>
+                <w:szCs w:val="20"/>
+              </w:rPr>
+              <w:t>== 'yes'</w:t>
+            </w:r>
+            <w:r>
+              <w:rPr>
+                <w:color w:val="9900FF"/>
+                <w:sz w:val="20"/>
+                <w:szCs w:val="20"/>
+              </w:rPr>
+              <w:t>) or (</w:t>
+            </w:r>
+            <w:r>
+              <w:rPr>
+                <w:color w:val="34A853"/>
+                <w:sz w:val="20"/>
+                <w:szCs w:val="20"/>
+              </w:rPr>
+              <w:t>type_of_response</w:t>
+            </w:r>
+            <w:r>
+              <w:rPr>
+                <w:sz w:val="20"/>
+                <w:szCs w:val="20"/>
+              </w:rPr>
+              <w:t xml:space="preserve">['case in 2 states'] and </w:t>
+            </w:r>
+            <w:proofErr w:type="spellStart"/>
+            <w:r>
+              <w:rPr>
+                <w:color w:val="34A853"/>
+                <w:sz w:val="20"/>
+                <w:szCs w:val="20"/>
+              </w:rPr>
+              <w:t>stage_of_other_case</w:t>
+            </w:r>
+            <w:proofErr w:type="spellEnd"/>
+            <w:r>
+              <w:rPr>
+                <w:color w:val="34A853"/>
+                <w:sz w:val="20"/>
+                <w:szCs w:val="20"/>
+              </w:rPr>
+              <w:t xml:space="preserve"> </w:t>
+            </w:r>
+            <w:r>
+              <w:rPr>
+                <w:sz w:val="20"/>
+                <w:szCs w:val="20"/>
+              </w:rPr>
+              <w:t>== 'ended with no order'</w:t>
+            </w:r>
+            <w:r>
+              <w:rPr>
+                <w:color w:val="9900FF"/>
+                <w:sz w:val="20"/>
+                <w:szCs w:val="20"/>
+              </w:rPr>
+              <w:t>)</w:t>
             </w:r>
             <w:r>
               <w:rPr>
@@ -2429,15 +3402,117 @@
                 <w:sz w:val="20"/>
                 <w:szCs w:val="20"/>
               </w:rPr>
-              <w:t>and</w:t>
-            </w:r>
-            <w:r>
-              <w:rPr>
-                <w:color w:val="FF0000"/>
+              <w:t>)</w:t>
+            </w:r>
+            <w:r>
+              <w:rPr>
+                <w:color w:val="00B050"/>
                 <w:sz w:val="20"/>
                 <w:szCs w:val="20"/>
               </w:rPr>
               <w:t xml:space="preserve"> </w:t>
+            </w:r>
+            <w:r>
+              <w:rPr>
+                <w:color w:val="4285F4"/>
+                <w:sz w:val="20"/>
+                <w:szCs w:val="20"/>
+              </w:rPr>
+              <w:t>and (</w:t>
+            </w:r>
+            <w:proofErr w:type="spellStart"/>
+            <w:r>
+              <w:rPr>
+                <w:color w:val="6AA84F"/>
+                <w:sz w:val="20"/>
+                <w:szCs w:val="20"/>
+              </w:rPr>
+              <w:t>response_to_complaint</w:t>
+            </w:r>
+            <w:proofErr w:type="spellEnd"/>
+            <w:r>
+              <w:rPr>
+                <w:color w:val="6AA84F"/>
+                <w:sz w:val="20"/>
+                <w:szCs w:val="20"/>
+              </w:rPr>
+              <w:t xml:space="preserve"> in('yes', 'some') </w:t>
+            </w:r>
+            <w:r>
+              <w:rPr>
+                <w:color w:val="9900FF"/>
+                <w:sz w:val="20"/>
+                <w:szCs w:val="20"/>
+              </w:rPr>
+              <w:t>or</w:t>
+            </w:r>
+            <w:r>
+              <w:rPr>
+                <w:color w:val="6AA84F"/>
+                <w:sz w:val="20"/>
+                <w:szCs w:val="20"/>
+              </w:rPr>
+              <w:t xml:space="preserve"> </w:t>
+            </w:r>
+            <w:r>
+              <w:rPr>
+                <w:color w:val="7030A0"/>
+                <w:sz w:val="20"/>
+                <w:szCs w:val="20"/>
+              </w:rPr>
+              <w:t>(</w:t>
+            </w:r>
+            <w:proofErr w:type="spellStart"/>
+            <w:r>
+              <w:rPr>
+                <w:color w:val="6AA84F"/>
+                <w:sz w:val="20"/>
+                <w:szCs w:val="20"/>
+              </w:rPr>
+              <w:t>response_to_complaint</w:t>
+            </w:r>
+            <w:proofErr w:type="spellEnd"/>
+            <w:r>
+              <w:rPr>
+                <w:color w:val="6AA84F"/>
+                <w:sz w:val="20"/>
+                <w:szCs w:val="20"/>
+              </w:rPr>
+              <w:t xml:space="preserve"> == 'no' and </w:t>
+            </w:r>
+            <w:proofErr w:type="spellStart"/>
+            <w:r>
+              <w:rPr>
+                <w:color w:val="6AA84F"/>
+                <w:sz w:val="20"/>
+                <w:szCs w:val="20"/>
+              </w:rPr>
+              <w:t>want_help_to_agree</w:t>
+            </w:r>
+            <w:proofErr w:type="spellEnd"/>
+            <w:r>
+              <w:rPr>
+                <w:color w:val="9900FF"/>
+                <w:sz w:val="20"/>
+                <w:szCs w:val="20"/>
+              </w:rPr>
+              <w:t>)</w:t>
+            </w:r>
+            <w:r>
+              <w:rPr>
+                <w:color w:val="4285F4"/>
+                <w:sz w:val="20"/>
+                <w:szCs w:val="20"/>
+              </w:rPr>
+              <w:t>)</w:t>
+            </w:r>
+            <w:r>
+              <w:rPr>
+                <w:color w:val="00B050"/>
+                <w:sz w:val="20"/>
+                <w:szCs w:val="20"/>
+              </w:rPr>
+              <w:t xml:space="preserve">) or </w:t>
             </w:r>
             <w:r>
               <w:rPr>
@@ -2445,31 +3520,7 @@
                 <w:sz w:val="20"/>
                 <w:szCs w:val="20"/>
               </w:rPr>
-              <w:t>case_type</w:t>
-            </w:r>
-            <w:r>
-              <w:rPr>
-                <w:color w:val="FF0000"/>
-                <w:sz w:val="20"/>
-                <w:szCs w:val="20"/>
-              </w:rPr>
-              <w:t xml:space="preserve"> == 'legal separation' </w:t>
-            </w:r>
-            <w:r>
-              <w:rPr>
-                <w:color w:val="4285F4"/>
-                <w:sz w:val="20"/>
-                <w:szCs w:val="20"/>
-              </w:rPr>
-              <w:t>and</w:t>
-            </w:r>
-            <w:r>
-              <w:rPr>
-                <w:color w:val="FF0000"/>
-                <w:sz w:val="20"/>
-                <w:szCs w:val="20"/>
-              </w:rPr>
-              <w:t xml:space="preserve"> </w:t>
+              <w:t>(type_of_response</w:t>
             </w:r>
             <w:r>
               <w:rPr>
@@ -2477,513 +3528,112 @@
                 <w:sz w:val="20"/>
                 <w:szCs w:val="20"/>
               </w:rPr>
-              <w:t>want_legal_separation</w:t>
-            </w:r>
-            <w:r>
-              <w:rPr>
-                <w:color w:val="FF0000"/>
+              <w:t>[</w:t>
+            </w:r>
+            <w:r>
+              <w:rPr>
                 <w:sz w:val="20"/>
                 <w:szCs w:val="20"/>
               </w:rPr>
-              <w:t xml:space="preserve"> in('no', 'unsure') </w:t>
-            </w:r>
-            <w:r>
-              <w:rPr>
-                <w:color w:val="4285F4"/>
+              <w:t>'</w:t>
+            </w:r>
+            <w:proofErr w:type="spellStart"/>
+            <w:r>
+              <w:rPr>
                 <w:sz w:val="20"/>
                 <w:szCs w:val="20"/>
               </w:rPr>
-              <w:t>and</w:t>
-            </w:r>
-            <w:r>
-              <w:rPr>
-                <w:color w:val="FF0000"/>
+              <w:t>ak</w:t>
+            </w:r>
+            <w:proofErr w:type="spellEnd"/>
+            <w:r>
+              <w:rPr>
                 <w:sz w:val="20"/>
                 <w:szCs w:val="20"/>
               </w:rPr>
-              <w:t xml:space="preserve"> </w:t>
-            </w:r>
+              <w:t xml:space="preserve"> divorce case'</w:t>
+            </w:r>
+            <w:r>
+              <w:rPr>
+                <w:sz w:val="20"/>
+                <w:szCs w:val="20"/>
+              </w:rPr>
+              <w:t>]</w:t>
+            </w:r>
+            <w:r>
+              <w:rPr>
+                <w:sz w:val="20"/>
+                <w:szCs w:val="20"/>
+              </w:rPr>
+              <w:t xml:space="preserve"> and </w:t>
+            </w:r>
+            <w:proofErr w:type="spellStart"/>
             <w:r>
               <w:rPr>
                 <w:color w:val="34A853"/>
                 <w:sz w:val="20"/>
                 <w:szCs w:val="20"/>
               </w:rPr>
-              <w:t>want_help_to_agree)</w:t>
-            </w:r>
-            <w:r>
-              <w:rPr>
-                <w:color w:val="FF9900"/>
-                <w:sz w:val="20"/>
-                <w:szCs w:val="20"/>
-              </w:rPr>
-              <w:t>)</w:t>
-            </w:r>
-            <w:r>
-              <w:rPr>
-                <w:color w:val="FF0000"/>
-                <w:sz w:val="20"/>
-                <w:szCs w:val="20"/>
-              </w:rPr>
-              <w:t>) or (</w:t>
-            </w:r>
+              <w:t>case_type</w:t>
+            </w:r>
+            <w:proofErr w:type="spellEnd"/>
             <w:r>
               <w:rPr>
                 <w:color w:val="34A853"/>
                 <w:sz w:val="20"/>
                 <w:szCs w:val="20"/>
               </w:rPr>
-              <w:t>user_need</w:t>
-            </w:r>
-            <w:r>
-              <w:rPr>
-                <w:color w:val="FF9900"/>
+              <w:t xml:space="preserve"> </w:t>
+            </w:r>
+            <w:r>
+              <w:rPr>
                 <w:sz w:val="20"/>
                 <w:szCs w:val="20"/>
               </w:rPr>
-              <w:t xml:space="preserve"> </w:t>
-            </w:r>
-            <w:r>
-              <w:rPr>
-                <w:sz w:val="20"/>
-                <w:szCs w:val="20"/>
-              </w:rPr>
-              <w:t>in('answer custody', 'answer divorce')</w:t>
-            </w:r>
-            <w:r>
-              <w:rPr>
-                <w:color w:val="FF9900"/>
-                <w:sz w:val="20"/>
-                <w:szCs w:val="20"/>
-              </w:rPr>
-              <w:t xml:space="preserve"> and (</w:t>
-            </w:r>
+              <w:t xml:space="preserve">== 'legal separation' and </w:t>
+            </w:r>
+            <w:proofErr w:type="spellStart"/>
             <w:r>
               <w:rPr>
                 <w:color w:val="34A853"/>
                 <w:sz w:val="20"/>
                 <w:szCs w:val="20"/>
               </w:rPr>
-              <w:t>type_of_response</w:t>
-            </w:r>
-            <w:r>
-              <w:rPr>
-                <w:sz w:val="20"/>
-                <w:szCs w:val="20"/>
-              </w:rPr>
-              <w:t xml:space="preserve">['None'] </w:t>
-            </w:r>
-            <w:r>
-              <w:rPr>
-                <w:color w:val="00B050"/>
-                <w:sz w:val="20"/>
-                <w:szCs w:val="20"/>
-              </w:rPr>
-              <w:t>or</w:t>
-            </w:r>
-            <w:r>
-              <w:rPr>
-                <w:color w:val="92D050"/>
-                <w:sz w:val="20"/>
-                <w:szCs w:val="20"/>
-              </w:rPr>
-              <w:t xml:space="preserve"> </w:t>
-            </w:r>
-            <w:r>
-              <w:rPr>
-                <w:color w:val="00B050"/>
-                <w:sz w:val="20"/>
-                <w:szCs w:val="20"/>
-              </w:rPr>
-              <w:t>(</w:t>
-            </w:r>
-            <w:r>
-              <w:rPr>
-                <w:color w:val="00B0F0"/>
-                <w:sz w:val="20"/>
-                <w:szCs w:val="20"/>
-              </w:rPr>
-              <w:t>(</w:t>
-            </w:r>
-            <w:r>
-              <w:rPr>
-                <w:color w:val="9900FF"/>
-                <w:sz w:val="20"/>
-                <w:szCs w:val="20"/>
-              </w:rPr>
-              <w:t>type_of_response</w:t>
-            </w:r>
-            <w:r>
-              <w:rPr>
-                <w:sz w:val="20"/>
-                <w:szCs w:val="20"/>
-              </w:rPr>
-              <w:t>[</w:t>
-            </w:r>
-            <w:r>
-              <w:rPr>
-                <w:sz w:val="20"/>
-                <w:szCs w:val="20"/>
-              </w:rPr>
-              <w:t>'ak custody case'</w:t>
-            </w:r>
-            <w:r>
-              <w:rPr>
-                <w:sz w:val="20"/>
-                <w:szCs w:val="20"/>
-              </w:rPr>
-              <w:t>]</w:t>
-            </w:r>
-            <w:r>
-              <w:rPr>
-                <w:sz w:val="20"/>
-                <w:szCs w:val="20"/>
-              </w:rPr>
-              <w:t xml:space="preserve"> </w:t>
-            </w:r>
-            <w:r>
-              <w:rPr>
-                <w:color w:val="9900FF"/>
-                <w:sz w:val="20"/>
-                <w:szCs w:val="20"/>
-              </w:rPr>
-              <w:t>or (</w:t>
-            </w:r>
+              <w:t>want_legal_separation</w:t>
+            </w:r>
+            <w:proofErr w:type="spellEnd"/>
             <w:r>
               <w:rPr>
                 <w:color w:val="34A853"/>
                 <w:sz w:val="20"/>
                 <w:szCs w:val="20"/>
               </w:rPr>
-              <w:t>type_of_response</w:t>
-            </w:r>
+              <w:t xml:space="preserve"> </w:t>
+            </w:r>
+            <w:r>
+              <w:rPr>
+                <w:sz w:val="20"/>
+                <w:szCs w:val="20"/>
+              </w:rPr>
+              <w:t xml:space="preserve">in('no', 'unsure') and </w:t>
+            </w:r>
+            <w:proofErr w:type="spellStart"/>
             <w:r>
               <w:rPr>
                 <w:color w:val="34A853"/>
                 <w:sz w:val="20"/>
                 <w:szCs w:val="20"/>
               </w:rPr>
-              <w:t>[</w:t>
-            </w:r>
-            <w:r>
-              <w:rPr>
-                <w:sz w:val="20"/>
-                <w:szCs w:val="20"/>
-              </w:rPr>
-              <w:t>'ak divorce case'</w:t>
-            </w:r>
-            <w:r>
-              <w:rPr>
-                <w:sz w:val="20"/>
-                <w:szCs w:val="20"/>
-              </w:rPr>
-              <w:t>]</w:t>
-            </w:r>
-            <w:r>
-              <w:rPr>
-                <w:sz w:val="20"/>
-                <w:szCs w:val="20"/>
-              </w:rPr>
-              <w:t xml:space="preserve"> and </w:t>
-            </w:r>
+              <w:t>want_help_to_agree</w:t>
+            </w:r>
+            <w:proofErr w:type="spellEnd"/>
             <w:r>
               <w:rPr>
                 <w:color w:val="34A853"/>
                 <w:sz w:val="20"/>
                 <w:szCs w:val="20"/>
               </w:rPr>
-              <w:t xml:space="preserve">case_type </w:t>
-            </w:r>
-            <w:r>
-              <w:rPr>
-                <w:sz w:val="20"/>
-                <w:szCs w:val="20"/>
-              </w:rPr>
-              <w:t>== 'divorce'</w:t>
-            </w:r>
-            <w:r>
-              <w:rPr>
-                <w:color w:val="9900FF"/>
-                <w:sz w:val="20"/>
-                <w:szCs w:val="20"/>
-              </w:rPr>
-              <w:t>) or (</w:t>
-            </w:r>
-            <w:r>
-              <w:rPr>
-                <w:color w:val="34A853"/>
-                <w:sz w:val="20"/>
-                <w:szCs w:val="20"/>
-              </w:rPr>
-              <w:t>type_of_response</w:t>
-            </w:r>
-            <w:r>
-              <w:rPr>
-                <w:color w:val="34A853"/>
-                <w:sz w:val="20"/>
-                <w:szCs w:val="20"/>
-              </w:rPr>
-              <w:t>[</w:t>
-            </w:r>
-            <w:r>
-              <w:rPr>
-                <w:sz w:val="20"/>
-                <w:szCs w:val="20"/>
-              </w:rPr>
-              <w:t>'ak divorce case'</w:t>
-            </w:r>
-            <w:r>
-              <w:rPr>
-                <w:sz w:val="20"/>
-                <w:szCs w:val="20"/>
-              </w:rPr>
-              <w:t>]</w:t>
-            </w:r>
-            <w:r>
-              <w:rPr>
-                <w:sz w:val="20"/>
-                <w:szCs w:val="20"/>
-              </w:rPr>
-              <w:t xml:space="preserve"> and </w:t>
-            </w:r>
-            <w:r>
-              <w:rPr>
-                <w:color w:val="34A853"/>
-                <w:sz w:val="20"/>
-                <w:szCs w:val="20"/>
-              </w:rPr>
-              <w:t xml:space="preserve">case_type </w:t>
-            </w:r>
-            <w:r>
-              <w:rPr>
-                <w:sz w:val="20"/>
-                <w:szCs w:val="20"/>
-              </w:rPr>
-              <w:t xml:space="preserve">== 'legal separation' and </w:t>
-            </w:r>
-            <w:r>
-              <w:rPr>
-                <w:color w:val="34A853"/>
-                <w:sz w:val="20"/>
-                <w:szCs w:val="20"/>
-              </w:rPr>
-              <w:t xml:space="preserve">want_legal_separation </w:t>
-            </w:r>
-            <w:r>
-              <w:rPr>
-                <w:sz w:val="20"/>
-                <w:szCs w:val="20"/>
-              </w:rPr>
-              <w:t>== 'yes'</w:t>
-            </w:r>
-            <w:r>
-              <w:rPr>
-                <w:color w:val="9900FF"/>
-                <w:sz w:val="20"/>
-                <w:szCs w:val="20"/>
-              </w:rPr>
-              <w:t>) or (</w:t>
-            </w:r>
-            <w:r>
-              <w:rPr>
-                <w:color w:val="34A853"/>
-                <w:sz w:val="20"/>
-                <w:szCs w:val="20"/>
-              </w:rPr>
-              <w:t>type_of_response</w:t>
-            </w:r>
-            <w:r>
-              <w:rPr>
-                <w:sz w:val="20"/>
-                <w:szCs w:val="20"/>
-              </w:rPr>
-              <w:t xml:space="preserve">['case in 2 states'] and </w:t>
-            </w:r>
-            <w:r>
-              <w:rPr>
-                <w:color w:val="34A853"/>
-                <w:sz w:val="20"/>
-                <w:szCs w:val="20"/>
-              </w:rPr>
-              <w:t xml:space="preserve">stage_of_other_case </w:t>
-            </w:r>
-            <w:r>
-              <w:rPr>
-                <w:sz w:val="20"/>
-                <w:szCs w:val="20"/>
-              </w:rPr>
-              <w:t>== 'ended with no order'</w:t>
-            </w:r>
-            <w:r>
-              <w:rPr>
-                <w:color w:val="9900FF"/>
-                <w:sz w:val="20"/>
-                <w:szCs w:val="20"/>
-              </w:rPr>
               <w:t>)</w:t>
-            </w:r>
-            <w:r>
-              <w:rPr>
-                <w:color w:val="4285F4"/>
-                <w:sz w:val="20"/>
-                <w:szCs w:val="20"/>
-              </w:rPr>
-              <w:t>)</w:t>
-            </w:r>
-            <w:r>
-              <w:rPr>
-                <w:color w:val="00B050"/>
-                <w:sz w:val="20"/>
-                <w:szCs w:val="20"/>
-              </w:rPr>
-              <w:t xml:space="preserve"> </w:t>
-            </w:r>
-            <w:r>
-              <w:rPr>
-                <w:color w:val="4285F4"/>
-                <w:sz w:val="20"/>
-                <w:szCs w:val="20"/>
-              </w:rPr>
-              <w:t>and (</w:t>
-            </w:r>
-            <w:r>
-              <w:rPr>
-                <w:color w:val="6AA84F"/>
-                <w:sz w:val="20"/>
-                <w:szCs w:val="20"/>
-              </w:rPr>
-              <w:t xml:space="preserve">response_to_complaint in('yes', 'some') </w:t>
-            </w:r>
-            <w:r>
-              <w:rPr>
-                <w:color w:val="9900FF"/>
-                <w:sz w:val="20"/>
-                <w:szCs w:val="20"/>
-              </w:rPr>
-              <w:t>or</w:t>
-            </w:r>
-            <w:r>
-              <w:rPr>
-                <w:color w:val="6AA84F"/>
-                <w:sz w:val="20"/>
-                <w:szCs w:val="20"/>
-              </w:rPr>
-              <w:t xml:space="preserve"> </w:t>
-            </w:r>
-            <w:r>
-              <w:rPr>
-                <w:color w:val="7030A0"/>
-                <w:sz w:val="20"/>
-                <w:szCs w:val="20"/>
-              </w:rPr>
-              <w:t>(</w:t>
-            </w:r>
-            <w:r>
-              <w:rPr>
-                <w:color w:val="6AA84F"/>
-                <w:sz w:val="20"/>
-                <w:szCs w:val="20"/>
-              </w:rPr>
-              <w:t>response_to_complaint == 'no' and want_help_to_agree</w:t>
-            </w:r>
-            <w:r>
-              <w:rPr>
-                <w:color w:val="9900FF"/>
-                <w:sz w:val="20"/>
-                <w:szCs w:val="20"/>
-              </w:rPr>
-              <w:t>)</w:t>
-            </w:r>
-            <w:r>
-              <w:rPr>
-                <w:color w:val="4285F4"/>
-                <w:sz w:val="20"/>
-                <w:szCs w:val="20"/>
-              </w:rPr>
-              <w:t>)</w:t>
-            </w:r>
-            <w:r>
-              <w:rPr>
-                <w:color w:val="00B050"/>
-                <w:sz w:val="20"/>
-                <w:szCs w:val="20"/>
-              </w:rPr>
-              <w:t xml:space="preserve">) or </w:t>
-            </w:r>
-            <w:r>
-              <w:rPr>
-                <w:color w:val="34A853"/>
-                <w:sz w:val="20"/>
-                <w:szCs w:val="20"/>
-              </w:rPr>
-              <w:t>(type_of_response</w:t>
-            </w:r>
-            <w:r>
-              <w:rPr>
-                <w:color w:val="34A853"/>
-                <w:sz w:val="20"/>
-                <w:szCs w:val="20"/>
-              </w:rPr>
-              <w:t>[</w:t>
-            </w:r>
-            <w:r>
-              <w:rPr>
-                <w:sz w:val="20"/>
-                <w:szCs w:val="20"/>
-              </w:rPr>
-              <w:t>'ak divorce case'</w:t>
-            </w:r>
-            <w:r>
-              <w:rPr>
-                <w:sz w:val="20"/>
-                <w:szCs w:val="20"/>
-              </w:rPr>
-              <w:t>]</w:t>
-            </w:r>
-            <w:r>
-              <w:rPr>
-                <w:sz w:val="20"/>
-                <w:szCs w:val="20"/>
-              </w:rPr>
-              <w:t xml:space="preserve"> and </w:t>
-            </w:r>
-            <w:r>
-              <w:rPr>
-                <w:color w:val="34A853"/>
-                <w:sz w:val="20"/>
-                <w:szCs w:val="20"/>
-              </w:rPr>
-              <w:t xml:space="preserve">case_type </w:t>
-            </w:r>
-            <w:r>
-              <w:rPr>
-                <w:sz w:val="20"/>
-                <w:szCs w:val="20"/>
-              </w:rPr>
-              <w:t xml:space="preserve">== 'legal separation' and </w:t>
-            </w:r>
-            <w:r>
-              <w:rPr>
-                <w:color w:val="34A853"/>
-                <w:sz w:val="20"/>
-                <w:szCs w:val="20"/>
-              </w:rPr>
-              <w:t xml:space="preserve">want_legal_separation </w:t>
-            </w:r>
-            <w:r>
-              <w:rPr>
-                <w:sz w:val="20"/>
-                <w:szCs w:val="20"/>
-              </w:rPr>
-              <w:t xml:space="preserve">in('no', 'unsure') and </w:t>
-            </w:r>
-            <w:r>
-              <w:rPr>
-                <w:color w:val="34A853"/>
-                <w:sz w:val="20"/>
-                <w:szCs w:val="20"/>
-              </w:rPr>
-              <w:t>want_help_to_agree)</w:t>
             </w:r>
             <w:r>
               <w:rPr>
@@ -3022,10 +3672,12 @@
             <w:pPr>
               <w:pStyle w:val="Body"/>
             </w:pPr>
+            <w:proofErr w:type="spellStart"/>
             <w:r>
               <w:lastRenderedPageBreak/>
               <w:t>want_help_to_agree_step</w:t>
             </w:r>
+            <w:proofErr w:type="spellEnd"/>
           </w:p>
         </w:tc>
       </w:tr>
@@ -3055,13 +3707,29 @@
             </w:pPr>
             <w:r>
               <w:lastRenderedPageBreak/>
-              <w:t>{{ want_help_to_agree</w:t>
+              <w:t>{</w:t>
+            </w:r>
+            <w:proofErr w:type="gramStart"/>
+            <w:r>
+              <w:t xml:space="preserve">{ </w:t>
+            </w:r>
+            <w:proofErr w:type="spellStart"/>
+            <w:r>
+              <w:t>want</w:t>
+            </w:r>
+            <w:proofErr w:type="gramEnd"/>
+            <w:r>
+              <w:t>_help_to_agree</w:t>
             </w:r>
             <w:r>
               <w:t>_</w:t>
             </w:r>
             <w:r>
-              <w:t>step.subject }}</w:t>
+              <w:t>step.subject</w:t>
+            </w:r>
+            <w:proofErr w:type="spellEnd"/>
+            <w:r>
+              <w:t xml:space="preserve"> }}</w:t>
             </w:r>
           </w:p>
         </w:tc>
@@ -3091,7 +3759,13 @@
               <w:pStyle w:val="Body"/>
             </w:pPr>
             <w:r>
-              <w:t>{{p (include_docx_template("docassemble.AKA2JBranding: want_help_to_agree_content</w:t>
+              <w:t>{{p (include_docx_template("docassemble.</w:t>
+            </w:r>
+            <w:r>
+              <w:t>AKA2JBranding:</w:t>
+            </w:r>
+            <w:r>
+              <w:t>want_help_to_agree_content</w:t>
             </w:r>
             <w:r>
               <w:t>.docx</w:t>
@@ -3126,7 +3800,23 @@
               <w:pStyle w:val="Body"/>
             </w:pPr>
             <w:r>
-              <w:t>{%tr endif %}</w:t>
+              <w:t>{%</w:t>
+            </w:r>
+            <w:proofErr w:type="spellStart"/>
+            <w:r>
+              <w:t>tr</w:t>
+            </w:r>
+            <w:proofErr w:type="spellEnd"/>
+            <w:r>
+              <w:t xml:space="preserve"> </w:t>
+            </w:r>
+            <w:proofErr w:type="spellStart"/>
+            <w:r>
+              <w:t>endif</w:t>
+            </w:r>
+            <w:proofErr w:type="spellEnd"/>
+            <w:r>
+              <w:t xml:space="preserve"> %}</w:t>
             </w:r>
           </w:p>
         </w:tc>
@@ -3180,13 +3870,35 @@
               <w:rPr>
                 <w:color w:val="FF0000"/>
               </w:rPr>
-              <w:t>{%tr if (</w:t>
-            </w:r>
+              <w:t>{%</w:t>
+            </w:r>
+            <w:proofErr w:type="spellStart"/>
+            <w:r>
+              <w:rPr>
+                <w:color w:val="FF0000"/>
+              </w:rPr>
+              <w:t>tr</w:t>
+            </w:r>
+            <w:proofErr w:type="spellEnd"/>
+            <w:r>
+              <w:rPr>
+                <w:color w:val="FF0000"/>
+              </w:rPr>
+              <w:t xml:space="preserve"> if (</w:t>
+            </w:r>
+            <w:proofErr w:type="spellStart"/>
             <w:r>
               <w:rPr>
                 <w:color w:val="FFC000"/>
               </w:rPr>
-              <w:t>user_need ==</w:t>
+              <w:t>user_need</w:t>
+            </w:r>
+            <w:proofErr w:type="spellEnd"/>
+            <w:r>
+              <w:rPr>
+                <w:color w:val="FFC000"/>
+              </w:rPr>
+              <w:t xml:space="preserve"> ==</w:t>
             </w:r>
             <w:r>
               <w:rPr>
@@ -3216,182 +3928,240 @@
               <w:rPr>
                 <w:color w:val="92D050"/>
               </w:rPr>
-              <w:t xml:space="preserve">'ak </w:t>
-            </w:r>
+              <w:t>'</w:t>
+            </w:r>
+            <w:proofErr w:type="spellStart"/>
             <w:r>
               <w:rPr>
                 <w:color w:val="92D050"/>
               </w:rPr>
+              <w:t>ak</w:t>
+            </w:r>
+            <w:proofErr w:type="spellEnd"/>
+            <w:r>
+              <w:rPr>
+                <w:color w:val="92D050"/>
+              </w:rPr>
+              <w:t xml:space="preserve"> divorce case'</w:t>
+            </w:r>
+            <w:r>
+              <w:rPr>
+                <w:color w:val="92D050"/>
+              </w:rPr>
+              <w:t>] or (</w:t>
+            </w:r>
+            <w:r>
+              <w:rPr>
+                <w:color w:val="00B050"/>
+              </w:rPr>
+              <w:t>type_of_response['wrong state'] an</w:t>
+            </w:r>
+            <w:r>
+              <w:rPr>
+                <w:color w:val="00B050"/>
+              </w:rPr>
+              <w:t xml:space="preserve">d not </w:t>
+            </w:r>
+            <w:r>
+              <w:rPr>
+                <w:color w:val="00B050"/>
+              </w:rPr>
               <w:lastRenderedPageBreak/>
-              <w:t>divorce case'</w:t>
+              <w:t>residency</w:t>
             </w:r>
             <w:r>
               <w:rPr>
                 <w:color w:val="92D050"/>
               </w:rPr>
-              <w:t>] or (</w:t>
+              <w:t>)</w:t>
+            </w:r>
+            <w:r>
+              <w:rPr>
+                <w:color w:val="FFC000"/>
+              </w:rPr>
+              <w:t>)</w:t>
+            </w:r>
+            <w:r>
+              <w:rPr>
+                <w:color w:val="FF0000"/>
+              </w:rPr>
+              <w:t>) or (</w:t>
+            </w:r>
+            <w:proofErr w:type="spellStart"/>
+            <w:r>
+              <w:rPr>
+                <w:color w:val="FFC000"/>
+              </w:rPr>
+              <w:t>user_need</w:t>
+            </w:r>
+            <w:proofErr w:type="spellEnd"/>
+            <w:r>
+              <w:rPr>
+                <w:color w:val="FFC000"/>
+              </w:rPr>
+              <w:t xml:space="preserve"> ==</w:t>
+            </w:r>
+            <w:r>
+              <w:rPr>
+                <w:color w:val="FF0000"/>
+              </w:rPr>
+              <w:t xml:space="preserve"> </w:t>
+            </w:r>
+            <w:r>
+              <w:rPr>
+                <w:color w:val="FFC000"/>
+              </w:rPr>
+              <w:t xml:space="preserve">'answer </w:t>
+            </w:r>
+            <w:r>
+              <w:rPr>
+                <w:color w:val="FFC000"/>
+              </w:rPr>
+              <w:t>custody</w:t>
+            </w:r>
+            <w:r>
+              <w:rPr>
+                <w:color w:val="FFC000"/>
+              </w:rPr>
+              <w:t xml:space="preserve">' and </w:t>
+            </w:r>
+            <w:r>
+              <w:rPr>
+                <w:color w:val="FFC000"/>
+              </w:rPr>
+              <w:t>t</w:t>
+            </w:r>
+            <w:r>
+              <w:rPr>
+                <w:color w:val="FFC000"/>
+              </w:rPr>
+              <w:t>ype_of_response['</w:t>
+            </w:r>
+            <w:proofErr w:type="spellStart"/>
+            <w:r>
+              <w:rPr>
+                <w:color w:val="FFC000"/>
+              </w:rPr>
+              <w:t>ak</w:t>
+            </w:r>
+            <w:proofErr w:type="spellEnd"/>
+            <w:r>
+              <w:rPr>
+                <w:color w:val="FFC000"/>
+              </w:rPr>
+              <w:t xml:space="preserve"> custody case']</w:t>
+            </w:r>
+            <w:r>
+              <w:rPr>
+                <w:color w:val="FF0000"/>
+              </w:rPr>
+              <w:t>)</w:t>
+            </w:r>
+            <w:r>
+              <w:rPr>
+                <w:color w:val="92D050"/>
+              </w:rPr>
+              <w:t xml:space="preserve"> </w:t>
+            </w:r>
+            <w:r>
+              <w:rPr>
+                <w:color w:val="FF0000"/>
+              </w:rPr>
+              <w:t>or (</w:t>
+            </w:r>
+            <w:proofErr w:type="spellStart"/>
+            <w:r>
+              <w:rPr>
+                <w:color w:val="FFC000"/>
+              </w:rPr>
+              <w:t>user_need</w:t>
+            </w:r>
+            <w:proofErr w:type="spellEnd"/>
+            <w:r>
+              <w:rPr>
+                <w:color w:val="FFC000"/>
+              </w:rPr>
+              <w:t xml:space="preserve"> </w:t>
+            </w:r>
+            <w:r>
+              <w:rPr>
+                <w:color w:val="FFC000"/>
+              </w:rPr>
+              <w:t>in(</w:t>
+            </w:r>
+            <w:r>
+              <w:rPr>
+                <w:color w:val="FFC000"/>
+              </w:rPr>
+              <w:t>'answer divorce'</w:t>
+            </w:r>
+            <w:r>
+              <w:rPr>
+                <w:color w:val="FFC000"/>
+              </w:rPr>
+              <w:t>,</w:t>
+            </w:r>
+            <w:r>
+              <w:rPr>
+                <w:color w:val="FFC000"/>
+              </w:rPr>
+              <w:t xml:space="preserve"> 'answer </w:t>
+            </w:r>
+            <w:r>
+              <w:rPr>
+                <w:color w:val="FFC000"/>
+              </w:rPr>
+              <w:t>custody</w:t>
+            </w:r>
+            <w:r>
+              <w:rPr>
+                <w:color w:val="FFC000"/>
+              </w:rPr>
+              <w:t>'</w:t>
+            </w:r>
+            <w:r>
+              <w:rPr>
+                <w:color w:val="FFC000"/>
+              </w:rPr>
+              <w:t>) and (</w:t>
+            </w:r>
+            <w:r>
+              <w:rPr>
+                <w:color w:val="92D050"/>
+              </w:rPr>
+              <w:t>(</w:t>
+            </w:r>
+            <w:r>
+              <w:rPr>
+                <w:color w:val="FFC000"/>
+              </w:rPr>
+              <w:t xml:space="preserve"> </w:t>
+            </w:r>
+            <w:r>
+              <w:rPr>
+                <w:color w:val="92D050"/>
+              </w:rPr>
+              <w:t xml:space="preserve"> </w:t>
             </w:r>
             <w:r>
               <w:rPr>
                 <w:color w:val="00B050"/>
               </w:rPr>
-              <w:t>type_of_response['wrong state'] an</w:t>
-            </w:r>
+              <w:t xml:space="preserve">type_of_response['case in 2 states']  and </w:t>
+            </w:r>
+            <w:proofErr w:type="spellStart"/>
             <w:r>
               <w:rPr>
                 <w:color w:val="00B050"/>
               </w:rPr>
-              <w:t>d not residency</w:t>
-            </w:r>
-            <w:r>
-              <w:rPr>
-                <w:color w:val="92D050"/>
-              </w:rPr>
-              <w:t>)</w:t>
-            </w:r>
-            <w:r>
-              <w:rPr>
-                <w:color w:val="FFC000"/>
-              </w:rPr>
-              <w:t>)</w:t>
-            </w:r>
-            <w:r>
-              <w:rPr>
-                <w:color w:val="FF0000"/>
-              </w:rPr>
-              <w:t>) or (</w:t>
-            </w:r>
-            <w:r>
-              <w:rPr>
-                <w:color w:val="FFC000"/>
-              </w:rPr>
-              <w:t>user_need ==</w:t>
-            </w:r>
-            <w:r>
-              <w:rPr>
-                <w:color w:val="FF0000"/>
-              </w:rPr>
-              <w:t xml:space="preserve"> </w:t>
-            </w:r>
-            <w:r>
-              <w:rPr>
-                <w:color w:val="FFC000"/>
-              </w:rPr>
-              <w:t xml:space="preserve">'answer </w:t>
-            </w:r>
-            <w:r>
-              <w:rPr>
-                <w:color w:val="FFC000"/>
-              </w:rPr>
-              <w:t>custody</w:t>
-            </w:r>
-            <w:r>
-              <w:rPr>
-                <w:color w:val="FFC000"/>
-              </w:rPr>
-              <w:t xml:space="preserve">' and </w:t>
-            </w:r>
-            <w:r>
-              <w:rPr>
-                <w:color w:val="FFC000"/>
-              </w:rPr>
-              <w:t>t</w:t>
-            </w:r>
-            <w:r>
-              <w:rPr>
-                <w:color w:val="FFC000"/>
-              </w:rPr>
-              <w:t>ype_of_response['ak custody case']</w:t>
-            </w:r>
-            <w:r>
-              <w:rPr>
-                <w:color w:val="FF0000"/>
-              </w:rPr>
-              <w:t>)</w:t>
-            </w:r>
-            <w:r>
-              <w:rPr>
-                <w:color w:val="92D050"/>
-              </w:rPr>
-              <w:t xml:space="preserve"> </w:t>
-            </w:r>
-            <w:r>
-              <w:rPr>
-                <w:color w:val="FF0000"/>
-              </w:rPr>
-              <w:t>or (</w:t>
-            </w:r>
-            <w:r>
-              <w:rPr>
-                <w:color w:val="FFC000"/>
-              </w:rPr>
-              <w:t xml:space="preserve">user_need </w:t>
-            </w:r>
-            <w:r>
-              <w:rPr>
-                <w:color w:val="FFC000"/>
-              </w:rPr>
-              <w:t>in(</w:t>
-            </w:r>
-            <w:r>
-              <w:rPr>
-                <w:color w:val="FFC000"/>
-              </w:rPr>
-              <w:t>'answer divorce'</w:t>
-            </w:r>
-            <w:r>
-              <w:rPr>
-                <w:color w:val="FFC000"/>
-              </w:rPr>
-              <w:t>,</w:t>
-            </w:r>
-            <w:r>
-              <w:rPr>
-                <w:color w:val="FFC000"/>
-              </w:rPr>
-              <w:t xml:space="preserve"> 'answer </w:t>
-            </w:r>
-            <w:r>
-              <w:rPr>
-                <w:color w:val="FFC000"/>
-              </w:rPr>
-              <w:t>custody</w:t>
-            </w:r>
-            <w:r>
-              <w:rPr>
-                <w:color w:val="FFC000"/>
-              </w:rPr>
-              <w:t>'</w:t>
-            </w:r>
-            <w:r>
-              <w:rPr>
-                <w:color w:val="FFC000"/>
-              </w:rPr>
-              <w:t>) and (</w:t>
-            </w:r>
-            <w:r>
-              <w:rPr>
-                <w:color w:val="92D050"/>
-              </w:rPr>
-              <w:t>(</w:t>
-            </w:r>
-            <w:r>
-              <w:rPr>
-                <w:color w:val="FFC000"/>
-              </w:rPr>
-              <w:t xml:space="preserve"> </w:t>
-            </w:r>
-            <w:r>
-              <w:rPr>
-                <w:color w:val="92D050"/>
-              </w:rPr>
-              <w:t xml:space="preserve"> </w:t>
-            </w:r>
+              <w:t>stage_of_other_case</w:t>
+            </w:r>
+            <w:proofErr w:type="spellEnd"/>
             <w:r>
               <w:rPr>
                 <w:color w:val="00B050"/>
               </w:rPr>
-              <w:t>type_of_response['case in 2 states']  and stage_of_other_case in('still going', 'ended with order'</w:t>
+              <w:t xml:space="preserve"> in('still going', 'ended with order'</w:t>
             </w:r>
             <w:r>
               <w:rPr>
@@ -3468,10 +4238,12 @@
             <w:pPr>
               <w:pStyle w:val="Body"/>
             </w:pPr>
+            <w:proofErr w:type="spellStart"/>
             <w:r>
               <w:lastRenderedPageBreak/>
               <w:t>answer_step</w:t>
             </w:r>
+            <w:proofErr w:type="spellEnd"/>
           </w:p>
         </w:tc>
       </w:tr>
@@ -3499,11 +4271,27 @@
               <w:pStyle w:val="Heading2"/>
               <w:outlineLvl w:val="1"/>
             </w:pPr>
-            <w:bookmarkStart w:id="1" w:name="_Step_8:_Fill"/>
-            <w:bookmarkEnd w:id="1"/>
+            <w:bookmarkStart w:id="2" w:name="_Step_8:_Fill"/>
+            <w:bookmarkEnd w:id="2"/>
             <w:r>
               <w:lastRenderedPageBreak/>
-              <w:t>{{ answer_step.subject }}</w:t>
+              <w:t>{</w:t>
+            </w:r>
+            <w:proofErr w:type="gramStart"/>
+            <w:r>
+              <w:t xml:space="preserve">{ </w:t>
+            </w:r>
+            <w:proofErr w:type="spellStart"/>
+            <w:r>
+              <w:t>answer</w:t>
+            </w:r>
+            <w:proofErr w:type="gramEnd"/>
+            <w:r>
+              <w:t>_step.subject</w:t>
+            </w:r>
+            <w:proofErr w:type="spellEnd"/>
+            <w:r>
+              <w:t xml:space="preserve"> }}</w:t>
             </w:r>
           </w:p>
         </w:tc>
@@ -3539,13 +4327,13 @@
               <w:t>docassemble</w:t>
             </w:r>
             <w:r>
-              <w:t xml:space="preserve">.AKA2JBranding: </w:t>
-            </w:r>
-            <w:r>
-              <w:t>answer</w:t>
-            </w:r>
-            <w:r>
-              <w:t>_content</w:t>
+              <w:t>.</w:t>
+            </w:r>
+            <w:r>
+              <w:t>AKA2JBranding:</w:t>
+            </w:r>
+            <w:r>
+              <w:t>answer_content</w:t>
             </w:r>
             <w:r>
               <w:t>.docx</w:t>
@@ -3583,7 +4371,35 @@
               <w:rPr>
                 <w:color w:val="FF0000"/>
               </w:rPr>
-              <w:t>{%tr endif %}</w:t>
+              <w:t>{%</w:t>
+            </w:r>
+            <w:proofErr w:type="spellStart"/>
+            <w:r>
+              <w:rPr>
+                <w:color w:val="FF0000"/>
+              </w:rPr>
+              <w:t>tr</w:t>
+            </w:r>
+            <w:proofErr w:type="spellEnd"/>
+            <w:r>
+              <w:rPr>
+                <w:color w:val="FF0000"/>
+              </w:rPr>
+              <w:t xml:space="preserve"> </w:t>
+            </w:r>
+            <w:proofErr w:type="spellStart"/>
+            <w:r>
+              <w:rPr>
+                <w:color w:val="FF0000"/>
+              </w:rPr>
+              <w:t>endif</w:t>
+            </w:r>
+            <w:proofErr w:type="spellEnd"/>
+            <w:r>
+              <w:rPr>
+                <w:color w:val="FF0000"/>
+              </w:rPr>
+              <w:t xml:space="preserve"> %}</w:t>
             </w:r>
           </w:p>
         </w:tc>
@@ -3633,7 +4449,15 @@
               <w:pStyle w:val="Body"/>
             </w:pPr>
             <w:r>
-              <w:t xml:space="preserve">{%tr </w:t>
+              <w:t>{%</w:t>
+            </w:r>
+            <w:proofErr w:type="spellStart"/>
+            <w:r>
+              <w:t>tr</w:t>
+            </w:r>
+            <w:proofErr w:type="spellEnd"/>
+            <w:r>
+              <w:t xml:space="preserve"> </w:t>
             </w:r>
             <w:r>
               <w:rPr>
@@ -3665,13 +4489,41 @@
             <w:r>
               <w:t xml:space="preserve"> </w:t>
             </w:r>
+            <w:proofErr w:type="spellStart"/>
             <w:r>
               <w:rPr>
                 <w:rStyle w:val="interviewvariable"/>
                 <w:color w:val="202529"/>
                 <w:shd w:val="clear" w:color="auto" w:fill="auto"/>
               </w:rPr>
-              <w:t>stage_of_other_case == 'still going') or (type_of_response['default'] and proper_service == 'neither')</w:t>
+              <w:t>stage_of_other_case</w:t>
+            </w:r>
+            <w:proofErr w:type="spellEnd"/>
+            <w:r>
+              <w:rPr>
+                <w:rStyle w:val="interviewvariable"/>
+                <w:color w:val="202529"/>
+                <w:shd w:val="clear" w:color="auto" w:fill="auto"/>
+              </w:rPr>
+              <w:t xml:space="preserve"> == 'still going') or (type_of_response['default'] and </w:t>
+            </w:r>
+            <w:proofErr w:type="spellStart"/>
+            <w:r>
+              <w:rPr>
+                <w:rStyle w:val="interviewvariable"/>
+                <w:color w:val="202529"/>
+                <w:shd w:val="clear" w:color="auto" w:fill="auto"/>
+              </w:rPr>
+              <w:t>proper_service</w:t>
+            </w:r>
+            <w:proofErr w:type="spellEnd"/>
+            <w:r>
+              <w:rPr>
+                <w:rStyle w:val="interviewvariable"/>
+                <w:color w:val="202529"/>
+                <w:shd w:val="clear" w:color="auto" w:fill="auto"/>
+              </w:rPr>
+              <w:t xml:space="preserve"> == 'neither')</w:t>
             </w:r>
             <w:r>
               <w:t xml:space="preserve"> %}</w:t>
@@ -3698,12 +4550,14 @@
               <w:pStyle w:val="Body"/>
               <w:spacing w:before="0" w:after="0"/>
             </w:pPr>
+            <w:proofErr w:type="spellStart"/>
             <w:r>
               <w:t>d</w:t>
             </w:r>
             <w:r>
               <w:t>ismiss_step</w:t>
             </w:r>
+            <w:proofErr w:type="spellEnd"/>
           </w:p>
         </w:tc>
       </w:tr>
@@ -3731,15 +4585,31 @@
               <w:pStyle w:val="Heading2"/>
               <w:outlineLvl w:val="1"/>
             </w:pPr>
-            <w:bookmarkStart w:id="2" w:name="_Hlk226106692"/>
-            <w:r>
-              <w:t>{{ d</w:t>
-            </w:r>
-            <w:r>
-              <w:t>ismiss_step</w:t>
-            </w:r>
-            <w:r>
-              <w:t>.subject }}</w:t>
+            <w:bookmarkStart w:id="3" w:name="_Hlk226106692"/>
+            <w:r>
+              <w:t>{</w:t>
+            </w:r>
+            <w:proofErr w:type="gramStart"/>
+            <w:r>
+              <w:t xml:space="preserve">{ </w:t>
+            </w:r>
+            <w:proofErr w:type="spellStart"/>
+            <w:r>
+              <w:t>d</w:t>
+            </w:r>
+            <w:r>
+              <w:t>ismiss</w:t>
+            </w:r>
+            <w:proofErr w:type="gramEnd"/>
+            <w:r>
+              <w:t>_step</w:t>
+            </w:r>
+            <w:r>
+              <w:t>.subject</w:t>
+            </w:r>
+            <w:proofErr w:type="spellEnd"/>
+            <w:r>
+              <w:t xml:space="preserve"> }}</w:t>
             </w:r>
           </w:p>
         </w:tc>
@@ -3779,7 +4649,13 @@
               <w:t>docassemble</w:t>
             </w:r>
             <w:r>
-              <w:t>.AKA2JBranding: dismiss_content</w:t>
+              <w:t>.</w:t>
+            </w:r>
+            <w:r>
+              <w:t>AKA2JBranding:</w:t>
+            </w:r>
+            <w:r>
+              <w:t>dismiss_content</w:t>
             </w:r>
             <w:r>
               <w:t>.docx</w:t>
@@ -3790,7 +4666,7 @@
           </w:p>
         </w:tc>
       </w:tr>
-      <w:bookmarkEnd w:id="2"/>
+      <w:bookmarkEnd w:id="3"/>
       <w:tr>
         <w:trPr>
           <w:jc w:val="center"/>
@@ -3816,7 +4692,23 @@
               <w:spacing w:before="0" w:after="0"/>
             </w:pPr>
             <w:r>
-              <w:t>{%tr endif %}</w:t>
+              <w:t>{%</w:t>
+            </w:r>
+            <w:proofErr w:type="spellStart"/>
+            <w:r>
+              <w:t>tr</w:t>
+            </w:r>
+            <w:proofErr w:type="spellEnd"/>
+            <w:r>
+              <w:t xml:space="preserve"> </w:t>
+            </w:r>
+            <w:proofErr w:type="spellStart"/>
+            <w:r>
+              <w:t>endif</w:t>
+            </w:r>
+            <w:proofErr w:type="spellEnd"/>
+            <w:r>
+              <w:t xml:space="preserve"> %}</w:t>
             </w:r>
           </w:p>
         </w:tc>
@@ -3840,8 +4732,8 @@
               <w:pStyle w:val="Body"/>
               <w:spacing w:before="0" w:after="0"/>
             </w:pPr>
-            <w:bookmarkStart w:id="3" w:name="_Hlk136354462"/>
-            <w:bookmarkEnd w:id="3"/>
+            <w:bookmarkStart w:id="4" w:name="_Hlk136354462"/>
+            <w:bookmarkEnd w:id="4"/>
           </w:p>
         </w:tc>
       </w:tr>
@@ -3870,11 +4762,23 @@
               <w:spacing w:before="0" w:after="0"/>
             </w:pPr>
             <w:r>
-              <w:t xml:space="preserve">{%tr if stage_of_default == </w:t>
-            </w:r>
-            <w:r>
-              <w:lastRenderedPageBreak/>
-              <w:t>'judgment entered' %}</w:t>
+              <w:t>{%</w:t>
+            </w:r>
+            <w:proofErr w:type="spellStart"/>
+            <w:r>
+              <w:t>tr</w:t>
+            </w:r>
+            <w:proofErr w:type="spellEnd"/>
+            <w:r>
+              <w:t xml:space="preserve"> if </w:t>
+            </w:r>
+            <w:proofErr w:type="spellStart"/>
+            <w:r>
+              <w:t>stage_of_default</w:t>
+            </w:r>
+            <w:proofErr w:type="spellEnd"/>
+            <w:r>
+              <w:t xml:space="preserve"> == 'judgment entered' %}</w:t>
             </w:r>
           </w:p>
         </w:tc>
@@ -3898,10 +4802,11 @@
               <w:pStyle w:val="Body"/>
               <w:spacing w:before="0" w:after="0"/>
             </w:pPr>
-            <w:r>
-              <w:lastRenderedPageBreak/>
+            <w:proofErr w:type="spellStart"/>
+            <w:r>
               <w:t>learn_set_aside_step</w:t>
             </w:r>
+            <w:proofErr w:type="spellEnd"/>
           </w:p>
         </w:tc>
       </w:tr>
@@ -3934,22 +4839,47 @@
                 <w:rFonts w:eastAsia="Calibri"/>
                 <w:shd w:val="clear" w:color="auto" w:fill="FFFFFF"/>
               </w:rPr>
-              <w:lastRenderedPageBreak/>
-              <w:t xml:space="preserve">{{ </w:t>
-            </w:r>
+              <w:t>{</w:t>
+            </w:r>
+            <w:proofErr w:type="gramStart"/>
             <w:r>
               <w:rPr>
                 <w:rFonts w:eastAsia="Calibri"/>
                 <w:shd w:val="clear" w:color="auto" w:fill="FFFFFF"/>
               </w:rPr>
-              <w:t>learn_set_aside_step</w:t>
-            </w:r>
+              <w:t xml:space="preserve">{ </w:t>
+            </w:r>
+            <w:proofErr w:type="spellStart"/>
             <w:r>
               <w:rPr>
                 <w:rFonts w:eastAsia="Calibri"/>
                 <w:shd w:val="clear" w:color="auto" w:fill="FFFFFF"/>
               </w:rPr>
-              <w:t>.subject }}</w:t>
+              <w:lastRenderedPageBreak/>
+              <w:t>learn</w:t>
+            </w:r>
+            <w:proofErr w:type="gramEnd"/>
+            <w:r>
+              <w:rPr>
+                <w:rFonts w:eastAsia="Calibri"/>
+                <w:shd w:val="clear" w:color="auto" w:fill="FFFFFF"/>
+              </w:rPr>
+              <w:t>_set_aside_step</w:t>
+            </w:r>
+            <w:r>
+              <w:rPr>
+                <w:rFonts w:eastAsia="Calibri"/>
+                <w:shd w:val="clear" w:color="auto" w:fill="FFFFFF"/>
+              </w:rPr>
+              <w:t>.subject</w:t>
+            </w:r>
+            <w:proofErr w:type="spellEnd"/>
+            <w:r>
+              <w:rPr>
+                <w:rFonts w:eastAsia="Calibri"/>
+                <w:shd w:val="clear" w:color="auto" w:fill="FFFFFF"/>
+              </w:rPr>
+              <w:t xml:space="preserve"> }}</w:t>
             </w:r>
           </w:p>
         </w:tc>
@@ -3979,13 +4909,20 @@
               <w:pStyle w:val="Body"/>
             </w:pPr>
             <w:r>
+              <w:lastRenderedPageBreak/>
               <w:t>{{p (include_docx_template("</w:t>
             </w:r>
             <w:r>
               <w:t>docassemble</w:t>
             </w:r>
             <w:r>
-              <w:t>.AKA2JBranding: learn_set_aside_content</w:t>
+              <w:t>.</w:t>
+            </w:r>
+            <w:r>
+              <w:t>AKA2JBranding:</w:t>
+            </w:r>
+            <w:r>
+              <w:t>learn_set_aside_content</w:t>
             </w:r>
             <w:r>
               <w:t>.docx</w:t>
@@ -4028,21 +4965,47 @@
                 <w:rFonts w:eastAsia="Calibri"/>
                 <w:shd w:val="clear" w:color="auto" w:fill="FFFFFF"/>
               </w:rPr>
-              <w:t>{{ fill</w:t>
-            </w:r>
+              <w:lastRenderedPageBreak/>
+              <w:t>{</w:t>
+            </w:r>
+            <w:proofErr w:type="gramStart"/>
             <w:r>
               <w:rPr>
                 <w:rFonts w:eastAsia="Calibri"/>
                 <w:shd w:val="clear" w:color="auto" w:fill="FFFFFF"/>
               </w:rPr>
-              <w:t>_set_aside_step</w:t>
-            </w:r>
+              <w:t xml:space="preserve">{ </w:t>
+            </w:r>
+            <w:proofErr w:type="spellStart"/>
             <w:r>
               <w:rPr>
                 <w:rFonts w:eastAsia="Calibri"/>
                 <w:shd w:val="clear" w:color="auto" w:fill="FFFFFF"/>
               </w:rPr>
-              <w:t>.subject }}</w:t>
+              <w:t>fill</w:t>
+            </w:r>
+            <w:proofErr w:type="gramEnd"/>
+            <w:r>
+              <w:rPr>
+                <w:rFonts w:eastAsia="Calibri"/>
+                <w:shd w:val="clear" w:color="auto" w:fill="FFFFFF"/>
+              </w:rPr>
+              <w:t>_set_aside_step</w:t>
+            </w:r>
+            <w:r>
+              <w:rPr>
+                <w:rFonts w:eastAsia="Calibri"/>
+                <w:shd w:val="clear" w:color="auto" w:fill="FFFFFF"/>
+              </w:rPr>
+              <w:t>.subject</w:t>
+            </w:r>
+            <w:proofErr w:type="spellEnd"/>
+            <w:r>
+              <w:rPr>
+                <w:rFonts w:eastAsia="Calibri"/>
+                <w:shd w:val="clear" w:color="auto" w:fill="FFFFFF"/>
+              </w:rPr>
+              <w:t xml:space="preserve"> }}</w:t>
             </w:r>
           </w:p>
         </w:tc>
@@ -4078,7 +5041,13 @@
               <w:t>docx</w:t>
             </w:r>
             <w:r>
-              <w:t>_template("docassemble.AKA2JBranding: fill_set_aside_content</w:t>
+              <w:t>_template("docassemble.</w:t>
+            </w:r>
+            <w:r>
+              <w:t>AKA2JBranding:</w:t>
+            </w:r>
+            <w:r>
+              <w:t>fill_set_aside_content</w:t>
             </w:r>
             <w:r>
               <w:t>.docx</w:t>
@@ -4120,7 +5089,35 @@
               <w:rPr>
                 <w:shd w:val="clear" w:color="auto" w:fill="FFFFFF"/>
               </w:rPr>
-              <w:t>{%tr endif %}</w:t>
+              <w:t>{%</w:t>
+            </w:r>
+            <w:proofErr w:type="spellStart"/>
+            <w:r>
+              <w:rPr>
+                <w:shd w:val="clear" w:color="auto" w:fill="FFFFFF"/>
+              </w:rPr>
+              <w:t>tr</w:t>
+            </w:r>
+            <w:proofErr w:type="spellEnd"/>
+            <w:r>
+              <w:rPr>
+                <w:shd w:val="clear" w:color="auto" w:fill="FFFFFF"/>
+              </w:rPr>
+              <w:t xml:space="preserve"> </w:t>
+            </w:r>
+            <w:proofErr w:type="spellStart"/>
+            <w:r>
+              <w:rPr>
+                <w:shd w:val="clear" w:color="auto" w:fill="FFFFFF"/>
+              </w:rPr>
+              <w:t>endif</w:t>
+            </w:r>
+            <w:proofErr w:type="spellEnd"/>
+            <w:r>
+              <w:rPr>
+                <w:shd w:val="clear" w:color="auto" w:fill="FFFFFF"/>
+              </w:rPr>
+              <w:t xml:space="preserve"> %}</w:t>
             </w:r>
           </w:p>
         </w:tc>
@@ -4173,7 +5170,31 @@
               <w:spacing w:before="0" w:after="0"/>
             </w:pPr>
             <w:r>
-              <w:t>{%tr if user_need in ('answer custody', 'custody') and parents_agree_documents %}</w:t>
+              <w:t>{%</w:t>
+            </w:r>
+            <w:proofErr w:type="spellStart"/>
+            <w:r>
+              <w:t>tr</w:t>
+            </w:r>
+            <w:proofErr w:type="spellEnd"/>
+            <w:r>
+              <w:t xml:space="preserve"> if </w:t>
+            </w:r>
+            <w:proofErr w:type="spellStart"/>
+            <w:r>
+              <w:t>user_need</w:t>
+            </w:r>
+            <w:proofErr w:type="spellEnd"/>
+            <w:r>
+              <w:t xml:space="preserve"> in ('answer custody', 'custody') and </w:t>
+            </w:r>
+            <w:proofErr w:type="spellStart"/>
+            <w:r>
+              <w:t>parents_agree_documents</w:t>
+            </w:r>
+            <w:proofErr w:type="spellEnd"/>
+            <w:r>
+              <w:t xml:space="preserve"> %}</w:t>
             </w:r>
           </w:p>
         </w:tc>
@@ -4198,9 +5219,11 @@
               <w:pStyle w:val="Body"/>
               <w:spacing w:before="0" w:after="0"/>
             </w:pPr>
+            <w:proofErr w:type="spellStart"/>
             <w:r>
               <w:t>uncontested_custody_forms_step</w:t>
             </w:r>
+            <w:proofErr w:type="spellEnd"/>
           </w:p>
         </w:tc>
       </w:tr>
@@ -4237,21 +5260,46 @@
                 <w:rFonts w:eastAsia="Calibri"/>
                 <w:shd w:val="clear" w:color="auto" w:fill="FFFFFF"/>
               </w:rPr>
-              <w:t xml:space="preserve">{{ </w:t>
-            </w:r>
+              <w:t>{</w:t>
+            </w:r>
+            <w:proofErr w:type="gramStart"/>
             <w:r>
               <w:rPr>
                 <w:rFonts w:eastAsia="Calibri"/>
                 <w:shd w:val="clear" w:color="auto" w:fill="FFFFFF"/>
               </w:rPr>
-              <w:t>uncontested_custody_forms_step</w:t>
-            </w:r>
+              <w:t xml:space="preserve">{ </w:t>
+            </w:r>
+            <w:proofErr w:type="spellStart"/>
             <w:r>
               <w:rPr>
                 <w:rFonts w:eastAsia="Calibri"/>
                 <w:shd w:val="clear" w:color="auto" w:fill="FFFFFF"/>
               </w:rPr>
-              <w:t>.subject }}</w:t>
+              <w:t>uncontested</w:t>
+            </w:r>
+            <w:proofErr w:type="gramEnd"/>
+            <w:r>
+              <w:rPr>
+                <w:rFonts w:eastAsia="Calibri"/>
+                <w:shd w:val="clear" w:color="auto" w:fill="FFFFFF"/>
+              </w:rPr>
+              <w:t>_custody_forms_step</w:t>
+            </w:r>
+            <w:r>
+              <w:rPr>
+                <w:rFonts w:eastAsia="Calibri"/>
+                <w:shd w:val="clear" w:color="auto" w:fill="FFFFFF"/>
+              </w:rPr>
+              <w:t>.subject</w:t>
+            </w:r>
+            <w:proofErr w:type="spellEnd"/>
+            <w:r>
+              <w:rPr>
+                <w:rFonts w:eastAsia="Calibri"/>
+                <w:shd w:val="clear" w:color="auto" w:fill="FFFFFF"/>
+              </w:rPr>
+              <w:t xml:space="preserve"> }}</w:t>
             </w:r>
           </w:p>
         </w:tc>
@@ -4283,7 +5331,15 @@
               <w:spacing w:before="100" w:after="100"/>
             </w:pPr>
             <w:r>
-              <w:t>If you and {{ other_party_in_case }} agree on everything (a parenting plan including decision-making and schedule, paternity, and child support), you can fill out forms to start the case together. This is called an uncontested case.</w:t>
+              <w:t>If you and {</w:t>
+            </w:r>
+            <w:proofErr w:type="gramStart"/>
+            <w:r>
+              <w:t>{ other</w:t>
+            </w:r>
+            <w:proofErr w:type="gramEnd"/>
+            <w:r>
+              <w:t>_party_in_case }} agree on everything (a parenting plan including decision-making and schedule, paternity, and child support), you can fill out forms to start the case together. This is called an uncontested case.</w:t>
             </w:r>
           </w:p>
           <w:p>
@@ -4338,7 +5394,15 @@
             </w:r>
             <w:r>
               <w:br/>
-              <w:t>courts.alaska.gov/shc/family/docs/shc-118.doc</w:t>
+              <w:t>courts.alaska.gov/</w:t>
+            </w:r>
+            <w:proofErr w:type="spellStart"/>
+            <w:r>
+              <w:t>shc</w:t>
+            </w:r>
+            <w:proofErr w:type="spellEnd"/>
+            <w:r>
+              <w:t>/family/docs/shc-118.doc</w:t>
             </w:r>
             <w:r>
               <w:br/>
@@ -4354,7 +5418,15 @@
             </w:hyperlink>
             <w:r>
               <w:br/>
-              <w:t>courts.alaska.gov/shc/family/docs/shc-118n.pdf</w:t>
+              <w:t>courts.alaska.gov/</w:t>
+            </w:r>
+            <w:proofErr w:type="spellStart"/>
+            <w:r>
+              <w:t>shc</w:t>
+            </w:r>
+            <w:proofErr w:type="spellEnd"/>
+            <w:r>
+              <w:t>/family/docs/shc-118n.pdf</w:t>
             </w:r>
           </w:p>
           <w:p>
@@ -4414,7 +5486,6 @@
               <w:br/>
             </w:r>
             <w:r>
-              <w:lastRenderedPageBreak/>
               <w:t xml:space="preserve">as a </w:t>
             </w:r>
             <w:hyperlink r:id="rId11">
@@ -4430,7 +5501,15 @@
             </w:r>
             <w:r>
               <w:br/>
-              <w:t>courts.alaska.gov/shc/family/docs/shc-1063.doc</w:t>
+              <w:t>courts.alaska.gov/</w:t>
+            </w:r>
+            <w:proofErr w:type="spellStart"/>
+            <w:r>
+              <w:t>shc</w:t>
+            </w:r>
+            <w:proofErr w:type="spellEnd"/>
+            <w:r>
+              <w:t>/family/docs/shc-1063.doc</w:t>
             </w:r>
             <w:r>
               <w:br/>
@@ -4446,7 +5525,18 @@
             </w:hyperlink>
             <w:r>
               <w:br/>
-              <w:t>courts.alaska.gov/shc/family/docs/shc-1063n.pdf</w:t>
+            </w:r>
+            <w:r>
+              <w:lastRenderedPageBreak/>
+              <w:t>courts.alaska.gov/</w:t>
+            </w:r>
+            <w:proofErr w:type="spellStart"/>
+            <w:r>
+              <w:t>shc</w:t>
+            </w:r>
+            <w:proofErr w:type="spellEnd"/>
+            <w:r>
+              <w:t>/family/docs/shc-1063n.pdf</w:t>
             </w:r>
           </w:p>
           <w:p>
@@ -4583,12 +5673,34 @@
                 <w:rPr>
                   <w:rStyle w:val="Hyperlink"/>
                 </w:rPr>
-                <w:t>How to Fill out the Child Support Guidelines Affidavit</w:t>
+                <w:t xml:space="preserve">How to </w:t>
+              </w:r>
+              <w:proofErr w:type="gramStart"/>
+              <w:r>
+                <w:rPr>
+                  <w:rStyle w:val="Hyperlink"/>
+                </w:rPr>
+                <w:t>Fill</w:t>
+              </w:r>
+              <w:proofErr w:type="gramEnd"/>
+              <w:r>
+                <w:rPr>
+                  <w:rStyle w:val="Hyperlink"/>
+                </w:rPr>
+                <w:t xml:space="preserve"> out the Child Support Guidelines Affidavit</w:t>
               </w:r>
             </w:hyperlink>
             <w:r>
               <w:br/>
-              <w:t>courts.alaska.gov/shc/family/docs/shc-dr305f-sample.pdf.</w:t>
+              <w:t>courts.alaska.gov/</w:t>
+            </w:r>
+            <w:proofErr w:type="spellStart"/>
+            <w:r>
+              <w:t>shc</w:t>
+            </w:r>
+            <w:proofErr w:type="spellEnd"/>
+            <w:r>
+              <w:t>/family/docs/shc-dr305f-sample.pdf.</w:t>
             </w:r>
           </w:p>
           <w:p>
@@ -4796,7 +5908,6 @@
               <w:outlineLvl w:val="2"/>
             </w:pPr>
             <w:r>
-              <w:lastRenderedPageBreak/>
               <w:t>Optional forms depending on your situation</w:t>
             </w:r>
           </w:p>
@@ -4827,7 +5938,11 @@
               <w:t xml:space="preserve"> </w:t>
             </w:r>
             <w:r>
-              <w:t>1 form based on the parenting schedule if it is not a primary custody calculation (where children are with 1 parent for at least 256 overnights/year</w:t>
+              <w:t xml:space="preserve">1 form based on the parenting schedule if it is not a primary custody calculation (where children are with 1 parent for </w:t>
+            </w:r>
+            <w:r>
+              <w:lastRenderedPageBreak/>
+              <w:t>at least 256 overnights/year</w:t>
             </w:r>
             <w:r>
               <w:rPr>
@@ -5006,16 +6121,38 @@
                 <w:b/>
                 <w:color w:val="000000"/>
               </w:rPr>
-              <w:t>Application for Services of Child Support Services Division,</w:t>
-            </w:r>
-            <w:hyperlink r:id="rId24" w:tgtFrame="_blank">
-              <w:r>
-                <w:rPr>
-                  <w:rStyle w:val="Hyperlink"/>
-                </w:rPr>
-                <w:t>DR-315</w:t>
-              </w:r>
-            </w:hyperlink>
+              <w:t>Application for Services of Child Support Services Division</w:t>
+            </w:r>
+            <w:proofErr w:type="gramStart"/>
+            <w:r>
+              <w:rPr>
+                <w:b/>
+                <w:color w:val="000000"/>
+              </w:rPr>
+              <w:t>,</w:t>
+            </w:r>
+            <w:proofErr w:type="gramEnd"/>
+            <w:r>
+              <w:fldChar w:fldCharType="begin"/>
+            </w:r>
+            <w:r>
+              <w:instrText xml:space="preserve"> HYPERLINK "https://public.courts.alaska.gov/web/forms/docs/dr-315.pdf" \t "_blank" \h </w:instrText>
+            </w:r>
+            <w:r>
+              <w:fldChar w:fldCharType="separate"/>
+            </w:r>
+            <w:r>
+              <w:rPr>
+                <w:rStyle w:val="Hyperlink"/>
+              </w:rPr>
+              <w:t>DR-315</w:t>
+            </w:r>
+            <w:r>
+              <w:rPr>
+                <w:rStyle w:val="Hyperlink"/>
+              </w:rPr>
+              <w:fldChar w:fldCharType="end"/>
+            </w:r>
             <w:r>
               <w:t>[Fill-In PDF]</w:t>
             </w:r>
@@ -5060,7 +6197,23 @@
             </w:pPr>
             <w:r>
               <w:lastRenderedPageBreak/>
-              <w:t>{%tr endif%}</w:t>
+              <w:t>{%</w:t>
+            </w:r>
+            <w:proofErr w:type="spellStart"/>
+            <w:r>
+              <w:t>tr</w:t>
+            </w:r>
+            <w:proofErr w:type="spellEnd"/>
+            <w:r>
+              <w:t xml:space="preserve"> </w:t>
+            </w:r>
+            <w:proofErr w:type="spellStart"/>
+            <w:r>
+              <w:t>endif</w:t>
+            </w:r>
+            <w:proofErr w:type="spellEnd"/>
+            <w:r>
+              <w:t>%}</w:t>
             </w:r>
           </w:p>
         </w:tc>
@@ -5111,10 +6264,34 @@
               <w:pStyle w:val="Body"/>
             </w:pPr>
             <w:r>
-              <w:t xml:space="preserve">{%tr </w:t>
-            </w:r>
-            <w:r>
-              <w:t>if type_of_response.any_true() and not (type_of_response.all_true('stay married', exclusive = True))</w:t>
+              <w:t>{%</w:t>
+            </w:r>
+            <w:proofErr w:type="spellStart"/>
+            <w:r>
+              <w:t>tr</w:t>
+            </w:r>
+            <w:proofErr w:type="spellEnd"/>
+            <w:r>
+              <w:t xml:space="preserve"> </w:t>
+            </w:r>
+            <w:r>
+              <w:t xml:space="preserve">if </w:t>
+            </w:r>
+            <w:proofErr w:type="spellStart"/>
+            <w:r>
+              <w:t>type_of_response.any_true</w:t>
+            </w:r>
+            <w:proofErr w:type="spellEnd"/>
+            <w:r>
+              <w:t>() and not (</w:t>
+            </w:r>
+            <w:proofErr w:type="spellStart"/>
+            <w:r>
+              <w:t>type_of_response.all_true</w:t>
+            </w:r>
+            <w:proofErr w:type="spellEnd"/>
+            <w:r>
+              <w:t>('stay married', exclusive = True))</w:t>
             </w:r>
             <w:r>
               <w:t xml:space="preserve"> %}</w:t>
@@ -5171,17 +6348,27 @@
               </w:rPr>
             </w:pPr>
             <w:r>
-              <w:t>{{</w:t>
+              <w:t>{</w:t>
+            </w:r>
+            <w:proofErr w:type="gramStart"/>
+            <w:r>
+              <w:t>{</w:t>
             </w:r>
             <w:r>
               <w:t xml:space="preserve"> </w:t>
             </w:r>
-            <w:r>
-              <w:t>truefiling_file_and_serve_step</w:t>
+            <w:proofErr w:type="spellStart"/>
+            <w:r>
+              <w:t>truefiling</w:t>
+            </w:r>
+            <w:proofErr w:type="gramEnd"/>
+            <w:r>
+              <w:t>_file_and_serve_step</w:t>
             </w:r>
             <w:r>
               <w:t>.subject</w:t>
             </w:r>
+            <w:proofErr w:type="spellEnd"/>
             <w:r>
               <w:t xml:space="preserve"> }}</w:t>
             </w:r>
@@ -5261,17 +6448,27 @@
               </w:rPr>
             </w:pPr>
             <w:r>
-              <w:t>{{</w:t>
+              <w:t>{</w:t>
+            </w:r>
+            <w:proofErr w:type="gramStart"/>
+            <w:r>
+              <w:t>{</w:t>
             </w:r>
             <w:r>
               <w:t xml:space="preserve"> </w:t>
             </w:r>
-            <w:r>
-              <w:t>truefiling_serve_</w:t>
+            <w:proofErr w:type="spellStart"/>
+            <w:r>
+              <w:t>truefiling</w:t>
+            </w:r>
+            <w:proofErr w:type="gramEnd"/>
+            <w:r>
+              <w:t>_serve_</w:t>
             </w:r>
             <w:r>
               <w:t>step.subject</w:t>
             </w:r>
+            <w:proofErr w:type="spellEnd"/>
             <w:r>
               <w:t xml:space="preserve"> }}</w:t>
             </w:r>
@@ -5351,7 +6548,23 @@
               <w:pStyle w:val="Body"/>
             </w:pPr>
             <w:r>
-              <w:t>{%tr endif%}</w:t>
+              <w:t>{%</w:t>
+            </w:r>
+            <w:proofErr w:type="spellStart"/>
+            <w:r>
+              <w:t>tr</w:t>
+            </w:r>
+            <w:proofErr w:type="spellEnd"/>
+            <w:r>
+              <w:t xml:space="preserve"> </w:t>
+            </w:r>
+            <w:proofErr w:type="spellStart"/>
+            <w:r>
+              <w:t>endif</w:t>
+            </w:r>
+            <w:proofErr w:type="spellEnd"/>
+            <w:r>
+              <w:t>%}</w:t>
             </w:r>
           </w:p>
         </w:tc>
@@ -5404,19 +6617,55 @@
               <w:rPr>
                 <w:color w:val="FF0000"/>
               </w:rPr>
-              <w:t>{%tr if</w:t>
-            </w:r>
+              <w:t>{%</w:t>
+            </w:r>
+            <w:proofErr w:type="spellStart"/>
             <w:r>
               <w:rPr>
                 <w:color w:val="FF0000"/>
               </w:rPr>
+              <w:t>tr</w:t>
+            </w:r>
+            <w:proofErr w:type="spellEnd"/>
+            <w:r>
+              <w:rPr>
+                <w:color w:val="FF0000"/>
+              </w:rPr>
+              <w:t xml:space="preserve"> if</w:t>
+            </w:r>
+            <w:r>
+              <w:rPr>
+                <w:color w:val="FF0000"/>
+              </w:rPr>
               <w:t xml:space="preserve"> (</w:t>
             </w:r>
+            <w:proofErr w:type="spellStart"/>
             <w:r>
               <w:rPr>
                 <w:color w:val="auto"/>
               </w:rPr>
-              <w:t>type_of_response.any_true() and not (type_of_response.all_true('stay married', exclusive = True))</w:t>
+              <w:t>type_of_response.any_true</w:t>
+            </w:r>
+            <w:proofErr w:type="spellEnd"/>
+            <w:r>
+              <w:rPr>
+                <w:color w:val="auto"/>
+              </w:rPr>
+              <w:t>() and not (</w:t>
+            </w:r>
+            <w:proofErr w:type="spellStart"/>
+            <w:r>
+              <w:rPr>
+                <w:color w:val="auto"/>
+              </w:rPr>
+              <w:t>type_of_response.all_true</w:t>
+            </w:r>
+            <w:proofErr w:type="spellEnd"/>
+            <w:r>
+              <w:rPr>
+                <w:color w:val="auto"/>
+              </w:rPr>
+              <w:t>('stay married', exclusive = True))</w:t>
             </w:r>
             <w:r>
               <w:rPr>
@@ -5437,11 +6686,43 @@
               <w:t>(</w:t>
             </w:r>
             <w:r>
-              <w:t>not ((type_of_response['de</w:t>
+              <w:t xml:space="preserve">not ((type_of_response['default'] and </w:t>
+            </w:r>
+            <w:proofErr w:type="spellStart"/>
+            <w:r>
+              <w:t>stage_of_default</w:t>
+            </w:r>
+            <w:proofErr w:type="spellEnd"/>
+            <w:r>
+              <w:t xml:space="preserve"> == 'judgment entered') or (type_of_response['ca</w:t>
             </w:r>
             <w:r>
               <w:lastRenderedPageBreak/>
-              <w:t>fault'] and stage_of_default == 'judgment entered') or (type_of_response['case in 2 states'] and stage_of_other_case == 'ended with order') or (type_of_response.all_true('wrong state', 'default') and user_need == 'answer custody' and not jurisdiction))</w:t>
+              <w:t xml:space="preserve">se in 2 states'] and </w:t>
+            </w:r>
+            <w:proofErr w:type="spellStart"/>
+            <w:r>
+              <w:t>stage_of_other_case</w:t>
+            </w:r>
+            <w:proofErr w:type="spellEnd"/>
+            <w:r>
+              <w:t xml:space="preserve"> == 'ended with order') or (</w:t>
+            </w:r>
+            <w:proofErr w:type="spellStart"/>
+            <w:r>
+              <w:t>type_of_response.all_true</w:t>
+            </w:r>
+            <w:proofErr w:type="spellEnd"/>
+            <w:r>
+              <w:t xml:space="preserve">('wrong state', 'default') and </w:t>
+            </w:r>
+            <w:proofErr w:type="spellStart"/>
+            <w:r>
+              <w:t>user_need</w:t>
+            </w:r>
+            <w:proofErr w:type="spellEnd"/>
+            <w:r>
+              <w:t xml:space="preserve"> == 'answer custody' and not jurisdiction))</w:t>
             </w:r>
             <w:r>
               <w:rPr>
@@ -5505,19 +6786,41 @@
                 <w:rFonts w:eastAsia="Calibri"/>
               </w:rPr>
               <w:lastRenderedPageBreak/>
-              <w:t xml:space="preserve">{{ </w:t>
-            </w:r>
+              <w:t>{</w:t>
+            </w:r>
+            <w:proofErr w:type="gramStart"/>
             <w:r>
               <w:rPr>
                 <w:rFonts w:eastAsia="Calibri"/>
               </w:rPr>
-              <w:t>read_drpo_step</w:t>
-            </w:r>
+              <w:t xml:space="preserve">{ </w:t>
+            </w:r>
+            <w:proofErr w:type="spellStart"/>
             <w:r>
               <w:rPr>
                 <w:rFonts w:eastAsia="Calibri"/>
               </w:rPr>
-              <w:t>.subject }}</w:t>
+              <w:t>read</w:t>
+            </w:r>
+            <w:proofErr w:type="gramEnd"/>
+            <w:r>
+              <w:rPr>
+                <w:rFonts w:eastAsia="Calibri"/>
+              </w:rPr>
+              <w:t>_drpo_step</w:t>
+            </w:r>
+            <w:r>
+              <w:rPr>
+                <w:rFonts w:eastAsia="Calibri"/>
+              </w:rPr>
+              <w:t>.subject</w:t>
+            </w:r>
+            <w:proofErr w:type="spellEnd"/>
+            <w:r>
+              <w:rPr>
+                <w:rFonts w:eastAsia="Calibri"/>
+              </w:rPr>
+              <w:t xml:space="preserve"> }}</w:t>
             </w:r>
           </w:p>
         </w:tc>
@@ -5582,7 +6885,23 @@
               </w:rPr>
             </w:pPr>
             <w:r>
-              <w:t>{%tr endif%}</w:t>
+              <w:t>{%</w:t>
+            </w:r>
+            <w:proofErr w:type="spellStart"/>
+            <w:r>
+              <w:t>tr</w:t>
+            </w:r>
+            <w:proofErr w:type="spellEnd"/>
+            <w:r>
+              <w:t xml:space="preserve"> </w:t>
+            </w:r>
+            <w:proofErr w:type="spellStart"/>
+            <w:r>
+              <w:t>endif</w:t>
+            </w:r>
+            <w:proofErr w:type="spellEnd"/>
+            <w:r>
+              <w:t>%}</w:t>
             </w:r>
           </w:p>
         </w:tc>
@@ -5635,19 +6954,55 @@
               <w:rPr>
                 <w:color w:val="FF0000"/>
               </w:rPr>
-              <w:t>{%tr if</w:t>
-            </w:r>
+              <w:t>{%</w:t>
+            </w:r>
+            <w:proofErr w:type="spellStart"/>
             <w:r>
               <w:rPr>
                 <w:color w:val="FF0000"/>
               </w:rPr>
+              <w:t>tr</w:t>
+            </w:r>
+            <w:proofErr w:type="spellEnd"/>
+            <w:r>
+              <w:rPr>
+                <w:color w:val="FF0000"/>
+              </w:rPr>
+              <w:t xml:space="preserve"> if</w:t>
+            </w:r>
+            <w:r>
+              <w:rPr>
+                <w:color w:val="FF0000"/>
+              </w:rPr>
               <w:t xml:space="preserve"> </w:t>
             </w:r>
+            <w:proofErr w:type="spellStart"/>
             <w:r>
               <w:rPr>
                 <w:color w:val="auto"/>
               </w:rPr>
-              <w:t>type_of_response.any_true() and not (type_of_response.all_true('stay married', exclusive = True))</w:t>
+              <w:t>type_of_response.any_true</w:t>
+            </w:r>
+            <w:proofErr w:type="spellEnd"/>
+            <w:r>
+              <w:rPr>
+                <w:color w:val="auto"/>
+              </w:rPr>
+              <w:t>() and not (</w:t>
+            </w:r>
+            <w:proofErr w:type="spellStart"/>
+            <w:r>
+              <w:rPr>
+                <w:color w:val="auto"/>
+              </w:rPr>
+              <w:t>type_of_response.all_true</w:t>
+            </w:r>
+            <w:proofErr w:type="spellEnd"/>
+            <w:r>
+              <w:rPr>
+                <w:color w:val="auto"/>
+              </w:rPr>
+              <w:t>('stay married', exclusive = True))</w:t>
             </w:r>
             <w:r>
               <w:rPr>
@@ -5710,14 +7065,30 @@
               <w:rPr>
                 <w:rFonts w:eastAsia="Calibri"/>
               </w:rPr>
-              <w:t xml:space="preserve">{{ </w:t>
-            </w:r>
+              <w:t>{</w:t>
+            </w:r>
+            <w:proofErr w:type="gramStart"/>
             <w:r>
               <w:rPr>
                 <w:rFonts w:eastAsia="Calibri"/>
               </w:rPr>
-              <w:t>expect_after_answer_step</w:t>
-            </w:r>
+              <w:t xml:space="preserve">{ </w:t>
+            </w:r>
+            <w:proofErr w:type="spellStart"/>
+            <w:r>
+              <w:rPr>
+                <w:rFonts w:eastAsia="Calibri"/>
+              </w:rPr>
+              <w:t>expect</w:t>
+            </w:r>
+            <w:proofErr w:type="gramEnd"/>
+            <w:r>
+              <w:rPr>
+                <w:rFonts w:eastAsia="Calibri"/>
+              </w:rPr>
+              <w:t>_after_answer_step</w:t>
+            </w:r>
+            <w:proofErr w:type="spellEnd"/>
             <w:r>
               <w:rPr>
                 <w:rFonts w:eastAsia="Calibri"/>
@@ -5773,7 +7144,23 @@
               <w:pStyle w:val="Body"/>
             </w:pPr>
             <w:r>
-              <w:t>{%tr endif %}</w:t>
+              <w:t>{%</w:t>
+            </w:r>
+            <w:proofErr w:type="spellStart"/>
+            <w:r>
+              <w:t>tr</w:t>
+            </w:r>
+            <w:proofErr w:type="spellEnd"/>
+            <w:r>
+              <w:t xml:space="preserve"> </w:t>
+            </w:r>
+            <w:proofErr w:type="spellStart"/>
+            <w:r>
+              <w:t>endif</w:t>
+            </w:r>
+            <w:proofErr w:type="spellEnd"/>
+            <w:r>
+              <w:t xml:space="preserve"> %}</w:t>
             </w:r>
           </w:p>
         </w:tc>
@@ -5826,12 +7213,26 @@
               <w:rPr>
                 <w:color w:val="FF0000"/>
               </w:rPr>
-              <w:t xml:space="preserve">{%tr </w:t>
-            </w:r>
+              <w:t>{%</w:t>
+            </w:r>
+            <w:proofErr w:type="spellStart"/>
             <w:r>
               <w:rPr>
                 <w:color w:val="FF0000"/>
               </w:rPr>
+              <w:t>tr</w:t>
+            </w:r>
+            <w:proofErr w:type="spellEnd"/>
+            <w:r>
+              <w:rPr>
+                <w:color w:val="FF0000"/>
+              </w:rPr>
+              <w:t xml:space="preserve"> </w:t>
+            </w:r>
+            <w:r>
+              <w:rPr>
+                <w:color w:val="FF0000"/>
+              </w:rPr>
               <w:t xml:space="preserve">if </w:t>
             </w:r>
             <w:r>
@@ -5841,11 +7242,51 @@
               <w:t>(</w:t>
             </w:r>
             <w:r>
-              <w:t xml:space="preserve">not ((user_need == 'answer custody' and type_of_response.all_true('wrong state', 'default') and not jurisdiction) or (type_of_response['case in 2 states'] and stage_of_other_case == 'ended with order') or </w:t>
+              <w:t>not ((</w:t>
+            </w:r>
+            <w:proofErr w:type="spellStart"/>
+            <w:r>
+              <w:t>user_need</w:t>
+            </w:r>
+            <w:proofErr w:type="spellEnd"/>
+            <w:r>
+              <w:t xml:space="preserve"> == 'answer custody' and </w:t>
+            </w:r>
+            <w:proofErr w:type="spellStart"/>
+            <w:r>
+              <w:t>type_of_response.all_true</w:t>
+            </w:r>
+            <w:proofErr w:type="spellEnd"/>
+            <w:r>
+              <w:t xml:space="preserve">('wrong state', 'default') and not jurisdiction) or (type_of_response['case in 2 states'] and </w:t>
+            </w:r>
+            <w:proofErr w:type="spellStart"/>
+            <w:r>
+              <w:t>stage_of_other_case</w:t>
+            </w:r>
+            <w:proofErr w:type="spellEnd"/>
+            <w:r>
+              <w:t xml:space="preserve"> == 'ended with order') or (type_of_response['default'] and </w:t>
+            </w:r>
+            <w:proofErr w:type="spellStart"/>
+            <w:r>
+              <w:t>stage_of_default</w:t>
+            </w:r>
+            <w:proofErr w:type="spellEnd"/>
+            <w:r>
+              <w:t xml:space="preserve"> == 'judgment entered') or </w:t>
+            </w:r>
+            <w:proofErr w:type="spellStart"/>
+            <w:r>
+              <w:t>type_of_response.all_f</w:t>
             </w:r>
             <w:r>
               <w:lastRenderedPageBreak/>
-              <w:t>(type_of_response['default'] and stage_of_default == 'judgment entered') or type_of_response.all_false())</w:t>
+              <w:t>alse</w:t>
+            </w:r>
+            <w:proofErr w:type="spellEnd"/>
+            <w:r>
+              <w:t>())</w:t>
             </w:r>
             <w:r>
               <w:rPr>
@@ -5859,11 +7300,19 @@
               </w:rPr>
               <w:t xml:space="preserve"> </w:t>
             </w:r>
+            <w:proofErr w:type="spellStart"/>
             <w:r>
               <w:rPr>
                 <w:color w:val="FF0000"/>
               </w:rPr>
-              <w:t>type_of_response.all_true('stay married', exclusive = True)</w:t>
+              <w:t>type_of_response.all_true</w:t>
+            </w:r>
+            <w:proofErr w:type="spellEnd"/>
+            <w:r>
+              <w:rPr>
+                <w:color w:val="FF0000"/>
+              </w:rPr>
+              <w:t>('stay married', exclusive = True)</w:t>
             </w:r>
             <w:r>
               <w:t xml:space="preserve"> %}</w:t>
@@ -5889,6 +7338,7 @@
             <w:pPr>
               <w:pStyle w:val="Body"/>
             </w:pPr>
+            <w:proofErr w:type="spellStart"/>
             <w:r>
               <w:lastRenderedPageBreak/>
               <w:t>learn_more_about_</w:t>
@@ -5899,6 +7349,7 @@
             <w:r>
               <w:t>process_step</w:t>
             </w:r>
+            <w:proofErr w:type="spellEnd"/>
           </w:p>
         </w:tc>
       </w:tr>
@@ -5934,19 +7385,41 @@
                 <w:rFonts w:eastAsia="Calibri"/>
               </w:rPr>
               <w:lastRenderedPageBreak/>
-              <w:t xml:space="preserve">{{ </w:t>
-            </w:r>
+              <w:t>{</w:t>
+            </w:r>
+            <w:proofErr w:type="gramStart"/>
             <w:r>
               <w:rPr>
                 <w:rFonts w:eastAsia="Calibri"/>
               </w:rPr>
-              <w:t>learn_more_about_process_step</w:t>
-            </w:r>
+              <w:t xml:space="preserve">{ </w:t>
+            </w:r>
+            <w:proofErr w:type="spellStart"/>
             <w:r>
               <w:rPr>
                 <w:rFonts w:eastAsia="Calibri"/>
               </w:rPr>
-              <w:t>.subject }}</w:t>
+              <w:t>learn</w:t>
+            </w:r>
+            <w:proofErr w:type="gramEnd"/>
+            <w:r>
+              <w:rPr>
+                <w:rFonts w:eastAsia="Calibri"/>
+              </w:rPr>
+              <w:t>_more_about_process_step</w:t>
+            </w:r>
+            <w:r>
+              <w:rPr>
+                <w:rFonts w:eastAsia="Calibri"/>
+              </w:rPr>
+              <w:t>.subject</w:t>
+            </w:r>
+            <w:proofErr w:type="spellEnd"/>
+            <w:r>
+              <w:rPr>
+                <w:rFonts w:eastAsia="Calibri"/>
+              </w:rPr>
+              <w:t xml:space="preserve"> }}</w:t>
             </w:r>
           </w:p>
         </w:tc>
@@ -5973,10 +7446,10 @@
               <w:t>{{p (include_docx_template("</w:t>
             </w:r>
             <w:r>
-              <w:t>docassemble.AKA2JBranding:</w:t>
-            </w:r>
-            <w:r>
-              <w:t xml:space="preserve"> </w:t>
+              <w:t>docassemble.</w:t>
+            </w:r>
+            <w:r>
+              <w:t>AKA2JBranding:</w:t>
             </w:r>
             <w:r>
               <w:t>learn_more_about_the_process_content.docx</w:t>
@@ -6015,7 +7488,35 @@
               <w:rPr>
                 <w:shd w:val="clear" w:color="auto" w:fill="FFFFFF"/>
               </w:rPr>
-              <w:t>{%tr endif %}</w:t>
+              <w:t>{%</w:t>
+            </w:r>
+            <w:proofErr w:type="spellStart"/>
+            <w:r>
+              <w:rPr>
+                <w:shd w:val="clear" w:color="auto" w:fill="FFFFFF"/>
+              </w:rPr>
+              <w:t>tr</w:t>
+            </w:r>
+            <w:proofErr w:type="spellEnd"/>
+            <w:r>
+              <w:rPr>
+                <w:shd w:val="clear" w:color="auto" w:fill="FFFFFF"/>
+              </w:rPr>
+              <w:t xml:space="preserve"> </w:t>
+            </w:r>
+            <w:proofErr w:type="spellStart"/>
+            <w:r>
+              <w:rPr>
+                <w:shd w:val="clear" w:color="auto" w:fill="FFFFFF"/>
+              </w:rPr>
+              <w:t>endif</w:t>
+            </w:r>
+            <w:proofErr w:type="spellEnd"/>
+            <w:r>
+              <w:rPr>
+                <w:shd w:val="clear" w:color="auto" w:fill="FFFFFF"/>
+              </w:rPr>
+              <w:t xml:space="preserve"> %}</w:t>
             </w:r>
           </w:p>
         </w:tc>
@@ -6073,7 +7574,35 @@
               <w:rPr>
                 <w:shd w:val="clear" w:color="auto" w:fill="FFFFFF"/>
               </w:rPr>
-              <w:t>{%tr if domestic_violence %}</w:t>
+              <w:t>{%</w:t>
+            </w:r>
+            <w:proofErr w:type="spellStart"/>
+            <w:r>
+              <w:rPr>
+                <w:shd w:val="clear" w:color="auto" w:fill="FFFFFF"/>
+              </w:rPr>
+              <w:t>tr</w:t>
+            </w:r>
+            <w:proofErr w:type="spellEnd"/>
+            <w:r>
+              <w:rPr>
+                <w:shd w:val="clear" w:color="auto" w:fill="FFFFFF"/>
+              </w:rPr>
+              <w:t xml:space="preserve"> if </w:t>
+            </w:r>
+            <w:proofErr w:type="spellStart"/>
+            <w:r>
+              <w:rPr>
+                <w:shd w:val="clear" w:color="auto" w:fill="FFFFFF"/>
+              </w:rPr>
+              <w:t>domestic_violence</w:t>
+            </w:r>
+            <w:proofErr w:type="spellEnd"/>
+            <w:r>
+              <w:rPr>
+                <w:shd w:val="clear" w:color="auto" w:fill="FFFFFF"/>
+              </w:rPr>
+              <w:t xml:space="preserve"> %}</w:t>
             </w:r>
           </w:p>
         </w:tc>
@@ -6097,9 +7626,11 @@
               <w:pStyle w:val="Body"/>
               <w:spacing w:before="0" w:after="0"/>
             </w:pPr>
+            <w:proofErr w:type="spellStart"/>
             <w:r>
               <w:t>answer_domestic_violence_step</w:t>
             </w:r>
+            <w:proofErr w:type="spellEnd"/>
             <w:r>
               <w:br/>
               <w:t>2026-04-02</w:t>
@@ -6135,10 +7666,19 @@
               </w:rPr>
             </w:pPr>
             <w:r>
-              <w:t xml:space="preserve">{{ </w:t>
-            </w:r>
-            <w:r>
-              <w:t>answer_domestic_violence_</w:t>
+              <w:t>{</w:t>
+            </w:r>
+            <w:proofErr w:type="gramStart"/>
+            <w:r>
+              <w:t xml:space="preserve">{ </w:t>
+            </w:r>
+            <w:proofErr w:type="spellStart"/>
+            <w:r>
+              <w:t>answer</w:t>
+            </w:r>
+            <w:proofErr w:type="gramEnd"/>
+            <w:r>
+              <w:t>_domestic_violence_</w:t>
             </w:r>
             <w:r>
               <w:t>step</w:t>
@@ -6146,6 +7686,7 @@
             <w:r>
               <w:t>.subject</w:t>
             </w:r>
+            <w:proofErr w:type="spellEnd"/>
             <w:r>
               <w:t xml:space="preserve"> }}</w:t>
             </w:r>
@@ -6228,7 +7769,35 @@
               <w:rPr>
                 <w:shd w:val="clear" w:color="auto" w:fill="FFFFFF"/>
               </w:rPr>
-              <w:t>{%tr endif %}</w:t>
+              <w:t>{%</w:t>
+            </w:r>
+            <w:proofErr w:type="spellStart"/>
+            <w:r>
+              <w:rPr>
+                <w:shd w:val="clear" w:color="auto" w:fill="FFFFFF"/>
+              </w:rPr>
+              <w:t>tr</w:t>
+            </w:r>
+            <w:proofErr w:type="spellEnd"/>
+            <w:r>
+              <w:rPr>
+                <w:shd w:val="clear" w:color="auto" w:fill="FFFFFF"/>
+              </w:rPr>
+              <w:t xml:space="preserve"> </w:t>
+            </w:r>
+            <w:proofErr w:type="spellStart"/>
+            <w:r>
+              <w:rPr>
+                <w:shd w:val="clear" w:color="auto" w:fill="FFFFFF"/>
+              </w:rPr>
+              <w:t>endif</w:t>
+            </w:r>
+            <w:proofErr w:type="spellEnd"/>
+            <w:r>
+              <w:rPr>
+                <w:shd w:val="clear" w:color="auto" w:fill="FFFFFF"/>
+              </w:rPr>
+              <w:t xml:space="preserve"> %}</w:t>
             </w:r>
           </w:p>
         </w:tc>
@@ -6287,112 +7856,201 @@
                 <w:color w:val="FF0000"/>
                 <w:shd w:val="clear" w:color="auto" w:fill="FFFFFF"/>
               </w:rPr>
-              <w:t xml:space="preserve">{%tr if (user_need </w:t>
-            </w:r>
+              <w:t>{%</w:t>
+            </w:r>
+            <w:proofErr w:type="spellStart"/>
             <w:r>
               <w:rPr>
                 <w:color w:val="FF0000"/>
                 <w:shd w:val="clear" w:color="auto" w:fill="FFFFFF"/>
               </w:rPr>
-              <w:t>in</w:t>
-            </w:r>
+              <w:t>tr</w:t>
+            </w:r>
+            <w:proofErr w:type="spellEnd"/>
             <w:r>
               <w:rPr>
                 <w:color w:val="FF0000"/>
                 <w:shd w:val="clear" w:color="auto" w:fill="FFFFFF"/>
               </w:rPr>
-              <w:t xml:space="preserve"> </w:t>
-            </w:r>
+              <w:t xml:space="preserve"> if (</w:t>
+            </w:r>
+            <w:proofErr w:type="spellStart"/>
             <w:r>
               <w:rPr>
                 <w:color w:val="FF0000"/>
                 <w:shd w:val="clear" w:color="auto" w:fill="FFFFFF"/>
               </w:rPr>
-              <w:t>(</w:t>
-            </w:r>
+              <w:t>user_need</w:t>
+            </w:r>
+            <w:proofErr w:type="spellEnd"/>
             <w:r>
               <w:rPr>
                 <w:color w:val="FF0000"/>
                 <w:shd w:val="clear" w:color="auto" w:fill="FFFFFF"/>
               </w:rPr>
-              <w:t>'custody'</w:t>
+              <w:t xml:space="preserve"> </w:t>
             </w:r>
             <w:r>
               <w:rPr>
                 <w:color w:val="FF0000"/>
                 <w:shd w:val="clear" w:color="auto" w:fill="FFFFFF"/>
               </w:rPr>
-              <w:t>, 'answer custody')</w:t>
+              <w:t>in</w:t>
             </w:r>
             <w:r>
               <w:rPr>
                 <w:color w:val="FF0000"/>
                 <w:shd w:val="clear" w:color="auto" w:fill="FFFFFF"/>
               </w:rPr>
-              <w:t xml:space="preserve"> and paternity) </w:t>
+              <w:t xml:space="preserve"> </w:t>
             </w:r>
             <w:r>
               <w:rPr>
                 <w:color w:val="FF0000"/>
                 <w:shd w:val="clear" w:color="auto" w:fill="FFFFFF"/>
               </w:rPr>
-              <w:t xml:space="preserve">or </w:t>
+              <w:t>(</w:t>
             </w:r>
             <w:r>
               <w:rPr>
                 <w:color w:val="FF0000"/>
                 <w:shd w:val="clear" w:color="auto" w:fill="FFFFFF"/>
               </w:rPr>
-              <w:t>(user_need == '</w:t>
+              <w:t>'custody'</w:t>
             </w:r>
             <w:r>
               <w:rPr>
                 <w:color w:val="FF0000"/>
                 <w:shd w:val="clear" w:color="auto" w:fill="FFFFFF"/>
               </w:rPr>
-              <w:t>divorce</w:t>
+              <w:t>, 'answer custody')</w:t>
             </w:r>
             <w:r>
               <w:rPr>
                 <w:color w:val="FF0000"/>
                 <w:shd w:val="clear" w:color="auto" w:fill="FFFFFF"/>
               </w:rPr>
-              <w:t xml:space="preserve">' and </w:t>
+              <w:t xml:space="preserve"> and paternity) </w:t>
             </w:r>
             <w:r>
               <w:rPr>
                 <w:color w:val="FF0000"/>
                 <w:shd w:val="clear" w:color="auto" w:fill="FFFFFF"/>
               </w:rPr>
-              <w:t xml:space="preserve">minor_children and </w:t>
+              <w:t xml:space="preserve">or </w:t>
             </w:r>
             <w:r>
               <w:rPr>
                 <w:color w:val="FF0000"/>
                 <w:shd w:val="clear" w:color="auto" w:fill="FFFFFF"/>
               </w:rPr>
-              <w:t>paternity</w:t>
-            </w:r>
+              <w:t>(</w:t>
+            </w:r>
+            <w:proofErr w:type="spellStart"/>
             <w:r>
               <w:rPr>
                 <w:color w:val="FF0000"/>
                 <w:shd w:val="clear" w:color="auto" w:fill="FFFFFF"/>
               </w:rPr>
-              <w:t xml:space="preserve"> == 'do not know'</w:t>
-            </w:r>
+              <w:t>user_need</w:t>
+            </w:r>
+            <w:proofErr w:type="spellEnd"/>
             <w:r>
               <w:rPr>
                 <w:color w:val="FF0000"/>
                 <w:shd w:val="clear" w:color="auto" w:fill="FFFFFF"/>
               </w:rPr>
-              <w:t xml:space="preserve">) </w:t>
+              <w:t xml:space="preserve"> == '</w:t>
             </w:r>
             <w:r>
               <w:rPr>
                 <w:color w:val="FF0000"/>
                 <w:shd w:val="clear" w:color="auto" w:fill="FFFFFF"/>
               </w:rPr>
-              <w:t xml:space="preserve">or (user_need == 'answer divorce' and minor_children and </w:t>
+              <w:t>divorce</w:t>
+            </w:r>
+            <w:r>
+              <w:rPr>
+                <w:color w:val="FF0000"/>
+                <w:shd w:val="clear" w:color="auto" w:fill="FFFFFF"/>
+              </w:rPr>
+              <w:t xml:space="preserve">' and </w:t>
+            </w:r>
+            <w:proofErr w:type="spellStart"/>
+            <w:r>
+              <w:rPr>
+                <w:color w:val="FF0000"/>
+                <w:shd w:val="clear" w:color="auto" w:fill="FFFFFF"/>
+              </w:rPr>
+              <w:t>minor_children</w:t>
+            </w:r>
+            <w:proofErr w:type="spellEnd"/>
+            <w:r>
+              <w:rPr>
+                <w:color w:val="FF0000"/>
+                <w:shd w:val="clear" w:color="auto" w:fill="FFFFFF"/>
+              </w:rPr>
+              <w:t xml:space="preserve"> and </w:t>
+            </w:r>
+            <w:r>
+              <w:rPr>
+                <w:color w:val="FF0000"/>
+                <w:shd w:val="clear" w:color="auto" w:fill="FFFFFF"/>
+              </w:rPr>
+              <w:t>paternity</w:t>
+            </w:r>
+            <w:r>
+              <w:rPr>
+                <w:color w:val="FF0000"/>
+                <w:shd w:val="clear" w:color="auto" w:fill="FFFFFF"/>
+              </w:rPr>
+              <w:t xml:space="preserve"> == 'do not know'</w:t>
+            </w:r>
+            <w:r>
+              <w:rPr>
+                <w:color w:val="FF0000"/>
+                <w:shd w:val="clear" w:color="auto" w:fill="FFFFFF"/>
+              </w:rPr>
+              <w:t xml:space="preserve">) </w:t>
+            </w:r>
+            <w:r>
+              <w:rPr>
+                <w:color w:val="FF0000"/>
+                <w:shd w:val="clear" w:color="auto" w:fill="FFFFFF"/>
+              </w:rPr>
+              <w:t>or (</w:t>
+            </w:r>
+            <w:proofErr w:type="spellStart"/>
+            <w:r>
+              <w:rPr>
+                <w:color w:val="FF0000"/>
+                <w:shd w:val="clear" w:color="auto" w:fill="FFFFFF"/>
+              </w:rPr>
+              <w:t>user_need</w:t>
+            </w:r>
+            <w:proofErr w:type="spellEnd"/>
+            <w:r>
+              <w:rPr>
+                <w:color w:val="FF0000"/>
+                <w:shd w:val="clear" w:color="auto" w:fill="FFFFFF"/>
+              </w:rPr>
+              <w:t xml:space="preserve"> == 'answer divorce' and </w:t>
+            </w:r>
+            <w:proofErr w:type="spellStart"/>
+            <w:r>
+              <w:rPr>
+                <w:color w:val="FF0000"/>
+                <w:shd w:val="clear" w:color="auto" w:fill="FFFFFF"/>
+              </w:rPr>
+              <w:t>minor_children</w:t>
+            </w:r>
+            <w:proofErr w:type="spellEnd"/>
+            <w:r>
+              <w:rPr>
+                <w:color w:val="FF0000"/>
+                <w:shd w:val="clear" w:color="auto" w:fill="FFFFFF"/>
+              </w:rPr>
+              <w:t xml:space="preserve"> and </w:t>
             </w:r>
             <w:r>
               <w:rPr>
@@ -6437,9 +8095,11 @@
               <w:pStyle w:val="Body"/>
               <w:spacing w:before="0" w:after="0"/>
             </w:pPr>
+            <w:proofErr w:type="spellStart"/>
             <w:r>
               <w:t>paternity_step</w:t>
             </w:r>
+            <w:proofErr w:type="spellEnd"/>
           </w:p>
         </w:tc>
       </w:tr>
@@ -6474,19 +8134,41 @@
               <w:rPr>
                 <w:shd w:val="clear" w:color="auto" w:fill="FFFFFF"/>
               </w:rPr>
-              <w:t xml:space="preserve">{{ </w:t>
-            </w:r>
+              <w:t>{</w:t>
+            </w:r>
+            <w:proofErr w:type="gramStart"/>
             <w:r>
               <w:rPr>
                 <w:shd w:val="clear" w:color="auto" w:fill="FFFFFF"/>
               </w:rPr>
-              <w:t>paternity_step</w:t>
-            </w:r>
+              <w:t xml:space="preserve">{ </w:t>
+            </w:r>
+            <w:proofErr w:type="spellStart"/>
             <w:r>
               <w:rPr>
                 <w:shd w:val="clear" w:color="auto" w:fill="FFFFFF"/>
               </w:rPr>
-              <w:t>.subject }}</w:t>
+              <w:t>paternity</w:t>
+            </w:r>
+            <w:proofErr w:type="gramEnd"/>
+            <w:r>
+              <w:rPr>
+                <w:shd w:val="clear" w:color="auto" w:fill="FFFFFF"/>
+              </w:rPr>
+              <w:t>_step</w:t>
+            </w:r>
+            <w:r>
+              <w:rPr>
+                <w:shd w:val="clear" w:color="auto" w:fill="FFFFFF"/>
+              </w:rPr>
+              <w:t>.subject</w:t>
+            </w:r>
+            <w:proofErr w:type="spellEnd"/>
+            <w:r>
+              <w:rPr>
+                <w:shd w:val="clear" w:color="auto" w:fill="FFFFFF"/>
+              </w:rPr>
+              <w:t xml:space="preserve"> }}</w:t>
             </w:r>
           </w:p>
         </w:tc>
@@ -6561,7 +8243,35 @@
               <w:rPr>
                 <w:shd w:val="clear" w:color="auto" w:fill="FFFFFF"/>
               </w:rPr>
-              <w:t>{%tr endif %}</w:t>
+              <w:t>{%</w:t>
+            </w:r>
+            <w:proofErr w:type="spellStart"/>
+            <w:r>
+              <w:rPr>
+                <w:shd w:val="clear" w:color="auto" w:fill="FFFFFF"/>
+              </w:rPr>
+              <w:t>tr</w:t>
+            </w:r>
+            <w:proofErr w:type="spellEnd"/>
+            <w:r>
+              <w:rPr>
+                <w:shd w:val="clear" w:color="auto" w:fill="FFFFFF"/>
+              </w:rPr>
+              <w:t xml:space="preserve"> </w:t>
+            </w:r>
+            <w:proofErr w:type="spellStart"/>
+            <w:r>
+              <w:rPr>
+                <w:shd w:val="clear" w:color="auto" w:fill="FFFFFF"/>
+              </w:rPr>
+              <w:t>endif</w:t>
+            </w:r>
+            <w:proofErr w:type="spellEnd"/>
+            <w:r>
+              <w:rPr>
+                <w:shd w:val="clear" w:color="auto" w:fill="FFFFFF"/>
+              </w:rPr>
+              <w:t xml:space="preserve"> %}</w:t>
             </w:r>
           </w:p>
         </w:tc>
@@ -6616,14 +8326,26 @@
               </w:rPr>
             </w:pPr>
             <w:r>
-              <w:lastRenderedPageBreak/>
-              <w:t xml:space="preserve">{{ </w:t>
-            </w:r>
-            <w:r>
-              <w:t>get_help</w:t>
-            </w:r>
-            <w:r>
-              <w:t>.subject }}</w:t>
+              <w:t>{</w:t>
+            </w:r>
+            <w:proofErr w:type="gramStart"/>
+            <w:r>
+              <w:t xml:space="preserve">{ </w:t>
+            </w:r>
+            <w:proofErr w:type="spellStart"/>
+            <w:r>
+              <w:t>get</w:t>
+            </w:r>
+            <w:proofErr w:type="gramEnd"/>
+            <w:r>
+              <w:t>_help</w:t>
+            </w:r>
+            <w:r>
+              <w:t>.subject</w:t>
+            </w:r>
+            <w:proofErr w:type="spellEnd"/>
+            <w:r>
+              <w:t xml:space="preserve"> }}</w:t>
             </w:r>
           </w:p>
         </w:tc>
@@ -6672,12 +8394,7 @@
       </w:pPr>
     </w:p>
     <w:sectPr>
-      <w:headerReference w:type="even" r:id="rId25"/>
-      <w:headerReference w:type="default" r:id="rId26"/>
-      <w:footerReference w:type="even" r:id="rId27"/>
-      <w:footerReference w:type="default" r:id="rId28"/>
-      <w:headerReference w:type="first" r:id="rId29"/>
-      <w:footerReference w:type="first" r:id="rId30"/>
+      <w:footerReference w:type="default" r:id="rId24"/>
       <w:pgSz w:w="12240" w:h="15840"/>
       <w:pgMar w:top="245" w:right="1440" w:bottom="274" w:left="1440" w:header="0" w:footer="720" w:gutter="0"/>
       <w:cols w:space="720"/>
@@ -6712,16 +8429,6 @@
   <w:p>
     <w:pPr>
       <w:pStyle w:val="Footer"/>
-    </w:pPr>
-  </w:p>
-</w:ftr>
-</file>
-
-<file path=word/footer2.xml><?xml version="1.0" encoding="utf-8"?>
-<w:ftr xmlns:wpc="http://schemas.microsoft.com/office/word/2010/wordprocessingCanvas" xmlns:mc="http://schemas.openxmlformats.org/markup-compatibility/2006" xmlns:o="urn:schemas-microsoft-com:office:office" xmlns:r="http://schemas.openxmlformats.org/officeDocument/2006/relationships" xmlns:m="http://schemas.openxmlformats.org/officeDocument/2006/math" xmlns:v="urn:schemas-microsoft-com:vml" xmlns:wp14="http://schemas.microsoft.com/office/word/2010/wordprocessingDrawing" xmlns:wp="http://schemas.openxmlformats.org/drawingml/2006/wordprocessingDrawing" xmlns:w10="urn:schemas-microsoft-com:office:word" xmlns:w="http://schemas.openxmlformats.org/wordprocessingml/2006/main" xmlns:w14="http://schemas.microsoft.com/office/word/2010/wordml" xmlns:wpg="http://schemas.microsoft.com/office/word/2010/wordprocessingGroup" xmlns:wpi="http://schemas.microsoft.com/office/word/2010/wordprocessingInk" xmlns:wne="http://schemas.microsoft.com/office/word/2006/wordml" xmlns:wps="http://schemas.microsoft.com/office/word/2010/wordprocessingShape" mc:Ignorable="w14 wp14">
-  <w:p>
-    <w:pPr>
-      <w:pStyle w:val="Footer"/>
       <w:spacing w:before="100" w:afterAutospacing="0"/>
       <w:jc w:val="right"/>
     </w:pPr>
@@ -6738,7 +8445,7 @@
       <w:rPr>
         <w:noProof/>
       </w:rPr>
-      <w:t>4</w:t>
+      <w:t>1</w:t>
     </w:r>
     <w:r>
       <w:fldChar w:fldCharType="end"/>
@@ -6759,7 +8466,7 @@
       <w:rPr>
         <w:noProof/>
       </w:rPr>
-      <w:t>11</w:t>
+      <w:t>10</w:t>
     </w:r>
     <w:r>
       <w:fldChar w:fldCharType="end"/>
@@ -6777,7 +8484,7 @@
       <w:t xml:space="preserve">April </w:t>
     </w:r>
     <w:r>
-      <w:t>12</w:t>
+      <w:t>13</w:t>
     </w:r>
     <w:r>
       <w:t>,</w:t>
@@ -6785,18 +8492,6 @@
     <w:r>
       <w:t xml:space="preserve"> 2026</w:t>
     </w:r>
-    <w:bookmarkStart w:id="4" w:name="_GoBack"/>
-    <w:bookmarkEnd w:id="4"/>
-  </w:p>
-</w:ftr>
-</file>
-
-<file path=word/footer3.xml><?xml version="1.0" encoding="utf-8"?>
-<w:ftr xmlns:wpc="http://schemas.microsoft.com/office/word/2010/wordprocessingCanvas" xmlns:mc="http://schemas.openxmlformats.org/markup-compatibility/2006" xmlns:o="urn:schemas-microsoft-com:office:office" xmlns:r="http://schemas.openxmlformats.org/officeDocument/2006/relationships" xmlns:m="http://schemas.openxmlformats.org/officeDocument/2006/math" xmlns:v="urn:schemas-microsoft-com:vml" xmlns:wp14="http://schemas.microsoft.com/office/word/2010/wordprocessingDrawing" xmlns:wp="http://schemas.openxmlformats.org/drawingml/2006/wordprocessingDrawing" xmlns:w10="urn:schemas-microsoft-com:office:word" xmlns:w="http://schemas.openxmlformats.org/wordprocessingml/2006/main" xmlns:w14="http://schemas.microsoft.com/office/word/2010/wordml" xmlns:wpg="http://schemas.microsoft.com/office/word/2010/wordprocessingGroup" xmlns:wpi="http://schemas.microsoft.com/office/word/2010/wordprocessingInk" xmlns:wne="http://schemas.microsoft.com/office/word/2006/wordml" xmlns:wps="http://schemas.microsoft.com/office/word/2010/wordprocessingShape" mc:Ignorable="w14 wp14">
-  <w:p>
-    <w:pPr>
-      <w:pStyle w:val="Footer"/>
-    </w:pPr>
   </w:p>
 </w:ftr>
 </file>
@@ -6818,36 +8513,6 @@
     </w:p>
   </w:footnote>
 </w:footnotes>
-</file>
-
-<file path=word/header1.xml><?xml version="1.0" encoding="utf-8"?>
-<w:hdr xmlns:wpc="http://schemas.microsoft.com/office/word/2010/wordprocessingCanvas" xmlns:mc="http://schemas.openxmlformats.org/markup-compatibility/2006" xmlns:o="urn:schemas-microsoft-com:office:office" xmlns:r="http://schemas.openxmlformats.org/officeDocument/2006/relationships" xmlns:m="http://schemas.openxmlformats.org/officeDocument/2006/math" xmlns:v="urn:schemas-microsoft-com:vml" xmlns:wp14="http://schemas.microsoft.com/office/word/2010/wordprocessingDrawing" xmlns:wp="http://schemas.openxmlformats.org/drawingml/2006/wordprocessingDrawing" xmlns:w10="urn:schemas-microsoft-com:office:word" xmlns:w="http://schemas.openxmlformats.org/wordprocessingml/2006/main" xmlns:w14="http://schemas.microsoft.com/office/word/2010/wordml" xmlns:wpg="http://schemas.microsoft.com/office/word/2010/wordprocessingGroup" xmlns:wpi="http://schemas.microsoft.com/office/word/2010/wordprocessingInk" xmlns:wne="http://schemas.microsoft.com/office/word/2006/wordml" xmlns:wps="http://schemas.microsoft.com/office/word/2010/wordprocessingShape" mc:Ignorable="w14 wp14">
-  <w:p>
-    <w:pPr>
-      <w:pStyle w:val="Header"/>
-    </w:pPr>
-  </w:p>
-</w:hdr>
-</file>
-
-<file path=word/header2.xml><?xml version="1.0" encoding="utf-8"?>
-<w:hdr xmlns:wpc="http://schemas.microsoft.com/office/word/2010/wordprocessingCanvas" xmlns:mc="http://schemas.openxmlformats.org/markup-compatibility/2006" xmlns:o="urn:schemas-microsoft-com:office:office" xmlns:r="http://schemas.openxmlformats.org/officeDocument/2006/relationships" xmlns:m="http://schemas.openxmlformats.org/officeDocument/2006/math" xmlns:v="urn:schemas-microsoft-com:vml" xmlns:wp14="http://schemas.microsoft.com/office/word/2010/wordprocessingDrawing" xmlns:wp="http://schemas.openxmlformats.org/drawingml/2006/wordprocessingDrawing" xmlns:w10="urn:schemas-microsoft-com:office:word" xmlns:w="http://schemas.openxmlformats.org/wordprocessingml/2006/main" xmlns:w14="http://schemas.microsoft.com/office/word/2010/wordml" xmlns:wpg="http://schemas.microsoft.com/office/word/2010/wordprocessingGroup" xmlns:wpi="http://schemas.microsoft.com/office/word/2010/wordprocessingInk" xmlns:wne="http://schemas.microsoft.com/office/word/2006/wordml" xmlns:wps="http://schemas.microsoft.com/office/word/2010/wordprocessingShape" mc:Ignorable="w14 wp14">
-  <w:p>
-    <w:pPr>
-      <w:pStyle w:val="Header"/>
-    </w:pPr>
-  </w:p>
-</w:hdr>
-</file>
-
-<file path=word/header3.xml><?xml version="1.0" encoding="utf-8"?>
-<w:hdr xmlns:wpc="http://schemas.microsoft.com/office/word/2010/wordprocessingCanvas" xmlns:mc="http://schemas.openxmlformats.org/markup-compatibility/2006" xmlns:o="urn:schemas-microsoft-com:office:office" xmlns:r="http://schemas.openxmlformats.org/officeDocument/2006/relationships" xmlns:m="http://schemas.openxmlformats.org/officeDocument/2006/math" xmlns:v="urn:schemas-microsoft-com:vml" xmlns:wp14="http://schemas.microsoft.com/office/word/2010/wordprocessingDrawing" xmlns:wp="http://schemas.openxmlformats.org/drawingml/2006/wordprocessingDrawing" xmlns:w10="urn:schemas-microsoft-com:office:word" xmlns:w="http://schemas.openxmlformats.org/wordprocessingml/2006/main" xmlns:w14="http://schemas.microsoft.com/office/word/2010/wordml" xmlns:wpg="http://schemas.microsoft.com/office/word/2010/wordprocessingGroup" xmlns:wpi="http://schemas.microsoft.com/office/word/2010/wordprocessingInk" xmlns:wne="http://schemas.microsoft.com/office/word/2006/wordml" xmlns:wps="http://schemas.microsoft.com/office/word/2010/wordprocessingShape" mc:Ignorable="w14 wp14">
-  <w:p>
-    <w:pPr>
-      <w:pStyle w:val="Header"/>
-    </w:pPr>
-  </w:p>
-</w:hdr>
 </file>
 
 <file path=word/numbering.xml><?xml version="1.0" encoding="utf-8"?>
@@ -12875,7 +14540,7 @@
 </file>
 
 <file path=customXml/itemProps1.xml><?xml version="1.0" encoding="utf-8"?>
-<ds:datastoreItem xmlns:ds="http://schemas.openxmlformats.org/officeDocument/2006/customXml" ds:itemID="{3A3EEAC7-0F7E-44FD-9F6C-696D01A6D530}">
+<ds:datastoreItem xmlns:ds="http://schemas.openxmlformats.org/officeDocument/2006/customXml" ds:itemID="{F2335B62-EE7E-496E-B365-687464127568}">
   <ds:schemaRefs>
     <ds:schemaRef ds:uri="http://schemas.openxmlformats.org/officeDocument/2006/bibliography"/>
   </ds:schemaRefs>

</xml_diff>

<commit_message>
typo type_of_resonce instead of type_of_response in aswer_domestic_violence_step.content and missing period at end of first sentence.
</commit_message>
<xml_diff>
--- a/docassemble/RespondingCaseToEndYourMarriageActionPlan/data/templates/responding_ending_marriage_action_plan.docx
+++ b/docassemble/RespondingCaseToEndYourMarriageActionPlan/data/templates/responding_ending_marriage_action_plan.docx
@@ -54,7 +54,7 @@
               <w:rPr>
                 <w:color w:val="92D050"/>
               </w:rPr>
-              <w:t>6</w:t>
+              <w:t>7</w:t>
             </w:r>
             <w:r>
               <w:rPr>
@@ -1918,6 +1918,416 @@
           </w:tcPr>
           <w:p>
             <w:pPr>
+              <w:pStyle w:val="Body"/>
+              <w:spacing w:before="0" w:after="0"/>
+            </w:pPr>
+            <w:r>
+              <w:rPr>
+                <w:color w:val="FF0000"/>
+              </w:rPr>
+              <w:t xml:space="preserve">{%tr </w:t>
+            </w:r>
+            <w:r>
+              <w:rPr>
+                <w:color w:val="FF0000"/>
+              </w:rPr>
+              <w:t>if user_need == 'answer divorce' and type_of_response['ak divorce case'] and case_type</w:t>
+            </w:r>
+            <w:r>
+              <w:rPr>
+                <w:color w:val="FF0000"/>
+              </w:rPr>
+              <w:t xml:space="preserve"> == 'legal </w:t>
+            </w:r>
+            <w:r>
+              <w:rPr>
+                <w:color w:val="FF0000"/>
+              </w:rPr>
+              <w:lastRenderedPageBreak/>
+              <w:t xml:space="preserve">separation' </w:t>
+            </w:r>
+            <w:r>
+              <w:rPr>
+                <w:color w:val="FF0000"/>
+              </w:rPr>
+              <w:t xml:space="preserve">and </w:t>
+            </w:r>
+            <w:r>
+              <w:rPr>
+                <w:color w:val="FF0000"/>
+              </w:rPr>
+              <w:t>want_legal_separation == '</w:t>
+            </w:r>
+            <w:r>
+              <w:rPr>
+                <w:color w:val="FF0000"/>
+              </w:rPr>
+              <w:t>unsure</w:t>
+            </w:r>
+            <w:r>
+              <w:rPr>
+                <w:color w:val="FF0000"/>
+              </w:rPr>
+              <w:t>'</w:t>
+            </w:r>
+            <w:r>
+              <w:rPr>
+                <w:color w:val="FF0000"/>
+              </w:rPr>
+              <w:t xml:space="preserve"> </w:t>
+            </w:r>
+            <w:r>
+              <w:rPr>
+                <w:color w:val="FF0000"/>
+              </w:rPr>
+              <w:t>%}</w:t>
+            </w:r>
+          </w:p>
+        </w:tc>
+        <w:tc>
+          <w:tcPr>
+            <w:tcW w:w="7618" w:type="dxa"/>
+            <w:tcBorders>
+              <w:top w:val="nil"/>
+              <w:left w:val="nil"/>
+              <w:bottom w:val="nil"/>
+              <w:right w:val="nil"/>
+            </w:tcBorders>
+            <w:tcMar>
+              <w:top w:w="0" w:type="dxa"/>
+              <w:left w:w="108" w:type="dxa"/>
+              <w:right w:w="108" w:type="dxa"/>
+            </w:tcMar>
+          </w:tcPr>
+          <w:p>
+            <w:pPr>
+              <w:pStyle w:val="Body"/>
+              <w:spacing w:before="0" w:after="0"/>
+            </w:pPr>
+            <w:r>
+              <w:lastRenderedPageBreak/>
+              <w:t>divorce_legal_separation_diff_step</w:t>
+            </w:r>
+          </w:p>
+        </w:tc>
+      </w:tr>
+      <w:tr>
+        <w:trPr>
+          <w:jc w:val="center"/>
+        </w:trPr>
+        <w:tc>
+          <w:tcPr>
+            <w:tcW w:w="2635" w:type="dxa"/>
+            <w:tcBorders>
+              <w:top w:val="nil"/>
+              <w:left w:val="nil"/>
+              <w:bottom w:val="nil"/>
+              <w:right w:val="nil"/>
+            </w:tcBorders>
+            <w:tcMar>
+              <w:top w:w="0" w:type="dxa"/>
+              <w:left w:w="108" w:type="dxa"/>
+              <w:right w:w="108" w:type="dxa"/>
+            </w:tcMar>
+          </w:tcPr>
+          <w:p>
+            <w:pPr>
+              <w:pStyle w:val="Heading2"/>
+            </w:pPr>
+            <w:r>
+              <w:t xml:space="preserve">{{ </w:t>
+            </w:r>
+            <w:r>
+              <w:t>divorce_legal_separation_diff_step</w:t>
+            </w:r>
+            <w:r>
+              <w:t>.subject }}</w:t>
+            </w:r>
+          </w:p>
+        </w:tc>
+        <w:tc>
+          <w:tcPr>
+            <w:tcW w:w="7618" w:type="dxa"/>
+            <w:tcBorders>
+              <w:top w:val="nil"/>
+              <w:left w:val="nil"/>
+              <w:bottom w:val="nil"/>
+              <w:right w:val="nil"/>
+            </w:tcBorders>
+            <w:tcMar>
+              <w:top w:w="0" w:type="dxa"/>
+              <w:left w:w="108" w:type="dxa"/>
+              <w:right w:w="108" w:type="dxa"/>
+            </w:tcMar>
+          </w:tcPr>
+          <w:p>
+            <w:pPr>
+              <w:pStyle w:val="Body"/>
+              <w:spacing w:before="0" w:beforeAutospacing="0" w:after="60" w:afterAutospacing="0"/>
+            </w:pPr>
+          </w:p>
+          <w:p>
+            <w:pPr>
+              <w:pStyle w:val="Body"/>
+            </w:pPr>
+            <w:r>
+              <w:t>If the health insurance will not change after a legal separation, the spouses may want a legal separation to keep the coverage.</w:t>
+            </w:r>
+          </w:p>
+          <w:p>
+            <w:pPr>
+              <w:pStyle w:val="Body"/>
+            </w:pPr>
+            <w:r>
+              <w:t xml:space="preserve">Some insurance companies may not continue coverage after the court issues a </w:t>
+            </w:r>
+            <w:r>
+              <w:rPr>
+                <w:b/>
+              </w:rPr>
+              <w:t>Legal Separation Decree</w:t>
+            </w:r>
+            <w:r>
+              <w:t xml:space="preserve"> so if you need your spouse’s medical insurance, talk to a lawyer before the legal separation is finalized to understand your options for continued coverage.</w:t>
+            </w:r>
+          </w:p>
+          <w:p>
+            <w:pPr>
+              <w:pStyle w:val="Body"/>
+            </w:pPr>
+            <w:r>
+              <w:t xml:space="preserve">If you and your spouse want to legally separate but stay married to protect significant religious, financial, social or legal interests, the court can issue a </w:t>
+            </w:r>
+            <w:r>
+              <w:rPr>
+                <w:b/>
+              </w:rPr>
+              <w:t>Decree of Legal Separation</w:t>
+            </w:r>
+            <w:r>
+              <w:t xml:space="preserve">. You will still be married, but the court will </w:t>
+            </w:r>
+            <w:r>
+              <w:rPr>
+                <w:color w:val="FF0000"/>
+              </w:rPr>
+              <w:t>{% if not minor_children and wife_is_pregnant == 'not pregnant'</w:t>
+            </w:r>
+            <w:r>
+              <w:rPr>
+                <w:color w:val="FF0000"/>
+              </w:rPr>
+              <w:t xml:space="preserve"> %}</w:t>
+            </w:r>
+            <w:r>
+              <w:t>divide the property and debt earned or received during the marriage.</w:t>
+            </w:r>
+            <w:r>
+              <w:rPr>
+                <w:color w:val="FF0000"/>
+              </w:rPr>
+              <w:t>{</w:t>
+            </w:r>
+            <w:r>
+              <w:rPr>
+                <w:color w:val="FF0000"/>
+              </w:rPr>
+              <w:t>% else</w:t>
+            </w:r>
+            <w:r>
+              <w:rPr>
+                <w:color w:val="FF0000"/>
+              </w:rPr>
+              <w:t>%}</w:t>
+            </w:r>
+          </w:p>
+          <w:p>
+            <w:pPr>
+              <w:pStyle w:val="Body"/>
+              <w:widowControl/>
+              <w:numPr>
+                <w:ilvl w:val="0"/>
+                <w:numId w:val="33"/>
+              </w:numPr>
+              <w:autoSpaceDE/>
+              <w:autoSpaceDN/>
+              <w:ind w:left="404"/>
+            </w:pPr>
+            <w:r>
+              <w:t>Divide the property and debt earned or received during the marriage.</w:t>
+            </w:r>
+          </w:p>
+          <w:p>
+            <w:pPr>
+              <w:pStyle w:val="Body"/>
+              <w:widowControl/>
+              <w:numPr>
+                <w:ilvl w:val="0"/>
+                <w:numId w:val="33"/>
+              </w:numPr>
+              <w:autoSpaceDE/>
+              <w:autoSpaceDN/>
+              <w:ind w:left="404"/>
+            </w:pPr>
+            <w:r>
+              <w:t>Issue a parenting plan that states:</w:t>
+            </w:r>
+          </w:p>
+          <w:p>
+            <w:pPr>
+              <w:pStyle w:val="Body"/>
+            </w:pPr>
+            <w:r>
+              <w:t xml:space="preserve">      1. A schedule for each parent to spend time with the children and</w:t>
+            </w:r>
+          </w:p>
+          <w:p>
+            <w:pPr>
+              <w:pStyle w:val="Body"/>
+            </w:pPr>
+            <w:r>
+              <w:t xml:space="preserve">      2. How the parents make decisions about the children. And</w:t>
+            </w:r>
+          </w:p>
+          <w:p>
+            <w:pPr>
+              <w:pStyle w:val="Body"/>
+              <w:widowControl/>
+              <w:numPr>
+                <w:ilvl w:val="0"/>
+                <w:numId w:val="33"/>
+              </w:numPr>
+              <w:autoSpaceDE/>
+              <w:autoSpaceDN/>
+              <w:ind w:left="404"/>
+            </w:pPr>
+            <w:r>
+              <w:t>Issue a child support order that states which parent will pay child support according to the child support rule.</w:t>
+            </w:r>
+          </w:p>
+          <w:p>
+            <w:pPr>
+              <w:pStyle w:val="Body"/>
+            </w:pPr>
+            <w:r>
+              <w:rPr>
+                <w:color w:val="FF0000"/>
+              </w:rPr>
+              <w:t>{</w:t>
+            </w:r>
+            <w:r>
+              <w:rPr>
+                <w:color w:val="FF0000"/>
+              </w:rPr>
+              <w:t>% endif</w:t>
+            </w:r>
+            <w:r>
+              <w:rPr>
+                <w:color w:val="FF0000"/>
+              </w:rPr>
+              <w:t xml:space="preserve"> %}</w:t>
+            </w:r>
+          </w:p>
+          <w:p>
+            <w:pPr>
+              <w:pStyle w:val="Body"/>
+            </w:pPr>
+            <w:r>
+              <w:t>Remember, either you or your spouse can turn a legal separation into a divorce at any time</w:t>
+            </w:r>
+          </w:p>
+          <w:p>
+            <w:pPr>
+              <w:pStyle w:val="Body"/>
+            </w:pPr>
+            <w:r>
+              <w:t>If you are not sure what you want, you can proceed with a legal separation, and change it to a divorce at any time.</w:t>
+            </w:r>
+          </w:p>
+          <w:p>
+            <w:pPr>
+              <w:pStyle w:val="Body"/>
+              <w:spacing w:before="0" w:after="0"/>
+            </w:pPr>
+            <w:r>
+              <w:t>If you decide you do not want a legal separation, check the box telling the court “I do not agree to a legal separation because I want the marriage to end in a divorce” in the “Counterclaims” section of your Answer (pages 2-3).</w:t>
+            </w:r>
+          </w:p>
+        </w:tc>
+      </w:tr>
+      <w:tr>
+        <w:trPr>
+          <w:jc w:val="center"/>
+        </w:trPr>
+        <w:tc>
+          <w:tcPr>
+            <w:tcW w:w="2635" w:type="dxa"/>
+            <w:tcBorders>
+              <w:top w:val="nil"/>
+              <w:left w:val="nil"/>
+              <w:bottom w:val="nil"/>
+              <w:right w:val="nil"/>
+            </w:tcBorders>
+            <w:tcMar>
+              <w:top w:w="0" w:type="dxa"/>
+              <w:left w:w="108" w:type="dxa"/>
+              <w:right w:w="108" w:type="dxa"/>
+            </w:tcMar>
+          </w:tcPr>
+          <w:p>
+            <w:pPr>
+              <w:pStyle w:val="Body"/>
+              <w:spacing w:before="0" w:after="0"/>
+            </w:pPr>
+            <w:r>
+              <w:t>{%tr endif %}</w:t>
+            </w:r>
+          </w:p>
+        </w:tc>
+        <w:tc>
+          <w:tcPr>
+            <w:tcW w:w="7618" w:type="dxa"/>
+            <w:tcBorders>
+              <w:top w:val="nil"/>
+              <w:left w:val="nil"/>
+              <w:bottom w:val="nil"/>
+              <w:right w:val="nil"/>
+            </w:tcBorders>
+            <w:tcMar>
+              <w:top w:w="0" w:type="dxa"/>
+              <w:left w:w="108" w:type="dxa"/>
+              <w:right w:w="108" w:type="dxa"/>
+            </w:tcMar>
+          </w:tcPr>
+          <w:p>
+            <w:pPr>
+              <w:pStyle w:val="Body"/>
+              <w:spacing w:before="0" w:after="0"/>
+            </w:pPr>
+          </w:p>
+        </w:tc>
+      </w:tr>
+      <w:tr>
+        <w:trPr>
+          <w:jc w:val="center"/>
+        </w:trPr>
+        <w:tc>
+          <w:tcPr>
+            <w:tcW w:w="2635" w:type="dxa"/>
+            <w:tcBorders>
+              <w:top w:val="nil"/>
+              <w:left w:val="nil"/>
+              <w:bottom w:val="nil"/>
+              <w:right w:val="nil"/>
+            </w:tcBorders>
+            <w:tcMar>
+              <w:top w:w="0" w:type="dxa"/>
+              <w:left w:w="108" w:type="dxa"/>
+              <w:right w:w="108" w:type="dxa"/>
+            </w:tcMar>
+          </w:tcPr>
+          <w:p>
+            <w:pPr>
               <w:pStyle w:val="Heading2"/>
               <w:outlineLvl w:val="1"/>
               <w:rPr>
@@ -1928,6 +2338,7 @@
               <w:t xml:space="preserve">{{ </w:t>
             </w:r>
             <w:r>
+              <w:lastRenderedPageBreak/>
               <w:t>get_help</w:t>
             </w:r>
             <w:r>
@@ -1962,6 +2373,7 @@
               <w:spacing w:before="100" w:after="100"/>
             </w:pPr>
             <w:r>
+              <w:lastRenderedPageBreak/>
               <w:t>{{p (include_docx_template("docassemble.AKA2JBranding:get_help</w:t>
             </w:r>
             <w:r>

</xml_diff>

<commit_message>
Fixed want_help_to_agree, and pushed to branding package on github plus  some tests in ak divorce case feature
</commit_message>
<xml_diff>
--- a/docassemble/RespondingCaseToEndYourMarriageActionPlan/data/templates/responding_ending_marriage_action_plan.docx
+++ b/docassemble/RespondingCaseToEndYourMarriageActionPlan/data/templates/responding_ending_marriage_action_plan.docx
@@ -506,33 +506,12 @@
               <w:spacing w:before="800" w:after="0"/>
             </w:pPr>
             <w:r>
-              <w:t xml:space="preserve">Your Action Plan in </w:t>
-            </w:r>
-            <w:r>
-              <w:t>{{</w:t>
-            </w:r>
-            <w:r>
-              <w:t xml:space="preserve"> </w:t>
-            </w:r>
-            <w:proofErr w:type="spellStart"/>
-            <w:r>
-              <w:t>step_list</w:t>
-            </w:r>
-            <w:proofErr w:type="spellEnd"/>
-            <w:r>
-              <w:t xml:space="preserve"> | </w:t>
-            </w:r>
-            <w:r>
-              <w:t xml:space="preserve">length </w:t>
-            </w:r>
+              <w:t>Your Action Plan in {{ step_list | length }} steps</w:t>
+            </w:r>
+            <w:proofErr w:type="spellStart"/>
+            <w:proofErr w:type="spellEnd"/>
             <w:bookmarkStart w:id="0" w:name="_GoBack"/>
             <w:bookmarkEnd w:id="0"/>
-            <w:r>
-              <w:t>}}</w:t>
-            </w:r>
-            <w:r>
-              <w:t xml:space="preserve"> steps</w:t>
-            </w:r>
           </w:p>
         </w:tc>
       </w:tr>
@@ -585,24 +564,12 @@
               <w:spacing w:before="0" w:after="0"/>
             </w:pPr>
             <w:r>
-              <w:t>{%</w:t>
-            </w:r>
-            <w:proofErr w:type="spellStart"/>
-            <w:r>
-              <w:t>tr</w:t>
-            </w:r>
-            <w:proofErr w:type="spellEnd"/>
-            <w:r>
-              <w:t xml:space="preserve"> if </w:t>
-            </w:r>
-            <w:proofErr w:type="spellStart"/>
-            <w:r>
-              <w:t>user_need</w:t>
-            </w:r>
-            <w:proofErr w:type="spellEnd"/>
-            <w:r>
-              <w:t xml:space="preserve"> == 'answer divorce' and type_of_response['stay married'] %}</w:t>
-            </w:r>
+              <w:t>{%tr if user_need == 'answer divorce' and type_of_response['stay married'] %}</w:t>
+            </w:r>
+            <w:proofErr w:type="spellStart"/>
+            <w:proofErr w:type="spellEnd"/>
+            <w:proofErr w:type="spellStart"/>
+            <w:proofErr w:type="spellEnd"/>
           </w:p>
         </w:tc>
         <w:tc>
@@ -656,30 +623,12 @@
               <w:outlineLvl w:val="1"/>
             </w:pPr>
             <w:r>
-              <w:t>{</w:t>
+              <w:t>{{ want_help_to_agree_step.subject }}</w:t>
             </w:r>
             <w:proofErr w:type="gramStart"/>
-            <w:r>
-              <w:t xml:space="preserve">{ </w:t>
-            </w:r>
-            <w:proofErr w:type="spellStart"/>
-            <w:r>
-              <w:t>want</w:t>
-            </w:r>
+            <w:proofErr w:type="spellStart"/>
             <w:proofErr w:type="gramEnd"/>
-            <w:r>
-              <w:t>_help_to_agree</w:t>
-            </w:r>
-            <w:r>
-              <w:t>_</w:t>
-            </w:r>
-            <w:r>
-              <w:t>step.subject</w:t>
-            </w:r>
-            <w:proofErr w:type="spellEnd"/>
-            <w:r>
-              <w:t xml:space="preserve"> }}</w:t>
-            </w:r>
+            <w:proofErr w:type="spellEnd"/>
           </w:p>
         </w:tc>
         <w:tc>
@@ -712,19 +661,7 @@
               </w:rPr>
             </w:pPr>
             <w:r>
-              <w:t>{{p (include_docx_template</w:t>
-            </w:r>
-            <w:r>
-              <w:t>("docassemble.AKA2JBranding:</w:t>
-            </w:r>
-            <w:r>
-              <w:t>want_help_to_agree_content</w:t>
-            </w:r>
-            <w:r>
-              <w:t>.docx</w:t>
-            </w:r>
-            <w:r>
-              <w:t>")) }}</w:t>
+              <w:t>{{p (include_docx_template("docassemble.AKA2JBranding:want_help_to_agree_content.docx")) }}</w:t>
             </w:r>
           </w:p>
         </w:tc>
@@ -754,24 +691,12 @@
               <w:spacing w:before="0" w:after="0"/>
             </w:pPr>
             <w:r>
-              <w:t>{%</w:t>
-            </w:r>
-            <w:proofErr w:type="spellStart"/>
-            <w:r>
-              <w:t>tr</w:t>
-            </w:r>
-            <w:proofErr w:type="spellEnd"/>
-            <w:r>
-              <w:t xml:space="preserve"> </w:t>
-            </w:r>
-            <w:proofErr w:type="spellStart"/>
-            <w:r>
-              <w:t>endif</w:t>
-            </w:r>
-            <w:proofErr w:type="spellEnd"/>
-            <w:r>
-              <w:t xml:space="preserve"> %}</w:t>
-            </w:r>
+              <w:t>{%tr endif %}</w:t>
+            </w:r>
+            <w:proofErr w:type="spellStart"/>
+            <w:proofErr w:type="spellEnd"/>
+            <w:proofErr w:type="spellStart"/>
+            <w:proofErr w:type="spellEnd"/>
           </w:p>
         </w:tc>
         <w:tc>
@@ -828,48 +753,12 @@
               <w:rPr>
                 <w:shd w:val="clear" w:color="auto" w:fill="FFFFFF"/>
               </w:rPr>
-              <w:t>{%</w:t>
-            </w:r>
-            <w:proofErr w:type="spellStart"/>
-            <w:r>
-              <w:rPr>
-                <w:shd w:val="clear" w:color="auto" w:fill="FFFFFF"/>
-              </w:rPr>
-              <w:t>tr</w:t>
-            </w:r>
-            <w:proofErr w:type="spellEnd"/>
-            <w:r>
-              <w:rPr>
-                <w:shd w:val="clear" w:color="auto" w:fill="FFFFFF"/>
-              </w:rPr>
-              <w:t xml:space="preserve"> if type_of_response['wrong state'] or (type_of_response['case in 2 states'] and </w:t>
-            </w:r>
-            <w:proofErr w:type="spellStart"/>
-            <w:r>
-              <w:rPr>
-                <w:shd w:val="clear" w:color="auto" w:fill="FFFFFF"/>
-              </w:rPr>
-              <w:t>stage_of_other_case</w:t>
-            </w:r>
-            <w:proofErr w:type="spellEnd"/>
-            <w:r>
-              <w:rPr>
-                <w:shd w:val="clear" w:color="auto" w:fill="FFFFFF"/>
-              </w:rPr>
-              <w:t xml:space="preserve"> in('still going', '</w:t>
-            </w:r>
-            <w:r>
-              <w:rPr>
-                <w:shd w:val="clear" w:color="auto" w:fill="FFFFFF"/>
-              </w:rPr>
-              <w:t>ended with no order</w:t>
-            </w:r>
-            <w:r>
-              <w:rPr>
-                <w:shd w:val="clear" w:color="auto" w:fill="FFFFFF"/>
-              </w:rPr>
-              <w:t>')) %}</w:t>
-            </w:r>
+              <w:t>{%tr if type_of_response['wrong state'] or (type_of_response['case in 2 states'] and stage_of_other_case in('still going', 'ended with no order')) %}</w:t>
+            </w:r>
+            <w:proofErr w:type="spellStart"/>
+            <w:proofErr w:type="spellEnd"/>
+            <w:proofErr w:type="spellStart"/>
+            <w:proofErr w:type="spellEnd"/>
           </w:p>
         </w:tc>
         <w:tc>
@@ -895,19 +784,10 @@
               <w:rPr>
                 <w:shd w:val="clear" w:color="auto" w:fill="92D050"/>
               </w:rPr>
-              <w:t>Green</w:t>
-            </w:r>
-            <w:r>
-              <w:t xml:space="preserve"> = thinks wrong place; no other case or (</w:t>
-            </w:r>
-            <w:proofErr w:type="spellStart"/>
-            <w:r>
-              <w:t>other_case</w:t>
-            </w:r>
-            <w:proofErr w:type="spellEnd"/>
-            <w:r>
-              <w:t xml:space="preserve"> and ongoing == 'no') </w:t>
-            </w:r>
+              <w:t xml:space="preserve">Green = thinks wrong place; no other case or (other_case and ongoing == 'no') </w:t>
+            </w:r>
+            <w:proofErr w:type="spellStart"/>
+            <w:proofErr w:type="spellEnd"/>
           </w:p>
           <w:p>
             <w:pPr>
@@ -917,10 +797,7 @@
               <w:rPr>
                 <w:shd w:val="clear" w:color="auto" w:fill="00B0F0"/>
               </w:rPr>
-              <w:t>Blue</w:t>
-            </w:r>
-            <w:r>
-              <w:t xml:space="preserve"> = now that spouse started, there are 2 cases </w:t>
+              <w:t xml:space="preserve">Blue = now that spouse started, there are 2 cases </w:t>
             </w:r>
           </w:p>
           <w:p>
@@ -938,21 +815,7 @@
                 <w:sz w:val="24"/>
                 <w:shd w:val="clear" w:color="auto" w:fill="DBD600"/>
               </w:rPr>
-              <w:t>Yellow</w:t>
-            </w:r>
-            <w:r>
-              <w:rPr>
-                <w:color w:val="202529"/>
-                <w:sz w:val="24"/>
-              </w:rPr>
-              <w:t xml:space="preserve"> = </w:t>
-            </w:r>
-            <w:r>
-              <w:rPr>
-                <w:color w:val="202529"/>
-                <w:sz w:val="24"/>
-              </w:rPr>
-              <w:t>both</w:t>
+              <w:t>Yellow = both</w:t>
             </w:r>
           </w:p>
           <w:p>
@@ -996,30 +859,12 @@
               <w:outlineLvl w:val="1"/>
             </w:pPr>
             <w:r>
-              <w:t>{</w:t>
+              <w:t>{{ answer_jurisdiction_step.subject }}</w:t>
             </w:r>
             <w:proofErr w:type="gramStart"/>
-            <w:r>
-              <w:t>{</w:t>
-            </w:r>
-            <w:r>
-              <w:t xml:space="preserve"> </w:t>
-            </w:r>
-            <w:proofErr w:type="spellStart"/>
-            <w:r>
-              <w:t>answer</w:t>
-            </w:r>
+            <w:proofErr w:type="spellStart"/>
             <w:proofErr w:type="gramEnd"/>
-            <w:r>
-              <w:t>_jurisdiction_ste</w:t>
-            </w:r>
-            <w:r>
-              <w:t>p.subject</w:t>
-            </w:r>
-            <w:proofErr w:type="spellEnd"/>
-            <w:r>
-              <w:t xml:space="preserve"> }}</w:t>
-            </w:r>
+            <w:proofErr w:type="spellEnd"/>
           </w:p>
         </w:tc>
         <w:tc>
@@ -1051,25 +896,7 @@
               </w:rPr>
             </w:pPr>
             <w:r>
-              <w:t>{{p (include_docx_template("</w:t>
-            </w:r>
-            <w:r>
-              <w:t>docassemble.AKA2JBranding:</w:t>
-            </w:r>
-            <w:r>
-              <w:t>answer_jurisdictio</w:t>
-            </w:r>
-            <w:r>
-              <w:t>n</w:t>
-            </w:r>
-            <w:r>
-              <w:t>_content</w:t>
-            </w:r>
-            <w:r>
-              <w:t>.docx</w:t>
-            </w:r>
-            <w:r>
-              <w:t>")) }}</w:t>
+              <w:t>{{p (include_docx_template("docassemble.AKA2JBranding:answer_jurisdiction_content.docx")) }}</w:t>
             </w:r>
           </w:p>
         </w:tc>
@@ -1099,24 +926,12 @@
               <w:spacing w:before="0" w:after="0"/>
             </w:pPr>
             <w:r>
-              <w:t>{%</w:t>
-            </w:r>
-            <w:proofErr w:type="spellStart"/>
-            <w:r>
-              <w:t>tr</w:t>
-            </w:r>
-            <w:proofErr w:type="spellEnd"/>
-            <w:r>
-              <w:t xml:space="preserve"> </w:t>
-            </w:r>
-            <w:proofErr w:type="spellStart"/>
-            <w:r>
-              <w:t>endif</w:t>
-            </w:r>
-            <w:proofErr w:type="spellEnd"/>
-            <w:r>
-              <w:t xml:space="preserve"> %}</w:t>
-            </w:r>
+              <w:t>{%tr endif %}</w:t>
+            </w:r>
+            <w:proofErr w:type="spellStart"/>
+            <w:proofErr w:type="spellEnd"/>
+            <w:proofErr w:type="spellStart"/>
+            <w:proofErr w:type="spellEnd"/>
           </w:p>
         </w:tc>
         <w:tc>
@@ -1170,46 +985,10 @@
               <w:spacing w:before="0" w:after="0"/>
             </w:pPr>
             <w:r>
-              <w:t>{%</w:t>
-            </w:r>
-            <w:proofErr w:type="spellStart"/>
-            <w:r>
-              <w:t>tr</w:t>
-            </w:r>
-            <w:proofErr w:type="spellEnd"/>
-            <w:r>
-              <w:t xml:space="preserve"> if</w:t>
-            </w:r>
-            <w:r>
-              <w:t xml:space="preserve"> </w:t>
-            </w:r>
-            <w:r>
-              <w:t>type_of_response</w:t>
-            </w:r>
-            <w:r>
-              <w:t>['</w:t>
-            </w:r>
-            <w:r>
-              <w:t>improper</w:t>
-            </w:r>
-            <w:r>
-              <w:t xml:space="preserve"> </w:t>
-            </w:r>
-            <w:r>
-              <w:t>service</w:t>
-            </w:r>
-            <w:r>
-              <w:t>']</w:t>
-            </w:r>
-            <w:r>
-              <w:t xml:space="preserve"> </w:t>
-            </w:r>
-            <w:r>
-              <w:t xml:space="preserve">or type_of_response['default'] </w:t>
-            </w:r>
-            <w:r>
-              <w:t>%}</w:t>
-            </w:r>
+              <w:t>{%tr if type_of_response['improper service'] or type_of_response['default'] %}</w:t>
+            </w:r>
+            <w:proofErr w:type="spellStart"/>
+            <w:proofErr w:type="spellEnd"/>
           </w:p>
         </w:tc>
         <w:tc>
@@ -1437,45 +1216,12 @@
               </w:rPr>
             </w:pPr>
             <w:r>
-              <w:t>{%</w:t>
-            </w:r>
-            <w:proofErr w:type="spellStart"/>
-            <w:r>
-              <w:t>tr</w:t>
-            </w:r>
-            <w:proofErr w:type="spellEnd"/>
-            <w:r>
-              <w:t xml:space="preserve"> if</w:t>
-            </w:r>
-            <w:r>
-              <w:t xml:space="preserve"> </w:t>
-            </w:r>
-            <w:proofErr w:type="spellStart"/>
-            <w:r>
-              <w:t>type_of_response</w:t>
-            </w:r>
-            <w:r>
-              <w:t>.all_true</w:t>
-            </w:r>
-            <w:proofErr w:type="spellEnd"/>
-            <w:r>
-              <w:t>('</w:t>
-            </w:r>
-            <w:r>
-              <w:t>improper</w:t>
-            </w:r>
-            <w:r>
-              <w:t xml:space="preserve"> </w:t>
-            </w:r>
-            <w:r>
-              <w:t>service</w:t>
-            </w:r>
-            <w:r>
-              <w:t xml:space="preserve">', exclusive = True) </w:t>
-            </w:r>
-            <w:r>
-              <w:t>%}</w:t>
-            </w:r>
+              <w:t>{%tr if type_of_response.all_true('improper service', exclusive = True) %}</w:t>
+            </w:r>
+            <w:proofErr w:type="spellStart"/>
+            <w:proofErr w:type="spellEnd"/>
+            <w:proofErr w:type="spellStart"/>
+            <w:proofErr w:type="spellEnd"/>
           </w:p>
         </w:tc>
         <w:tc>
@@ -1537,28 +1283,12 @@
                 <w:rFonts w:eastAsia="Calibri"/>
                 <w:shd w:val="clear" w:color="auto" w:fill="FFFFFF"/>
               </w:rPr>
-              <w:t>{</w:t>
+              <w:t>{{ decide_after_improper_service_step }}</w:t>
             </w:r>
             <w:proofErr w:type="gramStart"/>
-            <w:r>
-              <w:rPr>
-                <w:rFonts w:eastAsia="Calibri"/>
-                <w:shd w:val="clear" w:color="auto" w:fill="FFFFFF"/>
-              </w:rPr>
-              <w:t xml:space="preserve">{ </w:t>
-            </w:r>
-            <w:proofErr w:type="spellStart"/>
-            <w:r>
-              <w:t>decide</w:t>
-            </w:r>
+            <w:proofErr w:type="spellStart"/>
             <w:proofErr w:type="gramEnd"/>
-            <w:r>
-              <w:t>_after_improper_service_step</w:t>
-            </w:r>
-            <w:proofErr w:type="spellEnd"/>
-            <w:r>
-              <w:t xml:space="preserve"> }}</w:t>
-            </w:r>
+            <w:proofErr w:type="spellEnd"/>
           </w:p>
         </w:tc>
         <w:tc>
@@ -1588,16 +1318,7 @@
               <w:spacing w:before="0" w:beforeAutospacing="0" w:after="100"/>
             </w:pPr>
             <w:r>
-              <w:t>{{p (include_docx_template("docassemble.AKA2JBranding:</w:t>
-            </w:r>
-            <w:r>
-              <w:t>decide_after_improper_service_</w:t>
-            </w:r>
-            <w:r>
-              <w:t>content.docx</w:t>
-            </w:r>
-            <w:r>
-              <w:t>")) }}</w:t>
+              <w:t>{{p (include_docx_template("docassemble.AKA2JBranding:decide_after_improper_service_content.docx")) }}</w:t>
             </w:r>
           </w:p>
         </w:tc>
@@ -1627,24 +1348,12 @@
               <w:spacing w:before="0" w:after="0"/>
             </w:pPr>
             <w:r>
-              <w:t>{%</w:t>
-            </w:r>
-            <w:proofErr w:type="spellStart"/>
-            <w:r>
-              <w:t>tr</w:t>
-            </w:r>
-            <w:proofErr w:type="spellEnd"/>
-            <w:r>
-              <w:t xml:space="preserve"> </w:t>
-            </w:r>
-            <w:proofErr w:type="spellStart"/>
-            <w:r>
-              <w:t>endif</w:t>
-            </w:r>
-            <w:proofErr w:type="spellEnd"/>
-            <w:r>
-              <w:t xml:space="preserve"> %}</w:t>
-            </w:r>
+              <w:t>{%tr endif %}</w:t>
+            </w:r>
+            <w:proofErr w:type="spellStart"/>
+            <w:proofErr w:type="spellEnd"/>
+            <w:proofErr w:type="spellStart"/>
+            <w:proofErr w:type="spellEnd"/>
           </w:p>
         </w:tc>
         <w:tc>
@@ -1695,45 +1404,12 @@
               <w:spacing w:before="0" w:after="0"/>
             </w:pPr>
             <w:r>
-              <w:t>{%</w:t>
-            </w:r>
-            <w:proofErr w:type="spellStart"/>
-            <w:r>
-              <w:t>tr</w:t>
-            </w:r>
-            <w:proofErr w:type="spellEnd"/>
-            <w:r>
-              <w:t xml:space="preserve"> </w:t>
-            </w:r>
-            <w:r>
-              <w:rPr>
-                <w:rStyle w:val="interviewvariable"/>
-              </w:rPr>
-              <w:t xml:space="preserve">if </w:t>
-            </w:r>
-            <w:r>
-              <w:rPr>
-                <w:rStyle w:val="interviewvariable"/>
-              </w:rPr>
-              <w:t xml:space="preserve">type_of_response['case in 2 states'] and </w:t>
-            </w:r>
-            <w:proofErr w:type="spellStart"/>
-            <w:r>
-              <w:rPr>
-                <w:rStyle w:val="interviewvariable"/>
-              </w:rPr>
-              <w:t>stage_of_other_case</w:t>
-            </w:r>
-            <w:proofErr w:type="spellEnd"/>
-            <w:r>
-              <w:rPr>
-                <w:rStyle w:val="interviewvariable"/>
-              </w:rPr>
-              <w:t xml:space="preserve"> == 'still going'</w:t>
-            </w:r>
-            <w:r>
-              <w:t xml:space="preserve"> %}</w:t>
-            </w:r>
+              <w:t>{%tr if type_of_response['case in 2 states'] and stage_of_other_case == 'still going' %}</w:t>
+            </w:r>
+            <w:proofErr w:type="spellStart"/>
+            <w:proofErr w:type="spellEnd"/>
+            <w:proofErr w:type="spellStart"/>
+            <w:proofErr w:type="spellEnd"/>
           </w:p>
         </w:tc>
         <w:tc>
@@ -1791,33 +1467,10 @@
                 <w:rFonts w:eastAsia="Calibri"/>
                 <w:shd w:val="clear" w:color="auto" w:fill="FFFFFF"/>
               </w:rPr>
-              <w:t>{</w:t>
+              <w:t>{{ case_in_2_states_step.subject }}</w:t>
             </w:r>
             <w:proofErr w:type="gramStart"/>
-            <w:r>
-              <w:rPr>
-                <w:rFonts w:eastAsia="Calibri"/>
-                <w:shd w:val="clear" w:color="auto" w:fill="FFFFFF"/>
-              </w:rPr>
-              <w:t xml:space="preserve">{ </w:t>
-            </w:r>
-            <w:r>
-              <w:t>case</w:t>
-            </w:r>
             <w:proofErr w:type="gramEnd"/>
-            <w:r>
-              <w:t>_in_2_states_step</w:t>
-            </w:r>
-            <w:r>
-              <w:t>.subject</w:t>
-            </w:r>
-            <w:r>
-              <w:rPr>
-                <w:rFonts w:eastAsia="Calibri"/>
-                <w:shd w:val="clear" w:color="auto" w:fill="FFFFFF"/>
-              </w:rPr>
-              <w:t xml:space="preserve"> }}</w:t>
-            </w:r>
           </w:p>
         </w:tc>
         <w:tc>
@@ -1846,19 +1499,7 @@
               <w:pStyle w:val="Body"/>
             </w:pPr>
             <w:r>
-              <w:t>{{p (</w:t>
-            </w:r>
-            <w:r>
-              <w:t>include</w:t>
-            </w:r>
-            <w:r>
-              <w:t>_docx_template("docassemble.AKA2JBranding:</w:t>
-            </w:r>
-            <w:r>
-              <w:t>case_in_2_states_</w:t>
-            </w:r>
-            <w:r>
-              <w:t>content.docx")) }}</w:t>
+              <w:t>{{p (include_docx_template("docassemble.AKA2JBranding:case_in_2_states_content.docx")) }}</w:t>
             </w:r>
           </w:p>
         </w:tc>
@@ -1888,24 +1529,12 @@
               <w:spacing w:before="0" w:after="0"/>
             </w:pPr>
             <w:r>
-              <w:t>{%</w:t>
-            </w:r>
-            <w:proofErr w:type="spellStart"/>
-            <w:r>
-              <w:t>tr</w:t>
-            </w:r>
-            <w:proofErr w:type="spellEnd"/>
-            <w:r>
-              <w:t xml:space="preserve"> </w:t>
-            </w:r>
-            <w:proofErr w:type="spellStart"/>
-            <w:r>
-              <w:t>endif</w:t>
-            </w:r>
-            <w:proofErr w:type="spellEnd"/>
-            <w:r>
-              <w:t xml:space="preserve"> %}</w:t>
-            </w:r>
+              <w:t>{%tr endif %}</w:t>
+            </w:r>
+            <w:proofErr w:type="spellStart"/>
+            <w:proofErr w:type="spellEnd"/>
+            <w:proofErr w:type="spellStart"/>
+            <w:proofErr w:type="spellEnd"/>
           </w:p>
         </w:tc>
         <w:tc>
@@ -1959,22 +1588,10 @@
               <w:rPr>
                 <w:shd w:val="clear" w:color="auto" w:fill="FFFFFF"/>
               </w:rPr>
-              <w:t>{%</w:t>
-            </w:r>
-            <w:proofErr w:type="spellStart"/>
-            <w:r>
-              <w:rPr>
-                <w:shd w:val="clear" w:color="auto" w:fill="FFFFFF"/>
-              </w:rPr>
-              <w:t>tr</w:t>
-            </w:r>
-            <w:proofErr w:type="spellEnd"/>
-            <w:r>
-              <w:rPr>
-                <w:shd w:val="clear" w:color="auto" w:fill="FFFFFF"/>
-              </w:rPr>
-              <w:t xml:space="preserve"> if type_of_response['default'] %}</w:t>
-            </w:r>
+              <w:t>{%tr if type_of_response['default'] %}</w:t>
+            </w:r>
+            <w:proofErr w:type="spellStart"/>
+            <w:proofErr w:type="spellEnd"/>
           </w:p>
         </w:tc>
         <w:tc>
@@ -2034,33 +1651,12 @@
               <w:rPr>
                 <w:rFonts w:eastAsia="Calibri"/>
               </w:rPr>
-              <w:t>{</w:t>
+              <w:t>{{ default_options_step.subject }}</w:t>
             </w:r>
             <w:proofErr w:type="gramStart"/>
-            <w:r>
-              <w:rPr>
-                <w:rFonts w:eastAsia="Calibri"/>
-              </w:rPr>
-              <w:t xml:space="preserve">{ </w:t>
-            </w:r>
-            <w:proofErr w:type="spellStart"/>
-            <w:r>
-              <w:t>default</w:t>
-            </w:r>
+            <w:proofErr w:type="spellStart"/>
             <w:proofErr w:type="gramEnd"/>
-            <w:r>
-              <w:t>_options_step</w:t>
-            </w:r>
-            <w:r>
-              <w:t>.subject</w:t>
-            </w:r>
-            <w:proofErr w:type="spellEnd"/>
-            <w:r>
-              <w:rPr>
-                <w:rFonts w:eastAsia="Calibri"/>
-              </w:rPr>
-              <w:t xml:space="preserve"> }}</w:t>
-            </w:r>
+            <w:proofErr w:type="spellEnd"/>
           </w:p>
         </w:tc>
         <w:tc>
@@ -2090,13 +1686,7 @@
               <w:spacing w:before="280" w:after="0"/>
             </w:pPr>
             <w:r>
-              <w:t>{{p (include_docx_template("docassemble.AKA2JBranding:</w:t>
-            </w:r>
-            <w:r>
-              <w:t>default_options_content.docx</w:t>
-            </w:r>
-            <w:r>
-              <w:t>")) }}</w:t>
+              <w:t>{{p (include_docx_template("docassemble.AKA2JBranding:default_options_content.docx")) }}</w:t>
             </w:r>
           </w:p>
         </w:tc>
@@ -2127,24 +1717,12 @@
               <w:spacing w:before="0" w:after="0"/>
             </w:pPr>
             <w:r>
-              <w:t>{%</w:t>
-            </w:r>
-            <w:proofErr w:type="spellStart"/>
-            <w:r>
-              <w:t>tr</w:t>
-            </w:r>
-            <w:proofErr w:type="spellEnd"/>
-            <w:r>
-              <w:t xml:space="preserve"> </w:t>
-            </w:r>
-            <w:proofErr w:type="spellStart"/>
-            <w:r>
-              <w:t>endif</w:t>
-            </w:r>
-            <w:proofErr w:type="spellEnd"/>
-            <w:r>
-              <w:t xml:space="preserve"> %}</w:t>
-            </w:r>
+              <w:t>{%tr endif %}</w:t>
+            </w:r>
+            <w:proofErr w:type="spellStart"/>
+            <w:proofErr w:type="spellEnd"/>
+            <w:proofErr w:type="spellStart"/>
+            <w:proofErr w:type="spellEnd"/>
           </w:p>
         </w:tc>
         <w:tc>
@@ -2420,16 +1998,7 @@
               <w:pStyle w:val="Body"/>
             </w:pPr>
             <w:r>
-              <w:t xml:space="preserve">Some insurance companies may not continue coverage after the court issues a </w:t>
-            </w:r>
-            <w:r>
-              <w:rPr>
-                <w:b/>
-              </w:rPr>
-              <w:t>Legal Separation Decree</w:t>
-            </w:r>
-            <w:r>
-              <w:t xml:space="preserve"> so if you need your spouse’s medical insurance, talk to a lawyer before the legal separation is finalized to understand your options for continued coverage.</w:t>
+              <w:t>Some insurance companies may not continue coverage after the court issues a Legal Separation Decree so if you need your spouse’s medical insurance, talk to a lawyer before the legal separation is finalized to understand your options for continued coverage.</w:t>
             </w:r>
           </w:p>
           <w:p>
@@ -2437,78 +2006,12 @@
               <w:pStyle w:val="Body"/>
             </w:pPr>
             <w:r>
-              <w:t xml:space="preserve">If you and your spouse want to legally separate but stay married to protect significant religious, financial, social or legal interests, the court can issue a </w:t>
-            </w:r>
-            <w:r>
-              <w:rPr>
-                <w:b/>
-              </w:rPr>
-              <w:t>Decree of Legal Separation</w:t>
-            </w:r>
-            <w:r>
-              <w:t xml:space="preserve">. You will still be married, but the court will </w:t>
-            </w:r>
-            <w:r>
-              <w:rPr>
-                <w:color w:val="FF0000"/>
-              </w:rPr>
-              <w:t xml:space="preserve">{% if not </w:t>
-            </w:r>
-            <w:proofErr w:type="spellStart"/>
-            <w:r>
-              <w:rPr>
-                <w:color w:val="FF0000"/>
-              </w:rPr>
-              <w:t>minor_children</w:t>
-            </w:r>
-            <w:proofErr w:type="spellEnd"/>
-            <w:r>
-              <w:rPr>
-                <w:color w:val="FF0000"/>
-              </w:rPr>
-              <w:t xml:space="preserve"> and </w:t>
-            </w:r>
-            <w:proofErr w:type="spellStart"/>
-            <w:r>
-              <w:rPr>
-                <w:color w:val="FF0000"/>
-              </w:rPr>
-              <w:t>wife_is_pregnant</w:t>
-            </w:r>
-            <w:proofErr w:type="spellEnd"/>
-            <w:r>
-              <w:rPr>
-                <w:color w:val="FF0000"/>
-              </w:rPr>
-              <w:t xml:space="preserve"> == 'not pregnant'</w:t>
-            </w:r>
-            <w:r>
-              <w:rPr>
-                <w:color w:val="FF0000"/>
-              </w:rPr>
-              <w:t xml:space="preserve"> %}</w:t>
-            </w:r>
-            <w:r>
-              <w:t>divide the property and debt earned or received during the marriage.</w:t>
-            </w:r>
-            <w:r>
-              <w:rPr>
-                <w:color w:val="FF0000"/>
-              </w:rPr>
-              <w:t>{</w:t>
-            </w:r>
-            <w:r>
-              <w:rPr>
-                <w:color w:val="FF0000"/>
-              </w:rPr>
-              <w:t>% else</w:t>
-            </w:r>
-            <w:r>
-              <w:rPr>
-                <w:color w:val="FF0000"/>
-              </w:rPr>
-              <w:t>%}</w:t>
-            </w:r>
+              <w:t>If you and your spouse want to legally separate but stay married to protect significant religious, financial, social or legal interests, the court can issue a Decree of Legal Separation. You will still be married, but the court will {% if not minor_children and wife_is_pregnant == 'not pregnant' %}divide the property and debt earned or received during the marriage.{% else%}</w:t>
+            </w:r>
+            <w:proofErr w:type="spellStart"/>
+            <w:proofErr w:type="spellEnd"/>
+            <w:proofErr w:type="spellStart"/>
+            <w:proofErr w:type="spellEnd"/>
           </w:p>
           <w:p>
             <w:pPr>
@@ -2573,28 +2076,10 @@
               <w:rPr>
                 <w:color w:val="FF0000"/>
               </w:rPr>
-              <w:t>{</w:t>
-            </w:r>
-            <w:r>
-              <w:rPr>
-                <w:color w:val="FF0000"/>
-              </w:rPr>
-              <w:t xml:space="preserve">% </w:t>
-            </w:r>
-            <w:proofErr w:type="spellStart"/>
-            <w:r>
-              <w:rPr>
-                <w:color w:val="FF0000"/>
-              </w:rPr>
-              <w:t>endif</w:t>
-            </w:r>
-            <w:proofErr w:type="spellEnd"/>
-            <w:r>
-              <w:rPr>
-                <w:color w:val="FF0000"/>
-              </w:rPr>
-              <w:t xml:space="preserve"> %}</w:t>
-            </w:r>
+              <w:t>{% endif %}</w:t>
+            </w:r>
+            <w:proofErr w:type="spellStart"/>
+            <w:proofErr w:type="spellEnd"/>
           </w:p>
           <w:p>
             <w:pPr>
@@ -2653,36 +2138,12 @@
               <w:rPr>
                 <w:color w:val="FF0000"/>
               </w:rPr>
-              <w:t>{%</w:t>
-            </w:r>
-            <w:proofErr w:type="spellStart"/>
-            <w:r>
-              <w:rPr>
-                <w:color w:val="FF0000"/>
-              </w:rPr>
-              <w:t>tr</w:t>
-            </w:r>
-            <w:proofErr w:type="spellEnd"/>
-            <w:r>
-              <w:rPr>
-                <w:color w:val="FF0000"/>
-              </w:rPr>
-              <w:t xml:space="preserve"> </w:t>
-            </w:r>
-            <w:proofErr w:type="spellStart"/>
-            <w:r>
-              <w:rPr>
-                <w:color w:val="FF0000"/>
-              </w:rPr>
-              <w:t>endif</w:t>
-            </w:r>
-            <w:proofErr w:type="spellEnd"/>
-            <w:r>
-              <w:rPr>
-                <w:color w:val="FF0000"/>
-              </w:rPr>
-              <w:t xml:space="preserve"> %}</w:t>
-            </w:r>
+              <w:t>{%tr endif %}</w:t>
+            </w:r>
+            <w:proofErr w:type="spellStart"/>
+            <w:proofErr w:type="spellEnd"/>
+            <w:proofErr w:type="spellStart"/>
+            <w:proofErr w:type="spellEnd"/>
           </w:p>
         </w:tc>
         <w:tc>
@@ -3759,19 +3220,7 @@
               <w:pStyle w:val="Body"/>
             </w:pPr>
             <w:r>
-              <w:t>{{p (include_docx_template("docassemble.</w:t>
-            </w:r>
-            <w:r>
-              <w:t>AKA2JBranding:</w:t>
-            </w:r>
-            <w:r>
-              <w:t>want_help_to_agree_content</w:t>
-            </w:r>
-            <w:r>
-              <w:t>.docx</w:t>
-            </w:r>
-            <w:r>
-              <w:t>")) }}</w:t>
+              <w:t>{{p (include_docx_template("docassemble.AKA2JBranding:want_help_to_agree_content.docx")) }}</w:t>
             </w:r>
           </w:p>
         </w:tc>
@@ -3800,24 +3249,12 @@
               <w:pStyle w:val="Body"/>
             </w:pPr>
             <w:r>
-              <w:t>{%</w:t>
-            </w:r>
-            <w:proofErr w:type="spellStart"/>
-            <w:r>
-              <w:t>tr</w:t>
-            </w:r>
-            <w:proofErr w:type="spellEnd"/>
-            <w:r>
-              <w:t xml:space="preserve"> </w:t>
-            </w:r>
-            <w:proofErr w:type="spellStart"/>
-            <w:r>
-              <w:t>endif</w:t>
-            </w:r>
-            <w:proofErr w:type="spellEnd"/>
-            <w:r>
-              <w:t xml:space="preserve"> %}</w:t>
-            </w:r>
+              <w:t>{%tr endif %}</w:t>
+            </w:r>
+            <w:proofErr w:type="spellStart"/>
+            <w:proofErr w:type="spellEnd"/>
+            <w:proofErr w:type="spellStart"/>
+            <w:proofErr w:type="spellEnd"/>
           </w:p>
         </w:tc>
         <w:tc>
@@ -4321,25 +3758,7 @@
               <w:pStyle w:val="Body"/>
             </w:pPr>
             <w:r>
-              <w:t>{{p (include_docx_template("</w:t>
-            </w:r>
-            <w:r>
-              <w:t>docassemble</w:t>
-            </w:r>
-            <w:r>
-              <w:t>.</w:t>
-            </w:r>
-            <w:r>
-              <w:t>AKA2JBranding:</w:t>
-            </w:r>
-            <w:r>
-              <w:t>answer_content</w:t>
-            </w:r>
-            <w:r>
-              <w:t>.docx</w:t>
-            </w:r>
-            <w:r>
-              <w:t>")) }}</w:t>
+              <w:t>{{p (include_docx_template("docassemble.AKA2JBranding:answer_content.docx")) }}</w:t>
             </w:r>
           </w:p>
         </w:tc>
@@ -4371,36 +3790,12 @@
               <w:rPr>
                 <w:color w:val="FF0000"/>
               </w:rPr>
-              <w:t>{%</w:t>
-            </w:r>
-            <w:proofErr w:type="spellStart"/>
-            <w:r>
-              <w:rPr>
-                <w:color w:val="FF0000"/>
-              </w:rPr>
-              <w:t>tr</w:t>
-            </w:r>
-            <w:proofErr w:type="spellEnd"/>
-            <w:r>
-              <w:rPr>
-                <w:color w:val="FF0000"/>
-              </w:rPr>
-              <w:t xml:space="preserve"> </w:t>
-            </w:r>
-            <w:proofErr w:type="spellStart"/>
-            <w:r>
-              <w:rPr>
-                <w:color w:val="FF0000"/>
-              </w:rPr>
-              <w:t>endif</w:t>
-            </w:r>
-            <w:proofErr w:type="spellEnd"/>
-            <w:r>
-              <w:rPr>
-                <w:color w:val="FF0000"/>
-              </w:rPr>
-              <w:t xml:space="preserve"> %}</w:t>
-            </w:r>
+              <w:t>{%tr endif %}</w:t>
+            </w:r>
+            <w:proofErr w:type="spellStart"/>
+            <w:proofErr w:type="spellEnd"/>
+            <w:proofErr w:type="spellStart"/>
+            <w:proofErr w:type="spellEnd"/>
           </w:p>
         </w:tc>
         <w:tc>
@@ -4449,85 +3844,14 @@
               <w:pStyle w:val="Body"/>
             </w:pPr>
             <w:r>
-              <w:t>{%</w:t>
-            </w:r>
-            <w:proofErr w:type="spellStart"/>
-            <w:r>
-              <w:t>tr</w:t>
-            </w:r>
-            <w:proofErr w:type="spellEnd"/>
-            <w:r>
-              <w:t xml:space="preserve"> </w:t>
-            </w:r>
-            <w:r>
-              <w:rPr>
-                <w:rStyle w:val="interviewvariable"/>
-                <w:color w:val="202529"/>
-                <w:shd w:val="clear" w:color="auto" w:fill="auto"/>
-              </w:rPr>
-              <w:t>if (</w:t>
-            </w:r>
-            <w:r>
-              <w:rPr>
-                <w:rStyle w:val="interviewvariable"/>
-                <w:color w:val="202529"/>
-                <w:shd w:val="clear" w:color="auto" w:fill="auto"/>
-              </w:rPr>
-              <w:t>type_of_response['wrong state'] and</w:t>
-            </w:r>
-            <w:r>
-              <w:t xml:space="preserve"> not jurisdiction) or </w:t>
-            </w:r>
-            <w:r>
-              <w:rPr>
-                <w:rStyle w:val="interviewvariable"/>
-                <w:color w:val="202529"/>
-                <w:shd w:val="clear" w:color="auto" w:fill="auto"/>
-              </w:rPr>
-              <w:t>(type_of_response['case in 2 states'] and</w:t>
-            </w:r>
-            <w:r>
-              <w:t xml:space="preserve"> </w:t>
-            </w:r>
-            <w:proofErr w:type="spellStart"/>
-            <w:r>
-              <w:rPr>
-                <w:rStyle w:val="interviewvariable"/>
-                <w:color w:val="202529"/>
-                <w:shd w:val="clear" w:color="auto" w:fill="auto"/>
-              </w:rPr>
-              <w:t>stage_of_other_case</w:t>
-            </w:r>
-            <w:proofErr w:type="spellEnd"/>
-            <w:r>
-              <w:rPr>
-                <w:rStyle w:val="interviewvariable"/>
-                <w:color w:val="202529"/>
-                <w:shd w:val="clear" w:color="auto" w:fill="auto"/>
-              </w:rPr>
-              <w:t xml:space="preserve"> == 'still going') or (type_of_response['default'] and </w:t>
-            </w:r>
-            <w:proofErr w:type="spellStart"/>
-            <w:r>
-              <w:rPr>
-                <w:rStyle w:val="interviewvariable"/>
-                <w:color w:val="202529"/>
-                <w:shd w:val="clear" w:color="auto" w:fill="auto"/>
-              </w:rPr>
-              <w:t>proper_service</w:t>
-            </w:r>
-            <w:proofErr w:type="spellEnd"/>
-            <w:r>
-              <w:rPr>
-                <w:rStyle w:val="interviewvariable"/>
-                <w:color w:val="202529"/>
-                <w:shd w:val="clear" w:color="auto" w:fill="auto"/>
-              </w:rPr>
-              <w:t xml:space="preserve"> == 'neither')</w:t>
-            </w:r>
-            <w:r>
-              <w:t xml:space="preserve"> %}</w:t>
-            </w:r>
+              <w:t>{%tr if (type_of_response['wrong state'] and not jurisdiction) or (type_of_response['case in 2 states'] and stage_of_other_case == 'still going') or (type_of_response['default'] and proper_service == 'neither') %}</w:t>
+            </w:r>
+            <w:proofErr w:type="spellStart"/>
+            <w:proofErr w:type="spellEnd"/>
+            <w:proofErr w:type="spellStart"/>
+            <w:proofErr w:type="spellEnd"/>
+            <w:proofErr w:type="spellStart"/>
+            <w:proofErr w:type="spellEnd"/>
           </w:p>
         </w:tc>
         <w:tc>
@@ -4552,10 +3876,7 @@
             </w:pPr>
             <w:proofErr w:type="spellStart"/>
             <w:r>
-              <w:t>d</w:t>
-            </w:r>
-            <w:r>
-              <w:t>ismiss_step</w:t>
+              <w:t>dismiss_step</w:t>
             </w:r>
             <w:proofErr w:type="spellEnd"/>
           </w:p>
@@ -4587,30 +3908,12 @@
             </w:pPr>
             <w:bookmarkStart w:id="3" w:name="_Hlk226106692"/>
             <w:r>
-              <w:t>{</w:t>
+              <w:t>{{ dismiss_step.subject }}</w:t>
             </w:r>
             <w:proofErr w:type="gramStart"/>
-            <w:r>
-              <w:t xml:space="preserve">{ </w:t>
-            </w:r>
-            <w:proofErr w:type="spellStart"/>
-            <w:r>
-              <w:t>d</w:t>
-            </w:r>
-            <w:r>
-              <w:t>ismiss</w:t>
-            </w:r>
+            <w:proofErr w:type="spellStart"/>
             <w:proofErr w:type="gramEnd"/>
-            <w:r>
-              <w:t>_step</w:t>
-            </w:r>
-            <w:r>
-              <w:t>.subject</w:t>
-            </w:r>
-            <w:proofErr w:type="spellEnd"/>
-            <w:r>
-              <w:t xml:space="preserve"> }}</w:t>
-            </w:r>
+            <w:proofErr w:type="spellEnd"/>
           </w:p>
         </w:tc>
         <w:tc>
@@ -4643,25 +3946,7 @@
               <w:spacing w:before="240" w:after="100"/>
             </w:pPr>
             <w:r>
-              <w:t>{{p (include_docx_template("</w:t>
-            </w:r>
-            <w:r>
-              <w:t>docassemble</w:t>
-            </w:r>
-            <w:r>
-              <w:t>.</w:t>
-            </w:r>
-            <w:r>
-              <w:t>AKA2JBranding:</w:t>
-            </w:r>
-            <w:r>
-              <w:t>dismiss_content</w:t>
-            </w:r>
-            <w:r>
-              <w:t>.docx</w:t>
-            </w:r>
-            <w:r>
-              <w:t>")) }}</w:t>
+              <w:t>{{p (include_docx_template("docassemble.AKA2JBranding:dismiss_content.docx")) }}</w:t>
             </w:r>
           </w:p>
         </w:tc>
@@ -4692,24 +3977,12 @@
               <w:spacing w:before="0" w:after="0"/>
             </w:pPr>
             <w:r>
-              <w:t>{%</w:t>
-            </w:r>
-            <w:proofErr w:type="spellStart"/>
-            <w:r>
-              <w:t>tr</w:t>
-            </w:r>
-            <w:proofErr w:type="spellEnd"/>
-            <w:r>
-              <w:t xml:space="preserve"> </w:t>
-            </w:r>
-            <w:proofErr w:type="spellStart"/>
-            <w:r>
-              <w:t>endif</w:t>
-            </w:r>
-            <w:proofErr w:type="spellEnd"/>
-            <w:r>
-              <w:t xml:space="preserve"> %}</w:t>
-            </w:r>
+              <w:t>{%tr endif %}</w:t>
+            </w:r>
+            <w:proofErr w:type="spellStart"/>
+            <w:proofErr w:type="spellEnd"/>
+            <w:proofErr w:type="spellStart"/>
+            <w:proofErr w:type="spellEnd"/>
           </w:p>
         </w:tc>
         <w:tc>
@@ -4762,24 +4035,12 @@
               <w:spacing w:before="0" w:after="0"/>
             </w:pPr>
             <w:r>
-              <w:t>{%</w:t>
-            </w:r>
-            <w:proofErr w:type="spellStart"/>
-            <w:r>
-              <w:t>tr</w:t>
-            </w:r>
-            <w:proofErr w:type="spellEnd"/>
-            <w:r>
-              <w:t xml:space="preserve"> if </w:t>
-            </w:r>
-            <w:proofErr w:type="spellStart"/>
-            <w:r>
-              <w:t>stage_of_default</w:t>
-            </w:r>
-            <w:proofErr w:type="spellEnd"/>
-            <w:r>
-              <w:t xml:space="preserve"> == 'judgment entered' %}</w:t>
-            </w:r>
+              <w:t>{%tr if stage_of_default == 'judgment entered' %}</w:t>
+            </w:r>
+            <w:proofErr w:type="spellStart"/>
+            <w:proofErr w:type="spellEnd"/>
+            <w:proofErr w:type="spellStart"/>
+            <w:proofErr w:type="spellEnd"/>
           </w:p>
         </w:tc>
         <w:tc>
@@ -5035,28 +4296,7 @@
               <w:pStyle w:val="Body"/>
             </w:pPr>
             <w:r>
-              <w:t>{{p (include_</w:t>
-            </w:r>
-            <w:r>
-              <w:t>docx</w:t>
-            </w:r>
-            <w:r>
-              <w:t>_template("docassemble.</w:t>
-            </w:r>
-            <w:r>
-              <w:t>AKA2JBranding:</w:t>
-            </w:r>
-            <w:r>
-              <w:t>fill_set_aside_content</w:t>
-            </w:r>
-            <w:r>
-              <w:t>.docx</w:t>
-            </w:r>
-            <w:r>
-              <w:t>")) }</w:t>
-            </w:r>
-            <w:r>
-              <w:t>}</w:t>
+              <w:t>{{p (include_docx_template("docassemble.AKA2JBranding:fill_set_aside_content.docx")) }}</w:t>
             </w:r>
           </w:p>
         </w:tc>
@@ -5089,36 +4329,12 @@
               <w:rPr>
                 <w:shd w:val="clear" w:color="auto" w:fill="FFFFFF"/>
               </w:rPr>
-              <w:t>{%</w:t>
-            </w:r>
-            <w:proofErr w:type="spellStart"/>
-            <w:r>
-              <w:rPr>
-                <w:shd w:val="clear" w:color="auto" w:fill="FFFFFF"/>
-              </w:rPr>
-              <w:t>tr</w:t>
-            </w:r>
-            <w:proofErr w:type="spellEnd"/>
-            <w:r>
-              <w:rPr>
-                <w:shd w:val="clear" w:color="auto" w:fill="FFFFFF"/>
-              </w:rPr>
-              <w:t xml:space="preserve"> </w:t>
-            </w:r>
-            <w:proofErr w:type="spellStart"/>
-            <w:r>
-              <w:rPr>
-                <w:shd w:val="clear" w:color="auto" w:fill="FFFFFF"/>
-              </w:rPr>
-              <w:t>endif</w:t>
-            </w:r>
-            <w:proofErr w:type="spellEnd"/>
-            <w:r>
-              <w:rPr>
-                <w:shd w:val="clear" w:color="auto" w:fill="FFFFFF"/>
-              </w:rPr>
-              <w:t xml:space="preserve"> %}</w:t>
-            </w:r>
+              <w:t>{%tr endif %}</w:t>
+            </w:r>
+            <w:proofErr w:type="spellStart"/>
+            <w:proofErr w:type="spellEnd"/>
+            <w:proofErr w:type="spellStart"/>
+            <w:proofErr w:type="spellEnd"/>
           </w:p>
         </w:tc>
         <w:tc>
@@ -5170,32 +4386,14 @@
               <w:spacing w:before="0" w:after="0"/>
             </w:pPr>
             <w:r>
-              <w:t>{%</w:t>
-            </w:r>
-            <w:proofErr w:type="spellStart"/>
-            <w:r>
-              <w:t>tr</w:t>
-            </w:r>
-            <w:proofErr w:type="spellEnd"/>
-            <w:r>
-              <w:t xml:space="preserve"> if </w:t>
-            </w:r>
-            <w:proofErr w:type="spellStart"/>
-            <w:r>
-              <w:t>user_need</w:t>
-            </w:r>
-            <w:proofErr w:type="spellEnd"/>
-            <w:r>
-              <w:t xml:space="preserve"> in ('answer custody', 'custody') and </w:t>
-            </w:r>
-            <w:proofErr w:type="spellStart"/>
-            <w:r>
-              <w:t>parents_agree_documents</w:t>
-            </w:r>
-            <w:proofErr w:type="spellEnd"/>
-            <w:r>
-              <w:t xml:space="preserve"> %}</w:t>
-            </w:r>
+              <w:t>{%tr if user_need in ('answer custody', 'custody') and parents_agree_documents %}</w:t>
+            </w:r>
+            <w:proofErr w:type="spellStart"/>
+            <w:proofErr w:type="spellEnd"/>
+            <w:proofErr w:type="spellStart"/>
+            <w:proofErr w:type="spellEnd"/>
+            <w:proofErr w:type="spellStart"/>
+            <w:proofErr w:type="spellEnd"/>
           </w:p>
         </w:tc>
         <w:tc>
@@ -5260,47 +4458,12 @@
                 <w:rFonts w:eastAsia="Calibri"/>
                 <w:shd w:val="clear" w:color="auto" w:fill="FFFFFF"/>
               </w:rPr>
-              <w:t>{</w:t>
+              <w:t>{{ uncontested_custody_forms_step.subject }}</w:t>
             </w:r>
             <w:proofErr w:type="gramStart"/>
-            <w:r>
-              <w:rPr>
-                <w:rFonts w:eastAsia="Calibri"/>
-                <w:shd w:val="clear" w:color="auto" w:fill="FFFFFF"/>
-              </w:rPr>
-              <w:t xml:space="preserve">{ </w:t>
-            </w:r>
-            <w:proofErr w:type="spellStart"/>
-            <w:r>
-              <w:rPr>
-                <w:rFonts w:eastAsia="Calibri"/>
-                <w:shd w:val="clear" w:color="auto" w:fill="FFFFFF"/>
-              </w:rPr>
-              <w:t>uncontested</w:t>
-            </w:r>
+            <w:proofErr w:type="spellStart"/>
             <w:proofErr w:type="gramEnd"/>
-            <w:r>
-              <w:rPr>
-                <w:rFonts w:eastAsia="Calibri"/>
-                <w:shd w:val="clear" w:color="auto" w:fill="FFFFFF"/>
-              </w:rPr>
-              <w:t>_custody_forms_step</w:t>
-            </w:r>
-            <w:r>
-              <w:rPr>
-                <w:rFonts w:eastAsia="Calibri"/>
-                <w:shd w:val="clear" w:color="auto" w:fill="FFFFFF"/>
-              </w:rPr>
-              <w:t>.subject</w:t>
-            </w:r>
-            <w:proofErr w:type="spellEnd"/>
-            <w:r>
-              <w:rPr>
-                <w:rFonts w:eastAsia="Calibri"/>
-                <w:shd w:val="clear" w:color="auto" w:fill="FFFFFF"/>
-              </w:rPr>
-              <w:t xml:space="preserve"> }}</w:t>
-            </w:r>
+            <w:proofErr w:type="spellEnd"/>
           </w:p>
         </w:tc>
         <w:tc>
@@ -5331,16 +4494,10 @@
               <w:spacing w:before="100" w:after="100"/>
             </w:pPr>
             <w:r>
-              <w:t>If you and {</w:t>
+              <w:t>If you and {{ other_party_in_case }} agree on everything (a parenting plan including decision-making and schedule, paternity, and child support), you can fill out forms to start the case together. This is called an uncontested case.</w:t>
             </w:r>
             <w:proofErr w:type="gramStart"/>
-            <w:r>
-              <w:t>{ other</w:t>
-            </w:r>
             <w:proofErr w:type="gramEnd"/>
-            <w:r>
-              <w:t>_party_in_case }} agree on everything (a parenting plan including decision-making and schedule, paternity, and child support), you can fill out forms to start the case together. This is called an uncontested case.</w:t>
-            </w:r>
           </w:p>
           <w:p>
             <w:pPr>
@@ -5372,14 +4529,15 @@
               <w:rPr>
                 <w:b/>
               </w:rPr>
-              <w:t>Uncontested Complaint for Custody of Minor Children</w:t>
-            </w:r>
-            <w:r>
-              <w:t xml:space="preserve">, SHC-118 </w:t>
-            </w:r>
-            <w:r>
+              <w:t xml:space="preserve">Uncontested Complaint for Custody of Minor Children, SHC-118 </w:t>
               <w:br/>
-              <w:t xml:space="preserve">as a </w:t>
+              <w:t>as a  file</w:t>
+              <w:br/>
+              <w:t>courts.alaska.gov/shc/family/docs/shc-118.doc</w:t>
+              <w:br/>
+              <w:t>as a |</w:t>
+              <w:br/>
+              <w:t>courts.alaska.gov/shc/family/docs/shc-118n.pdf</w:t>
             </w:r>
             <w:hyperlink r:id="rId9">
               <w:r>
@@ -5389,25 +4547,8 @@
                 <w:t>Word</w:t>
               </w:r>
             </w:hyperlink>
-            <w:r>
-              <w:t xml:space="preserve"> file</w:t>
-            </w:r>
-            <w:r>
-              <w:br/>
-              <w:t>courts.alaska.gov/</w:t>
-            </w:r>
-            <w:proofErr w:type="spellStart"/>
-            <w:r>
-              <w:t>shc</w:t>
-            </w:r>
-            <w:proofErr w:type="spellEnd"/>
-            <w:r>
-              <w:t>/family/docs/shc-118.doc</w:t>
-            </w:r>
-            <w:r>
-              <w:br/>
-              <w:t>as a |</w:t>
-            </w:r>
+            <w:proofErr w:type="spellStart"/>
+            <w:proofErr w:type="spellEnd"/>
             <w:hyperlink r:id="rId10">
               <w:r>
                 <w:rPr>
@@ -5416,18 +4557,8 @@
                 <w:t>PDF</w:t>
               </w:r>
             </w:hyperlink>
-            <w:r>
-              <w:br/>
-              <w:t>courts.alaska.gov/</w:t>
-            </w:r>
-            <w:proofErr w:type="spellStart"/>
-            <w:r>
-              <w:t>shc</w:t>
-            </w:r>
-            <w:proofErr w:type="spellEnd"/>
-            <w:r>
-              <w:t>/family/docs/shc-118n.pdf</w:t>
-            </w:r>
+            <w:proofErr w:type="spellStart"/>
+            <w:proofErr w:type="spellEnd"/>
           </w:p>
           <w:p>
             <w:pPr>
@@ -5551,10 +4682,9 @@
               <w:rPr>
                 <w:b/>
               </w:rPr>
-              <w:t>Case description form</w:t>
-            </w:r>
-            <w:r>
-              <w:t xml:space="preserve">, </w:t>
+              <w:t xml:space="preserve">Case description form, </w:t>
+              <w:br/>
+              <w:t>public.courts.alaska.gov/web/forms/docs/civ-125s.pdf</w:t>
             </w:r>
             <w:hyperlink r:id="rId13">
               <w:r>
@@ -5564,10 +4694,6 @@
                 <w:t>CIV-125S</w:t>
               </w:r>
             </w:hyperlink>
-            <w:r>
-              <w:br/>
-              <w:t>public.courts.alaska.gov/web/forms/docs/civ-125s.pdf</w:t>
-            </w:r>
           </w:p>
           <w:p>
             <w:pPr>
@@ -5590,7 +4716,7 @@
               <w:rPr>
                 <w:b/>
               </w:rPr>
-              <w:t xml:space="preserve">Child Custody Jurisdiction Affidavit, </w:t>
+              <w:t>Child Custody Jurisdiction Affidavit,  [Fill-In PDF] (2 copies - each parent fills out their own) public.courts.alaska.gov/web/forms/docs/dr-150.pdf</w:t>
             </w:r>
             <w:hyperlink r:id="rId14">
               <w:r>
@@ -5601,9 +4727,6 @@
                 <w:t>DR-150</w:t>
               </w:r>
             </w:hyperlink>
-            <w:r>
-              <w:t xml:space="preserve"> [Fill-In PDF] (2 copies - each parent fills out their own) public.courts.alaska.gov/web/forms/docs/dr-150.pdf</w:t>
-            </w:r>
           </w:p>
           <w:p>
             <w:pPr>
@@ -5626,7 +4749,9 @@
               <w:rPr>
                 <w:b/>
               </w:rPr>
-              <w:t xml:space="preserve">Child Support Guidelines Affidavit, </w:t>
+              <w:t>Child Support Guidelines Affidavit,  [Fill-In PDF] (2 copies - each parent fills out their own)</w:t>
+              <w:br/>
+              <w:t>public.courts.alaska.gov/web/forms/docs/dr-305.pdf</w:t>
             </w:r>
             <w:hyperlink r:id="rId15">
               <w:r>
@@ -5637,13 +4762,6 @@
                 <w:t>DR-305</w:t>
               </w:r>
             </w:hyperlink>
-            <w:r>
-              <w:t xml:space="preserve"> [Fill-In PDF] (2 copies - each parent fills out their own)</w:t>
-            </w:r>
-            <w:r>
-              <w:br/>
-              <w:t>public.courts.alaska.gov/web/forms/docs/dr-305.pdf</w:t>
-            </w:r>
           </w:p>
           <w:p>
             <w:pPr>
@@ -5667,6 +4785,8 @@
             </w:pPr>
             <w:r>
               <w:t xml:space="preserve">See </w:t>
+              <w:br/>
+              <w:t>courts.alaska.gov/shc/family/docs/shc-dr305f-sample.pdf.</w:t>
             </w:r>
             <w:hyperlink r:id="rId16">
               <w:r>
@@ -5690,18 +4810,8 @@
                 <w:t xml:space="preserve"> out the Child Support Guidelines Affidavit</w:t>
               </w:r>
             </w:hyperlink>
-            <w:r>
-              <w:br/>
-              <w:t>courts.alaska.gov/</w:t>
-            </w:r>
-            <w:proofErr w:type="spellStart"/>
-            <w:r>
-              <w:t>shc</w:t>
-            </w:r>
-            <w:proofErr w:type="spellEnd"/>
-            <w:r>
-              <w:t>/family/docs/shc-dr305f-sample.pdf.</w:t>
-            </w:r>
+            <w:proofErr w:type="spellStart"/>
+            <w:proofErr w:type="spellEnd"/>
           </w:p>
           <w:p>
             <w:pPr>
@@ -5712,16 +4822,7 @@
               </w:numPr>
             </w:pPr>
             <w:r>
-              <w:t xml:space="preserve">Attach your most recent tax return and pay stubs to the </w:t>
-            </w:r>
-            <w:r>
-              <w:rPr>
-                <w:b/>
-              </w:rPr>
-              <w:t>Child Support Guidelines Affidavit</w:t>
-            </w:r>
-            <w:r>
-              <w:t>.</w:t>
+              <w:t>Attach your most recent tax return and pay stubs to the Child Support Guidelines Affidavit.</w:t>
             </w:r>
           </w:p>
           <w:p>
@@ -5748,10 +4849,11 @@
               <w:rPr>
                 <w:b/>
               </w:rPr>
-              <w:t>Information</w:t>
-            </w:r>
-            <w:r>
-              <w:t xml:space="preserve"> Sheet</w:t>
+              <w:t>Information Sheet</w:t>
+              <w:br/>
+              <w:t xml:space="preserve">public.courts.alaska.gov/web/forms/docs/dr-314.pdf </w:t>
+              <w:br/>
+              <w:t>Fill in 1-3 with complete information for yourself, the children in the case, {{ other_party_in_case }} if you know it, and then sign and date</w:t>
             </w:r>
             <w:hyperlink r:id="rId17">
               <w:r>
@@ -5761,14 +4863,6 @@
                 <w:t>, DR-314</w:t>
               </w:r>
             </w:hyperlink>
-            <w:r>
-              <w:br/>
-              <w:t xml:space="preserve">public.courts.alaska.gov/web/forms/docs/dr-314.pdf </w:t>
-            </w:r>
-            <w:r>
-              <w:br/>
-              <w:t>Fill in 1-3 with complete information for yourself, the children in the case, {{ other_party_in_case }} if you know it, and then sign and date</w:t>
-            </w:r>
           </w:p>
           <w:p>
             <w:pPr>
@@ -5776,16 +4870,7 @@
               <w:outlineLvl w:val="2"/>
             </w:pPr>
             <w:r>
-              <w:t xml:space="preserve">Required Forms - fill out but do </w:t>
-            </w:r>
-            <w:r>
-              <w:rPr>
-                <w:b/>
-              </w:rPr>
-              <w:t>not</w:t>
-            </w:r>
-            <w:r>
-              <w:t xml:space="preserve"> sign because the judge will sign them</w:t>
+              <w:t>Required Forms - fill out but do not sign because the judge will sign them</w:t>
             </w:r>
           </w:p>
           <w:p>
@@ -5800,13 +4885,9 @@
               </w:rPr>
             </w:pPr>
             <w:r>
-              <w:t xml:space="preserve">Child </w:t>
-            </w:r>
-            <w:r>
-              <w:rPr>
-                <w:b/>
-              </w:rPr>
-              <w:t xml:space="preserve">Support Order, </w:t>
+              <w:t xml:space="preserve">Child Support Order, </w:t>
+              <w:br/>
+              <w:t>public.courts.alaska.gov/web/forms/docs/dr-300.pdf</w:t>
             </w:r>
             <w:hyperlink r:id="rId18">
               <w:r>
@@ -5817,15 +4898,6 @@
                 <w:t>DR-300</w:t>
               </w:r>
             </w:hyperlink>
-            <w:r>
-              <w:rPr>
-                <w:b/>
-              </w:rPr>
-              <w:br/>
-            </w:r>
-            <w:r>
-              <w:t>public.courts.alaska.gov/web/forms/docs/dr-300.pdf</w:t>
-            </w:r>
           </w:p>
           <w:p>
             <w:pPr>
@@ -5842,7 +4914,9 @@
               <w:rPr>
                 <w:b/>
               </w:rPr>
-              <w:t xml:space="preserve">Custody Findings of Fact &amp; Conclusions of Law, </w:t>
+              <w:t>Custody Findings of Fact &amp; Conclusions of Law,  [Fill-In PDF]</w:t>
+              <w:br/>
+              <w:t>public.courts.alaska.gov/web/forms/docs/dr-460.pdf</w:t>
             </w:r>
             <w:hyperlink r:id="rId19">
               <w:r>
@@ -5853,21 +4927,6 @@
                 <w:t>DR-460</w:t>
               </w:r>
             </w:hyperlink>
-            <w:r>
-              <w:rPr>
-                <w:b/>
-              </w:rPr>
-              <w:t xml:space="preserve"> [Fill-In PDF]</w:t>
-            </w:r>
-            <w:r>
-              <w:rPr>
-                <w:b/>
-              </w:rPr>
-              <w:br/>
-            </w:r>
-            <w:r>
-              <w:t>public.courts.alaska.gov/web/forms/docs/dr-460.pdf</w:t>
-            </w:r>
           </w:p>
           <w:p>
             <w:pPr>
@@ -5881,10 +4940,9 @@
               <w:rPr>
                 <w:b/>
               </w:rPr>
-              <w:t>Custody</w:t>
-            </w:r>
-            <w:r>
-              <w:t xml:space="preserve"> Judgment and Decree, </w:t>
+              <w:t>Custody Judgment and Decree,  [Fill-In PDF]</w:t>
+              <w:br/>
+              <w:t>public.courts.alaska.gov/web/forms/docs/dr-465.pdf</w:t>
             </w:r>
             <w:hyperlink r:id="rId20">
               <w:r>
@@ -5894,13 +4952,6 @@
                 <w:t>DR-465</w:t>
               </w:r>
             </w:hyperlink>
-            <w:r>
-              <w:t xml:space="preserve"> [Fill-In PDF]</w:t>
-            </w:r>
-            <w:r>
-              <w:br/>
-              <w:t>public.courts.alaska.gov/web/forms/docs/dr-465.pdf</w:t>
-            </w:r>
           </w:p>
           <w:p>
             <w:pPr>
@@ -5969,7 +5020,9 @@
                 <w:b/>
                 <w:color w:val="000000"/>
               </w:rPr>
-              <w:t>Shared Custody Support Calculation,</w:t>
+              <w:t>Shared Custody Support Calculation, [Fill-In PDF]</w:t>
+              <w:br/>
+              <w:t>public.courts.alaska.gov/web/forms/docs/dr-306.pdf</w:t>
             </w:r>
             <w:hyperlink r:id="rId21" w:tgtFrame="_blank">
               <w:r>
@@ -5980,26 +5033,6 @@
                 <w:t>DR-306</w:t>
               </w:r>
             </w:hyperlink>
-            <w:r>
-              <w:rPr>
-                <w:rStyle w:val="Hyperlink"/>
-                <w:b/>
-                <w:color w:val="006699"/>
-              </w:rPr>
-              <w:t xml:space="preserve"> </w:t>
-            </w:r>
-            <w:r>
-              <w:t>[Fill-In PDF]</w:t>
-            </w:r>
-            <w:r>
-              <w:br/>
-            </w:r>
-            <w:r>
-              <w:rPr>
-                <w:color w:val="000000"/>
-              </w:rPr>
-              <w:t>public.courts.alaska.gov/web/forms/docs/dr-306.pdf</w:t>
-            </w:r>
           </w:p>
           <w:p>
             <w:pPr>
@@ -6014,7 +5047,9 @@
                 <w:b/>
                 <w:color w:val="000000"/>
               </w:rPr>
-              <w:t>Divided Custody Support Calculation,</w:t>
+              <w:t>Divided Custody Support Calculation, [Fill-In PDF]</w:t>
+              <w:br/>
+              <w:t>public.courts.alaska.gov/web/forms/docs/dr-307.pdf</w:t>
             </w:r>
             <w:hyperlink r:id="rId22" w:tgtFrame="_blank">
               <w:r>
@@ -6025,31 +5060,6 @@
                 <w:t>DR-307</w:t>
               </w:r>
             </w:hyperlink>
-            <w:r>
-              <w:rPr>
-                <w:rStyle w:val="Hyperlink"/>
-                <w:b/>
-                <w:color w:val="006699"/>
-              </w:rPr>
-              <w:t xml:space="preserve"> </w:t>
-            </w:r>
-            <w:r>
-              <w:rPr>
-                <w:rStyle w:val="small"/>
-                <w:color w:val="000000"/>
-                <w:sz w:val="19"/>
-                <w:szCs w:val="19"/>
-                <w:highlight w:val="white"/>
-              </w:rPr>
-              <w:t>[</w:t>
-            </w:r>
-            <w:r>
-              <w:t>Fill-In PDF]</w:t>
-            </w:r>
-            <w:r>
-              <w:br/>
-              <w:t>public.courts.alaska.gov/web/forms/docs/dr-307.pdf</w:t>
-            </w:r>
           </w:p>
           <w:p>
             <w:pPr>
@@ -6066,22 +5076,9 @@
                 <w:color w:val="222222"/>
                 <w:lang w:val="en"/>
               </w:rPr>
-              <w:t xml:space="preserve">Hybrid </w:t>
-            </w:r>
-            <w:r>
-              <w:rPr>
-                <w:b/>
-                <w:color w:val="000000"/>
-              </w:rPr>
-              <w:t>Custody</w:t>
-            </w:r>
-            <w:r>
-              <w:rPr>
-                <w:b/>
-                <w:color w:val="222222"/>
-                <w:lang w:val="en"/>
-              </w:rPr>
-              <w:t xml:space="preserve"> Child Support Calculation, </w:t>
+              <w:t>Hybrid Custody Child Support Calculation,  [Fill-In PDF]</w:t>
+              <w:br/>
+              <w:t>public.courts.alaska.gov/web/forms/docs/dr-308.pdf</w:t>
             </w:r>
             <w:hyperlink r:id="rId23" w:tgtFrame="_blank">
               <w:r>
@@ -6092,25 +5089,6 @@
                 <w:t>DR-308</w:t>
               </w:r>
             </w:hyperlink>
-            <w:r>
-              <w:rPr>
-                <w:color w:val="222222"/>
-                <w:lang w:val="en"/>
-              </w:rPr>
-              <w:t xml:space="preserve"> </w:t>
-            </w:r>
-            <w:r>
-              <w:t>[Fill-In PDF]</w:t>
-            </w:r>
-            <w:r>
-              <w:br/>
-            </w:r>
-            <w:r>
-              <w:rPr>
-                <w:color w:val="000000"/>
-              </w:rPr>
-              <w:t>public.courts.alaska.gov/web/forms/docs/dr-308.pdf</w:t>
-            </w:r>
           </w:p>
           <w:p>
             <w:pPr>
@@ -6264,38 +5242,14 @@
               <w:pStyle w:val="Body"/>
             </w:pPr>
             <w:r>
-              <w:t>{%</w:t>
-            </w:r>
-            <w:proofErr w:type="spellStart"/>
-            <w:r>
-              <w:t>tr</w:t>
-            </w:r>
-            <w:proofErr w:type="spellEnd"/>
-            <w:r>
-              <w:t xml:space="preserve"> </w:t>
-            </w:r>
-            <w:r>
-              <w:t xml:space="preserve">if </w:t>
-            </w:r>
-            <w:proofErr w:type="spellStart"/>
-            <w:r>
-              <w:t>type_of_response.any_true</w:t>
-            </w:r>
-            <w:proofErr w:type="spellEnd"/>
-            <w:r>
-              <w:t>() and not (</w:t>
-            </w:r>
-            <w:proofErr w:type="spellStart"/>
-            <w:r>
-              <w:t>type_of_response.all_true</w:t>
-            </w:r>
-            <w:proofErr w:type="spellEnd"/>
-            <w:r>
-              <w:t>('stay married', exclusive = True))</w:t>
-            </w:r>
-            <w:r>
-              <w:t xml:space="preserve"> %}</w:t>
-            </w:r>
+              <w:t>{%tr if type_of_response.any_true() and not (type_of_response.all_true('stay married', exclusive = True)) %}</w:t>
+            </w:r>
+            <w:proofErr w:type="spellStart"/>
+            <w:proofErr w:type="spellEnd"/>
+            <w:proofErr w:type="spellStart"/>
+            <w:proofErr w:type="spellEnd"/>
+            <w:proofErr w:type="spellStart"/>
+            <w:proofErr w:type="spellEnd"/>
           </w:p>
         </w:tc>
         <w:tc>
@@ -6348,30 +5302,12 @@
               </w:rPr>
             </w:pPr>
             <w:r>
-              <w:t>{</w:t>
+              <w:t>{{ truefiling_file_and_serve_step.subject }}</w:t>
             </w:r>
             <w:proofErr w:type="gramStart"/>
-            <w:r>
-              <w:t>{</w:t>
-            </w:r>
-            <w:r>
-              <w:t xml:space="preserve"> </w:t>
-            </w:r>
-            <w:proofErr w:type="spellStart"/>
-            <w:r>
-              <w:t>truefiling</w:t>
-            </w:r>
+            <w:proofErr w:type="spellStart"/>
             <w:proofErr w:type="gramEnd"/>
-            <w:r>
-              <w:t>_file_and_serve_step</w:t>
-            </w:r>
-            <w:r>
-              <w:t>.subject</w:t>
-            </w:r>
-            <w:proofErr w:type="spellEnd"/>
-            <w:r>
-              <w:t xml:space="preserve"> }}</w:t>
-            </w:r>
+            <w:proofErr w:type="spellEnd"/>
           </w:p>
         </w:tc>
         <w:tc>
@@ -6400,22 +5336,7 @@
               <w:pStyle w:val="Body"/>
             </w:pPr>
             <w:r>
-              <w:t>{{p (include_docx_template("docassemble.AKA2JBranding:</w:t>
-            </w:r>
-            <w:r>
-              <w:t>truefiling_file_and_serve_</w:t>
-            </w:r>
-            <w:r>
-              <w:t>content</w:t>
-            </w:r>
-            <w:r>
-              <w:t>.docx</w:t>
-            </w:r>
-            <w:r>
-              <w:t>")) }</w:t>
-            </w:r>
-            <w:r>
-              <w:t>}</w:t>
+              <w:t>{{p (include_docx_template("docassemble.AKA2JBranding:truefiling_file_and_serve_content.docx")) }}</w:t>
             </w:r>
           </w:p>
         </w:tc>
@@ -6448,30 +5369,12 @@
               </w:rPr>
             </w:pPr>
             <w:r>
-              <w:t>{</w:t>
+              <w:t>{{ truefiling_serve_step.subject }}</w:t>
             </w:r>
             <w:proofErr w:type="gramStart"/>
-            <w:r>
-              <w:t>{</w:t>
-            </w:r>
-            <w:r>
-              <w:t xml:space="preserve"> </w:t>
-            </w:r>
-            <w:proofErr w:type="spellStart"/>
-            <w:r>
-              <w:t>truefiling</w:t>
-            </w:r>
+            <w:proofErr w:type="spellStart"/>
             <w:proofErr w:type="gramEnd"/>
-            <w:r>
-              <w:t>_serve_</w:t>
-            </w:r>
-            <w:r>
-              <w:t>step.subject</w:t>
-            </w:r>
-            <w:proofErr w:type="spellEnd"/>
-            <w:r>
-              <w:t xml:space="preserve"> }}</w:t>
-            </w:r>
+            <w:proofErr w:type="spellEnd"/>
           </w:p>
         </w:tc>
         <w:tc>
@@ -6501,25 +5404,7 @@
               <w:spacing w:before="280" w:after="0"/>
             </w:pPr>
             <w:r>
-              <w:t>{{</w:t>
-            </w:r>
-            <w:r>
-              <w:t>p (include_docx_template("</w:t>
-            </w:r>
-            <w:r>
-              <w:t>docassemble.AKA2JBranding:</w:t>
-            </w:r>
-            <w:r>
-              <w:t>truefiling_serve_</w:t>
-            </w:r>
-            <w:r>
-              <w:t>content</w:t>
-            </w:r>
-            <w:r>
-              <w:t>.docx</w:t>
-            </w:r>
-            <w:r>
-              <w:t>")) }}</w:t>
+              <w:t>{{p (include_docx_template("docassemble.AKA2JBranding:truefiling_serve_content.docx")) }}</w:t>
             </w:r>
           </w:p>
         </w:tc>
@@ -6548,24 +5433,12 @@
               <w:pStyle w:val="Body"/>
             </w:pPr>
             <w:r>
-              <w:t>{%</w:t>
-            </w:r>
-            <w:proofErr w:type="spellStart"/>
-            <w:r>
-              <w:t>tr</w:t>
-            </w:r>
-            <w:proofErr w:type="spellEnd"/>
-            <w:r>
-              <w:t xml:space="preserve"> </w:t>
-            </w:r>
-            <w:proofErr w:type="spellStart"/>
-            <w:r>
-              <w:t>endif</w:t>
-            </w:r>
-            <w:proofErr w:type="spellEnd"/>
-            <w:r>
-              <w:t>%}</w:t>
-            </w:r>
+              <w:t>{%tr endif%}</w:t>
+            </w:r>
+            <w:proofErr w:type="spellStart"/>
+            <w:proofErr w:type="spellEnd"/>
+            <w:proofErr w:type="spellStart"/>
+            <w:proofErr w:type="spellEnd"/>
           </w:p>
         </w:tc>
         <w:tc>
@@ -6885,24 +5758,12 @@
               </w:rPr>
             </w:pPr>
             <w:r>
-              <w:t>{%</w:t>
-            </w:r>
-            <w:proofErr w:type="spellStart"/>
-            <w:r>
-              <w:t>tr</w:t>
-            </w:r>
-            <w:proofErr w:type="spellEnd"/>
-            <w:r>
-              <w:t xml:space="preserve"> </w:t>
-            </w:r>
-            <w:proofErr w:type="spellStart"/>
-            <w:r>
-              <w:t>endif</w:t>
-            </w:r>
-            <w:proofErr w:type="spellEnd"/>
-            <w:r>
-              <w:t>%}</w:t>
-            </w:r>
+              <w:t>{%tr endif%}</w:t>
+            </w:r>
+            <w:proofErr w:type="spellStart"/>
+            <w:proofErr w:type="spellEnd"/>
+            <w:proofErr w:type="spellStart"/>
+            <w:proofErr w:type="spellEnd"/>
           </w:p>
         </w:tc>
         <w:tc>
@@ -6954,62 +5815,14 @@
               <w:rPr>
                 <w:color w:val="FF0000"/>
               </w:rPr>
-              <w:t>{%</w:t>
-            </w:r>
-            <w:proofErr w:type="spellStart"/>
-            <w:r>
-              <w:rPr>
-                <w:color w:val="FF0000"/>
-              </w:rPr>
-              <w:t>tr</w:t>
-            </w:r>
-            <w:proofErr w:type="spellEnd"/>
-            <w:r>
-              <w:rPr>
-                <w:color w:val="FF0000"/>
-              </w:rPr>
-              <w:t xml:space="preserve"> if</w:t>
-            </w:r>
-            <w:r>
-              <w:rPr>
-                <w:color w:val="FF0000"/>
-              </w:rPr>
-              <w:t xml:space="preserve"> </w:t>
-            </w:r>
-            <w:proofErr w:type="spellStart"/>
-            <w:r>
-              <w:rPr>
-                <w:color w:val="auto"/>
-              </w:rPr>
-              <w:t>type_of_response.any_true</w:t>
-            </w:r>
-            <w:proofErr w:type="spellEnd"/>
-            <w:r>
-              <w:rPr>
-                <w:color w:val="auto"/>
-              </w:rPr>
-              <w:t>() and not (</w:t>
-            </w:r>
-            <w:proofErr w:type="spellStart"/>
-            <w:r>
-              <w:rPr>
-                <w:color w:val="auto"/>
-              </w:rPr>
-              <w:t>type_of_response.all_true</w:t>
-            </w:r>
-            <w:proofErr w:type="spellEnd"/>
-            <w:r>
-              <w:rPr>
-                <w:color w:val="auto"/>
-              </w:rPr>
-              <w:t>('stay married', exclusive = True))</w:t>
-            </w:r>
-            <w:r>
-              <w:rPr>
-                <w:color w:val="FF0000"/>
-              </w:rPr>
-              <w:t xml:space="preserve"> %}</w:t>
-            </w:r>
+              <w:t>{%tr if type_of_response.any_true() and not (type_of_response.all_true('stay married', exclusive = True)) %}</w:t>
+            </w:r>
+            <w:proofErr w:type="spellStart"/>
+            <w:proofErr w:type="spellEnd"/>
+            <w:proofErr w:type="spellStart"/>
+            <w:proofErr w:type="spellEnd"/>
+            <w:proofErr w:type="spellStart"/>
+            <w:proofErr w:type="spellEnd"/>
           </w:p>
         </w:tc>
         <w:tc>
@@ -7065,36 +5878,12 @@
               <w:rPr>
                 <w:rFonts w:eastAsia="Calibri"/>
               </w:rPr>
-              <w:t>{</w:t>
+              <w:t>{{ expect_after_answer_step }}</w:t>
             </w:r>
             <w:proofErr w:type="gramStart"/>
-            <w:r>
-              <w:rPr>
-                <w:rFonts w:eastAsia="Calibri"/>
-              </w:rPr>
-              <w:t xml:space="preserve">{ </w:t>
-            </w:r>
-            <w:proofErr w:type="spellStart"/>
-            <w:r>
-              <w:rPr>
-                <w:rFonts w:eastAsia="Calibri"/>
-              </w:rPr>
-              <w:t>expect</w:t>
-            </w:r>
+            <w:proofErr w:type="spellStart"/>
             <w:proofErr w:type="gramEnd"/>
-            <w:r>
-              <w:rPr>
-                <w:rFonts w:eastAsia="Calibri"/>
-              </w:rPr>
-              <w:t>_after_answer_step</w:t>
-            </w:r>
-            <w:proofErr w:type="spellEnd"/>
-            <w:r>
-              <w:rPr>
-                <w:rFonts w:eastAsia="Calibri"/>
-              </w:rPr>
-              <w:t xml:space="preserve"> }}</w:t>
-            </w:r>
+            <w:proofErr w:type="spellEnd"/>
           </w:p>
         </w:tc>
         <w:tc>
@@ -7144,24 +5933,12 @@
               <w:pStyle w:val="Body"/>
             </w:pPr>
             <w:r>
-              <w:t>{%</w:t>
-            </w:r>
-            <w:proofErr w:type="spellStart"/>
-            <w:r>
-              <w:t>tr</w:t>
-            </w:r>
-            <w:proofErr w:type="spellEnd"/>
-            <w:r>
-              <w:t xml:space="preserve"> </w:t>
-            </w:r>
-            <w:proofErr w:type="spellStart"/>
-            <w:r>
-              <w:t>endif</w:t>
-            </w:r>
-            <w:proofErr w:type="spellEnd"/>
-            <w:r>
-              <w:t xml:space="preserve"> %}</w:t>
-            </w:r>
+              <w:t>{%tr endif %}</w:t>
+            </w:r>
+            <w:proofErr w:type="spellStart"/>
+            <w:proofErr w:type="spellEnd"/>
+            <w:proofErr w:type="spellStart"/>
+            <w:proofErr w:type="spellEnd"/>
           </w:p>
         </w:tc>
         <w:tc>
@@ -7443,19 +6220,7 @@
               <w:pStyle w:val="Body"/>
             </w:pPr>
             <w:r>
-              <w:t>{{p (include_docx_template("</w:t>
-            </w:r>
-            <w:r>
-              <w:t>docassemble.</w:t>
-            </w:r>
-            <w:r>
-              <w:t>AKA2JBranding:</w:t>
-            </w:r>
-            <w:r>
-              <w:t>learn_more_about_the_process_content.docx</w:t>
-            </w:r>
-            <w:r>
-              <w:t>")) }}</w:t>
+              <w:t>{{p (include_docx_template("docassemble.AKA2JBranding:learn_more_about_the_process_content.docx")) }}</w:t>
             </w:r>
           </w:p>
         </w:tc>
@@ -7488,36 +6253,12 @@
               <w:rPr>
                 <w:shd w:val="clear" w:color="auto" w:fill="FFFFFF"/>
               </w:rPr>
-              <w:t>{%</w:t>
-            </w:r>
-            <w:proofErr w:type="spellStart"/>
-            <w:r>
-              <w:rPr>
-                <w:shd w:val="clear" w:color="auto" w:fill="FFFFFF"/>
-              </w:rPr>
-              <w:t>tr</w:t>
-            </w:r>
-            <w:proofErr w:type="spellEnd"/>
-            <w:r>
-              <w:rPr>
-                <w:shd w:val="clear" w:color="auto" w:fill="FFFFFF"/>
-              </w:rPr>
-              <w:t xml:space="preserve"> </w:t>
-            </w:r>
-            <w:proofErr w:type="spellStart"/>
-            <w:r>
-              <w:rPr>
-                <w:shd w:val="clear" w:color="auto" w:fill="FFFFFF"/>
-              </w:rPr>
-              <w:t>endif</w:t>
-            </w:r>
-            <w:proofErr w:type="spellEnd"/>
-            <w:r>
-              <w:rPr>
-                <w:shd w:val="clear" w:color="auto" w:fill="FFFFFF"/>
-              </w:rPr>
-              <w:t xml:space="preserve"> %}</w:t>
-            </w:r>
+              <w:t>{%tr endif %}</w:t>
+            </w:r>
+            <w:proofErr w:type="spellStart"/>
+            <w:proofErr w:type="spellEnd"/>
+            <w:proofErr w:type="spellStart"/>
+            <w:proofErr w:type="spellEnd"/>
           </w:p>
         </w:tc>
         <w:tc>
@@ -7574,36 +6315,12 @@
               <w:rPr>
                 <w:shd w:val="clear" w:color="auto" w:fill="FFFFFF"/>
               </w:rPr>
-              <w:t>{%</w:t>
-            </w:r>
-            <w:proofErr w:type="spellStart"/>
-            <w:r>
-              <w:rPr>
-                <w:shd w:val="clear" w:color="auto" w:fill="FFFFFF"/>
-              </w:rPr>
-              <w:t>tr</w:t>
-            </w:r>
-            <w:proofErr w:type="spellEnd"/>
-            <w:r>
-              <w:rPr>
-                <w:shd w:val="clear" w:color="auto" w:fill="FFFFFF"/>
-              </w:rPr>
-              <w:t xml:space="preserve"> if </w:t>
-            </w:r>
-            <w:proofErr w:type="spellStart"/>
-            <w:r>
-              <w:rPr>
-                <w:shd w:val="clear" w:color="auto" w:fill="FFFFFF"/>
-              </w:rPr>
-              <w:t>domestic_violence</w:t>
-            </w:r>
-            <w:proofErr w:type="spellEnd"/>
-            <w:r>
-              <w:rPr>
-                <w:shd w:val="clear" w:color="auto" w:fill="FFFFFF"/>
-              </w:rPr>
-              <w:t xml:space="preserve"> %}</w:t>
-            </w:r>
+              <w:t>{%tr if domestic_violence %}</w:t>
+            </w:r>
+            <w:proofErr w:type="spellStart"/>
+            <w:proofErr w:type="spellEnd"/>
+            <w:proofErr w:type="spellStart"/>
+            <w:proofErr w:type="spellEnd"/>
           </w:p>
         </w:tc>
         <w:tc>
@@ -7629,12 +6346,10 @@
             <w:proofErr w:type="spellStart"/>
             <w:r>
               <w:t>answer_domestic_violence_step</w:t>
-            </w:r>
-            <w:proofErr w:type="spellEnd"/>
-            <w:r>
               <w:br/>
               <w:t>2026-04-02</w:t>
             </w:r>
+            <w:proofErr w:type="spellEnd"/>
           </w:p>
         </w:tc>
       </w:tr>
@@ -7666,30 +6381,12 @@
               </w:rPr>
             </w:pPr>
             <w:r>
-              <w:t>{</w:t>
+              <w:t>{{ answer_domestic_violence_step.subject }}</w:t>
             </w:r>
             <w:proofErr w:type="gramStart"/>
-            <w:r>
-              <w:t xml:space="preserve">{ </w:t>
-            </w:r>
-            <w:proofErr w:type="spellStart"/>
-            <w:r>
-              <w:t>answer</w:t>
-            </w:r>
+            <w:proofErr w:type="spellStart"/>
             <w:proofErr w:type="gramEnd"/>
-            <w:r>
-              <w:t>_domestic_violence_</w:t>
-            </w:r>
-            <w:r>
-              <w:t>step</w:t>
-            </w:r>
-            <w:r>
-              <w:t>.subject</w:t>
-            </w:r>
-            <w:proofErr w:type="spellEnd"/>
-            <w:r>
-              <w:t xml:space="preserve"> }}</w:t>
-            </w:r>
+            <w:proofErr w:type="spellEnd"/>
           </w:p>
         </w:tc>
         <w:tc>
@@ -7718,22 +6415,7 @@
               <w:pStyle w:val="Body"/>
             </w:pPr>
             <w:r>
-              <w:t>{{p (include_docx_template("</w:t>
-            </w:r>
-            <w:r>
-              <w:t>docassemble.AKA2JBranding:</w:t>
-            </w:r>
-            <w:r>
-              <w:t>answer_domestic_violence</w:t>
-            </w:r>
-            <w:r>
-              <w:t>_</w:t>
-            </w:r>
-            <w:r>
-              <w:t>content.docx</w:t>
-            </w:r>
-            <w:r>
-              <w:t>")) }}</w:t>
+              <w:t>{{p (include_docx_template("docassemble.AKA2JBranding:answer_domestic_violence_content.docx")) }}</w:t>
             </w:r>
           </w:p>
         </w:tc>
@@ -7769,36 +6451,12 @@
               <w:rPr>
                 <w:shd w:val="clear" w:color="auto" w:fill="FFFFFF"/>
               </w:rPr>
-              <w:t>{%</w:t>
-            </w:r>
-            <w:proofErr w:type="spellStart"/>
-            <w:r>
-              <w:rPr>
-                <w:shd w:val="clear" w:color="auto" w:fill="FFFFFF"/>
-              </w:rPr>
-              <w:t>tr</w:t>
-            </w:r>
-            <w:proofErr w:type="spellEnd"/>
-            <w:r>
-              <w:rPr>
-                <w:shd w:val="clear" w:color="auto" w:fill="FFFFFF"/>
-              </w:rPr>
-              <w:t xml:space="preserve"> </w:t>
-            </w:r>
-            <w:proofErr w:type="spellStart"/>
-            <w:r>
-              <w:rPr>
-                <w:shd w:val="clear" w:color="auto" w:fill="FFFFFF"/>
-              </w:rPr>
-              <w:t>endif</w:t>
-            </w:r>
-            <w:proofErr w:type="spellEnd"/>
-            <w:r>
-              <w:rPr>
-                <w:shd w:val="clear" w:color="auto" w:fill="FFFFFF"/>
-              </w:rPr>
-              <w:t xml:space="preserve"> %}</w:t>
-            </w:r>
+              <w:t>{%tr endif %}</w:t>
+            </w:r>
+            <w:proofErr w:type="spellStart"/>
+            <w:proofErr w:type="spellEnd"/>
+            <w:proofErr w:type="spellStart"/>
+            <w:proofErr w:type="spellEnd"/>
           </w:p>
         </w:tc>
         <w:tc>
@@ -7856,223 +6514,20 @@
                 <w:color w:val="FF0000"/>
                 <w:shd w:val="clear" w:color="auto" w:fill="FFFFFF"/>
               </w:rPr>
-              <w:t>{%</w:t>
-            </w:r>
-            <w:proofErr w:type="spellStart"/>
-            <w:r>
-              <w:rPr>
-                <w:color w:val="FF0000"/>
-                <w:shd w:val="clear" w:color="auto" w:fill="FFFFFF"/>
-              </w:rPr>
-              <w:t>tr</w:t>
-            </w:r>
-            <w:proofErr w:type="spellEnd"/>
-            <w:r>
-              <w:rPr>
-                <w:color w:val="FF0000"/>
-                <w:shd w:val="clear" w:color="auto" w:fill="FFFFFF"/>
-              </w:rPr>
-              <w:t xml:space="preserve"> if (</w:t>
-            </w:r>
-            <w:proofErr w:type="spellStart"/>
-            <w:r>
-              <w:rPr>
-                <w:color w:val="FF0000"/>
-                <w:shd w:val="clear" w:color="auto" w:fill="FFFFFF"/>
-              </w:rPr>
-              <w:t>user_need</w:t>
-            </w:r>
-            <w:proofErr w:type="spellEnd"/>
-            <w:r>
-              <w:rPr>
-                <w:color w:val="FF0000"/>
-                <w:shd w:val="clear" w:color="auto" w:fill="FFFFFF"/>
-              </w:rPr>
-              <w:t xml:space="preserve"> </w:t>
-            </w:r>
-            <w:r>
-              <w:rPr>
-                <w:color w:val="FF0000"/>
-                <w:shd w:val="clear" w:color="auto" w:fill="FFFFFF"/>
-              </w:rPr>
-              <w:t>in</w:t>
-            </w:r>
-            <w:r>
-              <w:rPr>
-                <w:color w:val="FF0000"/>
-                <w:shd w:val="clear" w:color="auto" w:fill="FFFFFF"/>
-              </w:rPr>
-              <w:t xml:space="preserve"> </w:t>
-            </w:r>
-            <w:r>
-              <w:rPr>
-                <w:color w:val="FF0000"/>
-                <w:shd w:val="clear" w:color="auto" w:fill="FFFFFF"/>
-              </w:rPr>
-              <w:t>(</w:t>
-            </w:r>
-            <w:r>
-              <w:rPr>
-                <w:color w:val="FF0000"/>
-                <w:shd w:val="clear" w:color="auto" w:fill="FFFFFF"/>
-              </w:rPr>
-              <w:t>'custody'</w:t>
-            </w:r>
-            <w:r>
-              <w:rPr>
-                <w:color w:val="FF0000"/>
-                <w:shd w:val="clear" w:color="auto" w:fill="FFFFFF"/>
-              </w:rPr>
-              <w:t>, 'answer custody')</w:t>
-            </w:r>
-            <w:r>
-              <w:rPr>
-                <w:color w:val="FF0000"/>
-                <w:shd w:val="clear" w:color="auto" w:fill="FFFFFF"/>
-              </w:rPr>
-              <w:t xml:space="preserve"> and paternity) </w:t>
-            </w:r>
-            <w:r>
-              <w:rPr>
-                <w:color w:val="FF0000"/>
-                <w:shd w:val="clear" w:color="auto" w:fill="FFFFFF"/>
-              </w:rPr>
-              <w:t xml:space="preserve">or </w:t>
-            </w:r>
-            <w:r>
-              <w:rPr>
-                <w:color w:val="FF0000"/>
-                <w:shd w:val="clear" w:color="auto" w:fill="FFFFFF"/>
-              </w:rPr>
-              <w:t>(</w:t>
-            </w:r>
-            <w:proofErr w:type="spellStart"/>
-            <w:r>
-              <w:rPr>
-                <w:color w:val="FF0000"/>
-                <w:shd w:val="clear" w:color="auto" w:fill="FFFFFF"/>
-              </w:rPr>
-              <w:t>user_need</w:t>
-            </w:r>
-            <w:proofErr w:type="spellEnd"/>
-            <w:r>
-              <w:rPr>
-                <w:color w:val="FF0000"/>
-                <w:shd w:val="clear" w:color="auto" w:fill="FFFFFF"/>
-              </w:rPr>
-              <w:t xml:space="preserve"> == '</w:t>
-            </w:r>
-            <w:r>
-              <w:rPr>
-                <w:color w:val="FF0000"/>
-                <w:shd w:val="clear" w:color="auto" w:fill="FFFFFF"/>
-              </w:rPr>
-              <w:t>divorce</w:t>
-            </w:r>
-            <w:r>
-              <w:rPr>
-                <w:color w:val="FF0000"/>
-                <w:shd w:val="clear" w:color="auto" w:fill="FFFFFF"/>
-              </w:rPr>
-              <w:t xml:space="preserve">' and </w:t>
-            </w:r>
-            <w:proofErr w:type="spellStart"/>
-            <w:r>
-              <w:rPr>
-                <w:color w:val="FF0000"/>
-                <w:shd w:val="clear" w:color="auto" w:fill="FFFFFF"/>
-              </w:rPr>
-              <w:t>minor_children</w:t>
-            </w:r>
-            <w:proofErr w:type="spellEnd"/>
-            <w:r>
-              <w:rPr>
-                <w:color w:val="FF0000"/>
-                <w:shd w:val="clear" w:color="auto" w:fill="FFFFFF"/>
-              </w:rPr>
-              <w:t xml:space="preserve"> and </w:t>
-            </w:r>
-            <w:r>
-              <w:rPr>
-                <w:color w:val="FF0000"/>
-                <w:shd w:val="clear" w:color="auto" w:fill="FFFFFF"/>
-              </w:rPr>
-              <w:t>paternity</w:t>
-            </w:r>
-            <w:r>
-              <w:rPr>
-                <w:color w:val="FF0000"/>
-                <w:shd w:val="clear" w:color="auto" w:fill="FFFFFF"/>
-              </w:rPr>
-              <w:t xml:space="preserve"> == 'do not know'</w:t>
-            </w:r>
-            <w:r>
-              <w:rPr>
-                <w:color w:val="FF0000"/>
-                <w:shd w:val="clear" w:color="auto" w:fill="FFFFFF"/>
-              </w:rPr>
-              <w:t xml:space="preserve">) </w:t>
-            </w:r>
-            <w:r>
-              <w:rPr>
-                <w:color w:val="FF0000"/>
-                <w:shd w:val="clear" w:color="auto" w:fill="FFFFFF"/>
-              </w:rPr>
-              <w:t>or (</w:t>
-            </w:r>
-            <w:proofErr w:type="spellStart"/>
-            <w:r>
-              <w:rPr>
-                <w:color w:val="FF0000"/>
-                <w:shd w:val="clear" w:color="auto" w:fill="FFFFFF"/>
-              </w:rPr>
-              <w:t>user_need</w:t>
-            </w:r>
-            <w:proofErr w:type="spellEnd"/>
-            <w:r>
-              <w:rPr>
-                <w:color w:val="FF0000"/>
-                <w:shd w:val="clear" w:color="auto" w:fill="FFFFFF"/>
-              </w:rPr>
-              <w:t xml:space="preserve"> == 'answer divorce' and </w:t>
-            </w:r>
-            <w:proofErr w:type="spellStart"/>
-            <w:r>
-              <w:rPr>
-                <w:color w:val="FF0000"/>
-                <w:shd w:val="clear" w:color="auto" w:fill="FFFFFF"/>
-              </w:rPr>
-              <w:t>minor_children</w:t>
-            </w:r>
-            <w:proofErr w:type="spellEnd"/>
-            <w:r>
-              <w:rPr>
-                <w:color w:val="FF0000"/>
-                <w:shd w:val="clear" w:color="auto" w:fill="FFFFFF"/>
-              </w:rPr>
-              <w:t xml:space="preserve"> and </w:t>
-            </w:r>
-            <w:r>
-              <w:rPr>
-                <w:color w:val="FF0000"/>
-                <w:shd w:val="clear" w:color="auto" w:fill="FFFFFF"/>
-              </w:rPr>
-              <w:t>paternity</w:t>
-            </w:r>
-            <w:r>
-              <w:rPr>
-                <w:color w:val="FF0000"/>
-                <w:shd w:val="clear" w:color="auto" w:fill="FFFFFF"/>
-              </w:rPr>
-              <w:t xml:space="preserve"> == 'do not know')</w:t>
-            </w:r>
-            <w:r>
-              <w:rPr>
-                <w:color w:val="FF0000"/>
-                <w:shd w:val="clear" w:color="auto" w:fill="FFFFFF"/>
-              </w:rPr>
-              <w:t xml:space="preserve"> %}</w:t>
-            </w:r>
+              <w:t>{%tr if (user_need in ('custody', 'answer custody') and paternity) or (user_need == 'divorce' and minor_children and paternity == 'do not know') or (user_need == 'answer divorce' and minor_children and paternity == 'do not know') %}</w:t>
+            </w:r>
+            <w:proofErr w:type="spellStart"/>
+            <w:proofErr w:type="spellEnd"/>
+            <w:proofErr w:type="spellStart"/>
+            <w:proofErr w:type="spellEnd"/>
+            <w:proofErr w:type="spellStart"/>
+            <w:proofErr w:type="spellEnd"/>
+            <w:proofErr w:type="spellStart"/>
+            <w:proofErr w:type="spellEnd"/>
+            <w:proofErr w:type="spellStart"/>
+            <w:proofErr w:type="spellEnd"/>
+            <w:proofErr w:type="spellStart"/>
+            <w:proofErr w:type="spellEnd"/>
           </w:p>
         </w:tc>
         <w:tc>
@@ -8134,42 +6589,12 @@
               <w:rPr>
                 <w:shd w:val="clear" w:color="auto" w:fill="FFFFFF"/>
               </w:rPr>
-              <w:t>{</w:t>
+              <w:t>{{ paternity_step.subject }}</w:t>
             </w:r>
             <w:proofErr w:type="gramStart"/>
-            <w:r>
-              <w:rPr>
-                <w:shd w:val="clear" w:color="auto" w:fill="FFFFFF"/>
-              </w:rPr>
-              <w:t xml:space="preserve">{ </w:t>
-            </w:r>
-            <w:proofErr w:type="spellStart"/>
-            <w:r>
-              <w:rPr>
-                <w:shd w:val="clear" w:color="auto" w:fill="FFFFFF"/>
-              </w:rPr>
-              <w:t>paternity</w:t>
-            </w:r>
+            <w:proofErr w:type="spellStart"/>
             <w:proofErr w:type="gramEnd"/>
-            <w:r>
-              <w:rPr>
-                <w:shd w:val="clear" w:color="auto" w:fill="FFFFFF"/>
-              </w:rPr>
-              <w:t>_step</w:t>
-            </w:r>
-            <w:r>
-              <w:rPr>
-                <w:shd w:val="clear" w:color="auto" w:fill="FFFFFF"/>
-              </w:rPr>
-              <w:t>.subject</w:t>
-            </w:r>
-            <w:proofErr w:type="spellEnd"/>
-            <w:r>
-              <w:rPr>
-                <w:shd w:val="clear" w:color="auto" w:fill="FFFFFF"/>
-              </w:rPr>
-              <w:t xml:space="preserve"> }}</w:t>
-            </w:r>
+            <w:proofErr w:type="spellEnd"/>
           </w:p>
         </w:tc>
         <w:tc>
@@ -8198,16 +6623,7 @@
               <w:pStyle w:val="Body"/>
             </w:pPr>
             <w:r>
-              <w:t>{{p (include_docx_template("docassemble.AKA2JBranding:</w:t>
-            </w:r>
-            <w:r>
-              <w:t>paternity</w:t>
-            </w:r>
-            <w:r>
-              <w:t>_content.docx</w:t>
-            </w:r>
-            <w:r>
-              <w:t>")) }}</w:t>
+              <w:t>{{p (include_docx_template("docassemble.AKA2JBranding:paternity_content.docx")) }}</w:t>
             </w:r>
           </w:p>
         </w:tc>
@@ -8243,36 +6659,12 @@
               <w:rPr>
                 <w:shd w:val="clear" w:color="auto" w:fill="FFFFFF"/>
               </w:rPr>
-              <w:t>{%</w:t>
-            </w:r>
-            <w:proofErr w:type="spellStart"/>
-            <w:r>
-              <w:rPr>
-                <w:shd w:val="clear" w:color="auto" w:fill="FFFFFF"/>
-              </w:rPr>
-              <w:t>tr</w:t>
-            </w:r>
-            <w:proofErr w:type="spellEnd"/>
-            <w:r>
-              <w:rPr>
-                <w:shd w:val="clear" w:color="auto" w:fill="FFFFFF"/>
-              </w:rPr>
-              <w:t xml:space="preserve"> </w:t>
-            </w:r>
-            <w:proofErr w:type="spellStart"/>
-            <w:r>
-              <w:rPr>
-                <w:shd w:val="clear" w:color="auto" w:fill="FFFFFF"/>
-              </w:rPr>
-              <w:t>endif</w:t>
-            </w:r>
-            <w:proofErr w:type="spellEnd"/>
-            <w:r>
-              <w:rPr>
-                <w:shd w:val="clear" w:color="auto" w:fill="FFFFFF"/>
-              </w:rPr>
-              <w:t xml:space="preserve"> %}</w:t>
-            </w:r>
+              <w:t>{%tr endif %}</w:t>
+            </w:r>
+            <w:proofErr w:type="spellStart"/>
+            <w:proofErr w:type="spellEnd"/>
+            <w:proofErr w:type="spellStart"/>
+            <w:proofErr w:type="spellEnd"/>
           </w:p>
         </w:tc>
         <w:tc>
@@ -8326,27 +6718,12 @@
               </w:rPr>
             </w:pPr>
             <w:r>
-              <w:t>{</w:t>
+              <w:t>{{ get_help.subject }}</w:t>
             </w:r>
             <w:proofErr w:type="gramStart"/>
-            <w:r>
-              <w:t xml:space="preserve">{ </w:t>
-            </w:r>
-            <w:proofErr w:type="spellStart"/>
-            <w:r>
-              <w:t>get</w:t>
-            </w:r>
+            <w:proofErr w:type="spellStart"/>
             <w:proofErr w:type="gramEnd"/>
-            <w:r>
-              <w:t>_help</w:t>
-            </w:r>
-            <w:r>
-              <w:t>.subject</w:t>
-            </w:r>
-            <w:proofErr w:type="spellEnd"/>
-            <w:r>
-              <w:t xml:space="preserve"> }}</w:t>
-            </w:r>
+            <w:proofErr w:type="spellEnd"/>
           </w:p>
         </w:tc>
         <w:tc>
@@ -8376,13 +6753,7 @@
               <w:spacing w:before="100" w:after="100"/>
             </w:pPr>
             <w:r>
-              <w:t>{{p (include_docx_template("docassemble.AKA2JBranding:get_help</w:t>
-            </w:r>
-            <w:r>
-              <w:t>_content.docx</w:t>
-            </w:r>
-            <w:r>
-              <w:t>")) }}</w:t>
+              <w:t>{{p (include_docx_template("docassemble.AKA2JBranding:get_help_content.docx")) }}</w:t>
             </w:r>
           </w:p>
         </w:tc>
@@ -8395,6 +6766,11 @@
     </w:p>
     <w:sectPr>
       <w:footerReference w:type="default" r:id="rId24"/>
+      <w:headerReference w:type="default" r:id="rId27"/>
+      <w:headerReference w:type="first" r:id="rId28"/>
+      <w:headerReference w:type="even" r:id="rId29"/>
+      <w:footerReference w:type="first" r:id="rId30"/>
+      <w:footerReference w:type="even" r:id="rId31"/>
       <w:pgSz w:w="12240" w:h="15840"/>
       <w:pgMar w:top="245" w:right="1440" w:bottom="274" w:left="1440" w:header="0" w:footer="720" w:gutter="0"/>
       <w:cols w:space="720"/>
@@ -8481,17 +6857,28 @@
       <w:spacing w:before="100" w:afterAutospacing="0"/>
     </w:pPr>
     <w:r>
-      <w:t xml:space="preserve">April </w:t>
+      <w:t>April 13, 2026</w:t>
     </w:r>
-    <w:r>
-      <w:t>13</w:t>
-    </w:r>
-    <w:r>
-      <w:t>,</w:t>
-    </w:r>
-    <w:r>
-      <w:t xml:space="preserve"> 2026</w:t>
-    </w:r>
+  </w:p>
+</w:ftr>
+</file>
+
+<file path=word/footer2.xml><?xml version="1.0" encoding="utf-8"?>
+<w:ftr xmlns:m="http://schemas.openxmlformats.org/officeDocument/2006/math" xmlns:mc="http://schemas.openxmlformats.org/markup-compatibility/2006" xmlns:mo="http://schemas.microsoft.com/office/mac/office/2008/main" xmlns:mv="urn:schemas-microsoft-com:mac:vml" xmlns:o="urn:schemas-microsoft-com:office:office" xmlns:r="http://schemas.openxmlformats.org/officeDocument/2006/relationships" xmlns:v="urn:schemas-microsoft-com:vml" xmlns:w10="urn:schemas-microsoft-com:office:word" xmlns:w14="http://schemas.microsoft.com/office/word/2010/wordml" xmlns:w="http://schemas.openxmlformats.org/wordprocessingml/2006/main" xmlns:wne="http://schemas.microsoft.com/office/word/2006/wordml" xmlns:wp14="http://schemas.microsoft.com/office/word/2010/wordprocessingDrawing" xmlns:wp="http://schemas.openxmlformats.org/drawingml/2006/wordprocessingDrawing" xmlns:wpc="http://schemas.microsoft.com/office/word/2010/wordprocessingCanvas" xmlns:wpg="http://schemas.microsoft.com/office/word/2010/wordprocessingGroup" xmlns:wpi="http://schemas.microsoft.com/office/word/2010/wordprocessingInk" xmlns:wps="http://schemas.microsoft.com/office/word/2010/wordprocessingShape" mc:Ignorable="w14 wp14">
+  <w:p>
+    <w:pPr>
+      <w:pStyle w:val="Footer"/>
+    </w:pPr>
+  </w:p>
+</w:ftr>
+</file>
+
+<file path=word/footer3.xml><?xml version="1.0" encoding="utf-8"?>
+<w:ftr xmlns:m="http://schemas.openxmlformats.org/officeDocument/2006/math" xmlns:mc="http://schemas.openxmlformats.org/markup-compatibility/2006" xmlns:mo="http://schemas.microsoft.com/office/mac/office/2008/main" xmlns:mv="urn:schemas-microsoft-com:mac:vml" xmlns:o="urn:schemas-microsoft-com:office:office" xmlns:r="http://schemas.openxmlformats.org/officeDocument/2006/relationships" xmlns:v="urn:schemas-microsoft-com:vml" xmlns:w10="urn:schemas-microsoft-com:office:word" xmlns:w14="http://schemas.microsoft.com/office/word/2010/wordml" xmlns:w="http://schemas.openxmlformats.org/wordprocessingml/2006/main" xmlns:wne="http://schemas.microsoft.com/office/word/2006/wordml" xmlns:wp14="http://schemas.microsoft.com/office/word/2010/wordprocessingDrawing" xmlns:wp="http://schemas.openxmlformats.org/drawingml/2006/wordprocessingDrawing" xmlns:wpc="http://schemas.microsoft.com/office/word/2010/wordprocessingCanvas" xmlns:wpg="http://schemas.microsoft.com/office/word/2010/wordprocessingGroup" xmlns:wpi="http://schemas.microsoft.com/office/word/2010/wordprocessingInk" xmlns:wps="http://schemas.microsoft.com/office/word/2010/wordprocessingShape" mc:Ignorable="w14 wp14">
+  <w:p>
+    <w:pPr>
+      <w:pStyle w:val="Footer"/>
+    </w:pPr>
   </w:p>
 </w:ftr>
 </file>
@@ -8513,6 +6900,36 @@
     </w:p>
   </w:footnote>
 </w:footnotes>
+</file>
+
+<file path=word/header1.xml><?xml version="1.0" encoding="utf-8"?>
+<w:hdr xmlns:m="http://schemas.openxmlformats.org/officeDocument/2006/math" xmlns:mc="http://schemas.openxmlformats.org/markup-compatibility/2006" xmlns:mo="http://schemas.microsoft.com/office/mac/office/2008/main" xmlns:mv="urn:schemas-microsoft-com:mac:vml" xmlns:o="urn:schemas-microsoft-com:office:office" xmlns:r="http://schemas.openxmlformats.org/officeDocument/2006/relationships" xmlns:v="urn:schemas-microsoft-com:vml" xmlns:w10="urn:schemas-microsoft-com:office:word" xmlns:w14="http://schemas.microsoft.com/office/word/2010/wordml" xmlns:w="http://schemas.openxmlformats.org/wordprocessingml/2006/main" xmlns:wne="http://schemas.microsoft.com/office/word/2006/wordml" xmlns:wp14="http://schemas.microsoft.com/office/word/2010/wordprocessingDrawing" xmlns:wp="http://schemas.openxmlformats.org/drawingml/2006/wordprocessingDrawing" xmlns:wpc="http://schemas.microsoft.com/office/word/2010/wordprocessingCanvas" xmlns:wpg="http://schemas.microsoft.com/office/word/2010/wordprocessingGroup" xmlns:wpi="http://schemas.microsoft.com/office/word/2010/wordprocessingInk" xmlns:wps="http://schemas.microsoft.com/office/word/2010/wordprocessingShape" mc:Ignorable="w14 wp14">
+  <w:p>
+    <w:pPr>
+      <w:pStyle w:val="Header"/>
+    </w:pPr>
+  </w:p>
+</w:hdr>
+</file>
+
+<file path=word/header2.xml><?xml version="1.0" encoding="utf-8"?>
+<w:hdr xmlns:m="http://schemas.openxmlformats.org/officeDocument/2006/math" xmlns:mc="http://schemas.openxmlformats.org/markup-compatibility/2006" xmlns:mo="http://schemas.microsoft.com/office/mac/office/2008/main" xmlns:mv="urn:schemas-microsoft-com:mac:vml" xmlns:o="urn:schemas-microsoft-com:office:office" xmlns:r="http://schemas.openxmlformats.org/officeDocument/2006/relationships" xmlns:v="urn:schemas-microsoft-com:vml" xmlns:w10="urn:schemas-microsoft-com:office:word" xmlns:w14="http://schemas.microsoft.com/office/word/2010/wordml" xmlns:w="http://schemas.openxmlformats.org/wordprocessingml/2006/main" xmlns:wne="http://schemas.microsoft.com/office/word/2006/wordml" xmlns:wp14="http://schemas.microsoft.com/office/word/2010/wordprocessingDrawing" xmlns:wp="http://schemas.openxmlformats.org/drawingml/2006/wordprocessingDrawing" xmlns:wpc="http://schemas.microsoft.com/office/word/2010/wordprocessingCanvas" xmlns:wpg="http://schemas.microsoft.com/office/word/2010/wordprocessingGroup" xmlns:wpi="http://schemas.microsoft.com/office/word/2010/wordprocessingInk" xmlns:wps="http://schemas.microsoft.com/office/word/2010/wordprocessingShape" mc:Ignorable="w14 wp14">
+  <w:p>
+    <w:pPr>
+      <w:pStyle w:val="Header"/>
+    </w:pPr>
+  </w:p>
+</w:hdr>
+</file>
+
+<file path=word/header3.xml><?xml version="1.0" encoding="utf-8"?>
+<w:hdr xmlns:m="http://schemas.openxmlformats.org/officeDocument/2006/math" xmlns:mc="http://schemas.openxmlformats.org/markup-compatibility/2006" xmlns:mo="http://schemas.microsoft.com/office/mac/office/2008/main" xmlns:mv="urn:schemas-microsoft-com:mac:vml" xmlns:o="urn:schemas-microsoft-com:office:office" xmlns:r="http://schemas.openxmlformats.org/officeDocument/2006/relationships" xmlns:v="urn:schemas-microsoft-com:vml" xmlns:w10="urn:schemas-microsoft-com:office:word" xmlns:w14="http://schemas.microsoft.com/office/word/2010/wordml" xmlns:w="http://schemas.openxmlformats.org/wordprocessingml/2006/main" xmlns:wne="http://schemas.microsoft.com/office/word/2006/wordml" xmlns:wp14="http://schemas.microsoft.com/office/word/2010/wordprocessingDrawing" xmlns:wp="http://schemas.openxmlformats.org/drawingml/2006/wordprocessingDrawing" xmlns:wpc="http://schemas.microsoft.com/office/word/2010/wordprocessingCanvas" xmlns:wpg="http://schemas.microsoft.com/office/word/2010/wordprocessingGroup" xmlns:wpi="http://schemas.microsoft.com/office/word/2010/wordprocessingInk" xmlns:wps="http://schemas.microsoft.com/office/word/2010/wordprocessingShape" mc:Ignorable="w14 wp14">
+  <w:p>
+    <w:pPr>
+      <w:pStyle w:val="Header"/>
+    </w:pPr>
+  </w:p>
+</w:hdr>
 </file>
 
 <file path=word/numbering.xml><?xml version="1.0" encoding="utf-8"?>

</xml_diff>

<commit_message>
Ran docx tests, updated some content.docxes in branding package, features in this package and the answer divorce template to nab steps missed earlier
</commit_message>
<xml_diff>
--- a/docassemble/RespondingCaseToEndYourMarriageActionPlan/data/templates/responding_ending_marriage_action_plan.docx
+++ b/docassemble/RespondingCaseToEndYourMarriageActionPlan/data/templates/responding_ending_marriage_action_plan.docx
@@ -955,11 +955,7 @@
               <w:spacing w:before="0" w:after="0"/>
             </w:pPr>
             <w:r>
-              <w:t>{%tr if type_of_response['improper service'] or type_of_response['def</w:t>
-            </w:r>
-            <w:r>
-              <w:lastRenderedPageBreak/>
-              <w:t>ault'] %}</w:t>
+              <w:t>{%tr if type_of_response['improper service'] or type_of_response['default'] %}</w:t>
             </w:r>
           </w:p>
         </w:tc>
@@ -988,7 +984,6 @@
             </w:pPr>
             <w:proofErr w:type="spellStart"/>
             <w:r>
-              <w:lastRenderedPageBreak/>
               <w:t>proper_service_step</w:t>
             </w:r>
             <w:proofErr w:type="spellEnd"/>
@@ -1020,6 +1015,7 @@
               <w:outlineLvl w:val="1"/>
             </w:pPr>
             <w:r>
+              <w:lastRenderedPageBreak/>
               <w:t xml:space="preserve">{{ </w:t>
             </w:r>
             <w:proofErr w:type="spellStart"/>
@@ -1161,9 +1157,6 @@
                 <w:highlight w:val="white"/>
               </w:rPr>
             </w:pPr>
-            <w:r>
-              <w:t>{%tr if type_of_response.all_true('improper service', exclusive = True) %}</w:t>
-            </w:r>
           </w:p>
         </w:tc>
         <w:tc>
@@ -1190,6 +1183,15 @@
               <w:t>decide_after_improper_service_step</w:t>
             </w:r>
             <w:proofErr w:type="spellEnd"/>
+            <w:r>
+              <w:br/>
+            </w:r>
+            <w:r>
+              <w:t xml:space="preserve">if type_of_response.all_true('improper service', exclusive = True) </w:t>
+            </w:r>
+            <w:r>
+              <w:t>or (type_of_response.all_true(‘wrong state’, ‘improper service’) and not proper_service)</w:t>
+            </w:r>
           </w:p>
         </w:tc>
       </w:tr>
@@ -1285,9 +1287,6 @@
               <w:pStyle w:val="Body"/>
               <w:spacing w:before="0" w:after="0"/>
             </w:pPr>
-            <w:r>
-              <w:t>{%tr endif %}</w:t>
-            </w:r>
           </w:p>
         </w:tc>
         <w:tc>
@@ -1689,62 +1688,62 @@
               <w:rPr>
                 <w:color w:val="FF0000"/>
               </w:rPr>
-              <w:t xml:space="preserve">{%tr </w:t>
+              <w:t xml:space="preserve">{%tr if user_need == 'answer divorce' and case_type == 'legal separation' and not </w:t>
+            </w:r>
+            <w:r>
+              <w:rPr>
+                <w:color w:val="FFC000"/>
+              </w:rPr>
+              <w:t>(</w:t>
+            </w:r>
+            <w:r>
+              <w:rPr>
+                <w:color w:val="92D050"/>
+              </w:rPr>
+              <w:t>type_of_response[‘ca</w:t>
+            </w:r>
+            <w:r>
+              <w:rPr>
+                <w:color w:val="92D050"/>
+              </w:rPr>
+              <w:lastRenderedPageBreak/>
+              <w:t>se in 2 states’] and stage_of_other_case == ‘ended with order’</w:t>
+            </w:r>
+            <w:r>
+              <w:rPr>
+                <w:color w:val="FFC000"/>
+              </w:rPr>
+              <w:t>)</w:t>
             </w:r>
             <w:r>
               <w:rPr>
                 <w:color w:val="FF0000"/>
               </w:rPr>
-              <w:t xml:space="preserve">if user_need == 'answer divorce' and type_of_response['ak </w:t>
+              <w:t xml:space="preserve"> and not </w:t>
+            </w:r>
+            <w:r>
+              <w:rPr>
+                <w:color w:val="FFC000"/>
+              </w:rPr>
+              <w:t>(</w:t>
+            </w:r>
+            <w:r>
+              <w:rPr>
+                <w:color w:val="92D050"/>
+              </w:rPr>
+              <w:t>type_of_response[‘default’] and stage_of_default == ‘judgment entered’</w:t>
+            </w:r>
+            <w:r>
+              <w:rPr>
+                <w:color w:val="FFC000"/>
+              </w:rPr>
+              <w:t xml:space="preserve">) </w:t>
             </w:r>
             <w:r>
               <w:rPr>
                 <w:color w:val="FF0000"/>
               </w:rPr>
-              <w:lastRenderedPageBreak/>
-              <w:t>divorce case'] and case_type</w:t>
-            </w:r>
-            <w:r>
-              <w:rPr>
-                <w:color w:val="FF0000"/>
-              </w:rPr>
-              <w:t xml:space="preserve"> == 'legal separation' </w:t>
-            </w:r>
-            <w:r>
-              <w:rPr>
-                <w:color w:val="FF0000"/>
-              </w:rPr>
-              <w:t xml:space="preserve">and </w:t>
-            </w:r>
-            <w:r>
-              <w:rPr>
-                <w:color w:val="FF0000"/>
-              </w:rPr>
-              <w:t>want_legal_separation == '</w:t>
-            </w:r>
-            <w:r>
-              <w:rPr>
-                <w:color w:val="FF0000"/>
-              </w:rPr>
-              <w:t>unsure</w:t>
-            </w:r>
-            <w:r>
-              <w:rPr>
-                <w:color w:val="FF0000"/>
-              </w:rPr>
-              <w:t>'</w:t>
-            </w:r>
-            <w:r>
-              <w:rPr>
-                <w:color w:val="FF0000"/>
-              </w:rPr>
-              <w:t xml:space="preserve"> </w:t>
-            </w:r>
-            <w:r>
-              <w:rPr>
-                <w:color w:val="FF0000"/>
-              </w:rPr>
-              <w:t>%}</w:t>
+              <w:t>and want_legal_separation == 'unsure' %}</w:t>
             </w:r>
           </w:p>
         </w:tc>
@@ -1851,15 +1850,41 @@
               <w:pStyle w:val="Body"/>
             </w:pPr>
             <w:r>
-              <w:t>Some insurance companies may not continue coverage after the court issues a Legal Separation Decree so if you need your spouse’s medical insurance, talk to a lawyer before the legal separation is finalized to understand your options for continued coverage.</w:t>
-            </w:r>
-          </w:p>
-          <w:p>
-            <w:pPr>
-              <w:pStyle w:val="Body"/>
-            </w:pPr>
-            <w:r>
-              <w:t>If you and your spouse want to legally separate but stay married to protect significant religious, financial, social or legal interests, the court can issue a Decree of Legal Separation. You will still be married, but the court will {% if not minor_children and wife_is_pregnant == 'not pregnant' %}divide the property and debt earned or received during the marriage.{% else%}</w:t>
+              <w:t xml:space="preserve">Some insurance companies may not continue coverage after the court issues a </w:t>
+            </w:r>
+            <w:r>
+              <w:rPr>
+                <w:b/>
+                <w:bCs/>
+              </w:rPr>
+              <w:t>Legal Separation Decree</w:t>
+            </w:r>
+            <w:r>
+              <w:t xml:space="preserve"> so if you need your spouse’s medical insurance, talk to a lawyer before the legal separation is finalized to understand your options for continued coverage.</w:t>
+            </w:r>
+          </w:p>
+          <w:p>
+            <w:pPr>
+              <w:pStyle w:val="Body"/>
+            </w:pPr>
+            <w:r>
+              <w:t xml:space="preserve">If you and your spouse want to legally separate but stay married to protect significant religious, financial, social or legal interests, the court can issue a </w:t>
+            </w:r>
+            <w:r>
+              <w:rPr>
+                <w:b/>
+                <w:bCs/>
+              </w:rPr>
+              <w:t>Decree of Legal Separation</w:t>
+            </w:r>
+            <w:r>
+              <w:t>. You will still be married, but the court will {% if not minor_children and wife_is_pregnant == 'not pregnant' %}divide the property and debt earned or received during the marriage.{% else</w:t>
+            </w:r>
+            <w:r>
+              <w:t xml:space="preserve"> </w:t>
+            </w:r>
+            <w:r>
+              <w:t>%}</w:t>
             </w:r>
           </w:p>
           <w:p>
@@ -1935,10 +1960,18 @@
             <w:r>
               <w:t>Remember, either you or your spouse can turn a legal separation into a divorce at any time</w:t>
             </w:r>
-          </w:p>
-          <w:p>
-            <w:pPr>
-              <w:pStyle w:val="Body"/>
+            <w:r>
+              <w:t>:</w:t>
+            </w:r>
+          </w:p>
+          <w:p>
+            <w:pPr>
+              <w:pStyle w:val="Body"/>
+              <w:numPr>
+                <w:ilvl w:val="0"/>
+                <w:numId w:val="33"/>
+              </w:numPr>
+              <w:ind w:left="404"/>
             </w:pPr>
             <w:r>
               <w:t>If you are not sure what you want, you can proceed with a legal separation, and change it to a divorce at any time.</w:t>
@@ -1947,9 +1980,25 @@
           <w:p>
             <w:pPr>
               <w:pStyle w:val="Body"/>
-            </w:pPr>
-            <w:r>
-              <w:t>If you decide you do not want a legal separation, check the box telling the court “I do not agree to a legal separation because I want the marriage to end in a divorce” in the “Counterclaims” section of your Answer (pages 2-3).</w:t>
+              <w:numPr>
+                <w:ilvl w:val="0"/>
+                <w:numId w:val="33"/>
+              </w:numPr>
+              <w:ind w:left="404"/>
+            </w:pPr>
+            <w:r>
+              <w:lastRenderedPageBreak/>
+              <w:t xml:space="preserve">If you decide you do not want a legal separation, check the box telling the court “I do not agree to a legal separation because I want the marriage to end in a divorce” in the “Counterclaims” section of your </w:t>
+            </w:r>
+            <w:r>
+              <w:rPr>
+                <w:b/>
+                <w:bCs/>
+              </w:rPr>
+              <w:t>Answer</w:t>
+            </w:r>
+            <w:r>
+              <w:t xml:space="preserve"> (pages 2-3).</w:t>
             </w:r>
           </w:p>
         </w:tc>
@@ -2598,7 +2647,23 @@
                 <w:sz w:val="20"/>
                 <w:szCs w:val="20"/>
               </w:rPr>
-              <w:t xml:space="preserve">response_to_complaint in('yes', 'some') </w:t>
+              <w:t>response_to_complaint in('</w:t>
+            </w:r>
+            <w:r>
+              <w:rPr>
+                <w:color w:val="6AA84F"/>
+                <w:sz w:val="20"/>
+                <w:szCs w:val="20"/>
+              </w:rPr>
+              <w:t>agree</w:t>
+            </w:r>
+            <w:r>
+              <w:rPr>
+                <w:color w:val="6AA84F"/>
+                <w:sz w:val="20"/>
+                <w:szCs w:val="20"/>
+              </w:rPr>
+              <w:t xml:space="preserve">', 'some') </w:t>
             </w:r>
             <w:r>
               <w:rPr>
@@ -2825,7 +2890,11 @@
             </w:r>
             <w:proofErr w:type="spellStart"/>
             <w:r>
-              <w:t>want_help_to_agree</w:t>
+              <w:t>want_help_to_</w:t>
+            </w:r>
+            <w:r>
+              <w:lastRenderedPageBreak/>
+              <w:t>agree</w:t>
             </w:r>
             <w:r>
               <w:t>_</w:t>
@@ -2865,7 +2934,11 @@
               <w:pStyle w:val="Body"/>
             </w:pPr>
             <w:r>
-              <w:t>{{p (include_docx_template("docassemble.AKA2JBranding:want_help_to_agree_content.docx")) }}</w:t>
+              <w:t>{{p (include_docx_template("docassemble.AKA2JBranding:want_help_to_</w:t>
+            </w:r>
+            <w:r>
+              <w:lastRenderedPageBreak/>
+              <w:t>agree_content.docx")) }}</w:t>
             </w:r>
           </w:p>
         </w:tc>
@@ -2894,6 +2967,7 @@
               <w:pStyle w:val="Body"/>
             </w:pPr>
             <w:r>
+              <w:lastRenderedPageBreak/>
               <w:t>{%tr endif %}</w:t>
             </w:r>
           </w:p>
@@ -2954,463 +3028,54 @@
               <w:rPr>
                 <w:color w:val="FF0000"/>
               </w:rPr>
-              <w:t xml:space="preserve"> not </w:t>
+              <w:t xml:space="preserve"> </w:t>
             </w:r>
             <w:r>
               <w:rPr>
                 <w:color w:val="FF0000"/>
               </w:rPr>
-              <w:lastRenderedPageBreak/>
-              <w:t>(type_of_response[</w:t>
+              <w:t>type_of_response.any_true and not(</w:t>
+            </w:r>
+            <w:r>
+              <w:rPr>
+                <w:color w:val="FFC000"/>
+              </w:rPr>
+              <w:t>type_of_response['default'] and stage_of_default == 'judgment entered'</w:t>
             </w:r>
             <w:r>
               <w:rPr>
                 <w:color w:val="FF0000"/>
               </w:rPr>
-              <w:t>'</w:t>
+              <w:t>) and not(</w:t>
+            </w:r>
+            <w:r>
+              <w:rPr>
+                <w:color w:val="FFC000"/>
+              </w:rPr>
+              <w:t>type_of_response['case in 2 states'] and stage_of_other_case == 'ended with order'</w:t>
             </w:r>
             <w:r>
               <w:rPr>
                 <w:color w:val="FF0000"/>
               </w:rPr>
-              <w:t>case in 2 states</w:t>
+              <w:t>) and not(</w:t>
+            </w:r>
+            <w:r>
+              <w:rPr>
+                <w:color w:val="FFC000"/>
+              </w:rPr>
+              <w:t>type_of_response['stay married'] and not respond</w:t>
             </w:r>
             <w:r>
               <w:rPr>
                 <w:color w:val="FF0000"/>
               </w:rPr>
-              <w:t>'</w:t>
+              <w:t>)</w:t>
             </w:r>
             <w:r>
               <w:rPr>
                 <w:color w:val="FF0000"/>
               </w:rPr>
-              <w:t>]</w:t>
-            </w:r>
-            <w:r>
-              <w:rPr>
-                <w:color w:val="FF0000"/>
-              </w:rPr>
-              <w:t xml:space="preserve"> </w:t>
-            </w:r>
-            <w:r>
-              <w:rPr>
-                <w:color w:val="FF0000"/>
-              </w:rPr>
-              <w:t xml:space="preserve">and stage_of_other_case == </w:t>
-            </w:r>
-            <w:r>
-              <w:rPr>
-                <w:color w:val="FF0000"/>
-              </w:rPr>
-              <w:t>'</w:t>
-            </w:r>
-            <w:r>
-              <w:rPr>
-                <w:color w:val="FF0000"/>
-              </w:rPr>
-              <w:t>ended with order</w:t>
-            </w:r>
-            <w:r>
-              <w:rPr>
-                <w:color w:val="FF0000"/>
-              </w:rPr>
-              <w:t>'</w:t>
-            </w:r>
-            <w:r>
-              <w:rPr>
-                <w:color w:val="FF0000"/>
-              </w:rPr>
-              <w:t>) and not</w:t>
-            </w:r>
-            <w:r>
-              <w:rPr>
-                <w:color w:val="FF0000"/>
-              </w:rPr>
-              <w:t>(type_of_response[</w:t>
-            </w:r>
-            <w:r>
-              <w:rPr>
-                <w:color w:val="FF0000"/>
-              </w:rPr>
-              <w:t>'</w:t>
-            </w:r>
-            <w:r>
-              <w:rPr>
-                <w:color w:val="FF0000"/>
-              </w:rPr>
-              <w:t>default</w:t>
-            </w:r>
-            <w:r>
-              <w:rPr>
-                <w:color w:val="FF0000"/>
-              </w:rPr>
-              <w:t>'</w:t>
-            </w:r>
-            <w:r>
-              <w:rPr>
-                <w:color w:val="FF0000"/>
-              </w:rPr>
-              <w:t>] and stage_of_</w:t>
-            </w:r>
-            <w:r>
-              <w:rPr>
-                <w:color w:val="FF0000"/>
-              </w:rPr>
-              <w:t>default</w:t>
-            </w:r>
-            <w:r>
-              <w:rPr>
-                <w:color w:val="FF0000"/>
-              </w:rPr>
-              <w:t xml:space="preserve"> == </w:t>
-            </w:r>
-            <w:r>
-              <w:rPr>
-                <w:color w:val="FF0000"/>
-              </w:rPr>
-              <w:t>'</w:t>
-            </w:r>
-            <w:r>
-              <w:rPr>
-                <w:color w:val="FF0000"/>
-              </w:rPr>
-              <w:t>judgment entered</w:t>
-            </w:r>
-            <w:r>
-              <w:rPr>
-                <w:color w:val="FF0000"/>
-              </w:rPr>
-              <w:t>'</w:t>
-            </w:r>
-            <w:r>
-              <w:rPr>
-                <w:color w:val="FF0000"/>
-              </w:rPr>
-              <w:t>)</w:t>
-            </w:r>
-            <w:r>
-              <w:rPr>
-                <w:color w:val="FF0000"/>
-              </w:rPr>
-              <w:t xml:space="preserve">  and </w:t>
-            </w:r>
-            <w:r>
-              <w:rPr>
-                <w:color w:val="FF0000"/>
-              </w:rPr>
-              <w:t>(</w:t>
-            </w:r>
-            <w:r>
-              <w:rPr>
-                <w:color w:val="FFC000"/>
-              </w:rPr>
-              <w:t>user_need ==</w:t>
-            </w:r>
-            <w:r>
-              <w:rPr>
-                <w:color w:val="FF0000"/>
-              </w:rPr>
-              <w:t xml:space="preserve"> </w:t>
-            </w:r>
-            <w:r>
-              <w:rPr>
-                <w:color w:val="FFC000"/>
-              </w:rPr>
-              <w:t>'answer divorce' and (</w:t>
-            </w:r>
-            <w:r>
-              <w:rPr>
-                <w:color w:val="92D050"/>
-              </w:rPr>
-              <w:t>type_of_response</w:t>
-            </w:r>
-            <w:r>
-              <w:rPr>
-                <w:color w:val="92D050"/>
-              </w:rPr>
-              <w:t>[</w:t>
-            </w:r>
-            <w:r>
-              <w:rPr>
-                <w:color w:val="92D050"/>
-              </w:rPr>
-              <w:t>'ak divorce case'</w:t>
-            </w:r>
-            <w:r>
-              <w:rPr>
-                <w:color w:val="92D050"/>
-              </w:rPr>
-              <w:t>] or (</w:t>
-            </w:r>
-            <w:r>
-              <w:rPr>
-                <w:color w:val="00B050"/>
-              </w:rPr>
-              <w:t>type_of_response['wrong state'] an</w:t>
-            </w:r>
-            <w:r>
-              <w:rPr>
-                <w:color w:val="00B050"/>
-              </w:rPr>
-              <w:t>d not residency</w:t>
-            </w:r>
-            <w:r>
-              <w:rPr>
-                <w:color w:val="92D050"/>
-              </w:rPr>
-              <w:t>)</w:t>
-            </w:r>
-            <w:r>
-              <w:rPr>
-                <w:color w:val="FFC000"/>
-              </w:rPr>
-              <w:t>)</w:t>
-            </w:r>
-            <w:r>
-              <w:rPr>
-                <w:color w:val="FF0000"/>
-              </w:rPr>
-              <w:t>) or (</w:t>
-            </w:r>
-            <w:r>
-              <w:rPr>
-                <w:color w:val="FFC000"/>
-              </w:rPr>
-              <w:t>user_need ==</w:t>
-            </w:r>
-            <w:r>
-              <w:rPr>
-                <w:color w:val="FF0000"/>
-              </w:rPr>
-              <w:t xml:space="preserve"> </w:t>
-            </w:r>
-            <w:r>
-              <w:rPr>
-                <w:color w:val="FFC000"/>
-              </w:rPr>
-              <w:t xml:space="preserve">'answer </w:t>
-            </w:r>
-            <w:r>
-              <w:rPr>
-                <w:color w:val="FFC000"/>
-              </w:rPr>
-              <w:t>custody</w:t>
-            </w:r>
-            <w:r>
-              <w:rPr>
-                <w:color w:val="FFC000"/>
-              </w:rPr>
-              <w:t xml:space="preserve">' and </w:t>
-            </w:r>
-            <w:r>
-              <w:rPr>
-                <w:color w:val="FFC000"/>
-              </w:rPr>
-              <w:t>t</w:t>
-            </w:r>
-            <w:r>
-              <w:rPr>
-                <w:color w:val="FFC000"/>
-              </w:rPr>
-              <w:t>ype_of_response['ak custody case']</w:t>
-            </w:r>
-            <w:r>
-              <w:rPr>
-                <w:color w:val="FF0000"/>
-              </w:rPr>
-              <w:t>)</w:t>
-            </w:r>
-            <w:r>
-              <w:rPr>
-                <w:color w:val="92D050"/>
-              </w:rPr>
-              <w:t xml:space="preserve"> </w:t>
-            </w:r>
-            <w:r>
-              <w:rPr>
-                <w:color w:val="FF0000"/>
-              </w:rPr>
-              <w:t>or (</w:t>
-            </w:r>
-            <w:r>
-              <w:rPr>
-                <w:color w:val="FFC000"/>
-              </w:rPr>
-              <w:t xml:space="preserve">user_need </w:t>
-            </w:r>
-            <w:r>
-              <w:rPr>
-                <w:color w:val="FFC000"/>
-              </w:rPr>
-              <w:t>in(</w:t>
-            </w:r>
-            <w:r>
-              <w:rPr>
-                <w:color w:val="FFC000"/>
-              </w:rPr>
-              <w:t>'answer divorce'</w:t>
-            </w:r>
-            <w:r>
-              <w:rPr>
-                <w:color w:val="FFC000"/>
-              </w:rPr>
-              <w:t>,</w:t>
-            </w:r>
-            <w:r>
-              <w:rPr>
-                <w:color w:val="FFC000"/>
-              </w:rPr>
-              <w:t xml:space="preserve"> 'answer </w:t>
-            </w:r>
-            <w:r>
-              <w:rPr>
-                <w:color w:val="FFC000"/>
-              </w:rPr>
-              <w:t>custody</w:t>
-            </w:r>
-            <w:r>
-              <w:rPr>
-                <w:color w:val="FFC000"/>
-              </w:rPr>
-              <w:t>'</w:t>
-            </w:r>
-            <w:r>
-              <w:rPr>
-                <w:color w:val="FFC000"/>
-              </w:rPr>
-              <w:t>) and (</w:t>
-            </w:r>
-            <w:r>
-              <w:rPr>
-                <w:color w:val="92D050"/>
-              </w:rPr>
-              <w:t xml:space="preserve">type_of_response['case in 2 states']  and stage_of_other_case in('still going', 'ended with </w:t>
-            </w:r>
-            <w:r>
-              <w:rPr>
-                <w:color w:val="92D050"/>
-              </w:rPr>
-              <w:t xml:space="preserve">no </w:t>
-            </w:r>
-            <w:r>
-              <w:rPr>
-                <w:color w:val="92D050"/>
-              </w:rPr>
-              <w:t>order')</w:t>
-            </w:r>
-            <w:r>
-              <w:rPr>
-                <w:color w:val="FFC000"/>
-              </w:rPr>
-              <w:t>)</w:t>
-            </w:r>
-            <w:r>
-              <w:rPr>
-                <w:color w:val="FF0000"/>
-              </w:rPr>
-              <w:t>)</w:t>
-            </w:r>
-            <w:r>
-              <w:rPr>
-                <w:color w:val="FF0000"/>
-              </w:rPr>
-              <w:t xml:space="preserve"> or (</w:t>
-            </w:r>
-            <w:r>
-              <w:rPr>
-                <w:color w:val="FFC000"/>
-              </w:rPr>
-              <w:t>user_need ==</w:t>
-            </w:r>
-            <w:r>
-              <w:rPr>
-                <w:color w:val="FF0000"/>
-              </w:rPr>
-              <w:t xml:space="preserve"> </w:t>
-            </w:r>
-            <w:r>
-              <w:rPr>
-                <w:color w:val="FFC000"/>
-              </w:rPr>
-              <w:t xml:space="preserve">'answer </w:t>
-            </w:r>
-            <w:r>
-              <w:rPr>
-                <w:color w:val="FFC000"/>
-              </w:rPr>
-              <w:t>custody</w:t>
-            </w:r>
-            <w:r>
-              <w:rPr>
-                <w:color w:val="FFC000"/>
-              </w:rPr>
-              <w:t xml:space="preserve">' and </w:t>
-            </w:r>
-            <w:r>
-              <w:rPr>
-                <w:color w:val="FFC000"/>
-              </w:rPr>
-              <w:t>type_of_response['wrong state'] and not jurisdiction</w:t>
-            </w:r>
-            <w:r>
-              <w:rPr>
-                <w:color w:val="FF0000"/>
-              </w:rPr>
-              <w:t>)</w:t>
-            </w:r>
-            <w:r>
-              <w:rPr>
-                <w:color w:val="FF0000"/>
-              </w:rPr>
-              <w:t xml:space="preserve"> or (</w:t>
-            </w:r>
-            <w:r>
-              <w:rPr>
-                <w:color w:val="FFC000"/>
-              </w:rPr>
-              <w:t>user_need ==</w:t>
-            </w:r>
-            <w:r>
-              <w:rPr>
-                <w:color w:val="FF0000"/>
-              </w:rPr>
-              <w:t xml:space="preserve"> </w:t>
-            </w:r>
-            <w:r>
-              <w:rPr>
-                <w:color w:val="FFC000"/>
-              </w:rPr>
-              <w:t xml:space="preserve">'answer </w:t>
-            </w:r>
-            <w:r>
-              <w:rPr>
-                <w:color w:val="FFC000"/>
-              </w:rPr>
-              <w:t>divorce</w:t>
-            </w:r>
-            <w:r>
-              <w:rPr>
-                <w:color w:val="FFC000"/>
-              </w:rPr>
-              <w:t xml:space="preserve">' and </w:t>
-            </w:r>
-            <w:r>
-              <w:rPr>
-                <w:color w:val="FFC000"/>
-              </w:rPr>
-              <w:t>type_of_response['wrong state']</w:t>
-            </w:r>
-            <w:r>
-              <w:rPr>
-                <w:color w:val="FF0000"/>
-              </w:rPr>
-              <w:t>)</w:t>
-            </w:r>
-            <w:r>
-              <w:rPr>
-                <w:color w:val="FF0000"/>
-              </w:rPr>
               <w:t xml:space="preserve"> %}</w:t>
             </w:r>
           </w:p>
@@ -3435,7 +3100,6 @@
               <w:pStyle w:val="Body"/>
             </w:pPr>
             <w:r>
-              <w:lastRenderedPageBreak/>
               <w:t>answer_step</w:t>
             </w:r>
           </w:p>
@@ -3588,11 +3252,7 @@
               <w:pStyle w:val="Body"/>
             </w:pPr>
             <w:r>
-              <w:t xml:space="preserve">{%tr if </w:t>
-            </w:r>
-            <w:r>
-              <w:lastRenderedPageBreak/>
-              <w:t xml:space="preserve">(type_of_response['wrong state'] and not jurisdiction) or (type_of_response['case in 2 states'] and stage_of_other_case </w:t>
+              <w:t xml:space="preserve">{%tr if (type_of_response['wrong state'] and not jurisdiction) or (type_of_response['case in 2 states'] and stage_of_other_case </w:t>
             </w:r>
             <w:r>
               <w:t>in(</w:t>
@@ -3645,7 +3305,6 @@
             </w:pPr>
             <w:proofErr w:type="spellStart"/>
             <w:r>
-              <w:lastRenderedPageBreak/>
               <w:t>dismiss_step</w:t>
             </w:r>
             <w:proofErr w:type="spellEnd"/>
@@ -3797,6 +3456,7 @@
               <w:spacing w:before="0" w:after="0"/>
             </w:pPr>
             <w:r>
+              <w:lastRenderedPageBreak/>
               <w:t>{%tr if stage_of_default == 'judgment entered' %}</w:t>
             </w:r>
           </w:p>
@@ -4099,20 +3759,48 @@
               <w:bottom w:val="nil"/>
               <w:right w:val="nil"/>
             </w:tcBorders>
-            <w:shd w:val="clear" w:color="auto" w:fill="FFC000"/>
-            <w:tcMar>
-              <w:top w:w="0" w:type="dxa"/>
-              <w:left w:w="108" w:type="dxa"/>
-              <w:right w:w="108" w:type="dxa"/>
-            </w:tcMar>
-          </w:tcPr>
-          <w:p>
-            <w:pPr>
-              <w:pStyle w:val="Body"/>
-              <w:spacing w:before="0" w:after="0"/>
-            </w:pPr>
-            <w:r>
-              <w:t>{%tr if user_need in ('answer custody', 'custody') and parents_agree_documents %}</w:t>
+            <w:tcMar>
+              <w:top w:w="0" w:type="dxa"/>
+              <w:left w:w="108" w:type="dxa"/>
+              <w:right w:w="108" w:type="dxa"/>
+            </w:tcMar>
+          </w:tcPr>
+          <w:p>
+            <w:pPr>
+              <w:pStyle w:val="Body"/>
+            </w:pPr>
+            <w:r>
+              <w:t>{%tr if type_of_response.any_true() and not (type_of_response.all_true('stay married', exclusive = True))</w:t>
+            </w:r>
+            <w:r>
+              <w:t xml:space="preserve"> and (</w:t>
+            </w:r>
+            <w:r>
+              <w:t xml:space="preserve">filling_manner in('paper', 'dunno') or filing_method </w:t>
+            </w:r>
+            <w:r>
+              <w:t xml:space="preserve">in </w:t>
+            </w:r>
+            <w:r>
+              <w:t xml:space="preserve">('mail or in person', </w:t>
+            </w:r>
+            <w:r>
+              <w:t>‘</w:t>
+            </w:r>
+            <w:r>
+              <w:t>dunno</w:t>
+            </w:r>
+            <w:r>
+              <w:t>’</w:t>
+            </w:r>
+            <w:r>
+              <w:t>)</w:t>
+            </w:r>
+            <w:r>
+              <w:t>)</w:t>
+            </w:r>
+            <w:r>
+              <w:t xml:space="preserve"> %}</w:t>
             </w:r>
           </w:p>
         </w:tc>
@@ -4125,23 +3813,16 @@
               <w:bottom w:val="nil"/>
               <w:right w:val="nil"/>
             </w:tcBorders>
-            <w:shd w:val="clear" w:color="auto" w:fill="FFC000"/>
-            <w:tcMar>
-              <w:top w:w="0" w:type="dxa"/>
-              <w:left w:w="108" w:type="dxa"/>
-              <w:right w:w="108" w:type="dxa"/>
-            </w:tcMar>
-          </w:tcPr>
-          <w:p>
-            <w:pPr>
-              <w:pStyle w:val="Body"/>
-              <w:spacing w:before="0" w:after="0"/>
-            </w:pPr>
-            <w:proofErr w:type="spellStart"/>
-            <w:r>
-              <w:t>uncontested_custody_forms_step</w:t>
-            </w:r>
-            <w:proofErr w:type="spellEnd"/>
+            <w:tcMar>
+              <w:top w:w="0" w:type="dxa"/>
+              <w:left w:w="108" w:type="dxa"/>
+              <w:right w:w="108" w:type="dxa"/>
+            </w:tcMar>
+          </w:tcPr>
+          <w:p>
+            <w:pPr>
+              <w:pStyle w:val="Body"/>
+            </w:pPr>
           </w:p>
         </w:tc>
       </w:tr>
@@ -4158,7 +3839,6 @@
               <w:bottom w:val="nil"/>
               <w:right w:val="nil"/>
             </w:tcBorders>
-            <w:shd w:val="clear" w:color="auto" w:fill="FFC000"/>
             <w:tcMar>
               <w:top w:w="0" w:type="dxa"/>
               <w:left w:w="108" w:type="dxa"/>
@@ -4169,16 +3849,17 @@
             <w:pPr>
               <w:pStyle w:val="Heading2"/>
               <w:outlineLvl w:val="1"/>
-              <w:rPr>
-                <w:rFonts w:eastAsia="Calibri"/>
-              </w:rPr>
-            </w:pPr>
-            <w:r>
-              <w:rPr>
-                <w:rFonts w:eastAsia="Calibri"/>
-                <w:shd w:val="clear" w:color="auto" w:fill="FFFFFF"/>
-              </w:rPr>
-              <w:t>{{ uncontested_custody_forms_step.subject }}</w:t>
+            </w:pPr>
+            <w:r>
+              <w:t xml:space="preserve">{{ </w:t>
+            </w:r>
+            <w:proofErr w:type="spellStart"/>
+            <w:r>
+              <w:t>sign_step.subject</w:t>
+            </w:r>
+            <w:proofErr w:type="spellEnd"/>
+            <w:r>
+              <w:t xml:space="preserve"> }}</w:t>
             </w:r>
           </w:p>
         </w:tc>
@@ -4191,7 +3872,6 @@
               <w:bottom w:val="nil"/>
               <w:right w:val="nil"/>
             </w:tcBorders>
-            <w:shd w:val="clear" w:color="auto" w:fill="FFC000"/>
             <w:tcMar>
               <w:top w:w="0" w:type="dxa"/>
               <w:left w:w="108" w:type="dxa"/>
@@ -4207,724 +3887,11 @@
           <w:p>
             <w:pPr>
               <w:pStyle w:val="Body"/>
-              <w:spacing w:before="100" w:after="100"/>
-            </w:pPr>
-            <w:r>
-              <w:t xml:space="preserve">If you and {{ other_party_in_case }} agree on everything (a parenting plan including decision-making and schedule, paternity, and child support), you can fill out forms to start the case together. This is called </w:t>
-            </w:r>
-            <w:r>
-              <w:lastRenderedPageBreak/>
-              <w:t>an uncontested case.</w:t>
-            </w:r>
-          </w:p>
-          <w:p>
-            <w:pPr>
-              <w:pStyle w:val="Body"/>
-              <w:spacing w:before="280" w:after="280"/>
-            </w:pPr>
-            <w:r>
-              <w:t>You will not know your case number until you file your documents with the court. You can write the case number on all your forms then.</w:t>
-            </w:r>
-          </w:p>
-          <w:p>
-            <w:pPr>
-              <w:pStyle w:val="Heading3"/>
-              <w:outlineLvl w:val="2"/>
-            </w:pPr>
-            <w:r>
-              <w:t>Required forms – 1 copy that both parents sign if signatures are needed</w:t>
-            </w:r>
-          </w:p>
-          <w:p>
-            <w:pPr>
-              <w:pStyle w:val="ListParagraph"/>
-              <w:numPr>
-                <w:ilvl w:val="0"/>
-                <w:numId w:val="1"/>
-              </w:numPr>
-            </w:pPr>
-            <w:r>
-              <w:rPr>
-                <w:b/>
-              </w:rPr>
-              <w:t xml:space="preserve">Uncontested Complaint for Custody of Minor Children, SHC-118 </w:t>
-            </w:r>
-            <w:r>
-              <w:rPr>
-                <w:b/>
-              </w:rPr>
-              <w:br/>
-              <w:t>as a  file</w:t>
-            </w:r>
-            <w:r>
-              <w:rPr>
-                <w:b/>
-              </w:rPr>
-              <w:br/>
-              <w:t>courts.alaska.gov/shc/family/docs/shc-118.doc</w:t>
-            </w:r>
-            <w:r>
-              <w:rPr>
-                <w:b/>
-              </w:rPr>
-              <w:br/>
-              <w:t>as a |</w:t>
-            </w:r>
-            <w:r>
-              <w:rPr>
-                <w:b/>
-              </w:rPr>
-              <w:br/>
-              <w:t>courts.alaska.gov/shc/family/docs/shc-118n.pdf</w:t>
-            </w:r>
-            <w:hyperlink r:id="rId8">
-              <w:r>
-                <w:rPr>
-                  <w:rStyle w:val="Hyperlink"/>
-                </w:rPr>
-                <w:t>Word</w:t>
-              </w:r>
-            </w:hyperlink>
-            <w:hyperlink r:id="rId9">
-              <w:r>
-                <w:rPr>
-                  <w:rStyle w:val="Hyperlink"/>
-                </w:rPr>
-                <w:t>PDF</w:t>
-              </w:r>
-            </w:hyperlink>
-          </w:p>
-          <w:p>
-            <w:pPr>
-              <w:pStyle w:val="ListParagraph"/>
-              <w:numPr>
-                <w:ilvl w:val="1"/>
-                <w:numId w:val="1"/>
-              </w:numPr>
-            </w:pPr>
-            <w:r>
-              <w:t>Print your name, address and phone number in the upper left-hand corner of the first page.</w:t>
-            </w:r>
-          </w:p>
-          <w:p>
-            <w:pPr>
-              <w:pStyle w:val="ListParagraph"/>
-              <w:numPr>
-                <w:ilvl w:val="1"/>
-                <w:numId w:val="1"/>
-              </w:numPr>
-            </w:pPr>
-            <w:r>
-              <w:t>In the caption, print your name above “Plaintiff” and the other parent’s name above “Defendant.”</w:t>
-            </w:r>
-          </w:p>
-          <w:p>
-            <w:pPr>
-              <w:pStyle w:val="ListParagraph"/>
-              <w:numPr>
-                <w:ilvl w:val="1"/>
-                <w:numId w:val="1"/>
-              </w:numPr>
-            </w:pPr>
-            <w:r>
-              <w:t>Follow the directions on the form and fill out every section.</w:t>
-            </w:r>
-          </w:p>
-          <w:p>
-            <w:pPr>
-              <w:pStyle w:val="ListParagraph"/>
-              <w:numPr>
-                <w:ilvl w:val="0"/>
-                <w:numId w:val="1"/>
-              </w:numPr>
-            </w:pPr>
-            <w:r>
-              <w:rPr>
-                <w:b/>
-              </w:rPr>
-              <w:t>Request</w:t>
-            </w:r>
-            <w:r>
-              <w:rPr>
-                <w:b/>
-              </w:rPr>
-              <w:t xml:space="preserve"> to Put </w:t>
-            </w:r>
-            <w:r>
-              <w:rPr>
-                <w:b/>
-              </w:rPr>
-              <w:t>Agreement</w:t>
-            </w:r>
-            <w:r>
-              <w:rPr>
-                <w:b/>
-              </w:rPr>
-              <w:t xml:space="preserve"> on the Record, </w:t>
-            </w:r>
-            <w:r>
-              <w:rPr>
-                <w:b/>
-              </w:rPr>
-              <w:t>DR</w:t>
-            </w:r>
-            <w:r>
-              <w:rPr>
-                <w:b/>
-              </w:rPr>
-              <w:t>-</w:t>
-            </w:r>
-            <w:r>
-              <w:rPr>
-                <w:b/>
-              </w:rPr>
-              <w:t xml:space="preserve">264 </w:t>
-            </w:r>
-            <w:r>
-              <w:rPr>
-                <w:bCs/>
-              </w:rPr>
-              <w:t>[</w:t>
-            </w:r>
-            <w:hyperlink r:id="rId10" w:history="1">
-              <w:r>
-                <w:rPr>
-                  <w:rStyle w:val="Hyperlink"/>
-                  <w:bCs/>
-                </w:rPr>
-                <w:t>Fill-In PDF</w:t>
-              </w:r>
-            </w:hyperlink>
-            <w:r>
-              <w:rPr>
-                <w:bCs/>
-              </w:rPr>
-              <w:t>]</w:t>
-            </w:r>
-            <w:r>
-              <w:rPr>
-                <w:b/>
-              </w:rPr>
-              <w:br/>
-            </w:r>
-            <w:hyperlink r:id="rId11" w:history="1">
-              <w:r>
-                <w:rPr>
-                  <w:rStyle w:val="Hyperlink"/>
-                </w:rPr>
-                <w:t>ak-courts.info/dr264</w:t>
-              </w:r>
-            </w:hyperlink>
-          </w:p>
-          <w:p>
-            <w:pPr>
-              <w:pStyle w:val="ListParagraph"/>
-              <w:numPr>
-                <w:ilvl w:val="0"/>
-                <w:numId w:val="1"/>
-              </w:numPr>
-            </w:pPr>
-            <w:r>
-              <w:rPr>
-                <w:b/>
-              </w:rPr>
-              <w:t xml:space="preserve">Case description form, </w:t>
-            </w:r>
-            <w:r>
-              <w:rPr>
-                <w:b/>
-              </w:rPr>
-              <w:br/>
-              <w:t>public.courts.alaska.gov/web/forms/docs/civ-125s.pdf</w:t>
-            </w:r>
-            <w:hyperlink r:id="rId12">
-              <w:r>
-                <w:rPr>
-                  <w:rStyle w:val="Hyperlink"/>
-                </w:rPr>
-                <w:t>CIV-125S</w:t>
-              </w:r>
-            </w:hyperlink>
-          </w:p>
-          <w:p>
-            <w:pPr>
-              <w:pStyle w:val="Heading3"/>
-              <w:outlineLvl w:val="2"/>
-            </w:pPr>
-            <w:r>
-              <w:t>Required forms – 2 copies (each parent fills out and signs a separate copy)</w:t>
-            </w:r>
-          </w:p>
-          <w:p>
-            <w:pPr>
-              <w:pStyle w:val="ListParagraph"/>
-              <w:numPr>
-                <w:ilvl w:val="0"/>
-                <w:numId w:val="1"/>
-              </w:numPr>
-            </w:pPr>
-            <w:r>
-              <w:rPr>
-                <w:b/>
-              </w:rPr>
-              <w:t>Child Custody Jurisdiction Affidavit,  [Fill-In PDF] (2 copies - each parent fills out their own) public.courts.alaska.gov/web/forms/docs/dr-150.pdf</w:t>
-            </w:r>
-            <w:hyperlink r:id="rId13">
-              <w:r>
-                <w:rPr>
-                  <w:rStyle w:val="Hyperlink"/>
-                  <w:b/>
-                </w:rPr>
-                <w:t>DR-150</w:t>
-              </w:r>
-            </w:hyperlink>
-          </w:p>
-          <w:p>
-            <w:pPr>
-              <w:pStyle w:val="Body"/>
-              <w:spacing w:before="280" w:after="280"/>
-            </w:pPr>
-            <w:r>
-              <w:t>and</w:t>
-            </w:r>
-          </w:p>
-          <w:p>
-            <w:pPr>
-              <w:pStyle w:val="ListParagraph"/>
-              <w:numPr>
-                <w:ilvl w:val="0"/>
-                <w:numId w:val="1"/>
-              </w:numPr>
-            </w:pPr>
-            <w:r>
-              <w:rPr>
-                <w:b/>
-              </w:rPr>
-              <w:t>Child Support Guidelines Affidavit,  [Fill-In PDF] (2 copies - each parent fills out their own)</w:t>
-            </w:r>
-            <w:r>
-              <w:rPr>
-                <w:b/>
-              </w:rPr>
-              <w:br/>
-              <w:t>public.courts.alaska.gov/web/forms/docs/dr-305.pdf</w:t>
-            </w:r>
-            <w:hyperlink r:id="rId14">
-              <w:r>
-                <w:rPr>
-                  <w:rStyle w:val="Hyperlink"/>
-                  <w:b/>
-                </w:rPr>
-                <w:t>DR-305</w:t>
-              </w:r>
-            </w:hyperlink>
-          </w:p>
-          <w:p>
-            <w:pPr>
-              <w:pStyle w:val="ListParagraph"/>
-              <w:numPr>
-                <w:ilvl w:val="0"/>
-                <w:numId w:val="1"/>
-              </w:numPr>
-            </w:pPr>
-            <w:r>
-              <w:t>Answer each question completely.</w:t>
-            </w:r>
-          </w:p>
-          <w:p>
-            <w:pPr>
-              <w:pStyle w:val="ListParagraph"/>
-              <w:numPr>
-                <w:ilvl w:val="0"/>
-                <w:numId w:val="1"/>
-              </w:numPr>
-            </w:pPr>
-            <w:r>
-              <w:t xml:space="preserve">See </w:t>
-            </w:r>
-            <w:r>
-              <w:br/>
-              <w:t>courts.alaska.gov/shc/family/docs/shc-dr305f-sample.pdf.</w:t>
-            </w:r>
-            <w:hyperlink r:id="rId15">
-              <w:r>
-                <w:rPr>
-                  <w:rStyle w:val="Hyperlink"/>
-                </w:rPr>
-                <w:t>How to Fill out the Child Support Guidelines Affidavit</w:t>
-              </w:r>
-            </w:hyperlink>
-          </w:p>
-          <w:p>
-            <w:pPr>
-              <w:pStyle w:val="ListParagraph"/>
-              <w:numPr>
-                <w:ilvl w:val="0"/>
-                <w:numId w:val="1"/>
-              </w:numPr>
-            </w:pPr>
-            <w:r>
-              <w:t xml:space="preserve">Attach your most recent tax return and pay stubs to the Child </w:t>
-            </w:r>
-            <w:r>
-              <w:lastRenderedPageBreak/>
-              <w:t>Support Guidelines Affidavit.</w:t>
-            </w:r>
-          </w:p>
-          <w:p>
-            <w:pPr>
-              <w:pStyle w:val="ListParagraph"/>
-              <w:numPr>
-                <w:ilvl w:val="0"/>
-                <w:numId w:val="1"/>
-              </w:numPr>
-            </w:pPr>
-            <w:r>
-              <w:t>Sign these forms in front of a notary, who will need to see a picture ID. Court staff can notarize your signature for free.</w:t>
-            </w:r>
-          </w:p>
-          <w:p>
-            <w:pPr>
-              <w:pStyle w:val="ListParagraph"/>
-              <w:numPr>
-                <w:ilvl w:val="0"/>
-                <w:numId w:val="1"/>
-              </w:numPr>
-            </w:pPr>
-            <w:r>
-              <w:rPr>
-                <w:b/>
-              </w:rPr>
-              <w:t>Information Sheet</w:t>
-            </w:r>
-            <w:r>
-              <w:rPr>
-                <w:b/>
-              </w:rPr>
-              <w:br/>
-              <w:t xml:space="preserve">public.courts.alaska.gov/web/forms/docs/dr-314.pdf </w:t>
-            </w:r>
-            <w:r>
-              <w:rPr>
-                <w:b/>
-              </w:rPr>
-              <w:br/>
-              <w:t>Fill in 1-3 with complete information for yourself, the children in the case, {{ other_party_in_case }} if you know it, and then sign and date</w:t>
-            </w:r>
-            <w:hyperlink r:id="rId16">
-              <w:r>
-                <w:rPr>
-                  <w:rStyle w:val="Hyperlink"/>
-                </w:rPr>
-                <w:t>, DR-314</w:t>
-              </w:r>
-            </w:hyperlink>
-          </w:p>
-          <w:p>
-            <w:pPr>
-              <w:pStyle w:val="Heading3"/>
-              <w:outlineLvl w:val="2"/>
-            </w:pPr>
-            <w:r>
-              <w:t>Required Forms - fill out but do not sign because the judge will sign them</w:t>
-            </w:r>
-          </w:p>
-          <w:p>
-            <w:pPr>
-              <w:pStyle w:val="ListParagraph"/>
-              <w:numPr>
-                <w:ilvl w:val="0"/>
-                <w:numId w:val="1"/>
-              </w:numPr>
-              <w:rPr>
-                <w:b/>
-              </w:rPr>
-            </w:pPr>
-            <w:r>
-              <w:t xml:space="preserve">Child Support Order, </w:t>
-            </w:r>
-            <w:r>
-              <w:br/>
-              <w:t>public.courts.alaska.gov/web/forms/docs/dr-300.pdf</w:t>
-            </w:r>
-            <w:hyperlink r:id="rId17">
-              <w:r>
-                <w:rPr>
-                  <w:rStyle w:val="Hyperlink"/>
-                  <w:b/>
-                </w:rPr>
-                <w:t>DR-300</w:t>
-              </w:r>
-            </w:hyperlink>
-          </w:p>
-          <w:p>
-            <w:pPr>
-              <w:pStyle w:val="ListParagraph"/>
-              <w:numPr>
-                <w:ilvl w:val="0"/>
-                <w:numId w:val="1"/>
-              </w:numPr>
-              <w:rPr>
-                <w:b/>
-              </w:rPr>
-            </w:pPr>
-            <w:r>
-              <w:rPr>
-                <w:b/>
-              </w:rPr>
-              <w:t>Custody Findings of Fact &amp; Conclusions of Law,  [Fill-In PDF]</w:t>
-            </w:r>
-            <w:r>
-              <w:rPr>
-                <w:b/>
-              </w:rPr>
-              <w:br/>
-              <w:t>public.courts.alaska.gov/web/forms/docs/dr-460.pdf</w:t>
-            </w:r>
-            <w:hyperlink r:id="rId18">
-              <w:r>
-                <w:rPr>
-                  <w:rStyle w:val="Hyperlink"/>
-                  <w:b/>
-                </w:rPr>
-                <w:t>DR-460</w:t>
-              </w:r>
-            </w:hyperlink>
-          </w:p>
-          <w:p>
-            <w:pPr>
-              <w:pStyle w:val="ListParagraph"/>
-              <w:numPr>
-                <w:ilvl w:val="0"/>
-                <w:numId w:val="1"/>
-              </w:numPr>
-            </w:pPr>
-            <w:r>
-              <w:rPr>
-                <w:b/>
-              </w:rPr>
-              <w:t>Custody Judgment and Decree,  [Fill-In PDF]</w:t>
-            </w:r>
-            <w:r>
-              <w:rPr>
-                <w:b/>
-              </w:rPr>
-              <w:br/>
-              <w:t>public.courts.alaska.gov/web/forms/docs/dr-465.pdf</w:t>
-            </w:r>
-            <w:hyperlink r:id="rId19">
-              <w:r>
-                <w:rPr>
-                  <w:rStyle w:val="Hyperlink"/>
-                </w:rPr>
-                <w:t>DR-465</w:t>
-              </w:r>
-            </w:hyperlink>
-          </w:p>
-          <w:p>
-            <w:pPr>
-              <w:pStyle w:val="Heading3"/>
-              <w:outlineLvl w:val="2"/>
-            </w:pPr>
-            <w:r>
-              <w:t>Optional forms depending on your situation</w:t>
-            </w:r>
-          </w:p>
-          <w:p>
-            <w:pPr>
-              <w:pStyle w:val="ListParagraph"/>
-              <w:numPr>
-                <w:ilvl w:val="0"/>
-                <w:numId w:val="1"/>
-              </w:numPr>
-              <w:rPr>
-                <w:sz w:val="25"/>
-                <w:szCs w:val="25"/>
-                <w:u w:val="single"/>
-              </w:rPr>
-            </w:pPr>
-            <w:r>
-              <w:rPr>
-                <w:b/>
-              </w:rPr>
-              <w:t>Choose</w:t>
-            </w:r>
-            <w:r>
-              <w:rPr>
-                <w:sz w:val="25"/>
-                <w:szCs w:val="25"/>
-              </w:rPr>
-              <w:t xml:space="preserve"> </w:t>
-            </w:r>
-            <w:r>
-              <w:t>1 form based on the parenting schedule if it is not a primary custody calculation (where children are with 1 parent for at least 256 overnights/year</w:t>
-            </w:r>
-            <w:r>
-              <w:rPr>
-                <w:sz w:val="25"/>
-                <w:szCs w:val="25"/>
-                <w:u w:val="single"/>
-              </w:rPr>
-              <w:t>)</w:t>
-            </w:r>
-          </w:p>
-          <w:p>
-            <w:pPr>
-              <w:pStyle w:val="ListParagraph"/>
-              <w:numPr>
-                <w:ilvl w:val="0"/>
-                <w:numId w:val="1"/>
-              </w:numPr>
-              <w:rPr>
-                <w:color w:val="000000"/>
-              </w:rPr>
-            </w:pPr>
-            <w:r>
-              <w:rPr>
-                <w:b/>
-                <w:color w:val="000000"/>
-              </w:rPr>
-              <w:t>Shared Custody Support Calculation, [Fill-In PDF]</w:t>
-            </w:r>
-            <w:r>
-              <w:rPr>
-                <w:b/>
-                <w:color w:val="000000"/>
-              </w:rPr>
-              <w:br/>
-              <w:t>public.courts.alaska.gov/web/forms/docs/dr-306.pdf</w:t>
-            </w:r>
-            <w:hyperlink r:id="rId20" w:tgtFrame="_blank">
-              <w:r>
-                <w:rPr>
-                  <w:rStyle w:val="Hyperlink"/>
-                  <w:color w:val="006699"/>
-                </w:rPr>
-                <w:t>DR-306</w:t>
-              </w:r>
-            </w:hyperlink>
-          </w:p>
-          <w:p>
-            <w:pPr>
-              <w:pStyle w:val="ListParagraph"/>
-              <w:numPr>
-                <w:ilvl w:val="0"/>
-                <w:numId w:val="1"/>
-              </w:numPr>
-            </w:pPr>
-            <w:r>
-              <w:rPr>
-                <w:b/>
-                <w:color w:val="000000"/>
-              </w:rPr>
-              <w:t>Divided Custody Support Calculation, [Fill-In PDF]</w:t>
-            </w:r>
-            <w:r>
-              <w:rPr>
-                <w:b/>
-                <w:color w:val="000000"/>
-              </w:rPr>
-              <w:br/>
-              <w:t>public.courts.alaska.gov/web/forms/docs/dr-307.pdf</w:t>
-            </w:r>
-            <w:hyperlink r:id="rId21" w:tgtFrame="_blank">
-              <w:r>
-                <w:rPr>
-                  <w:rStyle w:val="Hyperlink"/>
-                  <w:color w:val="006699"/>
-                </w:rPr>
-                <w:t>DR-307</w:t>
-              </w:r>
-            </w:hyperlink>
-          </w:p>
-          <w:p>
-            <w:pPr>
-              <w:pStyle w:val="Body"/>
-              <w:spacing w:before="280" w:after="280"/>
-              <w:ind w:left="360"/>
-              <w:rPr>
-                <w:color w:val="000000"/>
-              </w:rPr>
-            </w:pPr>
-            <w:r>
-              <w:rPr>
-                <w:b/>
-                <w:color w:val="222222"/>
-                <w:lang w:val="en"/>
-              </w:rPr>
-              <w:t>Hybrid Custody Child Support Calculation,  [Fill-In PDF]</w:t>
-            </w:r>
-            <w:r>
-              <w:rPr>
-                <w:b/>
-                <w:color w:val="222222"/>
-                <w:lang w:val="en"/>
-              </w:rPr>
-              <w:br/>
-              <w:t>public.courts.alaska.gov/web/forms/docs/dr-308.pdf</w:t>
-            </w:r>
-            <w:hyperlink r:id="rId22" w:tgtFrame="_blank">
-              <w:r>
-                <w:rPr>
-                  <w:rStyle w:val="Hyperlink"/>
-                  <w:lang w:val="en"/>
-                </w:rPr>
-                <w:t>DR-308</w:t>
-              </w:r>
-            </w:hyperlink>
-          </w:p>
-          <w:p>
-            <w:pPr>
-              <w:pStyle w:val="Body"/>
-            </w:pPr>
-            <w:r>
-              <w:rPr>
-                <w:b/>
-                <w:color w:val="000000"/>
-              </w:rPr>
-              <w:t>Application for Services of Child Support Services Division,</w:t>
-            </w:r>
-            <w:r>
-              <w:rPr>
-                <w:b/>
-                <w:color w:val="000000"/>
-              </w:rPr>
-              <w:t xml:space="preserve"> </w:t>
-            </w:r>
-            <w:r>
-              <w:rPr>
-                <w:b/>
-              </w:rPr>
-              <w:t>DR-315</w:t>
-            </w:r>
-            <w:r>
-              <w:t xml:space="preserve"> </w:t>
-            </w:r>
-            <w:r>
-              <w:t>[</w:t>
-            </w:r>
-            <w:hyperlink r:id="rId23" w:history="1">
-              <w:r>
-                <w:rPr>
-                  <w:rStyle w:val="Hyperlink"/>
-                </w:rPr>
-                <w:t>Fill-In PDF</w:t>
-              </w:r>
-            </w:hyperlink>
-            <w:r>
-              <w:t>]</w:t>
-            </w:r>
-            <w:r>
-              <w:br/>
-            </w:r>
-            <w:hyperlink r:id="rId24" w:history="1">
-              <w:r>
-                <w:rPr>
-                  <w:rStyle w:val="Hyperlink"/>
-                </w:rPr>
-                <w:t>ak-courts.info/dr315</w:t>
-              </w:r>
-            </w:hyperlink>
+              <w:spacing w:before="0" w:beforeAutospacing="0" w:after="60" w:afterAutospacing="0"/>
+            </w:pPr>
+            <w:r>
+              <w:t>{{p (include_docx_template("docassemble.AKA2JBranding:sign_content.docx")) }}</w:t>
+            </w:r>
           </w:p>
         </w:tc>
       </w:tr>
@@ -4941,20 +3908,18 @@
               <w:bottom w:val="nil"/>
               <w:right w:val="nil"/>
             </w:tcBorders>
-            <w:shd w:val="clear" w:color="auto" w:fill="FFC000"/>
-            <w:tcMar>
-              <w:top w:w="0" w:type="dxa"/>
-              <w:left w:w="108" w:type="dxa"/>
-              <w:right w:w="108" w:type="dxa"/>
-            </w:tcMar>
-          </w:tcPr>
-          <w:p>
-            <w:pPr>
-              <w:pStyle w:val="Body"/>
-            </w:pPr>
-            <w:r>
-              <w:lastRenderedPageBreak/>
-              <w:t>{%tr endif%}</w:t>
+            <w:tcMar>
+              <w:top w:w="0" w:type="dxa"/>
+              <w:left w:w="108" w:type="dxa"/>
+              <w:right w:w="108" w:type="dxa"/>
+            </w:tcMar>
+          </w:tcPr>
+          <w:p>
+            <w:pPr>
+              <w:pStyle w:val="Body"/>
+            </w:pPr>
+            <w:r>
+              <w:t>{%tr endif %}</w:t>
             </w:r>
           </w:p>
         </w:tc>
@@ -4967,7 +3932,6 @@
               <w:bottom w:val="nil"/>
               <w:right w:val="nil"/>
             </w:tcBorders>
-            <w:shd w:val="clear" w:color="auto" w:fill="FFC000"/>
             <w:tcMar>
               <w:top w:w="0" w:type="dxa"/>
               <w:left w:w="108" w:type="dxa"/>
@@ -5005,62 +3969,7 @@
               <w:pStyle w:val="Body"/>
             </w:pPr>
             <w:r>
-              <w:t>{%tr if type_of_response.any_true() and not (type_of_response.all_true('stay married', exclusive = True))</w:t>
-            </w:r>
-            <w:r>
-              <w:t xml:space="preserve"> and (</w:t>
-            </w:r>
-            <w:proofErr w:type="spellStart"/>
-            <w:r>
-              <w:t>filling_manner</w:t>
-            </w:r>
-            <w:proofErr w:type="spellEnd"/>
-            <w:r>
-              <w:t xml:space="preserve"> </w:t>
-            </w:r>
-            <w:r>
-              <w:lastRenderedPageBreak/>
-              <w:t>in('paper', '</w:t>
-            </w:r>
-            <w:proofErr w:type="spellStart"/>
-            <w:r>
-              <w:t>dunno</w:t>
-            </w:r>
-            <w:proofErr w:type="spellEnd"/>
-            <w:r>
-              <w:t xml:space="preserve">') or </w:t>
-            </w:r>
-            <w:proofErr w:type="spellStart"/>
-            <w:r>
-              <w:t>filing_method</w:t>
-            </w:r>
-            <w:proofErr w:type="spellEnd"/>
-            <w:r>
-              <w:t xml:space="preserve"> </w:t>
-            </w:r>
-            <w:r>
-              <w:t xml:space="preserve">in </w:t>
-            </w:r>
-            <w:r>
-              <w:t xml:space="preserve">('mail or in person', </w:t>
-            </w:r>
-            <w:r>
-              <w:t>‘</w:t>
-            </w:r>
-            <w:r>
-              <w:t>dunno</w:t>
-            </w:r>
-            <w:r>
-              <w:t>’</w:t>
-            </w:r>
-            <w:r>
-              <w:t>)</w:t>
-            </w:r>
-            <w:r>
-              <w:t>)</w:t>
-            </w:r>
-            <w:r>
-              <w:t xml:space="preserve"> %}</w:t>
+              <w:t>{%tr if type_of_response.any_true() and not (type_of_response.all_true('stay married', exclusive = True)) %}</w:t>
             </w:r>
           </w:p>
         </w:tc>
@@ -5109,13 +4018,16 @@
             <w:pPr>
               <w:pStyle w:val="Heading2"/>
               <w:outlineLvl w:val="1"/>
+              <w:rPr>
+                <w:rFonts w:eastAsia="Calibri"/>
+              </w:rPr>
             </w:pPr>
             <w:r>
               <w:t xml:space="preserve">{{ </w:t>
             </w:r>
             <w:proofErr w:type="spellStart"/>
             <w:r>
-              <w:t>sign_step.subject</w:t>
+              <w:t>truefiling_file_and_serve_step.subject</w:t>
             </w:r>
             <w:proofErr w:type="spellEnd"/>
             <w:r>
@@ -5147,10 +4059,9 @@
           <w:p>
             <w:pPr>
               <w:pStyle w:val="Body"/>
-              <w:spacing w:before="0" w:beforeAutospacing="0" w:after="60" w:afterAutospacing="0"/>
-            </w:pPr>
-            <w:r>
-              <w:t>{{p (include_docx_template("docassemble.AKA2JBranding:sign_content.docx")) }}</w:t>
+            </w:pPr>
+            <w:r>
+              <w:t>{{p (include_docx_template("docassemble.AKA2JBranding:truefiling_file_and_serve_content.docx")) }}</w:t>
             </w:r>
           </w:p>
         </w:tc>
@@ -5176,10 +4087,18 @@
           </w:tcPr>
           <w:p>
             <w:pPr>
-              <w:pStyle w:val="Body"/>
-            </w:pPr>
-            <w:r>
-              <w:t>{%tr endif %}</w:t>
+              <w:pStyle w:val="Heading2"/>
+              <w:outlineLvl w:val="1"/>
+              <w:rPr>
+                <w:rFonts w:eastAsia="Calibri"/>
+              </w:rPr>
+            </w:pPr>
+            <w:r>
+              <w:t xml:space="preserve">{{ </w:t>
+            </w:r>
+            <w:r>
+              <w:lastRenderedPageBreak/>
+              <w:t>truefiling_serve_step.subject }}</w:t>
             </w:r>
           </w:p>
         </w:tc>
@@ -5201,7 +4120,18 @@
           <w:p>
             <w:pPr>
               <w:pStyle w:val="Body"/>
-            </w:pPr>
+              <w:spacing w:before="0" w:beforeAutospacing="0" w:after="60" w:afterAutospacing="0"/>
+            </w:pPr>
+          </w:p>
+          <w:p>
+            <w:pPr>
+              <w:pStyle w:val="Body"/>
+              <w:spacing w:before="280" w:after="0"/>
+            </w:pPr>
+            <w:r>
+              <w:lastRenderedPageBreak/>
+              <w:t>{{p (include_docx_template("docassemble.AKA2JBranding:truefiling_serve_content.docx")) }}</w:t>
+            </w:r>
           </w:p>
         </w:tc>
       </w:tr>
@@ -5229,7 +4159,14 @@
               <w:pStyle w:val="Body"/>
             </w:pPr>
             <w:r>
-              <w:t>{%tr if type_of_response.any_true() and not (type_of_response.all_true('stay married', exclusive = True)) %}</w:t>
+              <w:lastRenderedPageBreak/>
+              <w:t>{%tr endif</w:t>
+            </w:r>
+            <w:r>
+              <w:t xml:space="preserve"> </w:t>
+            </w:r>
+            <w:r>
+              <w:t>%}</w:t>
             </w:r>
           </w:p>
         </w:tc>
@@ -5276,22 +4213,52 @@
           </w:tcPr>
           <w:p>
             <w:pPr>
-              <w:pStyle w:val="Heading2"/>
-              <w:outlineLvl w:val="1"/>
-              <w:rPr>
-                <w:rFonts w:eastAsia="Calibri"/>
-              </w:rPr>
-            </w:pPr>
-            <w:r>
-              <w:t xml:space="preserve">{{ </w:t>
-            </w:r>
-            <w:proofErr w:type="spellStart"/>
-            <w:r>
-              <w:t>truefiling_file_and_serve_step.subject</w:t>
-            </w:r>
-            <w:proofErr w:type="spellEnd"/>
-            <w:r>
-              <w:t xml:space="preserve"> }}</w:t>
+              <w:pStyle w:val="Body"/>
+            </w:pPr>
+            <w:r>
+              <w:rPr>
+                <w:color w:val="FF0000"/>
+              </w:rPr>
+              <w:t>{%tr if</w:t>
+            </w:r>
+            <w:r>
+              <w:rPr>
+                <w:color w:val="FF0000"/>
+              </w:rPr>
+              <w:t xml:space="preserve"> (</w:t>
+            </w:r>
+            <w:r>
+              <w:rPr>
+                <w:color w:val="auto"/>
+              </w:rPr>
+              <w:t>type_of_response.any_true() and not (type_of_response.all_true('stay married', exclusive = True))</w:t>
+            </w:r>
+            <w:r>
+              <w:rPr>
+                <w:color w:val="FF0000"/>
+              </w:rPr>
+              <w:t>) and</w:t>
+            </w:r>
+            <w:r>
+              <w:rPr>
+                <w:color w:val="FF0000"/>
+              </w:rPr>
+              <w:t xml:space="preserve"> </w:t>
+            </w:r>
+            <w:r>
+              <w:rPr>
+                <w:color w:val="FF0000"/>
+              </w:rPr>
+              <w:t>(</w:t>
+            </w:r>
+            <w:r>
+              <w:t>not ((type_of_response['default'] and stage_of_default == 'judgment entered') or (type_of_response['case in 2 states'] and stage_of_other_case == 'ended with order') or (type_of_response.all_true('wrong state', 'default') and user_need == 'answer custody' and not jurisdiction))</w:t>
+            </w:r>
+            <w:r>
+              <w:rPr>
+                <w:color w:val="FF0000"/>
+              </w:rPr>
+              <w:t>) %}</w:t>
             </w:r>
           </w:p>
         </w:tc>
@@ -5313,16 +4280,7 @@
           <w:p>
             <w:pPr>
               <w:pStyle w:val="Body"/>
-              <w:spacing w:before="0" w:beforeAutospacing="0" w:after="60" w:afterAutospacing="0"/>
-            </w:pPr>
-          </w:p>
-          <w:p>
-            <w:pPr>
-              <w:pStyle w:val="Body"/>
-            </w:pPr>
-            <w:r>
-              <w:t>{{p (include_docx_template("docassemble.AKA2JBranding:truefiling_file_and_serve_content.docx")) }}</w:t>
-            </w:r>
+            </w:pPr>
           </w:p>
         </w:tc>
       </w:tr>
@@ -5354,7 +4312,42 @@
               </w:rPr>
             </w:pPr>
             <w:r>
-              <w:t>{{ truefiling_serve_step.subject }}</w:t>
+              <w:rPr>
+                <w:rFonts w:eastAsia="Calibri"/>
+              </w:rPr>
+              <w:t xml:space="preserve">{{ </w:t>
+            </w:r>
+            <w:proofErr w:type="spellStart"/>
+            <w:r>
+              <w:rPr>
+                <w:rFonts w:eastAsia="Calibri"/>
+              </w:rPr>
+              <w:t>read_</w:t>
+            </w:r>
+            <w:r>
+              <w:rPr>
+                <w:rFonts w:eastAsia="Calibri"/>
+              </w:rPr>
+              <w:t>standing_order</w:t>
+            </w:r>
+            <w:r>
+              <w:rPr>
+                <w:rFonts w:eastAsia="Calibri"/>
+              </w:rPr>
+              <w:t>_step</w:t>
+            </w:r>
+            <w:r>
+              <w:rPr>
+                <w:rFonts w:eastAsia="Calibri"/>
+              </w:rPr>
+              <w:t>.subject</w:t>
+            </w:r>
+            <w:proofErr w:type="spellEnd"/>
+            <w:r>
+              <w:rPr>
+                <w:rFonts w:eastAsia="Calibri"/>
+              </w:rPr>
+              <w:t xml:space="preserve"> }}</w:t>
             </w:r>
           </w:p>
         </w:tc>
@@ -5385,7 +4378,13 @@
               <w:spacing w:before="280" w:after="0"/>
             </w:pPr>
             <w:r>
-              <w:t>{{p (include_docx_template("docassemble.AKA2JBranding:truefiling_serve_content.docx")) }}</w:t>
+              <w:t>{{p (include_docx_template("docassemble.AKA2JBranding:</w:t>
+            </w:r>
+            <w:r>
+              <w:t>read_standing_order_content.docx</w:t>
+            </w:r>
+            <w:r>
+              <w:t>")) }}</w:t>
             </w:r>
           </w:p>
         </w:tc>
@@ -5412,9 +4411,20 @@
           <w:p>
             <w:pPr>
               <w:pStyle w:val="Body"/>
-            </w:pPr>
-            <w:r>
-              <w:t>{%tr endif%}</w:t>
+              <w:rPr>
+                <w:rStyle w:val="interviewvariable"/>
+                <w:color w:val="202529"/>
+                <w:shd w:val="clear" w:color="auto" w:fill="auto"/>
+              </w:rPr>
+            </w:pPr>
+            <w:r>
+              <w:t>{%tr endif</w:t>
+            </w:r>
+            <w:r>
+              <w:t xml:space="preserve"> </w:t>
+            </w:r>
+            <w:r>
+              <w:t>%}</w:t>
             </w:r>
           </w:p>
         </w:tc>
@@ -5467,50 +4477,7 @@
               <w:rPr>
                 <w:color w:val="FF0000"/>
               </w:rPr>
-              <w:t>{%tr if</w:t>
-            </w:r>
-            <w:r>
-              <w:rPr>
-                <w:color w:val="FF0000"/>
-              </w:rPr>
-              <w:t xml:space="preserve"> (</w:t>
-            </w:r>
-            <w:r>
-              <w:rPr>
-                <w:color w:val="auto"/>
-              </w:rPr>
-              <w:t>type_of_response.any_true() and not (type_of_response.all_true('stay married', exclusive = True))</w:t>
-            </w:r>
-            <w:r>
-              <w:rPr>
-                <w:color w:val="FF0000"/>
-              </w:rPr>
-              <w:t>) and</w:t>
-            </w:r>
-            <w:r>
-              <w:rPr>
-                <w:color w:val="FF0000"/>
-              </w:rPr>
-              <w:t xml:space="preserve"> </w:t>
-            </w:r>
-            <w:r>
-              <w:rPr>
-                <w:color w:val="FF0000"/>
-              </w:rPr>
-              <w:t>(</w:t>
-            </w:r>
-            <w:r>
-              <w:t xml:space="preserve">not ((type_of_response['default'] and stage_of_default == 'judgment entered') or (type_of_response['case in 2 states'] and stage_of_other_case == 'ended with order') </w:t>
-            </w:r>
-            <w:r>
-              <w:lastRenderedPageBreak/>
-              <w:t>or (type_of_response.all_true('wrong state', 'default') and user_need == 'answer custody' and not jurisdiction))</w:t>
-            </w:r>
-            <w:r>
-              <w:rPr>
-                <w:color w:val="FF0000"/>
-              </w:rPr>
-              <w:t>) %}</w:t>
+              <w:t>{%tr if type_of_response.any_true() and not (type_of_response.all_true('stay married', exclusive = True)) %}</w:t>
             </w:r>
           </w:p>
         </w:tc>
@@ -5574,31 +4541,26 @@
               <w:rPr>
                 <w:rFonts w:eastAsia="Calibri"/>
               </w:rPr>
-              <w:t>read_</w:t>
+              <w:t>expect_after_motion_or_ans</w:t>
             </w:r>
             <w:r>
               <w:rPr>
                 <w:rFonts w:eastAsia="Calibri"/>
               </w:rPr>
-              <w:t>standing_order</w:t>
+              <w:lastRenderedPageBreak/>
+              <w:t>wer_step</w:t>
             </w:r>
             <w:r>
               <w:rPr>
                 <w:rFonts w:eastAsia="Calibri"/>
               </w:rPr>
-              <w:t>_step</w:t>
-            </w:r>
+              <w:t>.subject</w:t>
+            </w:r>
+            <w:proofErr w:type="spellEnd"/>
             <w:r>
               <w:rPr>
                 <w:rFonts w:eastAsia="Calibri"/>
               </w:rPr>
-              <w:t>.subject</w:t>
-            </w:r>
-            <w:proofErr w:type="spellEnd"/>
-            <w:r>
-              <w:rPr>
-                <w:rFonts w:eastAsia="Calibri"/>
-              </w:rPr>
               <w:t xml:space="preserve"> }}</w:t>
             </w:r>
           </w:p>
@@ -5621,21 +4583,41 @@
           <w:p>
             <w:pPr>
               <w:pStyle w:val="Body"/>
-              <w:spacing w:before="0" w:beforeAutospacing="0" w:after="60" w:afterAutospacing="0"/>
-            </w:pPr>
-          </w:p>
-          <w:p>
-            <w:pPr>
-              <w:pStyle w:val="Body"/>
-              <w:spacing w:before="280" w:after="0"/>
-            </w:pPr>
-            <w:r>
+              <w:rPr>
+                <w:color w:val="auto"/>
+              </w:rPr>
+            </w:pPr>
+          </w:p>
+          <w:p>
+            <w:pPr>
+              <w:pStyle w:val="Body"/>
+              <w:rPr>
+                <w:color w:val="auto"/>
+              </w:rPr>
+            </w:pPr>
+            <w:r>
+              <w:rPr>
+                <w:color w:val="auto"/>
+              </w:rPr>
               <w:t>{{p (include_docx_template("docassemble.AKA2JBranding:</w:t>
             </w:r>
             <w:r>
-              <w:t>read_standing_order_content.docx</w:t>
-            </w:r>
-            <w:r>
+              <w:rPr>
+                <w:color w:val="auto"/>
+              </w:rPr>
+              <w:t>expect_after_</w:t>
+            </w:r>
+            <w:r>
+              <w:rPr>
+                <w:color w:val="auto"/>
+              </w:rPr>
+              <w:lastRenderedPageBreak/>
+              <w:t>motion_or_answer_content.docx</w:t>
+            </w:r>
+            <w:r>
+              <w:rPr>
+                <w:color w:val="auto"/>
+              </w:rPr>
               <w:t>")) }}</w:t>
             </w:r>
           </w:p>
@@ -5663,14 +4645,10 @@
           <w:p>
             <w:pPr>
               <w:pStyle w:val="Body"/>
-              <w:rPr>
-                <w:rStyle w:val="interviewvariable"/>
-                <w:color w:val="202529"/>
-                <w:shd w:val="clear" w:color="auto" w:fill="auto"/>
-              </w:rPr>
-            </w:pPr>
-            <w:r>
-              <w:t>{%tr endif%}</w:t>
+            </w:pPr>
+            <w:r>
+              <w:lastRenderedPageBreak/>
+              <w:t>{%tr endif %}</w:t>
             </w:r>
           </w:p>
         </w:tc>
@@ -5723,7 +4701,31 @@
               <w:rPr>
                 <w:color w:val="FF0000"/>
               </w:rPr>
-              <w:t>{%tr if type_of_response.any_true() and not (type_of_response.all_true('stay married', exclusive = True)) %}</w:t>
+              <w:t>{%tr if (</w:t>
+            </w:r>
+            <w:r>
+              <w:t>not ((user_need == 'answer custody' and type_of_response.all_true('wrong state', 'default') and not jurisdiction) or (type_of_response['case in 2 states'] and stage_of_other_case == 'ended with order') or (type_of_response['default'] and stage_of_default == 'judgment entered') or type_of_response.all_false())</w:t>
+            </w:r>
+            <w:r>
+              <w:rPr>
+                <w:color w:val="FF0000"/>
+              </w:rPr>
+              <w:t>) or</w:t>
+            </w:r>
+            <w:r>
+              <w:rPr>
+                <w:color w:val="FF0000"/>
+              </w:rPr>
+              <w:t xml:space="preserve"> </w:t>
+            </w:r>
+            <w:r>
+              <w:rPr>
+                <w:color w:val="FF0000"/>
+              </w:rPr>
+              <w:t>type_of_response.all_true('stay married', exclusive = True)</w:t>
+            </w:r>
+            <w:r>
+              <w:t xml:space="preserve"> %}</w:t>
             </w:r>
           </w:p>
         </w:tc>
@@ -5746,6 +4748,17 @@
             <w:pPr>
               <w:pStyle w:val="Body"/>
             </w:pPr>
+            <w:proofErr w:type="spellStart"/>
+            <w:r>
+              <w:t>learn_more_about_</w:t>
+            </w:r>
+            <w:r>
+              <w:t>the_</w:t>
+            </w:r>
+            <w:r>
+              <w:t>process_step</w:t>
+            </w:r>
+            <w:proofErr w:type="spellEnd"/>
           </w:p>
         </w:tc>
       </w:tr>
@@ -5787,7 +4800,7 @@
               <w:rPr>
                 <w:rFonts w:eastAsia="Calibri"/>
               </w:rPr>
-              <w:t>expect_after_motion_or_answer_step</w:t>
+              <w:t>learn_more_about_process_step</w:t>
             </w:r>
             <w:r>
               <w:rPr>
@@ -5822,35 +4835,9 @@
           <w:p>
             <w:pPr>
               <w:pStyle w:val="Body"/>
-              <w:rPr>
-                <w:color w:val="auto"/>
-              </w:rPr>
-            </w:pPr>
-          </w:p>
-          <w:p>
-            <w:pPr>
-              <w:pStyle w:val="Body"/>
-              <w:rPr>
-                <w:color w:val="auto"/>
-              </w:rPr>
-            </w:pPr>
-            <w:r>
-              <w:rPr>
-                <w:color w:val="auto"/>
-              </w:rPr>
-              <w:t>{{p (include_docx_template("docassemble.AKA2JBranding:</w:t>
-            </w:r>
-            <w:r>
-              <w:rPr>
-                <w:color w:val="auto"/>
-              </w:rPr>
-              <w:t>expect_after_motion_or_answer_content.docx</w:t>
-            </w:r>
-            <w:r>
-              <w:rPr>
-                <w:color w:val="auto"/>
-              </w:rPr>
-              <w:t>")) }}</w:t>
+            </w:pPr>
+            <w:r>
+              <w:t>{{p (include_docx_template("docassemble.AKA2JBranding:learn_more_about_the_process_content.docx")) }}</w:t>
             </w:r>
           </w:p>
         </w:tc>
@@ -5877,8 +4864,12 @@
           <w:p>
             <w:pPr>
               <w:pStyle w:val="Body"/>
-            </w:pPr>
-            <w:r>
+              <w:spacing w:before="0" w:after="0"/>
+            </w:pPr>
+            <w:r>
+              <w:rPr>
+                <w:shd w:val="clear" w:color="auto" w:fill="FFFFFF"/>
+              </w:rPr>
               <w:t>{%tr endif %}</w:t>
             </w:r>
           </w:p>
@@ -5901,6 +4892,7 @@
           <w:p>
             <w:pPr>
               <w:pStyle w:val="Body"/>
+              <w:spacing w:before="0" w:after="0"/>
             </w:pPr>
           </w:p>
         </w:tc>
@@ -5927,40 +4919,16 @@
           <w:p>
             <w:pPr>
               <w:pStyle w:val="Body"/>
-            </w:pPr>
-            <w:r>
-              <w:rPr>
-                <w:color w:val="FF0000"/>
-              </w:rPr>
-              <w:t>{%tr if (</w:t>
-            </w:r>
-            <w:r>
-              <w:t xml:space="preserve">not ((user_need == 'answer custody' and type_of_response.all_true('wrong state', 'default') and not jurisdiction) or (type_of_response['case in 2 states'] and stage_of_other_case == 'ended with order') or (type_of_response['default'] and stage_of_default == </w:t>
-            </w:r>
-            <w:r>
-              <w:lastRenderedPageBreak/>
-              <w:t>'judgment entered') or type_of_response.all_false())</w:t>
-            </w:r>
-            <w:r>
-              <w:rPr>
-                <w:color w:val="FF0000"/>
-              </w:rPr>
-              <w:t>) or</w:t>
-            </w:r>
-            <w:r>
-              <w:rPr>
-                <w:color w:val="FF0000"/>
-              </w:rPr>
-              <w:t xml:space="preserve"> </w:t>
-            </w:r>
-            <w:r>
-              <w:rPr>
-                <w:color w:val="FF0000"/>
-              </w:rPr>
-              <w:t>type_of_response.all_true('stay married', exclusive = True)</w:t>
-            </w:r>
-            <w:r>
-              <w:t xml:space="preserve"> %}</w:t>
+              <w:spacing w:before="0" w:after="0"/>
+              <w:rPr>
+                <w:shd w:val="clear" w:color="auto" w:fill="FFFFFF"/>
+              </w:rPr>
+            </w:pPr>
+            <w:r>
+              <w:rPr>
+                <w:shd w:val="clear" w:color="auto" w:fill="FFFFFF"/>
+              </w:rPr>
+              <w:t>{%tr if domestic_violence %}</w:t>
             </w:r>
           </w:p>
         </w:tc>
@@ -5982,19 +4950,17 @@
           <w:p>
             <w:pPr>
               <w:pStyle w:val="Body"/>
+              <w:spacing w:before="0" w:after="0"/>
             </w:pPr>
             <w:proofErr w:type="spellStart"/>
             <w:r>
-              <w:lastRenderedPageBreak/>
-              <w:t>learn_more_about_</w:t>
-            </w:r>
-            <w:r>
-              <w:t>the_</w:t>
-            </w:r>
-            <w:r>
-              <w:t>process_step</w:t>
+              <w:t>answer_domestic_violence_step</w:t>
             </w:r>
             <w:proofErr w:type="spellEnd"/>
+            <w:r>
+              <w:br/>
+              <w:t>2026-04-02</w:t>
+            </w:r>
           </w:p>
         </w:tc>
       </w:tr>
@@ -6022,34 +4988,11 @@
               <w:pStyle w:val="Heading2"/>
               <w:outlineLvl w:val="1"/>
               <w:rPr>
-                <w:rFonts w:eastAsia="Calibri"/>
-              </w:rPr>
-            </w:pPr>
-            <w:r>
-              <w:rPr>
-                <w:rFonts w:eastAsia="Calibri"/>
-              </w:rPr>
-              <w:t xml:space="preserve">{{ </w:t>
-            </w:r>
-            <w:proofErr w:type="spellStart"/>
-            <w:r>
-              <w:rPr>
-                <w:rFonts w:eastAsia="Calibri"/>
-              </w:rPr>
-              <w:t>learn_more_about_process_step</w:t>
-            </w:r>
-            <w:r>
-              <w:rPr>
-                <w:rFonts w:eastAsia="Calibri"/>
-              </w:rPr>
-              <w:t>.subject</w:t>
-            </w:r>
-            <w:proofErr w:type="spellEnd"/>
-            <w:r>
-              <w:rPr>
-                <w:rFonts w:eastAsia="Calibri"/>
-              </w:rPr>
-              <w:t xml:space="preserve"> }}</w:t>
+                <w:shd w:val="clear" w:color="auto" w:fill="FFFFFF"/>
+              </w:rPr>
+            </w:pPr>
+            <w:r>
+              <w:t>{{ answer_domestic_violence_step.subject }}</w:t>
             </w:r>
           </w:p>
         </w:tc>
@@ -6071,9 +5014,15 @@
           <w:p>
             <w:pPr>
               <w:pStyle w:val="Body"/>
-            </w:pPr>
-            <w:r>
-              <w:t>{{p (include_docx_template("docassemble.AKA2JBranding:learn_more_about_the_process_content.docx")) }}</w:t>
+              <w:spacing w:before="0" w:beforeAutospacing="0" w:after="60" w:afterAutospacing="0"/>
+            </w:pPr>
+          </w:p>
+          <w:p>
+            <w:pPr>
+              <w:pStyle w:val="Body"/>
+            </w:pPr>
+            <w:r>
+              <w:t>{{p (include_docx_template("docassemble.AKA2JBranding:answer_domestic_violence_content.docx")) }}</w:t>
             </w:r>
           </w:p>
         </w:tc>
@@ -6101,6 +5050,9 @@
             <w:pPr>
               <w:pStyle w:val="Body"/>
               <w:spacing w:before="0" w:after="0"/>
+              <w:rPr>
+                <w:shd w:val="clear" w:color="auto" w:fill="FFFFFF"/>
+              </w:rPr>
             </w:pPr>
             <w:r>
               <w:rPr>
@@ -6162,9 +5114,179 @@
             </w:pPr>
             <w:r>
               <w:rPr>
+                <w:color w:val="FF0000"/>
                 <w:shd w:val="clear" w:color="auto" w:fill="FFFFFF"/>
               </w:rPr>
-              <w:t>{%tr if domestic_violence %}</w:t>
+              <w:t xml:space="preserve">{%tr </w:t>
+            </w:r>
+            <w:r>
+              <w:rPr>
+                <w:color w:val="FF0000"/>
+                <w:shd w:val="clear" w:color="auto" w:fill="FFFFFF"/>
+              </w:rPr>
+              <w:t xml:space="preserve">if </w:t>
+            </w:r>
+            <w:r>
+              <w:rPr>
+                <w:color w:val="FF0000"/>
+                <w:shd w:val="clear" w:color="auto" w:fill="FFFFFF"/>
+              </w:rPr>
+              <w:t xml:space="preserve">user_need == 'answer divorce' and </w:t>
+            </w:r>
+            <w:r>
+              <w:rPr>
+                <w:color w:val="FF0000"/>
+                <w:shd w:val="clear" w:color="auto" w:fill="FFFFFF"/>
+              </w:rPr>
+              <w:t xml:space="preserve">type_of_response[‘ak divorce case’] and not </w:t>
+            </w:r>
+            <w:r>
+              <w:rPr>
+                <w:color w:val="FF0000"/>
+                <w:shd w:val="clear" w:color="auto" w:fill="FFFFFF"/>
+              </w:rPr>
+              <w:lastRenderedPageBreak/>
+              <w:t>type_of_response[‘improper service’] and not (</w:t>
+            </w:r>
+            <w:r>
+              <w:rPr>
+                <w:color w:val="FFC000"/>
+                <w:shd w:val="clear" w:color="auto" w:fill="FFFFFF"/>
+              </w:rPr>
+              <w:t>type_of_response[‘case in 2 states’] and stage_of_other_case == ‘ended with order’</w:t>
+            </w:r>
+            <w:r>
+              <w:rPr>
+                <w:color w:val="FF0000"/>
+                <w:shd w:val="clear" w:color="auto" w:fill="FFFFFF"/>
+              </w:rPr>
+              <w:t>) and not (</w:t>
+            </w:r>
+            <w:r>
+              <w:rPr>
+                <w:color w:val="FFC000"/>
+                <w:shd w:val="clear" w:color="auto" w:fill="FFFFFF"/>
+              </w:rPr>
+              <w:t>type_of_response[‘default’] and stage_of_default == ‘judgment entered’</w:t>
+            </w:r>
+            <w:r>
+              <w:rPr>
+                <w:color w:val="FF0000"/>
+                <w:shd w:val="clear" w:color="auto" w:fill="FFFFFF"/>
+              </w:rPr>
+              <w:t xml:space="preserve">) and </w:t>
+            </w:r>
+            <w:r>
+              <w:rPr>
+                <w:color w:val="FF0000"/>
+                <w:shd w:val="clear" w:color="auto" w:fill="FFFFFF"/>
+              </w:rPr>
+              <w:t>(</w:t>
+            </w:r>
+            <w:r>
+              <w:rPr>
+                <w:color w:val="FFC000"/>
+                <w:shd w:val="clear" w:color="auto" w:fill="FFFFFF"/>
+              </w:rPr>
+              <w:t>(</w:t>
+            </w:r>
+            <w:r>
+              <w:rPr>
+                <w:color w:val="92D050"/>
+                <w:shd w:val="clear" w:color="auto" w:fill="FFFFFF"/>
+              </w:rPr>
+              <w:t>minor_children an</w:t>
+            </w:r>
+            <w:r>
+              <w:rPr>
+                <w:color w:val="92D050"/>
+                <w:shd w:val="clear" w:color="auto" w:fill="FFFFFF"/>
+              </w:rPr>
+              <w:t>d husban</w:t>
+            </w:r>
+            <w:r>
+              <w:rPr>
+                <w:color w:val="92D050"/>
+                <w:shd w:val="clear" w:color="auto" w:fill="FFFFFF"/>
+              </w:rPr>
+              <w:t>d</w:t>
+            </w:r>
+            <w:r>
+              <w:rPr>
+                <w:color w:val="92D050"/>
+                <w:shd w:val="clear" w:color="auto" w:fill="FFFFFF"/>
+              </w:rPr>
+              <w:t>_not_father</w:t>
+            </w:r>
+            <w:r>
+              <w:rPr>
+                <w:color w:val="FFC000"/>
+                <w:shd w:val="clear" w:color="auto" w:fill="FFFFFF"/>
+              </w:rPr>
+              <w:t>)</w:t>
+            </w:r>
+            <w:r>
+              <w:rPr>
+                <w:color w:val="92D050"/>
+                <w:shd w:val="clear" w:color="auto" w:fill="FFFFFF"/>
+              </w:rPr>
+              <w:t xml:space="preserve"> </w:t>
+            </w:r>
+            <w:r>
+              <w:rPr>
+                <w:color w:val="FFC000"/>
+                <w:shd w:val="clear" w:color="auto" w:fill="FFFFFF"/>
+              </w:rPr>
+              <w:t>or (</w:t>
+            </w:r>
+            <w:r>
+              <w:rPr>
+                <w:color w:val="92D050"/>
+                <w:shd w:val="clear" w:color="auto" w:fill="FFFFFF"/>
+              </w:rPr>
+              <w:t>minor_children and husband_not_father is None</w:t>
+            </w:r>
+            <w:r>
+              <w:rPr>
+                <w:color w:val="FFC000"/>
+                <w:shd w:val="clear" w:color="auto" w:fill="FFFFFF"/>
+              </w:rPr>
+              <w:t>) or (</w:t>
+            </w:r>
+            <w:r>
+              <w:rPr>
+                <w:color w:val="92D050"/>
+                <w:shd w:val="clear" w:color="auto" w:fill="FFFFFF"/>
+              </w:rPr>
+              <w:t>minor_children and not husband_not_father and wife_is_pregnant == 'not husband'</w:t>
+            </w:r>
+            <w:r>
+              <w:rPr>
+                <w:color w:val="FFC000"/>
+                <w:shd w:val="clear" w:color="auto" w:fill="FFFFFF"/>
+              </w:rPr>
+              <w:t>) or (</w:t>
+            </w:r>
+            <w:r>
+              <w:rPr>
+                <w:color w:val="92D050"/>
+                <w:shd w:val="clear" w:color="auto" w:fill="FFFFFF"/>
+              </w:rPr>
+              <w:t>not minor_children and wife_is_pregnant == 'not husband'</w:t>
+            </w:r>
+            <w:r>
+              <w:rPr>
+                <w:color w:val="FFC000"/>
+                <w:shd w:val="clear" w:color="auto" w:fill="FFFFFF"/>
+              </w:rPr>
+              <w:t>)</w:t>
+            </w:r>
+            <w:r>
+              <w:rPr>
+                <w:color w:val="FF0000"/>
+                <w:shd w:val="clear" w:color="auto" w:fill="FFFFFF"/>
+              </w:rPr>
+              <w:t>) %}</w:t>
             </w:r>
           </w:p>
         </w:tc>
@@ -6190,13 +5312,10 @@
             </w:pPr>
             <w:proofErr w:type="spellStart"/>
             <w:r>
-              <w:t>answer_domestic_violence_step</w:t>
+              <w:lastRenderedPageBreak/>
+              <w:t>paternity_step</w:t>
             </w:r>
             <w:proofErr w:type="spellEnd"/>
-            <w:r>
-              <w:br/>
-              <w:t>2026-04-02</w:t>
-            </w:r>
           </w:p>
         </w:tc>
       </w:tr>
@@ -6228,7 +5347,10 @@
               </w:rPr>
             </w:pPr>
             <w:r>
-              <w:t>{{ answer_domestic_violence_step.subject }}</w:t>
+              <w:rPr>
+                <w:shd w:val="clear" w:color="auto" w:fill="FFFFFF"/>
+              </w:rPr>
+              <w:t>{{ paternity_step.subject }}</w:t>
             </w:r>
           </w:p>
         </w:tc>
@@ -6258,7 +5380,7 @@
               <w:pStyle w:val="Body"/>
             </w:pPr>
             <w:r>
-              <w:t>{{p (include_docx_template("docassemble.AKA2JBranding:answer_domestic_violence_content.docx")) }}</w:t>
+              <w:t>{{p (include_docx_template("docassemble.AKA2JBranding:paternity_content.docx")) }}</w:t>
             </w:r>
           </w:p>
         </w:tc>
@@ -6342,70 +5464,6 @@
           </w:tcPr>
           <w:p>
             <w:pPr>
-              <w:pStyle w:val="Body"/>
-              <w:spacing w:before="0" w:after="0"/>
-              <w:rPr>
-                <w:shd w:val="clear" w:color="auto" w:fill="FFFFFF"/>
-              </w:rPr>
-            </w:pPr>
-            <w:r>
-              <w:rPr>
-                <w:color w:val="FF0000"/>
-                <w:shd w:val="clear" w:color="auto" w:fill="FFFFFF"/>
-              </w:rPr>
-              <w:t>{%tr if (user_need in ('custody', 'answer custody') and paternity) or (user_need == 'divorce' and minor_children and paternity == 'do not know') or (user_need == 'answer divorce' and minor_children and paternity == 'do not know') %}</w:t>
-            </w:r>
-          </w:p>
-        </w:tc>
-        <w:tc>
-          <w:tcPr>
-            <w:tcW w:w="7618" w:type="dxa"/>
-            <w:tcBorders>
-              <w:top w:val="nil"/>
-              <w:left w:val="nil"/>
-              <w:bottom w:val="nil"/>
-              <w:right w:val="nil"/>
-            </w:tcBorders>
-            <w:tcMar>
-              <w:top w:w="0" w:type="dxa"/>
-              <w:left w:w="108" w:type="dxa"/>
-              <w:right w:w="108" w:type="dxa"/>
-            </w:tcMar>
-          </w:tcPr>
-          <w:p>
-            <w:pPr>
-              <w:pStyle w:val="Body"/>
-              <w:spacing w:before="0" w:after="0"/>
-            </w:pPr>
-            <w:proofErr w:type="spellStart"/>
-            <w:r>
-              <w:t>paternity_step</w:t>
-            </w:r>
-            <w:proofErr w:type="spellEnd"/>
-          </w:p>
-        </w:tc>
-      </w:tr>
-      <w:tr>
-        <w:trPr>
-          <w:jc w:val="center"/>
-        </w:trPr>
-        <w:tc>
-          <w:tcPr>
-            <w:tcW w:w="2635" w:type="dxa"/>
-            <w:tcBorders>
-              <w:top w:val="nil"/>
-              <w:left w:val="nil"/>
-              <w:bottom w:val="nil"/>
-              <w:right w:val="nil"/>
-            </w:tcBorders>
-            <w:tcMar>
-              <w:top w:w="0" w:type="dxa"/>
-              <w:left w:w="108" w:type="dxa"/>
-              <w:right w:w="108" w:type="dxa"/>
-            </w:tcMar>
-          </w:tcPr>
-          <w:p>
-            <w:pPr>
               <w:pStyle w:val="Heading2"/>
               <w:outlineLvl w:val="1"/>
               <w:rPr>
@@ -6413,10 +5471,7 @@
               </w:rPr>
             </w:pPr>
             <w:r>
-              <w:rPr>
-                <w:shd w:val="clear" w:color="auto" w:fill="FFFFFF"/>
-              </w:rPr>
-              <w:t>{{ paternity_step.subject }}</w:t>
+              <w:t>{{ get_help.subject }}</w:t>
             </w:r>
           </w:p>
         </w:tc>
@@ -6444,139 +5499,10 @@
           <w:p>
             <w:pPr>
               <w:pStyle w:val="Body"/>
-            </w:pPr>
-            <w:r>
-              <w:t>{{p (include_docx_template("docassemble.AKA2JBranding:paternity_content.docx")) }}</w:t>
-            </w:r>
-          </w:p>
-        </w:tc>
-      </w:tr>
-      <w:tr>
-        <w:trPr>
-          <w:jc w:val="center"/>
-        </w:trPr>
-        <w:tc>
-          <w:tcPr>
-            <w:tcW w:w="2635" w:type="dxa"/>
-            <w:tcBorders>
-              <w:top w:val="nil"/>
-              <w:left w:val="nil"/>
-              <w:bottom w:val="nil"/>
-              <w:right w:val="nil"/>
-            </w:tcBorders>
-            <w:tcMar>
-              <w:top w:w="0" w:type="dxa"/>
-              <w:left w:w="108" w:type="dxa"/>
-              <w:right w:w="108" w:type="dxa"/>
-            </w:tcMar>
-          </w:tcPr>
-          <w:p>
-            <w:pPr>
-              <w:pStyle w:val="Body"/>
-              <w:spacing w:before="0" w:after="0"/>
-              <w:rPr>
-                <w:shd w:val="clear" w:color="auto" w:fill="FFFFFF"/>
-              </w:rPr>
-            </w:pPr>
-            <w:r>
-              <w:rPr>
-                <w:shd w:val="clear" w:color="auto" w:fill="FFFFFF"/>
-              </w:rPr>
-              <w:t>{%tr endif %}</w:t>
-            </w:r>
-          </w:p>
-        </w:tc>
-        <w:tc>
-          <w:tcPr>
-            <w:tcW w:w="7618" w:type="dxa"/>
-            <w:tcBorders>
-              <w:top w:val="nil"/>
-              <w:left w:val="nil"/>
-              <w:bottom w:val="nil"/>
-              <w:right w:val="nil"/>
-            </w:tcBorders>
-            <w:tcMar>
-              <w:top w:w="0" w:type="dxa"/>
-              <w:left w:w="108" w:type="dxa"/>
-              <w:right w:w="108" w:type="dxa"/>
-            </w:tcMar>
-          </w:tcPr>
-          <w:p>
-            <w:pPr>
-              <w:pStyle w:val="Body"/>
-              <w:spacing w:before="0" w:after="0"/>
-            </w:pPr>
-          </w:p>
-        </w:tc>
-      </w:tr>
-      <w:tr>
-        <w:trPr>
-          <w:jc w:val="center"/>
-        </w:trPr>
-        <w:tc>
-          <w:tcPr>
-            <w:tcW w:w="2635" w:type="dxa"/>
-            <w:tcBorders>
-              <w:top w:val="nil"/>
-              <w:left w:val="nil"/>
-              <w:bottom w:val="nil"/>
-              <w:right w:val="nil"/>
-            </w:tcBorders>
-            <w:tcMar>
-              <w:top w:w="0" w:type="dxa"/>
-              <w:left w:w="108" w:type="dxa"/>
-              <w:right w:w="108" w:type="dxa"/>
-            </w:tcMar>
-          </w:tcPr>
-          <w:p>
-            <w:pPr>
-              <w:pStyle w:val="Heading2"/>
-              <w:outlineLvl w:val="1"/>
-              <w:rPr>
-                <w:shd w:val="clear" w:color="auto" w:fill="FFFFFF"/>
-              </w:rPr>
-            </w:pPr>
-            <w:r>
-              <w:t>{{ get_help.subje</w:t>
-            </w:r>
-            <w:r>
-              <w:lastRenderedPageBreak/>
-              <w:t>ct }}</w:t>
-            </w:r>
-          </w:p>
-        </w:tc>
-        <w:tc>
-          <w:tcPr>
-            <w:tcW w:w="7618" w:type="dxa"/>
-            <w:tcBorders>
-              <w:top w:val="nil"/>
-              <w:left w:val="nil"/>
-              <w:bottom w:val="nil"/>
-              <w:right w:val="nil"/>
-            </w:tcBorders>
-            <w:tcMar>
-              <w:top w:w="0" w:type="dxa"/>
-              <w:left w:w="108" w:type="dxa"/>
-              <w:right w:w="108" w:type="dxa"/>
-            </w:tcMar>
-          </w:tcPr>
-          <w:p>
-            <w:pPr>
-              <w:pStyle w:val="Body"/>
-              <w:spacing w:before="0" w:beforeAutospacing="0" w:after="60" w:afterAutospacing="0"/>
-            </w:pPr>
-          </w:p>
-          <w:p>
-            <w:pPr>
-              <w:pStyle w:val="Body"/>
               <w:spacing w:before="100" w:after="100"/>
             </w:pPr>
             <w:r>
-              <w:t xml:space="preserve">{{p </w:t>
-            </w:r>
-            <w:r>
-              <w:lastRenderedPageBreak/>
-              <w:t>(include_docx_template("docassemble.AKA2JBranding:get_help_content.docx")) }}</w:t>
+              <w:t>{{p (include_docx_template("docassemble.AKA2JBranding:get_help_content.docx")) }}</w:t>
             </w:r>
           </w:p>
         </w:tc>
@@ -6588,12 +5514,7 @@
       </w:pPr>
     </w:p>
     <w:sectPr>
-      <w:headerReference w:type="even" r:id="rId25"/>
-      <w:headerReference w:type="default" r:id="rId26"/>
-      <w:footerReference w:type="even" r:id="rId27"/>
-      <w:footerReference w:type="default" r:id="rId28"/>
-      <w:headerReference w:type="first" r:id="rId29"/>
-      <w:footerReference w:type="first" r:id="rId30"/>
+      <w:footerReference w:type="default" r:id="rId8"/>
       <w:pgSz w:w="12240" w:h="15840"/>
       <w:pgMar w:top="245" w:right="1440" w:bottom="274" w:left="1440" w:header="0" w:footer="720" w:gutter="0"/>
       <w:cols w:space="720"/>
@@ -6624,16 +5545,6 @@
 </file>
 
 <file path=word/footer1.xml><?xml version="1.0" encoding="utf-8"?>
-<w:ftr xmlns:wpc="http://schemas.microsoft.com/office/word/2010/wordprocessingCanvas" xmlns:cx="http://schemas.microsoft.com/office/drawing/2014/chartex" xmlns:cx1="http://schemas.microsoft.com/office/drawing/2015/9/8/chartex" xmlns:cx2="http://schemas.microsoft.com/office/drawing/2015/10/21/chartex" xmlns:cx3="http://schemas.microsoft.com/office/drawing/2016/5/9/chartex" xmlns:cx4="http://schemas.microsoft.com/office/drawing/2016/5/10/chartex" xmlns:cx5="http://schemas.microsoft.com/office/drawing/2016/5/11/chartex" xmlns:cx6="http://schemas.microsoft.com/office/drawing/2016/5/12/chartex" xmlns:cx7="http://schemas.microsoft.com/office/drawing/2016/5/13/chartex" xmlns:cx8="http://schemas.microsoft.com/office/drawing/2016/5/14/chartex" xmlns:mc="http://schemas.openxmlformats.org/markup-compatibility/2006" xmlns:aink="http://schemas.microsoft.com/office/drawing/2016/ink" xmlns:am3d="http://schemas.microsoft.com/office/drawing/2017/model3d" xmlns:o="urn:schemas-microsoft-com:office:office" xmlns:r="http://schemas.openxmlformats.org/officeDocument/2006/relationships" xmlns:m="http://schemas.openxmlformats.org/officeDocument/2006/math" xmlns:v="urn:schemas-microsoft-com:vml" xmlns:wp14="http://schemas.microsoft.com/office/word/2010/wordprocessingDrawing" xmlns:wp="http://schemas.openxmlformats.org/drawingml/2006/wordprocessingDrawing" xmlns:w10="urn:schemas-microsoft-com:office:word" xmlns:w="http://schemas.openxmlformats.org/wordprocessingml/2006/main" xmlns:w14="http://schemas.microsoft.com/office/word/2010/wordml" xmlns:w15="http://schemas.microsoft.com/office/word/2012/wordml" xmlns:w16cex="http://schemas.microsoft.com/office/word/2018/wordml/cex" xmlns:w16cid="http://schemas.microsoft.com/office/word/2016/wordml/cid" xmlns:w16="http://schemas.microsoft.com/office/word/2018/wordml" xmlns:w16sdtdh="http://schemas.microsoft.com/office/word/2020/wordml/sdtdatahash" xmlns:w16se="http://schemas.microsoft.com/office/word/2015/wordml/symex" xmlns:wpg="http://schemas.microsoft.com/office/word/2010/wordprocessingGroup" xmlns:wpi="http://schemas.microsoft.com/office/word/2010/wordprocessingInk" xmlns:wne="http://schemas.microsoft.com/office/word/2006/wordml" xmlns:wps="http://schemas.microsoft.com/office/word/2010/wordprocessingShape" mc:Ignorable="w14 w15 w16se w16cid w16 w16cex w16sdtdh wp14">
-  <w:p>
-    <w:pPr>
-      <w:pStyle w:val="Footer"/>
-    </w:pPr>
-  </w:p>
-</w:ftr>
-</file>
-
-<file path=word/footer2.xml><?xml version="1.0" encoding="utf-8"?>
 <w:ftr xmlns:wpc="http://schemas.microsoft.com/office/word/2010/wordprocessingCanvas" xmlns:cx="http://schemas.microsoft.com/office/drawing/2014/chartex" xmlns:cx1="http://schemas.microsoft.com/office/drawing/2015/9/8/chartex" xmlns:cx2="http://schemas.microsoft.com/office/drawing/2015/10/21/chartex" xmlns:cx3="http://schemas.microsoft.com/office/drawing/2016/5/9/chartex" xmlns:cx4="http://schemas.microsoft.com/office/drawing/2016/5/10/chartex" xmlns:cx5="http://schemas.microsoft.com/office/drawing/2016/5/11/chartex" xmlns:cx6="http://schemas.microsoft.com/office/drawing/2016/5/12/chartex" xmlns:cx7="http://schemas.microsoft.com/office/drawing/2016/5/13/chartex" xmlns:cx8="http://schemas.microsoft.com/office/drawing/2016/5/14/chartex" xmlns:mc="http://schemas.openxmlformats.org/markup-compatibility/2006" xmlns:aink="http://schemas.microsoft.com/office/drawing/2016/ink" xmlns:am3d="http://schemas.microsoft.com/office/drawing/2017/model3d" xmlns:o="urn:schemas-microsoft-com:office:office" xmlns:r="http://schemas.openxmlformats.org/officeDocument/2006/relationships" xmlns:m="http://schemas.openxmlformats.org/officeDocument/2006/math" xmlns:v="urn:schemas-microsoft-com:vml" xmlns:wp14="http://schemas.microsoft.com/office/word/2010/wordprocessingDrawing" xmlns:wp="http://schemas.openxmlformats.org/drawingml/2006/wordprocessingDrawing" xmlns:w10="urn:schemas-microsoft-com:office:word" xmlns:w="http://schemas.openxmlformats.org/wordprocessingml/2006/main" xmlns:w14="http://schemas.microsoft.com/office/word/2010/wordml" xmlns:w15="http://schemas.microsoft.com/office/word/2012/wordml" xmlns:w16cex="http://schemas.microsoft.com/office/word/2018/wordml/cex" xmlns:w16cid="http://schemas.microsoft.com/office/word/2016/wordml/cid" xmlns:w16="http://schemas.microsoft.com/office/word/2018/wordml" xmlns:w16sdtdh="http://schemas.microsoft.com/office/word/2020/wordml/sdtdatahash" xmlns:w16se="http://schemas.microsoft.com/office/word/2015/wordml/symex" xmlns:wpg="http://schemas.microsoft.com/office/word/2010/wordprocessingGroup" xmlns:wpi="http://schemas.microsoft.com/office/word/2010/wordprocessingInk" xmlns:wne="http://schemas.microsoft.com/office/word/2006/wordml" xmlns:wps="http://schemas.microsoft.com/office/word/2010/wordprocessingShape" mc:Ignorable="w14 w15 w16se w16cid w16 w16cex w16sdtdh wp14">
   <w:p>
     <w:pPr>
@@ -6690,24 +5601,11 @@
       <w:spacing w:before="100" w:afterAutospacing="0"/>
     </w:pPr>
     <w:r>
-      <w:t xml:space="preserve">April </w:t>
+      <w:t>May 5</w:t>
     </w:r>
     <w:r>
-      <w:t>2</w:t>
+      <w:t>, 2026</w:t>
     </w:r>
-    <w:r>
-      <w:t>3, 2026</w:t>
-    </w:r>
-  </w:p>
-</w:ftr>
-</file>
-
-<file path=word/footer3.xml><?xml version="1.0" encoding="utf-8"?>
-<w:ftr xmlns:wpc="http://schemas.microsoft.com/office/word/2010/wordprocessingCanvas" xmlns:cx="http://schemas.microsoft.com/office/drawing/2014/chartex" xmlns:cx1="http://schemas.microsoft.com/office/drawing/2015/9/8/chartex" xmlns:cx2="http://schemas.microsoft.com/office/drawing/2015/10/21/chartex" xmlns:cx3="http://schemas.microsoft.com/office/drawing/2016/5/9/chartex" xmlns:cx4="http://schemas.microsoft.com/office/drawing/2016/5/10/chartex" xmlns:cx5="http://schemas.microsoft.com/office/drawing/2016/5/11/chartex" xmlns:cx6="http://schemas.microsoft.com/office/drawing/2016/5/12/chartex" xmlns:cx7="http://schemas.microsoft.com/office/drawing/2016/5/13/chartex" xmlns:cx8="http://schemas.microsoft.com/office/drawing/2016/5/14/chartex" xmlns:mc="http://schemas.openxmlformats.org/markup-compatibility/2006" xmlns:aink="http://schemas.microsoft.com/office/drawing/2016/ink" xmlns:am3d="http://schemas.microsoft.com/office/drawing/2017/model3d" xmlns:o="urn:schemas-microsoft-com:office:office" xmlns:r="http://schemas.openxmlformats.org/officeDocument/2006/relationships" xmlns:m="http://schemas.openxmlformats.org/officeDocument/2006/math" xmlns:v="urn:schemas-microsoft-com:vml" xmlns:wp14="http://schemas.microsoft.com/office/word/2010/wordprocessingDrawing" xmlns:wp="http://schemas.openxmlformats.org/drawingml/2006/wordprocessingDrawing" xmlns:w10="urn:schemas-microsoft-com:office:word" xmlns:w="http://schemas.openxmlformats.org/wordprocessingml/2006/main" xmlns:w14="http://schemas.microsoft.com/office/word/2010/wordml" xmlns:w15="http://schemas.microsoft.com/office/word/2012/wordml" xmlns:w16cex="http://schemas.microsoft.com/office/word/2018/wordml/cex" xmlns:w16cid="http://schemas.microsoft.com/office/word/2016/wordml/cid" xmlns:w16="http://schemas.microsoft.com/office/word/2018/wordml" xmlns:w16sdtdh="http://schemas.microsoft.com/office/word/2020/wordml/sdtdatahash" xmlns:w16se="http://schemas.microsoft.com/office/word/2015/wordml/symex" xmlns:wpg="http://schemas.microsoft.com/office/word/2010/wordprocessingGroup" xmlns:wpi="http://schemas.microsoft.com/office/word/2010/wordprocessingInk" xmlns:wne="http://schemas.microsoft.com/office/word/2006/wordml" xmlns:wps="http://schemas.microsoft.com/office/word/2010/wordprocessingShape" mc:Ignorable="w14 w15 w16se w16cid w16 w16cex w16sdtdh wp14">
-  <w:p>
-    <w:pPr>
-      <w:pStyle w:val="Footer"/>
-    </w:pPr>
   </w:p>
 </w:ftr>
 </file>
@@ -6729,36 +5627,6 @@
     </w:p>
   </w:footnote>
 </w:footnotes>
-</file>
-
-<file path=word/header1.xml><?xml version="1.0" encoding="utf-8"?>
-<w:hdr xmlns:wpc="http://schemas.microsoft.com/office/word/2010/wordprocessingCanvas" xmlns:cx="http://schemas.microsoft.com/office/drawing/2014/chartex" xmlns:cx1="http://schemas.microsoft.com/office/drawing/2015/9/8/chartex" xmlns:cx2="http://schemas.microsoft.com/office/drawing/2015/10/21/chartex" xmlns:cx3="http://schemas.microsoft.com/office/drawing/2016/5/9/chartex" xmlns:cx4="http://schemas.microsoft.com/office/drawing/2016/5/10/chartex" xmlns:cx5="http://schemas.microsoft.com/office/drawing/2016/5/11/chartex" xmlns:cx6="http://schemas.microsoft.com/office/drawing/2016/5/12/chartex" xmlns:cx7="http://schemas.microsoft.com/office/drawing/2016/5/13/chartex" xmlns:cx8="http://schemas.microsoft.com/office/drawing/2016/5/14/chartex" xmlns:mc="http://schemas.openxmlformats.org/markup-compatibility/2006" xmlns:aink="http://schemas.microsoft.com/office/drawing/2016/ink" xmlns:am3d="http://schemas.microsoft.com/office/drawing/2017/model3d" xmlns:o="urn:schemas-microsoft-com:office:office" xmlns:r="http://schemas.openxmlformats.org/officeDocument/2006/relationships" xmlns:m="http://schemas.openxmlformats.org/officeDocument/2006/math" xmlns:v="urn:schemas-microsoft-com:vml" xmlns:wp14="http://schemas.microsoft.com/office/word/2010/wordprocessingDrawing" xmlns:wp="http://schemas.openxmlformats.org/drawingml/2006/wordprocessingDrawing" xmlns:w10="urn:schemas-microsoft-com:office:word" xmlns:w="http://schemas.openxmlformats.org/wordprocessingml/2006/main" xmlns:w14="http://schemas.microsoft.com/office/word/2010/wordml" xmlns:w15="http://schemas.microsoft.com/office/word/2012/wordml" xmlns:w16cex="http://schemas.microsoft.com/office/word/2018/wordml/cex" xmlns:w16cid="http://schemas.microsoft.com/office/word/2016/wordml/cid" xmlns:w16="http://schemas.microsoft.com/office/word/2018/wordml" xmlns:w16sdtdh="http://schemas.microsoft.com/office/word/2020/wordml/sdtdatahash" xmlns:w16se="http://schemas.microsoft.com/office/word/2015/wordml/symex" xmlns:wpg="http://schemas.microsoft.com/office/word/2010/wordprocessingGroup" xmlns:wpi="http://schemas.microsoft.com/office/word/2010/wordprocessingInk" xmlns:wne="http://schemas.microsoft.com/office/word/2006/wordml" xmlns:wps="http://schemas.microsoft.com/office/word/2010/wordprocessingShape" mc:Ignorable="w14 w15 w16se w16cid w16 w16cex w16sdtdh wp14">
-  <w:p>
-    <w:pPr>
-      <w:pStyle w:val="Header"/>
-    </w:pPr>
-  </w:p>
-</w:hdr>
-</file>
-
-<file path=word/header2.xml><?xml version="1.0" encoding="utf-8"?>
-<w:hdr xmlns:wpc="http://schemas.microsoft.com/office/word/2010/wordprocessingCanvas" xmlns:cx="http://schemas.microsoft.com/office/drawing/2014/chartex" xmlns:cx1="http://schemas.microsoft.com/office/drawing/2015/9/8/chartex" xmlns:cx2="http://schemas.microsoft.com/office/drawing/2015/10/21/chartex" xmlns:cx3="http://schemas.microsoft.com/office/drawing/2016/5/9/chartex" xmlns:cx4="http://schemas.microsoft.com/office/drawing/2016/5/10/chartex" xmlns:cx5="http://schemas.microsoft.com/office/drawing/2016/5/11/chartex" xmlns:cx6="http://schemas.microsoft.com/office/drawing/2016/5/12/chartex" xmlns:cx7="http://schemas.microsoft.com/office/drawing/2016/5/13/chartex" xmlns:cx8="http://schemas.microsoft.com/office/drawing/2016/5/14/chartex" xmlns:mc="http://schemas.openxmlformats.org/markup-compatibility/2006" xmlns:aink="http://schemas.microsoft.com/office/drawing/2016/ink" xmlns:am3d="http://schemas.microsoft.com/office/drawing/2017/model3d" xmlns:o="urn:schemas-microsoft-com:office:office" xmlns:r="http://schemas.openxmlformats.org/officeDocument/2006/relationships" xmlns:m="http://schemas.openxmlformats.org/officeDocument/2006/math" xmlns:v="urn:schemas-microsoft-com:vml" xmlns:wp14="http://schemas.microsoft.com/office/word/2010/wordprocessingDrawing" xmlns:wp="http://schemas.openxmlformats.org/drawingml/2006/wordprocessingDrawing" xmlns:w10="urn:schemas-microsoft-com:office:word" xmlns:w="http://schemas.openxmlformats.org/wordprocessingml/2006/main" xmlns:w14="http://schemas.microsoft.com/office/word/2010/wordml" xmlns:w15="http://schemas.microsoft.com/office/word/2012/wordml" xmlns:w16cex="http://schemas.microsoft.com/office/word/2018/wordml/cex" xmlns:w16cid="http://schemas.microsoft.com/office/word/2016/wordml/cid" xmlns:w16="http://schemas.microsoft.com/office/word/2018/wordml" xmlns:w16sdtdh="http://schemas.microsoft.com/office/word/2020/wordml/sdtdatahash" xmlns:w16se="http://schemas.microsoft.com/office/word/2015/wordml/symex" xmlns:wpg="http://schemas.microsoft.com/office/word/2010/wordprocessingGroup" xmlns:wpi="http://schemas.microsoft.com/office/word/2010/wordprocessingInk" xmlns:wne="http://schemas.microsoft.com/office/word/2006/wordml" xmlns:wps="http://schemas.microsoft.com/office/word/2010/wordprocessingShape" mc:Ignorable="w14 w15 w16se w16cid w16 w16cex w16sdtdh wp14">
-  <w:p>
-    <w:pPr>
-      <w:pStyle w:val="Header"/>
-    </w:pPr>
-  </w:p>
-</w:hdr>
-</file>
-
-<file path=word/header3.xml><?xml version="1.0" encoding="utf-8"?>
-<w:hdr xmlns:wpc="http://schemas.microsoft.com/office/word/2010/wordprocessingCanvas" xmlns:cx="http://schemas.microsoft.com/office/drawing/2014/chartex" xmlns:cx1="http://schemas.microsoft.com/office/drawing/2015/9/8/chartex" xmlns:cx2="http://schemas.microsoft.com/office/drawing/2015/10/21/chartex" xmlns:cx3="http://schemas.microsoft.com/office/drawing/2016/5/9/chartex" xmlns:cx4="http://schemas.microsoft.com/office/drawing/2016/5/10/chartex" xmlns:cx5="http://schemas.microsoft.com/office/drawing/2016/5/11/chartex" xmlns:cx6="http://schemas.microsoft.com/office/drawing/2016/5/12/chartex" xmlns:cx7="http://schemas.microsoft.com/office/drawing/2016/5/13/chartex" xmlns:cx8="http://schemas.microsoft.com/office/drawing/2016/5/14/chartex" xmlns:mc="http://schemas.openxmlformats.org/markup-compatibility/2006" xmlns:aink="http://schemas.microsoft.com/office/drawing/2016/ink" xmlns:am3d="http://schemas.microsoft.com/office/drawing/2017/model3d" xmlns:o="urn:schemas-microsoft-com:office:office" xmlns:r="http://schemas.openxmlformats.org/officeDocument/2006/relationships" xmlns:m="http://schemas.openxmlformats.org/officeDocument/2006/math" xmlns:v="urn:schemas-microsoft-com:vml" xmlns:wp14="http://schemas.microsoft.com/office/word/2010/wordprocessingDrawing" xmlns:wp="http://schemas.openxmlformats.org/drawingml/2006/wordprocessingDrawing" xmlns:w10="urn:schemas-microsoft-com:office:word" xmlns:w="http://schemas.openxmlformats.org/wordprocessingml/2006/main" xmlns:w14="http://schemas.microsoft.com/office/word/2010/wordml" xmlns:w15="http://schemas.microsoft.com/office/word/2012/wordml" xmlns:w16cex="http://schemas.microsoft.com/office/word/2018/wordml/cex" xmlns:w16cid="http://schemas.microsoft.com/office/word/2016/wordml/cid" xmlns:w16="http://schemas.microsoft.com/office/word/2018/wordml" xmlns:w16sdtdh="http://schemas.microsoft.com/office/word/2020/wordml/sdtdatahash" xmlns:w16se="http://schemas.microsoft.com/office/word/2015/wordml/symex" xmlns:wpg="http://schemas.microsoft.com/office/word/2010/wordprocessingGroup" xmlns:wpi="http://schemas.microsoft.com/office/word/2010/wordprocessingInk" xmlns:wne="http://schemas.microsoft.com/office/word/2006/wordml" xmlns:wps="http://schemas.microsoft.com/office/word/2010/wordprocessingShape" mc:Ignorable="w14 w15 w16se w16cid w16 w16cex w16sdtdh wp14">
-  <w:p>
-    <w:pPr>
-      <w:pStyle w:val="Header"/>
-    </w:pPr>
-  </w:p>
-</w:hdr>
 </file>
 
 <file path=word/numbering.xml><?xml version="1.0" encoding="utf-8"?>

</xml_diff>

<commit_message>
Fingers crossed we are a little closer
</commit_message>
<xml_diff>
--- a/docassemble/RespondingCaseToEndYourMarriageActionPlan/data/templates/responding_ending_marriage_action_plan.docx
+++ b/docassemble/RespondingCaseToEndYourMarriageActionPlan/data/templates/responding_ending_marriage_action_plan.docx
@@ -955,7 +955,11 @@
               <w:spacing w:before="0" w:after="0"/>
             </w:pPr>
             <w:r>
-              <w:t>{%tr if type_of_response['improper service'] or type_of_response['default'] %}</w:t>
+              <w:t>{%tr if type_of_response['improper service'] or type_of_response['def</w:t>
+            </w:r>
+            <w:r>
+              <w:lastRenderedPageBreak/>
+              <w:t>ault'] %}</w:t>
             </w:r>
           </w:p>
         </w:tc>
@@ -984,6 +988,7 @@
             </w:pPr>
             <w:proofErr w:type="spellStart"/>
             <w:r>
+              <w:lastRenderedPageBreak/>
               <w:t>proper_service_step</w:t>
             </w:r>
             <w:proofErr w:type="spellEnd"/>
@@ -1015,7 +1020,6 @@
               <w:outlineLvl w:val="1"/>
             </w:pPr>
             <w:r>
-              <w:lastRenderedPageBreak/>
               <w:t xml:space="preserve">{{ </w:t>
             </w:r>
             <w:proofErr w:type="spellStart"/>
@@ -1157,6 +1161,9 @@
                 <w:highlight w:val="white"/>
               </w:rPr>
             </w:pPr>
+            <w:r>
+              <w:t>{%tr if type_of_response.all_true('improper service', exclusive = True) %}</w:t>
+            </w:r>
           </w:p>
         </w:tc>
         <w:tc>
@@ -1183,15 +1190,6 @@
               <w:t>decide_after_improper_service_step</w:t>
             </w:r>
             <w:proofErr w:type="spellEnd"/>
-            <w:r>
-              <w:br/>
-            </w:r>
-            <w:r>
-              <w:t xml:space="preserve">if type_of_response.all_true('improper service', exclusive = True) </w:t>
-            </w:r>
-            <w:r>
-              <w:t>or (type_of_response.all_true(‘wrong state’, ‘improper service’) and not proper_service)</w:t>
-            </w:r>
           </w:p>
         </w:tc>
       </w:tr>
@@ -1285,8 +1283,11 @@
           <w:p>
             <w:pPr>
               <w:pStyle w:val="Body"/>
-              <w:spacing w:before="0" w:after="0"/>
-            </w:pPr>
+              <w:spacing w:before="100" w:after="100"/>
+            </w:pPr>
+            <w:r>
+              <w:t>{%tr endif %}</w:t>
+            </w:r>
           </w:p>
         </w:tc>
         <w:tc>
@@ -1688,7 +1689,20 @@
               <w:rPr>
                 <w:color w:val="FF0000"/>
               </w:rPr>
-              <w:t xml:space="preserve">{%tr if user_need == 'answer divorce' and case_type == 'legal separation' and not </w:t>
+              <w:t xml:space="preserve">{%tr if user_need == 'answer divorce' and case_type == 'legal </w:t>
+            </w:r>
+            <w:r>
+              <w:rPr>
+                <w:color w:val="FF0000"/>
+              </w:rPr>
+              <w:lastRenderedPageBreak/>
+              <w:t xml:space="preserve">separation' and </w:t>
+            </w:r>
+            <w:r>
+              <w:rPr>
+                <w:color w:val="FF0000"/>
+              </w:rPr>
+              <w:t xml:space="preserve">not </w:t>
             </w:r>
             <w:r>
               <w:rPr>
@@ -1700,50 +1714,49 @@
               <w:rPr>
                 <w:color w:val="92D050"/>
               </w:rPr>
-              <w:t>type_of_response[‘ca</w:t>
+              <w:t>type_of_response[‘case in 2 states’] and stage_of_other_case == ‘ended with order’</w:t>
+            </w:r>
+            <w:r>
+              <w:rPr>
+                <w:color w:val="FFC000"/>
+              </w:rPr>
+              <w:t>)</w:t>
+            </w:r>
+            <w:r>
+              <w:rPr>
+                <w:color w:val="FF0000"/>
+              </w:rPr>
+              <w:t xml:space="preserve"> and not </w:t>
+            </w:r>
+            <w:r>
+              <w:rPr>
+                <w:color w:val="FFC000"/>
+              </w:rPr>
+              <w:t>(</w:t>
             </w:r>
             <w:r>
               <w:rPr>
                 <w:color w:val="92D050"/>
               </w:rPr>
-              <w:lastRenderedPageBreak/>
-              <w:t>se in 2 states’] and stage_of_other_case == ‘ended with order’</w:t>
+              <w:t>type_of_response[‘default’] and stage_of_default == ‘judgment entered’</w:t>
             </w:r>
             <w:r>
               <w:rPr>
                 <w:color w:val="FFC000"/>
               </w:rPr>
-              <w:t>)</w:t>
+              <w:t xml:space="preserve">) </w:t>
             </w:r>
             <w:r>
               <w:rPr>
                 <w:color w:val="FF0000"/>
               </w:rPr>
-              <w:t xml:space="preserve"> and not </w:t>
-            </w:r>
-            <w:r>
-              <w:rPr>
-                <w:color w:val="FFC000"/>
-              </w:rPr>
-              <w:t>(</w:t>
-            </w:r>
-            <w:r>
-              <w:rPr>
-                <w:color w:val="92D050"/>
-              </w:rPr>
-              <w:t>type_of_response[‘default’] and stage_of_default == ‘judgment entered’</w:t>
-            </w:r>
-            <w:r>
-              <w:rPr>
-                <w:color w:val="FFC000"/>
-              </w:rPr>
-              <w:t xml:space="preserve">) </w:t>
+              <w:t xml:space="preserve">and </w:t>
             </w:r>
             <w:r>
               <w:rPr>
                 <w:color w:val="FF0000"/>
               </w:rPr>
-              <w:t>and want_legal_separation == 'unsure' %}</w:t>
+              <w:t>want_legal_separation == 'unsure' %}</w:t>
             </w:r>
           </w:p>
         </w:tc>
@@ -1801,6 +1814,7 @@
               <w:outlineLvl w:val="1"/>
             </w:pPr>
             <w:r>
+              <w:lastRenderedPageBreak/>
               <w:t xml:space="preserve">{{ </w:t>
             </w:r>
             <w:proofErr w:type="spellStart"/>
@@ -1855,7 +1869,6 @@
             <w:r>
               <w:rPr>
                 <w:b/>
-                <w:bCs/>
               </w:rPr>
               <w:t>Legal Separation Decree</w:t>
             </w:r>
@@ -1873,7 +1886,6 @@
             <w:r>
               <w:rPr>
                 <w:b/>
-                <w:bCs/>
               </w:rPr>
               <w:t>Decree of Legal Separation</w:t>
             </w:r>
@@ -1958,7 +1970,11 @@
               <w:pStyle w:val="Body"/>
             </w:pPr>
             <w:r>
-              <w:t>Remember, either you or your spouse can turn a legal separation into a divorce at any time</w:t>
+              <w:t xml:space="preserve">Remember, either you or your spouse can turn a legal separation into </w:t>
+            </w:r>
+            <w:r>
+              <w:lastRenderedPageBreak/>
+              <w:t>a divorce at any time</w:t>
             </w:r>
             <w:r>
               <w:t>:</w:t>
@@ -1987,13 +2003,11 @@
               <w:ind w:left="404"/>
             </w:pPr>
             <w:r>
-              <w:lastRenderedPageBreak/>
               <w:t xml:space="preserve">If you decide you do not want a legal separation, check the box telling the court “I do not agree to a legal separation because I want the marriage to end in a divorce” in the “Counterclaims” section of your </w:t>
             </w:r>
             <w:r>
               <w:rPr>
                 <w:b/>
-                <w:bCs/>
               </w:rPr>
               <w:t>Answer</w:t>
             </w:r>
@@ -2647,7 +2661,7 @@
                 <w:sz w:val="20"/>
                 <w:szCs w:val="20"/>
               </w:rPr>
-              <w:t>response_to_complaint in('</w:t>
+              <w:t>response_to_complaint in(</w:t>
             </w:r>
             <w:r>
               <w:rPr>
@@ -2655,7 +2669,7 @@
                 <w:sz w:val="20"/>
                 <w:szCs w:val="20"/>
               </w:rPr>
-              <w:t>agree</w:t>
+              <w:t>'</w:t>
             </w:r>
             <w:r>
               <w:rPr>
@@ -2663,7 +2677,23 @@
                 <w:sz w:val="20"/>
                 <w:szCs w:val="20"/>
               </w:rPr>
-              <w:t xml:space="preserve">', 'some') </w:t>
+              <w:t>agree</w:t>
+            </w:r>
+            <w:r>
+              <w:rPr>
+                <w:color w:val="6AA84F"/>
+                <w:sz w:val="20"/>
+                <w:szCs w:val="20"/>
+              </w:rPr>
+              <w:t>'</w:t>
+            </w:r>
+            <w:r>
+              <w:rPr>
+                <w:color w:val="6AA84F"/>
+                <w:sz w:val="20"/>
+                <w:szCs w:val="20"/>
+              </w:rPr>
+              <w:t xml:space="preserve">, 'some') </w:t>
             </w:r>
             <w:r>
               <w:rPr>
@@ -2805,6 +2835,7 @@
                 <w:sz w:val="20"/>
                 <w:szCs w:val="20"/>
               </w:rPr>
+              <w:lastRenderedPageBreak/>
               <w:t>want_help_to_agree</w:t>
             </w:r>
             <w:proofErr w:type="spellEnd"/>
@@ -2855,6 +2886,7 @@
             </w:pPr>
             <w:proofErr w:type="spellStart"/>
             <w:r>
+              <w:lastRenderedPageBreak/>
               <w:t>want_help_to_agree_step</w:t>
             </w:r>
             <w:proofErr w:type="spellEnd"/>
@@ -2890,11 +2922,7 @@
             </w:r>
             <w:proofErr w:type="spellStart"/>
             <w:r>
-              <w:t>want_help_to_</w:t>
-            </w:r>
-            <w:r>
-              <w:lastRenderedPageBreak/>
-              <w:t>agree</w:t>
+              <w:t>want_help_to_agree</w:t>
             </w:r>
             <w:r>
               <w:t>_</w:t>
@@ -2934,11 +2962,7 @@
               <w:pStyle w:val="Body"/>
             </w:pPr>
             <w:r>
-              <w:t>{{p (include_docx_template("docassemble.AKA2JBranding:want_help_to_</w:t>
-            </w:r>
-            <w:r>
-              <w:lastRenderedPageBreak/>
-              <w:t>agree_content.docx")) }}</w:t>
+              <w:t>{{p (include_docx_template("docassemble.AKA2JBranding:want_help_to_agree_content.docx")) }}</w:t>
             </w:r>
           </w:p>
         </w:tc>
@@ -2967,7 +2991,6 @@
               <w:pStyle w:val="Body"/>
             </w:pPr>
             <w:r>
-              <w:lastRenderedPageBreak/>
               <w:t>{%tr endif %}</w:t>
             </w:r>
           </w:p>
@@ -3046,25 +3069,37 @@
               <w:rPr>
                 <w:color w:val="FF0000"/>
               </w:rPr>
+              <w:t>) and not</w:t>
+            </w:r>
+            <w:r>
+              <w:rPr>
+                <w:color w:val="FF0000"/>
+              </w:rPr>
+              <w:t>(</w:t>
+            </w:r>
+            <w:r>
+              <w:rPr>
+                <w:color w:val="FFC000"/>
+              </w:rPr>
+              <w:t>type_of_response['case in 2 states'] and stage_of_other_case == 'ended with order'</w:t>
+            </w:r>
+            <w:r>
+              <w:rPr>
+                <w:color w:val="FF0000"/>
+              </w:rPr>
               <w:t>) and not(</w:t>
             </w:r>
             <w:r>
               <w:rPr>
                 <w:color w:val="FFC000"/>
               </w:rPr>
-              <w:t>type_of_response['case in 2 states'] and stage_of_other_case == 'ended with order'</w:t>
-            </w:r>
-            <w:r>
-              <w:rPr>
-                <w:color w:val="FF0000"/>
-              </w:rPr>
-              <w:t>) and not(</w:t>
+              <w:t>type_of_response[</w:t>
             </w:r>
             <w:r>
               <w:rPr>
                 <w:color w:val="FFC000"/>
               </w:rPr>
-              <w:t>type_of_response['stay married'] and not respond</w:t>
+              <w:t>'stay married'] and not respond</w:t>
             </w:r>
             <w:r>
               <w:rPr>
@@ -3337,7 +3372,11 @@
             </w:pPr>
             <w:bookmarkStart w:id="2" w:name="_Hlk226106692"/>
             <w:r>
-              <w:t>{{ dismiss_step.subject }}</w:t>
+              <w:t xml:space="preserve">{{ </w:t>
+            </w:r>
+            <w:r>
+              <w:lastRenderedPageBreak/>
+              <w:t>dismiss_step.subject }}</w:t>
             </w:r>
           </w:p>
         </w:tc>
@@ -3371,6 +3410,7 @@
               <w:spacing w:before="240" w:after="100"/>
             </w:pPr>
             <w:r>
+              <w:lastRenderedPageBreak/>
               <w:t>{{p (include_docx_template("docassemble.AKA2JBranding:dismiss_content.docx")) }}</w:t>
             </w:r>
           </w:p>
@@ -3402,6 +3442,7 @@
               <w:spacing w:before="0" w:after="0"/>
             </w:pPr>
             <w:r>
+              <w:lastRenderedPageBreak/>
               <w:t>{%tr endif %}</w:t>
             </w:r>
           </w:p>
@@ -3456,7 +3497,6 @@
               <w:spacing w:before="0" w:after="0"/>
             </w:pPr>
             <w:r>
-              <w:lastRenderedPageBreak/>
               <w:t>{%tr if stage_of_default == 'judgment entered' %}</w:t>
             </w:r>
           </w:p>
@@ -4027,6 +4067,7 @@
             </w:r>
             <w:proofErr w:type="spellStart"/>
             <w:r>
+              <w:lastRenderedPageBreak/>
               <w:t>truefiling_file_and_serve_step.subject</w:t>
             </w:r>
             <w:proofErr w:type="spellEnd"/>
@@ -4061,6 +4102,7 @@
               <w:pStyle w:val="Body"/>
             </w:pPr>
             <w:r>
+              <w:lastRenderedPageBreak/>
               <w:t>{{p (include_docx_template("docassemble.AKA2JBranding:truefiling_file_and_serve_content.docx")) }}</w:t>
             </w:r>
           </w:p>
@@ -4094,11 +4136,8 @@
               </w:rPr>
             </w:pPr>
             <w:r>
-              <w:t xml:space="preserve">{{ </w:t>
-            </w:r>
-            <w:r>
               <w:lastRenderedPageBreak/>
-              <w:t>truefiling_serve_step.subject }}</w:t>
+              <w:t>{{ truefiling_serve_step.subject }}</w:t>
             </w:r>
           </w:p>
         </w:tc>
@@ -4129,7 +4168,6 @@
               <w:spacing w:before="280" w:after="0"/>
             </w:pPr>
             <w:r>
-              <w:lastRenderedPageBreak/>
               <w:t>{{p (include_docx_template("docassemble.AKA2JBranding:truefiling_serve_content.docx")) }}</w:t>
             </w:r>
           </w:p>
@@ -4159,7 +4197,6 @@
               <w:pStyle w:val="Body"/>
             </w:pPr>
             <w:r>
-              <w:lastRenderedPageBreak/>
               <w:t>{%tr endif</w:t>
             </w:r>
             <w:r>
@@ -4477,7 +4514,14 @@
               <w:rPr>
                 <w:color w:val="FF0000"/>
               </w:rPr>
-              <w:t>{%tr if type_of_response.any_true() and not (type_of_response.all_true('stay married', exclusive = True)) %}</w:t>
+              <w:t xml:space="preserve">{%tr if type_of_response.any_true() and not </w:t>
+            </w:r>
+            <w:r>
+              <w:rPr>
+                <w:color w:val="FF0000"/>
+              </w:rPr>
+              <w:lastRenderedPageBreak/>
+              <w:t>(type_of_response.all_true('stay married', exclusive = True)) %}</w:t>
             </w:r>
           </w:p>
         </w:tc>
@@ -4541,26 +4585,19 @@
               <w:rPr>
                 <w:rFonts w:eastAsia="Calibri"/>
               </w:rPr>
-              <w:t>expect_after_motion_or_ans</w:t>
+              <w:t>expect_after_motion_or_answer_step</w:t>
             </w:r>
             <w:r>
               <w:rPr>
                 <w:rFonts w:eastAsia="Calibri"/>
               </w:rPr>
-              <w:lastRenderedPageBreak/>
-              <w:t>wer_step</w:t>
-            </w:r>
+              <w:t>.subject</w:t>
+            </w:r>
+            <w:proofErr w:type="spellEnd"/>
             <w:r>
               <w:rPr>
                 <w:rFonts w:eastAsia="Calibri"/>
               </w:rPr>
-              <w:t>.subject</w:t>
-            </w:r>
-            <w:proofErr w:type="spellEnd"/>
-            <w:r>
-              <w:rPr>
-                <w:rFonts w:eastAsia="Calibri"/>
-              </w:rPr>
               <w:t xml:space="preserve"> }}</w:t>
             </w:r>
           </w:p>
@@ -4605,14 +4642,7 @@
               <w:rPr>
                 <w:color w:val="auto"/>
               </w:rPr>
-              <w:t>expect_after_</w:t>
-            </w:r>
-            <w:r>
-              <w:rPr>
-                <w:color w:val="auto"/>
-              </w:rPr>
-              <w:lastRenderedPageBreak/>
-              <w:t>motion_or_answer_content.docx</w:t>
+              <w:t>expect_after_motion_or_answer_content.docx</w:t>
             </w:r>
             <w:r>
               <w:rPr>
@@ -4647,7 +4677,6 @@
               <w:pStyle w:val="Body"/>
             </w:pPr>
             <w:r>
-              <w:lastRenderedPageBreak/>
               <w:t>{%tr endif %}</w:t>
             </w:r>
           </w:p>
@@ -4992,7 +5021,11 @@
               </w:rPr>
             </w:pPr>
             <w:r>
-              <w:t>{{ answer_domestic_violence_step.subject }}</w:t>
+              <w:t xml:space="preserve">{{ </w:t>
+            </w:r>
+            <w:r>
+              <w:lastRenderedPageBreak/>
+              <w:t>answer_domestic_violence_step.subject }}</w:t>
             </w:r>
           </w:p>
         </w:tc>
@@ -5022,6 +5055,7 @@
               <w:pStyle w:val="Body"/>
             </w:pPr>
             <w:r>
+              <w:lastRenderedPageBreak/>
               <w:t>{{p (include_docx_template("docassemble.AKA2JBranding:answer_domestic_violence_content.docx")) }}</w:t>
             </w:r>
           </w:p>
@@ -5058,6 +5092,7 @@
               <w:rPr>
                 <w:shd w:val="clear" w:color="auto" w:fill="FFFFFF"/>
               </w:rPr>
+              <w:lastRenderedPageBreak/>
               <w:t>{%tr endif %}</w:t>
             </w:r>
           </w:p>
@@ -5138,154 +5173,146 @@
                 <w:color w:val="FF0000"/>
                 <w:shd w:val="clear" w:color="auto" w:fill="FFFFFF"/>
               </w:rPr>
-              <w:t xml:space="preserve">type_of_response[‘ak divorce case’] and not </w:t>
+              <w:t>type_of_response[‘ak divorce case’] and not type_of_response[‘improper service’] and not (</w:t>
+            </w:r>
+            <w:r>
+              <w:rPr>
+                <w:color w:val="FFC000"/>
+                <w:shd w:val="clear" w:color="auto" w:fill="FFFFFF"/>
+              </w:rPr>
+              <w:t>type_of_response[‘case in 2 states’] and stage_of_other_case == ‘ended with order’</w:t>
             </w:r>
             <w:r>
               <w:rPr>
                 <w:color w:val="FF0000"/>
                 <w:shd w:val="clear" w:color="auto" w:fill="FFFFFF"/>
               </w:rPr>
-              <w:lastRenderedPageBreak/>
-              <w:t>type_of_response[‘improper service’] and not (</w:t>
+              <w:t>) and not (</w:t>
             </w:r>
             <w:r>
               <w:rPr>
                 <w:color w:val="FFC000"/>
                 <w:shd w:val="clear" w:color="auto" w:fill="FFFFFF"/>
               </w:rPr>
-              <w:t>type_of_response[‘case in 2 states’] and stage_of_other_case == ‘ended with order’</w:t>
+              <w:t>type_of_response[‘default’] and stage_of_default == ‘judgment entered’</w:t>
             </w:r>
             <w:r>
               <w:rPr>
                 <w:color w:val="FF0000"/>
                 <w:shd w:val="clear" w:color="auto" w:fill="FFFFFF"/>
               </w:rPr>
-              <w:t>) and not (</w:t>
+              <w:t xml:space="preserve">) and </w:t>
+            </w:r>
+            <w:r>
+              <w:rPr>
+                <w:color w:val="FF0000"/>
+                <w:shd w:val="clear" w:color="auto" w:fill="FFFFFF"/>
+              </w:rPr>
+              <w:t>(</w:t>
             </w:r>
             <w:r>
               <w:rPr>
                 <w:color w:val="FFC000"/>
                 <w:shd w:val="clear" w:color="auto" w:fill="FFFFFF"/>
               </w:rPr>
-              <w:t>type_of_response[‘default’] and stage_of_default == ‘judgment entered’</w:t>
+              <w:t>(</w:t>
+            </w:r>
+            <w:r>
+              <w:rPr>
+                <w:color w:val="92D050"/>
+                <w:shd w:val="clear" w:color="auto" w:fill="FFFFFF"/>
+              </w:rPr>
+              <w:t>minor_children an</w:t>
+            </w:r>
+            <w:r>
+              <w:rPr>
+                <w:color w:val="92D050"/>
+                <w:shd w:val="clear" w:color="auto" w:fill="FFFFFF"/>
+              </w:rPr>
+              <w:t>d husban</w:t>
+            </w:r>
+            <w:r>
+              <w:rPr>
+                <w:color w:val="92D050"/>
+                <w:shd w:val="clear" w:color="auto" w:fill="FFFFFF"/>
+              </w:rPr>
+              <w:t>d</w:t>
+            </w:r>
+            <w:r>
+              <w:rPr>
+                <w:color w:val="92D050"/>
+                <w:shd w:val="clear" w:color="auto" w:fill="FFFFFF"/>
+              </w:rPr>
+              <w:t>_not_father</w:t>
+            </w:r>
+            <w:r>
+              <w:rPr>
+                <w:color w:val="FFC000"/>
+                <w:shd w:val="clear" w:color="auto" w:fill="FFFFFF"/>
+              </w:rPr>
+              <w:t>)</w:t>
+            </w:r>
+            <w:r>
+              <w:rPr>
+                <w:color w:val="92D050"/>
+                <w:shd w:val="clear" w:color="auto" w:fill="FFFFFF"/>
+              </w:rPr>
+              <w:t xml:space="preserve"> </w:t>
+            </w:r>
+            <w:r>
+              <w:rPr>
+                <w:color w:val="FFC000"/>
+                <w:shd w:val="clear" w:color="auto" w:fill="FFFFFF"/>
+              </w:rPr>
+              <w:t>or (</w:t>
+            </w:r>
+            <w:r>
+              <w:rPr>
+                <w:color w:val="92D050"/>
+                <w:shd w:val="clear" w:color="auto" w:fill="FFFFFF"/>
+              </w:rPr>
+              <w:t>minor_children and husband_not_father is None</w:t>
+            </w:r>
+            <w:r>
+              <w:rPr>
+                <w:color w:val="FFC000"/>
+                <w:shd w:val="clear" w:color="auto" w:fill="FFFFFF"/>
+              </w:rPr>
+              <w:t>) or (</w:t>
+            </w:r>
+            <w:r>
+              <w:rPr>
+                <w:color w:val="92D050"/>
+                <w:shd w:val="clear" w:color="auto" w:fill="FFFFFF"/>
+              </w:rPr>
+              <w:t>minor_children and not husband_not_father and wife_is_pregnant == 'not husband'</w:t>
+            </w:r>
+            <w:r>
+              <w:rPr>
+                <w:color w:val="FFC000"/>
+                <w:shd w:val="clear" w:color="auto" w:fill="FFFFFF"/>
+              </w:rPr>
+              <w:t>) or (</w:t>
+            </w:r>
+            <w:r>
+              <w:rPr>
+                <w:color w:val="92D050"/>
+                <w:shd w:val="clear" w:color="auto" w:fill="FFFFFF"/>
+              </w:rPr>
+              <w:t>not minor_children and wife_is_pregnant == 'not husband'</w:t>
+            </w:r>
+            <w:r>
+              <w:rPr>
+                <w:color w:val="FFC000"/>
+                <w:shd w:val="clear" w:color="auto" w:fill="FFFFFF"/>
+              </w:rPr>
+              <w:t>)</w:t>
             </w:r>
             <w:r>
               <w:rPr>
                 <w:color w:val="FF0000"/>
                 <w:shd w:val="clear" w:color="auto" w:fill="FFFFFF"/>
               </w:rPr>
-              <w:t xml:space="preserve">) and </w:t>
-            </w:r>
-            <w:r>
-              <w:rPr>
-                <w:color w:val="FF0000"/>
-                <w:shd w:val="clear" w:color="auto" w:fill="FFFFFF"/>
-              </w:rPr>
-              <w:t>(</w:t>
-            </w:r>
-            <w:r>
-              <w:rPr>
-                <w:color w:val="FFC000"/>
-                <w:shd w:val="clear" w:color="auto" w:fill="FFFFFF"/>
-              </w:rPr>
-              <w:t>(</w:t>
-            </w:r>
-            <w:r>
-              <w:rPr>
-                <w:color w:val="92D050"/>
-                <w:shd w:val="clear" w:color="auto" w:fill="FFFFFF"/>
-              </w:rPr>
-              <w:t>minor_children an</w:t>
-            </w:r>
-            <w:r>
-              <w:rPr>
-                <w:color w:val="92D050"/>
-                <w:shd w:val="clear" w:color="auto" w:fill="FFFFFF"/>
-              </w:rPr>
-              <w:t>d husban</w:t>
-            </w:r>
-            <w:r>
-              <w:rPr>
-                <w:color w:val="92D050"/>
-                <w:shd w:val="clear" w:color="auto" w:fill="FFFFFF"/>
-              </w:rPr>
-              <w:t>d</w:t>
-            </w:r>
-            <w:r>
-              <w:rPr>
-                <w:color w:val="92D050"/>
-                <w:shd w:val="clear" w:color="auto" w:fill="FFFFFF"/>
-              </w:rPr>
-              <w:t>_not_father</w:t>
-            </w:r>
-            <w:r>
-              <w:rPr>
-                <w:color w:val="FFC000"/>
-                <w:shd w:val="clear" w:color="auto" w:fill="FFFFFF"/>
-              </w:rPr>
-              <w:t>)</w:t>
-            </w:r>
-            <w:r>
-              <w:rPr>
-                <w:color w:val="92D050"/>
-                <w:shd w:val="clear" w:color="auto" w:fill="FFFFFF"/>
-              </w:rPr>
-              <w:t xml:space="preserve"> </w:t>
-            </w:r>
-            <w:r>
-              <w:rPr>
-                <w:color w:val="FFC000"/>
-                <w:shd w:val="clear" w:color="auto" w:fill="FFFFFF"/>
-              </w:rPr>
-              <w:t>or (</w:t>
-            </w:r>
-            <w:r>
-              <w:rPr>
-                <w:color w:val="92D050"/>
-                <w:shd w:val="clear" w:color="auto" w:fill="FFFFFF"/>
-              </w:rPr>
-              <w:t>minor_children and husband_not_father is None</w:t>
-            </w:r>
-            <w:r>
-              <w:rPr>
-                <w:color w:val="FFC000"/>
-                <w:shd w:val="clear" w:color="auto" w:fill="FFFFFF"/>
-              </w:rPr>
-              <w:t>) or (</w:t>
-            </w:r>
-            <w:r>
-              <w:rPr>
-                <w:color w:val="92D050"/>
-                <w:shd w:val="clear" w:color="auto" w:fill="FFFFFF"/>
-              </w:rPr>
-              <w:t>minor_children and not husband_not_father and wife_is_pregnant == 'not husband'</w:t>
-            </w:r>
-            <w:r>
-              <w:rPr>
-                <w:color w:val="FFC000"/>
-                <w:shd w:val="clear" w:color="auto" w:fill="FFFFFF"/>
-              </w:rPr>
-              <w:t>) or (</w:t>
-            </w:r>
-            <w:r>
-              <w:rPr>
-                <w:color w:val="92D050"/>
-                <w:shd w:val="clear" w:color="auto" w:fill="FFFFFF"/>
-              </w:rPr>
-              <w:t>not minor_children and wife_is_pregnant == 'not husband'</w:t>
-            </w:r>
-            <w:r>
-              <w:rPr>
-                <w:color w:val="FFC000"/>
-                <w:shd w:val="clear" w:color="auto" w:fill="FFFFFF"/>
-              </w:rPr>
-              <w:t>)</w:t>
-            </w:r>
-            <w:r>
-              <w:rPr>
-                <w:color w:val="FF0000"/>
-                <w:shd w:val="clear" w:color="auto" w:fill="FFFFFF"/>
-              </w:rPr>
               <w:t>) %}</w:t>
             </w:r>
           </w:p>
@@ -5312,7 +5339,6 @@
             </w:pPr>
             <w:proofErr w:type="spellStart"/>
             <w:r>
-              <w:lastRenderedPageBreak/>
               <w:t>paternity_step</w:t>
             </w:r>
             <w:proofErr w:type="spellEnd"/>
@@ -5471,7 +5497,11 @@
               </w:rPr>
             </w:pPr>
             <w:r>
-              <w:t>{{ get_help.subject }}</w:t>
+              <w:t>{{ get_help.subje</w:t>
+            </w:r>
+            <w:r>
+              <w:lastRenderedPageBreak/>
+              <w:t>ct }}</w:t>
             </w:r>
           </w:p>
         </w:tc>
@@ -5502,7 +5532,11 @@
               <w:spacing w:before="100" w:after="100"/>
             </w:pPr>
             <w:r>
-              <w:t>{{p (include_docx_template("docassemble.AKA2JBranding:get_help_content.docx")) }}</w:t>
+              <w:t>{{p (include_docx_template("docassemble.AKA2JBranding:get_help_cont</w:t>
+            </w:r>
+            <w:r>
+              <w:lastRenderedPageBreak/>
+              <w:t>ent.docx")) }}</w:t>
             </w:r>
           </w:p>
         </w:tc>
@@ -5539,6 +5573,13 @@
       <w:r>
         <w:continuationSeparator/>
       </w:r>
+    </w:p>
+  </w:endnote>
+  <w:endnote w:type="continuationNotice" w:id="1">
+    <w:p>
+      <w:pPr>
+        <w:spacing w:before="0" w:after="0"/>
+      </w:pPr>
     </w:p>
   </w:endnote>
 </w:endnotes>
@@ -5601,7 +5642,10 @@
       <w:spacing w:before="100" w:afterAutospacing="0"/>
     </w:pPr>
     <w:r>
-      <w:t>May 5</w:t>
+      <w:t xml:space="preserve">May </w:t>
+    </w:r>
+    <w:r>
+      <w:t>7</w:t>
     </w:r>
     <w:r>
       <w:t>, 2026</w:t>
@@ -5624,6 +5668,13 @@
       <w:r>
         <w:continuationSeparator/>
       </w:r>
+    </w:p>
+  </w:footnote>
+  <w:footnote w:type="continuationNotice" w:id="1">
+    <w:p>
+      <w:pPr>
+        <w:spacing w:before="0" w:after="0"/>
+      </w:pPr>
     </w:p>
   </w:footnote>
 </w:footnotes>

</xml_diff>

<commit_message>
jinja 2 doesn't like variable is None, has to be all lower case none for paternity step in divorce docx, fixed test and branding package for case in 2 states improper service and default
</commit_message>
<xml_diff>
--- a/docassemble/RespondingCaseToEndYourMarriageActionPlan/data/templates/responding_ending_marriage_action_plan.docx
+++ b/docassemble/RespondingCaseToEndYourMarriageActionPlan/data/templates/responding_ending_marriage_action_plan.docx
@@ -1,6 +1,6 @@
 
 <file path=word/document.xml><?xml version="1.0" encoding="utf-8"?>
-<w:document xmlns:wpc="http://schemas.microsoft.com/office/word/2010/wordprocessingCanvas" xmlns:cx="http://schemas.microsoft.com/office/drawing/2014/chartex" xmlns:cx1="http://schemas.microsoft.com/office/drawing/2015/9/8/chartex" xmlns:cx2="http://schemas.microsoft.com/office/drawing/2015/10/21/chartex" xmlns:cx3="http://schemas.microsoft.com/office/drawing/2016/5/9/chartex" xmlns:cx4="http://schemas.microsoft.com/office/drawing/2016/5/10/chartex" xmlns:cx5="http://schemas.microsoft.com/office/drawing/2016/5/11/chartex" xmlns:cx6="http://schemas.microsoft.com/office/drawing/2016/5/12/chartex" xmlns:cx7="http://schemas.microsoft.com/office/drawing/2016/5/13/chartex" xmlns:cx8="http://schemas.microsoft.com/office/drawing/2016/5/14/chartex" xmlns:mc="http://schemas.openxmlformats.org/markup-compatibility/2006" xmlns:aink="http://schemas.microsoft.com/office/drawing/2016/ink" xmlns:am3d="http://schemas.microsoft.com/office/drawing/2017/model3d" xmlns:o="urn:schemas-microsoft-com:office:office" xmlns:r="http://schemas.openxmlformats.org/officeDocument/2006/relationships" xmlns:m="http://schemas.openxmlformats.org/officeDocument/2006/math" xmlns:v="urn:schemas-microsoft-com:vml" xmlns:wp14="http://schemas.microsoft.com/office/word/2010/wordprocessingDrawing" xmlns:wp="http://schemas.openxmlformats.org/drawingml/2006/wordprocessingDrawing" xmlns:w10="urn:schemas-microsoft-com:office:word" xmlns:w="http://schemas.openxmlformats.org/wordprocessingml/2006/main" xmlns:w14="http://schemas.microsoft.com/office/word/2010/wordml" xmlns:w15="http://schemas.microsoft.com/office/word/2012/wordml" xmlns:w16cex="http://schemas.microsoft.com/office/word/2018/wordml/cex" xmlns:w16cid="http://schemas.microsoft.com/office/word/2016/wordml/cid" xmlns:w16="http://schemas.microsoft.com/office/word/2018/wordml" xmlns:w16sdtdh="http://schemas.microsoft.com/office/word/2020/wordml/sdtdatahash" xmlns:w16se="http://schemas.microsoft.com/office/word/2015/wordml/symex" xmlns:wpg="http://schemas.microsoft.com/office/word/2010/wordprocessingGroup" xmlns:wpi="http://schemas.microsoft.com/office/word/2010/wordprocessingInk" xmlns:wne="http://schemas.microsoft.com/office/word/2006/wordml" xmlns:wps="http://schemas.microsoft.com/office/word/2010/wordprocessingShape" mc:Ignorable="w14 w15 w16se w16cid w16 w16cex w16sdtdh wp14">
+<w:document xmlns:wpc="http://schemas.microsoft.com/office/word/2010/wordprocessingCanvas" xmlns:mc="http://schemas.openxmlformats.org/markup-compatibility/2006" xmlns:o="urn:schemas-microsoft-com:office:office" xmlns:r="http://schemas.openxmlformats.org/officeDocument/2006/relationships" xmlns:m="http://schemas.openxmlformats.org/officeDocument/2006/math" xmlns:v="urn:schemas-microsoft-com:vml" xmlns:wp14="http://schemas.microsoft.com/office/word/2010/wordprocessingDrawing" xmlns:wp="http://schemas.openxmlformats.org/drawingml/2006/wordprocessingDrawing" xmlns:w10="urn:schemas-microsoft-com:office:word" xmlns:w="http://schemas.openxmlformats.org/wordprocessingml/2006/main" xmlns:w14="http://schemas.microsoft.com/office/word/2010/wordml" xmlns:wpg="http://schemas.microsoft.com/office/word/2010/wordprocessingGroup" xmlns:wpi="http://schemas.microsoft.com/office/word/2010/wordprocessingInk" xmlns:wne="http://schemas.microsoft.com/office/word/2006/wordml" xmlns:wps="http://schemas.microsoft.com/office/word/2010/wordprocessingShape" mc:Ignorable="w14 wp14">
   <w:body>
     <w:p>
       <w:pPr>
@@ -461,7 +461,7 @@
                     </wp:anchor>
                   </w:drawing>
                 </mc:Choice>
-                <mc:Fallback>
+                <mc:Fallback xmlns:w16se="http://schemas.microsoft.com/office/word/2015/wordml/symex" xmlns:w16sdtdh="http://schemas.microsoft.com/office/word/2020/wordml/sdtdatahash" xmlns:w16="http://schemas.microsoft.com/office/word/2018/wordml" xmlns:w16cid="http://schemas.microsoft.com/office/word/2016/wordml/cid" xmlns:w16cex="http://schemas.microsoft.com/office/word/2018/wordml/cex" xmlns:w15="http://schemas.microsoft.com/office/word/2012/wordml" xmlns:am3d="http://schemas.microsoft.com/office/drawing/2017/model3d" xmlns:aink="http://schemas.microsoft.com/office/drawing/2016/ink" xmlns:cx8="http://schemas.microsoft.com/office/drawing/2016/5/14/chartex" xmlns:cx7="http://schemas.microsoft.com/office/drawing/2016/5/13/chartex" xmlns:cx6="http://schemas.microsoft.com/office/drawing/2016/5/12/chartex" xmlns:cx5="http://schemas.microsoft.com/office/drawing/2016/5/11/chartex" xmlns:cx4="http://schemas.microsoft.com/office/drawing/2016/5/10/chartex" xmlns:cx3="http://schemas.microsoft.com/office/drawing/2016/5/9/chartex" xmlns:cx2="http://schemas.microsoft.com/office/drawing/2015/10/21/chartex" xmlns:cx1="http://schemas.microsoft.com/office/drawing/2015/9/8/chartex" xmlns:cx="http://schemas.microsoft.com/office/drawing/2014/chartex">
                   <w:pict>
                     <v:group w14:anchorId="39EA2F09" id="Group 1" o:spid="_x0000_s1026" style="position:absolute;margin-left:0;margin-top:13.25pt;width:59.8pt;height:54.75pt;z-index:-503316478;mso-wrap-distance-right:25.2pt" coordsize="0,0" o:gfxdata="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">
                       <v:group id="Group 2" o:spid="_x0000_s1027" style="position:absolute;width:591120;height:694800" coordsize="0,0" o:gfxdata="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">
@@ -560,7 +560,23 @@
               <w:spacing w:before="0" w:after="0"/>
             </w:pPr>
             <w:r>
-              <w:t>{%tr if user_need == 'answer divorce' and type_of_response['stay married'] %}</w:t>
+              <w:t>{%</w:t>
+            </w:r>
+            <w:proofErr w:type="spellStart"/>
+            <w:r>
+              <w:t>tr</w:t>
+            </w:r>
+            <w:proofErr w:type="spellEnd"/>
+            <w:r>
+              <w:t xml:space="preserve"> if </w:t>
+            </w:r>
+            <w:proofErr w:type="spellStart"/>
+            <w:r>
+              <w:t>user_need</w:t>
+            </w:r>
+            <w:proofErr w:type="spellEnd"/>
+            <w:r>
+              <w:t xml:space="preserve"> == 'answer divorce' and type_of_response['stay married'] %}</w:t>
             </w:r>
           </w:p>
         </w:tc>
@@ -651,6 +667,9 @@
             <w:r>
               <w:t>{{p (include_docx_template("docassemble.AKA2JBranding:want_help_to_agree_content.docx")) }}</w:t>
             </w:r>
+            <w:r>
+              <w:t xml:space="preserve"> </w:t>
+            </w:r>
           </w:p>
         </w:tc>
       </w:tr>
@@ -955,11 +974,7 @@
               <w:spacing w:before="0" w:after="0"/>
             </w:pPr>
             <w:r>
-              <w:t>{%tr if type_of_response['improper service'] or type_of_response['def</w:t>
-            </w:r>
-            <w:r>
-              <w:lastRenderedPageBreak/>
-              <w:t>ault'] %}</w:t>
+              <w:t>{%tr if type_of_response['improper service'] or type_of_response['default'] %}</w:t>
             </w:r>
           </w:p>
         </w:tc>
@@ -988,7 +1003,6 @@
             </w:pPr>
             <w:proofErr w:type="spellStart"/>
             <w:r>
-              <w:lastRenderedPageBreak/>
               <w:t>proper_service_step</w:t>
             </w:r>
             <w:proofErr w:type="spellEnd"/>
@@ -1024,6 +1038,7 @@
             </w:r>
             <w:proofErr w:type="spellStart"/>
             <w:r>
+              <w:lastRenderedPageBreak/>
               <w:t>proper_service_step</w:t>
             </w:r>
             <w:r>
@@ -1062,6 +1077,7 @@
               <w:spacing w:before="100" w:after="100"/>
             </w:pPr>
             <w:r>
+              <w:lastRenderedPageBreak/>
               <w:t>{{p (include_docx_template("</w:t>
             </w:r>
             <w:r>
@@ -1104,6 +1120,7 @@
               </w:rPr>
             </w:pPr>
             <w:r>
+              <w:lastRenderedPageBreak/>
               <w:t>{%tr endif %}</w:t>
             </w:r>
           </w:p>
@@ -1689,74 +1706,62 @@
               <w:rPr>
                 <w:color w:val="FF0000"/>
               </w:rPr>
-              <w:t xml:space="preserve">{%tr if user_need == 'answer divorce' and case_type == 'legal </w:t>
+              <w:t xml:space="preserve">{%tr if user_need == 'answer divorce' and case_type == 'legal separation' and not </w:t>
+            </w:r>
+            <w:r>
+              <w:rPr>
+                <w:color w:val="FFC000"/>
+              </w:rPr>
+              <w:t>(</w:t>
+            </w:r>
+            <w:r>
+              <w:rPr>
+                <w:color w:val="92D050"/>
+              </w:rPr>
+              <w:t xml:space="preserve">type_of_response[‘case in 2 states’] and </w:t>
+            </w:r>
+            <w:r>
+              <w:rPr>
+                <w:color w:val="92D050"/>
+              </w:rPr>
+              <w:lastRenderedPageBreak/>
+              <w:t>stage_of_other_case == ‘ended with order’</w:t>
+            </w:r>
+            <w:r>
+              <w:rPr>
+                <w:color w:val="FFC000"/>
+              </w:rPr>
+              <w:t>)</w:t>
             </w:r>
             <w:r>
               <w:rPr>
                 <w:color w:val="FF0000"/>
               </w:rPr>
-              <w:lastRenderedPageBreak/>
-              <w:t xml:space="preserve">separation' and </w:t>
+              <w:t xml:space="preserve"> and not </w:t>
+            </w:r>
+            <w:r>
+              <w:rPr>
+                <w:color w:val="FFC000"/>
+              </w:rPr>
+              <w:t>(</w:t>
+            </w:r>
+            <w:r>
+              <w:rPr>
+                <w:color w:val="92D050"/>
+              </w:rPr>
+              <w:t>type_of_response[‘default’] and stage_of_default == ‘judgment entered’</w:t>
+            </w:r>
+            <w:r>
+              <w:rPr>
+                <w:color w:val="FFC000"/>
+              </w:rPr>
+              <w:t xml:space="preserve">) </w:t>
             </w:r>
             <w:r>
               <w:rPr>
                 <w:color w:val="FF0000"/>
               </w:rPr>
-              <w:t xml:space="preserve">not </w:t>
-            </w:r>
-            <w:r>
-              <w:rPr>
-                <w:color w:val="FFC000"/>
-              </w:rPr>
-              <w:t>(</w:t>
-            </w:r>
-            <w:r>
-              <w:rPr>
-                <w:color w:val="92D050"/>
-              </w:rPr>
-              <w:t>type_of_response[‘case in 2 states’] and stage_of_other_case == ‘ended with order’</w:t>
-            </w:r>
-            <w:r>
-              <w:rPr>
-                <w:color w:val="FFC000"/>
-              </w:rPr>
-              <w:t>)</w:t>
-            </w:r>
-            <w:r>
-              <w:rPr>
-                <w:color w:val="FF0000"/>
-              </w:rPr>
-              <w:t xml:space="preserve"> and not </w:t>
-            </w:r>
-            <w:r>
-              <w:rPr>
-                <w:color w:val="FFC000"/>
-              </w:rPr>
-              <w:t>(</w:t>
-            </w:r>
-            <w:r>
-              <w:rPr>
-                <w:color w:val="92D050"/>
-              </w:rPr>
-              <w:t>type_of_response[‘default’] and stage_of_default == ‘judgment entered’</w:t>
-            </w:r>
-            <w:r>
-              <w:rPr>
-                <w:color w:val="FFC000"/>
-              </w:rPr>
-              <w:t xml:space="preserve">) </w:t>
-            </w:r>
-            <w:r>
-              <w:rPr>
-                <w:color w:val="FF0000"/>
-              </w:rPr>
-              <w:t xml:space="preserve">and </w:t>
-            </w:r>
-            <w:r>
-              <w:rPr>
-                <w:color w:val="FF0000"/>
-              </w:rPr>
-              <w:t>want_legal_separation == 'unsure' %}</w:t>
+              <w:t>and want_legal_separation == 'unsure' %}</w:t>
             </w:r>
           </w:p>
         </w:tc>
@@ -1970,11 +1975,7 @@
               <w:pStyle w:val="Body"/>
             </w:pPr>
             <w:r>
-              <w:t xml:space="preserve">Remember, either you or your spouse can turn a legal separation into </w:t>
-            </w:r>
-            <w:r>
-              <w:lastRenderedPageBreak/>
-              <w:t>a divorce at any time</w:t>
+              <w:t>Remember, either you or your spouse can turn a legal separation into a divorce at any time</w:t>
             </w:r>
             <w:r>
               <w:t>:</w:t>
@@ -2003,7 +2004,11 @@
               <w:ind w:left="404"/>
             </w:pPr>
             <w:r>
-              <w:t xml:space="preserve">If you decide you do not want a legal separation, check the box telling the court “I do not agree to a legal separation because I want the marriage to end in a divorce” in the “Counterclaims” section of your </w:t>
+              <w:t xml:space="preserve">If you decide you do not want a legal separation, check the box </w:t>
+            </w:r>
+            <w:r>
+              <w:lastRenderedPageBreak/>
+              <w:t xml:space="preserve">telling the court “I do not agree to a legal separation because I want the marriage to end in a divorce” in the “Counterclaims” section of your </w:t>
             </w:r>
             <w:r>
               <w:rPr>
@@ -2336,6 +2341,7 @@
               </w:rPr>
               <w:t>) or (</w:t>
             </w:r>
+            <w:proofErr w:type="spellStart"/>
             <w:r>
               <w:rPr>
                 <w:color w:val="34A853"/>
@@ -2344,6 +2350,7 @@
               </w:rPr>
               <w:t>user_need</w:t>
             </w:r>
+            <w:proofErr w:type="spellEnd"/>
             <w:r>
               <w:rPr>
                 <w:color w:val="FF9900"/>
@@ -2367,6 +2374,7 @@
               </w:rPr>
               <w:t xml:space="preserve"> and (</w:t>
             </w:r>
+            <w:proofErr w:type="spellStart"/>
             <w:r>
               <w:rPr>
                 <w:color w:val="34A853"/>
@@ -2377,10 +2385,27 @@
             </w:r>
             <w:r>
               <w:rPr>
+                <w:color w:val="34A853"/>
                 <w:sz w:val="20"/>
                 <w:szCs w:val="20"/>
               </w:rPr>
-              <w:t xml:space="preserve">['None'] </w:t>
+              <w:t>.all_false</w:t>
+            </w:r>
+            <w:proofErr w:type="spellEnd"/>
+            <w:r>
+              <w:rPr>
+                <w:color w:val="34A853"/>
+                <w:sz w:val="20"/>
+                <w:szCs w:val="20"/>
+              </w:rPr>
+              <w:t>()</w:t>
+            </w:r>
+            <w:r>
+              <w:rPr>
+                <w:sz w:val="20"/>
+                <w:szCs w:val="20"/>
+              </w:rPr>
+              <w:t xml:space="preserve"> </w:t>
             </w:r>
             <w:r>
               <w:rPr>
@@ -2434,7 +2459,23 @@
                 <w:sz w:val="20"/>
                 <w:szCs w:val="20"/>
               </w:rPr>
-              <w:t>'ak custody case'</w:t>
+              <w:t>'</w:t>
+            </w:r>
+            <w:proofErr w:type="spellStart"/>
+            <w:r>
+              <w:rPr>
+                <w:sz w:val="20"/>
+                <w:szCs w:val="20"/>
+              </w:rPr>
+              <w:t>ak</w:t>
+            </w:r>
+            <w:proofErr w:type="spellEnd"/>
+            <w:r>
+              <w:rPr>
+                <w:sz w:val="20"/>
+                <w:szCs w:val="20"/>
+              </w:rPr>
+              <w:t xml:space="preserve"> custody case'</w:t>
             </w:r>
             <w:r>
               <w:rPr>
@@ -2661,7 +2702,7 @@
                 <w:sz w:val="20"/>
                 <w:szCs w:val="20"/>
               </w:rPr>
-              <w:t>response_to_complaint in(</w:t>
+              <w:t>response_to_complaint in('</w:t>
             </w:r>
             <w:r>
               <w:rPr>
@@ -2669,7 +2710,7 @@
                 <w:sz w:val="20"/>
                 <w:szCs w:val="20"/>
               </w:rPr>
-              <w:t>'</w:t>
+              <w:t>agree</w:t>
             </w:r>
             <w:r>
               <w:rPr>
@@ -2677,7 +2718,15 @@
                 <w:sz w:val="20"/>
                 <w:szCs w:val="20"/>
               </w:rPr>
-              <w:t>agree</w:t>
+              <w:t xml:space="preserve">', 'some') </w:t>
+            </w:r>
+            <w:r>
+              <w:rPr>
+                <w:color w:val="9900FF"/>
+                <w:sz w:val="20"/>
+                <w:szCs w:val="20"/>
+              </w:rPr>
+              <w:t>or</w:t>
             </w:r>
             <w:r>
               <w:rPr>
@@ -2685,7 +2734,15 @@
                 <w:sz w:val="20"/>
                 <w:szCs w:val="20"/>
               </w:rPr>
-              <w:t>'</w:t>
+              <w:t xml:space="preserve"> </w:t>
+            </w:r>
+            <w:r>
+              <w:rPr>
+                <w:color w:val="7030A0"/>
+                <w:sz w:val="20"/>
+                <w:szCs w:val="20"/>
+              </w:rPr>
+              <w:t>(</w:t>
             </w:r>
             <w:r>
               <w:rPr>
@@ -2693,56 +2750,24 @@
                 <w:sz w:val="20"/>
                 <w:szCs w:val="20"/>
               </w:rPr>
-              <w:t xml:space="preserve">, 'some') </w:t>
-            </w:r>
+              <w:t xml:space="preserve">response_to_complaint == 'no' and </w:t>
+            </w:r>
+            <w:proofErr w:type="spellStart"/>
+            <w:r>
+              <w:rPr>
+                <w:color w:val="6AA84F"/>
+                <w:sz w:val="20"/>
+                <w:szCs w:val="20"/>
+              </w:rPr>
+              <w:t>want_help_to_agree</w:t>
+            </w:r>
+            <w:proofErr w:type="spellEnd"/>
             <w:r>
               <w:rPr>
                 <w:color w:val="9900FF"/>
                 <w:sz w:val="20"/>
                 <w:szCs w:val="20"/>
               </w:rPr>
-              <w:t>or</w:t>
-            </w:r>
-            <w:r>
-              <w:rPr>
-                <w:color w:val="6AA84F"/>
-                <w:sz w:val="20"/>
-                <w:szCs w:val="20"/>
-              </w:rPr>
-              <w:t xml:space="preserve"> </w:t>
-            </w:r>
-            <w:r>
-              <w:rPr>
-                <w:color w:val="7030A0"/>
-                <w:sz w:val="20"/>
-                <w:szCs w:val="20"/>
-              </w:rPr>
-              <w:t>(</w:t>
-            </w:r>
-            <w:r>
-              <w:rPr>
-                <w:color w:val="6AA84F"/>
-                <w:sz w:val="20"/>
-                <w:szCs w:val="20"/>
-              </w:rPr>
-              <w:t xml:space="preserve">response_to_complaint == 'no' and </w:t>
-            </w:r>
-            <w:proofErr w:type="spellStart"/>
-            <w:r>
-              <w:rPr>
-                <w:color w:val="6AA84F"/>
-                <w:sz w:val="20"/>
-                <w:szCs w:val="20"/>
-              </w:rPr>
-              <w:t>want_help_to_agree</w:t>
-            </w:r>
-            <w:proofErr w:type="spellEnd"/>
-            <w:r>
-              <w:rPr>
-                <w:color w:val="9900FF"/>
-                <w:sz w:val="20"/>
-                <w:szCs w:val="20"/>
-              </w:rPr>
               <w:t>)</w:t>
             </w:r>
             <w:r>
@@ -2782,7 +2807,23 @@
                 <w:sz w:val="20"/>
                 <w:szCs w:val="20"/>
               </w:rPr>
-              <w:t>'ak divorce case'</w:t>
+              <w:t>'</w:t>
+            </w:r>
+            <w:proofErr w:type="spellStart"/>
+            <w:r>
+              <w:rPr>
+                <w:sz w:val="20"/>
+                <w:szCs w:val="20"/>
+              </w:rPr>
+              <w:t>ak</w:t>
+            </w:r>
+            <w:proofErr w:type="spellEnd"/>
+            <w:r>
+              <w:rPr>
+                <w:sz w:val="20"/>
+                <w:szCs w:val="20"/>
+              </w:rPr>
+              <w:t xml:space="preserve"> divorce case'</w:t>
             </w:r>
             <w:r>
               <w:rPr>
@@ -2835,7 +2876,6 @@
                 <w:sz w:val="20"/>
                 <w:szCs w:val="20"/>
               </w:rPr>
-              <w:lastRenderedPageBreak/>
               <w:t>want_help_to_agree</w:t>
             </w:r>
             <w:proofErr w:type="spellEnd"/>
@@ -2886,7 +2926,6 @@
             </w:pPr>
             <w:proofErr w:type="spellStart"/>
             <w:r>
-              <w:lastRenderedPageBreak/>
               <w:t>want_help_to_agree_step</w:t>
             </w:r>
             <w:proofErr w:type="spellEnd"/>
@@ -2928,7 +2967,11 @@
               <w:t>_</w:t>
             </w:r>
             <w:r>
-              <w:t>step.subject</w:t>
+              <w:t>step.su</w:t>
+            </w:r>
+            <w:r>
+              <w:lastRenderedPageBreak/>
+              <w:t>bject</w:t>
             </w:r>
             <w:proofErr w:type="spellEnd"/>
             <w:r>
@@ -2991,6 +3034,7 @@
               <w:pStyle w:val="Body"/>
             </w:pPr>
             <w:r>
+              <w:lastRenderedPageBreak/>
               <w:t>{%tr endif %}</w:t>
             </w:r>
           </w:p>
@@ -3069,13 +3113,7 @@
               <w:rPr>
                 <w:color w:val="FF0000"/>
               </w:rPr>
-              <w:t>) and not</w:t>
-            </w:r>
-            <w:r>
-              <w:rPr>
-                <w:color w:val="FF0000"/>
-              </w:rPr>
-              <w:t>(</w:t>
+              <w:t>) and not(</w:t>
             </w:r>
             <w:r>
               <w:rPr>
@@ -3372,11 +3410,7 @@
             </w:pPr>
             <w:bookmarkStart w:id="2" w:name="_Hlk226106692"/>
             <w:r>
-              <w:t xml:space="preserve">{{ </w:t>
-            </w:r>
-            <w:r>
-              <w:lastRenderedPageBreak/>
-              <w:t>dismiss_step.subject }}</w:t>
+              <w:t>{{ dismiss_step.subject }}</w:t>
             </w:r>
           </w:p>
         </w:tc>
@@ -3410,7 +3444,6 @@
               <w:spacing w:before="240" w:after="100"/>
             </w:pPr>
             <w:r>
-              <w:lastRenderedPageBreak/>
               <w:t>{{p (include_docx_template("docassemble.AKA2JBranding:dismiss_content.docx")) }}</w:t>
             </w:r>
           </w:p>
@@ -3442,7 +3475,6 @@
               <w:spacing w:before="0" w:after="0"/>
             </w:pPr>
             <w:r>
-              <w:lastRenderedPageBreak/>
               <w:t>{%tr endif %}</w:t>
             </w:r>
           </w:p>
@@ -3497,7 +3529,11 @@
               <w:spacing w:before="0" w:after="0"/>
             </w:pPr>
             <w:r>
-              <w:t>{%tr if stage_of_default == 'judgment entered' %}</w:t>
+              <w:t xml:space="preserve">{%tr if stage_of_default == </w:t>
+            </w:r>
+            <w:r>
+              <w:lastRenderedPageBreak/>
+              <w:t>'judgment entered' %}</w:t>
             </w:r>
           </w:p>
         </w:tc>
@@ -3523,6 +3559,7 @@
             </w:pPr>
             <w:proofErr w:type="spellStart"/>
             <w:r>
+              <w:lastRenderedPageBreak/>
               <w:t>learn_set_aside_step</w:t>
             </w:r>
             <w:proofErr w:type="spellEnd"/>
@@ -3558,6 +3595,7 @@
                 <w:rFonts w:eastAsia="Calibri"/>
                 <w:shd w:val="clear" w:color="auto" w:fill="FFFFFF"/>
               </w:rPr>
+              <w:lastRenderedPageBreak/>
               <w:t xml:space="preserve">{{ </w:t>
             </w:r>
             <w:proofErr w:type="spellStart"/>
@@ -4067,7 +4105,6 @@
             </w:r>
             <w:proofErr w:type="spellStart"/>
             <w:r>
-              <w:lastRenderedPageBreak/>
               <w:t>truefiling_file_and_serve_step.subject</w:t>
             </w:r>
             <w:proofErr w:type="spellEnd"/>
@@ -4102,7 +4139,6 @@
               <w:pStyle w:val="Body"/>
             </w:pPr>
             <w:r>
-              <w:lastRenderedPageBreak/>
               <w:t>{{p (include_docx_template("docassemble.AKA2JBranding:truefiling_file_and_serve_content.docx")) }}</w:t>
             </w:r>
           </w:p>
@@ -4136,8 +4172,11 @@
               </w:rPr>
             </w:pPr>
             <w:r>
+              <w:t>{{ truefiling_serve</w:t>
+            </w:r>
+            <w:r>
               <w:lastRenderedPageBreak/>
-              <w:t>{{ truefiling_serve_step.subject }}</w:t>
+              <w:t>_step.subject }}</w:t>
             </w:r>
           </w:p>
         </w:tc>
@@ -4168,7 +4207,11 @@
               <w:spacing w:before="280" w:after="0"/>
             </w:pPr>
             <w:r>
-              <w:t>{{p (include_docx_template("docassemble.AKA2JBranding:truefiling_serve_content.docx")) }}</w:t>
+              <w:t>{{p (include_docx_template("docassemble.AKA2JBranding:truefiling_serv</w:t>
+            </w:r>
+            <w:r>
+              <w:lastRenderedPageBreak/>
+              <w:t>e_content.docx")) }}</w:t>
             </w:r>
           </w:p>
         </w:tc>
@@ -4197,6 +4240,7 @@
               <w:pStyle w:val="Body"/>
             </w:pPr>
             <w:r>
+              <w:lastRenderedPageBreak/>
               <w:t>{%tr endif</w:t>
             </w:r>
             <w:r>
@@ -4514,14 +4558,7 @@
               <w:rPr>
                 <w:color w:val="FF0000"/>
               </w:rPr>
-              <w:t xml:space="preserve">{%tr if type_of_response.any_true() and not </w:t>
-            </w:r>
-            <w:r>
-              <w:rPr>
-                <w:color w:val="FF0000"/>
-              </w:rPr>
-              <w:lastRenderedPageBreak/>
-              <w:t>(type_of_response.all_true('stay married', exclusive = True)) %}</w:t>
+              <w:t>{%tr if type_of_response.any_true() and not (type_of_response.all_true('stay married', exclusive = True)) %}</w:t>
             </w:r>
           </w:p>
         </w:tc>
@@ -4591,7 +4628,14 @@
               <w:rPr>
                 <w:rFonts w:eastAsia="Calibri"/>
               </w:rPr>
-              <w:t>.subject</w:t>
+              <w:t>.subje</w:t>
+            </w:r>
+            <w:r>
+              <w:rPr>
+                <w:rFonts w:eastAsia="Calibri"/>
+              </w:rPr>
+              <w:lastRenderedPageBreak/>
+              <w:t>ct</w:t>
             </w:r>
             <w:proofErr w:type="spellEnd"/>
             <w:r>
@@ -4677,6 +4721,7 @@
               <w:pStyle w:val="Body"/>
             </w:pPr>
             <w:r>
+              <w:lastRenderedPageBreak/>
               <w:t>{%tr endif %}</w:t>
             </w:r>
           </w:p>
@@ -5021,11 +5066,7 @@
               </w:rPr>
             </w:pPr>
             <w:r>
-              <w:t xml:space="preserve">{{ </w:t>
-            </w:r>
-            <w:r>
-              <w:lastRenderedPageBreak/>
-              <w:t>answer_domestic_violence_step.subject }}</w:t>
+              <w:t>{{ answer_domestic_violence_step.subject }}</w:t>
             </w:r>
           </w:p>
         </w:tc>
@@ -5055,7 +5096,6 @@
               <w:pStyle w:val="Body"/>
             </w:pPr>
             <w:r>
-              <w:lastRenderedPageBreak/>
               <w:t>{{p (include_docx_template("docassemble.AKA2JBranding:answer_domestic_violence_content.docx")) }}</w:t>
             </w:r>
           </w:p>
@@ -5092,7 +5132,6 @@
               <w:rPr>
                 <w:shd w:val="clear" w:color="auto" w:fill="FFFFFF"/>
               </w:rPr>
-              <w:lastRenderedPageBreak/>
               <w:t>{%tr endif %}</w:t>
             </w:r>
           </w:p>
@@ -5173,7 +5212,15 @@
                 <w:color w:val="FF0000"/>
                 <w:shd w:val="clear" w:color="auto" w:fill="FFFFFF"/>
               </w:rPr>
-              <w:t>type_of_response[‘ak divorce case’] and not type_of_response[‘improper service’] and not (</w:t>
+              <w:t>type_of_response[‘ak divorce case’] and not type_of_response[‘imp</w:t>
+            </w:r>
+            <w:r>
+              <w:rPr>
+                <w:color w:val="FF0000"/>
+                <w:shd w:val="clear" w:color="auto" w:fill="FFFFFF"/>
+              </w:rPr>
+              <w:lastRenderedPageBreak/>
+              <w:t>roper service’] and not (</w:t>
             </w:r>
             <w:r>
               <w:rPr>
@@ -5271,7 +5318,23 @@
                 <w:color w:val="92D050"/>
                 <w:shd w:val="clear" w:color="auto" w:fill="FFFFFF"/>
               </w:rPr>
-              <w:t>minor_children and husband_not_father is None</w:t>
+              <w:t>minor_chil</w:t>
+            </w:r>
+            <w:r>
+              <w:rPr>
+                <w:color w:val="92D050"/>
+                <w:shd w:val="clear" w:color="auto" w:fill="FFFFFF"/>
+              </w:rPr>
+              <w:t>dren and husband_not_father is n</w:t>
+            </w:r>
+            <w:bookmarkStart w:id="4" w:name="_GoBack"/>
+            <w:bookmarkEnd w:id="4"/>
+            <w:r>
+              <w:rPr>
+                <w:color w:val="92D050"/>
+                <w:shd w:val="clear" w:color="auto" w:fill="FFFFFF"/>
+              </w:rPr>
+              <w:t>one</w:t>
             </w:r>
             <w:r>
               <w:rPr>
@@ -5339,6 +5402,7 @@
             </w:pPr>
             <w:proofErr w:type="spellStart"/>
             <w:r>
+              <w:lastRenderedPageBreak/>
               <w:t>paternity_step</w:t>
             </w:r>
             <w:proofErr w:type="spellEnd"/>
@@ -5376,6 +5440,7 @@
               <w:rPr>
                 <w:shd w:val="clear" w:color="auto" w:fill="FFFFFF"/>
               </w:rPr>
+              <w:lastRenderedPageBreak/>
               <w:t>{{ paternity_step.subject }}</w:t>
             </w:r>
           </w:p>
@@ -5497,11 +5562,7 @@
               </w:rPr>
             </w:pPr>
             <w:r>
-              <w:t>{{ get_help.subje</w:t>
-            </w:r>
-            <w:r>
-              <w:lastRenderedPageBreak/>
-              <w:t>ct }}</w:t>
+              <w:t>{{ get_help.subject }}</w:t>
             </w:r>
           </w:p>
         </w:tc>
@@ -5532,11 +5593,7 @@
               <w:spacing w:before="100" w:after="100"/>
             </w:pPr>
             <w:r>
-              <w:t>{{p (include_docx_template("docassemble.AKA2JBranding:get_help_cont</w:t>
-            </w:r>
-            <w:r>
-              <w:lastRenderedPageBreak/>
-              <w:t>ent.docx")) }}</w:t>
+              <w:t>{{p (include_docx_template("docassemble.AKA2JBranding:get_help_content.docx")) }}</w:t>
             </w:r>
           </w:p>
         </w:tc>
@@ -5548,7 +5605,7 @@
       </w:pPr>
     </w:p>
     <w:sectPr>
-      <w:footerReference w:type="default" r:id="rId8"/>
+      <w:footerReference w:type="default" r:id="rId9"/>
       <w:pgSz w:w="12240" w:h="15840"/>
       <w:pgMar w:top="245" w:right="1440" w:bottom="274" w:left="1440" w:header="0" w:footer="720" w:gutter="0"/>
       <w:cols w:space="720"/>
@@ -5560,7 +5617,7 @@
 </file>
 
 <file path=word/endnotes.xml><?xml version="1.0" encoding="utf-8"?>
-<w:endnotes xmlns:wpc="http://schemas.microsoft.com/office/word/2010/wordprocessingCanvas" xmlns:cx="http://schemas.microsoft.com/office/drawing/2014/chartex" xmlns:cx1="http://schemas.microsoft.com/office/drawing/2015/9/8/chartex" xmlns:cx2="http://schemas.microsoft.com/office/drawing/2015/10/21/chartex" xmlns:cx3="http://schemas.microsoft.com/office/drawing/2016/5/9/chartex" xmlns:cx4="http://schemas.microsoft.com/office/drawing/2016/5/10/chartex" xmlns:cx5="http://schemas.microsoft.com/office/drawing/2016/5/11/chartex" xmlns:cx6="http://schemas.microsoft.com/office/drawing/2016/5/12/chartex" xmlns:cx7="http://schemas.microsoft.com/office/drawing/2016/5/13/chartex" xmlns:cx8="http://schemas.microsoft.com/office/drawing/2016/5/14/chartex" xmlns:mc="http://schemas.openxmlformats.org/markup-compatibility/2006" xmlns:aink="http://schemas.microsoft.com/office/drawing/2016/ink" xmlns:am3d="http://schemas.microsoft.com/office/drawing/2017/model3d" xmlns:o="urn:schemas-microsoft-com:office:office" xmlns:r="http://schemas.openxmlformats.org/officeDocument/2006/relationships" xmlns:m="http://schemas.openxmlformats.org/officeDocument/2006/math" xmlns:v="urn:schemas-microsoft-com:vml" xmlns:wp14="http://schemas.microsoft.com/office/word/2010/wordprocessingDrawing" xmlns:wp="http://schemas.openxmlformats.org/drawingml/2006/wordprocessingDrawing" xmlns:w10="urn:schemas-microsoft-com:office:word" xmlns:w="http://schemas.openxmlformats.org/wordprocessingml/2006/main" xmlns:w14="http://schemas.microsoft.com/office/word/2010/wordml" xmlns:w15="http://schemas.microsoft.com/office/word/2012/wordml" xmlns:w16cex="http://schemas.microsoft.com/office/word/2018/wordml/cex" xmlns:w16cid="http://schemas.microsoft.com/office/word/2016/wordml/cid" xmlns:w16="http://schemas.microsoft.com/office/word/2018/wordml" xmlns:w16sdtdh="http://schemas.microsoft.com/office/word/2020/wordml/sdtdatahash" xmlns:w16se="http://schemas.microsoft.com/office/word/2015/wordml/symex" xmlns:wpg="http://schemas.microsoft.com/office/word/2010/wordprocessingGroup" xmlns:wpi="http://schemas.microsoft.com/office/word/2010/wordprocessingInk" xmlns:wne="http://schemas.microsoft.com/office/word/2006/wordml" xmlns:wps="http://schemas.microsoft.com/office/word/2010/wordprocessingShape" mc:Ignorable="w14 w15 w16se w16cid w16 w16cex w16sdtdh wp14">
+<w:endnotes xmlns:wpc="http://schemas.microsoft.com/office/word/2010/wordprocessingCanvas" xmlns:mc="http://schemas.openxmlformats.org/markup-compatibility/2006" xmlns:o="urn:schemas-microsoft-com:office:office" xmlns:r="http://schemas.openxmlformats.org/officeDocument/2006/relationships" xmlns:m="http://schemas.openxmlformats.org/officeDocument/2006/math" xmlns:v="urn:schemas-microsoft-com:vml" xmlns:wp14="http://schemas.microsoft.com/office/word/2010/wordprocessingDrawing" xmlns:wp="http://schemas.openxmlformats.org/drawingml/2006/wordprocessingDrawing" xmlns:w10="urn:schemas-microsoft-com:office:word" xmlns:w="http://schemas.openxmlformats.org/wordprocessingml/2006/main" xmlns:w14="http://schemas.microsoft.com/office/word/2010/wordml" xmlns:wpg="http://schemas.microsoft.com/office/word/2010/wordprocessingGroup" xmlns:wpi="http://schemas.microsoft.com/office/word/2010/wordprocessingInk" xmlns:wne="http://schemas.microsoft.com/office/word/2006/wordml" xmlns:wps="http://schemas.microsoft.com/office/word/2010/wordprocessingShape" mc:Ignorable="w14 wp14">
   <w:endnote w:type="separator" w:id="-1">
     <w:p>
       <w:r>
@@ -5586,7 +5643,7 @@
 </file>
 
 <file path=word/footer1.xml><?xml version="1.0" encoding="utf-8"?>
-<w:ftr xmlns:wpc="http://schemas.microsoft.com/office/word/2010/wordprocessingCanvas" xmlns:cx="http://schemas.microsoft.com/office/drawing/2014/chartex" xmlns:cx1="http://schemas.microsoft.com/office/drawing/2015/9/8/chartex" xmlns:cx2="http://schemas.microsoft.com/office/drawing/2015/10/21/chartex" xmlns:cx3="http://schemas.microsoft.com/office/drawing/2016/5/9/chartex" xmlns:cx4="http://schemas.microsoft.com/office/drawing/2016/5/10/chartex" xmlns:cx5="http://schemas.microsoft.com/office/drawing/2016/5/11/chartex" xmlns:cx6="http://schemas.microsoft.com/office/drawing/2016/5/12/chartex" xmlns:cx7="http://schemas.microsoft.com/office/drawing/2016/5/13/chartex" xmlns:cx8="http://schemas.microsoft.com/office/drawing/2016/5/14/chartex" xmlns:mc="http://schemas.openxmlformats.org/markup-compatibility/2006" xmlns:aink="http://schemas.microsoft.com/office/drawing/2016/ink" xmlns:am3d="http://schemas.microsoft.com/office/drawing/2017/model3d" xmlns:o="urn:schemas-microsoft-com:office:office" xmlns:r="http://schemas.openxmlformats.org/officeDocument/2006/relationships" xmlns:m="http://schemas.openxmlformats.org/officeDocument/2006/math" xmlns:v="urn:schemas-microsoft-com:vml" xmlns:wp14="http://schemas.microsoft.com/office/word/2010/wordprocessingDrawing" xmlns:wp="http://schemas.openxmlformats.org/drawingml/2006/wordprocessingDrawing" xmlns:w10="urn:schemas-microsoft-com:office:word" xmlns:w="http://schemas.openxmlformats.org/wordprocessingml/2006/main" xmlns:w14="http://schemas.microsoft.com/office/word/2010/wordml" xmlns:w15="http://schemas.microsoft.com/office/word/2012/wordml" xmlns:w16cex="http://schemas.microsoft.com/office/word/2018/wordml/cex" xmlns:w16cid="http://schemas.microsoft.com/office/word/2016/wordml/cid" xmlns:w16="http://schemas.microsoft.com/office/word/2018/wordml" xmlns:w16sdtdh="http://schemas.microsoft.com/office/word/2020/wordml/sdtdatahash" xmlns:w16se="http://schemas.microsoft.com/office/word/2015/wordml/symex" xmlns:wpg="http://schemas.microsoft.com/office/word/2010/wordprocessingGroup" xmlns:wpi="http://schemas.microsoft.com/office/word/2010/wordprocessingInk" xmlns:wne="http://schemas.microsoft.com/office/word/2006/wordml" xmlns:wps="http://schemas.microsoft.com/office/word/2010/wordprocessingShape" mc:Ignorable="w14 w15 w16se w16cid w16 w16cex w16sdtdh wp14">
+<w:ftr xmlns:wpc="http://schemas.microsoft.com/office/word/2010/wordprocessingCanvas" xmlns:mc="http://schemas.openxmlformats.org/markup-compatibility/2006" xmlns:o="urn:schemas-microsoft-com:office:office" xmlns:r="http://schemas.openxmlformats.org/officeDocument/2006/relationships" xmlns:m="http://schemas.openxmlformats.org/officeDocument/2006/math" xmlns:v="urn:schemas-microsoft-com:vml" xmlns:wp14="http://schemas.microsoft.com/office/word/2010/wordprocessingDrawing" xmlns:wp="http://schemas.openxmlformats.org/drawingml/2006/wordprocessingDrawing" xmlns:w10="urn:schemas-microsoft-com:office:word" xmlns:w="http://schemas.openxmlformats.org/wordprocessingml/2006/main" xmlns:w14="http://schemas.microsoft.com/office/word/2010/wordml" xmlns:wpg="http://schemas.microsoft.com/office/word/2010/wordprocessingGroup" xmlns:wpi="http://schemas.microsoft.com/office/word/2010/wordprocessingInk" xmlns:wne="http://schemas.microsoft.com/office/word/2006/wordml" xmlns:wps="http://schemas.microsoft.com/office/word/2010/wordprocessingShape" mc:Ignorable="w14 wp14">
   <w:p>
     <w:pPr>
       <w:pStyle w:val="Footer"/>
@@ -5606,7 +5663,7 @@
       <w:rPr>
         <w:noProof/>
       </w:rPr>
-      <w:t>1</w:t>
+      <w:t>9</w:t>
     </w:r>
     <w:r>
       <w:fldChar w:fldCharType="end"/>
@@ -5627,7 +5684,7 @@
       <w:rPr>
         <w:noProof/>
       </w:rPr>
-      <w:t>10</w:t>
+      <w:t>9</w:t>
     </w:r>
     <w:r>
       <w:fldChar w:fldCharType="end"/>
@@ -5655,7 +5712,7 @@
 </file>
 
 <file path=word/footnotes.xml><?xml version="1.0" encoding="utf-8"?>
-<w:footnotes xmlns:wpc="http://schemas.microsoft.com/office/word/2010/wordprocessingCanvas" xmlns:cx="http://schemas.microsoft.com/office/drawing/2014/chartex" xmlns:cx1="http://schemas.microsoft.com/office/drawing/2015/9/8/chartex" xmlns:cx2="http://schemas.microsoft.com/office/drawing/2015/10/21/chartex" xmlns:cx3="http://schemas.microsoft.com/office/drawing/2016/5/9/chartex" xmlns:cx4="http://schemas.microsoft.com/office/drawing/2016/5/10/chartex" xmlns:cx5="http://schemas.microsoft.com/office/drawing/2016/5/11/chartex" xmlns:cx6="http://schemas.microsoft.com/office/drawing/2016/5/12/chartex" xmlns:cx7="http://schemas.microsoft.com/office/drawing/2016/5/13/chartex" xmlns:cx8="http://schemas.microsoft.com/office/drawing/2016/5/14/chartex" xmlns:mc="http://schemas.openxmlformats.org/markup-compatibility/2006" xmlns:aink="http://schemas.microsoft.com/office/drawing/2016/ink" xmlns:am3d="http://schemas.microsoft.com/office/drawing/2017/model3d" xmlns:o="urn:schemas-microsoft-com:office:office" xmlns:r="http://schemas.openxmlformats.org/officeDocument/2006/relationships" xmlns:m="http://schemas.openxmlformats.org/officeDocument/2006/math" xmlns:v="urn:schemas-microsoft-com:vml" xmlns:wp14="http://schemas.microsoft.com/office/word/2010/wordprocessingDrawing" xmlns:wp="http://schemas.openxmlformats.org/drawingml/2006/wordprocessingDrawing" xmlns:w10="urn:schemas-microsoft-com:office:word" xmlns:w="http://schemas.openxmlformats.org/wordprocessingml/2006/main" xmlns:w14="http://schemas.microsoft.com/office/word/2010/wordml" xmlns:w15="http://schemas.microsoft.com/office/word/2012/wordml" xmlns:w16cex="http://schemas.microsoft.com/office/word/2018/wordml/cex" xmlns:w16cid="http://schemas.microsoft.com/office/word/2016/wordml/cid" xmlns:w16="http://schemas.microsoft.com/office/word/2018/wordml" xmlns:w16sdtdh="http://schemas.microsoft.com/office/word/2020/wordml/sdtdatahash" xmlns:w16se="http://schemas.microsoft.com/office/word/2015/wordml/symex" xmlns:wpg="http://schemas.microsoft.com/office/word/2010/wordprocessingGroup" xmlns:wpi="http://schemas.microsoft.com/office/word/2010/wordprocessingInk" xmlns:wne="http://schemas.microsoft.com/office/word/2006/wordml" xmlns:wps="http://schemas.microsoft.com/office/word/2010/wordprocessingShape" mc:Ignorable="w14 w15 w16se w16cid w16 w16cex w16sdtdh wp14">
+<w:footnotes xmlns:wpc="http://schemas.microsoft.com/office/word/2010/wordprocessingCanvas" xmlns:mc="http://schemas.openxmlformats.org/markup-compatibility/2006" xmlns:o="urn:schemas-microsoft-com:office:office" xmlns:r="http://schemas.openxmlformats.org/officeDocument/2006/relationships" xmlns:m="http://schemas.openxmlformats.org/officeDocument/2006/math" xmlns:v="urn:schemas-microsoft-com:vml" xmlns:wp14="http://schemas.microsoft.com/office/word/2010/wordprocessingDrawing" xmlns:wp="http://schemas.openxmlformats.org/drawingml/2006/wordprocessingDrawing" xmlns:w10="urn:schemas-microsoft-com:office:word" xmlns:w="http://schemas.openxmlformats.org/wordprocessingml/2006/main" xmlns:w14="http://schemas.microsoft.com/office/word/2010/wordml" xmlns:wpg="http://schemas.microsoft.com/office/word/2010/wordprocessingGroup" xmlns:wpi="http://schemas.microsoft.com/office/word/2010/wordprocessingInk" xmlns:wne="http://schemas.microsoft.com/office/word/2006/wordml" xmlns:wps="http://schemas.microsoft.com/office/word/2010/wordprocessingShape" mc:Ignorable="w14 wp14">
   <w:footnote w:type="separator" w:id="-1">
     <w:p>
       <w:r>
@@ -5681,8 +5738,8 @@
 </file>
 
 <file path=word/numbering.xml><?xml version="1.0" encoding="utf-8"?>
-<w:numbering xmlns:wpc="http://schemas.microsoft.com/office/word/2010/wordprocessingCanvas" xmlns:cx="http://schemas.microsoft.com/office/drawing/2014/chartex" xmlns:cx1="http://schemas.microsoft.com/office/drawing/2015/9/8/chartex" xmlns:cx2="http://schemas.microsoft.com/office/drawing/2015/10/21/chartex" xmlns:cx3="http://schemas.microsoft.com/office/drawing/2016/5/9/chartex" xmlns:cx4="http://schemas.microsoft.com/office/drawing/2016/5/10/chartex" xmlns:cx5="http://schemas.microsoft.com/office/drawing/2016/5/11/chartex" xmlns:cx6="http://schemas.microsoft.com/office/drawing/2016/5/12/chartex" xmlns:cx7="http://schemas.microsoft.com/office/drawing/2016/5/13/chartex" xmlns:cx8="http://schemas.microsoft.com/office/drawing/2016/5/14/chartex" xmlns:mc="http://schemas.openxmlformats.org/markup-compatibility/2006" xmlns:aink="http://schemas.microsoft.com/office/drawing/2016/ink" xmlns:am3d="http://schemas.microsoft.com/office/drawing/2017/model3d" xmlns:o="urn:schemas-microsoft-com:office:office" xmlns:r="http://schemas.openxmlformats.org/officeDocument/2006/relationships" xmlns:m="http://schemas.openxmlformats.org/officeDocument/2006/math" xmlns:v="urn:schemas-microsoft-com:vml" xmlns:wp14="http://schemas.microsoft.com/office/word/2010/wordprocessingDrawing" xmlns:wp="http://schemas.openxmlformats.org/drawingml/2006/wordprocessingDrawing" xmlns:w10="urn:schemas-microsoft-com:office:word" xmlns:w="http://schemas.openxmlformats.org/wordprocessingml/2006/main" xmlns:w14="http://schemas.microsoft.com/office/word/2010/wordml" xmlns:w15="http://schemas.microsoft.com/office/word/2012/wordml" xmlns:w16cex="http://schemas.microsoft.com/office/word/2018/wordml/cex" xmlns:w16cid="http://schemas.microsoft.com/office/word/2016/wordml/cid" xmlns:w16="http://schemas.microsoft.com/office/word/2018/wordml" xmlns:w16sdtdh="http://schemas.microsoft.com/office/word/2020/wordml/sdtdatahash" xmlns:w16se="http://schemas.microsoft.com/office/word/2015/wordml/symex" xmlns:wpg="http://schemas.microsoft.com/office/word/2010/wordprocessingGroup" xmlns:wpi="http://schemas.microsoft.com/office/word/2010/wordprocessingInk" xmlns:wne="http://schemas.microsoft.com/office/word/2006/wordml" xmlns:wps="http://schemas.microsoft.com/office/word/2010/wordprocessingShape" mc:Ignorable="w14 w15 w16se w16cid w16 w16cex w16sdtdh wp14">
-  <w:abstractNum w:abstractNumId="0" w15:restartNumberingAfterBreak="0">
+<w:numbering xmlns:wpc="http://schemas.microsoft.com/office/word/2010/wordprocessingCanvas" xmlns:mc="http://schemas.openxmlformats.org/markup-compatibility/2006" xmlns:o="urn:schemas-microsoft-com:office:office" xmlns:r="http://schemas.openxmlformats.org/officeDocument/2006/relationships" xmlns:m="http://schemas.openxmlformats.org/officeDocument/2006/math" xmlns:v="urn:schemas-microsoft-com:vml" xmlns:wp14="http://schemas.microsoft.com/office/word/2010/wordprocessingDrawing" xmlns:wp="http://schemas.openxmlformats.org/drawingml/2006/wordprocessingDrawing" xmlns:w10="urn:schemas-microsoft-com:office:word" xmlns:w="http://schemas.openxmlformats.org/wordprocessingml/2006/main" xmlns:w14="http://schemas.microsoft.com/office/word/2010/wordml" xmlns:wpg="http://schemas.microsoft.com/office/word/2010/wordprocessingGroup" xmlns:wpi="http://schemas.microsoft.com/office/word/2010/wordprocessingInk" xmlns:wne="http://schemas.microsoft.com/office/word/2006/wordml" xmlns:wps="http://schemas.microsoft.com/office/word/2010/wordprocessingShape" mc:Ignorable="w14 wp14">
+  <w:abstractNum w:abstractNumId="0">
     <w:nsid w:val="08C6366F"/>
     <w:multiLevelType w:val="hybridMultilevel"/>
     <w:tmpl w:val="D3561CAA"/>
@@ -5769,7 +5826,7 @@
       </w:pPr>
     </w:lvl>
   </w:abstractNum>
-  <w:abstractNum w:abstractNumId="1" w15:restartNumberingAfterBreak="0">
+  <w:abstractNum w:abstractNumId="1">
     <w:nsid w:val="0C357DD6"/>
     <w:multiLevelType w:val="hybridMultilevel"/>
     <w:tmpl w:val="FEA8088E"/>
@@ -5860,7 +5917,7 @@
       </w:pPr>
     </w:lvl>
   </w:abstractNum>
-  <w:abstractNum w:abstractNumId="2" w15:restartNumberingAfterBreak="0">
+  <w:abstractNum w:abstractNumId="2">
     <w:nsid w:val="10F958A7"/>
     <w:multiLevelType w:val="hybridMultilevel"/>
     <w:tmpl w:val="E8E0613E"/>
@@ -5972,7 +6029,7 @@
       </w:rPr>
     </w:lvl>
   </w:abstractNum>
-  <w:abstractNum w:abstractNumId="3" w15:restartNumberingAfterBreak="0">
+  <w:abstractNum w:abstractNumId="3">
     <w:nsid w:val="129D559F"/>
     <w:multiLevelType w:val="multilevel"/>
     <w:tmpl w:val="00C02F3C"/>
@@ -6112,7 +6169,7 @@
       </w:rPr>
     </w:lvl>
   </w:abstractNum>
-  <w:abstractNum w:abstractNumId="4" w15:restartNumberingAfterBreak="0">
+  <w:abstractNum w:abstractNumId="4">
     <w:nsid w:val="15510218"/>
     <w:multiLevelType w:val="hybridMultilevel"/>
     <w:tmpl w:val="8EF49D20"/>
@@ -6202,7 +6259,7 @@
       </w:pPr>
     </w:lvl>
   </w:abstractNum>
-  <w:abstractNum w:abstractNumId="5" w15:restartNumberingAfterBreak="0">
+  <w:abstractNum w:abstractNumId="5">
     <w:nsid w:val="22693C94"/>
     <w:multiLevelType w:val="hybridMultilevel"/>
     <w:tmpl w:val="68D8C73C"/>
@@ -6315,7 +6372,7 @@
       </w:rPr>
     </w:lvl>
   </w:abstractNum>
-  <w:abstractNum w:abstractNumId="6" w15:restartNumberingAfterBreak="0">
+  <w:abstractNum w:abstractNumId="6">
     <w:nsid w:val="253D4794"/>
     <w:multiLevelType w:val="multilevel"/>
     <w:tmpl w:val="8C80AB36"/>
@@ -6428,7 +6485,7 @@
       </w:rPr>
     </w:lvl>
   </w:abstractNum>
-  <w:abstractNum w:abstractNumId="7" w15:restartNumberingAfterBreak="0">
+  <w:abstractNum w:abstractNumId="7">
     <w:nsid w:val="26BC257F"/>
     <w:multiLevelType w:val="multilevel"/>
     <w:tmpl w:val="78DAAC24"/>
@@ -6541,7 +6598,7 @@
       </w:pPr>
     </w:lvl>
   </w:abstractNum>
-  <w:abstractNum w:abstractNumId="8" w15:restartNumberingAfterBreak="0">
+  <w:abstractNum w:abstractNumId="8">
     <w:nsid w:val="296F3872"/>
     <w:multiLevelType w:val="hybridMultilevel"/>
     <w:tmpl w:val="F1F875BA"/>
@@ -6656,7 +6713,7 @@
       </w:rPr>
     </w:lvl>
   </w:abstractNum>
-  <w:abstractNum w:abstractNumId="9" w15:restartNumberingAfterBreak="0">
+  <w:abstractNum w:abstractNumId="9">
     <w:nsid w:val="2B157829"/>
     <w:multiLevelType w:val="multilevel"/>
     <w:tmpl w:val="0B7E5932"/>
@@ -6769,7 +6826,7 @@
       </w:pPr>
     </w:lvl>
   </w:abstractNum>
-  <w:abstractNum w:abstractNumId="10" w15:restartNumberingAfterBreak="0">
+  <w:abstractNum w:abstractNumId="10">
     <w:nsid w:val="2D5A0F48"/>
     <w:multiLevelType w:val="multilevel"/>
     <w:tmpl w:val="FED0097C"/>
@@ -6909,7 +6966,7 @@
       </w:rPr>
     </w:lvl>
   </w:abstractNum>
-  <w:abstractNum w:abstractNumId="11" w15:restartNumberingAfterBreak="0">
+  <w:abstractNum w:abstractNumId="11">
     <w:nsid w:val="2DE97314"/>
     <w:multiLevelType w:val="multilevel"/>
     <w:tmpl w:val="340AB222"/>
@@ -7022,7 +7079,7 @@
       </w:pPr>
     </w:lvl>
   </w:abstractNum>
-  <w:abstractNum w:abstractNumId="12" w15:restartNumberingAfterBreak="0">
+  <w:abstractNum w:abstractNumId="12">
     <w:nsid w:val="35C20F8D"/>
     <w:multiLevelType w:val="multilevel"/>
     <w:tmpl w:val="7996E420"/>
@@ -7135,7 +7192,7 @@
       </w:pPr>
     </w:lvl>
   </w:abstractNum>
-  <w:abstractNum w:abstractNumId="13" w15:restartNumberingAfterBreak="0">
+  <w:abstractNum w:abstractNumId="13">
     <w:nsid w:val="3B2B185A"/>
     <w:multiLevelType w:val="multilevel"/>
     <w:tmpl w:val="B18493EA"/>
@@ -7248,7 +7305,7 @@
       </w:pPr>
     </w:lvl>
   </w:abstractNum>
-  <w:abstractNum w:abstractNumId="14" w15:restartNumberingAfterBreak="0">
+  <w:abstractNum w:abstractNumId="14">
     <w:nsid w:val="41841B01"/>
     <w:multiLevelType w:val="hybridMultilevel"/>
     <w:tmpl w:val="55BC674E"/>
@@ -7339,7 +7396,7 @@
       </w:pPr>
     </w:lvl>
   </w:abstractNum>
-  <w:abstractNum w:abstractNumId="15" w15:restartNumberingAfterBreak="0">
+  <w:abstractNum w:abstractNumId="15">
     <w:nsid w:val="4803540D"/>
     <w:multiLevelType w:val="hybridMultilevel"/>
     <w:tmpl w:val="22883C36"/>
@@ -7453,7 +7510,7 @@
       </w:rPr>
     </w:lvl>
   </w:abstractNum>
-  <w:abstractNum w:abstractNumId="16" w15:restartNumberingAfterBreak="0">
+  <w:abstractNum w:abstractNumId="16">
     <w:nsid w:val="492F4D8F"/>
     <w:multiLevelType w:val="hybridMultilevel"/>
     <w:tmpl w:val="F62C94DE"/>
@@ -7567,7 +7624,7 @@
       </w:rPr>
     </w:lvl>
   </w:abstractNum>
-  <w:abstractNum w:abstractNumId="17" w15:restartNumberingAfterBreak="0">
+  <w:abstractNum w:abstractNumId="17">
     <w:nsid w:val="523345C7"/>
     <w:multiLevelType w:val="multilevel"/>
     <w:tmpl w:val="5A5E29B8"/>
@@ -7707,7 +7764,7 @@
       </w:rPr>
     </w:lvl>
   </w:abstractNum>
-  <w:abstractNum w:abstractNumId="18" w15:restartNumberingAfterBreak="0">
+  <w:abstractNum w:abstractNumId="18">
     <w:nsid w:val="6B961852"/>
     <w:multiLevelType w:val="hybridMultilevel"/>
     <w:tmpl w:val="DAAECE10"/>
@@ -7800,7 +7857,7 @@
       </w:pPr>
     </w:lvl>
   </w:abstractNum>
-  <w:abstractNum w:abstractNumId="19" w15:restartNumberingAfterBreak="0">
+  <w:abstractNum w:abstractNumId="19">
     <w:nsid w:val="72C94C4A"/>
     <w:multiLevelType w:val="multilevel"/>
     <w:tmpl w:val="E606F4D4"/>
@@ -7913,7 +7970,7 @@
       </w:pPr>
     </w:lvl>
   </w:abstractNum>
-  <w:abstractNum w:abstractNumId="20" w15:restartNumberingAfterBreak="0">
+  <w:abstractNum w:abstractNumId="20">
     <w:nsid w:val="72F61AFE"/>
     <w:multiLevelType w:val="multilevel"/>
     <w:tmpl w:val="82241B5A"/>
@@ -8026,7 +8083,7 @@
       </w:pPr>
     </w:lvl>
   </w:abstractNum>
-  <w:abstractNum w:abstractNumId="21" w15:restartNumberingAfterBreak="0">
+  <w:abstractNum w:abstractNumId="21">
     <w:nsid w:val="7BAF36E9"/>
     <w:multiLevelType w:val="multilevel"/>
     <w:tmpl w:val="24180D92"/>
@@ -8274,7 +8331,7 @@
 </file>
 
 <file path=word/styles.xml><?xml version="1.0" encoding="utf-8"?>
-<w:styles xmlns:mc="http://schemas.openxmlformats.org/markup-compatibility/2006" xmlns:r="http://schemas.openxmlformats.org/officeDocument/2006/relationships" xmlns:w="http://schemas.openxmlformats.org/wordprocessingml/2006/main" xmlns:w14="http://schemas.microsoft.com/office/word/2010/wordml" xmlns:w15="http://schemas.microsoft.com/office/word/2012/wordml" xmlns:w16cex="http://schemas.microsoft.com/office/word/2018/wordml/cex" xmlns:w16cid="http://schemas.microsoft.com/office/word/2016/wordml/cid" xmlns:w16="http://schemas.microsoft.com/office/word/2018/wordml" xmlns:w16sdtdh="http://schemas.microsoft.com/office/word/2020/wordml/sdtdatahash" xmlns:w16se="http://schemas.microsoft.com/office/word/2015/wordml/symex" mc:Ignorable="w14 w15 w16se w16cid w16 w16cex w16sdtdh">
+<w:styles xmlns:mc="http://schemas.openxmlformats.org/markup-compatibility/2006" xmlns:r="http://schemas.openxmlformats.org/officeDocument/2006/relationships" xmlns:w="http://schemas.openxmlformats.org/wordprocessingml/2006/main" xmlns:w14="http://schemas.microsoft.com/office/word/2010/wordml" mc:Ignorable="w14">
   <w:docDefaults>
     <w:rPrDefault>
       <w:rPr>
@@ -8290,383 +8347,145 @@
       </w:pPr>
     </w:pPrDefault>
   </w:docDefaults>
-  <w:latentStyles w:defLockedState="0" w:defUIPriority="99" w:defSemiHidden="0" w:defUnhideWhenUsed="0" w:defQFormat="0" w:count="376">
-    <w:lsdException w:name="Normal" w:uiPriority="0" w:qFormat="1"/>
-    <w:lsdException w:name="heading 1" w:uiPriority="9" w:qFormat="1"/>
-    <w:lsdException w:name="heading 2" w:semiHidden="1" w:uiPriority="9" w:unhideWhenUsed="1" w:qFormat="1"/>
-    <w:lsdException w:name="heading 3" w:semiHidden="1" w:uiPriority="9" w:unhideWhenUsed="1" w:qFormat="1"/>
-    <w:lsdException w:name="heading 4" w:semiHidden="1" w:uiPriority="9" w:unhideWhenUsed="1" w:qFormat="1"/>
-    <w:lsdException w:name="heading 5" w:semiHidden="1" w:uiPriority="9" w:unhideWhenUsed="1" w:qFormat="1"/>
-    <w:lsdException w:name="heading 6" w:semiHidden="1" w:uiPriority="9" w:unhideWhenUsed="1" w:qFormat="1"/>
-    <w:lsdException w:name="heading 7" w:semiHidden="1" w:uiPriority="9" w:unhideWhenUsed="1" w:qFormat="1"/>
-    <w:lsdException w:name="heading 8" w:semiHidden="1" w:uiPriority="9" w:unhideWhenUsed="1" w:qFormat="1"/>
-    <w:lsdException w:name="heading 9" w:semiHidden="1" w:uiPriority="9" w:unhideWhenUsed="1" w:qFormat="1"/>
-    <w:lsdException w:name="index 1" w:semiHidden="1" w:unhideWhenUsed="1"/>
-    <w:lsdException w:name="index 2" w:semiHidden="1" w:unhideWhenUsed="1"/>
-    <w:lsdException w:name="index 3" w:semiHidden="1" w:unhideWhenUsed="1"/>
-    <w:lsdException w:name="index 4" w:semiHidden="1" w:unhideWhenUsed="1"/>
-    <w:lsdException w:name="index 5" w:semiHidden="1" w:unhideWhenUsed="1"/>
-    <w:lsdException w:name="index 6" w:semiHidden="1" w:unhideWhenUsed="1"/>
-    <w:lsdException w:name="index 7" w:semiHidden="1" w:unhideWhenUsed="1"/>
-    <w:lsdException w:name="index 8" w:semiHidden="1" w:unhideWhenUsed="1"/>
-    <w:lsdException w:name="index 9" w:semiHidden="1" w:unhideWhenUsed="1"/>
-    <w:lsdException w:name="toc 1" w:semiHidden="1" w:uiPriority="39" w:unhideWhenUsed="1"/>
-    <w:lsdException w:name="toc 2" w:semiHidden="1" w:uiPriority="39" w:unhideWhenUsed="1"/>
-    <w:lsdException w:name="toc 3" w:semiHidden="1" w:uiPriority="39" w:unhideWhenUsed="1"/>
-    <w:lsdException w:name="toc 4" w:semiHidden="1" w:uiPriority="39" w:unhideWhenUsed="1"/>
-    <w:lsdException w:name="toc 5" w:semiHidden="1" w:uiPriority="39" w:unhideWhenUsed="1"/>
-    <w:lsdException w:name="toc 6" w:semiHidden="1" w:uiPriority="39" w:unhideWhenUsed="1"/>
-    <w:lsdException w:name="toc 7" w:semiHidden="1" w:uiPriority="39" w:unhideWhenUsed="1"/>
-    <w:lsdException w:name="toc 8" w:semiHidden="1" w:uiPriority="39" w:unhideWhenUsed="1"/>
-    <w:lsdException w:name="toc 9" w:semiHidden="1" w:uiPriority="39" w:unhideWhenUsed="1"/>
-    <w:lsdException w:name="Normal Indent" w:semiHidden="1" w:unhideWhenUsed="1"/>
-    <w:lsdException w:name="footnote text" w:semiHidden="1" w:unhideWhenUsed="1"/>
-    <w:lsdException w:name="annotation text" w:semiHidden="1" w:unhideWhenUsed="1"/>
-    <w:lsdException w:name="header" w:semiHidden="1" w:unhideWhenUsed="1"/>
-    <w:lsdException w:name="footer" w:semiHidden="1" w:unhideWhenUsed="1"/>
-    <w:lsdException w:name="index heading" w:semiHidden="1" w:unhideWhenUsed="1"/>
-    <w:lsdException w:name="caption" w:semiHidden="1" w:uiPriority="35" w:unhideWhenUsed="1" w:qFormat="1"/>
-    <w:lsdException w:name="table of figures" w:semiHidden="1" w:unhideWhenUsed="1"/>
-    <w:lsdException w:name="envelope address" w:semiHidden="1" w:unhideWhenUsed="1"/>
-    <w:lsdException w:name="envelope return" w:semiHidden="1" w:unhideWhenUsed="1"/>
-    <w:lsdException w:name="footnote reference" w:semiHidden="1" w:unhideWhenUsed="1"/>
-    <w:lsdException w:name="annotation reference" w:semiHidden="1" w:unhideWhenUsed="1"/>
-    <w:lsdException w:name="line number" w:semiHidden="1" w:unhideWhenUsed="1"/>
-    <w:lsdException w:name="page number" w:semiHidden="1" w:unhideWhenUsed="1"/>
-    <w:lsdException w:name="endnote reference" w:semiHidden="1" w:unhideWhenUsed="1"/>
-    <w:lsdException w:name="endnote text" w:semiHidden="1" w:unhideWhenUsed="1"/>
-    <w:lsdException w:name="table of authorities" w:semiHidden="1" w:unhideWhenUsed="1"/>
-    <w:lsdException w:name="macro" w:semiHidden="1" w:unhideWhenUsed="1"/>
-    <w:lsdException w:name="toa heading" w:semiHidden="1" w:unhideWhenUsed="1"/>
-    <w:lsdException w:name="List" w:semiHidden="1" w:unhideWhenUsed="1"/>
-    <w:lsdException w:name="List Bullet" w:semiHidden="1" w:unhideWhenUsed="1"/>
-    <w:lsdException w:name="List Number" w:semiHidden="1" w:unhideWhenUsed="1"/>
-    <w:lsdException w:name="List 2" w:semiHidden="1" w:unhideWhenUsed="1"/>
-    <w:lsdException w:name="List 3" w:semiHidden="1" w:unhideWhenUsed="1"/>
-    <w:lsdException w:name="List 4" w:semiHidden="1" w:unhideWhenUsed="1"/>
-    <w:lsdException w:name="List 5" w:semiHidden="1" w:unhideWhenUsed="1"/>
-    <w:lsdException w:name="List Bullet 2" w:semiHidden="1" w:unhideWhenUsed="1"/>
-    <w:lsdException w:name="List Bullet 3" w:semiHidden="1" w:unhideWhenUsed="1"/>
-    <w:lsdException w:name="List Bullet 4" w:semiHidden="1" w:unhideWhenUsed="1"/>
-    <w:lsdException w:name="List Bullet 5" w:semiHidden="1" w:unhideWhenUsed="1"/>
-    <w:lsdException w:name="List Number 2" w:semiHidden="1" w:unhideWhenUsed="1"/>
-    <w:lsdException w:name="List Number 3" w:semiHidden="1" w:unhideWhenUsed="1"/>
-    <w:lsdException w:name="List Number 4" w:semiHidden="1" w:unhideWhenUsed="1"/>
-    <w:lsdException w:name="List Number 5" w:semiHidden="1" w:unhideWhenUsed="1"/>
-    <w:lsdException w:name="Title" w:uiPriority="10" w:qFormat="1"/>
-    <w:lsdException w:name="Closing" w:semiHidden="1" w:unhideWhenUsed="1"/>
-    <w:lsdException w:name="Signature" w:semiHidden="1" w:unhideWhenUsed="1"/>
-    <w:lsdException w:name="Default Paragraph Font" w:semiHidden="1" w:uiPriority="1" w:unhideWhenUsed="1"/>
-    <w:lsdException w:name="Body Text" w:semiHidden="1" w:uiPriority="1" w:unhideWhenUsed="1" w:qFormat="1"/>
-    <w:lsdException w:name="Body Text Indent" w:semiHidden="1" w:unhideWhenUsed="1"/>
-    <w:lsdException w:name="List Continue" w:semiHidden="1" w:unhideWhenUsed="1"/>
-    <w:lsdException w:name="List Continue 2" w:semiHidden="1" w:unhideWhenUsed="1"/>
-    <w:lsdException w:name="List Continue 3" w:semiHidden="1" w:unhideWhenUsed="1"/>
-    <w:lsdException w:name="List Continue 4" w:semiHidden="1" w:unhideWhenUsed="1"/>
-    <w:lsdException w:name="List Continue 5" w:semiHidden="1" w:unhideWhenUsed="1"/>
-    <w:lsdException w:name="Message Header" w:semiHidden="1" w:unhideWhenUsed="1"/>
-    <w:lsdException w:name="Subtitle" w:uiPriority="11" w:qFormat="1"/>
-    <w:lsdException w:name="Salutation" w:semiHidden="1" w:unhideWhenUsed="1"/>
-    <w:lsdException w:name="Date" w:semiHidden="1" w:unhideWhenUsed="1"/>
-    <w:lsdException w:name="Body Text First Indent" w:semiHidden="1" w:unhideWhenUsed="1"/>
-    <w:lsdException w:name="Body Text First Indent 2" w:semiHidden="1" w:unhideWhenUsed="1"/>
-    <w:lsdException w:name="Note Heading" w:semiHidden="1" w:unhideWhenUsed="1"/>
-    <w:lsdException w:name="Body Text 2" w:semiHidden="1" w:unhideWhenUsed="1"/>
-    <w:lsdException w:name="Body Text 3" w:semiHidden="1" w:unhideWhenUsed="1"/>
-    <w:lsdException w:name="Body Text Indent 2" w:semiHidden="1" w:unhideWhenUsed="1"/>
-    <w:lsdException w:name="Body Text Indent 3" w:semiHidden="1" w:unhideWhenUsed="1"/>
-    <w:lsdException w:name="Block Text" w:semiHidden="1" w:unhideWhenUsed="1"/>
-    <w:lsdException w:name="Hyperlink" w:semiHidden="1" w:unhideWhenUsed="1"/>
-    <w:lsdException w:name="FollowedHyperlink" w:semiHidden="1" w:unhideWhenUsed="1"/>
-    <w:lsdException w:name="Strong" w:uiPriority="22" w:qFormat="1"/>
-    <w:lsdException w:name="Emphasis" w:uiPriority="20" w:qFormat="1"/>
-    <w:lsdException w:name="Document Map" w:semiHidden="1" w:unhideWhenUsed="1"/>
-    <w:lsdException w:name="Plain Text" w:semiHidden="1" w:unhideWhenUsed="1"/>
-    <w:lsdException w:name="E-mail Signature" w:semiHidden="1" w:unhideWhenUsed="1"/>
-    <w:lsdException w:name="HTML Top of Form" w:semiHidden="1" w:unhideWhenUsed="1"/>
-    <w:lsdException w:name="HTML Bottom of Form" w:semiHidden="1" w:unhideWhenUsed="1"/>
-    <w:lsdException w:name="Normal (Web)" w:semiHidden="1" w:unhideWhenUsed="1"/>
-    <w:lsdException w:name="HTML Acronym" w:semiHidden="1" w:unhideWhenUsed="1"/>
-    <w:lsdException w:name="HTML Address" w:semiHidden="1" w:unhideWhenUsed="1"/>
-    <w:lsdException w:name="HTML Cite" w:semiHidden="1" w:unhideWhenUsed="1"/>
-    <w:lsdException w:name="HTML Code" w:semiHidden="1" w:unhideWhenUsed="1"/>
-    <w:lsdException w:name="HTML Definition" w:semiHidden="1" w:unhideWhenUsed="1"/>
-    <w:lsdException w:name="HTML Keyboard" w:semiHidden="1" w:unhideWhenUsed="1"/>
-    <w:lsdException w:name="HTML Preformatted" w:semiHidden="1" w:unhideWhenUsed="1"/>
-    <w:lsdException w:name="HTML Sample" w:semiHidden="1" w:unhideWhenUsed="1"/>
-    <w:lsdException w:name="HTML Typewriter" w:semiHidden="1" w:unhideWhenUsed="1"/>
-    <w:lsdException w:name="HTML Variable" w:semiHidden="1" w:unhideWhenUsed="1"/>
-    <w:lsdException w:name="Normal Table" w:semiHidden="1" w:unhideWhenUsed="1"/>
-    <w:lsdException w:name="annotation subject" w:semiHidden="1" w:unhideWhenUsed="1"/>
-    <w:lsdException w:name="No List" w:semiHidden="1" w:unhideWhenUsed="1"/>
-    <w:lsdException w:name="Outline List 1" w:semiHidden="1" w:unhideWhenUsed="1"/>
-    <w:lsdException w:name="Outline List 2" w:semiHidden="1" w:unhideWhenUsed="1"/>
-    <w:lsdException w:name="Outline List 3" w:semiHidden="1" w:unhideWhenUsed="1"/>
-    <w:lsdException w:name="Table Simple 1" w:semiHidden="1" w:unhideWhenUsed="1"/>
-    <w:lsdException w:name="Table Simple 2" w:semiHidden="1" w:unhideWhenUsed="1"/>
-    <w:lsdException w:name="Table Simple 3" w:semiHidden="1" w:unhideWhenUsed="1"/>
-    <w:lsdException w:name="Table Classic 1" w:semiHidden="1" w:unhideWhenUsed="1"/>
-    <w:lsdException w:name="Table Classic 2" w:semiHidden="1" w:unhideWhenUsed="1"/>
-    <w:lsdException w:name="Table Classic 3" w:semiHidden="1" w:unhideWhenUsed="1"/>
-    <w:lsdException w:name="Table Classic 4" w:semiHidden="1" w:unhideWhenUsed="1"/>
-    <w:lsdException w:name="Table Colorful 1" w:semiHidden="1" w:unhideWhenUsed="1"/>
-    <w:lsdException w:name="Table Colorful 2" w:semiHidden="1" w:unhideWhenUsed="1"/>
-    <w:lsdException w:name="Table Colorful 3" w:semiHidden="1" w:unhideWhenUsed="1"/>
-    <w:lsdException w:name="Table Columns 1" w:semiHidden="1" w:unhideWhenUsed="1"/>
-    <w:lsdException w:name="Table Columns 2" w:semiHidden="1" w:unhideWhenUsed="1"/>
-    <w:lsdException w:name="Table Columns 3" w:semiHidden="1" w:unhideWhenUsed="1"/>
-    <w:lsdException w:name="Table Columns 4" w:semiHidden="1" w:unhideWhenUsed="1"/>
-    <w:lsdException w:name="Table Columns 5" w:semiHidden="1" w:unhideWhenUsed="1"/>
-    <w:lsdException w:name="Table Grid 1" w:semiHidden="1" w:unhideWhenUsed="1"/>
-    <w:lsdException w:name="Table Grid 2" w:semiHidden="1" w:unhideWhenUsed="1"/>
-    <w:lsdException w:name="Table Grid 3" w:semiHidden="1" w:unhideWhenUsed="1"/>
-    <w:lsdException w:name="Table Grid 4" w:semiHidden="1" w:unhideWhenUsed="1"/>
-    <w:lsdException w:name="Table Grid 5" w:semiHidden="1" w:unhideWhenUsed="1"/>
-    <w:lsdException w:name="Table Grid 6" w:semiHidden="1" w:unhideWhenUsed="1"/>
-    <w:lsdException w:name="Table Grid 7" w:semiHidden="1" w:unhideWhenUsed="1"/>
-    <w:lsdException w:name="Table Grid 8" w:semiHidden="1" w:unhideWhenUsed="1"/>
-    <w:lsdException w:name="Table List 1" w:semiHidden="1" w:unhideWhenUsed="1"/>
-    <w:lsdException w:name="Table List 2" w:semiHidden="1" w:unhideWhenUsed="1"/>
-    <w:lsdException w:name="Table List 3" w:semiHidden="1" w:unhideWhenUsed="1"/>
-    <w:lsdException w:name="Table List 4" w:semiHidden="1" w:unhideWhenUsed="1"/>
-    <w:lsdException w:name="Table List 5" w:semiHidden="1" w:unhideWhenUsed="1"/>
-    <w:lsdException w:name="Table List 6" w:semiHidden="1" w:unhideWhenUsed="1"/>
-    <w:lsdException w:name="Table List 7" w:semiHidden="1" w:unhideWhenUsed="1"/>
-    <w:lsdException w:name="Table List 8" w:semiHidden="1" w:unhideWhenUsed="1"/>
-    <w:lsdException w:name="Table 3D effects 1" w:semiHidden="1" w:unhideWhenUsed="1"/>
-    <w:lsdException w:name="Table 3D effects 2" w:semiHidden="1" w:unhideWhenUsed="1"/>
-    <w:lsdException w:name="Table 3D effects 3" w:semiHidden="1" w:unhideWhenUsed="1"/>
-    <w:lsdException w:name="Table Contemporary" w:semiHidden="1" w:unhideWhenUsed="1"/>
-    <w:lsdException w:name="Table Elegant" w:semiHidden="1" w:unhideWhenUsed="1"/>
-    <w:lsdException w:name="Table Professional" w:semiHidden="1" w:unhideWhenUsed="1"/>
-    <w:lsdException w:name="Table Subtle 1" w:semiHidden="1" w:unhideWhenUsed="1"/>
-    <w:lsdException w:name="Table Subtle 2" w:semiHidden="1" w:unhideWhenUsed="1"/>
-    <w:lsdException w:name="Table Web 1" w:semiHidden="1" w:unhideWhenUsed="1"/>
-    <w:lsdException w:name="Table Web 2" w:semiHidden="1" w:unhideWhenUsed="1"/>
-    <w:lsdException w:name="Table Web 3" w:semiHidden="1" w:unhideWhenUsed="1"/>
-    <w:lsdException w:name="Balloon Text" w:semiHidden="1" w:unhideWhenUsed="1"/>
-    <w:lsdException w:name="Table Grid" w:uiPriority="39"/>
-    <w:lsdException w:name="Table Theme" w:semiHidden="1" w:unhideWhenUsed="1"/>
-    <w:lsdException w:name="Placeholder Text" w:semiHidden="1"/>
-    <w:lsdException w:name="No Spacing" w:uiPriority="1" w:qFormat="1"/>
-    <w:lsdException w:name="Light Shading" w:uiPriority="60"/>
-    <w:lsdException w:name="Light List" w:uiPriority="61"/>
-    <w:lsdException w:name="Light Grid" w:uiPriority="62"/>
-    <w:lsdException w:name="Medium Shading 1" w:uiPriority="63"/>
-    <w:lsdException w:name="Medium Shading 2" w:uiPriority="64"/>
-    <w:lsdException w:name="Medium List 1" w:uiPriority="65"/>
-    <w:lsdException w:name="Medium List 2" w:uiPriority="66"/>
-    <w:lsdException w:name="Medium Grid 1" w:uiPriority="67"/>
-    <w:lsdException w:name="Medium Grid 2" w:uiPriority="68"/>
-    <w:lsdException w:name="Medium Grid 3" w:uiPriority="69"/>
-    <w:lsdException w:name="Dark List" w:uiPriority="70"/>
-    <w:lsdException w:name="Colorful Shading" w:uiPriority="71"/>
-    <w:lsdException w:name="Colorful List" w:uiPriority="72"/>
-    <w:lsdException w:name="Colorful Grid" w:uiPriority="73"/>
-    <w:lsdException w:name="Light Shading Accent 1" w:uiPriority="60"/>
-    <w:lsdException w:name="Light List Accent 1" w:uiPriority="61"/>
-    <w:lsdException w:name="Light Grid Accent 1" w:uiPriority="62"/>
-    <w:lsdException w:name="Medium Shading 1 Accent 1" w:uiPriority="63"/>
-    <w:lsdException w:name="Medium Shading 2 Accent 1" w:uiPriority="64"/>
-    <w:lsdException w:name="Medium List 1 Accent 1" w:uiPriority="65"/>
-    <w:lsdException w:name="Revision" w:semiHidden="1"/>
-    <w:lsdException w:name="List Paragraph" w:uiPriority="34" w:qFormat="1"/>
-    <w:lsdException w:name="Quote" w:uiPriority="29" w:qFormat="1"/>
-    <w:lsdException w:name="Intense Quote" w:uiPriority="30" w:qFormat="1"/>
-    <w:lsdException w:name="Medium List 2 Accent 1" w:uiPriority="66"/>
-    <w:lsdException w:name="Medium Grid 1 Accent 1" w:uiPriority="67"/>
-    <w:lsdException w:name="Medium Grid 2 Accent 1" w:uiPriority="68"/>
-    <w:lsdException w:name="Medium Grid 3 Accent 1" w:uiPriority="69"/>
-    <w:lsdException w:name="Dark List Accent 1" w:uiPriority="70"/>
-    <w:lsdException w:name="Colorful Shading Accent 1" w:uiPriority="71"/>
-    <w:lsdException w:name="Colorful List Accent 1" w:uiPriority="72"/>
-    <w:lsdException w:name="Colorful Grid Accent 1" w:uiPriority="73"/>
-    <w:lsdException w:name="Light Shading Accent 2" w:uiPriority="60"/>
-    <w:lsdException w:name="Light List Accent 2" w:uiPriority="61"/>
-    <w:lsdException w:name="Light Grid Accent 2" w:uiPriority="62"/>
-    <w:lsdException w:name="Medium Shading 1 Accent 2" w:uiPriority="63"/>
-    <w:lsdException w:name="Medium Shading 2 Accent 2" w:uiPriority="64"/>
-    <w:lsdException w:name="Medium List 1 Accent 2" w:uiPriority="65"/>
-    <w:lsdException w:name="Medium List 2 Accent 2" w:uiPriority="66"/>
-    <w:lsdException w:name="Medium Grid 1 Accent 2" w:uiPriority="67"/>
-    <w:lsdException w:name="Medium Grid 2 Accent 2" w:uiPriority="68"/>
-    <w:lsdException w:name="Medium Grid 3 Accent 2" w:uiPriority="69"/>
-    <w:lsdException w:name="Dark List Accent 2" w:uiPriority="70"/>
-    <w:lsdException w:name="Colorful Shading Accent 2" w:uiPriority="71"/>
-    <w:lsdException w:name="Colorful List Accent 2" w:uiPriority="72"/>
-    <w:lsdException w:name="Colorful Grid Accent 2" w:uiPriority="73"/>
-    <w:lsdException w:name="Light Shading Accent 3" w:uiPriority="60"/>
-    <w:lsdException w:name="Light List Accent 3" w:uiPriority="61"/>
-    <w:lsdException w:name="Light Grid Accent 3" w:uiPriority="62"/>
-    <w:lsdException w:name="Medium Shading 1 Accent 3" w:uiPriority="63"/>
-    <w:lsdException w:name="Medium Shading 2 Accent 3" w:uiPriority="64"/>
-    <w:lsdException w:name="Medium List 1 Accent 3" w:uiPriority="65"/>
-    <w:lsdException w:name="Medium List 2 Accent 3" w:uiPriority="66"/>
-    <w:lsdException w:name="Medium Grid 1 Accent 3" w:uiPriority="67"/>
-    <w:lsdException w:name="Medium Grid 2 Accent 3" w:uiPriority="68"/>
-    <w:lsdException w:name="Medium Grid 3 Accent 3" w:uiPriority="69"/>
-    <w:lsdException w:name="Dark List Accent 3" w:uiPriority="70"/>
-    <w:lsdException w:name="Colorful Shading Accent 3" w:uiPriority="71"/>
-    <w:lsdException w:name="Colorful List Accent 3" w:uiPriority="72"/>
-    <w:lsdException w:name="Colorful Grid Accent 3" w:uiPriority="73"/>
-    <w:lsdException w:name="Light Shading Accent 4" w:uiPriority="60"/>
-    <w:lsdException w:name="Light List Accent 4" w:uiPriority="61"/>
-    <w:lsdException w:name="Light Grid Accent 4" w:uiPriority="62"/>
-    <w:lsdException w:name="Medium Shading 1 Accent 4" w:uiPriority="63"/>
-    <w:lsdException w:name="Medium Shading 2 Accent 4" w:uiPriority="64"/>
-    <w:lsdException w:name="Medium List 1 Accent 4" w:uiPriority="65"/>
-    <w:lsdException w:name="Medium List 2 Accent 4" w:uiPriority="66"/>
-    <w:lsdException w:name="Medium Grid 1 Accent 4" w:uiPriority="67"/>
-    <w:lsdException w:name="Medium Grid 2 Accent 4" w:uiPriority="68"/>
-    <w:lsdException w:name="Medium Grid 3 Accent 4" w:uiPriority="69"/>
-    <w:lsdException w:name="Dark List Accent 4" w:uiPriority="70"/>
-    <w:lsdException w:name="Colorful Shading Accent 4" w:uiPriority="71"/>
-    <w:lsdException w:name="Colorful List Accent 4" w:uiPriority="72"/>
-    <w:lsdException w:name="Colorful Grid Accent 4" w:uiPriority="73"/>
-    <w:lsdException w:name="Light Shading Accent 5" w:uiPriority="60"/>
-    <w:lsdException w:name="Light List Accent 5" w:uiPriority="61"/>
-    <w:lsdException w:name="Light Grid Accent 5" w:uiPriority="62"/>
-    <w:lsdException w:name="Medium Shading 1 Accent 5" w:uiPriority="63"/>
-    <w:lsdException w:name="Medium Shading 2 Accent 5" w:uiPriority="64"/>
-    <w:lsdException w:name="Medium List 1 Accent 5" w:uiPriority="65"/>
-    <w:lsdException w:name="Medium List 2 Accent 5" w:uiPriority="66"/>
-    <w:lsdException w:name="Medium Grid 1 Accent 5" w:uiPriority="67"/>
-    <w:lsdException w:name="Medium Grid 2 Accent 5" w:uiPriority="68"/>
-    <w:lsdException w:name="Medium Grid 3 Accent 5" w:uiPriority="69"/>
-    <w:lsdException w:name="Dark List Accent 5" w:uiPriority="70"/>
-    <w:lsdException w:name="Colorful Shading Accent 5" w:uiPriority="71"/>
-    <w:lsdException w:name="Colorful List Accent 5" w:uiPriority="72"/>
-    <w:lsdException w:name="Colorful Grid Accent 5" w:uiPriority="73"/>
-    <w:lsdException w:name="Light Shading Accent 6" w:uiPriority="60"/>
-    <w:lsdException w:name="Light List Accent 6" w:uiPriority="61"/>
-    <w:lsdException w:name="Light Grid Accent 6" w:uiPriority="62"/>
-    <w:lsdException w:name="Medium Shading 1 Accent 6" w:uiPriority="63"/>
-    <w:lsdException w:name="Medium Shading 2 Accent 6" w:uiPriority="64"/>
-    <w:lsdException w:name="Medium List 1 Accent 6" w:uiPriority="65"/>
-    <w:lsdException w:name="Medium List 2 Accent 6" w:uiPriority="66"/>
-    <w:lsdException w:name="Medium Grid 1 Accent 6" w:uiPriority="67"/>
-    <w:lsdException w:name="Medium Grid 2 Accent 6" w:uiPriority="68"/>
-    <w:lsdException w:name="Medium Grid 3 Accent 6" w:uiPriority="69"/>
-    <w:lsdException w:name="Dark List Accent 6" w:uiPriority="70"/>
-    <w:lsdException w:name="Colorful Shading Accent 6" w:uiPriority="71"/>
-    <w:lsdException w:name="Colorful List Accent 6" w:uiPriority="72"/>
-    <w:lsdException w:name="Colorful Grid Accent 6" w:uiPriority="73"/>
-    <w:lsdException w:name="Subtle Emphasis" w:uiPriority="19" w:qFormat="1"/>
-    <w:lsdException w:name="Intense Emphasis" w:uiPriority="21" w:qFormat="1"/>
-    <w:lsdException w:name="Subtle Reference" w:uiPriority="31" w:qFormat="1"/>
-    <w:lsdException w:name="Intense Reference" w:uiPriority="32" w:qFormat="1"/>
-    <w:lsdException w:name="Book Title" w:uiPriority="33" w:qFormat="1"/>
-    <w:lsdException w:name="Bibliography" w:semiHidden="1" w:uiPriority="37" w:unhideWhenUsed="1"/>
-    <w:lsdException w:name="TOC Heading" w:semiHidden="1" w:uiPriority="39" w:unhideWhenUsed="1" w:qFormat="1"/>
-    <w:lsdException w:name="Plain Table 1" w:uiPriority="41"/>
-    <w:lsdException w:name="Plain Table 2" w:uiPriority="42"/>
-    <w:lsdException w:name="Plain Table 3" w:uiPriority="43"/>
-    <w:lsdException w:name="Plain Table 4" w:uiPriority="44"/>
-    <w:lsdException w:name="Plain Table 5" w:uiPriority="45"/>
-    <w:lsdException w:name="Grid Table Light" w:uiPriority="40"/>
-    <w:lsdException w:name="Grid Table 1 Light" w:uiPriority="46"/>
-    <w:lsdException w:name="Grid Table 2" w:uiPriority="47"/>
-    <w:lsdException w:name="Grid Table 3" w:uiPriority="48"/>
-    <w:lsdException w:name="Grid Table 4" w:uiPriority="49"/>
-    <w:lsdException w:name="Grid Table 5 Dark" w:uiPriority="50"/>
-    <w:lsdException w:name="Grid Table 6 Colorful" w:uiPriority="51"/>
-    <w:lsdException w:name="Grid Table 7 Colorful" w:uiPriority="52"/>
-    <w:lsdException w:name="Grid Table 1 Light Accent 1" w:uiPriority="46"/>
-    <w:lsdException w:name="Grid Table 2 Accent 1" w:uiPriority="47"/>
-    <w:lsdException w:name="Grid Table 3 Accent 1" w:uiPriority="48"/>
-    <w:lsdException w:name="Grid Table 4 Accent 1" w:uiPriority="49"/>
-    <w:lsdException w:name="Grid Table 5 Dark Accent 1" w:uiPriority="50"/>
-    <w:lsdException w:name="Grid Table 6 Colorful Accent 1" w:uiPriority="51"/>
-    <w:lsdException w:name="Grid Table 7 Colorful Accent 1" w:uiPriority="52"/>
-    <w:lsdException w:name="Grid Table 1 Light Accent 2" w:uiPriority="46"/>
-    <w:lsdException w:name="Grid Table 2 Accent 2" w:uiPriority="47"/>
-    <w:lsdException w:name="Grid Table 3 Accent 2" w:uiPriority="48"/>
-    <w:lsdException w:name="Grid Table 4 Accent 2" w:uiPriority="49"/>
-    <w:lsdException w:name="Grid Table 5 Dark Accent 2" w:uiPriority="50"/>
-    <w:lsdException w:name="Grid Table 6 Colorful Accent 2" w:uiPriority="51"/>
-    <w:lsdException w:name="Grid Table 7 Colorful Accent 2" w:uiPriority="52"/>
-    <w:lsdException w:name="Grid Table 1 Light Accent 3" w:uiPriority="46"/>
-    <w:lsdException w:name="Grid Table 2 Accent 3" w:uiPriority="47"/>
-    <w:lsdException w:name="Grid Table 3 Accent 3" w:uiPriority="48"/>
-    <w:lsdException w:name="Grid Table 4 Accent 3" w:uiPriority="49"/>
-    <w:lsdException w:name="Grid Table 5 Dark Accent 3" w:uiPriority="50"/>
-    <w:lsdException w:name="Grid Table 6 Colorful Accent 3" w:uiPriority="51"/>
-    <w:lsdException w:name="Grid Table 7 Colorful Accent 3" w:uiPriority="52"/>
-    <w:lsdException w:name="Grid Table 1 Light Accent 4" w:uiPriority="46"/>
-    <w:lsdException w:name="Grid Table 2 Accent 4" w:uiPriority="47"/>
-    <w:lsdException w:name="Grid Table 3 Accent 4" w:uiPriority="48"/>
-    <w:lsdException w:name="Grid Table 4 Accent 4" w:uiPriority="49"/>
-    <w:lsdException w:name="Grid Table 5 Dark Accent 4" w:uiPriority="50"/>
-    <w:lsdException w:name="Grid Table 6 Colorful Accent 4" w:uiPriority="51"/>
-    <w:lsdException w:name="Grid Table 7 Colorful Accent 4" w:uiPriority="52"/>
-    <w:lsdException w:name="Grid Table 1 Light Accent 5" w:uiPriority="46"/>
-    <w:lsdException w:name="Grid Table 2 Accent 5" w:uiPriority="47"/>
-    <w:lsdException w:name="Grid Table 3 Accent 5" w:uiPriority="48"/>
-    <w:lsdException w:name="Grid Table 4 Accent 5" w:uiPriority="49"/>
-    <w:lsdException w:name="Grid Table 5 Dark Accent 5" w:uiPriority="50"/>
-    <w:lsdException w:name="Grid Table 6 Colorful Accent 5" w:uiPriority="51"/>
-    <w:lsdException w:name="Grid Table 7 Colorful Accent 5" w:uiPriority="52"/>
-    <w:lsdException w:name="Grid Table 1 Light Accent 6" w:uiPriority="46"/>
-    <w:lsdException w:name="Grid Table 2 Accent 6" w:uiPriority="47"/>
-    <w:lsdException w:name="Grid Table 3 Accent 6" w:uiPriority="48"/>
-    <w:lsdException w:name="Grid Table 4 Accent 6" w:uiPriority="49"/>
-    <w:lsdException w:name="Grid Table 5 Dark Accent 6" w:uiPriority="50"/>
-    <w:lsdException w:name="Grid Table 6 Colorful Accent 6" w:uiPriority="51"/>
-    <w:lsdException w:name="Grid Table 7 Colorful Accent 6" w:uiPriority="52"/>
-    <w:lsdException w:name="List Table 1 Light" w:uiPriority="46"/>
-    <w:lsdException w:name="List Table 2" w:uiPriority="47"/>
-    <w:lsdException w:name="List Table 3" w:uiPriority="48"/>
-    <w:lsdException w:name="List Table 4" w:uiPriority="49"/>
-    <w:lsdException w:name="List Table 5 Dark" w:uiPriority="50"/>
-    <w:lsdException w:name="List Table 6 Colorful" w:uiPriority="51"/>
-    <w:lsdException w:name="List Table 7 Colorful" w:uiPriority="52"/>
-    <w:lsdException w:name="List Table 1 Light Accent 1" w:uiPriority="46"/>
-    <w:lsdException w:name="List Table 2 Accent 1" w:uiPriority="47"/>
-    <w:lsdException w:name="List Table 3 Accent 1" w:uiPriority="48"/>
-    <w:lsdException w:name="List Table 4 Accent 1" w:uiPriority="49"/>
-    <w:lsdException w:name="List Table 5 Dark Accent 1" w:uiPriority="50"/>
-    <w:lsdException w:name="List Table 6 Colorful Accent 1" w:uiPriority="51"/>
-    <w:lsdException w:name="List Table 7 Colorful Accent 1" w:uiPriority="52"/>
-    <w:lsdException w:name="List Table 1 Light Accent 2" w:uiPriority="46"/>
-    <w:lsdException w:name="List Table 2 Accent 2" w:uiPriority="47"/>
-    <w:lsdException w:name="List Table 3 Accent 2" w:uiPriority="48"/>
-    <w:lsdException w:name="List Table 4 Accent 2" w:uiPriority="49"/>
-    <w:lsdException w:name="List Table 5 Dark Accent 2" w:uiPriority="50"/>
-    <w:lsdException w:name="List Table 6 Colorful Accent 2" w:uiPriority="51"/>
-    <w:lsdException w:name="List Table 7 Colorful Accent 2" w:uiPriority="52"/>
-    <w:lsdException w:name="List Table 1 Light Accent 3" w:uiPriority="46"/>
-    <w:lsdException w:name="List Table 2 Accent 3" w:uiPriority="47"/>
-    <w:lsdException w:name="List Table 3 Accent 3" w:uiPriority="48"/>
-    <w:lsdException w:name="List Table 4 Accent 3" w:uiPriority="49"/>
-    <w:lsdException w:name="List Table 5 Dark Accent 3" w:uiPriority="50"/>
-    <w:lsdException w:name="List Table 6 Colorful Accent 3" w:uiPriority="51"/>
-    <w:lsdException w:name="List Table 7 Colorful Accent 3" w:uiPriority="52"/>
-    <w:lsdException w:name="List Table 1 Light Accent 4" w:uiPriority="46"/>
-    <w:lsdException w:name="List Table 2 Accent 4" w:uiPriority="47"/>
-    <w:lsdException w:name="List Table 3 Accent 4" w:uiPriority="48"/>
-    <w:lsdException w:name="List Table 4 Accent 4" w:uiPriority="49"/>
-    <w:lsdException w:name="List Table 5 Dark Accent 4" w:uiPriority="50"/>
-    <w:lsdException w:name="List Table 6 Colorful Accent 4" w:uiPriority="51"/>
-    <w:lsdException w:name="List Table 7 Colorful Accent 4" w:uiPriority="52"/>
-    <w:lsdException w:name="List Table 1 Light Accent 5" w:uiPriority="46"/>
-    <w:lsdException w:name="List Table 2 Accent 5" w:uiPriority="47"/>
-    <w:lsdException w:name="List Table 3 Accent 5" w:uiPriority="48"/>
-    <w:lsdException w:name="List Table 4 Accent 5" w:uiPriority="49"/>
-    <w:lsdException w:name="List Table 5 Dark Accent 5" w:uiPriority="50"/>
-    <w:lsdException w:name="List Table 6 Colorful Accent 5" w:uiPriority="51"/>
-    <w:lsdException w:name="List Table 7 Colorful Accent 5" w:uiPriority="52"/>
-    <w:lsdException w:name="List Table 1 Light Accent 6" w:uiPriority="46"/>
-    <w:lsdException w:name="List Table 2 Accent 6" w:uiPriority="47"/>
-    <w:lsdException w:name="List Table 3 Accent 6" w:uiPriority="48"/>
-    <w:lsdException w:name="List Table 4 Accent 6" w:uiPriority="49"/>
-    <w:lsdException w:name="List Table 5 Dark Accent 6" w:uiPriority="50"/>
-    <w:lsdException w:name="List Table 6 Colorful Accent 6" w:uiPriority="51"/>
-    <w:lsdException w:name="List Table 7 Colorful Accent 6" w:uiPriority="52"/>
-    <w:lsdException w:name="Mention" w:semiHidden="1" w:unhideWhenUsed="1"/>
-    <w:lsdException w:name="Smart Hyperlink" w:semiHidden="1" w:unhideWhenUsed="1"/>
-    <w:lsdException w:name="Hashtag" w:semiHidden="1" w:unhideWhenUsed="1"/>
-    <w:lsdException w:name="Unresolved Mention" w:semiHidden="1" w:unhideWhenUsed="1"/>
-    <w:lsdException w:name="Smart Link" w:semiHidden="1" w:unhideWhenUsed="1"/>
+  <w:latentStyles w:defLockedState="0" w:defUIPriority="99" w:defSemiHidden="1" w:defUnhideWhenUsed="1" w:defQFormat="0" w:count="267">
+    <w:lsdException w:name="Normal" w:semiHidden="0" w:uiPriority="0" w:unhideWhenUsed="0" w:qFormat="1"/>
+    <w:lsdException w:name="heading 1" w:semiHidden="0" w:uiPriority="9" w:unhideWhenUsed="0" w:qFormat="1"/>
+    <w:lsdException w:name="heading 2" w:uiPriority="9" w:qFormat="1"/>
+    <w:lsdException w:name="heading 3" w:uiPriority="9" w:qFormat="1"/>
+    <w:lsdException w:name="heading 4" w:uiPriority="9" w:qFormat="1"/>
+    <w:lsdException w:name="heading 5" w:uiPriority="9" w:qFormat="1"/>
+    <w:lsdException w:name="heading 6" w:uiPriority="9" w:qFormat="1"/>
+    <w:lsdException w:name="heading 7" w:uiPriority="9" w:qFormat="1"/>
+    <w:lsdException w:name="heading 8" w:uiPriority="9" w:qFormat="1"/>
+    <w:lsdException w:name="heading 9" w:uiPriority="9" w:qFormat="1"/>
+    <w:lsdException w:name="toc 1" w:uiPriority="39"/>
+    <w:lsdException w:name="toc 2" w:uiPriority="39"/>
+    <w:lsdException w:name="toc 3" w:uiPriority="39"/>
+    <w:lsdException w:name="toc 4" w:uiPriority="39"/>
+    <w:lsdException w:name="toc 5" w:uiPriority="39"/>
+    <w:lsdException w:name="toc 6" w:uiPriority="39"/>
+    <w:lsdException w:name="toc 7" w:uiPriority="39"/>
+    <w:lsdException w:name="toc 8" w:uiPriority="39"/>
+    <w:lsdException w:name="toc 9" w:uiPriority="39"/>
+    <w:lsdException w:name="caption" w:uiPriority="35" w:qFormat="1"/>
+    <w:lsdException w:name="Title" w:semiHidden="0" w:uiPriority="10" w:unhideWhenUsed="0" w:qFormat="1"/>
+    <w:lsdException w:name="Default Paragraph Font" w:uiPriority="1"/>
+    <w:lsdException w:name="Body Text" w:uiPriority="1" w:qFormat="1"/>
+    <w:lsdException w:name="Subtitle" w:semiHidden="0" w:uiPriority="11" w:unhideWhenUsed="0" w:qFormat="1"/>
+    <w:lsdException w:name="Strong" w:semiHidden="0" w:uiPriority="22" w:unhideWhenUsed="0" w:qFormat="1"/>
+    <w:lsdException w:name="Emphasis" w:semiHidden="0" w:uiPriority="20" w:unhideWhenUsed="0" w:qFormat="1"/>
+    <w:lsdException w:name="Table Grid" w:semiHidden="0" w:uiPriority="39" w:unhideWhenUsed="0"/>
+    <w:lsdException w:name="Placeholder Text" w:unhideWhenUsed="0"/>
+    <w:lsdException w:name="No Spacing" w:semiHidden="0" w:uiPriority="1" w:unhideWhenUsed="0" w:qFormat="1"/>
+    <w:lsdException w:name="Light Shading" w:semiHidden="0" w:uiPriority="60" w:unhideWhenUsed="0"/>
+    <w:lsdException w:name="Light List" w:semiHidden="0" w:uiPriority="61" w:unhideWhenUsed="0"/>
+    <w:lsdException w:name="Light Grid" w:semiHidden="0" w:uiPriority="62" w:unhideWhenUsed="0"/>
+    <w:lsdException w:name="Medium Shading 1" w:semiHidden="0" w:uiPriority="63" w:unhideWhenUsed="0"/>
+    <w:lsdException w:name="Medium Shading 2" w:semiHidden="0" w:uiPriority="64" w:unhideWhenUsed="0"/>
+    <w:lsdException w:name="Medium List 1" w:semiHidden="0" w:uiPriority="65" w:unhideWhenUsed="0"/>
+    <w:lsdException w:name="Medium List 2" w:semiHidden="0" w:uiPriority="66" w:unhideWhenUsed="0"/>
+    <w:lsdException w:name="Medium Grid 1" w:semiHidden="0" w:uiPriority="67" w:unhideWhenUsed="0"/>
+    <w:lsdException w:name="Medium Grid 2" w:semiHidden="0" w:uiPriority="68" w:unhideWhenUsed="0"/>
+    <w:lsdException w:name="Medium Grid 3" w:semiHidden="0" w:uiPriority="69" w:unhideWhenUsed="0"/>
+    <w:lsdException w:name="Dark List" w:semiHidden="0" w:uiPriority="70" w:unhideWhenUsed="0"/>
+    <w:lsdException w:name="Colorful Shading" w:semiHidden="0" w:uiPriority="71" w:unhideWhenUsed="0"/>
+    <w:lsdException w:name="Colorful List" w:semiHidden="0" w:uiPriority="72" w:unhideWhenUsed="0"/>
+    <w:lsdException w:name="Colorful Grid" w:semiHidden="0" w:uiPriority="73" w:unhideWhenUsed="0"/>
+    <w:lsdException w:name="Light Shading Accent 1" w:semiHidden="0" w:uiPriority="60" w:unhideWhenUsed="0"/>
+    <w:lsdException w:name="Light List Accent 1" w:semiHidden="0" w:uiPriority="61" w:unhideWhenUsed="0"/>
+    <w:lsdException w:name="Light Grid Accent 1" w:semiHidden="0" w:uiPriority="62" w:unhideWhenUsed="0"/>
+    <w:lsdException w:name="Medium Shading 1 Accent 1" w:semiHidden="0" w:uiPriority="63" w:unhideWhenUsed="0"/>
+    <w:lsdException w:name="Medium Shading 2 Accent 1" w:semiHidden="0" w:uiPriority="64" w:unhideWhenUsed="0"/>
+    <w:lsdException w:name="Medium List 1 Accent 1" w:semiHidden="0" w:uiPriority="65" w:unhideWhenUsed="0"/>
+    <w:lsdException w:name="Revision" w:unhideWhenUsed="0"/>
+    <w:lsdException w:name="List Paragraph" w:semiHidden="0" w:uiPriority="34" w:unhideWhenUsed="0" w:qFormat="1"/>
+    <w:lsdException w:name="Quote" w:semiHidden="0" w:uiPriority="29" w:unhideWhenUsed="0" w:qFormat="1"/>
+    <w:lsdException w:name="Intense Quote" w:semiHidden="0" w:uiPriority="30" w:unhideWhenUsed="0" w:qFormat="1"/>
+    <w:lsdException w:name="Medium List 2 Accent 1" w:semiHidden="0" w:uiPriority="66" w:unhideWhenUsed="0"/>
+    <w:lsdException w:name="Medium Grid 1 Accent 1" w:semiHidden="0" w:uiPriority="67" w:unhideWhenUsed="0"/>
+    <w:lsdException w:name="Medium Grid 2 Accent 1" w:semiHidden="0" w:uiPriority="68" w:unhideWhenUsed="0"/>
+    <w:lsdException w:name="Medium Grid 3 Accent 1" w:semiHidden="0" w:uiPriority="69" w:unhideWhenUsed="0"/>
+    <w:lsdException w:name="Dark List Accent 1" w:semiHidden="0" w:uiPriority="70" w:unhideWhenUsed="0"/>
+    <w:lsdException w:name="Colorful Shading Accent 1" w:semiHidden="0" w:uiPriority="71" w:unhideWhenUsed="0"/>
+    <w:lsdException w:name="Colorful List Accent 1" w:semiHidden="0" w:uiPriority="72" w:unhideWhenUsed="0"/>
+    <w:lsdException w:name="Colorful Grid Accent 1" w:semiHidden="0" w:uiPriority="73" w:unhideWhenUsed="0"/>
+    <w:lsdException w:name="Light Shading Accent 2" w:semiHidden="0" w:uiPriority="60" w:unhideWhenUsed="0"/>
+    <w:lsdException w:name="Light List Accent 2" w:semiHidden="0" w:uiPriority="61" w:unhideWhenUsed="0"/>
+    <w:lsdException w:name="Light Grid Accent 2" w:semiHidden="0" w:uiPriority="62" w:unhideWhenUsed="0"/>
+    <w:lsdException w:name="Medium Shading 1 Accent 2" w:semiHidden="0" w:uiPriority="63" w:unhideWhenUsed="0"/>
+    <w:lsdException w:name="Medium Shading 2 Accent 2" w:semiHidden="0" w:uiPriority="64" w:unhideWhenUsed="0"/>
+    <w:lsdException w:name="Medium List 1 Accent 2" w:semiHidden="0" w:uiPriority="65" w:unhideWhenUsed="0"/>
+    <w:lsdException w:name="Medium List 2 Accent 2" w:semiHidden="0" w:uiPriority="66" w:unhideWhenUsed="0"/>
+    <w:lsdException w:name="Medium Grid 1 Accent 2" w:semiHidden="0" w:uiPriority="67" w:unhideWhenUsed="0"/>
+    <w:lsdException w:name="Medium Grid 2 Accent 2" w:semiHidden="0" w:uiPriority="68" w:unhideWhenUsed="0"/>
+    <w:lsdException w:name="Medium Grid 3 Accent 2" w:semiHidden="0" w:uiPriority="69" w:unhideWhenUsed="0"/>
+    <w:lsdException w:name="Dark List Accent 2" w:semiHidden="0" w:uiPriority="70" w:unhideWhenUsed="0"/>
+    <w:lsdException w:name="Colorful Shading Accent 2" w:semiHidden="0" w:uiPriority="71" w:unhideWhenUsed="0"/>
+    <w:lsdException w:name="Colorful List Accent 2" w:semiHidden="0" w:uiPriority="72" w:unhideWhenUsed="0"/>
+    <w:lsdException w:name="Colorful Grid Accent 2" w:semiHidden="0" w:uiPriority="73" w:unhideWhenUsed="0"/>
+    <w:lsdException w:name="Light Shading Accent 3" w:semiHidden="0" w:uiPriority="60" w:unhideWhenUsed="0"/>
+    <w:lsdException w:name="Light List Accent 3" w:semiHidden="0" w:uiPriority="61" w:unhideWhenUsed="0"/>
+    <w:lsdException w:name="Light Grid Accent 3" w:semiHidden="0" w:uiPriority="62" w:unhideWhenUsed="0"/>
+    <w:lsdException w:name="Medium Shading 1 Accent 3" w:semiHidden="0" w:uiPriority="63" w:unhideWhenUsed="0"/>
+    <w:lsdException w:name="Medium Shading 2 Accent 3" w:semiHidden="0" w:uiPriority="64" w:unhideWhenUsed="0"/>
+    <w:lsdException w:name="Medium List 1 Accent 3" w:semiHidden="0" w:uiPriority="65" w:unhideWhenUsed="0"/>
+    <w:lsdException w:name="Medium List 2 Accent 3" w:semiHidden="0" w:uiPriority="66" w:unhideWhenUsed="0"/>
+    <w:lsdException w:name="Medium Grid 1 Accent 3" w:semiHidden="0" w:uiPriority="67" w:unhideWhenUsed="0"/>
+    <w:lsdException w:name="Medium Grid 2 Accent 3" w:semiHidden="0" w:uiPriority="68" w:unhideWhenUsed="0"/>
+    <w:lsdException w:name="Medium Grid 3 Accent 3" w:semiHidden="0" w:uiPriority="69" w:unhideWhenUsed="0"/>
+    <w:lsdException w:name="Dark List Accent 3" w:semiHidden="0" w:uiPriority="70" w:unhideWhenUsed="0"/>
+    <w:lsdException w:name="Colorful Shading Accent 3" w:semiHidden="0" w:uiPriority="71" w:unhideWhenUsed="0"/>
+    <w:lsdException w:name="Colorful List Accent 3" w:semiHidden="0" w:uiPriority="72" w:unhideWhenUsed="0"/>
+    <w:lsdException w:name="Colorful Grid Accent 3" w:semiHidden="0" w:uiPriority="73" w:unhideWhenUsed="0"/>
+    <w:lsdException w:name="Light Shading Accent 4" w:semiHidden="0" w:uiPriority="60" w:unhideWhenUsed="0"/>
+    <w:lsdException w:name="Light List Accent 4" w:semiHidden="0" w:uiPriority="61" w:unhideWhenUsed="0"/>
+    <w:lsdException w:name="Light Grid Accent 4" w:semiHidden="0" w:uiPriority="62" w:unhideWhenUsed="0"/>
+    <w:lsdException w:name="Medium Shading 1 Accent 4" w:semiHidden="0" w:uiPriority="63" w:unhideWhenUsed="0"/>
+    <w:lsdException w:name="Medium Shading 2 Accent 4" w:semiHidden="0" w:uiPriority="64" w:unhideWhenUsed="0"/>
+    <w:lsdException w:name="Medium List 1 Accent 4" w:semiHidden="0" w:uiPriority="65" w:unhideWhenUsed="0"/>
+    <w:lsdException w:name="Medium List 2 Accent 4" w:semiHidden="0" w:uiPriority="66" w:unhideWhenUsed="0"/>
+    <w:lsdException w:name="Medium Grid 1 Accent 4" w:semiHidden="0" w:uiPriority="67" w:unhideWhenUsed="0"/>
+    <w:lsdException w:name="Medium Grid 2 Accent 4" w:semiHidden="0" w:uiPriority="68" w:unhideWhenUsed="0"/>
+    <w:lsdException w:name="Medium Grid 3 Accent 4" w:semiHidden="0" w:uiPriority="69" w:unhideWhenUsed="0"/>
+    <w:lsdException w:name="Dark List Accent 4" w:semiHidden="0" w:uiPriority="70" w:unhideWhenUsed="0"/>
+    <w:lsdException w:name="Colorful Shading Accent 4" w:semiHidden="0" w:uiPriority="71" w:unhideWhenUsed="0"/>
+    <w:lsdException w:name="Colorful List Accent 4" w:semiHidden="0" w:uiPriority="72" w:unhideWhenUsed="0"/>
+    <w:lsdException w:name="Colorful Grid Accent 4" w:semiHidden="0" w:uiPriority="73" w:unhideWhenUsed="0"/>
+    <w:lsdException w:name="Light Shading Accent 5" w:semiHidden="0" w:uiPriority="60" w:unhideWhenUsed="0"/>
+    <w:lsdException w:name="Light List Accent 5" w:semiHidden="0" w:uiPriority="61" w:unhideWhenUsed="0"/>
+    <w:lsdException w:name="Light Grid Accent 5" w:semiHidden="0" w:uiPriority="62" w:unhideWhenUsed="0"/>
+    <w:lsdException w:name="Medium Shading 1 Accent 5" w:semiHidden="0" w:uiPriority="63" w:unhideWhenUsed="0"/>
+    <w:lsdException w:name="Medium Shading 2 Accent 5" w:semiHidden="0" w:uiPriority="64" w:unhideWhenUsed="0"/>
+    <w:lsdException w:name="Medium List 1 Accent 5" w:semiHidden="0" w:uiPriority="65" w:unhideWhenUsed="0"/>
+    <w:lsdException w:name="Medium List 2 Accent 5" w:semiHidden="0" w:uiPriority="66" w:unhideWhenUsed="0"/>
+    <w:lsdException w:name="Medium Grid 1 Accent 5" w:semiHidden="0" w:uiPriority="67" w:unhideWhenUsed="0"/>
+    <w:lsdException w:name="Medium Grid 2 Accent 5" w:semiHidden="0" w:uiPriority="68" w:unhideWhenUsed="0"/>
+    <w:lsdException w:name="Medium Grid 3 Accent 5" w:semiHidden="0" w:uiPriority="69" w:unhideWhenUsed="0"/>
+    <w:lsdException w:name="Dark List Accent 5" w:semiHidden="0" w:uiPriority="70" w:unhideWhenUsed="0"/>
+    <w:lsdException w:name="Colorful Shading Accent 5" w:semiHidden="0" w:uiPriority="71" w:unhideWhenUsed="0"/>
+    <w:lsdException w:name="Colorful List Accent 5" w:semiHidden="0" w:uiPriority="72" w:unhideWhenUsed="0"/>
+    <w:lsdException w:name="Colorful Grid Accent 5" w:semiHidden="0" w:uiPriority="73" w:unhideWhenUsed="0"/>
+    <w:lsdException w:name="Light Shading Accent 6" w:semiHidden="0" w:uiPriority="60" w:unhideWhenUsed="0"/>
+    <w:lsdException w:name="Light List Accent 6" w:semiHidden="0" w:uiPriority="61" w:unhideWhenUsed="0"/>
+    <w:lsdException w:name="Light Grid Accent 6" w:semiHidden="0" w:uiPriority="62" w:unhideWhenUsed="0"/>
+    <w:lsdException w:name="Medium Shading 1 Accent 6" w:semiHidden="0" w:uiPriority="63" w:unhideWhenUsed="0"/>
+    <w:lsdException w:name="Medium Shading 2 Accent 6" w:semiHidden="0" w:uiPriority="64" w:unhideWhenUsed="0"/>
+    <w:lsdException w:name="Medium List 1 Accent 6" w:semiHidden="0" w:uiPriority="65" w:unhideWhenUsed="0"/>
+    <w:lsdException w:name="Medium List 2 Accent 6" w:semiHidden="0" w:uiPriority="66" w:unhideWhenUsed="0"/>
+    <w:lsdException w:name="Medium Grid 1 Accent 6" w:semiHidden="0" w:uiPriority="67" w:unhideWhenUsed="0"/>
+    <w:lsdException w:name="Medium Grid 2 Accent 6" w:semiHidden="0" w:uiPriority="68" w:unhideWhenUsed="0"/>
+    <w:lsdException w:name="Medium Grid 3 Accent 6" w:semiHidden="0" w:uiPriority="69" w:unhideWhenUsed="0"/>
+    <w:lsdException w:name="Dark List Accent 6" w:semiHidden="0" w:uiPriority="70" w:unhideWhenUsed="0"/>
+    <w:lsdException w:name="Colorful Shading Accent 6" w:semiHidden="0" w:uiPriority="71" w:unhideWhenUsed="0"/>
+    <w:lsdException w:name="Colorful List Accent 6" w:semiHidden="0" w:uiPriority="72" w:unhideWhenUsed="0"/>
+    <w:lsdException w:name="Colorful Grid Accent 6" w:semiHidden="0" w:uiPriority="73" w:unhideWhenUsed="0"/>
+    <w:lsdException w:name="Subtle Emphasis" w:semiHidden="0" w:uiPriority="19" w:unhideWhenUsed="0" w:qFormat="1"/>
+    <w:lsdException w:name="Intense Emphasis" w:semiHidden="0" w:uiPriority="21" w:unhideWhenUsed="0" w:qFormat="1"/>
+    <w:lsdException w:name="Subtle Reference" w:semiHidden="0" w:uiPriority="31" w:unhideWhenUsed="0" w:qFormat="1"/>
+    <w:lsdException w:name="Intense Reference" w:semiHidden="0" w:uiPriority="32" w:unhideWhenUsed="0" w:qFormat="1"/>
+    <w:lsdException w:name="Book Title" w:semiHidden="0" w:uiPriority="33" w:unhideWhenUsed="0" w:qFormat="1"/>
+    <w:lsdException w:name="Bibliography" w:uiPriority="37"/>
+    <w:lsdException w:name="TOC Heading" w:uiPriority="39" w:qFormat="1"/>
   </w:latentStyles>
   <w:style w:type="paragraph" w:default="1" w:styleId="Normal">
     <w:name w:val="Normal"/>
@@ -10074,7 +9893,1585 @@
       <w:shd w:val="clear" w:color="auto" w:fill="E1DFDD"/>
     </w:rPr>
   </w:style>
-  <w:style w:type="character" w:styleId="UnresolvedMention">
+  <w:style w:type="character" w:customStyle="1" w:styleId="UnresolvedMention">
+    <w:name w:val="Unresolved Mention"/>
+    <w:basedOn w:val="DefaultParagraphFont"/>
+    <w:uiPriority w:val="99"/>
+    <w:semiHidden/>
+    <w:unhideWhenUsed/>
+    <w:rsid w:val="000A7BA4"/>
+    <w:rPr>
+      <w:color w:val="605E5C"/>
+      <w:shd w:val="clear" w:color="auto" w:fill="E1DFDD"/>
+    </w:rPr>
+  </w:style>
+</w:styles>
+</file>
+
+<file path=word/stylesWithEffects.xml><?xml version="1.0" encoding="utf-8"?>
+<w:styles xmlns:wpc="http://schemas.microsoft.com/office/word/2010/wordprocessingCanvas" xmlns:mc="http://schemas.openxmlformats.org/markup-compatibility/2006" xmlns:o="urn:schemas-microsoft-com:office:office" xmlns:r="http://schemas.openxmlformats.org/officeDocument/2006/relationships" xmlns:m="http://schemas.openxmlformats.org/officeDocument/2006/math" xmlns:v="urn:schemas-microsoft-com:vml" xmlns:wp14="http://schemas.microsoft.com/office/word/2010/wordprocessingDrawing" xmlns:wp="http://schemas.openxmlformats.org/drawingml/2006/wordprocessingDrawing" xmlns:w10="urn:schemas-microsoft-com:office:word" xmlns:w="http://schemas.openxmlformats.org/wordprocessingml/2006/main" xmlns:w14="http://schemas.microsoft.com/office/word/2010/wordml" xmlns:wpg="http://schemas.microsoft.com/office/word/2010/wordprocessingGroup" xmlns:wpi="http://schemas.microsoft.com/office/word/2010/wordprocessingInk" xmlns:wne="http://schemas.microsoft.com/office/word/2006/wordml" xmlns:wps="http://schemas.microsoft.com/office/word/2010/wordprocessingShape" mc:Ignorable="w14 wp14">
+  <w:docDefaults>
+    <w:rPrDefault>
+      <w:rPr>
+        <w:rFonts w:asciiTheme="minorHAnsi" w:eastAsia="Arial" w:hAnsiTheme="minorHAnsi" w:cstheme="minorBidi"/>
+        <w:sz w:val="22"/>
+        <w:szCs w:val="22"/>
+        <w:lang w:val="en-US" w:eastAsia="en-US" w:bidi="ar-SA"/>
+      </w:rPr>
+    </w:rPrDefault>
+    <w:pPrDefault>
+      <w:pPr>
+        <w:suppressAutoHyphens/>
+      </w:pPr>
+    </w:pPrDefault>
+  </w:docDefaults>
+  <w:latentStyles w:defLockedState="0" w:defUIPriority="99" w:defSemiHidden="1" w:defUnhideWhenUsed="1" w:defQFormat="0" w:count="267">
+    <w:lsdException w:name="Normal" w:semiHidden="0" w:uiPriority="0" w:unhideWhenUsed="0" w:qFormat="1"/>
+    <w:lsdException w:name="heading 1" w:semiHidden="0" w:uiPriority="9" w:unhideWhenUsed="0" w:qFormat="1"/>
+    <w:lsdException w:name="heading 2" w:uiPriority="9" w:qFormat="1"/>
+    <w:lsdException w:name="heading 3" w:uiPriority="9" w:qFormat="1"/>
+    <w:lsdException w:name="heading 4" w:uiPriority="9" w:qFormat="1"/>
+    <w:lsdException w:name="heading 5" w:uiPriority="9" w:qFormat="1"/>
+    <w:lsdException w:name="heading 6" w:uiPriority="9" w:qFormat="1"/>
+    <w:lsdException w:name="heading 7" w:uiPriority="9" w:qFormat="1"/>
+    <w:lsdException w:name="heading 8" w:uiPriority="9" w:qFormat="1"/>
+    <w:lsdException w:name="heading 9" w:uiPriority="9" w:qFormat="1"/>
+    <w:lsdException w:name="toc 1" w:uiPriority="39"/>
+    <w:lsdException w:name="toc 2" w:uiPriority="39"/>
+    <w:lsdException w:name="toc 3" w:uiPriority="39"/>
+    <w:lsdException w:name="toc 4" w:uiPriority="39"/>
+    <w:lsdException w:name="toc 5" w:uiPriority="39"/>
+    <w:lsdException w:name="toc 6" w:uiPriority="39"/>
+    <w:lsdException w:name="toc 7" w:uiPriority="39"/>
+    <w:lsdException w:name="toc 8" w:uiPriority="39"/>
+    <w:lsdException w:name="toc 9" w:uiPriority="39"/>
+    <w:lsdException w:name="caption" w:uiPriority="35" w:qFormat="1"/>
+    <w:lsdException w:name="Title" w:semiHidden="0" w:uiPriority="10" w:unhideWhenUsed="0" w:qFormat="1"/>
+    <w:lsdException w:name="Default Paragraph Font" w:uiPriority="1"/>
+    <w:lsdException w:name="Body Text" w:uiPriority="1" w:qFormat="1"/>
+    <w:lsdException w:name="Subtitle" w:semiHidden="0" w:uiPriority="11" w:unhideWhenUsed="0" w:qFormat="1"/>
+    <w:lsdException w:name="Strong" w:semiHidden="0" w:uiPriority="22" w:unhideWhenUsed="0" w:qFormat="1"/>
+    <w:lsdException w:name="Emphasis" w:semiHidden="0" w:uiPriority="20" w:unhideWhenUsed="0" w:qFormat="1"/>
+    <w:lsdException w:name="Table Grid" w:semiHidden="0" w:uiPriority="39" w:unhideWhenUsed="0"/>
+    <w:lsdException w:name="Placeholder Text" w:unhideWhenUsed="0"/>
+    <w:lsdException w:name="No Spacing" w:semiHidden="0" w:uiPriority="1" w:unhideWhenUsed="0" w:qFormat="1"/>
+    <w:lsdException w:name="Light Shading" w:semiHidden="0" w:uiPriority="60" w:unhideWhenUsed="0"/>
+    <w:lsdException w:name="Light List" w:semiHidden="0" w:uiPriority="61" w:unhideWhenUsed="0"/>
+    <w:lsdException w:name="Light Grid" w:semiHidden="0" w:uiPriority="62" w:unhideWhenUsed="0"/>
+    <w:lsdException w:name="Medium Shading 1" w:semiHidden="0" w:uiPriority="63" w:unhideWhenUsed="0"/>
+    <w:lsdException w:name="Medium Shading 2" w:semiHidden="0" w:uiPriority="64" w:unhideWhenUsed="0"/>
+    <w:lsdException w:name="Medium List 1" w:semiHidden="0" w:uiPriority="65" w:unhideWhenUsed="0"/>
+    <w:lsdException w:name="Medium List 2" w:semiHidden="0" w:uiPriority="66" w:unhideWhenUsed="0"/>
+    <w:lsdException w:name="Medium Grid 1" w:semiHidden="0" w:uiPriority="67" w:unhideWhenUsed="0"/>
+    <w:lsdException w:name="Medium Grid 2" w:semiHidden="0" w:uiPriority="68" w:unhideWhenUsed="0"/>
+    <w:lsdException w:name="Medium Grid 3" w:semiHidden="0" w:uiPriority="69" w:unhideWhenUsed="0"/>
+    <w:lsdException w:name="Dark List" w:semiHidden="0" w:uiPriority="70" w:unhideWhenUsed="0"/>
+    <w:lsdException w:name="Colorful Shading" w:semiHidden="0" w:uiPriority="71" w:unhideWhenUsed="0"/>
+    <w:lsdException w:name="Colorful List" w:semiHidden="0" w:uiPriority="72" w:unhideWhenUsed="0"/>
+    <w:lsdException w:name="Colorful Grid" w:semiHidden="0" w:uiPriority="73" w:unhideWhenUsed="0"/>
+    <w:lsdException w:name="Light Shading Accent 1" w:semiHidden="0" w:uiPriority="60" w:unhideWhenUsed="0"/>
+    <w:lsdException w:name="Light List Accent 1" w:semiHidden="0" w:uiPriority="61" w:unhideWhenUsed="0"/>
+    <w:lsdException w:name="Light Grid Accent 1" w:semiHidden="0" w:uiPriority="62" w:unhideWhenUsed="0"/>
+    <w:lsdException w:name="Medium Shading 1 Accent 1" w:semiHidden="0" w:uiPriority="63" w:unhideWhenUsed="0"/>
+    <w:lsdException w:name="Medium Shading 2 Accent 1" w:semiHidden="0" w:uiPriority="64" w:unhideWhenUsed="0"/>
+    <w:lsdException w:name="Medium List 1 Accent 1" w:semiHidden="0" w:uiPriority="65" w:unhideWhenUsed="0"/>
+    <w:lsdException w:name="Revision" w:unhideWhenUsed="0"/>
+    <w:lsdException w:name="List Paragraph" w:semiHidden="0" w:uiPriority="34" w:unhideWhenUsed="0" w:qFormat="1"/>
+    <w:lsdException w:name="Quote" w:semiHidden="0" w:uiPriority="29" w:unhideWhenUsed="0" w:qFormat="1"/>
+    <w:lsdException w:name="Intense Quote" w:semiHidden="0" w:uiPriority="30" w:unhideWhenUsed="0" w:qFormat="1"/>
+    <w:lsdException w:name="Medium List 2 Accent 1" w:semiHidden="0" w:uiPriority="66" w:unhideWhenUsed="0"/>
+    <w:lsdException w:name="Medium Grid 1 Accent 1" w:semiHidden="0" w:uiPriority="67" w:unhideWhenUsed="0"/>
+    <w:lsdException w:name="Medium Grid 2 Accent 1" w:semiHidden="0" w:uiPriority="68" w:unhideWhenUsed="0"/>
+    <w:lsdException w:name="Medium Grid 3 Accent 1" w:semiHidden="0" w:uiPriority="69" w:unhideWhenUsed="0"/>
+    <w:lsdException w:name="Dark List Accent 1" w:semiHidden="0" w:uiPriority="70" w:unhideWhenUsed="0"/>
+    <w:lsdException w:name="Colorful Shading Accent 1" w:semiHidden="0" w:uiPriority="71" w:unhideWhenUsed="0"/>
+    <w:lsdException w:name="Colorful List Accent 1" w:semiHidden="0" w:uiPriority="72" w:unhideWhenUsed="0"/>
+    <w:lsdException w:name="Colorful Grid Accent 1" w:semiHidden="0" w:uiPriority="73" w:unhideWhenUsed="0"/>
+    <w:lsdException w:name="Light Shading Accent 2" w:semiHidden="0" w:uiPriority="60" w:unhideWhenUsed="0"/>
+    <w:lsdException w:name="Light List Accent 2" w:semiHidden="0" w:uiPriority="61" w:unhideWhenUsed="0"/>
+    <w:lsdException w:name="Light Grid Accent 2" w:semiHidden="0" w:uiPriority="62" w:unhideWhenUsed="0"/>
+    <w:lsdException w:name="Medium Shading 1 Accent 2" w:semiHidden="0" w:uiPriority="63" w:unhideWhenUsed="0"/>
+    <w:lsdException w:name="Medium Shading 2 Accent 2" w:semiHidden="0" w:uiPriority="64" w:unhideWhenUsed="0"/>
+    <w:lsdException w:name="Medium List 1 Accent 2" w:semiHidden="0" w:uiPriority="65" w:unhideWhenUsed="0"/>
+    <w:lsdException w:name="Medium List 2 Accent 2" w:semiHidden="0" w:uiPriority="66" w:unhideWhenUsed="0"/>
+    <w:lsdException w:name="Medium Grid 1 Accent 2" w:semiHidden="0" w:uiPriority="67" w:unhideWhenUsed="0"/>
+    <w:lsdException w:name="Medium Grid 2 Accent 2" w:semiHidden="0" w:uiPriority="68" w:unhideWhenUsed="0"/>
+    <w:lsdException w:name="Medium Grid 3 Accent 2" w:semiHidden="0" w:uiPriority="69" w:unhideWhenUsed="0"/>
+    <w:lsdException w:name="Dark List Accent 2" w:semiHidden="0" w:uiPriority="70" w:unhideWhenUsed="0"/>
+    <w:lsdException w:name="Colorful Shading Accent 2" w:semiHidden="0" w:uiPriority="71" w:unhideWhenUsed="0"/>
+    <w:lsdException w:name="Colorful List Accent 2" w:semiHidden="0" w:uiPriority="72" w:unhideWhenUsed="0"/>
+    <w:lsdException w:name="Colorful Grid Accent 2" w:semiHidden="0" w:uiPriority="73" w:unhideWhenUsed="0"/>
+    <w:lsdException w:name="Light Shading Accent 3" w:semiHidden="0" w:uiPriority="60" w:unhideWhenUsed="0"/>
+    <w:lsdException w:name="Light List Accent 3" w:semiHidden="0" w:uiPriority="61" w:unhideWhenUsed="0"/>
+    <w:lsdException w:name="Light Grid Accent 3" w:semiHidden="0" w:uiPriority="62" w:unhideWhenUsed="0"/>
+    <w:lsdException w:name="Medium Shading 1 Accent 3" w:semiHidden="0" w:uiPriority="63" w:unhideWhenUsed="0"/>
+    <w:lsdException w:name="Medium Shading 2 Accent 3" w:semiHidden="0" w:uiPriority="64" w:unhideWhenUsed="0"/>
+    <w:lsdException w:name="Medium List 1 Accent 3" w:semiHidden="0" w:uiPriority="65" w:unhideWhenUsed="0"/>
+    <w:lsdException w:name="Medium List 2 Accent 3" w:semiHidden="0" w:uiPriority="66" w:unhideWhenUsed="0"/>
+    <w:lsdException w:name="Medium Grid 1 Accent 3" w:semiHidden="0" w:uiPriority="67" w:unhideWhenUsed="0"/>
+    <w:lsdException w:name="Medium Grid 2 Accent 3" w:semiHidden="0" w:uiPriority="68" w:unhideWhenUsed="0"/>
+    <w:lsdException w:name="Medium Grid 3 Accent 3" w:semiHidden="0" w:uiPriority="69" w:unhideWhenUsed="0"/>
+    <w:lsdException w:name="Dark List Accent 3" w:semiHidden="0" w:uiPriority="70" w:unhideWhenUsed="0"/>
+    <w:lsdException w:name="Colorful Shading Accent 3" w:semiHidden="0" w:uiPriority="71" w:unhideWhenUsed="0"/>
+    <w:lsdException w:name="Colorful List Accent 3" w:semiHidden="0" w:uiPriority="72" w:unhideWhenUsed="0"/>
+    <w:lsdException w:name="Colorful Grid Accent 3" w:semiHidden="0" w:uiPriority="73" w:unhideWhenUsed="0"/>
+    <w:lsdException w:name="Light Shading Accent 4" w:semiHidden="0" w:uiPriority="60" w:unhideWhenUsed="0"/>
+    <w:lsdException w:name="Light List Accent 4" w:semiHidden="0" w:uiPriority="61" w:unhideWhenUsed="0"/>
+    <w:lsdException w:name="Light Grid Accent 4" w:semiHidden="0" w:uiPriority="62" w:unhideWhenUsed="0"/>
+    <w:lsdException w:name="Medium Shading 1 Accent 4" w:semiHidden="0" w:uiPriority="63" w:unhideWhenUsed="0"/>
+    <w:lsdException w:name="Medium Shading 2 Accent 4" w:semiHidden="0" w:uiPriority="64" w:unhideWhenUsed="0"/>
+    <w:lsdException w:name="Medium List 1 Accent 4" w:semiHidden="0" w:uiPriority="65" w:unhideWhenUsed="0"/>
+    <w:lsdException w:name="Medium List 2 Accent 4" w:semiHidden="0" w:uiPriority="66" w:unhideWhenUsed="0"/>
+    <w:lsdException w:name="Medium Grid 1 Accent 4" w:semiHidden="0" w:uiPriority="67" w:unhideWhenUsed="0"/>
+    <w:lsdException w:name="Medium Grid 2 Accent 4" w:semiHidden="0" w:uiPriority="68" w:unhideWhenUsed="0"/>
+    <w:lsdException w:name="Medium Grid 3 Accent 4" w:semiHidden="0" w:uiPriority="69" w:unhideWhenUsed="0"/>
+    <w:lsdException w:name="Dark List Accent 4" w:semiHidden="0" w:uiPriority="70" w:unhideWhenUsed="0"/>
+    <w:lsdException w:name="Colorful Shading Accent 4" w:semiHidden="0" w:uiPriority="71" w:unhideWhenUsed="0"/>
+    <w:lsdException w:name="Colorful List Accent 4" w:semiHidden="0" w:uiPriority="72" w:unhideWhenUsed="0"/>
+    <w:lsdException w:name="Colorful Grid Accent 4" w:semiHidden="0" w:uiPriority="73" w:unhideWhenUsed="0"/>
+    <w:lsdException w:name="Light Shading Accent 5" w:semiHidden="0" w:uiPriority="60" w:unhideWhenUsed="0"/>
+    <w:lsdException w:name="Light List Accent 5" w:semiHidden="0" w:uiPriority="61" w:unhideWhenUsed="0"/>
+    <w:lsdException w:name="Light Grid Accent 5" w:semiHidden="0" w:uiPriority="62" w:unhideWhenUsed="0"/>
+    <w:lsdException w:name="Medium Shading 1 Accent 5" w:semiHidden="0" w:uiPriority="63" w:unhideWhenUsed="0"/>
+    <w:lsdException w:name="Medium Shading 2 Accent 5" w:semiHidden="0" w:uiPriority="64" w:unhideWhenUsed="0"/>
+    <w:lsdException w:name="Medium List 1 Accent 5" w:semiHidden="0" w:uiPriority="65" w:unhideWhenUsed="0"/>
+    <w:lsdException w:name="Medium List 2 Accent 5" w:semiHidden="0" w:uiPriority="66" w:unhideWhenUsed="0"/>
+    <w:lsdException w:name="Medium Grid 1 Accent 5" w:semiHidden="0" w:uiPriority="67" w:unhideWhenUsed="0"/>
+    <w:lsdException w:name="Medium Grid 2 Accent 5" w:semiHidden="0" w:uiPriority="68" w:unhideWhenUsed="0"/>
+    <w:lsdException w:name="Medium Grid 3 Accent 5" w:semiHidden="0" w:uiPriority="69" w:unhideWhenUsed="0"/>
+    <w:lsdException w:name="Dark List Accent 5" w:semiHidden="0" w:uiPriority="70" w:unhideWhenUsed="0"/>
+    <w:lsdException w:name="Colorful Shading Accent 5" w:semiHidden="0" w:uiPriority="71" w:unhideWhenUsed="0"/>
+    <w:lsdException w:name="Colorful List Accent 5" w:semiHidden="0" w:uiPriority="72" w:unhideWhenUsed="0"/>
+    <w:lsdException w:name="Colorful Grid Accent 5" w:semiHidden="0" w:uiPriority="73" w:unhideWhenUsed="0"/>
+    <w:lsdException w:name="Light Shading Accent 6" w:semiHidden="0" w:uiPriority="60" w:unhideWhenUsed="0"/>
+    <w:lsdException w:name="Light List Accent 6" w:semiHidden="0" w:uiPriority="61" w:unhideWhenUsed="0"/>
+    <w:lsdException w:name="Light Grid Accent 6" w:semiHidden="0" w:uiPriority="62" w:unhideWhenUsed="0"/>
+    <w:lsdException w:name="Medium Shading 1 Accent 6" w:semiHidden="0" w:uiPriority="63" w:unhideWhenUsed="0"/>
+    <w:lsdException w:name="Medium Shading 2 Accent 6" w:semiHidden="0" w:uiPriority="64" w:unhideWhenUsed="0"/>
+    <w:lsdException w:name="Medium List 1 Accent 6" w:semiHidden="0" w:uiPriority="65" w:unhideWhenUsed="0"/>
+    <w:lsdException w:name="Medium List 2 Accent 6" w:semiHidden="0" w:uiPriority="66" w:unhideWhenUsed="0"/>
+    <w:lsdException w:name="Medium Grid 1 Accent 6" w:semiHidden="0" w:uiPriority="67" w:unhideWhenUsed="0"/>
+    <w:lsdException w:name="Medium Grid 2 Accent 6" w:semiHidden="0" w:uiPriority="68" w:unhideWhenUsed="0"/>
+    <w:lsdException w:name="Medium Grid 3 Accent 6" w:semiHidden="0" w:uiPriority="69" w:unhideWhenUsed="0"/>
+    <w:lsdException w:name="Dark List Accent 6" w:semiHidden="0" w:uiPriority="70" w:unhideWhenUsed="0"/>
+    <w:lsdException w:name="Colorful Shading Accent 6" w:semiHidden="0" w:uiPriority="71" w:unhideWhenUsed="0"/>
+    <w:lsdException w:name="Colorful List Accent 6" w:semiHidden="0" w:uiPriority="72" w:unhideWhenUsed="0"/>
+    <w:lsdException w:name="Colorful Grid Accent 6" w:semiHidden="0" w:uiPriority="73" w:unhideWhenUsed="0"/>
+    <w:lsdException w:name="Subtle Emphasis" w:semiHidden="0" w:uiPriority="19" w:unhideWhenUsed="0" w:qFormat="1"/>
+    <w:lsdException w:name="Intense Emphasis" w:semiHidden="0" w:uiPriority="21" w:unhideWhenUsed="0" w:qFormat="1"/>
+    <w:lsdException w:name="Subtle Reference" w:semiHidden="0" w:uiPriority="31" w:unhideWhenUsed="0" w:qFormat="1"/>
+    <w:lsdException w:name="Intense Reference" w:semiHidden="0" w:uiPriority="32" w:unhideWhenUsed="0" w:qFormat="1"/>
+    <w:lsdException w:name="Book Title" w:semiHidden="0" w:uiPriority="33" w:unhideWhenUsed="0" w:qFormat="1"/>
+    <w:lsdException w:name="Bibliography" w:uiPriority="37"/>
+    <w:lsdException w:name="TOC Heading" w:uiPriority="39" w:qFormat="1"/>
+  </w:latentStyles>
+  <w:style w:type="paragraph" w:default="1" w:styleId="Normal">
+    <w:name w:val="Normal"/>
+    <w:qFormat/>
+    <w:rsid w:val="00EC6368"/>
+    <w:pPr>
+      <w:suppressAutoHyphens w:val="0"/>
+      <w:spacing w:before="-1" w:beforeAutospacing="1" w:after="-1" w:afterAutospacing="1"/>
+    </w:pPr>
+    <w:rPr>
+      <w:rFonts w:ascii="Arial" w:hAnsi="Arial" w:cs="Arial"/>
+    </w:rPr>
+  </w:style>
+  <w:style w:type="paragraph" w:styleId="Heading1">
+    <w:name w:val="heading 1"/>
+    <w:basedOn w:val="BodyText"/>
+    <w:link w:val="Heading1Char"/>
+    <w:uiPriority w:val="9"/>
+    <w:qFormat/>
+    <w:rsid w:val="00EC6368"/>
+    <w:pPr>
+      <w:pBdr>
+        <w:bottom w:val="single" w:sz="4" w:space="1" w:color="A6A6A6" w:themeColor="background1" w:themeShade="A6"/>
+      </w:pBdr>
+      <w:spacing w:before="0" w:beforeAutospacing="0" w:after="100"/>
+      <w:outlineLvl w:val="0"/>
+    </w:pPr>
+    <w:rPr>
+      <w:color w:val="0A2A78"/>
+      <w:spacing w:val="-4"/>
+      <w:sz w:val="40"/>
+    </w:rPr>
+  </w:style>
+  <w:style w:type="paragraph" w:styleId="Heading2">
+    <w:name w:val="heading 2"/>
+    <w:basedOn w:val="BodyText"/>
+    <w:next w:val="BodyText"/>
+    <w:link w:val="Heading2Char"/>
+    <w:uiPriority w:val="9"/>
+    <w:unhideWhenUsed/>
+    <w:qFormat/>
+    <w:rsid w:val="00EC6368"/>
+    <w:pPr>
+      <w:widowControl w:val="0"/>
+      <w:autoSpaceDE w:val="0"/>
+      <w:autoSpaceDN w:val="0"/>
+      <w:spacing w:before="0" w:beforeAutospacing="0" w:after="0" w:afterAutospacing="0"/>
+      <w:outlineLvl w:val="1"/>
+    </w:pPr>
+    <w:rPr>
+      <w:rFonts w:eastAsiaTheme="minorHAnsi"/>
+      <w:color w:val="0A2A78"/>
+      <w:sz w:val="36"/>
+    </w:rPr>
+  </w:style>
+  <w:style w:type="paragraph" w:styleId="Heading3">
+    <w:name w:val="heading 3"/>
+    <w:basedOn w:val="Heading2"/>
+    <w:next w:val="Body"/>
+    <w:link w:val="Heading3Char"/>
+    <w:uiPriority w:val="9"/>
+    <w:unhideWhenUsed/>
+    <w:qFormat/>
+    <w:rsid w:val="00EC6368"/>
+    <w:pPr>
+      <w:outlineLvl w:val="2"/>
+    </w:pPr>
+    <w:rPr>
+      <w:sz w:val="32"/>
+    </w:rPr>
+  </w:style>
+  <w:style w:type="paragraph" w:styleId="Heading4">
+    <w:name w:val="heading 4"/>
+    <w:basedOn w:val="BodyText"/>
+    <w:next w:val="Normal"/>
+    <w:link w:val="Heading4Char"/>
+    <w:uiPriority w:val="9"/>
+    <w:unhideWhenUsed/>
+    <w:qFormat/>
+    <w:rsid w:val="00EC6368"/>
+    <w:pPr>
+      <w:widowControl w:val="0"/>
+      <w:autoSpaceDE w:val="0"/>
+      <w:autoSpaceDN w:val="0"/>
+      <w:spacing w:beforeAutospacing="0" w:afterAutospacing="0"/>
+      <w:ind w:left="360"/>
+      <w:outlineLvl w:val="3"/>
+    </w:pPr>
+    <w:rPr>
+      <w:rFonts w:eastAsiaTheme="minorHAnsi"/>
+      <w:iCs/>
+      <w:color w:val="0A2A78"/>
+    </w:rPr>
+  </w:style>
+  <w:style w:type="paragraph" w:styleId="Heading5">
+    <w:name w:val="heading 5"/>
+    <w:basedOn w:val="Normal"/>
+    <w:next w:val="Normal"/>
+    <w:link w:val="Heading5Char"/>
+    <w:uiPriority w:val="9"/>
+    <w:semiHidden/>
+    <w:unhideWhenUsed/>
+    <w:qFormat/>
+    <w:rsid w:val="00750956"/>
+    <w:pPr>
+      <w:keepNext/>
+      <w:keepLines/>
+      <w:spacing w:before="240" w:after="80"/>
+      <w:outlineLvl w:val="4"/>
+    </w:pPr>
+    <w:rPr>
+      <w:color w:val="666666"/>
+    </w:rPr>
+  </w:style>
+  <w:style w:type="paragraph" w:styleId="Heading6">
+    <w:name w:val="heading 6"/>
+    <w:basedOn w:val="Normal"/>
+    <w:next w:val="Normal"/>
+    <w:link w:val="Heading6Char"/>
+    <w:uiPriority w:val="9"/>
+    <w:semiHidden/>
+    <w:unhideWhenUsed/>
+    <w:qFormat/>
+    <w:rsid w:val="00750956"/>
+    <w:pPr>
+      <w:keepNext/>
+      <w:keepLines/>
+      <w:spacing w:before="240" w:after="80"/>
+      <w:outlineLvl w:val="5"/>
+    </w:pPr>
+    <w:rPr>
+      <w:i/>
+      <w:color w:val="666666"/>
+    </w:rPr>
+  </w:style>
+  <w:style w:type="character" w:default="1" w:styleId="DefaultParagraphFont">
+    <w:name w:val="Default Paragraph Font"/>
+    <w:uiPriority w:val="1"/>
+    <w:semiHidden/>
+    <w:unhideWhenUsed/>
+  </w:style>
+  <w:style w:type="table" w:default="1" w:styleId="TableNormal">
+    <w:name w:val="Normal Table"/>
+    <w:uiPriority w:val="99"/>
+    <w:semiHidden/>
+    <w:unhideWhenUsed/>
+    <w:tblPr>
+      <w:tblInd w:w="0" w:type="dxa"/>
+      <w:tblCellMar>
+        <w:top w:w="0" w:type="dxa"/>
+        <w:left w:w="108" w:type="dxa"/>
+        <w:bottom w:w="0" w:type="dxa"/>
+        <w:right w:w="108" w:type="dxa"/>
+      </w:tblCellMar>
+    </w:tblPr>
+  </w:style>
+  <w:style w:type="numbering" w:default="1" w:styleId="NoList">
+    <w:name w:val="No List"/>
+    <w:uiPriority w:val="99"/>
+    <w:semiHidden/>
+    <w:unhideWhenUsed/>
+  </w:style>
+  <w:style w:type="character" w:customStyle="1" w:styleId="Heading1Char">
+    <w:name w:val="Heading 1 Char"/>
+    <w:basedOn w:val="DefaultParagraphFont"/>
+    <w:link w:val="Heading1"/>
+    <w:uiPriority w:val="9"/>
+    <w:rsid w:val="00EC6368"/>
+    <w:rPr>
+      <w:rFonts w:ascii="Helvetica" w:hAnsi="Helvetica" w:cs="Helvetica"/>
+      <w:color w:val="0A2A78"/>
+      <w:spacing w:val="-4"/>
+      <w:sz w:val="40"/>
+      <w:szCs w:val="24"/>
+    </w:rPr>
+  </w:style>
+  <w:style w:type="character" w:customStyle="1" w:styleId="Heading3Char">
+    <w:name w:val="Heading 3 Char"/>
+    <w:basedOn w:val="DefaultParagraphFont"/>
+    <w:link w:val="Heading3"/>
+    <w:uiPriority w:val="9"/>
+    <w:rsid w:val="00EC6368"/>
+    <w:rPr>
+      <w:rFonts w:ascii="Helvetica" w:eastAsiaTheme="minorHAnsi" w:hAnsi="Helvetica" w:cs="Helvetica"/>
+      <w:color w:val="0A2A78"/>
+      <w:spacing w:val="-2"/>
+      <w:sz w:val="32"/>
+      <w:szCs w:val="24"/>
+    </w:rPr>
+  </w:style>
+  <w:style w:type="character" w:customStyle="1" w:styleId="interviewglossarywordintemplateChar">
+    <w:name w:val="interview glossary word in template Char"/>
+    <w:basedOn w:val="DefaultParagraphFont"/>
+    <w:link w:val="interviewglossarywordintemplate"/>
+    <w:rsid w:val="00EC6368"/>
+  </w:style>
+  <w:style w:type="character" w:customStyle="1" w:styleId="interviewbuttonChar">
+    <w:name w:val="interview button Char"/>
+    <w:basedOn w:val="DefaultParagraphFont"/>
+    <w:link w:val="interviewbutton"/>
+    <w:rsid w:val="00EC6368"/>
+    <w:rPr>
+      <w:color w:val="FFFFFF" w:themeColor="background1"/>
+      <w:szCs w:val="40"/>
+      <w:shd w:val="clear" w:color="auto" w:fill="0070C0"/>
+    </w:rPr>
+  </w:style>
+  <w:style w:type="character" w:customStyle="1" w:styleId="BodyTextChar">
+    <w:name w:val="Body Text Char"/>
+    <w:basedOn w:val="DefaultParagraphFont"/>
+    <w:link w:val="BodyText"/>
+    <w:uiPriority w:val="1"/>
+    <w:rsid w:val="00EC6368"/>
+    <w:rPr>
+      <w:rFonts w:ascii="Helvetica" w:hAnsi="Helvetica" w:cs="Helvetica"/>
+      <w:color w:val="202529"/>
+      <w:spacing w:val="-2"/>
+      <w:sz w:val="24"/>
+      <w:szCs w:val="24"/>
+    </w:rPr>
+  </w:style>
+  <w:style w:type="character" w:customStyle="1" w:styleId="Heading2Char">
+    <w:name w:val="Heading 2 Char"/>
+    <w:basedOn w:val="DefaultParagraphFont"/>
+    <w:link w:val="Heading2"/>
+    <w:uiPriority w:val="9"/>
+    <w:rsid w:val="00EC6368"/>
+    <w:rPr>
+      <w:rFonts w:ascii="Helvetica" w:eastAsiaTheme="minorHAnsi" w:hAnsi="Helvetica" w:cs="Helvetica"/>
+      <w:color w:val="0A2A78"/>
+      <w:spacing w:val="-2"/>
+      <w:sz w:val="36"/>
+      <w:szCs w:val="24"/>
+    </w:rPr>
+  </w:style>
+  <w:style w:type="character" w:customStyle="1" w:styleId="TitleChar">
+    <w:name w:val="Title Char"/>
+    <w:basedOn w:val="DefaultParagraphFont"/>
+    <w:link w:val="Title"/>
+    <w:uiPriority w:val="10"/>
+    <w:rsid w:val="00EC6368"/>
+    <w:rPr>
+      <w:rFonts w:ascii="Helvetica" w:hAnsi="Helvetica" w:cs="Helvetica"/>
+      <w:color w:val="0A2A78"/>
+      <w:spacing w:val="-2"/>
+      <w:sz w:val="48"/>
+      <w:szCs w:val="24"/>
+    </w:rPr>
+  </w:style>
+  <w:style w:type="character" w:customStyle="1" w:styleId="BalloonTextChar">
+    <w:name w:val="Balloon Text Char"/>
+    <w:basedOn w:val="DefaultParagraphFont"/>
+    <w:link w:val="BalloonText"/>
+    <w:uiPriority w:val="99"/>
+    <w:semiHidden/>
+    <w:rsid w:val="00EC6368"/>
+    <w:rPr>
+      <w:rFonts w:ascii="Segoe UI" w:hAnsi="Segoe UI" w:cs="Segoe UI"/>
+      <w:sz w:val="18"/>
+      <w:szCs w:val="18"/>
+    </w:rPr>
+  </w:style>
+  <w:style w:type="character" w:styleId="CommentReference">
+    <w:name w:val="annotation reference"/>
+    <w:basedOn w:val="DefaultParagraphFont"/>
+    <w:uiPriority w:val="99"/>
+    <w:semiHidden/>
+    <w:unhideWhenUsed/>
+    <w:rsid w:val="00EC6368"/>
+    <w:rPr>
+      <w:sz w:val="16"/>
+      <w:szCs w:val="16"/>
+    </w:rPr>
+  </w:style>
+  <w:style w:type="character" w:customStyle="1" w:styleId="CommentTextChar">
+    <w:name w:val="Comment Text Char"/>
+    <w:basedOn w:val="DefaultParagraphFont"/>
+    <w:link w:val="CommentText"/>
+    <w:uiPriority w:val="99"/>
+    <w:rsid w:val="00EC6368"/>
+    <w:rPr>
+      <w:rFonts w:ascii="Arial" w:hAnsi="Arial" w:cs="Arial"/>
+      <w:sz w:val="20"/>
+      <w:szCs w:val="20"/>
+    </w:rPr>
+  </w:style>
+  <w:style w:type="character" w:customStyle="1" w:styleId="CommentSubjectChar">
+    <w:name w:val="Comment Subject Char"/>
+    <w:basedOn w:val="CommentTextChar"/>
+    <w:link w:val="CommentSubject"/>
+    <w:uiPriority w:val="99"/>
+    <w:semiHidden/>
+    <w:rsid w:val="00EC6368"/>
+    <w:rPr>
+      <w:rFonts w:ascii="Arial" w:hAnsi="Arial" w:cs="Arial"/>
+      <w:b/>
+      <w:bCs/>
+      <w:sz w:val="20"/>
+      <w:szCs w:val="20"/>
+    </w:rPr>
+  </w:style>
+  <w:style w:type="character" w:customStyle="1" w:styleId="FooterChar">
+    <w:name w:val="Footer Char"/>
+    <w:basedOn w:val="DefaultParagraphFont"/>
+    <w:link w:val="Footer"/>
+    <w:uiPriority w:val="99"/>
+    <w:rsid w:val="00EC6368"/>
+    <w:rPr>
+      <w:rFonts w:ascii="Arial" w:hAnsi="Arial" w:cs="Arial"/>
+    </w:rPr>
+  </w:style>
+  <w:style w:type="character" w:customStyle="1" w:styleId="HeaderChar">
+    <w:name w:val="Header Char"/>
+    <w:basedOn w:val="DefaultParagraphFont"/>
+    <w:link w:val="Header"/>
+    <w:uiPriority w:val="99"/>
+    <w:rsid w:val="00EC6368"/>
+    <w:rPr>
+      <w:rFonts w:ascii="Arial" w:hAnsi="Arial" w:cs="Arial"/>
+    </w:rPr>
+  </w:style>
+  <w:style w:type="character" w:customStyle="1" w:styleId="Heading4Char">
+    <w:name w:val="Heading 4 Char"/>
+    <w:basedOn w:val="DefaultParagraphFont"/>
+    <w:link w:val="Heading4"/>
+    <w:uiPriority w:val="9"/>
+    <w:rsid w:val="00EC6368"/>
+    <w:rPr>
+      <w:rFonts w:ascii="Helvetica" w:eastAsiaTheme="minorHAnsi" w:hAnsi="Helvetica" w:cs="Helvetica"/>
+      <w:iCs/>
+      <w:color w:val="0A2A78"/>
+      <w:spacing w:val="-2"/>
+      <w:sz w:val="24"/>
+      <w:szCs w:val="24"/>
+    </w:rPr>
+  </w:style>
+  <w:style w:type="character" w:styleId="Hyperlink">
+    <w:name w:val="Hyperlink"/>
+    <w:basedOn w:val="DefaultParagraphFont"/>
+    <w:uiPriority w:val="99"/>
+    <w:unhideWhenUsed/>
+    <w:rsid w:val="00EC6368"/>
+    <w:rPr>
+      <w:rFonts w:ascii="Helvetica" w:hAnsi="Helvetica" w:cs="Helvetica"/>
+      <w:color w:val="0563C1" w:themeColor="hyperlink"/>
+      <w:spacing w:val="-2"/>
+      <w:sz w:val="24"/>
+      <w:szCs w:val="24"/>
+      <w:u w:val="none"/>
+    </w:rPr>
+  </w:style>
+  <w:style w:type="character" w:customStyle="1" w:styleId="UnresolvedMention1">
+    <w:name w:val="Unresolved Mention1"/>
+    <w:basedOn w:val="DefaultParagraphFont"/>
+    <w:uiPriority w:val="99"/>
+    <w:semiHidden/>
+    <w:unhideWhenUsed/>
+    <w:rsid w:val="00EC6368"/>
+    <w:rPr>
+      <w:color w:val="605E5C"/>
+      <w:shd w:val="clear" w:color="auto" w:fill="E1DFDD"/>
+    </w:rPr>
+  </w:style>
+  <w:style w:type="character" w:customStyle="1" w:styleId="small">
+    <w:name w:val="small"/>
+    <w:basedOn w:val="DefaultParagraphFont"/>
+    <w:rsid w:val="00EC6368"/>
+    <w:rPr>
+      <w:rFonts w:cs="Times New Roman"/>
+    </w:rPr>
+  </w:style>
+  <w:style w:type="character" w:customStyle="1" w:styleId="interviewPAPtexttrigger">
+    <w:name w:val="interview PAP text trigger"/>
+    <w:basedOn w:val="DefaultParagraphFont"/>
+    <w:uiPriority w:val="1"/>
+    <w:qFormat/>
+    <w:rsid w:val="00EC6368"/>
+    <w:rPr>
+      <w:shd w:val="clear" w:color="auto" w:fill="009999"/>
+    </w:rPr>
+  </w:style>
+  <w:style w:type="character" w:customStyle="1" w:styleId="NumChar">
+    <w:name w:val="NumChar"/>
+    <w:basedOn w:val="DefaultParagraphFont"/>
+    <w:uiPriority w:val="1"/>
+    <w:qFormat/>
+    <w:rsid w:val="00EC6368"/>
+    <w:rPr>
+      <w:rFonts w:eastAsiaTheme="minorHAnsi"/>
+    </w:rPr>
+  </w:style>
+  <w:style w:type="character" w:customStyle="1" w:styleId="UnresolvedMention2">
+    <w:name w:val="Unresolved Mention2"/>
+    <w:basedOn w:val="DefaultParagraphFont"/>
+    <w:uiPriority w:val="99"/>
+    <w:semiHidden/>
+    <w:unhideWhenUsed/>
+    <w:rsid w:val="00EC6368"/>
+    <w:rPr>
+      <w:color w:val="605E5C"/>
+      <w:shd w:val="clear" w:color="auto" w:fill="E1DFDD"/>
+    </w:rPr>
+  </w:style>
+  <w:style w:type="character" w:customStyle="1" w:styleId="convention">
+    <w:name w:val="convention"/>
+    <w:basedOn w:val="DefaultParagraphFont"/>
+    <w:uiPriority w:val="1"/>
+    <w:qFormat/>
+    <w:rsid w:val="00EC6368"/>
+    <w:rPr>
+      <w:sz w:val="22"/>
+      <w:szCs w:val="22"/>
+      <w:shd w:val="clear" w:color="auto" w:fill="A6A6A6" w:themeFill="background1" w:themeFillShade="A6"/>
+    </w:rPr>
+  </w:style>
+  <w:style w:type="character" w:customStyle="1" w:styleId="interviewvariable">
+    <w:name w:val="interview variable"/>
+    <w:basedOn w:val="DefaultParagraphFont"/>
+    <w:uiPriority w:val="1"/>
+    <w:qFormat/>
+    <w:rsid w:val="00EC6368"/>
+    <w:rPr>
+      <w:color w:val="FF7C80"/>
+      <w:shd w:val="clear" w:color="auto" w:fill="FFFFCC"/>
+    </w:rPr>
+  </w:style>
+  <w:style w:type="character" w:styleId="Strong">
+    <w:name w:val="Strong"/>
+    <w:basedOn w:val="DefaultParagraphFont"/>
+    <w:uiPriority w:val="22"/>
+    <w:qFormat/>
+    <w:rsid w:val="00EC6368"/>
+    <w:rPr>
+      <w:b/>
+      <w:bCs/>
+    </w:rPr>
+  </w:style>
+  <w:style w:type="character" w:styleId="FollowedHyperlink">
+    <w:name w:val="FollowedHyperlink"/>
+    <w:basedOn w:val="DefaultParagraphFont"/>
+    <w:uiPriority w:val="99"/>
+    <w:semiHidden/>
+    <w:unhideWhenUsed/>
+    <w:rsid w:val="00EC6368"/>
+    <w:rPr>
+      <w:color w:val="954F72" w:themeColor="followedHyperlink"/>
+      <w:u w:val="single"/>
+    </w:rPr>
+  </w:style>
+  <w:style w:type="character" w:customStyle="1" w:styleId="interviewclickformoreinfo-definition">
+    <w:name w:val="interview click for more info - definition"/>
+    <w:uiPriority w:val="1"/>
+    <w:qFormat/>
+    <w:rsid w:val="00EC6368"/>
+    <w:rPr>
+      <w:color w:val="00B050"/>
+      <w:u w:val="dash" w:color="92D050"/>
+    </w:rPr>
+  </w:style>
+  <w:style w:type="character" w:customStyle="1" w:styleId="UnresolvedMention3">
+    <w:name w:val="Unresolved Mention3"/>
+    <w:basedOn w:val="DefaultParagraphFont"/>
+    <w:uiPriority w:val="99"/>
+    <w:semiHidden/>
+    <w:unhideWhenUsed/>
+    <w:rsid w:val="00F729A9"/>
+    <w:rPr>
+      <w:color w:val="605E5C"/>
+      <w:shd w:val="clear" w:color="auto" w:fill="E1DFDD"/>
+    </w:rPr>
+  </w:style>
+  <w:style w:type="character" w:customStyle="1" w:styleId="UnresolvedMention30">
+    <w:name w:val="Unresolved Mention3"/>
+    <w:basedOn w:val="DefaultParagraphFont"/>
+    <w:uiPriority w:val="99"/>
+    <w:semiHidden/>
+    <w:unhideWhenUsed/>
+    <w:rsid w:val="00EC6368"/>
+    <w:rPr>
+      <w:color w:val="605E5C"/>
+      <w:shd w:val="clear" w:color="auto" w:fill="E1DFDD"/>
+    </w:rPr>
+  </w:style>
+  <w:style w:type="character" w:styleId="Emphasis">
+    <w:name w:val="Emphasis"/>
+    <w:basedOn w:val="DefaultParagraphFont"/>
+    <w:uiPriority w:val="20"/>
+    <w:qFormat/>
+    <w:rsid w:val="00EC6368"/>
+    <w:rPr>
+      <w:i/>
+      <w:iCs/>
+    </w:rPr>
+  </w:style>
+  <w:style w:type="character" w:customStyle="1" w:styleId="UnresolvedMention4">
+    <w:name w:val="Unresolved Mention4"/>
+    <w:basedOn w:val="DefaultParagraphFont"/>
+    <w:uiPriority w:val="99"/>
+    <w:semiHidden/>
+    <w:unhideWhenUsed/>
+    <w:rsid w:val="00EC6368"/>
+    <w:rPr>
+      <w:color w:val="605E5C"/>
+      <w:shd w:val="clear" w:color="auto" w:fill="E1DFDD"/>
+    </w:rPr>
+  </w:style>
+  <w:style w:type="character" w:customStyle="1" w:styleId="UnresolvedMention31">
+    <w:name w:val="Unresolved Mention31"/>
+    <w:basedOn w:val="DefaultParagraphFont"/>
+    <w:uiPriority w:val="99"/>
+    <w:semiHidden/>
+    <w:unhideWhenUsed/>
+    <w:rsid w:val="00EC6368"/>
+    <w:rPr>
+      <w:color w:val="605E5C"/>
+      <w:shd w:val="clear" w:color="auto" w:fill="E1DFDD"/>
+    </w:rPr>
+  </w:style>
+  <w:style w:type="paragraph" w:customStyle="1" w:styleId="Heading">
+    <w:name w:val="Heading"/>
+    <w:basedOn w:val="Normal"/>
+    <w:next w:val="BodyText"/>
+    <w:qFormat/>
+    <w:pPr>
+      <w:keepNext/>
+      <w:spacing w:before="240" w:after="120"/>
+    </w:pPr>
+    <w:rPr>
+      <w:rFonts w:ascii="Liberation Sans" w:eastAsia="Microsoft YaHei" w:hAnsi="Liberation Sans" w:cs="Lucida Sans"/>
+      <w:sz w:val="28"/>
+      <w:szCs w:val="28"/>
+    </w:rPr>
+  </w:style>
+  <w:style w:type="paragraph" w:styleId="BodyText">
+    <w:name w:val="Body Text"/>
+    <w:basedOn w:val="Normal"/>
+    <w:link w:val="BodyTextChar"/>
+    <w:uiPriority w:val="1"/>
+    <w:qFormat/>
+    <w:rsid w:val="00EC6368"/>
+    <w:pPr>
+      <w:spacing w:before="54" w:after="120" w:line="276" w:lineRule="auto"/>
+    </w:pPr>
+    <w:rPr>
+      <w:rFonts w:ascii="Helvetica" w:hAnsi="Helvetica" w:cs="Helvetica"/>
+      <w:color w:val="202529"/>
+      <w:spacing w:val="-2"/>
+      <w:sz w:val="24"/>
+      <w:szCs w:val="24"/>
+    </w:rPr>
+  </w:style>
+  <w:style w:type="paragraph" w:styleId="List">
+    <w:name w:val="List"/>
+    <w:basedOn w:val="BodyText"/>
+    <w:rPr>
+      <w:rFonts w:cs="Lucida Sans"/>
+    </w:rPr>
+  </w:style>
+  <w:style w:type="paragraph" w:styleId="Caption">
+    <w:name w:val="caption"/>
+    <w:basedOn w:val="Normal"/>
+    <w:qFormat/>
+    <w:pPr>
+      <w:suppressLineNumbers/>
+      <w:spacing w:before="120" w:after="120"/>
+    </w:pPr>
+    <w:rPr>
+      <w:rFonts w:cs="Lucida Sans"/>
+      <w:i/>
+      <w:iCs/>
+      <w:sz w:val="24"/>
+      <w:szCs w:val="24"/>
+    </w:rPr>
+  </w:style>
+  <w:style w:type="paragraph" w:customStyle="1" w:styleId="Index">
+    <w:name w:val="Index"/>
+    <w:basedOn w:val="Normal"/>
+    <w:qFormat/>
+    <w:pPr>
+      <w:suppressLineNumbers/>
+    </w:pPr>
+    <w:rPr>
+      <w:rFonts w:cs="Lucida Sans"/>
+    </w:rPr>
+  </w:style>
+  <w:style w:type="paragraph" w:customStyle="1" w:styleId="Code">
+    <w:name w:val="Code"/>
+    <w:basedOn w:val="Normal"/>
+    <w:qFormat/>
+    <w:rsid w:val="00EC6368"/>
+    <w:rPr>
+      <w:rFonts w:ascii="Calibri" w:hAnsi="Calibri"/>
+    </w:rPr>
+  </w:style>
+  <w:style w:type="paragraph" w:customStyle="1" w:styleId="Body">
+    <w:name w:val="Body"/>
+    <w:basedOn w:val="BodyText"/>
+    <w:qFormat/>
+    <w:rsid w:val="00EC6368"/>
+    <w:rPr>
+      <w:rFonts w:eastAsiaTheme="minorHAnsi"/>
+    </w:rPr>
+  </w:style>
+  <w:style w:type="paragraph" w:styleId="ListParagraph">
+    <w:name w:val="List Paragraph"/>
+    <w:basedOn w:val="BodyText"/>
+    <w:uiPriority w:val="34"/>
+    <w:qFormat/>
+    <w:rsid w:val="00EC6368"/>
+    <w:pPr>
+      <w:widowControl w:val="0"/>
+      <w:numPr>
+        <w:numId w:val="17"/>
+      </w:numPr>
+      <w:autoSpaceDE w:val="0"/>
+      <w:autoSpaceDN w:val="0"/>
+      <w:spacing w:beforeAutospacing="0" w:afterAutospacing="0"/>
+    </w:pPr>
+    <w:rPr>
+      <w:rFonts w:eastAsiaTheme="minorHAnsi"/>
+    </w:rPr>
+  </w:style>
+  <w:style w:type="paragraph" w:customStyle="1" w:styleId="TFVariable">
+    <w:name w:val="TF Variable"/>
+    <w:basedOn w:val="Heading3"/>
+    <w:next w:val="Body"/>
+    <w:qFormat/>
+    <w:rsid w:val="00EC6368"/>
+    <w:pPr>
+      <w:numPr>
+        <w:numId w:val="21"/>
+      </w:numPr>
+    </w:pPr>
+  </w:style>
+  <w:style w:type="paragraph" w:customStyle="1" w:styleId="interviewglossarywordintemplate">
+    <w:name w:val="interview glossary word in template"/>
+    <w:basedOn w:val="Normal"/>
+    <w:link w:val="interviewglossarywordintemplateChar"/>
+    <w:qFormat/>
+    <w:rsid w:val="00EC6368"/>
+    <w:pPr>
+      <w:spacing w:after="60" w:line="360" w:lineRule="auto"/>
+    </w:pPr>
+    <w:rPr>
+      <w:rFonts w:asciiTheme="minorHAnsi" w:hAnsiTheme="minorHAnsi" w:cstheme="minorBidi"/>
+    </w:rPr>
+  </w:style>
+  <w:style w:type="paragraph" w:customStyle="1" w:styleId="interviewbutton">
+    <w:name w:val="interview button"/>
+    <w:basedOn w:val="Normal"/>
+    <w:next w:val="Normal"/>
+    <w:link w:val="interviewbuttonChar"/>
+    <w:qFormat/>
+    <w:rsid w:val="00EC6368"/>
+    <w:pPr>
+      <w:shd w:val="clear" w:color="auto" w:fill="0070C0"/>
+      <w:spacing w:after="60" w:line="360" w:lineRule="auto"/>
+    </w:pPr>
+    <w:rPr>
+      <w:rFonts w:asciiTheme="minorHAnsi" w:hAnsiTheme="minorHAnsi" w:cstheme="minorBidi"/>
+      <w:color w:val="FFFFFF" w:themeColor="background1"/>
+      <w:szCs w:val="40"/>
+    </w:rPr>
+  </w:style>
+  <w:style w:type="paragraph" w:styleId="Title">
+    <w:name w:val="Title"/>
+    <w:basedOn w:val="BodyText"/>
+    <w:next w:val="Normal"/>
+    <w:link w:val="TitleChar"/>
+    <w:uiPriority w:val="10"/>
+    <w:qFormat/>
+    <w:rsid w:val="00EC6368"/>
+    <w:pPr>
+      <w:spacing w:before="0" w:beforeAutospacing="0" w:after="100"/>
+    </w:pPr>
+    <w:rPr>
+      <w:color w:val="0A2A78"/>
+      <w:sz w:val="48"/>
+    </w:rPr>
+  </w:style>
+  <w:style w:type="paragraph" w:styleId="BalloonText">
+    <w:name w:val="Balloon Text"/>
+    <w:basedOn w:val="Normal"/>
+    <w:link w:val="BalloonTextChar"/>
+    <w:uiPriority w:val="99"/>
+    <w:semiHidden/>
+    <w:unhideWhenUsed/>
+    <w:rsid w:val="00EC6368"/>
+    <w:rPr>
+      <w:rFonts w:ascii="Segoe UI" w:hAnsi="Segoe UI" w:cs="Segoe UI"/>
+      <w:sz w:val="18"/>
+      <w:szCs w:val="18"/>
+    </w:rPr>
+  </w:style>
+  <w:style w:type="paragraph" w:styleId="CommentText">
+    <w:name w:val="annotation text"/>
+    <w:basedOn w:val="Normal"/>
+    <w:link w:val="CommentTextChar"/>
+    <w:uiPriority w:val="99"/>
+    <w:unhideWhenUsed/>
+    <w:rsid w:val="00EC6368"/>
+    <w:rPr>
+      <w:sz w:val="20"/>
+      <w:szCs w:val="20"/>
+    </w:rPr>
+  </w:style>
+  <w:style w:type="paragraph" w:styleId="CommentSubject">
+    <w:name w:val="annotation subject"/>
+    <w:basedOn w:val="CommentText"/>
+    <w:next w:val="CommentText"/>
+    <w:link w:val="CommentSubjectChar"/>
+    <w:uiPriority w:val="99"/>
+    <w:semiHidden/>
+    <w:unhideWhenUsed/>
+    <w:rsid w:val="00EC6368"/>
+    <w:rPr>
+      <w:b/>
+      <w:bCs/>
+    </w:rPr>
+  </w:style>
+  <w:style w:type="paragraph" w:customStyle="1" w:styleId="HeaderandFooter">
+    <w:name w:val="Header and Footer"/>
+    <w:basedOn w:val="Normal"/>
+    <w:qFormat/>
+  </w:style>
+  <w:style w:type="paragraph" w:styleId="Footer">
+    <w:name w:val="footer"/>
+    <w:basedOn w:val="Normal"/>
+    <w:link w:val="FooterChar"/>
+    <w:uiPriority w:val="99"/>
+    <w:unhideWhenUsed/>
+    <w:rsid w:val="00EC6368"/>
+    <w:pPr>
+      <w:tabs>
+        <w:tab w:val="center" w:pos="4680"/>
+        <w:tab w:val="right" w:pos="9360"/>
+      </w:tabs>
+    </w:pPr>
+  </w:style>
+  <w:style w:type="paragraph" w:styleId="Header">
+    <w:name w:val="header"/>
+    <w:basedOn w:val="Normal"/>
+    <w:link w:val="HeaderChar"/>
+    <w:uiPriority w:val="99"/>
+    <w:unhideWhenUsed/>
+    <w:rsid w:val="00EC6368"/>
+    <w:pPr>
+      <w:tabs>
+        <w:tab w:val="center" w:pos="4680"/>
+        <w:tab w:val="right" w:pos="9360"/>
+      </w:tabs>
+    </w:pPr>
+  </w:style>
+  <w:style w:type="paragraph" w:customStyle="1" w:styleId="TableParagraph">
+    <w:name w:val="Table Paragraph"/>
+    <w:basedOn w:val="Normal"/>
+    <w:uiPriority w:val="1"/>
+    <w:qFormat/>
+    <w:rsid w:val="00EC6368"/>
+  </w:style>
+  <w:style w:type="paragraph" w:customStyle="1" w:styleId="H3numberedfordirections">
+    <w:name w:val="H3 numbered for directions"/>
+    <w:basedOn w:val="Heading3"/>
+    <w:next w:val="BodyText"/>
+    <w:qFormat/>
+    <w:rsid w:val="00EC6368"/>
+    <w:pPr>
+      <w:numPr>
+        <w:numId w:val="16"/>
+      </w:numPr>
+      <w:outlineLvl w:val="9"/>
+    </w:pPr>
+  </w:style>
+  <w:style w:type="paragraph" w:customStyle="1" w:styleId="Listnumbered">
+    <w:name w:val="List numbered"/>
+    <w:basedOn w:val="BodyText"/>
+    <w:qFormat/>
+    <w:rsid w:val="00EC6368"/>
+    <w:pPr>
+      <w:widowControl w:val="0"/>
+      <w:autoSpaceDE w:val="0"/>
+      <w:autoSpaceDN w:val="0"/>
+      <w:spacing w:beforeAutospacing="0" w:afterAutospacing="0"/>
+    </w:pPr>
+    <w:rPr>
+      <w:rFonts w:eastAsiaTheme="minorHAnsi"/>
+    </w:rPr>
+  </w:style>
+  <w:style w:type="paragraph" w:customStyle="1" w:styleId="Listnumberedunderbullet">
+    <w:name w:val="List numbered under bullet"/>
+    <w:basedOn w:val="BodyText"/>
+    <w:qFormat/>
+    <w:rsid w:val="00EC6368"/>
+    <w:pPr>
+      <w:widowControl w:val="0"/>
+      <w:numPr>
+        <w:ilvl w:val="4"/>
+        <w:numId w:val="19"/>
+      </w:numPr>
+      <w:autoSpaceDE w:val="0"/>
+      <w:autoSpaceDN w:val="0"/>
+      <w:spacing w:beforeAutospacing="0" w:afterAutospacing="0"/>
+    </w:pPr>
+    <w:rPr>
+      <w:rFonts w:eastAsiaTheme="minorHAnsi"/>
+    </w:rPr>
+  </w:style>
+  <w:style w:type="paragraph" w:customStyle="1" w:styleId="StyleHeading1Hanging008">
+    <w:name w:val="Style Heading 1 + Hanging:  0.08&quot;"/>
+    <w:basedOn w:val="Heading1"/>
+    <w:rsid w:val="00EC6368"/>
+    <w:pPr>
+      <w:spacing w:before="120"/>
+      <w:ind w:hanging="115"/>
+    </w:pPr>
+    <w:rPr>
+      <w:rFonts w:eastAsia="Times New Roman" w:cs="Times New Roman"/>
+      <w:szCs w:val="20"/>
+    </w:rPr>
+  </w:style>
+  <w:style w:type="paragraph" w:styleId="NormalWeb">
+    <w:name w:val="Normal (Web)"/>
+    <w:basedOn w:val="Normal"/>
+    <w:uiPriority w:val="99"/>
+    <w:unhideWhenUsed/>
+    <w:rsid w:val="00EC6368"/>
+    <w:pPr>
+      <w:spacing w:before="100" w:after="100"/>
+    </w:pPr>
+    <w:rPr>
+      <w:rFonts w:ascii="Times New Roman" w:eastAsia="Times New Roman" w:hAnsi="Times New Roman" w:cs="Times New Roman"/>
+      <w:sz w:val="24"/>
+      <w:szCs w:val="24"/>
+    </w:rPr>
+  </w:style>
+  <w:style w:type="paragraph" w:customStyle="1" w:styleId="ListParagraphNumbered">
+    <w:name w:val="List Paragraph Numbered"/>
+    <w:basedOn w:val="ListParagraph"/>
+    <w:qFormat/>
+    <w:rsid w:val="00EC6368"/>
+    <w:pPr>
+      <w:numPr>
+        <w:numId w:val="20"/>
+      </w:numPr>
+    </w:pPr>
+    <w:rPr>
+      <w:b/>
+    </w:rPr>
+  </w:style>
+  <w:style w:type="paragraph" w:customStyle="1" w:styleId="one-indent">
+    <w:name w:val="one-indent"/>
+    <w:basedOn w:val="Normal"/>
+    <w:rsid w:val="00EC6368"/>
+    <w:pPr>
+      <w:spacing w:before="100" w:after="100"/>
+    </w:pPr>
+    <w:rPr>
+      <w:rFonts w:ascii="Times New Roman" w:eastAsia="Times New Roman" w:hAnsi="Times New Roman" w:cs="Times New Roman"/>
+      <w:sz w:val="24"/>
+      <w:szCs w:val="24"/>
+    </w:rPr>
+  </w:style>
+  <w:style w:type="paragraph" w:styleId="Revision">
+    <w:name w:val="Revision"/>
+    <w:uiPriority w:val="99"/>
+    <w:semiHidden/>
+    <w:qFormat/>
+    <w:rsid w:val="005C1760"/>
+    <w:rPr>
+      <w:rFonts w:ascii="Arial" w:hAnsi="Arial" w:cs="Arial"/>
+    </w:rPr>
+  </w:style>
+  <w:style w:type="numbering" w:customStyle="1" w:styleId="Style1">
+    <w:name w:val="Style1"/>
+    <w:uiPriority w:val="99"/>
+    <w:rsid w:val="00EC6368"/>
+    <w:pPr>
+      <w:numPr>
+        <w:numId w:val="14"/>
+      </w:numPr>
+    </w:pPr>
+  </w:style>
+  <w:style w:type="table" w:styleId="TableGrid">
+    <w:name w:val="Table Grid"/>
+    <w:basedOn w:val="TableNormal"/>
+    <w:uiPriority w:val="39"/>
+    <w:rsid w:val="00EC6368"/>
+    <w:pPr>
+      <w:widowControl w:val="0"/>
+      <w:suppressAutoHyphens w:val="0"/>
+      <w:autoSpaceDE w:val="0"/>
+      <w:autoSpaceDN w:val="0"/>
+    </w:pPr>
+    <w:rPr>
+      <w:rFonts w:eastAsiaTheme="minorHAnsi"/>
+    </w:rPr>
+    <w:tblPr>
+      <w:tblBorders>
+        <w:top w:val="single" w:sz="4" w:space="0" w:color="auto"/>
+        <w:left w:val="single" w:sz="4" w:space="0" w:color="auto"/>
+        <w:bottom w:val="single" w:sz="4" w:space="0" w:color="auto"/>
+        <w:right w:val="single" w:sz="4" w:space="0" w:color="auto"/>
+        <w:insideH w:val="single" w:sz="4" w:space="0" w:color="auto"/>
+        <w:insideV w:val="single" w:sz="4" w:space="0" w:color="auto"/>
+      </w:tblBorders>
+    </w:tblPr>
+  </w:style>
+  <w:style w:type="table" w:customStyle="1" w:styleId="TableGrid1">
+    <w:name w:val="Table Grid1"/>
+    <w:basedOn w:val="TableNormal"/>
+    <w:next w:val="TableGrid"/>
+    <w:uiPriority w:val="39"/>
+    <w:rsid w:val="00EC6368"/>
+    <w:pPr>
+      <w:widowControl w:val="0"/>
+      <w:suppressAutoHyphens w:val="0"/>
+      <w:autoSpaceDE w:val="0"/>
+      <w:autoSpaceDN w:val="0"/>
+    </w:pPr>
+    <w:rPr>
+      <w:rFonts w:eastAsiaTheme="minorHAnsi"/>
+    </w:rPr>
+    <w:tblPr>
+      <w:tblBorders>
+        <w:top w:val="single" w:sz="4" w:space="0" w:color="auto"/>
+        <w:left w:val="single" w:sz="4" w:space="0" w:color="auto"/>
+        <w:bottom w:val="single" w:sz="4" w:space="0" w:color="auto"/>
+        <w:right w:val="single" w:sz="4" w:space="0" w:color="auto"/>
+        <w:insideH w:val="single" w:sz="4" w:space="0" w:color="auto"/>
+        <w:insideV w:val="single" w:sz="4" w:space="0" w:color="auto"/>
+      </w:tblBorders>
+    </w:tblPr>
+  </w:style>
+  <w:style w:type="paragraph" w:customStyle="1" w:styleId="Example">
+    <w:name w:val="Example"/>
+    <w:basedOn w:val="Normal"/>
+    <w:next w:val="Normal"/>
+    <w:qFormat/>
+    <w:rsid w:val="00EC6368"/>
+    <w:pPr>
+      <w:widowControl w:val="0"/>
+      <w:autoSpaceDE w:val="0"/>
+      <w:autoSpaceDN w:val="0"/>
+      <w:spacing w:before="54" w:after="120" w:line="276" w:lineRule="auto"/>
+      <w:ind w:left="397"/>
+    </w:pPr>
+    <w:rPr>
+      <w:rFonts w:ascii="Helvetica" w:eastAsiaTheme="minorHAnsi" w:hAnsi="Helvetica" w:cs="Helvetica"/>
+      <w:color w:val="202529"/>
+      <w:spacing w:val="-2"/>
+      <w:sz w:val="24"/>
+      <w:szCs w:val="24"/>
+    </w:rPr>
+  </w:style>
+  <w:style w:type="paragraph" w:styleId="HTMLPreformatted">
+    <w:name w:val="HTML Preformatted"/>
+    <w:basedOn w:val="Normal"/>
+    <w:link w:val="HTMLPreformattedChar"/>
+    <w:uiPriority w:val="99"/>
+    <w:semiHidden/>
+    <w:unhideWhenUsed/>
+    <w:rsid w:val="00EC6368"/>
+    <w:pPr>
+      <w:tabs>
+        <w:tab w:val="left" w:pos="916"/>
+        <w:tab w:val="left" w:pos="1832"/>
+        <w:tab w:val="left" w:pos="2748"/>
+        <w:tab w:val="left" w:pos="3664"/>
+        <w:tab w:val="left" w:pos="4580"/>
+        <w:tab w:val="left" w:pos="5496"/>
+        <w:tab w:val="left" w:pos="6412"/>
+        <w:tab w:val="left" w:pos="7328"/>
+        <w:tab w:val="left" w:pos="8244"/>
+        <w:tab w:val="left" w:pos="9160"/>
+        <w:tab w:val="left" w:pos="10076"/>
+        <w:tab w:val="left" w:pos="10992"/>
+        <w:tab w:val="left" w:pos="11908"/>
+        <w:tab w:val="left" w:pos="12824"/>
+        <w:tab w:val="left" w:pos="13740"/>
+        <w:tab w:val="left" w:pos="14656"/>
+      </w:tabs>
+      <w:spacing w:before="0" w:beforeAutospacing="0" w:after="0" w:afterAutospacing="0"/>
+    </w:pPr>
+    <w:rPr>
+      <w:rFonts w:ascii="Courier New" w:eastAsia="Times New Roman" w:hAnsi="Courier New" w:cs="Courier New"/>
+      <w:sz w:val="20"/>
+      <w:szCs w:val="20"/>
+    </w:rPr>
+  </w:style>
+  <w:style w:type="character" w:customStyle="1" w:styleId="HTMLPreformattedChar">
+    <w:name w:val="HTML Preformatted Char"/>
+    <w:basedOn w:val="DefaultParagraphFont"/>
+    <w:link w:val="HTMLPreformatted"/>
+    <w:uiPriority w:val="99"/>
+    <w:semiHidden/>
+    <w:rsid w:val="00EC6368"/>
+    <w:rPr>
+      <w:rFonts w:ascii="Courier New" w:eastAsia="Times New Roman" w:hAnsi="Courier New" w:cs="Courier New"/>
+      <w:sz w:val="20"/>
+      <w:szCs w:val="20"/>
+    </w:rPr>
+  </w:style>
+  <w:style w:type="paragraph" w:customStyle="1" w:styleId="interviewbuttons">
+    <w:name w:val="interview buttons"/>
+    <w:basedOn w:val="Normal"/>
+    <w:qFormat/>
+    <w:rsid w:val="00EC6368"/>
+    <w:pPr>
+      <w:pBdr>
+        <w:top w:val="single" w:sz="12" w:space="1" w:color="0070C0"/>
+        <w:left w:val="single" w:sz="12" w:space="4" w:color="0070C0"/>
+        <w:bottom w:val="single" w:sz="12" w:space="1" w:color="0070C0"/>
+        <w:right w:val="single" w:sz="12" w:space="4" w:color="0070C0"/>
+        <w:between w:val="single" w:sz="12" w:space="1" w:color="0070C0"/>
+        <w:bar w:val="single" w:sz="12" w:color="0070C0"/>
+      </w:pBdr>
+      <w:shd w:val="clear" w:color="auto" w:fill="FFFFFF"/>
+      <w:spacing w:after="0"/>
+      <w:ind w:left="-58" w:right="-216"/>
+    </w:pPr>
+    <w:rPr>
+      <w:sz w:val="21"/>
+      <w:szCs w:val="21"/>
+    </w:rPr>
+  </w:style>
+  <w:style w:type="character" w:customStyle="1" w:styleId="interviewconvention">
+    <w:name w:val="interview convention"/>
+    <w:basedOn w:val="DefaultParagraphFont"/>
+    <w:uiPriority w:val="1"/>
+    <w:qFormat/>
+    <w:rsid w:val="00EC6368"/>
+    <w:rPr>
+      <w:sz w:val="22"/>
+      <w:szCs w:val="22"/>
+      <w:shd w:val="clear" w:color="auto" w:fill="A6A6A6" w:themeFill="background1" w:themeFillShade="A6"/>
+    </w:rPr>
+  </w:style>
+  <w:style w:type="character" w:customStyle="1" w:styleId="interviewneedstobewritten">
+    <w:name w:val="interview needs to be written"/>
+    <w:basedOn w:val="DefaultParagraphFont"/>
+    <w:uiPriority w:val="1"/>
+    <w:qFormat/>
+    <w:rsid w:val="00EC6368"/>
+    <w:rPr>
+      <w:shd w:val="clear" w:color="auto" w:fill="FFFF00"/>
+    </w:rPr>
+  </w:style>
+  <w:style w:type="character" w:customStyle="1" w:styleId="interviewpdf">
+    <w:name w:val="interview pdf"/>
+    <w:basedOn w:val="DefaultParagraphFont"/>
+    <w:uiPriority w:val="1"/>
+    <w:qFormat/>
+    <w:rsid w:val="00EC6368"/>
+    <w:rPr>
+      <w:sz w:val="21"/>
+      <w:szCs w:val="21"/>
+    </w:rPr>
+  </w:style>
+  <w:style w:type="paragraph" w:customStyle="1" w:styleId="interviewradiobuttons">
+    <w:name w:val="interview radio buttons"/>
+    <w:basedOn w:val="ListParagraph"/>
+    <w:qFormat/>
+    <w:rsid w:val="00EC6368"/>
+    <w:pPr>
+      <w:widowControl/>
+      <w:numPr>
+        <w:numId w:val="18"/>
+      </w:numPr>
+      <w:pBdr>
+        <w:top w:val="single" w:sz="12" w:space="1" w:color="0070C0"/>
+        <w:left w:val="single" w:sz="12" w:space="4" w:color="0070C0"/>
+        <w:bottom w:val="single" w:sz="12" w:space="1" w:color="0070C0"/>
+        <w:right w:val="single" w:sz="12" w:space="4" w:color="0070C0"/>
+        <w:between w:val="single" w:sz="12" w:space="1" w:color="0070C0"/>
+        <w:bar w:val="single" w:sz="12" w:color="0070C0"/>
+      </w:pBdr>
+      <w:shd w:val="clear" w:color="auto" w:fill="FFFFFF"/>
+      <w:autoSpaceDE/>
+      <w:autoSpaceDN/>
+      <w:spacing w:before="-1" w:beforeAutospacing="1" w:after="480" w:afterAutospacing="1" w:line="240" w:lineRule="auto"/>
+      <w:ind w:right="-220"/>
+      <w:contextualSpacing/>
+    </w:pPr>
+    <w:rPr>
+      <w:rFonts w:ascii="Arial" w:eastAsia="Arial" w:hAnsi="Arial" w:cs="Arial"/>
+      <w:color w:val="auto"/>
+      <w:spacing w:val="0"/>
+      <w:sz w:val="21"/>
+      <w:szCs w:val="21"/>
+    </w:rPr>
+  </w:style>
+  <w:style w:type="character" w:customStyle="1" w:styleId="interviewtemplatetrigger">
+    <w:name w:val="interview template trigger"/>
+    <w:basedOn w:val="DefaultParagraphFont"/>
+    <w:uiPriority w:val="1"/>
+    <w:qFormat/>
+    <w:rsid w:val="00EC6368"/>
+  </w:style>
+  <w:style w:type="paragraph" w:customStyle="1" w:styleId="ListPlevel2">
+    <w:name w:val="List P level 2"/>
+    <w:basedOn w:val="ListParagraph"/>
+    <w:qFormat/>
+    <w:rsid w:val="00EC6368"/>
+    <w:pPr>
+      <w:numPr>
+        <w:numId w:val="0"/>
+      </w:numPr>
+      <w:tabs>
+        <w:tab w:val="num" w:pos="360"/>
+      </w:tabs>
+      <w:ind w:left="765" w:hanging="360"/>
+    </w:pPr>
+  </w:style>
+  <w:style w:type="paragraph" w:customStyle="1" w:styleId="ListPlevel3">
+    <w:name w:val="List P level 3"/>
+    <w:basedOn w:val="ListPlevel2"/>
+    <w:qFormat/>
+    <w:rsid w:val="00EC6368"/>
+    <w:pPr>
+      <w:tabs>
+        <w:tab w:val="clear" w:pos="360"/>
+      </w:tabs>
+      <w:ind w:left="0" w:firstLine="0"/>
+    </w:pPr>
+  </w:style>
+  <w:style w:type="paragraph" w:customStyle="1" w:styleId="MLRIAdvocacyguideforPDFPart">
+    <w:name w:val="MLRI Advocacy guide for PDF Part"/>
+    <w:basedOn w:val="Normal"/>
+    <w:qFormat/>
+    <w:rsid w:val="00EC6368"/>
+    <w:pPr>
+      <w:spacing w:before="480" w:after="80" w:line="320" w:lineRule="exact"/>
+      <w:ind w:left="187"/>
+    </w:pPr>
+    <w:rPr>
+      <w:rFonts w:ascii="Bookman Old Style" w:hAnsi="Bookman Old Style"/>
+      <w:color w:val="808080"/>
+      <w:szCs w:val="28"/>
+    </w:rPr>
+  </w:style>
+  <w:style w:type="character" w:customStyle="1" w:styleId="UnresolvedMention5">
+    <w:name w:val="Unresolved Mention5"/>
+    <w:basedOn w:val="DefaultParagraphFont"/>
+    <w:uiPriority w:val="99"/>
+    <w:semiHidden/>
+    <w:unhideWhenUsed/>
+    <w:rsid w:val="00EC6368"/>
+    <w:rPr>
+      <w:color w:val="605E5C"/>
+      <w:shd w:val="clear" w:color="auto" w:fill="E1DFDD"/>
+    </w:rPr>
+  </w:style>
+  <w:style w:type="character" w:customStyle="1" w:styleId="UnresolvedMention6">
+    <w:name w:val="Unresolved Mention6"/>
+    <w:basedOn w:val="DefaultParagraphFont"/>
+    <w:uiPriority w:val="99"/>
+    <w:semiHidden/>
+    <w:unhideWhenUsed/>
+    <w:rsid w:val="00EC6368"/>
+    <w:rPr>
+      <w:color w:val="605E5C"/>
+      <w:shd w:val="clear" w:color="auto" w:fill="E1DFDD"/>
+    </w:rPr>
+  </w:style>
+  <w:style w:type="character" w:customStyle="1" w:styleId="UnresolvedMention7">
+    <w:name w:val="Unresolved Mention7"/>
+    <w:basedOn w:val="DefaultParagraphFont"/>
+    <w:uiPriority w:val="99"/>
+    <w:semiHidden/>
+    <w:unhideWhenUsed/>
+    <w:rsid w:val="00EC6368"/>
+    <w:rPr>
+      <w:color w:val="605E5C"/>
+      <w:shd w:val="clear" w:color="auto" w:fill="E1DFDD"/>
+    </w:rPr>
+  </w:style>
+  <w:style w:type="character" w:customStyle="1" w:styleId="Heading5Char">
+    <w:name w:val="Heading 5 Char"/>
+    <w:basedOn w:val="DefaultParagraphFont"/>
+    <w:link w:val="Heading5"/>
+    <w:uiPriority w:val="9"/>
+    <w:semiHidden/>
+    <w:rsid w:val="00750956"/>
+    <w:rPr>
+      <w:rFonts w:ascii="Arial" w:hAnsi="Arial" w:cs="Arial"/>
+      <w:color w:val="666666"/>
+      <w:sz w:val="24"/>
+      <w:lang w:val="en"/>
+    </w:rPr>
+  </w:style>
+  <w:style w:type="character" w:customStyle="1" w:styleId="Heading6Char">
+    <w:name w:val="Heading 6 Char"/>
+    <w:basedOn w:val="DefaultParagraphFont"/>
+    <w:link w:val="Heading6"/>
+    <w:uiPriority w:val="9"/>
+    <w:semiHidden/>
+    <w:rsid w:val="00750956"/>
+    <w:rPr>
+      <w:rFonts w:ascii="Arial" w:hAnsi="Arial" w:cs="Arial"/>
+      <w:i/>
+      <w:color w:val="666666"/>
+      <w:sz w:val="24"/>
+      <w:lang w:val="en"/>
+    </w:rPr>
+  </w:style>
+  <w:style w:type="character" w:customStyle="1" w:styleId="Helptextinquestionmark">
+    <w:name w:val="Help text in question mark"/>
+    <w:basedOn w:val="DefaultParagraphFont"/>
+    <w:uiPriority w:val="1"/>
+    <w:qFormat/>
+    <w:rsid w:val="00750956"/>
+    <w:rPr>
+      <w:rFonts w:ascii="Tahoma" w:hAnsi="Tahoma" w:cs="Tahoma"/>
+      <w:color w:val="FFFFFF" w:themeColor="background1"/>
+      <w:szCs w:val="24"/>
+      <w:shd w:val="clear" w:color="auto" w:fill="33CCFF"/>
+    </w:rPr>
+  </w:style>
+  <w:style w:type="character" w:customStyle="1" w:styleId="Interviewbutton0">
+    <w:name w:val="Interview button"/>
+    <w:basedOn w:val="DefaultParagraphFont"/>
+    <w:uiPriority w:val="1"/>
+    <w:qFormat/>
+    <w:rsid w:val="00750956"/>
+    <w:rPr>
+      <w:color w:val="FFFFFF" w:themeColor="background1"/>
+      <w:bdr w:val="none" w:sz="0" w:space="0" w:color="auto"/>
+      <w:shd w:val="clear" w:color="auto" w:fill="0B5ED8"/>
+    </w:rPr>
+  </w:style>
+  <w:style w:type="paragraph" w:customStyle="1" w:styleId="interviewcheckboxes">
+    <w:name w:val="interview checkboxes"/>
+    <w:basedOn w:val="ListParagraph"/>
+    <w:qFormat/>
+    <w:rsid w:val="00750956"/>
+    <w:pPr>
+      <w:numPr>
+        <w:numId w:val="15"/>
+      </w:numPr>
+      <w:pBdr>
+        <w:top w:val="single" w:sz="12" w:space="1" w:color="0070C0"/>
+        <w:left w:val="single" w:sz="12" w:space="4" w:color="0070C0"/>
+        <w:bottom w:val="single" w:sz="12" w:space="1" w:color="0070C0"/>
+        <w:right w:val="single" w:sz="12" w:space="4" w:color="0070C0"/>
+        <w:between w:val="single" w:sz="12" w:space="1" w:color="0070C0"/>
+        <w:bar w:val="single" w:sz="12" w:color="0070C0"/>
+      </w:pBdr>
+    </w:pPr>
+  </w:style>
+  <w:style w:type="character" w:customStyle="1" w:styleId="interviewcondition2">
+    <w:name w:val="interview condition 2"/>
+    <w:basedOn w:val="Hyperlink"/>
+    <w:uiPriority w:val="1"/>
+    <w:qFormat/>
+    <w:rsid w:val="00750956"/>
+    <w:rPr>
+      <w:rFonts w:ascii="Helvetica" w:hAnsi="Helvetica" w:cs="Helvetica"/>
+      <w:color w:val="009999"/>
+      <w:spacing w:val="-2"/>
+      <w:sz w:val="24"/>
+      <w:szCs w:val="24"/>
+      <w:u w:val="none"/>
+    </w:rPr>
+  </w:style>
+  <w:style w:type="character" w:customStyle="1" w:styleId="interviewhelpquestionmark">
+    <w:name w:val="interview help question mark"/>
+    <w:basedOn w:val="DefaultParagraphFont"/>
+    <w:uiPriority w:val="1"/>
+    <w:qFormat/>
+    <w:rsid w:val="00750956"/>
+    <w:rPr>
+      <w:color w:val="FFFFFF" w:themeColor="background1"/>
+      <w:shd w:val="clear" w:color="auto" w:fill="9CC2E5" w:themeFill="accent5" w:themeFillTint="99"/>
+    </w:rPr>
+  </w:style>
+  <w:style w:type="paragraph" w:customStyle="1" w:styleId="interviewneedsediting">
+    <w:name w:val="interview needs editing"/>
+    <w:basedOn w:val="Normal"/>
+    <w:next w:val="Normal"/>
+    <w:qFormat/>
+    <w:rsid w:val="00750956"/>
+    <w:pPr>
+      <w:shd w:val="clear" w:color="auto" w:fill="FFFF00"/>
+      <w:spacing w:after="60" w:line="360" w:lineRule="auto"/>
+    </w:pPr>
+    <w:rPr>
+      <w:sz w:val="21"/>
+      <w:szCs w:val="21"/>
+    </w:rPr>
+  </w:style>
+  <w:style w:type="character" w:customStyle="1" w:styleId="interviewtextbox">
+    <w:name w:val="interview text box"/>
+    <w:basedOn w:val="DefaultParagraphFont"/>
+    <w:uiPriority w:val="1"/>
+    <w:qFormat/>
+    <w:rsid w:val="00750956"/>
+    <w:rPr>
+      <w:shd w:val="clear" w:color="auto" w:fill="D9D9D9" w:themeFill="background1" w:themeFillShade="D9"/>
+    </w:rPr>
+  </w:style>
+  <w:style w:type="character" w:customStyle="1" w:styleId="subject">
+    <w:name w:val="subject"/>
+    <w:basedOn w:val="DefaultParagraphFont"/>
+    <w:rsid w:val="00750956"/>
+  </w:style>
+  <w:style w:type="paragraph" w:styleId="Subtitle">
+    <w:name w:val="Subtitle"/>
+    <w:basedOn w:val="Normal"/>
+    <w:next w:val="Normal"/>
+    <w:link w:val="SubtitleChar"/>
+    <w:uiPriority w:val="11"/>
+    <w:qFormat/>
+    <w:rsid w:val="00750956"/>
+    <w:pPr>
+      <w:keepNext/>
+      <w:keepLines/>
+      <w:spacing w:after="320"/>
+    </w:pPr>
+    <w:rPr>
+      <w:color w:val="666666"/>
+      <w:sz w:val="30"/>
+      <w:szCs w:val="30"/>
+    </w:rPr>
+  </w:style>
+  <w:style w:type="character" w:customStyle="1" w:styleId="SubtitleChar">
+    <w:name w:val="Subtitle Char"/>
+    <w:basedOn w:val="DefaultParagraphFont"/>
+    <w:link w:val="Subtitle"/>
+    <w:uiPriority w:val="11"/>
+    <w:rsid w:val="00750956"/>
+    <w:rPr>
+      <w:rFonts w:ascii="Arial" w:hAnsi="Arial" w:cs="Arial"/>
+      <w:color w:val="666666"/>
+      <w:sz w:val="30"/>
+      <w:szCs w:val="30"/>
+      <w:lang w:val="en"/>
+    </w:rPr>
+  </w:style>
+  <w:style w:type="paragraph" w:styleId="TOC1">
+    <w:name w:val="toc 1"/>
+    <w:basedOn w:val="Normal"/>
+    <w:next w:val="Normal"/>
+    <w:autoRedefine/>
+    <w:uiPriority w:val="39"/>
+    <w:unhideWhenUsed/>
+    <w:rsid w:val="00750956"/>
+    <w:pPr>
+      <w:spacing w:after="100"/>
+    </w:pPr>
+  </w:style>
+  <w:style w:type="paragraph" w:styleId="TOC2">
+    <w:name w:val="toc 2"/>
+    <w:basedOn w:val="Normal"/>
+    <w:next w:val="Normal"/>
+    <w:autoRedefine/>
+    <w:uiPriority w:val="39"/>
+    <w:unhideWhenUsed/>
+    <w:rsid w:val="00750956"/>
+    <w:pPr>
+      <w:spacing w:after="100"/>
+      <w:ind w:left="240"/>
+    </w:pPr>
+  </w:style>
+  <w:style w:type="paragraph" w:styleId="TOC3">
+    <w:name w:val="toc 3"/>
+    <w:basedOn w:val="Normal"/>
+    <w:next w:val="Normal"/>
+    <w:autoRedefine/>
+    <w:uiPriority w:val="39"/>
+    <w:unhideWhenUsed/>
+    <w:rsid w:val="00750956"/>
+    <w:pPr>
+      <w:spacing w:after="100"/>
+      <w:ind w:left="480"/>
+    </w:pPr>
+  </w:style>
+  <w:style w:type="paragraph" w:styleId="TOCHeading">
+    <w:name w:val="TOC Heading"/>
+    <w:basedOn w:val="Heading1"/>
+    <w:next w:val="Normal"/>
+    <w:uiPriority w:val="39"/>
+    <w:unhideWhenUsed/>
+    <w:qFormat/>
+    <w:rsid w:val="00750956"/>
+    <w:pPr>
+      <w:spacing w:before="240" w:after="0" w:line="259" w:lineRule="auto"/>
+      <w:outlineLvl w:val="9"/>
+    </w:pPr>
+    <w:rPr>
+      <w:rFonts w:asciiTheme="majorHAnsi" w:eastAsiaTheme="majorEastAsia" w:hAnsiTheme="majorHAnsi" w:cstheme="majorBidi"/>
+      <w:color w:val="2F5496" w:themeColor="accent1" w:themeShade="BF"/>
+      <w:sz w:val="32"/>
+      <w:szCs w:val="32"/>
+    </w:rPr>
+  </w:style>
+  <w:style w:type="character" w:customStyle="1" w:styleId="UnresolvedMention8">
+    <w:name w:val="Unresolved Mention8"/>
+    <w:basedOn w:val="DefaultParagraphFont"/>
+    <w:uiPriority w:val="99"/>
+    <w:semiHidden/>
+    <w:unhideWhenUsed/>
+    <w:rsid w:val="00226581"/>
+    <w:rPr>
+      <w:color w:val="605E5C"/>
+      <w:shd w:val="clear" w:color="auto" w:fill="E1DFDD"/>
+    </w:rPr>
+  </w:style>
+  <w:style w:type="character" w:customStyle="1" w:styleId="UnresolvedMention">
     <w:name w:val="Unresolved Mention"/>
     <w:basedOn w:val="DefaultParagraphFont"/>
     <w:uiPriority w:val="99"/>
@@ -10378,7 +11775,7 @@
   <a:extraClrSchemeLst/>
   <a:extLst>
     <a:ext uri="{05A4C25C-085E-4340-85A3-A5531E510DB2}">
-      <thm15:themeFamily xmlns:thm15="http://schemas.microsoft.com/office/thememl/2012/main" name="Office Theme" id="{62F939B6-93AF-4DB8-9C6B-D6C7DFDC589F}" vid="{4A3C46E8-61CC-4603-A589-7422A47A8E4A}"/>
+      <thm15:themeFamily xmlns:thm15="http://schemas.microsoft.com/office/thememl/2012/main" xmlns="" name="Office Theme" id="{62F939B6-93AF-4DB8-9C6B-D6C7DFDC589F}" vid="{4A3C46E8-61CC-4603-A589-7422A47A8E4A}"/>
     </a:ext>
   </a:extLst>
 </a:theme>
@@ -10389,7 +11786,7 @@
 </file>
 
 <file path=customXml/itemProps1.xml><?xml version="1.0" encoding="utf-8"?>
-<ds:datastoreItem xmlns:ds="http://schemas.openxmlformats.org/officeDocument/2006/customXml" ds:itemID="{F2335B62-EE7E-496E-B365-687464127568}">
+<ds:datastoreItem xmlns:ds="http://schemas.openxmlformats.org/officeDocument/2006/customXml" ds:itemID="{897FBDD9-5FF1-4752-BD9C-991B6430A50E}">
   <ds:schemaRefs>
     <ds:schemaRef ds:uri="http://schemas.openxmlformats.org/officeDocument/2006/bibliography"/>
   </ds:schemaRefs>

</xml_diff>

<commit_message>
changed 'no' to 'none' as value for response_to_complate in docx template for want_help_to_agree, after updating branding package with typos also
</commit_message>
<xml_diff>
--- a/docassemble/RespondingCaseToEndYourMarriageActionPlan/data/templates/responding_ending_marriage_action_plan.docx
+++ b/docassemble/RespondingCaseToEndYourMarriageActionPlan/data/templates/responding_ending_marriage_action_plan.docx
@@ -1,6 +1,6 @@
 
 <file path=word/document.xml><?xml version="1.0" encoding="utf-8"?>
-<w:document xmlns:wpc="http://schemas.microsoft.com/office/word/2010/wordprocessingCanvas" xmlns:mc="http://schemas.openxmlformats.org/markup-compatibility/2006" xmlns:o="urn:schemas-microsoft-com:office:office" xmlns:r="http://schemas.openxmlformats.org/officeDocument/2006/relationships" xmlns:m="http://schemas.openxmlformats.org/officeDocument/2006/math" xmlns:v="urn:schemas-microsoft-com:vml" xmlns:wp14="http://schemas.microsoft.com/office/word/2010/wordprocessingDrawing" xmlns:wp="http://schemas.openxmlformats.org/drawingml/2006/wordprocessingDrawing" xmlns:w10="urn:schemas-microsoft-com:office:word" xmlns:w="http://schemas.openxmlformats.org/wordprocessingml/2006/main" xmlns:w14="http://schemas.microsoft.com/office/word/2010/wordml" xmlns:wpg="http://schemas.microsoft.com/office/word/2010/wordprocessingGroup" xmlns:wpi="http://schemas.microsoft.com/office/word/2010/wordprocessingInk" xmlns:wne="http://schemas.microsoft.com/office/word/2006/wordml" xmlns:wps="http://schemas.microsoft.com/office/word/2010/wordprocessingShape" mc:Ignorable="w14 wp14">
+<w:document xmlns:wpc="http://schemas.microsoft.com/office/word/2010/wordprocessingCanvas" xmlns:cx="http://schemas.microsoft.com/office/drawing/2014/chartex" xmlns:cx1="http://schemas.microsoft.com/office/drawing/2015/9/8/chartex" xmlns:cx2="http://schemas.microsoft.com/office/drawing/2015/10/21/chartex" xmlns:cx3="http://schemas.microsoft.com/office/drawing/2016/5/9/chartex" xmlns:cx4="http://schemas.microsoft.com/office/drawing/2016/5/10/chartex" xmlns:cx5="http://schemas.microsoft.com/office/drawing/2016/5/11/chartex" xmlns:cx6="http://schemas.microsoft.com/office/drawing/2016/5/12/chartex" xmlns:cx7="http://schemas.microsoft.com/office/drawing/2016/5/13/chartex" xmlns:cx8="http://schemas.microsoft.com/office/drawing/2016/5/14/chartex" xmlns:mc="http://schemas.openxmlformats.org/markup-compatibility/2006" xmlns:aink="http://schemas.microsoft.com/office/drawing/2016/ink" xmlns:am3d="http://schemas.microsoft.com/office/drawing/2017/model3d" xmlns:o="urn:schemas-microsoft-com:office:office" xmlns:r="http://schemas.openxmlformats.org/officeDocument/2006/relationships" xmlns:m="http://schemas.openxmlformats.org/officeDocument/2006/math" xmlns:v="urn:schemas-microsoft-com:vml" xmlns:wp14="http://schemas.microsoft.com/office/word/2010/wordprocessingDrawing" xmlns:wp="http://schemas.openxmlformats.org/drawingml/2006/wordprocessingDrawing" xmlns:w10="urn:schemas-microsoft-com:office:word" xmlns:w="http://schemas.openxmlformats.org/wordprocessingml/2006/main" xmlns:w14="http://schemas.microsoft.com/office/word/2010/wordml" xmlns:w15="http://schemas.microsoft.com/office/word/2012/wordml" xmlns:w16cex="http://schemas.microsoft.com/office/word/2018/wordml/cex" xmlns:w16cid="http://schemas.microsoft.com/office/word/2016/wordml/cid" xmlns:w16="http://schemas.microsoft.com/office/word/2018/wordml" xmlns:w16sdtdh="http://schemas.microsoft.com/office/word/2020/wordml/sdtdatahash" xmlns:w16se="http://schemas.microsoft.com/office/word/2015/wordml/symex" xmlns:wpg="http://schemas.microsoft.com/office/word/2010/wordprocessingGroup" xmlns:wpi="http://schemas.microsoft.com/office/word/2010/wordprocessingInk" xmlns:wne="http://schemas.microsoft.com/office/word/2006/wordml" xmlns:wps="http://schemas.microsoft.com/office/word/2010/wordprocessingShape" mc:Ignorable="w14 w15 w16se w16cid w16 w16cex w16sdtdh wp14">
   <w:body>
     <w:p>
       <w:pPr>
@@ -461,9 +461,9 @@
                     </wp:anchor>
                   </w:drawing>
                 </mc:Choice>
-                <mc:Fallback xmlns:w16se="http://schemas.microsoft.com/office/word/2015/wordml/symex" xmlns:w16sdtdh="http://schemas.microsoft.com/office/word/2020/wordml/sdtdatahash" xmlns:w16="http://schemas.microsoft.com/office/word/2018/wordml" xmlns:w16cid="http://schemas.microsoft.com/office/word/2016/wordml/cid" xmlns:w16cex="http://schemas.microsoft.com/office/word/2018/wordml/cex" xmlns:w15="http://schemas.microsoft.com/office/word/2012/wordml" xmlns:am3d="http://schemas.microsoft.com/office/drawing/2017/model3d" xmlns:aink="http://schemas.microsoft.com/office/drawing/2016/ink" xmlns:cx8="http://schemas.microsoft.com/office/drawing/2016/5/14/chartex" xmlns:cx7="http://schemas.microsoft.com/office/drawing/2016/5/13/chartex" xmlns:cx6="http://schemas.microsoft.com/office/drawing/2016/5/12/chartex" xmlns:cx5="http://schemas.microsoft.com/office/drawing/2016/5/11/chartex" xmlns:cx4="http://schemas.microsoft.com/office/drawing/2016/5/10/chartex" xmlns:cx3="http://schemas.microsoft.com/office/drawing/2016/5/9/chartex" xmlns:cx2="http://schemas.microsoft.com/office/drawing/2015/10/21/chartex" xmlns:cx1="http://schemas.microsoft.com/office/drawing/2015/9/8/chartex" xmlns:cx="http://schemas.microsoft.com/office/drawing/2014/chartex">
+                <mc:Fallback>
                   <w:pict>
-                    <v:group w14:anchorId="39EA2F09" id="Group 1" o:spid="_x0000_s1026" style="position:absolute;margin-left:0;margin-top:13.25pt;width:59.8pt;height:54.75pt;z-index:-503316478;mso-wrap-distance-right:25.2pt" coordsize="0,0" o:gfxdata="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">
+                    <v:group w14:anchorId="3206BA7F" id="Group 1" o:spid="_x0000_s1026" style="position:absolute;margin-left:0;margin-top:13.25pt;width:59.8pt;height:54.75pt;z-index:-503316478;mso-wrap-distance-right:25.2pt" coordsize="0,0" o:gfxdata="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">
                       <v:group id="Group 2" o:spid="_x0000_s1027" style="position:absolute;width:591120;height:694800" coordsize="0,0" o:gfxdata="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">
                         <v:shape id="Freeform 3" o:spid="_x0000_s1028" style="position:absolute;top:41400;width:591120;height:653400;visibility:visible;mso-wrap-style:square;v-text-anchor:top" coordsize="915,1071" o:gfxdata="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" path="m85,89l85,,914,r,985l824,985t,85l,1070,,92r573,l573,337r246,l824,1070xe" filled="f" strokecolor="#333" strokeweight=".44mm">
                           <v:path arrowok="t"/>
@@ -560,23 +560,7 @@
               <w:spacing w:before="0" w:after="0"/>
             </w:pPr>
             <w:r>
-              <w:t>{%</w:t>
-            </w:r>
-            <w:proofErr w:type="spellStart"/>
-            <w:r>
-              <w:t>tr</w:t>
-            </w:r>
-            <w:proofErr w:type="spellEnd"/>
-            <w:r>
-              <w:t xml:space="preserve"> if </w:t>
-            </w:r>
-            <w:proofErr w:type="spellStart"/>
-            <w:r>
-              <w:t>user_need</w:t>
-            </w:r>
-            <w:proofErr w:type="spellEnd"/>
-            <w:r>
-              <w:t xml:space="preserve"> == 'answer divorce' and type_of_response['stay married'] %}</w:t>
+              <w:t>{%tr if user_need == 'answer divorce' and type_of_response['stay married'] %}</w:t>
             </w:r>
           </w:p>
         </w:tc>
@@ -1034,11 +1018,11 @@
               <w:outlineLvl w:val="1"/>
             </w:pPr>
             <w:r>
+              <w:lastRenderedPageBreak/>
               <w:t xml:space="preserve">{{ </w:t>
             </w:r>
             <w:proofErr w:type="spellStart"/>
             <w:r>
-              <w:lastRenderedPageBreak/>
               <w:t>proper_service_step</w:t>
             </w:r>
             <w:r>
@@ -1077,7 +1061,6 @@
               <w:spacing w:before="100" w:after="100"/>
             </w:pPr>
             <w:r>
-              <w:lastRenderedPageBreak/>
               <w:t>{{p (include_docx_template("</w:t>
             </w:r>
             <w:r>
@@ -1120,7 +1103,6 @@
               </w:rPr>
             </w:pPr>
             <w:r>
-              <w:lastRenderedPageBreak/>
               <w:t>{%tr endif %}</w:t>
             </w:r>
           </w:p>
@@ -1712,20 +1694,14 @@
               <w:rPr>
                 <w:color w:val="FFC000"/>
               </w:rPr>
+              <w:lastRenderedPageBreak/>
               <w:t>(</w:t>
             </w:r>
             <w:r>
               <w:rPr>
                 <w:color w:val="92D050"/>
               </w:rPr>
-              <w:t xml:space="preserve">type_of_response[‘case in 2 states’] and </w:t>
-            </w:r>
-            <w:r>
-              <w:rPr>
-                <w:color w:val="92D050"/>
-              </w:rPr>
-              <w:lastRenderedPageBreak/>
-              <w:t>stage_of_other_case == ‘ended with order’</w:t>
+              <w:t>type_of_response[‘case in 2 states’] and stage_of_other_case == ‘ended with order’</w:t>
             </w:r>
             <w:r>
               <w:rPr>
@@ -1819,7 +1795,6 @@
               <w:outlineLvl w:val="1"/>
             </w:pPr>
             <w:r>
-              <w:lastRenderedPageBreak/>
               <w:t xml:space="preserve">{{ </w:t>
             </w:r>
             <w:proofErr w:type="spellStart"/>
@@ -1991,6 +1966,7 @@
               <w:ind w:left="404"/>
             </w:pPr>
             <w:r>
+              <w:lastRenderedPageBreak/>
               <w:t>If you are not sure what you want, you can proceed with a legal separation, and change it to a divorce at any time.</w:t>
             </w:r>
           </w:p>
@@ -2004,11 +1980,7 @@
               <w:ind w:left="404"/>
             </w:pPr>
             <w:r>
-              <w:t xml:space="preserve">If you decide you do not want a legal separation, check the box </w:t>
-            </w:r>
-            <w:r>
-              <w:lastRenderedPageBreak/>
-              <w:t xml:space="preserve">telling the court “I do not agree to a legal separation because I want the marriage to end in a divorce” in the “Counterclaims” section of your </w:t>
+              <w:t xml:space="preserve">If you decide you do not want a legal separation, check the box telling the court “I do not agree to a legal separation because I want the marriage to end in a divorce” in the “Counterclaims” section of your </w:t>
             </w:r>
             <w:r>
               <w:rPr>
@@ -2341,7 +2313,6 @@
               </w:rPr>
               <w:t>) or (</w:t>
             </w:r>
-            <w:proofErr w:type="spellStart"/>
             <w:r>
               <w:rPr>
                 <w:color w:val="34A853"/>
@@ -2350,7 +2321,6 @@
               </w:rPr>
               <w:t>user_need</w:t>
             </w:r>
-            <w:proofErr w:type="spellEnd"/>
             <w:r>
               <w:rPr>
                 <w:color w:val="FF9900"/>
@@ -2854,37 +2824,61 @@
               </w:rPr>
               <w:t xml:space="preserve">== 'legal separation' and </w:t>
             </w:r>
+            <w:proofErr w:type="spellStart"/>
             <w:r>
               <w:rPr>
                 <w:color w:val="34A853"/>
                 <w:sz w:val="20"/>
                 <w:szCs w:val="20"/>
               </w:rPr>
-              <w:t xml:space="preserve">want_legal_separation </w:t>
-            </w:r>
-            <w:r>
-              <w:rPr>
-                <w:sz w:val="20"/>
-                <w:szCs w:val="20"/>
-              </w:rPr>
-              <w:t xml:space="preserve">in('no', 'unsure') and </w:t>
-            </w:r>
-            <w:proofErr w:type="spellStart"/>
+              <w:t>want_legal_separation</w:t>
+            </w:r>
+            <w:proofErr w:type="spellEnd"/>
             <w:r>
               <w:rPr>
                 <w:color w:val="34A853"/>
                 <w:sz w:val="20"/>
                 <w:szCs w:val="20"/>
               </w:rPr>
-              <w:t>want_help_to_agree</w:t>
-            </w:r>
-            <w:proofErr w:type="spellEnd"/>
+              <w:t xml:space="preserve"> </w:t>
+            </w:r>
+            <w:r>
+              <w:rPr>
+                <w:sz w:val="20"/>
+                <w:szCs w:val="20"/>
+              </w:rPr>
+              <w:t>in('no</w:t>
+            </w:r>
+            <w:r>
+              <w:rPr>
+                <w:sz w:val="20"/>
+                <w:szCs w:val="20"/>
+              </w:rPr>
+              <w:t>ne</w:t>
+            </w:r>
+            <w:r>
+              <w:rPr>
+                <w:sz w:val="20"/>
+                <w:szCs w:val="20"/>
+              </w:rPr>
+              <w:t xml:space="preserve">', 'unsure') and </w:t>
+            </w:r>
+            <w:proofErr w:type="spellStart"/>
             <w:r>
               <w:rPr>
                 <w:color w:val="34A853"/>
                 <w:sz w:val="20"/>
                 <w:szCs w:val="20"/>
               </w:rPr>
+              <w:t>want_help_to_agree</w:t>
+            </w:r>
+            <w:proofErr w:type="spellEnd"/>
+            <w:r>
+              <w:rPr>
+                <w:color w:val="34A853"/>
+                <w:sz w:val="20"/>
+                <w:szCs w:val="20"/>
+              </w:rPr>
               <w:t>)</w:t>
             </w:r>
             <w:r>
@@ -2924,11 +2918,9 @@
             <w:pPr>
               <w:pStyle w:val="Body"/>
             </w:pPr>
-            <w:proofErr w:type="spellStart"/>
             <w:r>
               <w:t>want_help_to_agree_step</w:t>
             </w:r>
-            <w:proofErr w:type="spellEnd"/>
           </w:p>
         </w:tc>
       </w:tr>
@@ -2957,25 +2949,14 @@
               <w:outlineLvl w:val="1"/>
             </w:pPr>
             <w:r>
-              <w:t xml:space="preserve">{{ </w:t>
-            </w:r>
-            <w:proofErr w:type="spellStart"/>
-            <w:r>
-              <w:t>want_help_to_agree</w:t>
+              <w:lastRenderedPageBreak/>
+              <w:t>{{ want_help_to_agree</w:t>
             </w:r>
             <w:r>
               <w:t>_</w:t>
             </w:r>
             <w:r>
-              <w:t>step.su</w:t>
-            </w:r>
-            <w:r>
-              <w:lastRenderedPageBreak/>
-              <w:t>bject</w:t>
-            </w:r>
-            <w:proofErr w:type="spellEnd"/>
-            <w:r>
-              <w:t xml:space="preserve"> }}</w:t>
+              <w:t>step.subject }}</w:t>
             </w:r>
           </w:p>
         </w:tc>
@@ -3034,7 +3015,6 @@
               <w:pStyle w:val="Body"/>
             </w:pPr>
             <w:r>
-              <w:lastRenderedPageBreak/>
               <w:t>{%tr endif %}</w:t>
             </w:r>
           </w:p>
@@ -3410,7 +3390,11 @@
             </w:pPr>
             <w:bookmarkStart w:id="2" w:name="_Hlk226106692"/>
             <w:r>
-              <w:t>{{ dismiss_step.subject }}</w:t>
+              <w:t xml:space="preserve">{{ </w:t>
+            </w:r>
+            <w:r>
+              <w:lastRenderedPageBreak/>
+              <w:t>dismiss_step.subject }}</w:t>
             </w:r>
           </w:p>
         </w:tc>
@@ -3444,6 +3428,7 @@
               <w:spacing w:before="240" w:after="100"/>
             </w:pPr>
             <w:r>
+              <w:lastRenderedPageBreak/>
               <w:t>{{p (include_docx_template("docassemble.AKA2JBranding:dismiss_content.docx")) }}</w:t>
             </w:r>
           </w:p>
@@ -3475,6 +3460,7 @@
               <w:spacing w:before="0" w:after="0"/>
             </w:pPr>
             <w:r>
+              <w:lastRenderedPageBreak/>
               <w:t>{%tr endif %}</w:t>
             </w:r>
           </w:p>
@@ -3529,11 +3515,7 @@
               <w:spacing w:before="0" w:after="0"/>
             </w:pPr>
             <w:r>
-              <w:t xml:space="preserve">{%tr if stage_of_default == </w:t>
-            </w:r>
-            <w:r>
-              <w:lastRenderedPageBreak/>
-              <w:t>'judgment entered' %}</w:t>
+              <w:t>{%tr if stage_of_default == 'judgment entered' %}</w:t>
             </w:r>
           </w:p>
         </w:tc>
@@ -3559,7 +3541,6 @@
             </w:pPr>
             <w:proofErr w:type="spellStart"/>
             <w:r>
-              <w:lastRenderedPageBreak/>
               <w:t>learn_set_aside_step</w:t>
             </w:r>
             <w:proofErr w:type="spellEnd"/>
@@ -3595,7 +3576,6 @@
                 <w:rFonts w:eastAsia="Calibri"/>
                 <w:shd w:val="clear" w:color="auto" w:fill="FFFFFF"/>
               </w:rPr>
-              <w:lastRenderedPageBreak/>
               <w:t xml:space="preserve">{{ </w:t>
             </w:r>
             <w:proofErr w:type="spellStart"/>
@@ -4105,6 +4085,7 @@
             </w:r>
             <w:proofErr w:type="spellStart"/>
             <w:r>
+              <w:lastRenderedPageBreak/>
               <w:t>truefiling_file_and_serve_step.subject</w:t>
             </w:r>
             <w:proofErr w:type="spellEnd"/>
@@ -4139,6 +4120,7 @@
               <w:pStyle w:val="Body"/>
             </w:pPr>
             <w:r>
+              <w:lastRenderedPageBreak/>
               <w:t>{{p (include_docx_template("docassemble.AKA2JBranding:truefiling_file_and_serve_content.docx")) }}</w:t>
             </w:r>
           </w:p>
@@ -4172,11 +4154,8 @@
               </w:rPr>
             </w:pPr>
             <w:r>
-              <w:t>{{ truefiling_serve</w:t>
-            </w:r>
-            <w:r>
               <w:lastRenderedPageBreak/>
-              <w:t>_step.subject }}</w:t>
+              <w:t>{{ truefiling_serve_step.subject }}</w:t>
             </w:r>
           </w:p>
         </w:tc>
@@ -4207,11 +4186,7 @@
               <w:spacing w:before="280" w:after="0"/>
             </w:pPr>
             <w:r>
-              <w:t>{{p (include_docx_template("docassemble.AKA2JBranding:truefiling_serv</w:t>
-            </w:r>
-            <w:r>
-              <w:lastRenderedPageBreak/>
-              <w:t>e_content.docx")) }}</w:t>
+              <w:t>{{p (include_docx_template("docassemble.AKA2JBranding:truefiling_serve_content.docx")) }}</w:t>
             </w:r>
           </w:p>
         </w:tc>
@@ -4240,7 +4215,6 @@
               <w:pStyle w:val="Body"/>
             </w:pPr>
             <w:r>
-              <w:lastRenderedPageBreak/>
               <w:t>{%tr endif</w:t>
             </w:r>
             <w:r>
@@ -4558,7 +4532,14 @@
               <w:rPr>
                 <w:color w:val="FF0000"/>
               </w:rPr>
-              <w:t>{%tr if type_of_response.any_true() and not (type_of_response.all_true('stay married', exclusive = True)) %}</w:t>
+              <w:t xml:space="preserve">{%tr if type_of_response.any_true() and not </w:t>
+            </w:r>
+            <w:r>
+              <w:rPr>
+                <w:color w:val="FF0000"/>
+              </w:rPr>
+              <w:lastRenderedPageBreak/>
+              <w:t>(type_of_response.all_true('stay married', exclusive = True)) %}</w:t>
             </w:r>
           </w:p>
         </w:tc>
@@ -4628,14 +4609,7 @@
               <w:rPr>
                 <w:rFonts w:eastAsia="Calibri"/>
               </w:rPr>
-              <w:t>.subje</w:t>
-            </w:r>
-            <w:r>
-              <w:rPr>
-                <w:rFonts w:eastAsia="Calibri"/>
-              </w:rPr>
-              <w:lastRenderedPageBreak/>
-              <w:t>ct</w:t>
+              <w:t>.subject</w:t>
             </w:r>
             <w:proofErr w:type="spellEnd"/>
             <w:r>
@@ -4721,7 +4695,6 @@
               <w:pStyle w:val="Body"/>
             </w:pPr>
             <w:r>
-              <w:lastRenderedPageBreak/>
               <w:t>{%tr endif %}</w:t>
             </w:r>
           </w:p>
@@ -5066,7 +5039,11 @@
               </w:rPr>
             </w:pPr>
             <w:r>
-              <w:t>{{ answer_domestic_violence_step.subject }}</w:t>
+              <w:t xml:space="preserve">{{ </w:t>
+            </w:r>
+            <w:r>
+              <w:lastRenderedPageBreak/>
+              <w:t>answer_domestic_violence_step.subject }}</w:t>
             </w:r>
           </w:p>
         </w:tc>
@@ -5096,6 +5073,7 @@
               <w:pStyle w:val="Body"/>
             </w:pPr>
             <w:r>
+              <w:lastRenderedPageBreak/>
               <w:t>{{p (include_docx_template("docassemble.AKA2JBranding:answer_domestic_violence_content.docx")) }}</w:t>
             </w:r>
           </w:p>
@@ -5132,6 +5110,7 @@
               <w:rPr>
                 <w:shd w:val="clear" w:color="auto" w:fill="FFFFFF"/>
               </w:rPr>
+              <w:lastRenderedPageBreak/>
               <w:t>{%tr endif %}</w:t>
             </w:r>
           </w:p>
@@ -5212,170 +5191,160 @@
                 <w:color w:val="FF0000"/>
                 <w:shd w:val="clear" w:color="auto" w:fill="FFFFFF"/>
               </w:rPr>
-              <w:t>type_of_response[‘ak divorce case’] and not type_of_response[‘imp</w:t>
+              <w:t>type_of_response[‘ak divorce case’] and not type_of_response[‘improper service’] and not (</w:t>
+            </w:r>
+            <w:r>
+              <w:rPr>
+                <w:color w:val="FFC000"/>
+                <w:shd w:val="clear" w:color="auto" w:fill="FFFFFF"/>
+              </w:rPr>
+              <w:t>type_of_response[‘case in 2 states’] and stage_of_other_case == ‘ended with order’</w:t>
             </w:r>
             <w:r>
               <w:rPr>
                 <w:color w:val="FF0000"/>
                 <w:shd w:val="clear" w:color="auto" w:fill="FFFFFF"/>
               </w:rPr>
-              <w:lastRenderedPageBreak/>
-              <w:t>roper service’] and not (</w:t>
+              <w:t>) and not (</w:t>
             </w:r>
             <w:r>
               <w:rPr>
                 <w:color w:val="FFC000"/>
                 <w:shd w:val="clear" w:color="auto" w:fill="FFFFFF"/>
               </w:rPr>
-              <w:t>type_of_response[‘case in 2 states’] and stage_of_other_case == ‘ended with order’</w:t>
+              <w:t>type_of_response[‘default’] and stage_of_default == ‘judgment entered’</w:t>
             </w:r>
             <w:r>
               <w:rPr>
                 <w:color w:val="FF0000"/>
                 <w:shd w:val="clear" w:color="auto" w:fill="FFFFFF"/>
               </w:rPr>
-              <w:t>) and not (</w:t>
+              <w:t xml:space="preserve">) and </w:t>
+            </w:r>
+            <w:r>
+              <w:rPr>
+                <w:color w:val="FF0000"/>
+                <w:shd w:val="clear" w:color="auto" w:fill="FFFFFF"/>
+              </w:rPr>
+              <w:t>(</w:t>
             </w:r>
             <w:r>
               <w:rPr>
                 <w:color w:val="FFC000"/>
                 <w:shd w:val="clear" w:color="auto" w:fill="FFFFFF"/>
               </w:rPr>
-              <w:t>type_of_response[‘default’] and stage_of_default == ‘judgment entered’</w:t>
+              <w:t>(</w:t>
+            </w:r>
+            <w:r>
+              <w:rPr>
+                <w:color w:val="92D050"/>
+                <w:shd w:val="clear" w:color="auto" w:fill="FFFFFF"/>
+              </w:rPr>
+              <w:t>minor_children an</w:t>
+            </w:r>
+            <w:r>
+              <w:rPr>
+                <w:color w:val="92D050"/>
+                <w:shd w:val="clear" w:color="auto" w:fill="FFFFFF"/>
+              </w:rPr>
+              <w:t>d husban</w:t>
+            </w:r>
+            <w:r>
+              <w:rPr>
+                <w:color w:val="92D050"/>
+                <w:shd w:val="clear" w:color="auto" w:fill="FFFFFF"/>
+              </w:rPr>
+              <w:t>d</w:t>
+            </w:r>
+            <w:r>
+              <w:rPr>
+                <w:color w:val="92D050"/>
+                <w:shd w:val="clear" w:color="auto" w:fill="FFFFFF"/>
+              </w:rPr>
+              <w:t>_not_father</w:t>
+            </w:r>
+            <w:r>
+              <w:rPr>
+                <w:color w:val="FFC000"/>
+                <w:shd w:val="clear" w:color="auto" w:fill="FFFFFF"/>
+              </w:rPr>
+              <w:t>)</w:t>
+            </w:r>
+            <w:r>
+              <w:rPr>
+                <w:color w:val="92D050"/>
+                <w:shd w:val="clear" w:color="auto" w:fill="FFFFFF"/>
+              </w:rPr>
+              <w:t xml:space="preserve"> </w:t>
+            </w:r>
+            <w:r>
+              <w:rPr>
+                <w:color w:val="FFC000"/>
+                <w:shd w:val="clear" w:color="auto" w:fill="FFFFFF"/>
+              </w:rPr>
+              <w:t>or (</w:t>
+            </w:r>
+            <w:r>
+              <w:rPr>
+                <w:color w:val="92D050"/>
+                <w:shd w:val="clear" w:color="auto" w:fill="FFFFFF"/>
+              </w:rPr>
+              <w:t>minor_chil</w:t>
+            </w:r>
+            <w:r>
+              <w:rPr>
+                <w:color w:val="92D050"/>
+                <w:shd w:val="clear" w:color="auto" w:fill="FFFFFF"/>
+              </w:rPr>
+              <w:t>dren and husband_not_father is n</w:t>
+            </w:r>
+            <w:r>
+              <w:rPr>
+                <w:color w:val="92D050"/>
+                <w:shd w:val="clear" w:color="auto" w:fill="FFFFFF"/>
+              </w:rPr>
+              <w:t>one</w:t>
+            </w:r>
+            <w:r>
+              <w:rPr>
+                <w:color w:val="FFC000"/>
+                <w:shd w:val="clear" w:color="auto" w:fill="FFFFFF"/>
+              </w:rPr>
+              <w:t>) or (</w:t>
+            </w:r>
+            <w:r>
+              <w:rPr>
+                <w:color w:val="92D050"/>
+                <w:shd w:val="clear" w:color="auto" w:fill="FFFFFF"/>
+              </w:rPr>
+              <w:t>minor_children and not husband_not_father and wife_is_pregnant == 'not husband'</w:t>
+            </w:r>
+            <w:r>
+              <w:rPr>
+                <w:color w:val="FFC000"/>
+                <w:shd w:val="clear" w:color="auto" w:fill="FFFFFF"/>
+              </w:rPr>
+              <w:t>) or (</w:t>
+            </w:r>
+            <w:r>
+              <w:rPr>
+                <w:color w:val="92D050"/>
+                <w:shd w:val="clear" w:color="auto" w:fill="FFFFFF"/>
+              </w:rPr>
+              <w:t>not minor_children and wife_is_pregnant == 'not husband'</w:t>
+            </w:r>
+            <w:r>
+              <w:rPr>
+                <w:color w:val="FFC000"/>
+                <w:shd w:val="clear" w:color="auto" w:fill="FFFFFF"/>
+              </w:rPr>
+              <w:t>)</w:t>
             </w:r>
             <w:r>
               <w:rPr>
                 <w:color w:val="FF0000"/>
                 <w:shd w:val="clear" w:color="auto" w:fill="FFFFFF"/>
               </w:rPr>
-              <w:t xml:space="preserve">) and </w:t>
-            </w:r>
-            <w:r>
-              <w:rPr>
-                <w:color w:val="FF0000"/>
-                <w:shd w:val="clear" w:color="auto" w:fill="FFFFFF"/>
-              </w:rPr>
-              <w:t>(</w:t>
-            </w:r>
-            <w:r>
-              <w:rPr>
-                <w:color w:val="FFC000"/>
-                <w:shd w:val="clear" w:color="auto" w:fill="FFFFFF"/>
-              </w:rPr>
-              <w:t>(</w:t>
-            </w:r>
-            <w:r>
-              <w:rPr>
-                <w:color w:val="92D050"/>
-                <w:shd w:val="clear" w:color="auto" w:fill="FFFFFF"/>
-              </w:rPr>
-              <w:t>minor_children an</w:t>
-            </w:r>
-            <w:r>
-              <w:rPr>
-                <w:color w:val="92D050"/>
-                <w:shd w:val="clear" w:color="auto" w:fill="FFFFFF"/>
-              </w:rPr>
-              <w:t>d husban</w:t>
-            </w:r>
-            <w:r>
-              <w:rPr>
-                <w:color w:val="92D050"/>
-                <w:shd w:val="clear" w:color="auto" w:fill="FFFFFF"/>
-              </w:rPr>
-              <w:t>d</w:t>
-            </w:r>
-            <w:r>
-              <w:rPr>
-                <w:color w:val="92D050"/>
-                <w:shd w:val="clear" w:color="auto" w:fill="FFFFFF"/>
-              </w:rPr>
-              <w:t>_not_father</w:t>
-            </w:r>
-            <w:r>
-              <w:rPr>
-                <w:color w:val="FFC000"/>
-                <w:shd w:val="clear" w:color="auto" w:fill="FFFFFF"/>
-              </w:rPr>
-              <w:t>)</w:t>
-            </w:r>
-            <w:r>
-              <w:rPr>
-                <w:color w:val="92D050"/>
-                <w:shd w:val="clear" w:color="auto" w:fill="FFFFFF"/>
-              </w:rPr>
-              <w:t xml:space="preserve"> </w:t>
-            </w:r>
-            <w:r>
-              <w:rPr>
-                <w:color w:val="FFC000"/>
-                <w:shd w:val="clear" w:color="auto" w:fill="FFFFFF"/>
-              </w:rPr>
-              <w:t>or (</w:t>
-            </w:r>
-            <w:r>
-              <w:rPr>
-                <w:color w:val="92D050"/>
-                <w:shd w:val="clear" w:color="auto" w:fill="FFFFFF"/>
-              </w:rPr>
-              <w:t>minor_chil</w:t>
-            </w:r>
-            <w:r>
-              <w:rPr>
-                <w:color w:val="92D050"/>
-                <w:shd w:val="clear" w:color="auto" w:fill="FFFFFF"/>
-              </w:rPr>
-              <w:t>dren and husband_not_father is n</w:t>
-            </w:r>
-            <w:bookmarkStart w:id="4" w:name="_GoBack"/>
-            <w:bookmarkEnd w:id="4"/>
-            <w:r>
-              <w:rPr>
-                <w:color w:val="92D050"/>
-                <w:shd w:val="clear" w:color="auto" w:fill="FFFFFF"/>
-              </w:rPr>
-              <w:t>one</w:t>
-            </w:r>
-            <w:r>
-              <w:rPr>
-                <w:color w:val="FFC000"/>
-                <w:shd w:val="clear" w:color="auto" w:fill="FFFFFF"/>
-              </w:rPr>
-              <w:t>) or (</w:t>
-            </w:r>
-            <w:r>
-              <w:rPr>
-                <w:color w:val="92D050"/>
-                <w:shd w:val="clear" w:color="auto" w:fill="FFFFFF"/>
-              </w:rPr>
-              <w:t>minor_children and not husband_not_father and wife_is_pregnant == 'not husband'</w:t>
-            </w:r>
-            <w:r>
-              <w:rPr>
-                <w:color w:val="FFC000"/>
-                <w:shd w:val="clear" w:color="auto" w:fill="FFFFFF"/>
-              </w:rPr>
-              <w:t>) or (</w:t>
-            </w:r>
-            <w:r>
-              <w:rPr>
-                <w:color w:val="92D050"/>
-                <w:shd w:val="clear" w:color="auto" w:fill="FFFFFF"/>
-              </w:rPr>
-              <w:t>not minor_children and wife_is_pregnant == 'not husband'</w:t>
-            </w:r>
-            <w:r>
-              <w:rPr>
-                <w:color w:val="FFC000"/>
-                <w:shd w:val="clear" w:color="auto" w:fill="FFFFFF"/>
-              </w:rPr>
-              <w:t>)</w:t>
-            </w:r>
-            <w:r>
-              <w:rPr>
-                <w:color w:val="FF0000"/>
-                <w:shd w:val="clear" w:color="auto" w:fill="FFFFFF"/>
-              </w:rPr>
               <w:t>) %}</w:t>
             </w:r>
           </w:p>
@@ -5402,7 +5371,6 @@
             </w:pPr>
             <w:proofErr w:type="spellStart"/>
             <w:r>
-              <w:lastRenderedPageBreak/>
               <w:t>paternity_step</w:t>
             </w:r>
             <w:proofErr w:type="spellEnd"/>
@@ -5440,7 +5408,6 @@
               <w:rPr>
                 <w:shd w:val="clear" w:color="auto" w:fill="FFFFFF"/>
               </w:rPr>
-              <w:lastRenderedPageBreak/>
               <w:t>{{ paternity_step.subject }}</w:t>
             </w:r>
           </w:p>
@@ -5562,7 +5529,11 @@
               </w:rPr>
             </w:pPr>
             <w:r>
-              <w:t>{{ get_help.subject }}</w:t>
+              <w:t>{{ get_help.subje</w:t>
+            </w:r>
+            <w:r>
+              <w:lastRenderedPageBreak/>
+              <w:t>ct }}</w:t>
             </w:r>
           </w:p>
         </w:tc>
@@ -5593,7 +5564,11 @@
               <w:spacing w:before="100" w:after="100"/>
             </w:pPr>
             <w:r>
-              <w:t>{{p (include_docx_template("docassemble.AKA2JBranding:get_help_content.docx")) }}</w:t>
+              <w:t>{{p (include_docx_template("docassemble.AKA2JBranding:get_help_cont</w:t>
+            </w:r>
+            <w:r>
+              <w:lastRenderedPageBreak/>
+              <w:t>ent.docx")) }}</w:t>
             </w:r>
           </w:p>
         </w:tc>
@@ -5605,7 +5580,12 @@
       </w:pPr>
     </w:p>
     <w:sectPr>
-      <w:footerReference w:type="default" r:id="rId9"/>
+      <w:headerReference w:type="even" r:id="rId8"/>
+      <w:headerReference w:type="default" r:id="rId9"/>
+      <w:footerReference w:type="even" r:id="rId10"/>
+      <w:footerReference w:type="default" r:id="rId11"/>
+      <w:headerReference w:type="first" r:id="rId12"/>
+      <w:footerReference w:type="first" r:id="rId13"/>
       <w:pgSz w:w="12240" w:h="15840"/>
       <w:pgMar w:top="245" w:right="1440" w:bottom="274" w:left="1440" w:header="0" w:footer="720" w:gutter="0"/>
       <w:cols w:space="720"/>
@@ -5617,7 +5597,7 @@
 </file>
 
 <file path=word/endnotes.xml><?xml version="1.0" encoding="utf-8"?>
-<w:endnotes xmlns:wpc="http://schemas.microsoft.com/office/word/2010/wordprocessingCanvas" xmlns:mc="http://schemas.openxmlformats.org/markup-compatibility/2006" xmlns:o="urn:schemas-microsoft-com:office:office" xmlns:r="http://schemas.openxmlformats.org/officeDocument/2006/relationships" xmlns:m="http://schemas.openxmlformats.org/officeDocument/2006/math" xmlns:v="urn:schemas-microsoft-com:vml" xmlns:wp14="http://schemas.microsoft.com/office/word/2010/wordprocessingDrawing" xmlns:wp="http://schemas.openxmlformats.org/drawingml/2006/wordprocessingDrawing" xmlns:w10="urn:schemas-microsoft-com:office:word" xmlns:w="http://schemas.openxmlformats.org/wordprocessingml/2006/main" xmlns:w14="http://schemas.microsoft.com/office/word/2010/wordml" xmlns:wpg="http://schemas.microsoft.com/office/word/2010/wordprocessingGroup" xmlns:wpi="http://schemas.microsoft.com/office/word/2010/wordprocessingInk" xmlns:wne="http://schemas.microsoft.com/office/word/2006/wordml" xmlns:wps="http://schemas.microsoft.com/office/word/2010/wordprocessingShape" mc:Ignorable="w14 wp14">
+<w:endnotes xmlns:wpc="http://schemas.microsoft.com/office/word/2010/wordprocessingCanvas" xmlns:cx="http://schemas.microsoft.com/office/drawing/2014/chartex" xmlns:cx1="http://schemas.microsoft.com/office/drawing/2015/9/8/chartex" xmlns:cx2="http://schemas.microsoft.com/office/drawing/2015/10/21/chartex" xmlns:cx3="http://schemas.microsoft.com/office/drawing/2016/5/9/chartex" xmlns:cx4="http://schemas.microsoft.com/office/drawing/2016/5/10/chartex" xmlns:cx5="http://schemas.microsoft.com/office/drawing/2016/5/11/chartex" xmlns:cx6="http://schemas.microsoft.com/office/drawing/2016/5/12/chartex" xmlns:cx7="http://schemas.microsoft.com/office/drawing/2016/5/13/chartex" xmlns:cx8="http://schemas.microsoft.com/office/drawing/2016/5/14/chartex" xmlns:mc="http://schemas.openxmlformats.org/markup-compatibility/2006" xmlns:aink="http://schemas.microsoft.com/office/drawing/2016/ink" xmlns:am3d="http://schemas.microsoft.com/office/drawing/2017/model3d" xmlns:o="urn:schemas-microsoft-com:office:office" xmlns:r="http://schemas.openxmlformats.org/officeDocument/2006/relationships" xmlns:m="http://schemas.openxmlformats.org/officeDocument/2006/math" xmlns:v="urn:schemas-microsoft-com:vml" xmlns:wp14="http://schemas.microsoft.com/office/word/2010/wordprocessingDrawing" xmlns:wp="http://schemas.openxmlformats.org/drawingml/2006/wordprocessingDrawing" xmlns:w10="urn:schemas-microsoft-com:office:word" xmlns:w="http://schemas.openxmlformats.org/wordprocessingml/2006/main" xmlns:w14="http://schemas.microsoft.com/office/word/2010/wordml" xmlns:w15="http://schemas.microsoft.com/office/word/2012/wordml" xmlns:w16cex="http://schemas.microsoft.com/office/word/2018/wordml/cex" xmlns:w16cid="http://schemas.microsoft.com/office/word/2016/wordml/cid" xmlns:w16="http://schemas.microsoft.com/office/word/2018/wordml" xmlns:w16sdtdh="http://schemas.microsoft.com/office/word/2020/wordml/sdtdatahash" xmlns:w16se="http://schemas.microsoft.com/office/word/2015/wordml/symex" xmlns:wpg="http://schemas.microsoft.com/office/word/2010/wordprocessingGroup" xmlns:wpi="http://schemas.microsoft.com/office/word/2010/wordprocessingInk" xmlns:wne="http://schemas.microsoft.com/office/word/2006/wordml" xmlns:wps="http://schemas.microsoft.com/office/word/2010/wordprocessingShape" mc:Ignorable="w14 w15 w16se w16cid w16 w16cex w16sdtdh wp14">
   <w:endnote w:type="separator" w:id="-1">
     <w:p>
       <w:r>
@@ -5643,7 +5623,17 @@
 </file>
 
 <file path=word/footer1.xml><?xml version="1.0" encoding="utf-8"?>
-<w:ftr xmlns:wpc="http://schemas.microsoft.com/office/word/2010/wordprocessingCanvas" xmlns:mc="http://schemas.openxmlformats.org/markup-compatibility/2006" xmlns:o="urn:schemas-microsoft-com:office:office" xmlns:r="http://schemas.openxmlformats.org/officeDocument/2006/relationships" xmlns:m="http://schemas.openxmlformats.org/officeDocument/2006/math" xmlns:v="urn:schemas-microsoft-com:vml" xmlns:wp14="http://schemas.microsoft.com/office/word/2010/wordprocessingDrawing" xmlns:wp="http://schemas.openxmlformats.org/drawingml/2006/wordprocessingDrawing" xmlns:w10="urn:schemas-microsoft-com:office:word" xmlns:w="http://schemas.openxmlformats.org/wordprocessingml/2006/main" xmlns:w14="http://schemas.microsoft.com/office/word/2010/wordml" xmlns:wpg="http://schemas.microsoft.com/office/word/2010/wordprocessingGroup" xmlns:wpi="http://schemas.microsoft.com/office/word/2010/wordprocessingInk" xmlns:wne="http://schemas.microsoft.com/office/word/2006/wordml" xmlns:wps="http://schemas.microsoft.com/office/word/2010/wordprocessingShape" mc:Ignorable="w14 wp14">
+<w:ftr xmlns:wpc="http://schemas.microsoft.com/office/word/2010/wordprocessingCanvas" xmlns:cx="http://schemas.microsoft.com/office/drawing/2014/chartex" xmlns:cx1="http://schemas.microsoft.com/office/drawing/2015/9/8/chartex" xmlns:cx2="http://schemas.microsoft.com/office/drawing/2015/10/21/chartex" xmlns:cx3="http://schemas.microsoft.com/office/drawing/2016/5/9/chartex" xmlns:cx4="http://schemas.microsoft.com/office/drawing/2016/5/10/chartex" xmlns:cx5="http://schemas.microsoft.com/office/drawing/2016/5/11/chartex" xmlns:cx6="http://schemas.microsoft.com/office/drawing/2016/5/12/chartex" xmlns:cx7="http://schemas.microsoft.com/office/drawing/2016/5/13/chartex" xmlns:cx8="http://schemas.microsoft.com/office/drawing/2016/5/14/chartex" xmlns:mc="http://schemas.openxmlformats.org/markup-compatibility/2006" xmlns:aink="http://schemas.microsoft.com/office/drawing/2016/ink" xmlns:am3d="http://schemas.microsoft.com/office/drawing/2017/model3d" xmlns:o="urn:schemas-microsoft-com:office:office" xmlns:r="http://schemas.openxmlformats.org/officeDocument/2006/relationships" xmlns:m="http://schemas.openxmlformats.org/officeDocument/2006/math" xmlns:v="urn:schemas-microsoft-com:vml" xmlns:wp14="http://schemas.microsoft.com/office/word/2010/wordprocessingDrawing" xmlns:wp="http://schemas.openxmlformats.org/drawingml/2006/wordprocessingDrawing" xmlns:w10="urn:schemas-microsoft-com:office:word" xmlns:w="http://schemas.openxmlformats.org/wordprocessingml/2006/main" xmlns:w14="http://schemas.microsoft.com/office/word/2010/wordml" xmlns:w15="http://schemas.microsoft.com/office/word/2012/wordml" xmlns:w16cex="http://schemas.microsoft.com/office/word/2018/wordml/cex" xmlns:w16cid="http://schemas.microsoft.com/office/word/2016/wordml/cid" xmlns:w16="http://schemas.microsoft.com/office/word/2018/wordml" xmlns:w16sdtdh="http://schemas.microsoft.com/office/word/2020/wordml/sdtdatahash" xmlns:w16se="http://schemas.microsoft.com/office/word/2015/wordml/symex" xmlns:wpg="http://schemas.microsoft.com/office/word/2010/wordprocessingGroup" xmlns:wpi="http://schemas.microsoft.com/office/word/2010/wordprocessingInk" xmlns:wne="http://schemas.microsoft.com/office/word/2006/wordml" xmlns:wps="http://schemas.microsoft.com/office/word/2010/wordprocessingShape" mc:Ignorable="w14 w15 w16se w16cid w16 w16cex w16sdtdh wp14">
+  <w:p>
+    <w:pPr>
+      <w:pStyle w:val="Footer"/>
+    </w:pPr>
+  </w:p>
+</w:ftr>
+</file>
+
+<file path=word/footer2.xml><?xml version="1.0" encoding="utf-8"?>
+<w:ftr xmlns:wpc="http://schemas.microsoft.com/office/word/2010/wordprocessingCanvas" xmlns:cx="http://schemas.microsoft.com/office/drawing/2014/chartex" xmlns:cx1="http://schemas.microsoft.com/office/drawing/2015/9/8/chartex" xmlns:cx2="http://schemas.microsoft.com/office/drawing/2015/10/21/chartex" xmlns:cx3="http://schemas.microsoft.com/office/drawing/2016/5/9/chartex" xmlns:cx4="http://schemas.microsoft.com/office/drawing/2016/5/10/chartex" xmlns:cx5="http://schemas.microsoft.com/office/drawing/2016/5/11/chartex" xmlns:cx6="http://schemas.microsoft.com/office/drawing/2016/5/12/chartex" xmlns:cx7="http://schemas.microsoft.com/office/drawing/2016/5/13/chartex" xmlns:cx8="http://schemas.microsoft.com/office/drawing/2016/5/14/chartex" xmlns:mc="http://schemas.openxmlformats.org/markup-compatibility/2006" xmlns:aink="http://schemas.microsoft.com/office/drawing/2016/ink" xmlns:am3d="http://schemas.microsoft.com/office/drawing/2017/model3d" xmlns:o="urn:schemas-microsoft-com:office:office" xmlns:r="http://schemas.openxmlformats.org/officeDocument/2006/relationships" xmlns:m="http://schemas.openxmlformats.org/officeDocument/2006/math" xmlns:v="urn:schemas-microsoft-com:vml" xmlns:wp14="http://schemas.microsoft.com/office/word/2010/wordprocessingDrawing" xmlns:wp="http://schemas.openxmlformats.org/drawingml/2006/wordprocessingDrawing" xmlns:w10="urn:schemas-microsoft-com:office:word" xmlns:w="http://schemas.openxmlformats.org/wordprocessingml/2006/main" xmlns:w14="http://schemas.microsoft.com/office/word/2010/wordml" xmlns:w15="http://schemas.microsoft.com/office/word/2012/wordml" xmlns:w16cex="http://schemas.microsoft.com/office/word/2018/wordml/cex" xmlns:w16cid="http://schemas.microsoft.com/office/word/2016/wordml/cid" xmlns:w16="http://schemas.microsoft.com/office/word/2018/wordml" xmlns:w16sdtdh="http://schemas.microsoft.com/office/word/2020/wordml/sdtdatahash" xmlns:w16se="http://schemas.microsoft.com/office/word/2015/wordml/symex" xmlns:wpg="http://schemas.microsoft.com/office/word/2010/wordprocessingGroup" xmlns:wpi="http://schemas.microsoft.com/office/word/2010/wordprocessingInk" xmlns:wne="http://schemas.microsoft.com/office/word/2006/wordml" xmlns:wps="http://schemas.microsoft.com/office/word/2010/wordprocessingShape" mc:Ignorable="w14 w15 w16se w16cid w16 w16cex w16sdtdh wp14">
   <w:p>
     <w:pPr>
       <w:pStyle w:val="Footer"/>
@@ -5702,7 +5692,7 @@
       <w:t xml:space="preserve">May </w:t>
     </w:r>
     <w:r>
-      <w:t>7</w:t>
+      <w:t>8</w:t>
     </w:r>
     <w:r>
       <w:t>, 2026</w:t>
@@ -5711,8 +5701,18 @@
 </w:ftr>
 </file>
 
+<file path=word/footer3.xml><?xml version="1.0" encoding="utf-8"?>
+<w:ftr xmlns:wpc="http://schemas.microsoft.com/office/word/2010/wordprocessingCanvas" xmlns:cx="http://schemas.microsoft.com/office/drawing/2014/chartex" xmlns:cx1="http://schemas.microsoft.com/office/drawing/2015/9/8/chartex" xmlns:cx2="http://schemas.microsoft.com/office/drawing/2015/10/21/chartex" xmlns:cx3="http://schemas.microsoft.com/office/drawing/2016/5/9/chartex" xmlns:cx4="http://schemas.microsoft.com/office/drawing/2016/5/10/chartex" xmlns:cx5="http://schemas.microsoft.com/office/drawing/2016/5/11/chartex" xmlns:cx6="http://schemas.microsoft.com/office/drawing/2016/5/12/chartex" xmlns:cx7="http://schemas.microsoft.com/office/drawing/2016/5/13/chartex" xmlns:cx8="http://schemas.microsoft.com/office/drawing/2016/5/14/chartex" xmlns:mc="http://schemas.openxmlformats.org/markup-compatibility/2006" xmlns:aink="http://schemas.microsoft.com/office/drawing/2016/ink" xmlns:am3d="http://schemas.microsoft.com/office/drawing/2017/model3d" xmlns:o="urn:schemas-microsoft-com:office:office" xmlns:r="http://schemas.openxmlformats.org/officeDocument/2006/relationships" xmlns:m="http://schemas.openxmlformats.org/officeDocument/2006/math" xmlns:v="urn:schemas-microsoft-com:vml" xmlns:wp14="http://schemas.microsoft.com/office/word/2010/wordprocessingDrawing" xmlns:wp="http://schemas.openxmlformats.org/drawingml/2006/wordprocessingDrawing" xmlns:w10="urn:schemas-microsoft-com:office:word" xmlns:w="http://schemas.openxmlformats.org/wordprocessingml/2006/main" xmlns:w14="http://schemas.microsoft.com/office/word/2010/wordml" xmlns:w15="http://schemas.microsoft.com/office/word/2012/wordml" xmlns:w16cex="http://schemas.microsoft.com/office/word/2018/wordml/cex" xmlns:w16cid="http://schemas.microsoft.com/office/word/2016/wordml/cid" xmlns:w16="http://schemas.microsoft.com/office/word/2018/wordml" xmlns:w16sdtdh="http://schemas.microsoft.com/office/word/2020/wordml/sdtdatahash" xmlns:w16se="http://schemas.microsoft.com/office/word/2015/wordml/symex" xmlns:wpg="http://schemas.microsoft.com/office/word/2010/wordprocessingGroup" xmlns:wpi="http://schemas.microsoft.com/office/word/2010/wordprocessingInk" xmlns:wne="http://schemas.microsoft.com/office/word/2006/wordml" xmlns:wps="http://schemas.microsoft.com/office/word/2010/wordprocessingShape" mc:Ignorable="w14 w15 w16se w16cid w16 w16cex w16sdtdh wp14">
+  <w:p>
+    <w:pPr>
+      <w:pStyle w:val="Footer"/>
+    </w:pPr>
+  </w:p>
+</w:ftr>
+</file>
+
 <file path=word/footnotes.xml><?xml version="1.0" encoding="utf-8"?>
-<w:footnotes xmlns:wpc="http://schemas.microsoft.com/office/word/2010/wordprocessingCanvas" xmlns:mc="http://schemas.openxmlformats.org/markup-compatibility/2006" xmlns:o="urn:schemas-microsoft-com:office:office" xmlns:r="http://schemas.openxmlformats.org/officeDocument/2006/relationships" xmlns:m="http://schemas.openxmlformats.org/officeDocument/2006/math" xmlns:v="urn:schemas-microsoft-com:vml" xmlns:wp14="http://schemas.microsoft.com/office/word/2010/wordprocessingDrawing" xmlns:wp="http://schemas.openxmlformats.org/drawingml/2006/wordprocessingDrawing" xmlns:w10="urn:schemas-microsoft-com:office:word" xmlns:w="http://schemas.openxmlformats.org/wordprocessingml/2006/main" xmlns:w14="http://schemas.microsoft.com/office/word/2010/wordml" xmlns:wpg="http://schemas.microsoft.com/office/word/2010/wordprocessingGroup" xmlns:wpi="http://schemas.microsoft.com/office/word/2010/wordprocessingInk" xmlns:wne="http://schemas.microsoft.com/office/word/2006/wordml" xmlns:wps="http://schemas.microsoft.com/office/word/2010/wordprocessingShape" mc:Ignorable="w14 wp14">
+<w:footnotes xmlns:wpc="http://schemas.microsoft.com/office/word/2010/wordprocessingCanvas" xmlns:cx="http://schemas.microsoft.com/office/drawing/2014/chartex" xmlns:cx1="http://schemas.microsoft.com/office/drawing/2015/9/8/chartex" xmlns:cx2="http://schemas.microsoft.com/office/drawing/2015/10/21/chartex" xmlns:cx3="http://schemas.microsoft.com/office/drawing/2016/5/9/chartex" xmlns:cx4="http://schemas.microsoft.com/office/drawing/2016/5/10/chartex" xmlns:cx5="http://schemas.microsoft.com/office/drawing/2016/5/11/chartex" xmlns:cx6="http://schemas.microsoft.com/office/drawing/2016/5/12/chartex" xmlns:cx7="http://schemas.microsoft.com/office/drawing/2016/5/13/chartex" xmlns:cx8="http://schemas.microsoft.com/office/drawing/2016/5/14/chartex" xmlns:mc="http://schemas.openxmlformats.org/markup-compatibility/2006" xmlns:aink="http://schemas.microsoft.com/office/drawing/2016/ink" xmlns:am3d="http://schemas.microsoft.com/office/drawing/2017/model3d" xmlns:o="urn:schemas-microsoft-com:office:office" xmlns:r="http://schemas.openxmlformats.org/officeDocument/2006/relationships" xmlns:m="http://schemas.openxmlformats.org/officeDocument/2006/math" xmlns:v="urn:schemas-microsoft-com:vml" xmlns:wp14="http://schemas.microsoft.com/office/word/2010/wordprocessingDrawing" xmlns:wp="http://schemas.openxmlformats.org/drawingml/2006/wordprocessingDrawing" xmlns:w10="urn:schemas-microsoft-com:office:word" xmlns:w="http://schemas.openxmlformats.org/wordprocessingml/2006/main" xmlns:w14="http://schemas.microsoft.com/office/word/2010/wordml" xmlns:w15="http://schemas.microsoft.com/office/word/2012/wordml" xmlns:w16cex="http://schemas.microsoft.com/office/word/2018/wordml/cex" xmlns:w16cid="http://schemas.microsoft.com/office/word/2016/wordml/cid" xmlns:w16="http://schemas.microsoft.com/office/word/2018/wordml" xmlns:w16sdtdh="http://schemas.microsoft.com/office/word/2020/wordml/sdtdatahash" xmlns:w16se="http://schemas.microsoft.com/office/word/2015/wordml/symex" xmlns:wpg="http://schemas.microsoft.com/office/word/2010/wordprocessingGroup" xmlns:wpi="http://schemas.microsoft.com/office/word/2010/wordprocessingInk" xmlns:wne="http://schemas.microsoft.com/office/word/2006/wordml" xmlns:wps="http://schemas.microsoft.com/office/word/2010/wordprocessingShape" mc:Ignorable="w14 w15 w16se w16cid w16 w16cex w16sdtdh wp14">
   <w:footnote w:type="separator" w:id="-1">
     <w:p>
       <w:r>
@@ -5737,9 +5737,39 @@
 </w:footnotes>
 </file>
 
+<file path=word/header1.xml><?xml version="1.0" encoding="utf-8"?>
+<w:hdr xmlns:wpc="http://schemas.microsoft.com/office/word/2010/wordprocessingCanvas" xmlns:cx="http://schemas.microsoft.com/office/drawing/2014/chartex" xmlns:cx1="http://schemas.microsoft.com/office/drawing/2015/9/8/chartex" xmlns:cx2="http://schemas.microsoft.com/office/drawing/2015/10/21/chartex" xmlns:cx3="http://schemas.microsoft.com/office/drawing/2016/5/9/chartex" xmlns:cx4="http://schemas.microsoft.com/office/drawing/2016/5/10/chartex" xmlns:cx5="http://schemas.microsoft.com/office/drawing/2016/5/11/chartex" xmlns:cx6="http://schemas.microsoft.com/office/drawing/2016/5/12/chartex" xmlns:cx7="http://schemas.microsoft.com/office/drawing/2016/5/13/chartex" xmlns:cx8="http://schemas.microsoft.com/office/drawing/2016/5/14/chartex" xmlns:mc="http://schemas.openxmlformats.org/markup-compatibility/2006" xmlns:aink="http://schemas.microsoft.com/office/drawing/2016/ink" xmlns:am3d="http://schemas.microsoft.com/office/drawing/2017/model3d" xmlns:o="urn:schemas-microsoft-com:office:office" xmlns:r="http://schemas.openxmlformats.org/officeDocument/2006/relationships" xmlns:m="http://schemas.openxmlformats.org/officeDocument/2006/math" xmlns:v="urn:schemas-microsoft-com:vml" xmlns:wp14="http://schemas.microsoft.com/office/word/2010/wordprocessingDrawing" xmlns:wp="http://schemas.openxmlformats.org/drawingml/2006/wordprocessingDrawing" xmlns:w10="urn:schemas-microsoft-com:office:word" xmlns:w="http://schemas.openxmlformats.org/wordprocessingml/2006/main" xmlns:w14="http://schemas.microsoft.com/office/word/2010/wordml" xmlns:w15="http://schemas.microsoft.com/office/word/2012/wordml" xmlns:w16cex="http://schemas.microsoft.com/office/word/2018/wordml/cex" xmlns:w16cid="http://schemas.microsoft.com/office/word/2016/wordml/cid" xmlns:w16="http://schemas.microsoft.com/office/word/2018/wordml" xmlns:w16sdtdh="http://schemas.microsoft.com/office/word/2020/wordml/sdtdatahash" xmlns:w16se="http://schemas.microsoft.com/office/word/2015/wordml/symex" xmlns:wpg="http://schemas.microsoft.com/office/word/2010/wordprocessingGroup" xmlns:wpi="http://schemas.microsoft.com/office/word/2010/wordprocessingInk" xmlns:wne="http://schemas.microsoft.com/office/word/2006/wordml" xmlns:wps="http://schemas.microsoft.com/office/word/2010/wordprocessingShape" mc:Ignorable="w14 w15 w16se w16cid w16 w16cex w16sdtdh wp14">
+  <w:p>
+    <w:pPr>
+      <w:pStyle w:val="Header"/>
+    </w:pPr>
+  </w:p>
+</w:hdr>
+</file>
+
+<file path=word/header2.xml><?xml version="1.0" encoding="utf-8"?>
+<w:hdr xmlns:wpc="http://schemas.microsoft.com/office/word/2010/wordprocessingCanvas" xmlns:cx="http://schemas.microsoft.com/office/drawing/2014/chartex" xmlns:cx1="http://schemas.microsoft.com/office/drawing/2015/9/8/chartex" xmlns:cx2="http://schemas.microsoft.com/office/drawing/2015/10/21/chartex" xmlns:cx3="http://schemas.microsoft.com/office/drawing/2016/5/9/chartex" xmlns:cx4="http://schemas.microsoft.com/office/drawing/2016/5/10/chartex" xmlns:cx5="http://schemas.microsoft.com/office/drawing/2016/5/11/chartex" xmlns:cx6="http://schemas.microsoft.com/office/drawing/2016/5/12/chartex" xmlns:cx7="http://schemas.microsoft.com/office/drawing/2016/5/13/chartex" xmlns:cx8="http://schemas.microsoft.com/office/drawing/2016/5/14/chartex" xmlns:mc="http://schemas.openxmlformats.org/markup-compatibility/2006" xmlns:aink="http://schemas.microsoft.com/office/drawing/2016/ink" xmlns:am3d="http://schemas.microsoft.com/office/drawing/2017/model3d" xmlns:o="urn:schemas-microsoft-com:office:office" xmlns:r="http://schemas.openxmlformats.org/officeDocument/2006/relationships" xmlns:m="http://schemas.openxmlformats.org/officeDocument/2006/math" xmlns:v="urn:schemas-microsoft-com:vml" xmlns:wp14="http://schemas.microsoft.com/office/word/2010/wordprocessingDrawing" xmlns:wp="http://schemas.openxmlformats.org/drawingml/2006/wordprocessingDrawing" xmlns:w10="urn:schemas-microsoft-com:office:word" xmlns:w="http://schemas.openxmlformats.org/wordprocessingml/2006/main" xmlns:w14="http://schemas.microsoft.com/office/word/2010/wordml" xmlns:w15="http://schemas.microsoft.com/office/word/2012/wordml" xmlns:w16cex="http://schemas.microsoft.com/office/word/2018/wordml/cex" xmlns:w16cid="http://schemas.microsoft.com/office/word/2016/wordml/cid" xmlns:w16="http://schemas.microsoft.com/office/word/2018/wordml" xmlns:w16sdtdh="http://schemas.microsoft.com/office/word/2020/wordml/sdtdatahash" xmlns:w16se="http://schemas.microsoft.com/office/word/2015/wordml/symex" xmlns:wpg="http://schemas.microsoft.com/office/word/2010/wordprocessingGroup" xmlns:wpi="http://schemas.microsoft.com/office/word/2010/wordprocessingInk" xmlns:wne="http://schemas.microsoft.com/office/word/2006/wordml" xmlns:wps="http://schemas.microsoft.com/office/word/2010/wordprocessingShape" mc:Ignorable="w14 w15 w16se w16cid w16 w16cex w16sdtdh wp14">
+  <w:p>
+    <w:pPr>
+      <w:pStyle w:val="Header"/>
+    </w:pPr>
+  </w:p>
+</w:hdr>
+</file>
+
+<file path=word/header3.xml><?xml version="1.0" encoding="utf-8"?>
+<w:hdr xmlns:wpc="http://schemas.microsoft.com/office/word/2010/wordprocessingCanvas" xmlns:cx="http://schemas.microsoft.com/office/drawing/2014/chartex" xmlns:cx1="http://schemas.microsoft.com/office/drawing/2015/9/8/chartex" xmlns:cx2="http://schemas.microsoft.com/office/drawing/2015/10/21/chartex" xmlns:cx3="http://schemas.microsoft.com/office/drawing/2016/5/9/chartex" xmlns:cx4="http://schemas.microsoft.com/office/drawing/2016/5/10/chartex" xmlns:cx5="http://schemas.microsoft.com/office/drawing/2016/5/11/chartex" xmlns:cx6="http://schemas.microsoft.com/office/drawing/2016/5/12/chartex" xmlns:cx7="http://schemas.microsoft.com/office/drawing/2016/5/13/chartex" xmlns:cx8="http://schemas.microsoft.com/office/drawing/2016/5/14/chartex" xmlns:mc="http://schemas.openxmlformats.org/markup-compatibility/2006" xmlns:aink="http://schemas.microsoft.com/office/drawing/2016/ink" xmlns:am3d="http://schemas.microsoft.com/office/drawing/2017/model3d" xmlns:o="urn:schemas-microsoft-com:office:office" xmlns:r="http://schemas.openxmlformats.org/officeDocument/2006/relationships" xmlns:m="http://schemas.openxmlformats.org/officeDocument/2006/math" xmlns:v="urn:schemas-microsoft-com:vml" xmlns:wp14="http://schemas.microsoft.com/office/word/2010/wordprocessingDrawing" xmlns:wp="http://schemas.openxmlformats.org/drawingml/2006/wordprocessingDrawing" xmlns:w10="urn:schemas-microsoft-com:office:word" xmlns:w="http://schemas.openxmlformats.org/wordprocessingml/2006/main" xmlns:w14="http://schemas.microsoft.com/office/word/2010/wordml" xmlns:w15="http://schemas.microsoft.com/office/word/2012/wordml" xmlns:w16cex="http://schemas.microsoft.com/office/word/2018/wordml/cex" xmlns:w16cid="http://schemas.microsoft.com/office/word/2016/wordml/cid" xmlns:w16="http://schemas.microsoft.com/office/word/2018/wordml" xmlns:w16sdtdh="http://schemas.microsoft.com/office/word/2020/wordml/sdtdatahash" xmlns:w16se="http://schemas.microsoft.com/office/word/2015/wordml/symex" xmlns:wpg="http://schemas.microsoft.com/office/word/2010/wordprocessingGroup" xmlns:wpi="http://schemas.microsoft.com/office/word/2010/wordprocessingInk" xmlns:wne="http://schemas.microsoft.com/office/word/2006/wordml" xmlns:wps="http://schemas.microsoft.com/office/word/2010/wordprocessingShape" mc:Ignorable="w14 w15 w16se w16cid w16 w16cex w16sdtdh wp14">
+  <w:p>
+    <w:pPr>
+      <w:pStyle w:val="Header"/>
+    </w:pPr>
+  </w:p>
+</w:hdr>
+</file>
+
 <file path=word/numbering.xml><?xml version="1.0" encoding="utf-8"?>
-<w:numbering xmlns:wpc="http://schemas.microsoft.com/office/word/2010/wordprocessingCanvas" xmlns:mc="http://schemas.openxmlformats.org/markup-compatibility/2006" xmlns:o="urn:schemas-microsoft-com:office:office" xmlns:r="http://schemas.openxmlformats.org/officeDocument/2006/relationships" xmlns:m="http://schemas.openxmlformats.org/officeDocument/2006/math" xmlns:v="urn:schemas-microsoft-com:vml" xmlns:wp14="http://schemas.microsoft.com/office/word/2010/wordprocessingDrawing" xmlns:wp="http://schemas.openxmlformats.org/drawingml/2006/wordprocessingDrawing" xmlns:w10="urn:schemas-microsoft-com:office:word" xmlns:w="http://schemas.openxmlformats.org/wordprocessingml/2006/main" xmlns:w14="http://schemas.microsoft.com/office/word/2010/wordml" xmlns:wpg="http://schemas.microsoft.com/office/word/2010/wordprocessingGroup" xmlns:wpi="http://schemas.microsoft.com/office/word/2010/wordprocessingInk" xmlns:wne="http://schemas.microsoft.com/office/word/2006/wordml" xmlns:wps="http://schemas.microsoft.com/office/word/2010/wordprocessingShape" mc:Ignorable="w14 wp14">
-  <w:abstractNum w:abstractNumId="0">
+<w:numbering xmlns:wpc="http://schemas.microsoft.com/office/word/2010/wordprocessingCanvas" xmlns:cx="http://schemas.microsoft.com/office/drawing/2014/chartex" xmlns:cx1="http://schemas.microsoft.com/office/drawing/2015/9/8/chartex" xmlns:cx2="http://schemas.microsoft.com/office/drawing/2015/10/21/chartex" xmlns:cx3="http://schemas.microsoft.com/office/drawing/2016/5/9/chartex" xmlns:cx4="http://schemas.microsoft.com/office/drawing/2016/5/10/chartex" xmlns:cx5="http://schemas.microsoft.com/office/drawing/2016/5/11/chartex" xmlns:cx6="http://schemas.microsoft.com/office/drawing/2016/5/12/chartex" xmlns:cx7="http://schemas.microsoft.com/office/drawing/2016/5/13/chartex" xmlns:cx8="http://schemas.microsoft.com/office/drawing/2016/5/14/chartex" xmlns:mc="http://schemas.openxmlformats.org/markup-compatibility/2006" xmlns:aink="http://schemas.microsoft.com/office/drawing/2016/ink" xmlns:am3d="http://schemas.microsoft.com/office/drawing/2017/model3d" xmlns:o="urn:schemas-microsoft-com:office:office" xmlns:r="http://schemas.openxmlformats.org/officeDocument/2006/relationships" xmlns:m="http://schemas.openxmlformats.org/officeDocument/2006/math" xmlns:v="urn:schemas-microsoft-com:vml" xmlns:wp14="http://schemas.microsoft.com/office/word/2010/wordprocessingDrawing" xmlns:wp="http://schemas.openxmlformats.org/drawingml/2006/wordprocessingDrawing" xmlns:w10="urn:schemas-microsoft-com:office:word" xmlns:w="http://schemas.openxmlformats.org/wordprocessingml/2006/main" xmlns:w14="http://schemas.microsoft.com/office/word/2010/wordml" xmlns:w15="http://schemas.microsoft.com/office/word/2012/wordml" xmlns:w16cex="http://schemas.microsoft.com/office/word/2018/wordml/cex" xmlns:w16cid="http://schemas.microsoft.com/office/word/2016/wordml/cid" xmlns:w16="http://schemas.microsoft.com/office/word/2018/wordml" xmlns:w16sdtdh="http://schemas.microsoft.com/office/word/2020/wordml/sdtdatahash" xmlns:w16se="http://schemas.microsoft.com/office/word/2015/wordml/symex" xmlns:wpg="http://schemas.microsoft.com/office/word/2010/wordprocessingGroup" xmlns:wpi="http://schemas.microsoft.com/office/word/2010/wordprocessingInk" xmlns:wne="http://schemas.microsoft.com/office/word/2006/wordml" xmlns:wps="http://schemas.microsoft.com/office/word/2010/wordprocessingShape" mc:Ignorable="w14 w15 w16se w16cid w16 w16cex w16sdtdh wp14">
+  <w:abstractNum w:abstractNumId="0" w15:restartNumberingAfterBreak="0">
     <w:nsid w:val="08C6366F"/>
     <w:multiLevelType w:val="hybridMultilevel"/>
     <w:tmpl w:val="D3561CAA"/>
@@ -5826,7 +5856,7 @@
       </w:pPr>
     </w:lvl>
   </w:abstractNum>
-  <w:abstractNum w:abstractNumId="1">
+  <w:abstractNum w:abstractNumId="1" w15:restartNumberingAfterBreak="0">
     <w:nsid w:val="0C357DD6"/>
     <w:multiLevelType w:val="hybridMultilevel"/>
     <w:tmpl w:val="FEA8088E"/>
@@ -5917,7 +5947,7 @@
       </w:pPr>
     </w:lvl>
   </w:abstractNum>
-  <w:abstractNum w:abstractNumId="2">
+  <w:abstractNum w:abstractNumId="2" w15:restartNumberingAfterBreak="0">
     <w:nsid w:val="10F958A7"/>
     <w:multiLevelType w:val="hybridMultilevel"/>
     <w:tmpl w:val="E8E0613E"/>
@@ -6029,7 +6059,7 @@
       </w:rPr>
     </w:lvl>
   </w:abstractNum>
-  <w:abstractNum w:abstractNumId="3">
+  <w:abstractNum w:abstractNumId="3" w15:restartNumberingAfterBreak="0">
     <w:nsid w:val="129D559F"/>
     <w:multiLevelType w:val="multilevel"/>
     <w:tmpl w:val="00C02F3C"/>
@@ -6169,7 +6199,7 @@
       </w:rPr>
     </w:lvl>
   </w:abstractNum>
-  <w:abstractNum w:abstractNumId="4">
+  <w:abstractNum w:abstractNumId="4" w15:restartNumberingAfterBreak="0">
     <w:nsid w:val="15510218"/>
     <w:multiLevelType w:val="hybridMultilevel"/>
     <w:tmpl w:val="8EF49D20"/>
@@ -6259,7 +6289,7 @@
       </w:pPr>
     </w:lvl>
   </w:abstractNum>
-  <w:abstractNum w:abstractNumId="5">
+  <w:abstractNum w:abstractNumId="5" w15:restartNumberingAfterBreak="0">
     <w:nsid w:val="22693C94"/>
     <w:multiLevelType w:val="hybridMultilevel"/>
     <w:tmpl w:val="68D8C73C"/>
@@ -6372,7 +6402,7 @@
       </w:rPr>
     </w:lvl>
   </w:abstractNum>
-  <w:abstractNum w:abstractNumId="6">
+  <w:abstractNum w:abstractNumId="6" w15:restartNumberingAfterBreak="0">
     <w:nsid w:val="253D4794"/>
     <w:multiLevelType w:val="multilevel"/>
     <w:tmpl w:val="8C80AB36"/>
@@ -6485,7 +6515,7 @@
       </w:rPr>
     </w:lvl>
   </w:abstractNum>
-  <w:abstractNum w:abstractNumId="7">
+  <w:abstractNum w:abstractNumId="7" w15:restartNumberingAfterBreak="0">
     <w:nsid w:val="26BC257F"/>
     <w:multiLevelType w:val="multilevel"/>
     <w:tmpl w:val="78DAAC24"/>
@@ -6598,7 +6628,7 @@
       </w:pPr>
     </w:lvl>
   </w:abstractNum>
-  <w:abstractNum w:abstractNumId="8">
+  <w:abstractNum w:abstractNumId="8" w15:restartNumberingAfterBreak="0">
     <w:nsid w:val="296F3872"/>
     <w:multiLevelType w:val="hybridMultilevel"/>
     <w:tmpl w:val="F1F875BA"/>
@@ -6713,7 +6743,7 @@
       </w:rPr>
     </w:lvl>
   </w:abstractNum>
-  <w:abstractNum w:abstractNumId="9">
+  <w:abstractNum w:abstractNumId="9" w15:restartNumberingAfterBreak="0">
     <w:nsid w:val="2B157829"/>
     <w:multiLevelType w:val="multilevel"/>
     <w:tmpl w:val="0B7E5932"/>
@@ -6826,7 +6856,7 @@
       </w:pPr>
     </w:lvl>
   </w:abstractNum>
-  <w:abstractNum w:abstractNumId="10">
+  <w:abstractNum w:abstractNumId="10" w15:restartNumberingAfterBreak="0">
     <w:nsid w:val="2D5A0F48"/>
     <w:multiLevelType w:val="multilevel"/>
     <w:tmpl w:val="FED0097C"/>
@@ -6966,7 +6996,7 @@
       </w:rPr>
     </w:lvl>
   </w:abstractNum>
-  <w:abstractNum w:abstractNumId="11">
+  <w:abstractNum w:abstractNumId="11" w15:restartNumberingAfterBreak="0">
     <w:nsid w:val="2DE97314"/>
     <w:multiLevelType w:val="multilevel"/>
     <w:tmpl w:val="340AB222"/>
@@ -7079,7 +7109,7 @@
       </w:pPr>
     </w:lvl>
   </w:abstractNum>
-  <w:abstractNum w:abstractNumId="12">
+  <w:abstractNum w:abstractNumId="12" w15:restartNumberingAfterBreak="0">
     <w:nsid w:val="35C20F8D"/>
     <w:multiLevelType w:val="multilevel"/>
     <w:tmpl w:val="7996E420"/>
@@ -7192,7 +7222,7 @@
       </w:pPr>
     </w:lvl>
   </w:abstractNum>
-  <w:abstractNum w:abstractNumId="13">
+  <w:abstractNum w:abstractNumId="13" w15:restartNumberingAfterBreak="0">
     <w:nsid w:val="3B2B185A"/>
     <w:multiLevelType w:val="multilevel"/>
     <w:tmpl w:val="B18493EA"/>
@@ -7305,7 +7335,7 @@
       </w:pPr>
     </w:lvl>
   </w:abstractNum>
-  <w:abstractNum w:abstractNumId="14">
+  <w:abstractNum w:abstractNumId="14" w15:restartNumberingAfterBreak="0">
     <w:nsid w:val="41841B01"/>
     <w:multiLevelType w:val="hybridMultilevel"/>
     <w:tmpl w:val="55BC674E"/>
@@ -7396,7 +7426,7 @@
       </w:pPr>
     </w:lvl>
   </w:abstractNum>
-  <w:abstractNum w:abstractNumId="15">
+  <w:abstractNum w:abstractNumId="15" w15:restartNumberingAfterBreak="0">
     <w:nsid w:val="4803540D"/>
     <w:multiLevelType w:val="hybridMultilevel"/>
     <w:tmpl w:val="22883C36"/>
@@ -7510,7 +7540,7 @@
       </w:rPr>
     </w:lvl>
   </w:abstractNum>
-  <w:abstractNum w:abstractNumId="16">
+  <w:abstractNum w:abstractNumId="16" w15:restartNumberingAfterBreak="0">
     <w:nsid w:val="492F4D8F"/>
     <w:multiLevelType w:val="hybridMultilevel"/>
     <w:tmpl w:val="F62C94DE"/>
@@ -7624,7 +7654,7 @@
       </w:rPr>
     </w:lvl>
   </w:abstractNum>
-  <w:abstractNum w:abstractNumId="17">
+  <w:abstractNum w:abstractNumId="17" w15:restartNumberingAfterBreak="0">
     <w:nsid w:val="523345C7"/>
     <w:multiLevelType w:val="multilevel"/>
     <w:tmpl w:val="5A5E29B8"/>
@@ -7764,7 +7794,7 @@
       </w:rPr>
     </w:lvl>
   </w:abstractNum>
-  <w:abstractNum w:abstractNumId="18">
+  <w:abstractNum w:abstractNumId="18" w15:restartNumberingAfterBreak="0">
     <w:nsid w:val="6B961852"/>
     <w:multiLevelType w:val="hybridMultilevel"/>
     <w:tmpl w:val="DAAECE10"/>
@@ -7857,7 +7887,7 @@
       </w:pPr>
     </w:lvl>
   </w:abstractNum>
-  <w:abstractNum w:abstractNumId="19">
+  <w:abstractNum w:abstractNumId="19" w15:restartNumberingAfterBreak="0">
     <w:nsid w:val="72C94C4A"/>
     <w:multiLevelType w:val="multilevel"/>
     <w:tmpl w:val="E606F4D4"/>
@@ -7970,7 +8000,7 @@
       </w:pPr>
     </w:lvl>
   </w:abstractNum>
-  <w:abstractNum w:abstractNumId="20">
+  <w:abstractNum w:abstractNumId="20" w15:restartNumberingAfterBreak="0">
     <w:nsid w:val="72F61AFE"/>
     <w:multiLevelType w:val="multilevel"/>
     <w:tmpl w:val="82241B5A"/>
@@ -8083,7 +8113,7 @@
       </w:pPr>
     </w:lvl>
   </w:abstractNum>
-  <w:abstractNum w:abstractNumId="21">
+  <w:abstractNum w:abstractNumId="21" w15:restartNumberingAfterBreak="0">
     <w:nsid w:val="7BAF36E9"/>
     <w:multiLevelType w:val="multilevel"/>
     <w:tmpl w:val="24180D92"/>
@@ -8331,7 +8361,7 @@
 </file>
 
 <file path=word/styles.xml><?xml version="1.0" encoding="utf-8"?>
-<w:styles xmlns:mc="http://schemas.openxmlformats.org/markup-compatibility/2006" xmlns:r="http://schemas.openxmlformats.org/officeDocument/2006/relationships" xmlns:w="http://schemas.openxmlformats.org/wordprocessingml/2006/main" xmlns:w14="http://schemas.microsoft.com/office/word/2010/wordml" mc:Ignorable="w14">
+<w:styles xmlns:mc="http://schemas.openxmlformats.org/markup-compatibility/2006" xmlns:r="http://schemas.openxmlformats.org/officeDocument/2006/relationships" xmlns:w="http://schemas.openxmlformats.org/wordprocessingml/2006/main" xmlns:w14="http://schemas.microsoft.com/office/word/2010/wordml" xmlns:w15="http://schemas.microsoft.com/office/word/2012/wordml" xmlns:w16cex="http://schemas.microsoft.com/office/word/2018/wordml/cex" xmlns:w16cid="http://schemas.microsoft.com/office/word/2016/wordml/cid" xmlns:w16="http://schemas.microsoft.com/office/word/2018/wordml" xmlns:w16sdtdh="http://schemas.microsoft.com/office/word/2020/wordml/sdtdatahash" xmlns:w16se="http://schemas.microsoft.com/office/word/2015/wordml/symex" mc:Ignorable="w14 w15 w16se w16cid w16 w16cex w16sdtdh">
   <w:docDefaults>
     <w:rPrDefault>
       <w:rPr>
@@ -8347,145 +8377,383 @@
       </w:pPr>
     </w:pPrDefault>
   </w:docDefaults>
-  <w:latentStyles w:defLockedState="0" w:defUIPriority="99" w:defSemiHidden="1" w:defUnhideWhenUsed="1" w:defQFormat="0" w:count="267">
-    <w:lsdException w:name="Normal" w:semiHidden="0" w:uiPriority="0" w:unhideWhenUsed="0" w:qFormat="1"/>
-    <w:lsdException w:name="heading 1" w:semiHidden="0" w:uiPriority="9" w:unhideWhenUsed="0" w:qFormat="1"/>
-    <w:lsdException w:name="heading 2" w:uiPriority="9" w:qFormat="1"/>
-    <w:lsdException w:name="heading 3" w:uiPriority="9" w:qFormat="1"/>
-    <w:lsdException w:name="heading 4" w:uiPriority="9" w:qFormat="1"/>
-    <w:lsdException w:name="heading 5" w:uiPriority="9" w:qFormat="1"/>
-    <w:lsdException w:name="heading 6" w:uiPriority="9" w:qFormat="1"/>
-    <w:lsdException w:name="heading 7" w:uiPriority="9" w:qFormat="1"/>
-    <w:lsdException w:name="heading 8" w:uiPriority="9" w:qFormat="1"/>
-    <w:lsdException w:name="heading 9" w:uiPriority="9" w:qFormat="1"/>
-    <w:lsdException w:name="toc 1" w:uiPriority="39"/>
-    <w:lsdException w:name="toc 2" w:uiPriority="39"/>
-    <w:lsdException w:name="toc 3" w:uiPriority="39"/>
-    <w:lsdException w:name="toc 4" w:uiPriority="39"/>
-    <w:lsdException w:name="toc 5" w:uiPriority="39"/>
-    <w:lsdException w:name="toc 6" w:uiPriority="39"/>
-    <w:lsdException w:name="toc 7" w:uiPriority="39"/>
-    <w:lsdException w:name="toc 8" w:uiPriority="39"/>
-    <w:lsdException w:name="toc 9" w:uiPriority="39"/>
-    <w:lsdException w:name="caption" w:uiPriority="35" w:qFormat="1"/>
-    <w:lsdException w:name="Title" w:semiHidden="0" w:uiPriority="10" w:unhideWhenUsed="0" w:qFormat="1"/>
-    <w:lsdException w:name="Default Paragraph Font" w:uiPriority="1"/>
-    <w:lsdException w:name="Body Text" w:uiPriority="1" w:qFormat="1"/>
-    <w:lsdException w:name="Subtitle" w:semiHidden="0" w:uiPriority="11" w:unhideWhenUsed="0" w:qFormat="1"/>
-    <w:lsdException w:name="Strong" w:semiHidden="0" w:uiPriority="22" w:unhideWhenUsed="0" w:qFormat="1"/>
-    <w:lsdException w:name="Emphasis" w:semiHidden="0" w:uiPriority="20" w:unhideWhenUsed="0" w:qFormat="1"/>
-    <w:lsdException w:name="Table Grid" w:semiHidden="0" w:uiPriority="39" w:unhideWhenUsed="0"/>
-    <w:lsdException w:name="Placeholder Text" w:unhideWhenUsed="0"/>
-    <w:lsdException w:name="No Spacing" w:semiHidden="0" w:uiPriority="1" w:unhideWhenUsed="0" w:qFormat="1"/>
-    <w:lsdException w:name="Light Shading" w:semiHidden="0" w:uiPriority="60" w:unhideWhenUsed="0"/>
-    <w:lsdException w:name="Light List" w:semiHidden="0" w:uiPriority="61" w:unhideWhenUsed="0"/>
-    <w:lsdException w:name="Light Grid" w:semiHidden="0" w:uiPriority="62" w:unhideWhenUsed="0"/>
-    <w:lsdException w:name="Medium Shading 1" w:semiHidden="0" w:uiPriority="63" w:unhideWhenUsed="0"/>
-    <w:lsdException w:name="Medium Shading 2" w:semiHidden="0" w:uiPriority="64" w:unhideWhenUsed="0"/>
-    <w:lsdException w:name="Medium List 1" w:semiHidden="0" w:uiPriority="65" w:unhideWhenUsed="0"/>
-    <w:lsdException w:name="Medium List 2" w:semiHidden="0" w:uiPriority="66" w:unhideWhenUsed="0"/>
-    <w:lsdException w:name="Medium Grid 1" w:semiHidden="0" w:uiPriority="67" w:unhideWhenUsed="0"/>
-    <w:lsdException w:name="Medium Grid 2" w:semiHidden="0" w:uiPriority="68" w:unhideWhenUsed="0"/>
-    <w:lsdException w:name="Medium Grid 3" w:semiHidden="0" w:uiPriority="69" w:unhideWhenUsed="0"/>
-    <w:lsdException w:name="Dark List" w:semiHidden="0" w:uiPriority="70" w:unhideWhenUsed="0"/>
-    <w:lsdException w:name="Colorful Shading" w:semiHidden="0" w:uiPriority="71" w:unhideWhenUsed="0"/>
-    <w:lsdException w:name="Colorful List" w:semiHidden="0" w:uiPriority="72" w:unhideWhenUsed="0"/>
-    <w:lsdException w:name="Colorful Grid" w:semiHidden="0" w:uiPriority="73" w:unhideWhenUsed="0"/>
-    <w:lsdException w:name="Light Shading Accent 1" w:semiHidden="0" w:uiPriority="60" w:unhideWhenUsed="0"/>
-    <w:lsdException w:name="Light List Accent 1" w:semiHidden="0" w:uiPriority="61" w:unhideWhenUsed="0"/>
-    <w:lsdException w:name="Light Grid Accent 1" w:semiHidden="0" w:uiPriority="62" w:unhideWhenUsed="0"/>
-    <w:lsdException w:name="Medium Shading 1 Accent 1" w:semiHidden="0" w:uiPriority="63" w:unhideWhenUsed="0"/>
-    <w:lsdException w:name="Medium Shading 2 Accent 1" w:semiHidden="0" w:uiPriority="64" w:unhideWhenUsed="0"/>
-    <w:lsdException w:name="Medium List 1 Accent 1" w:semiHidden="0" w:uiPriority="65" w:unhideWhenUsed="0"/>
-    <w:lsdException w:name="Revision" w:unhideWhenUsed="0"/>
-    <w:lsdException w:name="List Paragraph" w:semiHidden="0" w:uiPriority="34" w:unhideWhenUsed="0" w:qFormat="1"/>
-    <w:lsdException w:name="Quote" w:semiHidden="0" w:uiPriority="29" w:unhideWhenUsed="0" w:qFormat="1"/>
-    <w:lsdException w:name="Intense Quote" w:semiHidden="0" w:uiPriority="30" w:unhideWhenUsed="0" w:qFormat="1"/>
-    <w:lsdException w:name="Medium List 2 Accent 1" w:semiHidden="0" w:uiPriority="66" w:unhideWhenUsed="0"/>
-    <w:lsdException w:name="Medium Grid 1 Accent 1" w:semiHidden="0" w:uiPriority="67" w:unhideWhenUsed="0"/>
-    <w:lsdException w:name="Medium Grid 2 Accent 1" w:semiHidden="0" w:uiPriority="68" w:unhideWhenUsed="0"/>
-    <w:lsdException w:name="Medium Grid 3 Accent 1" w:semiHidden="0" w:uiPriority="69" w:unhideWhenUsed="0"/>
-    <w:lsdException w:name="Dark List Accent 1" w:semiHidden="0" w:uiPriority="70" w:unhideWhenUsed="0"/>
-    <w:lsdException w:name="Colorful Shading Accent 1" w:semiHidden="0" w:uiPriority="71" w:unhideWhenUsed="0"/>
-    <w:lsdException w:name="Colorful List Accent 1" w:semiHidden="0" w:uiPriority="72" w:unhideWhenUsed="0"/>
-    <w:lsdException w:name="Colorful Grid Accent 1" w:semiHidden="0" w:uiPriority="73" w:unhideWhenUsed="0"/>
-    <w:lsdException w:name="Light Shading Accent 2" w:semiHidden="0" w:uiPriority="60" w:unhideWhenUsed="0"/>
-    <w:lsdException w:name="Light List Accent 2" w:semiHidden="0" w:uiPriority="61" w:unhideWhenUsed="0"/>
-    <w:lsdException w:name="Light Grid Accent 2" w:semiHidden="0" w:uiPriority="62" w:unhideWhenUsed="0"/>
-    <w:lsdException w:name="Medium Shading 1 Accent 2" w:semiHidden="0" w:uiPriority="63" w:unhideWhenUsed="0"/>
-    <w:lsdException w:name="Medium Shading 2 Accent 2" w:semiHidden="0" w:uiPriority="64" w:unhideWhenUsed="0"/>
-    <w:lsdException w:name="Medium List 1 Accent 2" w:semiHidden="0" w:uiPriority="65" w:unhideWhenUsed="0"/>
-    <w:lsdException w:name="Medium List 2 Accent 2" w:semiHidden="0" w:uiPriority="66" w:unhideWhenUsed="0"/>
-    <w:lsdException w:name="Medium Grid 1 Accent 2" w:semiHidden="0" w:uiPriority="67" w:unhideWhenUsed="0"/>
-    <w:lsdException w:name="Medium Grid 2 Accent 2" w:semiHidden="0" w:uiPriority="68" w:unhideWhenUsed="0"/>
-    <w:lsdException w:name="Medium Grid 3 Accent 2" w:semiHidden="0" w:uiPriority="69" w:unhideWhenUsed="0"/>
-    <w:lsdException w:name="Dark List Accent 2" w:semiHidden="0" w:uiPriority="70" w:unhideWhenUsed="0"/>
-    <w:lsdException w:name="Colorful Shading Accent 2" w:semiHidden="0" w:uiPriority="71" w:unhideWhenUsed="0"/>
-    <w:lsdException w:name="Colorful List Accent 2" w:semiHidden="0" w:uiPriority="72" w:unhideWhenUsed="0"/>
-    <w:lsdException w:name="Colorful Grid Accent 2" w:semiHidden="0" w:uiPriority="73" w:unhideWhenUsed="0"/>
-    <w:lsdException w:name="Light Shading Accent 3" w:semiHidden="0" w:uiPriority="60" w:unhideWhenUsed="0"/>
-    <w:lsdException w:name="Light List Accent 3" w:semiHidden="0" w:uiPriority="61" w:unhideWhenUsed="0"/>
-    <w:lsdException w:name="Light Grid Accent 3" w:semiHidden="0" w:uiPriority="62" w:unhideWhenUsed="0"/>
-    <w:lsdException w:name="Medium Shading 1 Accent 3" w:semiHidden="0" w:uiPriority="63" w:unhideWhenUsed="0"/>
-    <w:lsdException w:name="Medium Shading 2 Accent 3" w:semiHidden="0" w:uiPriority="64" w:unhideWhenUsed="0"/>
-    <w:lsdException w:name="Medium List 1 Accent 3" w:semiHidden="0" w:uiPriority="65" w:unhideWhenUsed="0"/>
-    <w:lsdException w:name="Medium List 2 Accent 3" w:semiHidden="0" w:uiPriority="66" w:unhideWhenUsed="0"/>
-    <w:lsdException w:name="Medium Grid 1 Accent 3" w:semiHidden="0" w:uiPriority="67" w:unhideWhenUsed="0"/>
-    <w:lsdException w:name="Medium Grid 2 Accent 3" w:semiHidden="0" w:uiPriority="68" w:unhideWhenUsed="0"/>
-    <w:lsdException w:name="Medium Grid 3 Accent 3" w:semiHidden="0" w:uiPriority="69" w:unhideWhenUsed="0"/>
-    <w:lsdException w:name="Dark List Accent 3" w:semiHidden="0" w:uiPriority="70" w:unhideWhenUsed="0"/>
-    <w:lsdException w:name="Colorful Shading Accent 3" w:semiHidden="0" w:uiPriority="71" w:unhideWhenUsed="0"/>
-    <w:lsdException w:name="Colorful List Accent 3" w:semiHidden="0" w:uiPriority="72" w:unhideWhenUsed="0"/>
-    <w:lsdException w:name="Colorful Grid Accent 3" w:semiHidden="0" w:uiPriority="73" w:unhideWhenUsed="0"/>
-    <w:lsdException w:name="Light Shading Accent 4" w:semiHidden="0" w:uiPriority="60" w:unhideWhenUsed="0"/>
-    <w:lsdException w:name="Light List Accent 4" w:semiHidden="0" w:uiPriority="61" w:unhideWhenUsed="0"/>
-    <w:lsdException w:name="Light Grid Accent 4" w:semiHidden="0" w:uiPriority="62" w:unhideWhenUsed="0"/>
-    <w:lsdException w:name="Medium Shading 1 Accent 4" w:semiHidden="0" w:uiPriority="63" w:unhideWhenUsed="0"/>
-    <w:lsdException w:name="Medium Shading 2 Accent 4" w:semiHidden="0" w:uiPriority="64" w:unhideWhenUsed="0"/>
-    <w:lsdException w:name="Medium List 1 Accent 4" w:semiHidden="0" w:uiPriority="65" w:unhideWhenUsed="0"/>
-    <w:lsdException w:name="Medium List 2 Accent 4" w:semiHidden="0" w:uiPriority="66" w:unhideWhenUsed="0"/>
-    <w:lsdException w:name="Medium Grid 1 Accent 4" w:semiHidden="0" w:uiPriority="67" w:unhideWhenUsed="0"/>
-    <w:lsdException w:name="Medium Grid 2 Accent 4" w:semiHidden="0" w:uiPriority="68" w:unhideWhenUsed="0"/>
-    <w:lsdException w:name="Medium Grid 3 Accent 4" w:semiHidden="0" w:uiPriority="69" w:unhideWhenUsed="0"/>
-    <w:lsdException w:name="Dark List Accent 4" w:semiHidden="0" w:uiPriority="70" w:unhideWhenUsed="0"/>
-    <w:lsdException w:name="Colorful Shading Accent 4" w:semiHidden="0" w:uiPriority="71" w:unhideWhenUsed="0"/>
-    <w:lsdException w:name="Colorful List Accent 4" w:semiHidden="0" w:uiPriority="72" w:unhideWhenUsed="0"/>
-    <w:lsdException w:name="Colorful Grid Accent 4" w:semiHidden="0" w:uiPriority="73" w:unhideWhenUsed="0"/>
-    <w:lsdException w:name="Light Shading Accent 5" w:semiHidden="0" w:uiPriority="60" w:unhideWhenUsed="0"/>
-    <w:lsdException w:name="Light List Accent 5" w:semiHidden="0" w:uiPriority="61" w:unhideWhenUsed="0"/>
-    <w:lsdException w:name="Light Grid Accent 5" w:semiHidden="0" w:uiPriority="62" w:unhideWhenUsed="0"/>
-    <w:lsdException w:name="Medium Shading 1 Accent 5" w:semiHidden="0" w:uiPriority="63" w:unhideWhenUsed="0"/>
-    <w:lsdException w:name="Medium Shading 2 Accent 5" w:semiHidden="0" w:uiPriority="64" w:unhideWhenUsed="0"/>
-    <w:lsdException w:name="Medium List 1 Accent 5" w:semiHidden="0" w:uiPriority="65" w:unhideWhenUsed="0"/>
-    <w:lsdException w:name="Medium List 2 Accent 5" w:semiHidden="0" w:uiPriority="66" w:unhideWhenUsed="0"/>
-    <w:lsdException w:name="Medium Grid 1 Accent 5" w:semiHidden="0" w:uiPriority="67" w:unhideWhenUsed="0"/>
-    <w:lsdException w:name="Medium Grid 2 Accent 5" w:semiHidden="0" w:uiPriority="68" w:unhideWhenUsed="0"/>
-    <w:lsdException w:name="Medium Grid 3 Accent 5" w:semiHidden="0" w:uiPriority="69" w:unhideWhenUsed="0"/>
-    <w:lsdException w:name="Dark List Accent 5" w:semiHidden="0" w:uiPriority="70" w:unhideWhenUsed="0"/>
-    <w:lsdException w:name="Colorful Shading Accent 5" w:semiHidden="0" w:uiPriority="71" w:unhideWhenUsed="0"/>
-    <w:lsdException w:name="Colorful List Accent 5" w:semiHidden="0" w:uiPriority="72" w:unhideWhenUsed="0"/>
-    <w:lsdException w:name="Colorful Grid Accent 5" w:semiHidden="0" w:uiPriority="73" w:unhideWhenUsed="0"/>
-    <w:lsdException w:name="Light Shading Accent 6" w:semiHidden="0" w:uiPriority="60" w:unhideWhenUsed="0"/>
-    <w:lsdException w:name="Light List Accent 6" w:semiHidden="0" w:uiPriority="61" w:unhideWhenUsed="0"/>
-    <w:lsdException w:name="Light Grid Accent 6" w:semiHidden="0" w:uiPriority="62" w:unhideWhenUsed="0"/>
-    <w:lsdException w:name="Medium Shading 1 Accent 6" w:semiHidden="0" w:uiPriority="63" w:unhideWhenUsed="0"/>
-    <w:lsdException w:name="Medium Shading 2 Accent 6" w:semiHidden="0" w:uiPriority="64" w:unhideWhenUsed="0"/>
-    <w:lsdException w:name="Medium List 1 Accent 6" w:semiHidden="0" w:uiPriority="65" w:unhideWhenUsed="0"/>
-    <w:lsdException w:name="Medium List 2 Accent 6" w:semiHidden="0" w:uiPriority="66" w:unhideWhenUsed="0"/>
-    <w:lsdException w:name="Medium Grid 1 Accent 6" w:semiHidden="0" w:uiPriority="67" w:unhideWhenUsed="0"/>
-    <w:lsdException w:name="Medium Grid 2 Accent 6" w:semiHidden="0" w:uiPriority="68" w:unhideWhenUsed="0"/>
-    <w:lsdException w:name="Medium Grid 3 Accent 6" w:semiHidden="0" w:uiPriority="69" w:unhideWhenUsed="0"/>
-    <w:lsdException w:name="Dark List Accent 6" w:semiHidden="0" w:uiPriority="70" w:unhideWhenUsed="0"/>
-    <w:lsdException w:name="Colorful Shading Accent 6" w:semiHidden="0" w:uiPriority="71" w:unhideWhenUsed="0"/>
-    <w:lsdException w:name="Colorful List Accent 6" w:semiHidden="0" w:uiPriority="72" w:unhideWhenUsed="0"/>
-    <w:lsdException w:name="Colorful Grid Accent 6" w:semiHidden="0" w:uiPriority="73" w:unhideWhenUsed="0"/>
-    <w:lsdException w:name="Subtle Emphasis" w:semiHidden="0" w:uiPriority="19" w:unhideWhenUsed="0" w:qFormat="1"/>
-    <w:lsdException w:name="Intense Emphasis" w:semiHidden="0" w:uiPriority="21" w:unhideWhenUsed="0" w:qFormat="1"/>
-    <w:lsdException w:name="Subtle Reference" w:semiHidden="0" w:uiPriority="31" w:unhideWhenUsed="0" w:qFormat="1"/>
-    <w:lsdException w:name="Intense Reference" w:semiHidden="0" w:uiPriority="32" w:unhideWhenUsed="0" w:qFormat="1"/>
-    <w:lsdException w:name="Book Title" w:semiHidden="0" w:uiPriority="33" w:unhideWhenUsed="0" w:qFormat="1"/>
-    <w:lsdException w:name="Bibliography" w:uiPriority="37"/>
-    <w:lsdException w:name="TOC Heading" w:uiPriority="39" w:qFormat="1"/>
+  <w:latentStyles w:defLockedState="0" w:defUIPriority="99" w:defSemiHidden="0" w:defUnhideWhenUsed="0" w:defQFormat="0" w:count="376">
+    <w:lsdException w:name="Normal" w:uiPriority="0" w:qFormat="1"/>
+    <w:lsdException w:name="heading 1" w:uiPriority="9" w:qFormat="1"/>
+    <w:lsdException w:name="heading 2" w:semiHidden="1" w:uiPriority="9" w:unhideWhenUsed="1" w:qFormat="1"/>
+    <w:lsdException w:name="heading 3" w:semiHidden="1" w:uiPriority="9" w:unhideWhenUsed="1" w:qFormat="1"/>
+    <w:lsdException w:name="heading 4" w:semiHidden="1" w:uiPriority="9" w:unhideWhenUsed="1" w:qFormat="1"/>
+    <w:lsdException w:name="heading 5" w:semiHidden="1" w:uiPriority="9" w:unhideWhenUsed="1" w:qFormat="1"/>
+    <w:lsdException w:name="heading 6" w:semiHidden="1" w:uiPriority="9" w:unhideWhenUsed="1" w:qFormat="1"/>
+    <w:lsdException w:name="heading 7" w:semiHidden="1" w:uiPriority="9" w:unhideWhenUsed="1" w:qFormat="1"/>
+    <w:lsdException w:name="heading 8" w:semiHidden="1" w:uiPriority="9" w:unhideWhenUsed="1" w:qFormat="1"/>
+    <w:lsdException w:name="heading 9" w:semiHidden="1" w:uiPriority="9" w:unhideWhenUsed="1" w:qFormat="1"/>
+    <w:lsdException w:name="index 1" w:semiHidden="1" w:unhideWhenUsed="1"/>
+    <w:lsdException w:name="index 2" w:semiHidden="1" w:unhideWhenUsed="1"/>
+    <w:lsdException w:name="index 3" w:semiHidden="1" w:unhideWhenUsed="1"/>
+    <w:lsdException w:name="index 4" w:semiHidden="1" w:unhideWhenUsed="1"/>
+    <w:lsdException w:name="index 5" w:semiHidden="1" w:unhideWhenUsed="1"/>
+    <w:lsdException w:name="index 6" w:semiHidden="1" w:unhideWhenUsed="1"/>
+    <w:lsdException w:name="index 7" w:semiHidden="1" w:unhideWhenUsed="1"/>
+    <w:lsdException w:name="index 8" w:semiHidden="1" w:unhideWhenUsed="1"/>
+    <w:lsdException w:name="index 9" w:semiHidden="1" w:unhideWhenUsed="1"/>
+    <w:lsdException w:name="toc 1" w:semiHidden="1" w:uiPriority="39" w:unhideWhenUsed="1"/>
+    <w:lsdException w:name="toc 2" w:semiHidden="1" w:uiPriority="39" w:unhideWhenUsed="1"/>
+    <w:lsdException w:name="toc 3" w:semiHidden="1" w:uiPriority="39" w:unhideWhenUsed="1"/>
+    <w:lsdException w:name="toc 4" w:semiHidden="1" w:uiPriority="39" w:unhideWhenUsed="1"/>
+    <w:lsdException w:name="toc 5" w:semiHidden="1" w:uiPriority="39" w:unhideWhenUsed="1"/>
+    <w:lsdException w:name="toc 6" w:semiHidden="1" w:uiPriority="39" w:unhideWhenUsed="1"/>
+    <w:lsdException w:name="toc 7" w:semiHidden="1" w:uiPriority="39" w:unhideWhenUsed="1"/>
+    <w:lsdException w:name="toc 8" w:semiHidden="1" w:uiPriority="39" w:unhideWhenUsed="1"/>
+    <w:lsdException w:name="toc 9" w:semiHidden="1" w:uiPriority="39" w:unhideWhenUsed="1"/>
+    <w:lsdException w:name="Normal Indent" w:semiHidden="1" w:unhideWhenUsed="1"/>
+    <w:lsdException w:name="footnote text" w:semiHidden="1" w:unhideWhenUsed="1"/>
+    <w:lsdException w:name="annotation text" w:semiHidden="1" w:unhideWhenUsed="1"/>
+    <w:lsdException w:name="header" w:semiHidden="1" w:unhideWhenUsed="1"/>
+    <w:lsdException w:name="footer" w:semiHidden="1" w:unhideWhenUsed="1"/>
+    <w:lsdException w:name="index heading" w:semiHidden="1" w:unhideWhenUsed="1"/>
+    <w:lsdException w:name="caption" w:semiHidden="1" w:uiPriority="35" w:unhideWhenUsed="1" w:qFormat="1"/>
+    <w:lsdException w:name="table of figures" w:semiHidden="1" w:unhideWhenUsed="1"/>
+    <w:lsdException w:name="envelope address" w:semiHidden="1" w:unhideWhenUsed="1"/>
+    <w:lsdException w:name="envelope return" w:semiHidden="1" w:unhideWhenUsed="1"/>
+    <w:lsdException w:name="footnote reference" w:semiHidden="1" w:unhideWhenUsed="1"/>
+    <w:lsdException w:name="annotation reference" w:semiHidden="1" w:unhideWhenUsed="1"/>
+    <w:lsdException w:name="line number" w:semiHidden="1" w:unhideWhenUsed="1"/>
+    <w:lsdException w:name="page number" w:semiHidden="1" w:unhideWhenUsed="1"/>
+    <w:lsdException w:name="endnote reference" w:semiHidden="1" w:unhideWhenUsed="1"/>
+    <w:lsdException w:name="endnote text" w:semiHidden="1" w:unhideWhenUsed="1"/>
+    <w:lsdException w:name="table of authorities" w:semiHidden="1" w:unhideWhenUsed="1"/>
+    <w:lsdException w:name="macro" w:semiHidden="1" w:unhideWhenUsed="1"/>
+    <w:lsdException w:name="toa heading" w:semiHidden="1" w:unhideWhenUsed="1"/>
+    <w:lsdException w:name="List" w:semiHidden="1" w:unhideWhenUsed="1"/>
+    <w:lsdException w:name="List Bullet" w:semiHidden="1" w:unhideWhenUsed="1"/>
+    <w:lsdException w:name="List Number" w:semiHidden="1" w:unhideWhenUsed="1"/>
+    <w:lsdException w:name="List 2" w:semiHidden="1" w:unhideWhenUsed="1"/>
+    <w:lsdException w:name="List 3" w:semiHidden="1" w:unhideWhenUsed="1"/>
+    <w:lsdException w:name="List 4" w:semiHidden="1" w:unhideWhenUsed="1"/>
+    <w:lsdException w:name="List 5" w:semiHidden="1" w:unhideWhenUsed="1"/>
+    <w:lsdException w:name="List Bullet 2" w:semiHidden="1" w:unhideWhenUsed="1"/>
+    <w:lsdException w:name="List Bullet 3" w:semiHidden="1" w:unhideWhenUsed="1"/>
+    <w:lsdException w:name="List Bullet 4" w:semiHidden="1" w:unhideWhenUsed="1"/>
+    <w:lsdException w:name="List Bullet 5" w:semiHidden="1" w:unhideWhenUsed="1"/>
+    <w:lsdException w:name="List Number 2" w:semiHidden="1" w:unhideWhenUsed="1"/>
+    <w:lsdException w:name="List Number 3" w:semiHidden="1" w:unhideWhenUsed="1"/>
+    <w:lsdException w:name="List Number 4" w:semiHidden="1" w:unhideWhenUsed="1"/>
+    <w:lsdException w:name="List Number 5" w:semiHidden="1" w:unhideWhenUsed="1"/>
+    <w:lsdException w:name="Title" w:uiPriority="10" w:qFormat="1"/>
+    <w:lsdException w:name="Closing" w:semiHidden="1" w:unhideWhenUsed="1"/>
+    <w:lsdException w:name="Signature" w:semiHidden="1" w:unhideWhenUsed="1"/>
+    <w:lsdException w:name="Default Paragraph Font" w:semiHidden="1" w:uiPriority="1" w:unhideWhenUsed="1"/>
+    <w:lsdException w:name="Body Text" w:semiHidden="1" w:uiPriority="1" w:unhideWhenUsed="1" w:qFormat="1"/>
+    <w:lsdException w:name="Body Text Indent" w:semiHidden="1" w:unhideWhenUsed="1"/>
+    <w:lsdException w:name="List Continue" w:semiHidden="1" w:unhideWhenUsed="1"/>
+    <w:lsdException w:name="List Continue 2" w:semiHidden="1" w:unhideWhenUsed="1"/>
+    <w:lsdException w:name="List Continue 3" w:semiHidden="1" w:unhideWhenUsed="1"/>
+    <w:lsdException w:name="List Continue 4" w:semiHidden="1" w:unhideWhenUsed="1"/>
+    <w:lsdException w:name="List Continue 5" w:semiHidden="1" w:unhideWhenUsed="1"/>
+    <w:lsdException w:name="Message Header" w:semiHidden="1" w:unhideWhenUsed="1"/>
+    <w:lsdException w:name="Subtitle" w:uiPriority="11" w:qFormat="1"/>
+    <w:lsdException w:name="Salutation" w:semiHidden="1" w:unhideWhenUsed="1"/>
+    <w:lsdException w:name="Date" w:semiHidden="1" w:unhideWhenUsed="1"/>
+    <w:lsdException w:name="Body Text First Indent" w:semiHidden="1" w:unhideWhenUsed="1"/>
+    <w:lsdException w:name="Body Text First Indent 2" w:semiHidden="1" w:unhideWhenUsed="1"/>
+    <w:lsdException w:name="Note Heading" w:semiHidden="1" w:unhideWhenUsed="1"/>
+    <w:lsdException w:name="Body Text 2" w:semiHidden="1" w:unhideWhenUsed="1"/>
+    <w:lsdException w:name="Body Text 3" w:semiHidden="1" w:unhideWhenUsed="1"/>
+    <w:lsdException w:name="Body Text Indent 2" w:semiHidden="1" w:unhideWhenUsed="1"/>
+    <w:lsdException w:name="Body Text Indent 3" w:semiHidden="1" w:unhideWhenUsed="1"/>
+    <w:lsdException w:name="Block Text" w:semiHidden="1" w:unhideWhenUsed="1"/>
+    <w:lsdException w:name="Hyperlink" w:semiHidden="1" w:unhideWhenUsed="1"/>
+    <w:lsdException w:name="FollowedHyperlink" w:semiHidden="1" w:unhideWhenUsed="1"/>
+    <w:lsdException w:name="Strong" w:uiPriority="22" w:qFormat="1"/>
+    <w:lsdException w:name="Emphasis" w:uiPriority="20" w:qFormat="1"/>
+    <w:lsdException w:name="Document Map" w:semiHidden="1" w:unhideWhenUsed="1"/>
+    <w:lsdException w:name="Plain Text" w:semiHidden="1" w:unhideWhenUsed="1"/>
+    <w:lsdException w:name="E-mail Signature" w:semiHidden="1" w:unhideWhenUsed="1"/>
+    <w:lsdException w:name="HTML Top of Form" w:semiHidden="1" w:unhideWhenUsed="1"/>
+    <w:lsdException w:name="HTML Bottom of Form" w:semiHidden="1" w:unhideWhenUsed="1"/>
+    <w:lsdException w:name="Normal (Web)" w:semiHidden="1" w:unhideWhenUsed="1"/>
+    <w:lsdException w:name="HTML Acronym" w:semiHidden="1" w:unhideWhenUsed="1"/>
+    <w:lsdException w:name="HTML Address" w:semiHidden="1" w:unhideWhenUsed="1"/>
+    <w:lsdException w:name="HTML Cite" w:semiHidden="1" w:unhideWhenUsed="1"/>
+    <w:lsdException w:name="HTML Code" w:semiHidden="1" w:unhideWhenUsed="1"/>
+    <w:lsdException w:name="HTML Definition" w:semiHidden="1" w:unhideWhenUsed="1"/>
+    <w:lsdException w:name="HTML Keyboard" w:semiHidden="1" w:unhideWhenUsed="1"/>
+    <w:lsdException w:name="HTML Preformatted" w:semiHidden="1" w:unhideWhenUsed="1"/>
+    <w:lsdException w:name="HTML Sample" w:semiHidden="1" w:unhideWhenUsed="1"/>
+    <w:lsdException w:name="HTML Typewriter" w:semiHidden="1" w:unhideWhenUsed="1"/>
+    <w:lsdException w:name="HTML Variable" w:semiHidden="1" w:unhideWhenUsed="1"/>
+    <w:lsdException w:name="Normal Table" w:semiHidden="1" w:unhideWhenUsed="1"/>
+    <w:lsdException w:name="annotation subject" w:semiHidden="1" w:unhideWhenUsed="1"/>
+    <w:lsdException w:name="No List" w:semiHidden="1" w:unhideWhenUsed="1"/>
+    <w:lsdException w:name="Outline List 1" w:semiHidden="1" w:unhideWhenUsed="1"/>
+    <w:lsdException w:name="Outline List 2" w:semiHidden="1" w:unhideWhenUsed="1"/>
+    <w:lsdException w:name="Outline List 3" w:semiHidden="1" w:unhideWhenUsed="1"/>
+    <w:lsdException w:name="Table Simple 1" w:semiHidden="1" w:unhideWhenUsed="1"/>
+    <w:lsdException w:name="Table Simple 2" w:semiHidden="1" w:unhideWhenUsed="1"/>
+    <w:lsdException w:name="Table Simple 3" w:semiHidden="1" w:unhideWhenUsed="1"/>
+    <w:lsdException w:name="Table Classic 1" w:semiHidden="1" w:unhideWhenUsed="1"/>
+    <w:lsdException w:name="Table Classic 2" w:semiHidden="1" w:unhideWhenUsed="1"/>
+    <w:lsdException w:name="Table Classic 3" w:semiHidden="1" w:unhideWhenUsed="1"/>
+    <w:lsdException w:name="Table Classic 4" w:semiHidden="1" w:unhideWhenUsed="1"/>
+    <w:lsdException w:name="Table Colorful 1" w:semiHidden="1" w:unhideWhenUsed="1"/>
+    <w:lsdException w:name="Table Colorful 2" w:semiHidden="1" w:unhideWhenUsed="1"/>
+    <w:lsdException w:name="Table Colorful 3" w:semiHidden="1" w:unhideWhenUsed="1"/>
+    <w:lsdException w:name="Table Columns 1" w:semiHidden="1" w:unhideWhenUsed="1"/>
+    <w:lsdException w:name="Table Columns 2" w:semiHidden="1" w:unhideWhenUsed="1"/>
+    <w:lsdException w:name="Table Columns 3" w:semiHidden="1" w:unhideWhenUsed="1"/>
+    <w:lsdException w:name="Table Columns 4" w:semiHidden="1" w:unhideWhenUsed="1"/>
+    <w:lsdException w:name="Table Columns 5" w:semiHidden="1" w:unhideWhenUsed="1"/>
+    <w:lsdException w:name="Table Grid 1" w:semiHidden="1" w:unhideWhenUsed="1"/>
+    <w:lsdException w:name="Table Grid 2" w:semiHidden="1" w:unhideWhenUsed="1"/>
+    <w:lsdException w:name="Table Grid 3" w:semiHidden="1" w:unhideWhenUsed="1"/>
+    <w:lsdException w:name="Table Grid 4" w:semiHidden="1" w:unhideWhenUsed="1"/>
+    <w:lsdException w:name="Table Grid 5" w:semiHidden="1" w:unhideWhenUsed="1"/>
+    <w:lsdException w:name="Table Grid 6" w:semiHidden="1" w:unhideWhenUsed="1"/>
+    <w:lsdException w:name="Table Grid 7" w:semiHidden="1" w:unhideWhenUsed="1"/>
+    <w:lsdException w:name="Table Grid 8" w:semiHidden="1" w:unhideWhenUsed="1"/>
+    <w:lsdException w:name="Table List 1" w:semiHidden="1" w:unhideWhenUsed="1"/>
+    <w:lsdException w:name="Table List 2" w:semiHidden="1" w:unhideWhenUsed="1"/>
+    <w:lsdException w:name="Table List 3" w:semiHidden="1" w:unhideWhenUsed="1"/>
+    <w:lsdException w:name="Table List 4" w:semiHidden="1" w:unhideWhenUsed="1"/>
+    <w:lsdException w:name="Table List 5" w:semiHidden="1" w:unhideWhenUsed="1"/>
+    <w:lsdException w:name="Table List 6" w:semiHidden="1" w:unhideWhenUsed="1"/>
+    <w:lsdException w:name="Table List 7" w:semiHidden="1" w:unhideWhenUsed="1"/>
+    <w:lsdException w:name="Table List 8" w:semiHidden="1" w:unhideWhenUsed="1"/>
+    <w:lsdException w:name="Table 3D effects 1" w:semiHidden="1" w:unhideWhenUsed="1"/>
+    <w:lsdException w:name="Table 3D effects 2" w:semiHidden="1" w:unhideWhenUsed="1"/>
+    <w:lsdException w:name="Table 3D effects 3" w:semiHidden="1" w:unhideWhenUsed="1"/>
+    <w:lsdException w:name="Table Contemporary" w:semiHidden="1" w:unhideWhenUsed="1"/>
+    <w:lsdException w:name="Table Elegant" w:semiHidden="1" w:unhideWhenUsed="1"/>
+    <w:lsdException w:name="Table Professional" w:semiHidden="1" w:unhideWhenUsed="1"/>
+    <w:lsdException w:name="Table Subtle 1" w:semiHidden="1" w:unhideWhenUsed="1"/>
+    <w:lsdException w:name="Table Subtle 2" w:semiHidden="1" w:unhideWhenUsed="1"/>
+    <w:lsdException w:name="Table Web 1" w:semiHidden="1" w:unhideWhenUsed="1"/>
+    <w:lsdException w:name="Table Web 2" w:semiHidden="1" w:unhideWhenUsed="1"/>
+    <w:lsdException w:name="Table Web 3" w:semiHidden="1" w:unhideWhenUsed="1"/>
+    <w:lsdException w:name="Balloon Text" w:semiHidden="1" w:unhideWhenUsed="1"/>
+    <w:lsdException w:name="Table Grid" w:semiHidden="1" w:uiPriority="39" w:unhideWhenUsed="1"/>
+    <w:lsdException w:name="Table Theme" w:semiHidden="1" w:unhideWhenUsed="1"/>
+    <w:lsdException w:name="Placeholder Text" w:semiHidden="1"/>
+    <w:lsdException w:name="No Spacing" w:uiPriority="1" w:qFormat="1"/>
+    <w:lsdException w:name="Light Shading" w:uiPriority="60"/>
+    <w:lsdException w:name="Light List" w:uiPriority="61"/>
+    <w:lsdException w:name="Light Grid" w:uiPriority="62"/>
+    <w:lsdException w:name="Medium Shading 1" w:uiPriority="63"/>
+    <w:lsdException w:name="Medium Shading 2" w:uiPriority="64"/>
+    <w:lsdException w:name="Medium List 1" w:uiPriority="65"/>
+    <w:lsdException w:name="Medium List 2" w:uiPriority="66"/>
+    <w:lsdException w:name="Medium Grid 1" w:uiPriority="67"/>
+    <w:lsdException w:name="Medium Grid 2" w:uiPriority="68"/>
+    <w:lsdException w:name="Medium Grid 3" w:uiPriority="69"/>
+    <w:lsdException w:name="Dark List" w:uiPriority="70"/>
+    <w:lsdException w:name="Colorful Shading" w:uiPriority="71"/>
+    <w:lsdException w:name="Colorful List" w:uiPriority="72"/>
+    <w:lsdException w:name="Colorful Grid" w:uiPriority="73"/>
+    <w:lsdException w:name="Light Shading Accent 1" w:uiPriority="60"/>
+    <w:lsdException w:name="Light List Accent 1" w:uiPriority="61"/>
+    <w:lsdException w:name="Light Grid Accent 1" w:uiPriority="62"/>
+    <w:lsdException w:name="Medium Shading 1 Accent 1" w:uiPriority="63"/>
+    <w:lsdException w:name="Medium Shading 2 Accent 1" w:uiPriority="64"/>
+    <w:lsdException w:name="Medium List 1 Accent 1" w:uiPriority="65"/>
+    <w:lsdException w:name="Revision" w:semiHidden="1"/>
+    <w:lsdException w:name="List Paragraph" w:uiPriority="34" w:qFormat="1"/>
+    <w:lsdException w:name="Quote" w:uiPriority="29" w:qFormat="1"/>
+    <w:lsdException w:name="Intense Quote" w:uiPriority="30" w:qFormat="1"/>
+    <w:lsdException w:name="Medium List 2 Accent 1" w:uiPriority="66"/>
+    <w:lsdException w:name="Medium Grid 1 Accent 1" w:uiPriority="67"/>
+    <w:lsdException w:name="Medium Grid 2 Accent 1" w:uiPriority="68"/>
+    <w:lsdException w:name="Medium Grid 3 Accent 1" w:uiPriority="69"/>
+    <w:lsdException w:name="Dark List Accent 1" w:uiPriority="70"/>
+    <w:lsdException w:name="Colorful Shading Accent 1" w:uiPriority="71"/>
+    <w:lsdException w:name="Colorful List Accent 1" w:uiPriority="72"/>
+    <w:lsdException w:name="Colorful Grid Accent 1" w:uiPriority="73"/>
+    <w:lsdException w:name="Light Shading Accent 2" w:uiPriority="60"/>
+    <w:lsdException w:name="Light List Accent 2" w:uiPriority="61"/>
+    <w:lsdException w:name="Light Grid Accent 2" w:uiPriority="62"/>
+    <w:lsdException w:name="Medium Shading 1 Accent 2" w:uiPriority="63"/>
+    <w:lsdException w:name="Medium Shading 2 Accent 2" w:uiPriority="64"/>
+    <w:lsdException w:name="Medium List 1 Accent 2" w:uiPriority="65"/>
+    <w:lsdException w:name="Medium List 2 Accent 2" w:uiPriority="66"/>
+    <w:lsdException w:name="Medium Grid 1 Accent 2" w:uiPriority="67"/>
+    <w:lsdException w:name="Medium Grid 2 Accent 2" w:uiPriority="68"/>
+    <w:lsdException w:name="Medium Grid 3 Accent 2" w:uiPriority="69"/>
+    <w:lsdException w:name="Dark List Accent 2" w:uiPriority="70"/>
+    <w:lsdException w:name="Colorful Shading Accent 2" w:uiPriority="71"/>
+    <w:lsdException w:name="Colorful List Accent 2" w:uiPriority="72"/>
+    <w:lsdException w:name="Colorful Grid Accent 2" w:uiPriority="73"/>
+    <w:lsdException w:name="Light Shading Accent 3" w:uiPriority="60"/>
+    <w:lsdException w:name="Light List Accent 3" w:uiPriority="61"/>
+    <w:lsdException w:name="Light Grid Accent 3" w:uiPriority="62"/>
+    <w:lsdException w:name="Medium Shading 1 Accent 3" w:uiPriority="63"/>
+    <w:lsdException w:name="Medium Shading 2 Accent 3" w:uiPriority="64"/>
+    <w:lsdException w:name="Medium List 1 Accent 3" w:uiPriority="65"/>
+    <w:lsdException w:name="Medium List 2 Accent 3" w:uiPriority="66"/>
+    <w:lsdException w:name="Medium Grid 1 Accent 3" w:uiPriority="67"/>
+    <w:lsdException w:name="Medium Grid 2 Accent 3" w:uiPriority="68"/>
+    <w:lsdException w:name="Medium Grid 3 Accent 3" w:uiPriority="69"/>
+    <w:lsdException w:name="Dark List Accent 3" w:uiPriority="70"/>
+    <w:lsdException w:name="Colorful Shading Accent 3" w:uiPriority="71"/>
+    <w:lsdException w:name="Colorful List Accent 3" w:uiPriority="72"/>
+    <w:lsdException w:name="Colorful Grid Accent 3" w:uiPriority="73"/>
+    <w:lsdException w:name="Light Shading Accent 4" w:uiPriority="60"/>
+    <w:lsdException w:name="Light List Accent 4" w:uiPriority="61"/>
+    <w:lsdException w:name="Light Grid Accent 4" w:uiPriority="62"/>
+    <w:lsdException w:name="Medium Shading 1 Accent 4" w:uiPriority="63"/>
+    <w:lsdException w:name="Medium Shading 2 Accent 4" w:uiPriority="64"/>
+    <w:lsdException w:name="Medium List 1 Accent 4" w:uiPriority="65"/>
+    <w:lsdException w:name="Medium List 2 Accent 4" w:uiPriority="66"/>
+    <w:lsdException w:name="Medium Grid 1 Accent 4" w:uiPriority="67"/>
+    <w:lsdException w:name="Medium Grid 2 Accent 4" w:uiPriority="68"/>
+    <w:lsdException w:name="Medium Grid 3 Accent 4" w:uiPriority="69"/>
+    <w:lsdException w:name="Dark List Accent 4" w:uiPriority="70"/>
+    <w:lsdException w:name="Colorful Shading Accent 4" w:uiPriority="71"/>
+    <w:lsdException w:name="Colorful List Accent 4" w:uiPriority="72"/>
+    <w:lsdException w:name="Colorful Grid Accent 4" w:uiPriority="73"/>
+    <w:lsdException w:name="Light Shading Accent 5" w:uiPriority="60"/>
+    <w:lsdException w:name="Light List Accent 5" w:uiPriority="61"/>
+    <w:lsdException w:name="Light Grid Accent 5" w:uiPriority="62"/>
+    <w:lsdException w:name="Medium Shading 1 Accent 5" w:uiPriority="63"/>
+    <w:lsdException w:name="Medium Shading 2 Accent 5" w:uiPriority="64"/>
+    <w:lsdException w:name="Medium List 1 Accent 5" w:uiPriority="65"/>
+    <w:lsdException w:name="Medium List 2 Accent 5" w:uiPriority="66"/>
+    <w:lsdException w:name="Medium Grid 1 Accent 5" w:uiPriority="67"/>
+    <w:lsdException w:name="Medium Grid 2 Accent 5" w:uiPriority="68"/>
+    <w:lsdException w:name="Medium Grid 3 Accent 5" w:uiPriority="69"/>
+    <w:lsdException w:name="Dark List Accent 5" w:uiPriority="70"/>
+    <w:lsdException w:name="Colorful Shading Accent 5" w:uiPriority="71"/>
+    <w:lsdException w:name="Colorful List Accent 5" w:uiPriority="72"/>
+    <w:lsdException w:name="Colorful Grid Accent 5" w:uiPriority="73"/>
+    <w:lsdException w:name="Light Shading Accent 6" w:uiPriority="60"/>
+    <w:lsdException w:name="Light List Accent 6" w:uiPriority="61"/>
+    <w:lsdException w:name="Light Grid Accent 6" w:uiPriority="62"/>
+    <w:lsdException w:name="Medium Shading 1 Accent 6" w:uiPriority="63"/>
+    <w:lsdException w:name="Medium Shading 2 Accent 6" w:uiPriority="64"/>
+    <w:lsdException w:name="Medium List 1 Accent 6" w:uiPriority="65"/>
+    <w:lsdException w:name="Medium List 2 Accent 6" w:uiPriority="66"/>
+    <w:lsdException w:name="Medium Grid 1 Accent 6" w:uiPriority="67"/>
+    <w:lsdException w:name="Medium Grid 2 Accent 6" w:uiPriority="68"/>
+    <w:lsdException w:name="Medium Grid 3 Accent 6" w:uiPriority="69"/>
+    <w:lsdException w:name="Dark List Accent 6" w:uiPriority="70"/>
+    <w:lsdException w:name="Colorful Shading Accent 6" w:uiPriority="71"/>
+    <w:lsdException w:name="Colorful List Accent 6" w:uiPriority="72"/>
+    <w:lsdException w:name="Colorful Grid Accent 6" w:uiPriority="73"/>
+    <w:lsdException w:name="Subtle Emphasis" w:uiPriority="19" w:qFormat="1"/>
+    <w:lsdException w:name="Intense Emphasis" w:uiPriority="21" w:qFormat="1"/>
+    <w:lsdException w:name="Subtle Reference" w:uiPriority="31" w:qFormat="1"/>
+    <w:lsdException w:name="Intense Reference" w:uiPriority="32" w:qFormat="1"/>
+    <w:lsdException w:name="Book Title" w:uiPriority="33" w:qFormat="1"/>
+    <w:lsdException w:name="Bibliography" w:semiHidden="1" w:uiPriority="37" w:unhideWhenUsed="1"/>
+    <w:lsdException w:name="TOC Heading" w:semiHidden="1" w:uiPriority="39" w:unhideWhenUsed="1" w:qFormat="1"/>
+    <w:lsdException w:name="Plain Table 1" w:uiPriority="41"/>
+    <w:lsdException w:name="Plain Table 2" w:uiPriority="42"/>
+    <w:lsdException w:name="Plain Table 3" w:uiPriority="43"/>
+    <w:lsdException w:name="Plain Table 4" w:uiPriority="44"/>
+    <w:lsdException w:name="Plain Table 5" w:uiPriority="45"/>
+    <w:lsdException w:name="Grid Table Light" w:uiPriority="40"/>
+    <w:lsdException w:name="Grid Table 1 Light" w:uiPriority="46"/>
+    <w:lsdException w:name="Grid Table 2" w:uiPriority="47"/>
+    <w:lsdException w:name="Grid Table 3" w:uiPriority="48"/>
+    <w:lsdException w:name="Grid Table 4" w:uiPriority="49"/>
+    <w:lsdException w:name="Grid Table 5 Dark" w:uiPriority="50"/>
+    <w:lsdException w:name="Grid Table 6 Colorful" w:uiPriority="51"/>
+    <w:lsdException w:name="Grid Table 7 Colorful" w:uiPriority="52"/>
+    <w:lsdException w:name="Grid Table 1 Light Accent 1" w:uiPriority="46"/>
+    <w:lsdException w:name="Grid Table 2 Accent 1" w:uiPriority="47"/>
+    <w:lsdException w:name="Grid Table 3 Accent 1" w:uiPriority="48"/>
+    <w:lsdException w:name="Grid Table 4 Accent 1" w:uiPriority="49"/>
+    <w:lsdException w:name="Grid Table 5 Dark Accent 1" w:uiPriority="50"/>
+    <w:lsdException w:name="Grid Table 6 Colorful Accent 1" w:uiPriority="51"/>
+    <w:lsdException w:name="Grid Table 7 Colorful Accent 1" w:uiPriority="52"/>
+    <w:lsdException w:name="Grid Table 1 Light Accent 2" w:uiPriority="46"/>
+    <w:lsdException w:name="Grid Table 2 Accent 2" w:uiPriority="47"/>
+    <w:lsdException w:name="Grid Table 3 Accent 2" w:uiPriority="48"/>
+    <w:lsdException w:name="Grid Table 4 Accent 2" w:uiPriority="49"/>
+    <w:lsdException w:name="Grid Table 5 Dark Accent 2" w:uiPriority="50"/>
+    <w:lsdException w:name="Grid Table 6 Colorful Accent 2" w:uiPriority="51"/>
+    <w:lsdException w:name="Grid Table 7 Colorful Accent 2" w:uiPriority="52"/>
+    <w:lsdException w:name="Grid Table 1 Light Accent 3" w:uiPriority="46"/>
+    <w:lsdException w:name="Grid Table 2 Accent 3" w:uiPriority="47"/>
+    <w:lsdException w:name="Grid Table 3 Accent 3" w:uiPriority="48"/>
+    <w:lsdException w:name="Grid Table 4 Accent 3" w:uiPriority="49"/>
+    <w:lsdException w:name="Grid Table 5 Dark Accent 3" w:uiPriority="50"/>
+    <w:lsdException w:name="Grid Table 6 Colorful Accent 3" w:uiPriority="51"/>
+    <w:lsdException w:name="Grid Table 7 Colorful Accent 3" w:uiPriority="52"/>
+    <w:lsdException w:name="Grid Table 1 Light Accent 4" w:uiPriority="46"/>
+    <w:lsdException w:name="Grid Table 2 Accent 4" w:uiPriority="47"/>
+    <w:lsdException w:name="Grid Table 3 Accent 4" w:uiPriority="48"/>
+    <w:lsdException w:name="Grid Table 4 Accent 4" w:uiPriority="49"/>
+    <w:lsdException w:name="Grid Table 5 Dark Accent 4" w:uiPriority="50"/>
+    <w:lsdException w:name="Grid Table 6 Colorful Accent 4" w:uiPriority="51"/>
+    <w:lsdException w:name="Grid Table 7 Colorful Accent 4" w:uiPriority="52"/>
+    <w:lsdException w:name="Grid Table 1 Light Accent 5" w:uiPriority="46"/>
+    <w:lsdException w:name="Grid Table 2 Accent 5" w:uiPriority="47"/>
+    <w:lsdException w:name="Grid Table 3 Accent 5" w:uiPriority="48"/>
+    <w:lsdException w:name="Grid Table 4 Accent 5" w:uiPriority="49"/>
+    <w:lsdException w:name="Grid Table 5 Dark Accent 5" w:uiPriority="50"/>
+    <w:lsdException w:name="Grid Table 6 Colorful Accent 5" w:uiPriority="51"/>
+    <w:lsdException w:name="Grid Table 7 Colorful Accent 5" w:uiPriority="52"/>
+    <w:lsdException w:name="Grid Table 1 Light Accent 6" w:uiPriority="46"/>
+    <w:lsdException w:name="Grid Table 2 Accent 6" w:uiPriority="47"/>
+    <w:lsdException w:name="Grid Table 3 Accent 6" w:uiPriority="48"/>
+    <w:lsdException w:name="Grid Table 4 Accent 6" w:uiPriority="49"/>
+    <w:lsdException w:name="Grid Table 5 Dark Accent 6" w:uiPriority="50"/>
+    <w:lsdException w:name="Grid Table 6 Colorful Accent 6" w:uiPriority="51"/>
+    <w:lsdException w:name="Grid Table 7 Colorful Accent 6" w:uiPriority="52"/>
+    <w:lsdException w:name="List Table 1 Light" w:uiPriority="46"/>
+    <w:lsdException w:name="List Table 2" w:uiPriority="47"/>
+    <w:lsdException w:name="List Table 3" w:uiPriority="48"/>
+    <w:lsdException w:name="List Table 4" w:uiPriority="49"/>
+    <w:lsdException w:name="List Table 5 Dark" w:uiPriority="50"/>
+    <w:lsdException w:name="List Table 6 Colorful" w:uiPriority="51"/>
+    <w:lsdException w:name="List Table 7 Colorful" w:uiPriority="52"/>
+    <w:lsdException w:name="List Table 1 Light Accent 1" w:uiPriority="46"/>
+    <w:lsdException w:name="List Table 2 Accent 1" w:uiPriority="47"/>
+    <w:lsdException w:name="List Table 3 Accent 1" w:uiPriority="48"/>
+    <w:lsdException w:name="List Table 4 Accent 1" w:uiPriority="49"/>
+    <w:lsdException w:name="List Table 5 Dark Accent 1" w:uiPriority="50"/>
+    <w:lsdException w:name="List Table 6 Colorful Accent 1" w:uiPriority="51"/>
+    <w:lsdException w:name="List Table 7 Colorful Accent 1" w:uiPriority="52"/>
+    <w:lsdException w:name="List Table 1 Light Accent 2" w:uiPriority="46"/>
+    <w:lsdException w:name="List Table 2 Accent 2" w:uiPriority="47"/>
+    <w:lsdException w:name="List Table 3 Accent 2" w:uiPriority="48"/>
+    <w:lsdException w:name="List Table 4 Accent 2" w:uiPriority="49"/>
+    <w:lsdException w:name="List Table 5 Dark Accent 2" w:uiPriority="50"/>
+    <w:lsdException w:name="List Table 6 Colorful Accent 2" w:uiPriority="51"/>
+    <w:lsdException w:name="List Table 7 Colorful Accent 2" w:uiPriority="52"/>
+    <w:lsdException w:name="List Table 1 Light Accent 3" w:uiPriority="46"/>
+    <w:lsdException w:name="List Table 2 Accent 3" w:uiPriority="47"/>
+    <w:lsdException w:name="List Table 3 Accent 3" w:uiPriority="48"/>
+    <w:lsdException w:name="List Table 4 Accent 3" w:uiPriority="49"/>
+    <w:lsdException w:name="List Table 5 Dark Accent 3" w:uiPriority="50"/>
+    <w:lsdException w:name="List Table 6 Colorful Accent 3" w:uiPriority="51"/>
+    <w:lsdException w:name="List Table 7 Colorful Accent 3" w:uiPriority="52"/>
+    <w:lsdException w:name="List Table 1 Light Accent 4" w:uiPriority="46"/>
+    <w:lsdException w:name="List Table 2 Accent 4" w:uiPriority="47"/>
+    <w:lsdException w:name="List Table 3 Accent 4" w:uiPriority="48"/>
+    <w:lsdException w:name="List Table 4 Accent 4" w:uiPriority="49"/>
+    <w:lsdException w:name="List Table 5 Dark Accent 4" w:uiPriority="50"/>
+    <w:lsdException w:name="List Table 6 Colorful Accent 4" w:uiPriority="51"/>
+    <w:lsdException w:name="List Table 7 Colorful Accent 4" w:uiPriority="52"/>
+    <w:lsdException w:name="List Table 1 Light Accent 5" w:uiPriority="46"/>
+    <w:lsdException w:name="List Table 2 Accent 5" w:uiPriority="47"/>
+    <w:lsdException w:name="List Table 3 Accent 5" w:uiPriority="48"/>
+    <w:lsdException w:name="List Table 4 Accent 5" w:uiPriority="49"/>
+    <w:lsdException w:name="List Table 5 Dark Accent 5" w:uiPriority="50"/>
+    <w:lsdException w:name="List Table 6 Colorful Accent 5" w:uiPriority="51"/>
+    <w:lsdException w:name="List Table 7 Colorful Accent 5" w:uiPriority="52"/>
+    <w:lsdException w:name="List Table 1 Light Accent 6" w:uiPriority="46"/>
+    <w:lsdException w:name="List Table 2 Accent 6" w:uiPriority="47"/>
+    <w:lsdException w:name="List Table 3 Accent 6" w:uiPriority="48"/>
+    <w:lsdException w:name="List Table 4 Accent 6" w:uiPriority="49"/>
+    <w:lsdException w:name="List Table 5 Dark Accent 6" w:uiPriority="50"/>
+    <w:lsdException w:name="List Table 6 Colorful Accent 6" w:uiPriority="51"/>
+    <w:lsdException w:name="List Table 7 Colorful Accent 6" w:uiPriority="52"/>
+    <w:lsdException w:name="Mention" w:semiHidden="1" w:unhideWhenUsed="1"/>
+    <w:lsdException w:name="Smart Hyperlink" w:semiHidden="1" w:unhideWhenUsed="1"/>
+    <w:lsdException w:name="Hashtag" w:semiHidden="1" w:unhideWhenUsed="1"/>
+    <w:lsdException w:name="Unresolved Mention" w:semiHidden="1" w:unhideWhenUsed="1"/>
+    <w:lsdException w:name="Smart Link" w:semiHidden="1" w:unhideWhenUsed="1"/>
   </w:latentStyles>
   <w:style w:type="paragraph" w:default="1" w:styleId="Normal">
     <w:name w:val="Normal"/>
@@ -9893,1586 +10161,8 @@
       <w:shd w:val="clear" w:color="auto" w:fill="E1DFDD"/>
     </w:rPr>
   </w:style>
-  <w:style w:type="character" w:customStyle="1" w:styleId="UnresolvedMention">
-    <w:name w:val="Unresolved Mention"/>
-    <w:basedOn w:val="DefaultParagraphFont"/>
-    <w:uiPriority w:val="99"/>
-    <w:semiHidden/>
-    <w:unhideWhenUsed/>
-    <w:rsid w:val="000A7BA4"/>
-    <w:rPr>
-      <w:color w:val="605E5C"/>
-      <w:shd w:val="clear" w:color="auto" w:fill="E1DFDD"/>
-    </w:rPr>
-  </w:style>
-</w:styles>
-</file>
-
-<file path=word/stylesWithEffects.xml><?xml version="1.0" encoding="utf-8"?>
-<w:styles xmlns:wpc="http://schemas.microsoft.com/office/word/2010/wordprocessingCanvas" xmlns:mc="http://schemas.openxmlformats.org/markup-compatibility/2006" xmlns:o="urn:schemas-microsoft-com:office:office" xmlns:r="http://schemas.openxmlformats.org/officeDocument/2006/relationships" xmlns:m="http://schemas.openxmlformats.org/officeDocument/2006/math" xmlns:v="urn:schemas-microsoft-com:vml" xmlns:wp14="http://schemas.microsoft.com/office/word/2010/wordprocessingDrawing" xmlns:wp="http://schemas.openxmlformats.org/drawingml/2006/wordprocessingDrawing" xmlns:w10="urn:schemas-microsoft-com:office:word" xmlns:w="http://schemas.openxmlformats.org/wordprocessingml/2006/main" xmlns:w14="http://schemas.microsoft.com/office/word/2010/wordml" xmlns:wpg="http://schemas.microsoft.com/office/word/2010/wordprocessingGroup" xmlns:wpi="http://schemas.microsoft.com/office/word/2010/wordprocessingInk" xmlns:wne="http://schemas.microsoft.com/office/word/2006/wordml" xmlns:wps="http://schemas.microsoft.com/office/word/2010/wordprocessingShape" mc:Ignorable="w14 wp14">
-  <w:docDefaults>
-    <w:rPrDefault>
-      <w:rPr>
-        <w:rFonts w:asciiTheme="minorHAnsi" w:eastAsia="Arial" w:hAnsiTheme="minorHAnsi" w:cstheme="minorBidi"/>
-        <w:sz w:val="22"/>
-        <w:szCs w:val="22"/>
-        <w:lang w:val="en-US" w:eastAsia="en-US" w:bidi="ar-SA"/>
-      </w:rPr>
-    </w:rPrDefault>
-    <w:pPrDefault>
-      <w:pPr>
-        <w:suppressAutoHyphens/>
-      </w:pPr>
-    </w:pPrDefault>
-  </w:docDefaults>
-  <w:latentStyles w:defLockedState="0" w:defUIPriority="99" w:defSemiHidden="1" w:defUnhideWhenUsed="1" w:defQFormat="0" w:count="267">
-    <w:lsdException w:name="Normal" w:semiHidden="0" w:uiPriority="0" w:unhideWhenUsed="0" w:qFormat="1"/>
-    <w:lsdException w:name="heading 1" w:semiHidden="0" w:uiPriority="9" w:unhideWhenUsed="0" w:qFormat="1"/>
-    <w:lsdException w:name="heading 2" w:uiPriority="9" w:qFormat="1"/>
-    <w:lsdException w:name="heading 3" w:uiPriority="9" w:qFormat="1"/>
-    <w:lsdException w:name="heading 4" w:uiPriority="9" w:qFormat="1"/>
-    <w:lsdException w:name="heading 5" w:uiPriority="9" w:qFormat="1"/>
-    <w:lsdException w:name="heading 6" w:uiPriority="9" w:qFormat="1"/>
-    <w:lsdException w:name="heading 7" w:uiPriority="9" w:qFormat="1"/>
-    <w:lsdException w:name="heading 8" w:uiPriority="9" w:qFormat="1"/>
-    <w:lsdException w:name="heading 9" w:uiPriority="9" w:qFormat="1"/>
-    <w:lsdException w:name="toc 1" w:uiPriority="39"/>
-    <w:lsdException w:name="toc 2" w:uiPriority="39"/>
-    <w:lsdException w:name="toc 3" w:uiPriority="39"/>
-    <w:lsdException w:name="toc 4" w:uiPriority="39"/>
-    <w:lsdException w:name="toc 5" w:uiPriority="39"/>
-    <w:lsdException w:name="toc 6" w:uiPriority="39"/>
-    <w:lsdException w:name="toc 7" w:uiPriority="39"/>
-    <w:lsdException w:name="toc 8" w:uiPriority="39"/>
-    <w:lsdException w:name="toc 9" w:uiPriority="39"/>
-    <w:lsdException w:name="caption" w:uiPriority="35" w:qFormat="1"/>
-    <w:lsdException w:name="Title" w:semiHidden="0" w:uiPriority="10" w:unhideWhenUsed="0" w:qFormat="1"/>
-    <w:lsdException w:name="Default Paragraph Font" w:uiPriority="1"/>
-    <w:lsdException w:name="Body Text" w:uiPriority="1" w:qFormat="1"/>
-    <w:lsdException w:name="Subtitle" w:semiHidden="0" w:uiPriority="11" w:unhideWhenUsed="0" w:qFormat="1"/>
-    <w:lsdException w:name="Strong" w:semiHidden="0" w:uiPriority="22" w:unhideWhenUsed="0" w:qFormat="1"/>
-    <w:lsdException w:name="Emphasis" w:semiHidden="0" w:uiPriority="20" w:unhideWhenUsed="0" w:qFormat="1"/>
-    <w:lsdException w:name="Table Grid" w:semiHidden="0" w:uiPriority="39" w:unhideWhenUsed="0"/>
-    <w:lsdException w:name="Placeholder Text" w:unhideWhenUsed="0"/>
-    <w:lsdException w:name="No Spacing" w:semiHidden="0" w:uiPriority="1" w:unhideWhenUsed="0" w:qFormat="1"/>
-    <w:lsdException w:name="Light Shading" w:semiHidden="0" w:uiPriority="60" w:unhideWhenUsed="0"/>
-    <w:lsdException w:name="Light List" w:semiHidden="0" w:uiPriority="61" w:unhideWhenUsed="0"/>
-    <w:lsdException w:name="Light Grid" w:semiHidden="0" w:uiPriority="62" w:unhideWhenUsed="0"/>
-    <w:lsdException w:name="Medium Shading 1" w:semiHidden="0" w:uiPriority="63" w:unhideWhenUsed="0"/>
-    <w:lsdException w:name="Medium Shading 2" w:semiHidden="0" w:uiPriority="64" w:unhideWhenUsed="0"/>
-    <w:lsdException w:name="Medium List 1" w:semiHidden="0" w:uiPriority="65" w:unhideWhenUsed="0"/>
-    <w:lsdException w:name="Medium List 2" w:semiHidden="0" w:uiPriority="66" w:unhideWhenUsed="0"/>
-    <w:lsdException w:name="Medium Grid 1" w:semiHidden="0" w:uiPriority="67" w:unhideWhenUsed="0"/>
-    <w:lsdException w:name="Medium Grid 2" w:semiHidden="0" w:uiPriority="68" w:unhideWhenUsed="0"/>
-    <w:lsdException w:name="Medium Grid 3" w:semiHidden="0" w:uiPriority="69" w:unhideWhenUsed="0"/>
-    <w:lsdException w:name="Dark List" w:semiHidden="0" w:uiPriority="70" w:unhideWhenUsed="0"/>
-    <w:lsdException w:name="Colorful Shading" w:semiHidden="0" w:uiPriority="71" w:unhideWhenUsed="0"/>
-    <w:lsdException w:name="Colorful List" w:semiHidden="0" w:uiPriority="72" w:unhideWhenUsed="0"/>
-    <w:lsdException w:name="Colorful Grid" w:semiHidden="0" w:uiPriority="73" w:unhideWhenUsed="0"/>
-    <w:lsdException w:name="Light Shading Accent 1" w:semiHidden="0" w:uiPriority="60" w:unhideWhenUsed="0"/>
-    <w:lsdException w:name="Light List Accent 1" w:semiHidden="0" w:uiPriority="61" w:unhideWhenUsed="0"/>
-    <w:lsdException w:name="Light Grid Accent 1" w:semiHidden="0" w:uiPriority="62" w:unhideWhenUsed="0"/>
-    <w:lsdException w:name="Medium Shading 1 Accent 1" w:semiHidden="0" w:uiPriority="63" w:unhideWhenUsed="0"/>
-    <w:lsdException w:name="Medium Shading 2 Accent 1" w:semiHidden="0" w:uiPriority="64" w:unhideWhenUsed="0"/>
-    <w:lsdException w:name="Medium List 1 Accent 1" w:semiHidden="0" w:uiPriority="65" w:unhideWhenUsed="0"/>
-    <w:lsdException w:name="Revision" w:unhideWhenUsed="0"/>
-    <w:lsdException w:name="List Paragraph" w:semiHidden="0" w:uiPriority="34" w:unhideWhenUsed="0" w:qFormat="1"/>
-    <w:lsdException w:name="Quote" w:semiHidden="0" w:uiPriority="29" w:unhideWhenUsed="0" w:qFormat="1"/>
-    <w:lsdException w:name="Intense Quote" w:semiHidden="0" w:uiPriority="30" w:unhideWhenUsed="0" w:qFormat="1"/>
-    <w:lsdException w:name="Medium List 2 Accent 1" w:semiHidden="0" w:uiPriority="66" w:unhideWhenUsed="0"/>
-    <w:lsdException w:name="Medium Grid 1 Accent 1" w:semiHidden="0" w:uiPriority="67" w:unhideWhenUsed="0"/>
-    <w:lsdException w:name="Medium Grid 2 Accent 1" w:semiHidden="0" w:uiPriority="68" w:unhideWhenUsed="0"/>
-    <w:lsdException w:name="Medium Grid 3 Accent 1" w:semiHidden="0" w:uiPriority="69" w:unhideWhenUsed="0"/>
-    <w:lsdException w:name="Dark List Accent 1" w:semiHidden="0" w:uiPriority="70" w:unhideWhenUsed="0"/>
-    <w:lsdException w:name="Colorful Shading Accent 1" w:semiHidden="0" w:uiPriority="71" w:unhideWhenUsed="0"/>
-    <w:lsdException w:name="Colorful List Accent 1" w:semiHidden="0" w:uiPriority="72" w:unhideWhenUsed="0"/>
-    <w:lsdException w:name="Colorful Grid Accent 1" w:semiHidden="0" w:uiPriority="73" w:unhideWhenUsed="0"/>
-    <w:lsdException w:name="Light Shading Accent 2" w:semiHidden="0" w:uiPriority="60" w:unhideWhenUsed="0"/>
-    <w:lsdException w:name="Light List Accent 2" w:semiHidden="0" w:uiPriority="61" w:unhideWhenUsed="0"/>
-    <w:lsdException w:name="Light Grid Accent 2" w:semiHidden="0" w:uiPriority="62" w:unhideWhenUsed="0"/>
-    <w:lsdException w:name="Medium Shading 1 Accent 2" w:semiHidden="0" w:uiPriority="63" w:unhideWhenUsed="0"/>
-    <w:lsdException w:name="Medium Shading 2 Accent 2" w:semiHidden="0" w:uiPriority="64" w:unhideWhenUsed="0"/>
-    <w:lsdException w:name="Medium List 1 Accent 2" w:semiHidden="0" w:uiPriority="65" w:unhideWhenUsed="0"/>
-    <w:lsdException w:name="Medium List 2 Accent 2" w:semiHidden="0" w:uiPriority="66" w:unhideWhenUsed="0"/>
-    <w:lsdException w:name="Medium Grid 1 Accent 2" w:semiHidden="0" w:uiPriority="67" w:unhideWhenUsed="0"/>
-    <w:lsdException w:name="Medium Grid 2 Accent 2" w:semiHidden="0" w:uiPriority="68" w:unhideWhenUsed="0"/>
-    <w:lsdException w:name="Medium Grid 3 Accent 2" w:semiHidden="0" w:uiPriority="69" w:unhideWhenUsed="0"/>
-    <w:lsdException w:name="Dark List Accent 2" w:semiHidden="0" w:uiPriority="70" w:unhideWhenUsed="0"/>
-    <w:lsdException w:name="Colorful Shading Accent 2" w:semiHidden="0" w:uiPriority="71" w:unhideWhenUsed="0"/>
-    <w:lsdException w:name="Colorful List Accent 2" w:semiHidden="0" w:uiPriority="72" w:unhideWhenUsed="0"/>
-    <w:lsdException w:name="Colorful Grid Accent 2" w:semiHidden="0" w:uiPriority="73" w:unhideWhenUsed="0"/>
-    <w:lsdException w:name="Light Shading Accent 3" w:semiHidden="0" w:uiPriority="60" w:unhideWhenUsed="0"/>
-    <w:lsdException w:name="Light List Accent 3" w:semiHidden="0" w:uiPriority="61" w:unhideWhenUsed="0"/>
-    <w:lsdException w:name="Light Grid Accent 3" w:semiHidden="0" w:uiPriority="62" w:unhideWhenUsed="0"/>
-    <w:lsdException w:name="Medium Shading 1 Accent 3" w:semiHidden="0" w:uiPriority="63" w:unhideWhenUsed="0"/>
-    <w:lsdException w:name="Medium Shading 2 Accent 3" w:semiHidden="0" w:uiPriority="64" w:unhideWhenUsed="0"/>
-    <w:lsdException w:name="Medium List 1 Accent 3" w:semiHidden="0" w:uiPriority="65" w:unhideWhenUsed="0"/>
-    <w:lsdException w:name="Medium List 2 Accent 3" w:semiHidden="0" w:uiPriority="66" w:unhideWhenUsed="0"/>
-    <w:lsdException w:name="Medium Grid 1 Accent 3" w:semiHidden="0" w:uiPriority="67" w:unhideWhenUsed="0"/>
-    <w:lsdException w:name="Medium Grid 2 Accent 3" w:semiHidden="0" w:uiPriority="68" w:unhideWhenUsed="0"/>
-    <w:lsdException w:name="Medium Grid 3 Accent 3" w:semiHidden="0" w:uiPriority="69" w:unhideWhenUsed="0"/>
-    <w:lsdException w:name="Dark List Accent 3" w:semiHidden="0" w:uiPriority="70" w:unhideWhenUsed="0"/>
-    <w:lsdException w:name="Colorful Shading Accent 3" w:semiHidden="0" w:uiPriority="71" w:unhideWhenUsed="0"/>
-    <w:lsdException w:name="Colorful List Accent 3" w:semiHidden="0" w:uiPriority="72" w:unhideWhenUsed="0"/>
-    <w:lsdException w:name="Colorful Grid Accent 3" w:semiHidden="0" w:uiPriority="73" w:unhideWhenUsed="0"/>
-    <w:lsdException w:name="Light Shading Accent 4" w:semiHidden="0" w:uiPriority="60" w:unhideWhenUsed="0"/>
-    <w:lsdException w:name="Light List Accent 4" w:semiHidden="0" w:uiPriority="61" w:unhideWhenUsed="0"/>
-    <w:lsdException w:name="Light Grid Accent 4" w:semiHidden="0" w:uiPriority="62" w:unhideWhenUsed="0"/>
-    <w:lsdException w:name="Medium Shading 1 Accent 4" w:semiHidden="0" w:uiPriority="63" w:unhideWhenUsed="0"/>
-    <w:lsdException w:name="Medium Shading 2 Accent 4" w:semiHidden="0" w:uiPriority="64" w:unhideWhenUsed="0"/>
-    <w:lsdException w:name="Medium List 1 Accent 4" w:semiHidden="0" w:uiPriority="65" w:unhideWhenUsed="0"/>
-    <w:lsdException w:name="Medium List 2 Accent 4" w:semiHidden="0" w:uiPriority="66" w:unhideWhenUsed="0"/>
-    <w:lsdException w:name="Medium Grid 1 Accent 4" w:semiHidden="0" w:uiPriority="67" w:unhideWhenUsed="0"/>
-    <w:lsdException w:name="Medium Grid 2 Accent 4" w:semiHidden="0" w:uiPriority="68" w:unhideWhenUsed="0"/>
-    <w:lsdException w:name="Medium Grid 3 Accent 4" w:semiHidden="0" w:uiPriority="69" w:unhideWhenUsed="0"/>
-    <w:lsdException w:name="Dark List Accent 4" w:semiHidden="0" w:uiPriority="70" w:unhideWhenUsed="0"/>
-    <w:lsdException w:name="Colorful Shading Accent 4" w:semiHidden="0" w:uiPriority="71" w:unhideWhenUsed="0"/>
-    <w:lsdException w:name="Colorful List Accent 4" w:semiHidden="0" w:uiPriority="72" w:unhideWhenUsed="0"/>
-    <w:lsdException w:name="Colorful Grid Accent 4" w:semiHidden="0" w:uiPriority="73" w:unhideWhenUsed="0"/>
-    <w:lsdException w:name="Light Shading Accent 5" w:semiHidden="0" w:uiPriority="60" w:unhideWhenUsed="0"/>
-    <w:lsdException w:name="Light List Accent 5" w:semiHidden="0" w:uiPriority="61" w:unhideWhenUsed="0"/>
-    <w:lsdException w:name="Light Grid Accent 5" w:semiHidden="0" w:uiPriority="62" w:unhideWhenUsed="0"/>
-    <w:lsdException w:name="Medium Shading 1 Accent 5" w:semiHidden="0" w:uiPriority="63" w:unhideWhenUsed="0"/>
-    <w:lsdException w:name="Medium Shading 2 Accent 5" w:semiHidden="0" w:uiPriority="64" w:unhideWhenUsed="0"/>
-    <w:lsdException w:name="Medium List 1 Accent 5" w:semiHidden="0" w:uiPriority="65" w:unhideWhenUsed="0"/>
-    <w:lsdException w:name="Medium List 2 Accent 5" w:semiHidden="0" w:uiPriority="66" w:unhideWhenUsed="0"/>
-    <w:lsdException w:name="Medium Grid 1 Accent 5" w:semiHidden="0" w:uiPriority="67" w:unhideWhenUsed="0"/>
-    <w:lsdException w:name="Medium Grid 2 Accent 5" w:semiHidden="0" w:uiPriority="68" w:unhideWhenUsed="0"/>
-    <w:lsdException w:name="Medium Grid 3 Accent 5" w:semiHidden="0" w:uiPriority="69" w:unhideWhenUsed="0"/>
-    <w:lsdException w:name="Dark List Accent 5" w:semiHidden="0" w:uiPriority="70" w:unhideWhenUsed="0"/>
-    <w:lsdException w:name="Colorful Shading Accent 5" w:semiHidden="0" w:uiPriority="71" w:unhideWhenUsed="0"/>
-    <w:lsdException w:name="Colorful List Accent 5" w:semiHidden="0" w:uiPriority="72" w:unhideWhenUsed="0"/>
-    <w:lsdException w:name="Colorful Grid Accent 5" w:semiHidden="0" w:uiPriority="73" w:unhideWhenUsed="0"/>
-    <w:lsdException w:name="Light Shading Accent 6" w:semiHidden="0" w:uiPriority="60" w:unhideWhenUsed="0"/>
-    <w:lsdException w:name="Light List Accent 6" w:semiHidden="0" w:uiPriority="61" w:unhideWhenUsed="0"/>
-    <w:lsdException w:name="Light Grid Accent 6" w:semiHidden="0" w:uiPriority="62" w:unhideWhenUsed="0"/>
-    <w:lsdException w:name="Medium Shading 1 Accent 6" w:semiHidden="0" w:uiPriority="63" w:unhideWhenUsed="0"/>
-    <w:lsdException w:name="Medium Shading 2 Accent 6" w:semiHidden="0" w:uiPriority="64" w:unhideWhenUsed="0"/>
-    <w:lsdException w:name="Medium List 1 Accent 6" w:semiHidden="0" w:uiPriority="65" w:unhideWhenUsed="0"/>
-    <w:lsdException w:name="Medium List 2 Accent 6" w:semiHidden="0" w:uiPriority="66" w:unhideWhenUsed="0"/>
-    <w:lsdException w:name="Medium Grid 1 Accent 6" w:semiHidden="0" w:uiPriority="67" w:unhideWhenUsed="0"/>
-    <w:lsdException w:name="Medium Grid 2 Accent 6" w:semiHidden="0" w:uiPriority="68" w:unhideWhenUsed="0"/>
-    <w:lsdException w:name="Medium Grid 3 Accent 6" w:semiHidden="0" w:uiPriority="69" w:unhideWhenUsed="0"/>
-    <w:lsdException w:name="Dark List Accent 6" w:semiHidden="0" w:uiPriority="70" w:unhideWhenUsed="0"/>
-    <w:lsdException w:name="Colorful Shading Accent 6" w:semiHidden="0" w:uiPriority="71" w:unhideWhenUsed="0"/>
-    <w:lsdException w:name="Colorful List Accent 6" w:semiHidden="0" w:uiPriority="72" w:unhideWhenUsed="0"/>
-    <w:lsdException w:name="Colorful Grid Accent 6" w:semiHidden="0" w:uiPriority="73" w:unhideWhenUsed="0"/>
-    <w:lsdException w:name="Subtle Emphasis" w:semiHidden="0" w:uiPriority="19" w:unhideWhenUsed="0" w:qFormat="1"/>
-    <w:lsdException w:name="Intense Emphasis" w:semiHidden="0" w:uiPriority="21" w:unhideWhenUsed="0" w:qFormat="1"/>
-    <w:lsdException w:name="Subtle Reference" w:semiHidden="0" w:uiPriority="31" w:unhideWhenUsed="0" w:qFormat="1"/>
-    <w:lsdException w:name="Intense Reference" w:semiHidden="0" w:uiPriority="32" w:unhideWhenUsed="0" w:qFormat="1"/>
-    <w:lsdException w:name="Book Title" w:semiHidden="0" w:uiPriority="33" w:unhideWhenUsed="0" w:qFormat="1"/>
-    <w:lsdException w:name="Bibliography" w:uiPriority="37"/>
-    <w:lsdException w:name="TOC Heading" w:uiPriority="39" w:qFormat="1"/>
-  </w:latentStyles>
-  <w:style w:type="paragraph" w:default="1" w:styleId="Normal">
-    <w:name w:val="Normal"/>
-    <w:qFormat/>
-    <w:rsid w:val="00EC6368"/>
-    <w:pPr>
-      <w:suppressAutoHyphens w:val="0"/>
-      <w:spacing w:before="-1" w:beforeAutospacing="1" w:after="-1" w:afterAutospacing="1"/>
-    </w:pPr>
-    <w:rPr>
-      <w:rFonts w:ascii="Arial" w:hAnsi="Arial" w:cs="Arial"/>
-    </w:rPr>
-  </w:style>
-  <w:style w:type="paragraph" w:styleId="Heading1">
-    <w:name w:val="heading 1"/>
-    <w:basedOn w:val="BodyText"/>
-    <w:link w:val="Heading1Char"/>
-    <w:uiPriority w:val="9"/>
-    <w:qFormat/>
-    <w:rsid w:val="00EC6368"/>
-    <w:pPr>
-      <w:pBdr>
-        <w:bottom w:val="single" w:sz="4" w:space="1" w:color="A6A6A6" w:themeColor="background1" w:themeShade="A6"/>
-      </w:pBdr>
-      <w:spacing w:before="0" w:beforeAutospacing="0" w:after="100"/>
-      <w:outlineLvl w:val="0"/>
-    </w:pPr>
-    <w:rPr>
-      <w:color w:val="0A2A78"/>
-      <w:spacing w:val="-4"/>
-      <w:sz w:val="40"/>
-    </w:rPr>
-  </w:style>
-  <w:style w:type="paragraph" w:styleId="Heading2">
-    <w:name w:val="heading 2"/>
-    <w:basedOn w:val="BodyText"/>
-    <w:next w:val="BodyText"/>
-    <w:link w:val="Heading2Char"/>
-    <w:uiPriority w:val="9"/>
-    <w:unhideWhenUsed/>
-    <w:qFormat/>
-    <w:rsid w:val="00EC6368"/>
-    <w:pPr>
-      <w:widowControl w:val="0"/>
-      <w:autoSpaceDE w:val="0"/>
-      <w:autoSpaceDN w:val="0"/>
-      <w:spacing w:before="0" w:beforeAutospacing="0" w:after="0" w:afterAutospacing="0"/>
-      <w:outlineLvl w:val="1"/>
-    </w:pPr>
-    <w:rPr>
-      <w:rFonts w:eastAsiaTheme="minorHAnsi"/>
-      <w:color w:val="0A2A78"/>
-      <w:sz w:val="36"/>
-    </w:rPr>
-  </w:style>
-  <w:style w:type="paragraph" w:styleId="Heading3">
-    <w:name w:val="heading 3"/>
-    <w:basedOn w:val="Heading2"/>
-    <w:next w:val="Body"/>
-    <w:link w:val="Heading3Char"/>
-    <w:uiPriority w:val="9"/>
-    <w:unhideWhenUsed/>
-    <w:qFormat/>
-    <w:rsid w:val="00EC6368"/>
-    <w:pPr>
-      <w:outlineLvl w:val="2"/>
-    </w:pPr>
-    <w:rPr>
-      <w:sz w:val="32"/>
-    </w:rPr>
-  </w:style>
-  <w:style w:type="paragraph" w:styleId="Heading4">
-    <w:name w:val="heading 4"/>
-    <w:basedOn w:val="BodyText"/>
-    <w:next w:val="Normal"/>
-    <w:link w:val="Heading4Char"/>
-    <w:uiPriority w:val="9"/>
-    <w:unhideWhenUsed/>
-    <w:qFormat/>
-    <w:rsid w:val="00EC6368"/>
-    <w:pPr>
-      <w:widowControl w:val="0"/>
-      <w:autoSpaceDE w:val="0"/>
-      <w:autoSpaceDN w:val="0"/>
-      <w:spacing w:beforeAutospacing="0" w:afterAutospacing="0"/>
-      <w:ind w:left="360"/>
-      <w:outlineLvl w:val="3"/>
-    </w:pPr>
-    <w:rPr>
-      <w:rFonts w:eastAsiaTheme="minorHAnsi"/>
-      <w:iCs/>
-      <w:color w:val="0A2A78"/>
-    </w:rPr>
-  </w:style>
-  <w:style w:type="paragraph" w:styleId="Heading5">
-    <w:name w:val="heading 5"/>
-    <w:basedOn w:val="Normal"/>
-    <w:next w:val="Normal"/>
-    <w:link w:val="Heading5Char"/>
-    <w:uiPriority w:val="9"/>
-    <w:semiHidden/>
-    <w:unhideWhenUsed/>
-    <w:qFormat/>
-    <w:rsid w:val="00750956"/>
-    <w:pPr>
-      <w:keepNext/>
-      <w:keepLines/>
-      <w:spacing w:before="240" w:after="80"/>
-      <w:outlineLvl w:val="4"/>
-    </w:pPr>
-    <w:rPr>
-      <w:color w:val="666666"/>
-    </w:rPr>
-  </w:style>
-  <w:style w:type="paragraph" w:styleId="Heading6">
-    <w:name w:val="heading 6"/>
-    <w:basedOn w:val="Normal"/>
-    <w:next w:val="Normal"/>
-    <w:link w:val="Heading6Char"/>
-    <w:uiPriority w:val="9"/>
-    <w:semiHidden/>
-    <w:unhideWhenUsed/>
-    <w:qFormat/>
-    <w:rsid w:val="00750956"/>
-    <w:pPr>
-      <w:keepNext/>
-      <w:keepLines/>
-      <w:spacing w:before="240" w:after="80"/>
-      <w:outlineLvl w:val="5"/>
-    </w:pPr>
-    <w:rPr>
-      <w:i/>
-      <w:color w:val="666666"/>
-    </w:rPr>
-  </w:style>
-  <w:style w:type="character" w:default="1" w:styleId="DefaultParagraphFont">
-    <w:name w:val="Default Paragraph Font"/>
-    <w:uiPriority w:val="1"/>
-    <w:semiHidden/>
-    <w:unhideWhenUsed/>
-  </w:style>
-  <w:style w:type="table" w:default="1" w:styleId="TableNormal">
-    <w:name w:val="Normal Table"/>
-    <w:uiPriority w:val="99"/>
-    <w:semiHidden/>
-    <w:unhideWhenUsed/>
-    <w:tblPr>
-      <w:tblInd w:w="0" w:type="dxa"/>
-      <w:tblCellMar>
-        <w:top w:w="0" w:type="dxa"/>
-        <w:left w:w="108" w:type="dxa"/>
-        <w:bottom w:w="0" w:type="dxa"/>
-        <w:right w:w="108" w:type="dxa"/>
-      </w:tblCellMar>
-    </w:tblPr>
-  </w:style>
-  <w:style w:type="numbering" w:default="1" w:styleId="NoList">
-    <w:name w:val="No List"/>
-    <w:uiPriority w:val="99"/>
-    <w:semiHidden/>
-    <w:unhideWhenUsed/>
-  </w:style>
-  <w:style w:type="character" w:customStyle="1" w:styleId="Heading1Char">
-    <w:name w:val="Heading 1 Char"/>
-    <w:basedOn w:val="DefaultParagraphFont"/>
-    <w:link w:val="Heading1"/>
-    <w:uiPriority w:val="9"/>
-    <w:rsid w:val="00EC6368"/>
-    <w:rPr>
-      <w:rFonts w:ascii="Helvetica" w:hAnsi="Helvetica" w:cs="Helvetica"/>
-      <w:color w:val="0A2A78"/>
-      <w:spacing w:val="-4"/>
-      <w:sz w:val="40"/>
-      <w:szCs w:val="24"/>
-    </w:rPr>
-  </w:style>
-  <w:style w:type="character" w:customStyle="1" w:styleId="Heading3Char">
-    <w:name w:val="Heading 3 Char"/>
-    <w:basedOn w:val="DefaultParagraphFont"/>
-    <w:link w:val="Heading3"/>
-    <w:uiPriority w:val="9"/>
-    <w:rsid w:val="00EC6368"/>
-    <w:rPr>
-      <w:rFonts w:ascii="Helvetica" w:eastAsiaTheme="minorHAnsi" w:hAnsi="Helvetica" w:cs="Helvetica"/>
-      <w:color w:val="0A2A78"/>
-      <w:spacing w:val="-2"/>
-      <w:sz w:val="32"/>
-      <w:szCs w:val="24"/>
-    </w:rPr>
-  </w:style>
-  <w:style w:type="character" w:customStyle="1" w:styleId="interviewglossarywordintemplateChar">
-    <w:name w:val="interview glossary word in template Char"/>
-    <w:basedOn w:val="DefaultParagraphFont"/>
-    <w:link w:val="interviewglossarywordintemplate"/>
-    <w:rsid w:val="00EC6368"/>
-  </w:style>
-  <w:style w:type="character" w:customStyle="1" w:styleId="interviewbuttonChar">
-    <w:name w:val="interview button Char"/>
-    <w:basedOn w:val="DefaultParagraphFont"/>
-    <w:link w:val="interviewbutton"/>
-    <w:rsid w:val="00EC6368"/>
-    <w:rPr>
-      <w:color w:val="FFFFFF" w:themeColor="background1"/>
-      <w:szCs w:val="40"/>
-      <w:shd w:val="clear" w:color="auto" w:fill="0070C0"/>
-    </w:rPr>
-  </w:style>
-  <w:style w:type="character" w:customStyle="1" w:styleId="BodyTextChar">
-    <w:name w:val="Body Text Char"/>
-    <w:basedOn w:val="DefaultParagraphFont"/>
-    <w:link w:val="BodyText"/>
-    <w:uiPriority w:val="1"/>
-    <w:rsid w:val="00EC6368"/>
-    <w:rPr>
-      <w:rFonts w:ascii="Helvetica" w:hAnsi="Helvetica" w:cs="Helvetica"/>
-      <w:color w:val="202529"/>
-      <w:spacing w:val="-2"/>
-      <w:sz w:val="24"/>
-      <w:szCs w:val="24"/>
-    </w:rPr>
-  </w:style>
-  <w:style w:type="character" w:customStyle="1" w:styleId="Heading2Char">
-    <w:name w:val="Heading 2 Char"/>
-    <w:basedOn w:val="DefaultParagraphFont"/>
-    <w:link w:val="Heading2"/>
-    <w:uiPriority w:val="9"/>
-    <w:rsid w:val="00EC6368"/>
-    <w:rPr>
-      <w:rFonts w:ascii="Helvetica" w:eastAsiaTheme="minorHAnsi" w:hAnsi="Helvetica" w:cs="Helvetica"/>
-      <w:color w:val="0A2A78"/>
-      <w:spacing w:val="-2"/>
-      <w:sz w:val="36"/>
-      <w:szCs w:val="24"/>
-    </w:rPr>
-  </w:style>
-  <w:style w:type="character" w:customStyle="1" w:styleId="TitleChar">
-    <w:name w:val="Title Char"/>
-    <w:basedOn w:val="DefaultParagraphFont"/>
-    <w:link w:val="Title"/>
-    <w:uiPriority w:val="10"/>
-    <w:rsid w:val="00EC6368"/>
-    <w:rPr>
-      <w:rFonts w:ascii="Helvetica" w:hAnsi="Helvetica" w:cs="Helvetica"/>
-      <w:color w:val="0A2A78"/>
-      <w:spacing w:val="-2"/>
-      <w:sz w:val="48"/>
-      <w:szCs w:val="24"/>
-    </w:rPr>
-  </w:style>
-  <w:style w:type="character" w:customStyle="1" w:styleId="BalloonTextChar">
-    <w:name w:val="Balloon Text Char"/>
-    <w:basedOn w:val="DefaultParagraphFont"/>
-    <w:link w:val="BalloonText"/>
-    <w:uiPriority w:val="99"/>
-    <w:semiHidden/>
-    <w:rsid w:val="00EC6368"/>
-    <w:rPr>
-      <w:rFonts w:ascii="Segoe UI" w:hAnsi="Segoe UI" w:cs="Segoe UI"/>
-      <w:sz w:val="18"/>
-      <w:szCs w:val="18"/>
-    </w:rPr>
-  </w:style>
-  <w:style w:type="character" w:styleId="CommentReference">
-    <w:name w:val="annotation reference"/>
-    <w:basedOn w:val="DefaultParagraphFont"/>
-    <w:uiPriority w:val="99"/>
-    <w:semiHidden/>
-    <w:unhideWhenUsed/>
-    <w:rsid w:val="00EC6368"/>
-    <w:rPr>
-      <w:sz w:val="16"/>
-      <w:szCs w:val="16"/>
-    </w:rPr>
-  </w:style>
-  <w:style w:type="character" w:customStyle="1" w:styleId="CommentTextChar">
-    <w:name w:val="Comment Text Char"/>
-    <w:basedOn w:val="DefaultParagraphFont"/>
-    <w:link w:val="CommentText"/>
-    <w:uiPriority w:val="99"/>
-    <w:rsid w:val="00EC6368"/>
-    <w:rPr>
-      <w:rFonts w:ascii="Arial" w:hAnsi="Arial" w:cs="Arial"/>
-      <w:sz w:val="20"/>
-      <w:szCs w:val="20"/>
-    </w:rPr>
-  </w:style>
-  <w:style w:type="character" w:customStyle="1" w:styleId="CommentSubjectChar">
-    <w:name w:val="Comment Subject Char"/>
-    <w:basedOn w:val="CommentTextChar"/>
-    <w:link w:val="CommentSubject"/>
-    <w:uiPriority w:val="99"/>
-    <w:semiHidden/>
-    <w:rsid w:val="00EC6368"/>
-    <w:rPr>
-      <w:rFonts w:ascii="Arial" w:hAnsi="Arial" w:cs="Arial"/>
-      <w:b/>
-      <w:bCs/>
-      <w:sz w:val="20"/>
-      <w:szCs w:val="20"/>
-    </w:rPr>
-  </w:style>
-  <w:style w:type="character" w:customStyle="1" w:styleId="FooterChar">
-    <w:name w:val="Footer Char"/>
-    <w:basedOn w:val="DefaultParagraphFont"/>
-    <w:link w:val="Footer"/>
-    <w:uiPriority w:val="99"/>
-    <w:rsid w:val="00EC6368"/>
-    <w:rPr>
-      <w:rFonts w:ascii="Arial" w:hAnsi="Arial" w:cs="Arial"/>
-    </w:rPr>
-  </w:style>
-  <w:style w:type="character" w:customStyle="1" w:styleId="HeaderChar">
-    <w:name w:val="Header Char"/>
-    <w:basedOn w:val="DefaultParagraphFont"/>
-    <w:link w:val="Header"/>
-    <w:uiPriority w:val="99"/>
-    <w:rsid w:val="00EC6368"/>
-    <w:rPr>
-      <w:rFonts w:ascii="Arial" w:hAnsi="Arial" w:cs="Arial"/>
-    </w:rPr>
-  </w:style>
-  <w:style w:type="character" w:customStyle="1" w:styleId="Heading4Char">
-    <w:name w:val="Heading 4 Char"/>
-    <w:basedOn w:val="DefaultParagraphFont"/>
-    <w:link w:val="Heading4"/>
-    <w:uiPriority w:val="9"/>
-    <w:rsid w:val="00EC6368"/>
-    <w:rPr>
-      <w:rFonts w:ascii="Helvetica" w:eastAsiaTheme="minorHAnsi" w:hAnsi="Helvetica" w:cs="Helvetica"/>
-      <w:iCs/>
-      <w:color w:val="0A2A78"/>
-      <w:spacing w:val="-2"/>
-      <w:sz w:val="24"/>
-      <w:szCs w:val="24"/>
-    </w:rPr>
-  </w:style>
-  <w:style w:type="character" w:styleId="Hyperlink">
-    <w:name w:val="Hyperlink"/>
-    <w:basedOn w:val="DefaultParagraphFont"/>
-    <w:uiPriority w:val="99"/>
-    <w:unhideWhenUsed/>
-    <w:rsid w:val="00EC6368"/>
-    <w:rPr>
-      <w:rFonts w:ascii="Helvetica" w:hAnsi="Helvetica" w:cs="Helvetica"/>
-      <w:color w:val="0563C1" w:themeColor="hyperlink"/>
-      <w:spacing w:val="-2"/>
-      <w:sz w:val="24"/>
-      <w:szCs w:val="24"/>
-      <w:u w:val="none"/>
-    </w:rPr>
-  </w:style>
-  <w:style w:type="character" w:customStyle="1" w:styleId="UnresolvedMention1">
-    <w:name w:val="Unresolved Mention1"/>
-    <w:basedOn w:val="DefaultParagraphFont"/>
-    <w:uiPriority w:val="99"/>
-    <w:semiHidden/>
-    <w:unhideWhenUsed/>
-    <w:rsid w:val="00EC6368"/>
-    <w:rPr>
-      <w:color w:val="605E5C"/>
-      <w:shd w:val="clear" w:color="auto" w:fill="E1DFDD"/>
-    </w:rPr>
-  </w:style>
-  <w:style w:type="character" w:customStyle="1" w:styleId="small">
-    <w:name w:val="small"/>
-    <w:basedOn w:val="DefaultParagraphFont"/>
-    <w:rsid w:val="00EC6368"/>
-    <w:rPr>
-      <w:rFonts w:cs="Times New Roman"/>
-    </w:rPr>
-  </w:style>
-  <w:style w:type="character" w:customStyle="1" w:styleId="interviewPAPtexttrigger">
-    <w:name w:val="interview PAP text trigger"/>
-    <w:basedOn w:val="DefaultParagraphFont"/>
-    <w:uiPriority w:val="1"/>
-    <w:qFormat/>
-    <w:rsid w:val="00EC6368"/>
-    <w:rPr>
-      <w:shd w:val="clear" w:color="auto" w:fill="009999"/>
-    </w:rPr>
-  </w:style>
-  <w:style w:type="character" w:customStyle="1" w:styleId="NumChar">
-    <w:name w:val="NumChar"/>
-    <w:basedOn w:val="DefaultParagraphFont"/>
-    <w:uiPriority w:val="1"/>
-    <w:qFormat/>
-    <w:rsid w:val="00EC6368"/>
-    <w:rPr>
-      <w:rFonts w:eastAsiaTheme="minorHAnsi"/>
-    </w:rPr>
-  </w:style>
-  <w:style w:type="character" w:customStyle="1" w:styleId="UnresolvedMention2">
-    <w:name w:val="Unresolved Mention2"/>
-    <w:basedOn w:val="DefaultParagraphFont"/>
-    <w:uiPriority w:val="99"/>
-    <w:semiHidden/>
-    <w:unhideWhenUsed/>
-    <w:rsid w:val="00EC6368"/>
-    <w:rPr>
-      <w:color w:val="605E5C"/>
-      <w:shd w:val="clear" w:color="auto" w:fill="E1DFDD"/>
-    </w:rPr>
-  </w:style>
-  <w:style w:type="character" w:customStyle="1" w:styleId="convention">
-    <w:name w:val="convention"/>
-    <w:basedOn w:val="DefaultParagraphFont"/>
-    <w:uiPriority w:val="1"/>
-    <w:qFormat/>
-    <w:rsid w:val="00EC6368"/>
-    <w:rPr>
-      <w:sz w:val="22"/>
-      <w:szCs w:val="22"/>
-      <w:shd w:val="clear" w:color="auto" w:fill="A6A6A6" w:themeFill="background1" w:themeFillShade="A6"/>
-    </w:rPr>
-  </w:style>
-  <w:style w:type="character" w:customStyle="1" w:styleId="interviewvariable">
-    <w:name w:val="interview variable"/>
-    <w:basedOn w:val="DefaultParagraphFont"/>
-    <w:uiPriority w:val="1"/>
-    <w:qFormat/>
-    <w:rsid w:val="00EC6368"/>
-    <w:rPr>
-      <w:color w:val="FF7C80"/>
-      <w:shd w:val="clear" w:color="auto" w:fill="FFFFCC"/>
-    </w:rPr>
-  </w:style>
-  <w:style w:type="character" w:styleId="Strong">
-    <w:name w:val="Strong"/>
-    <w:basedOn w:val="DefaultParagraphFont"/>
-    <w:uiPriority w:val="22"/>
-    <w:qFormat/>
-    <w:rsid w:val="00EC6368"/>
-    <w:rPr>
-      <w:b/>
-      <w:bCs/>
-    </w:rPr>
-  </w:style>
-  <w:style w:type="character" w:styleId="FollowedHyperlink">
-    <w:name w:val="FollowedHyperlink"/>
-    <w:basedOn w:val="DefaultParagraphFont"/>
-    <w:uiPriority w:val="99"/>
-    <w:semiHidden/>
-    <w:unhideWhenUsed/>
-    <w:rsid w:val="00EC6368"/>
-    <w:rPr>
-      <w:color w:val="954F72" w:themeColor="followedHyperlink"/>
-      <w:u w:val="single"/>
-    </w:rPr>
-  </w:style>
-  <w:style w:type="character" w:customStyle="1" w:styleId="interviewclickformoreinfo-definition">
-    <w:name w:val="interview click for more info - definition"/>
-    <w:uiPriority w:val="1"/>
-    <w:qFormat/>
-    <w:rsid w:val="00EC6368"/>
-    <w:rPr>
-      <w:color w:val="00B050"/>
-      <w:u w:val="dash" w:color="92D050"/>
-    </w:rPr>
-  </w:style>
-  <w:style w:type="character" w:customStyle="1" w:styleId="UnresolvedMention3">
-    <w:name w:val="Unresolved Mention3"/>
-    <w:basedOn w:val="DefaultParagraphFont"/>
-    <w:uiPriority w:val="99"/>
-    <w:semiHidden/>
-    <w:unhideWhenUsed/>
-    <w:rsid w:val="00F729A9"/>
-    <w:rPr>
-      <w:color w:val="605E5C"/>
-      <w:shd w:val="clear" w:color="auto" w:fill="E1DFDD"/>
-    </w:rPr>
-  </w:style>
-  <w:style w:type="character" w:customStyle="1" w:styleId="UnresolvedMention30">
-    <w:name w:val="Unresolved Mention3"/>
-    <w:basedOn w:val="DefaultParagraphFont"/>
-    <w:uiPriority w:val="99"/>
-    <w:semiHidden/>
-    <w:unhideWhenUsed/>
-    <w:rsid w:val="00EC6368"/>
-    <w:rPr>
-      <w:color w:val="605E5C"/>
-      <w:shd w:val="clear" w:color="auto" w:fill="E1DFDD"/>
-    </w:rPr>
-  </w:style>
-  <w:style w:type="character" w:styleId="Emphasis">
-    <w:name w:val="Emphasis"/>
-    <w:basedOn w:val="DefaultParagraphFont"/>
-    <w:uiPriority w:val="20"/>
-    <w:qFormat/>
-    <w:rsid w:val="00EC6368"/>
-    <w:rPr>
-      <w:i/>
-      <w:iCs/>
-    </w:rPr>
-  </w:style>
-  <w:style w:type="character" w:customStyle="1" w:styleId="UnresolvedMention4">
-    <w:name w:val="Unresolved Mention4"/>
-    <w:basedOn w:val="DefaultParagraphFont"/>
-    <w:uiPriority w:val="99"/>
-    <w:semiHidden/>
-    <w:unhideWhenUsed/>
-    <w:rsid w:val="00EC6368"/>
-    <w:rPr>
-      <w:color w:val="605E5C"/>
-      <w:shd w:val="clear" w:color="auto" w:fill="E1DFDD"/>
-    </w:rPr>
-  </w:style>
-  <w:style w:type="character" w:customStyle="1" w:styleId="UnresolvedMention31">
-    <w:name w:val="Unresolved Mention31"/>
-    <w:basedOn w:val="DefaultParagraphFont"/>
-    <w:uiPriority w:val="99"/>
-    <w:semiHidden/>
-    <w:unhideWhenUsed/>
-    <w:rsid w:val="00EC6368"/>
-    <w:rPr>
-      <w:color w:val="605E5C"/>
-      <w:shd w:val="clear" w:color="auto" w:fill="E1DFDD"/>
-    </w:rPr>
-  </w:style>
-  <w:style w:type="paragraph" w:customStyle="1" w:styleId="Heading">
-    <w:name w:val="Heading"/>
-    <w:basedOn w:val="Normal"/>
-    <w:next w:val="BodyText"/>
-    <w:qFormat/>
-    <w:pPr>
-      <w:keepNext/>
-      <w:spacing w:before="240" w:after="120"/>
-    </w:pPr>
-    <w:rPr>
-      <w:rFonts w:ascii="Liberation Sans" w:eastAsia="Microsoft YaHei" w:hAnsi="Liberation Sans" w:cs="Lucida Sans"/>
-      <w:sz w:val="28"/>
-      <w:szCs w:val="28"/>
-    </w:rPr>
-  </w:style>
-  <w:style w:type="paragraph" w:styleId="BodyText">
-    <w:name w:val="Body Text"/>
-    <w:basedOn w:val="Normal"/>
-    <w:link w:val="BodyTextChar"/>
-    <w:uiPriority w:val="1"/>
-    <w:qFormat/>
-    <w:rsid w:val="00EC6368"/>
-    <w:pPr>
-      <w:spacing w:before="54" w:after="120" w:line="276" w:lineRule="auto"/>
-    </w:pPr>
-    <w:rPr>
-      <w:rFonts w:ascii="Helvetica" w:hAnsi="Helvetica" w:cs="Helvetica"/>
-      <w:color w:val="202529"/>
-      <w:spacing w:val="-2"/>
-      <w:sz w:val="24"/>
-      <w:szCs w:val="24"/>
-    </w:rPr>
-  </w:style>
-  <w:style w:type="paragraph" w:styleId="List">
-    <w:name w:val="List"/>
-    <w:basedOn w:val="BodyText"/>
-    <w:rPr>
-      <w:rFonts w:cs="Lucida Sans"/>
-    </w:rPr>
-  </w:style>
-  <w:style w:type="paragraph" w:styleId="Caption">
-    <w:name w:val="caption"/>
-    <w:basedOn w:val="Normal"/>
-    <w:qFormat/>
-    <w:pPr>
-      <w:suppressLineNumbers/>
-      <w:spacing w:before="120" w:after="120"/>
-    </w:pPr>
-    <w:rPr>
-      <w:rFonts w:cs="Lucida Sans"/>
-      <w:i/>
-      <w:iCs/>
-      <w:sz w:val="24"/>
-      <w:szCs w:val="24"/>
-    </w:rPr>
-  </w:style>
-  <w:style w:type="paragraph" w:customStyle="1" w:styleId="Index">
-    <w:name w:val="Index"/>
-    <w:basedOn w:val="Normal"/>
-    <w:qFormat/>
-    <w:pPr>
-      <w:suppressLineNumbers/>
-    </w:pPr>
-    <w:rPr>
-      <w:rFonts w:cs="Lucida Sans"/>
-    </w:rPr>
-  </w:style>
-  <w:style w:type="paragraph" w:customStyle="1" w:styleId="Code">
-    <w:name w:val="Code"/>
-    <w:basedOn w:val="Normal"/>
-    <w:qFormat/>
-    <w:rsid w:val="00EC6368"/>
-    <w:rPr>
-      <w:rFonts w:ascii="Calibri" w:hAnsi="Calibri"/>
-    </w:rPr>
-  </w:style>
-  <w:style w:type="paragraph" w:customStyle="1" w:styleId="Body">
-    <w:name w:val="Body"/>
-    <w:basedOn w:val="BodyText"/>
-    <w:qFormat/>
-    <w:rsid w:val="00EC6368"/>
-    <w:rPr>
-      <w:rFonts w:eastAsiaTheme="minorHAnsi"/>
-    </w:rPr>
-  </w:style>
-  <w:style w:type="paragraph" w:styleId="ListParagraph">
-    <w:name w:val="List Paragraph"/>
-    <w:basedOn w:val="BodyText"/>
-    <w:uiPriority w:val="34"/>
-    <w:qFormat/>
-    <w:rsid w:val="00EC6368"/>
-    <w:pPr>
-      <w:widowControl w:val="0"/>
-      <w:numPr>
-        <w:numId w:val="17"/>
-      </w:numPr>
-      <w:autoSpaceDE w:val="0"/>
-      <w:autoSpaceDN w:val="0"/>
-      <w:spacing w:beforeAutospacing="0" w:afterAutospacing="0"/>
-    </w:pPr>
-    <w:rPr>
-      <w:rFonts w:eastAsiaTheme="minorHAnsi"/>
-    </w:rPr>
-  </w:style>
-  <w:style w:type="paragraph" w:customStyle="1" w:styleId="TFVariable">
-    <w:name w:val="TF Variable"/>
-    <w:basedOn w:val="Heading3"/>
-    <w:next w:val="Body"/>
-    <w:qFormat/>
-    <w:rsid w:val="00EC6368"/>
-    <w:pPr>
-      <w:numPr>
-        <w:numId w:val="21"/>
-      </w:numPr>
-    </w:pPr>
-  </w:style>
-  <w:style w:type="paragraph" w:customStyle="1" w:styleId="interviewglossarywordintemplate">
-    <w:name w:val="interview glossary word in template"/>
-    <w:basedOn w:val="Normal"/>
-    <w:link w:val="interviewglossarywordintemplateChar"/>
-    <w:qFormat/>
-    <w:rsid w:val="00EC6368"/>
-    <w:pPr>
-      <w:spacing w:after="60" w:line="360" w:lineRule="auto"/>
-    </w:pPr>
-    <w:rPr>
-      <w:rFonts w:asciiTheme="minorHAnsi" w:hAnsiTheme="minorHAnsi" w:cstheme="minorBidi"/>
-    </w:rPr>
-  </w:style>
-  <w:style w:type="paragraph" w:customStyle="1" w:styleId="interviewbutton">
-    <w:name w:val="interview button"/>
-    <w:basedOn w:val="Normal"/>
-    <w:next w:val="Normal"/>
-    <w:link w:val="interviewbuttonChar"/>
-    <w:qFormat/>
-    <w:rsid w:val="00EC6368"/>
-    <w:pPr>
-      <w:shd w:val="clear" w:color="auto" w:fill="0070C0"/>
-      <w:spacing w:after="60" w:line="360" w:lineRule="auto"/>
-    </w:pPr>
-    <w:rPr>
-      <w:rFonts w:asciiTheme="minorHAnsi" w:hAnsiTheme="minorHAnsi" w:cstheme="minorBidi"/>
-      <w:color w:val="FFFFFF" w:themeColor="background1"/>
-      <w:szCs w:val="40"/>
-    </w:rPr>
-  </w:style>
-  <w:style w:type="paragraph" w:styleId="Title">
-    <w:name w:val="Title"/>
-    <w:basedOn w:val="BodyText"/>
-    <w:next w:val="Normal"/>
-    <w:link w:val="TitleChar"/>
-    <w:uiPriority w:val="10"/>
-    <w:qFormat/>
-    <w:rsid w:val="00EC6368"/>
-    <w:pPr>
-      <w:spacing w:before="0" w:beforeAutospacing="0" w:after="100"/>
-    </w:pPr>
-    <w:rPr>
-      <w:color w:val="0A2A78"/>
-      <w:sz w:val="48"/>
-    </w:rPr>
-  </w:style>
-  <w:style w:type="paragraph" w:styleId="BalloonText">
-    <w:name w:val="Balloon Text"/>
-    <w:basedOn w:val="Normal"/>
-    <w:link w:val="BalloonTextChar"/>
-    <w:uiPriority w:val="99"/>
-    <w:semiHidden/>
-    <w:unhideWhenUsed/>
-    <w:rsid w:val="00EC6368"/>
-    <w:rPr>
-      <w:rFonts w:ascii="Segoe UI" w:hAnsi="Segoe UI" w:cs="Segoe UI"/>
-      <w:sz w:val="18"/>
-      <w:szCs w:val="18"/>
-    </w:rPr>
-  </w:style>
-  <w:style w:type="paragraph" w:styleId="CommentText">
-    <w:name w:val="annotation text"/>
-    <w:basedOn w:val="Normal"/>
-    <w:link w:val="CommentTextChar"/>
-    <w:uiPriority w:val="99"/>
-    <w:unhideWhenUsed/>
-    <w:rsid w:val="00EC6368"/>
-    <w:rPr>
-      <w:sz w:val="20"/>
-      <w:szCs w:val="20"/>
-    </w:rPr>
-  </w:style>
-  <w:style w:type="paragraph" w:styleId="CommentSubject">
-    <w:name w:val="annotation subject"/>
-    <w:basedOn w:val="CommentText"/>
-    <w:next w:val="CommentText"/>
-    <w:link w:val="CommentSubjectChar"/>
-    <w:uiPriority w:val="99"/>
-    <w:semiHidden/>
-    <w:unhideWhenUsed/>
-    <w:rsid w:val="00EC6368"/>
-    <w:rPr>
-      <w:b/>
-      <w:bCs/>
-    </w:rPr>
-  </w:style>
-  <w:style w:type="paragraph" w:customStyle="1" w:styleId="HeaderandFooter">
-    <w:name w:val="Header and Footer"/>
-    <w:basedOn w:val="Normal"/>
-    <w:qFormat/>
-  </w:style>
-  <w:style w:type="paragraph" w:styleId="Footer">
-    <w:name w:val="footer"/>
-    <w:basedOn w:val="Normal"/>
-    <w:link w:val="FooterChar"/>
-    <w:uiPriority w:val="99"/>
-    <w:unhideWhenUsed/>
-    <w:rsid w:val="00EC6368"/>
-    <w:pPr>
-      <w:tabs>
-        <w:tab w:val="center" w:pos="4680"/>
-        <w:tab w:val="right" w:pos="9360"/>
-      </w:tabs>
-    </w:pPr>
-  </w:style>
-  <w:style w:type="paragraph" w:styleId="Header">
-    <w:name w:val="header"/>
-    <w:basedOn w:val="Normal"/>
-    <w:link w:val="HeaderChar"/>
-    <w:uiPriority w:val="99"/>
-    <w:unhideWhenUsed/>
-    <w:rsid w:val="00EC6368"/>
-    <w:pPr>
-      <w:tabs>
-        <w:tab w:val="center" w:pos="4680"/>
-        <w:tab w:val="right" w:pos="9360"/>
-      </w:tabs>
-    </w:pPr>
-  </w:style>
-  <w:style w:type="paragraph" w:customStyle="1" w:styleId="TableParagraph">
-    <w:name w:val="Table Paragraph"/>
-    <w:basedOn w:val="Normal"/>
-    <w:uiPriority w:val="1"/>
-    <w:qFormat/>
-    <w:rsid w:val="00EC6368"/>
-  </w:style>
-  <w:style w:type="paragraph" w:customStyle="1" w:styleId="H3numberedfordirections">
-    <w:name w:val="H3 numbered for directions"/>
-    <w:basedOn w:val="Heading3"/>
-    <w:next w:val="BodyText"/>
-    <w:qFormat/>
-    <w:rsid w:val="00EC6368"/>
-    <w:pPr>
-      <w:numPr>
-        <w:numId w:val="16"/>
-      </w:numPr>
-      <w:outlineLvl w:val="9"/>
-    </w:pPr>
-  </w:style>
-  <w:style w:type="paragraph" w:customStyle="1" w:styleId="Listnumbered">
-    <w:name w:val="List numbered"/>
-    <w:basedOn w:val="BodyText"/>
-    <w:qFormat/>
-    <w:rsid w:val="00EC6368"/>
-    <w:pPr>
-      <w:widowControl w:val="0"/>
-      <w:autoSpaceDE w:val="0"/>
-      <w:autoSpaceDN w:val="0"/>
-      <w:spacing w:beforeAutospacing="0" w:afterAutospacing="0"/>
-    </w:pPr>
-    <w:rPr>
-      <w:rFonts w:eastAsiaTheme="minorHAnsi"/>
-    </w:rPr>
-  </w:style>
-  <w:style w:type="paragraph" w:customStyle="1" w:styleId="Listnumberedunderbullet">
-    <w:name w:val="List numbered under bullet"/>
-    <w:basedOn w:val="BodyText"/>
-    <w:qFormat/>
-    <w:rsid w:val="00EC6368"/>
-    <w:pPr>
-      <w:widowControl w:val="0"/>
-      <w:numPr>
-        <w:ilvl w:val="4"/>
-        <w:numId w:val="19"/>
-      </w:numPr>
-      <w:autoSpaceDE w:val="0"/>
-      <w:autoSpaceDN w:val="0"/>
-      <w:spacing w:beforeAutospacing="0" w:afterAutospacing="0"/>
-    </w:pPr>
-    <w:rPr>
-      <w:rFonts w:eastAsiaTheme="minorHAnsi"/>
-    </w:rPr>
-  </w:style>
-  <w:style w:type="paragraph" w:customStyle="1" w:styleId="StyleHeading1Hanging008">
-    <w:name w:val="Style Heading 1 + Hanging:  0.08&quot;"/>
-    <w:basedOn w:val="Heading1"/>
-    <w:rsid w:val="00EC6368"/>
-    <w:pPr>
-      <w:spacing w:before="120"/>
-      <w:ind w:hanging="115"/>
-    </w:pPr>
-    <w:rPr>
-      <w:rFonts w:eastAsia="Times New Roman" w:cs="Times New Roman"/>
-      <w:szCs w:val="20"/>
-    </w:rPr>
-  </w:style>
-  <w:style w:type="paragraph" w:styleId="NormalWeb">
-    <w:name w:val="Normal (Web)"/>
-    <w:basedOn w:val="Normal"/>
-    <w:uiPriority w:val="99"/>
-    <w:unhideWhenUsed/>
-    <w:rsid w:val="00EC6368"/>
-    <w:pPr>
-      <w:spacing w:before="100" w:after="100"/>
-    </w:pPr>
-    <w:rPr>
-      <w:rFonts w:ascii="Times New Roman" w:eastAsia="Times New Roman" w:hAnsi="Times New Roman" w:cs="Times New Roman"/>
-      <w:sz w:val="24"/>
-      <w:szCs w:val="24"/>
-    </w:rPr>
-  </w:style>
-  <w:style w:type="paragraph" w:customStyle="1" w:styleId="ListParagraphNumbered">
-    <w:name w:val="List Paragraph Numbered"/>
-    <w:basedOn w:val="ListParagraph"/>
-    <w:qFormat/>
-    <w:rsid w:val="00EC6368"/>
-    <w:pPr>
-      <w:numPr>
-        <w:numId w:val="20"/>
-      </w:numPr>
-    </w:pPr>
-    <w:rPr>
-      <w:b/>
-    </w:rPr>
-  </w:style>
-  <w:style w:type="paragraph" w:customStyle="1" w:styleId="one-indent">
-    <w:name w:val="one-indent"/>
-    <w:basedOn w:val="Normal"/>
-    <w:rsid w:val="00EC6368"/>
-    <w:pPr>
-      <w:spacing w:before="100" w:after="100"/>
-    </w:pPr>
-    <w:rPr>
-      <w:rFonts w:ascii="Times New Roman" w:eastAsia="Times New Roman" w:hAnsi="Times New Roman" w:cs="Times New Roman"/>
-      <w:sz w:val="24"/>
-      <w:szCs w:val="24"/>
-    </w:rPr>
-  </w:style>
-  <w:style w:type="paragraph" w:styleId="Revision">
-    <w:name w:val="Revision"/>
-    <w:uiPriority w:val="99"/>
-    <w:semiHidden/>
-    <w:qFormat/>
-    <w:rsid w:val="005C1760"/>
-    <w:rPr>
-      <w:rFonts w:ascii="Arial" w:hAnsi="Arial" w:cs="Arial"/>
-    </w:rPr>
-  </w:style>
-  <w:style w:type="numbering" w:customStyle="1" w:styleId="Style1">
-    <w:name w:val="Style1"/>
-    <w:uiPriority w:val="99"/>
-    <w:rsid w:val="00EC6368"/>
-    <w:pPr>
-      <w:numPr>
-        <w:numId w:val="14"/>
-      </w:numPr>
-    </w:pPr>
-  </w:style>
-  <w:style w:type="table" w:styleId="TableGrid">
-    <w:name w:val="Table Grid"/>
-    <w:basedOn w:val="TableNormal"/>
-    <w:uiPriority w:val="39"/>
-    <w:rsid w:val="00EC6368"/>
-    <w:pPr>
-      <w:widowControl w:val="0"/>
-      <w:suppressAutoHyphens w:val="0"/>
-      <w:autoSpaceDE w:val="0"/>
-      <w:autoSpaceDN w:val="0"/>
-    </w:pPr>
-    <w:rPr>
-      <w:rFonts w:eastAsiaTheme="minorHAnsi"/>
-    </w:rPr>
-    <w:tblPr>
-      <w:tblBorders>
-        <w:top w:val="single" w:sz="4" w:space="0" w:color="auto"/>
-        <w:left w:val="single" w:sz="4" w:space="0" w:color="auto"/>
-        <w:bottom w:val="single" w:sz="4" w:space="0" w:color="auto"/>
-        <w:right w:val="single" w:sz="4" w:space="0" w:color="auto"/>
-        <w:insideH w:val="single" w:sz="4" w:space="0" w:color="auto"/>
-        <w:insideV w:val="single" w:sz="4" w:space="0" w:color="auto"/>
-      </w:tblBorders>
-    </w:tblPr>
-  </w:style>
-  <w:style w:type="table" w:customStyle="1" w:styleId="TableGrid1">
-    <w:name w:val="Table Grid1"/>
-    <w:basedOn w:val="TableNormal"/>
-    <w:next w:val="TableGrid"/>
-    <w:uiPriority w:val="39"/>
-    <w:rsid w:val="00EC6368"/>
-    <w:pPr>
-      <w:widowControl w:val="0"/>
-      <w:suppressAutoHyphens w:val="0"/>
-      <w:autoSpaceDE w:val="0"/>
-      <w:autoSpaceDN w:val="0"/>
-    </w:pPr>
-    <w:rPr>
-      <w:rFonts w:eastAsiaTheme="minorHAnsi"/>
-    </w:rPr>
-    <w:tblPr>
-      <w:tblBorders>
-        <w:top w:val="single" w:sz="4" w:space="0" w:color="auto"/>
-        <w:left w:val="single" w:sz="4" w:space="0" w:color="auto"/>
-        <w:bottom w:val="single" w:sz="4" w:space="0" w:color="auto"/>
-        <w:right w:val="single" w:sz="4" w:space="0" w:color="auto"/>
-        <w:insideH w:val="single" w:sz="4" w:space="0" w:color="auto"/>
-        <w:insideV w:val="single" w:sz="4" w:space="0" w:color="auto"/>
-      </w:tblBorders>
-    </w:tblPr>
-  </w:style>
-  <w:style w:type="paragraph" w:customStyle="1" w:styleId="Example">
-    <w:name w:val="Example"/>
-    <w:basedOn w:val="Normal"/>
-    <w:next w:val="Normal"/>
-    <w:qFormat/>
-    <w:rsid w:val="00EC6368"/>
-    <w:pPr>
-      <w:widowControl w:val="0"/>
-      <w:autoSpaceDE w:val="0"/>
-      <w:autoSpaceDN w:val="0"/>
-      <w:spacing w:before="54" w:after="120" w:line="276" w:lineRule="auto"/>
-      <w:ind w:left="397"/>
-    </w:pPr>
-    <w:rPr>
-      <w:rFonts w:ascii="Helvetica" w:eastAsiaTheme="minorHAnsi" w:hAnsi="Helvetica" w:cs="Helvetica"/>
-      <w:color w:val="202529"/>
-      <w:spacing w:val="-2"/>
-      <w:sz w:val="24"/>
-      <w:szCs w:val="24"/>
-    </w:rPr>
-  </w:style>
-  <w:style w:type="paragraph" w:styleId="HTMLPreformatted">
-    <w:name w:val="HTML Preformatted"/>
-    <w:basedOn w:val="Normal"/>
-    <w:link w:val="HTMLPreformattedChar"/>
-    <w:uiPriority w:val="99"/>
-    <w:semiHidden/>
-    <w:unhideWhenUsed/>
-    <w:rsid w:val="00EC6368"/>
-    <w:pPr>
-      <w:tabs>
-        <w:tab w:val="left" w:pos="916"/>
-        <w:tab w:val="left" w:pos="1832"/>
-        <w:tab w:val="left" w:pos="2748"/>
-        <w:tab w:val="left" w:pos="3664"/>
-        <w:tab w:val="left" w:pos="4580"/>
-        <w:tab w:val="left" w:pos="5496"/>
-        <w:tab w:val="left" w:pos="6412"/>
-        <w:tab w:val="left" w:pos="7328"/>
-        <w:tab w:val="left" w:pos="8244"/>
-        <w:tab w:val="left" w:pos="9160"/>
-        <w:tab w:val="left" w:pos="10076"/>
-        <w:tab w:val="left" w:pos="10992"/>
-        <w:tab w:val="left" w:pos="11908"/>
-        <w:tab w:val="left" w:pos="12824"/>
-        <w:tab w:val="left" w:pos="13740"/>
-        <w:tab w:val="left" w:pos="14656"/>
-      </w:tabs>
-      <w:spacing w:before="0" w:beforeAutospacing="0" w:after="0" w:afterAutospacing="0"/>
-    </w:pPr>
-    <w:rPr>
-      <w:rFonts w:ascii="Courier New" w:eastAsia="Times New Roman" w:hAnsi="Courier New" w:cs="Courier New"/>
-      <w:sz w:val="20"/>
-      <w:szCs w:val="20"/>
-    </w:rPr>
-  </w:style>
-  <w:style w:type="character" w:customStyle="1" w:styleId="HTMLPreformattedChar">
-    <w:name w:val="HTML Preformatted Char"/>
-    <w:basedOn w:val="DefaultParagraphFont"/>
-    <w:link w:val="HTMLPreformatted"/>
-    <w:uiPriority w:val="99"/>
-    <w:semiHidden/>
-    <w:rsid w:val="00EC6368"/>
-    <w:rPr>
-      <w:rFonts w:ascii="Courier New" w:eastAsia="Times New Roman" w:hAnsi="Courier New" w:cs="Courier New"/>
-      <w:sz w:val="20"/>
-      <w:szCs w:val="20"/>
-    </w:rPr>
-  </w:style>
-  <w:style w:type="paragraph" w:customStyle="1" w:styleId="interviewbuttons">
-    <w:name w:val="interview buttons"/>
-    <w:basedOn w:val="Normal"/>
-    <w:qFormat/>
-    <w:rsid w:val="00EC6368"/>
-    <w:pPr>
-      <w:pBdr>
-        <w:top w:val="single" w:sz="12" w:space="1" w:color="0070C0"/>
-        <w:left w:val="single" w:sz="12" w:space="4" w:color="0070C0"/>
-        <w:bottom w:val="single" w:sz="12" w:space="1" w:color="0070C0"/>
-        <w:right w:val="single" w:sz="12" w:space="4" w:color="0070C0"/>
-        <w:between w:val="single" w:sz="12" w:space="1" w:color="0070C0"/>
-        <w:bar w:val="single" w:sz="12" w:color="0070C0"/>
-      </w:pBdr>
-      <w:shd w:val="clear" w:color="auto" w:fill="FFFFFF"/>
-      <w:spacing w:after="0"/>
-      <w:ind w:left="-58" w:right="-216"/>
-    </w:pPr>
-    <w:rPr>
-      <w:sz w:val="21"/>
-      <w:szCs w:val="21"/>
-    </w:rPr>
-  </w:style>
-  <w:style w:type="character" w:customStyle="1" w:styleId="interviewconvention">
-    <w:name w:val="interview convention"/>
-    <w:basedOn w:val="DefaultParagraphFont"/>
-    <w:uiPriority w:val="1"/>
-    <w:qFormat/>
-    <w:rsid w:val="00EC6368"/>
-    <w:rPr>
-      <w:sz w:val="22"/>
-      <w:szCs w:val="22"/>
-      <w:shd w:val="clear" w:color="auto" w:fill="A6A6A6" w:themeFill="background1" w:themeFillShade="A6"/>
-    </w:rPr>
-  </w:style>
-  <w:style w:type="character" w:customStyle="1" w:styleId="interviewneedstobewritten">
-    <w:name w:val="interview needs to be written"/>
-    <w:basedOn w:val="DefaultParagraphFont"/>
-    <w:uiPriority w:val="1"/>
-    <w:qFormat/>
-    <w:rsid w:val="00EC6368"/>
-    <w:rPr>
-      <w:shd w:val="clear" w:color="auto" w:fill="FFFF00"/>
-    </w:rPr>
-  </w:style>
-  <w:style w:type="character" w:customStyle="1" w:styleId="interviewpdf">
-    <w:name w:val="interview pdf"/>
-    <w:basedOn w:val="DefaultParagraphFont"/>
-    <w:uiPriority w:val="1"/>
-    <w:qFormat/>
-    <w:rsid w:val="00EC6368"/>
-    <w:rPr>
-      <w:sz w:val="21"/>
-      <w:szCs w:val="21"/>
-    </w:rPr>
-  </w:style>
-  <w:style w:type="paragraph" w:customStyle="1" w:styleId="interviewradiobuttons">
-    <w:name w:val="interview radio buttons"/>
-    <w:basedOn w:val="ListParagraph"/>
-    <w:qFormat/>
-    <w:rsid w:val="00EC6368"/>
-    <w:pPr>
-      <w:widowControl/>
-      <w:numPr>
-        <w:numId w:val="18"/>
-      </w:numPr>
-      <w:pBdr>
-        <w:top w:val="single" w:sz="12" w:space="1" w:color="0070C0"/>
-        <w:left w:val="single" w:sz="12" w:space="4" w:color="0070C0"/>
-        <w:bottom w:val="single" w:sz="12" w:space="1" w:color="0070C0"/>
-        <w:right w:val="single" w:sz="12" w:space="4" w:color="0070C0"/>
-        <w:between w:val="single" w:sz="12" w:space="1" w:color="0070C0"/>
-        <w:bar w:val="single" w:sz="12" w:color="0070C0"/>
-      </w:pBdr>
-      <w:shd w:val="clear" w:color="auto" w:fill="FFFFFF"/>
-      <w:autoSpaceDE/>
-      <w:autoSpaceDN/>
-      <w:spacing w:before="-1" w:beforeAutospacing="1" w:after="480" w:afterAutospacing="1" w:line="240" w:lineRule="auto"/>
-      <w:ind w:right="-220"/>
-      <w:contextualSpacing/>
-    </w:pPr>
-    <w:rPr>
-      <w:rFonts w:ascii="Arial" w:eastAsia="Arial" w:hAnsi="Arial" w:cs="Arial"/>
-      <w:color w:val="auto"/>
-      <w:spacing w:val="0"/>
-      <w:sz w:val="21"/>
-      <w:szCs w:val="21"/>
-    </w:rPr>
-  </w:style>
-  <w:style w:type="character" w:customStyle="1" w:styleId="interviewtemplatetrigger">
-    <w:name w:val="interview template trigger"/>
-    <w:basedOn w:val="DefaultParagraphFont"/>
-    <w:uiPriority w:val="1"/>
-    <w:qFormat/>
-    <w:rsid w:val="00EC6368"/>
-  </w:style>
-  <w:style w:type="paragraph" w:customStyle="1" w:styleId="ListPlevel2">
-    <w:name w:val="List P level 2"/>
-    <w:basedOn w:val="ListParagraph"/>
-    <w:qFormat/>
-    <w:rsid w:val="00EC6368"/>
-    <w:pPr>
-      <w:numPr>
-        <w:numId w:val="0"/>
-      </w:numPr>
-      <w:tabs>
-        <w:tab w:val="num" w:pos="360"/>
-      </w:tabs>
-      <w:ind w:left="765" w:hanging="360"/>
-    </w:pPr>
-  </w:style>
-  <w:style w:type="paragraph" w:customStyle="1" w:styleId="ListPlevel3">
-    <w:name w:val="List P level 3"/>
-    <w:basedOn w:val="ListPlevel2"/>
-    <w:qFormat/>
-    <w:rsid w:val="00EC6368"/>
-    <w:pPr>
-      <w:tabs>
-        <w:tab w:val="clear" w:pos="360"/>
-      </w:tabs>
-      <w:ind w:left="0" w:firstLine="0"/>
-    </w:pPr>
-  </w:style>
-  <w:style w:type="paragraph" w:customStyle="1" w:styleId="MLRIAdvocacyguideforPDFPart">
-    <w:name w:val="MLRI Advocacy guide for PDF Part"/>
-    <w:basedOn w:val="Normal"/>
-    <w:qFormat/>
-    <w:rsid w:val="00EC6368"/>
-    <w:pPr>
-      <w:spacing w:before="480" w:after="80" w:line="320" w:lineRule="exact"/>
-      <w:ind w:left="187"/>
-    </w:pPr>
-    <w:rPr>
-      <w:rFonts w:ascii="Bookman Old Style" w:hAnsi="Bookman Old Style"/>
-      <w:color w:val="808080"/>
-      <w:szCs w:val="28"/>
-    </w:rPr>
-  </w:style>
-  <w:style w:type="character" w:customStyle="1" w:styleId="UnresolvedMention5">
-    <w:name w:val="Unresolved Mention5"/>
-    <w:basedOn w:val="DefaultParagraphFont"/>
-    <w:uiPriority w:val="99"/>
-    <w:semiHidden/>
-    <w:unhideWhenUsed/>
-    <w:rsid w:val="00EC6368"/>
-    <w:rPr>
-      <w:color w:val="605E5C"/>
-      <w:shd w:val="clear" w:color="auto" w:fill="E1DFDD"/>
-    </w:rPr>
-  </w:style>
-  <w:style w:type="character" w:customStyle="1" w:styleId="UnresolvedMention6">
-    <w:name w:val="Unresolved Mention6"/>
-    <w:basedOn w:val="DefaultParagraphFont"/>
-    <w:uiPriority w:val="99"/>
-    <w:semiHidden/>
-    <w:unhideWhenUsed/>
-    <w:rsid w:val="00EC6368"/>
-    <w:rPr>
-      <w:color w:val="605E5C"/>
-      <w:shd w:val="clear" w:color="auto" w:fill="E1DFDD"/>
-    </w:rPr>
-  </w:style>
-  <w:style w:type="character" w:customStyle="1" w:styleId="UnresolvedMention7">
-    <w:name w:val="Unresolved Mention7"/>
-    <w:basedOn w:val="DefaultParagraphFont"/>
-    <w:uiPriority w:val="99"/>
-    <w:semiHidden/>
-    <w:unhideWhenUsed/>
-    <w:rsid w:val="00EC6368"/>
-    <w:rPr>
-      <w:color w:val="605E5C"/>
-      <w:shd w:val="clear" w:color="auto" w:fill="E1DFDD"/>
-    </w:rPr>
-  </w:style>
-  <w:style w:type="character" w:customStyle="1" w:styleId="Heading5Char">
-    <w:name w:val="Heading 5 Char"/>
-    <w:basedOn w:val="DefaultParagraphFont"/>
-    <w:link w:val="Heading5"/>
-    <w:uiPriority w:val="9"/>
-    <w:semiHidden/>
-    <w:rsid w:val="00750956"/>
-    <w:rPr>
-      <w:rFonts w:ascii="Arial" w:hAnsi="Arial" w:cs="Arial"/>
-      <w:color w:val="666666"/>
-      <w:sz w:val="24"/>
-      <w:lang w:val="en"/>
-    </w:rPr>
-  </w:style>
-  <w:style w:type="character" w:customStyle="1" w:styleId="Heading6Char">
-    <w:name w:val="Heading 6 Char"/>
-    <w:basedOn w:val="DefaultParagraphFont"/>
-    <w:link w:val="Heading6"/>
-    <w:uiPriority w:val="9"/>
-    <w:semiHidden/>
-    <w:rsid w:val="00750956"/>
-    <w:rPr>
-      <w:rFonts w:ascii="Arial" w:hAnsi="Arial" w:cs="Arial"/>
-      <w:i/>
-      <w:color w:val="666666"/>
-      <w:sz w:val="24"/>
-      <w:lang w:val="en"/>
-    </w:rPr>
-  </w:style>
-  <w:style w:type="character" w:customStyle="1" w:styleId="Helptextinquestionmark">
-    <w:name w:val="Help text in question mark"/>
-    <w:basedOn w:val="DefaultParagraphFont"/>
-    <w:uiPriority w:val="1"/>
-    <w:qFormat/>
-    <w:rsid w:val="00750956"/>
-    <w:rPr>
-      <w:rFonts w:ascii="Tahoma" w:hAnsi="Tahoma" w:cs="Tahoma"/>
-      <w:color w:val="FFFFFF" w:themeColor="background1"/>
-      <w:szCs w:val="24"/>
-      <w:shd w:val="clear" w:color="auto" w:fill="33CCFF"/>
-    </w:rPr>
-  </w:style>
-  <w:style w:type="character" w:customStyle="1" w:styleId="Interviewbutton0">
-    <w:name w:val="Interview button"/>
-    <w:basedOn w:val="DefaultParagraphFont"/>
-    <w:uiPriority w:val="1"/>
-    <w:qFormat/>
-    <w:rsid w:val="00750956"/>
-    <w:rPr>
-      <w:color w:val="FFFFFF" w:themeColor="background1"/>
-      <w:bdr w:val="none" w:sz="0" w:space="0" w:color="auto"/>
-      <w:shd w:val="clear" w:color="auto" w:fill="0B5ED8"/>
-    </w:rPr>
-  </w:style>
-  <w:style w:type="paragraph" w:customStyle="1" w:styleId="interviewcheckboxes">
-    <w:name w:val="interview checkboxes"/>
-    <w:basedOn w:val="ListParagraph"/>
-    <w:qFormat/>
-    <w:rsid w:val="00750956"/>
-    <w:pPr>
-      <w:numPr>
-        <w:numId w:val="15"/>
-      </w:numPr>
-      <w:pBdr>
-        <w:top w:val="single" w:sz="12" w:space="1" w:color="0070C0"/>
-        <w:left w:val="single" w:sz="12" w:space="4" w:color="0070C0"/>
-        <w:bottom w:val="single" w:sz="12" w:space="1" w:color="0070C0"/>
-        <w:right w:val="single" w:sz="12" w:space="4" w:color="0070C0"/>
-        <w:between w:val="single" w:sz="12" w:space="1" w:color="0070C0"/>
-        <w:bar w:val="single" w:sz="12" w:color="0070C0"/>
-      </w:pBdr>
-    </w:pPr>
-  </w:style>
-  <w:style w:type="character" w:customStyle="1" w:styleId="interviewcondition2">
-    <w:name w:val="interview condition 2"/>
-    <w:basedOn w:val="Hyperlink"/>
-    <w:uiPriority w:val="1"/>
-    <w:qFormat/>
-    <w:rsid w:val="00750956"/>
-    <w:rPr>
-      <w:rFonts w:ascii="Helvetica" w:hAnsi="Helvetica" w:cs="Helvetica"/>
-      <w:color w:val="009999"/>
-      <w:spacing w:val="-2"/>
-      <w:sz w:val="24"/>
-      <w:szCs w:val="24"/>
-      <w:u w:val="none"/>
-    </w:rPr>
-  </w:style>
-  <w:style w:type="character" w:customStyle="1" w:styleId="interviewhelpquestionmark">
-    <w:name w:val="interview help question mark"/>
-    <w:basedOn w:val="DefaultParagraphFont"/>
-    <w:uiPriority w:val="1"/>
-    <w:qFormat/>
-    <w:rsid w:val="00750956"/>
-    <w:rPr>
-      <w:color w:val="FFFFFF" w:themeColor="background1"/>
-      <w:shd w:val="clear" w:color="auto" w:fill="9CC2E5" w:themeFill="accent5" w:themeFillTint="99"/>
-    </w:rPr>
-  </w:style>
-  <w:style w:type="paragraph" w:customStyle="1" w:styleId="interviewneedsediting">
-    <w:name w:val="interview needs editing"/>
-    <w:basedOn w:val="Normal"/>
-    <w:next w:val="Normal"/>
-    <w:qFormat/>
-    <w:rsid w:val="00750956"/>
-    <w:pPr>
-      <w:shd w:val="clear" w:color="auto" w:fill="FFFF00"/>
-      <w:spacing w:after="60" w:line="360" w:lineRule="auto"/>
-    </w:pPr>
-    <w:rPr>
-      <w:sz w:val="21"/>
-      <w:szCs w:val="21"/>
-    </w:rPr>
-  </w:style>
-  <w:style w:type="character" w:customStyle="1" w:styleId="interviewtextbox">
-    <w:name w:val="interview text box"/>
-    <w:basedOn w:val="DefaultParagraphFont"/>
-    <w:uiPriority w:val="1"/>
-    <w:qFormat/>
-    <w:rsid w:val="00750956"/>
-    <w:rPr>
-      <w:shd w:val="clear" w:color="auto" w:fill="D9D9D9" w:themeFill="background1" w:themeFillShade="D9"/>
-    </w:rPr>
-  </w:style>
-  <w:style w:type="character" w:customStyle="1" w:styleId="subject">
-    <w:name w:val="subject"/>
-    <w:basedOn w:val="DefaultParagraphFont"/>
-    <w:rsid w:val="00750956"/>
-  </w:style>
-  <w:style w:type="paragraph" w:styleId="Subtitle">
-    <w:name w:val="Subtitle"/>
-    <w:basedOn w:val="Normal"/>
-    <w:next w:val="Normal"/>
-    <w:link w:val="SubtitleChar"/>
-    <w:uiPriority w:val="11"/>
-    <w:qFormat/>
-    <w:rsid w:val="00750956"/>
-    <w:pPr>
-      <w:keepNext/>
-      <w:keepLines/>
-      <w:spacing w:after="320"/>
-    </w:pPr>
-    <w:rPr>
-      <w:color w:val="666666"/>
-      <w:sz w:val="30"/>
-      <w:szCs w:val="30"/>
-    </w:rPr>
-  </w:style>
-  <w:style w:type="character" w:customStyle="1" w:styleId="SubtitleChar">
-    <w:name w:val="Subtitle Char"/>
-    <w:basedOn w:val="DefaultParagraphFont"/>
-    <w:link w:val="Subtitle"/>
-    <w:uiPriority w:val="11"/>
-    <w:rsid w:val="00750956"/>
-    <w:rPr>
-      <w:rFonts w:ascii="Arial" w:hAnsi="Arial" w:cs="Arial"/>
-      <w:color w:val="666666"/>
-      <w:sz w:val="30"/>
-      <w:szCs w:val="30"/>
-      <w:lang w:val="en"/>
-    </w:rPr>
-  </w:style>
-  <w:style w:type="paragraph" w:styleId="TOC1">
-    <w:name w:val="toc 1"/>
-    <w:basedOn w:val="Normal"/>
-    <w:next w:val="Normal"/>
-    <w:autoRedefine/>
-    <w:uiPriority w:val="39"/>
-    <w:unhideWhenUsed/>
-    <w:rsid w:val="00750956"/>
-    <w:pPr>
-      <w:spacing w:after="100"/>
-    </w:pPr>
-  </w:style>
-  <w:style w:type="paragraph" w:styleId="TOC2">
-    <w:name w:val="toc 2"/>
-    <w:basedOn w:val="Normal"/>
-    <w:next w:val="Normal"/>
-    <w:autoRedefine/>
-    <w:uiPriority w:val="39"/>
-    <w:unhideWhenUsed/>
-    <w:rsid w:val="00750956"/>
-    <w:pPr>
-      <w:spacing w:after="100"/>
-      <w:ind w:left="240"/>
-    </w:pPr>
-  </w:style>
-  <w:style w:type="paragraph" w:styleId="TOC3">
-    <w:name w:val="toc 3"/>
-    <w:basedOn w:val="Normal"/>
-    <w:next w:val="Normal"/>
-    <w:autoRedefine/>
-    <w:uiPriority w:val="39"/>
-    <w:unhideWhenUsed/>
-    <w:rsid w:val="00750956"/>
-    <w:pPr>
-      <w:spacing w:after="100"/>
-      <w:ind w:left="480"/>
-    </w:pPr>
-  </w:style>
-  <w:style w:type="paragraph" w:styleId="TOCHeading">
-    <w:name w:val="TOC Heading"/>
-    <w:basedOn w:val="Heading1"/>
-    <w:next w:val="Normal"/>
-    <w:uiPriority w:val="39"/>
-    <w:unhideWhenUsed/>
-    <w:qFormat/>
-    <w:rsid w:val="00750956"/>
-    <w:pPr>
-      <w:spacing w:before="240" w:after="0" w:line="259" w:lineRule="auto"/>
-      <w:outlineLvl w:val="9"/>
-    </w:pPr>
-    <w:rPr>
-      <w:rFonts w:asciiTheme="majorHAnsi" w:eastAsiaTheme="majorEastAsia" w:hAnsiTheme="majorHAnsi" w:cstheme="majorBidi"/>
-      <w:color w:val="2F5496" w:themeColor="accent1" w:themeShade="BF"/>
-      <w:sz w:val="32"/>
-      <w:szCs w:val="32"/>
-    </w:rPr>
-  </w:style>
-  <w:style w:type="character" w:customStyle="1" w:styleId="UnresolvedMention8">
-    <w:name w:val="Unresolved Mention8"/>
-    <w:basedOn w:val="DefaultParagraphFont"/>
-    <w:uiPriority w:val="99"/>
-    <w:semiHidden/>
-    <w:unhideWhenUsed/>
-    <w:rsid w:val="00226581"/>
-    <w:rPr>
-      <w:color w:val="605E5C"/>
-      <w:shd w:val="clear" w:color="auto" w:fill="E1DFDD"/>
-    </w:rPr>
-  </w:style>
-  <w:style w:type="character" w:customStyle="1" w:styleId="UnresolvedMention">
-    <w:name w:val="Unresolved Mention"/>
+  <w:style w:type="character" w:customStyle="1" w:styleId="UnresolvedMention9">
+    <w:name w:val="Unresolved Mention9"/>
     <w:basedOn w:val="DefaultParagraphFont"/>
     <w:uiPriority w:val="99"/>
     <w:semiHidden/>
@@ -11775,7 +10465,7 @@
   <a:extraClrSchemeLst/>
   <a:extLst>
     <a:ext uri="{05A4C25C-085E-4340-85A3-A5531E510DB2}">
-      <thm15:themeFamily xmlns:thm15="http://schemas.microsoft.com/office/thememl/2012/main" xmlns="" name="Office Theme" id="{62F939B6-93AF-4DB8-9C6B-D6C7DFDC589F}" vid="{4A3C46E8-61CC-4603-A589-7422A47A8E4A}"/>
+      <thm15:themeFamily xmlns:thm15="http://schemas.microsoft.com/office/thememl/2012/main" name="Office Theme" id="{62F939B6-93AF-4DB8-9C6B-D6C7DFDC589F}" vid="{4A3C46E8-61CC-4603-A589-7422A47A8E4A}"/>
     </a:ext>
   </a:extLst>
 </a:theme>

</xml_diff>

<commit_message>
updated all feature files that to look for called "jurisdiction"        Deleted . after feature files that have . after [Fill in PDF] after updating branding package
</commit_message>
<xml_diff>
--- a/docassemble/RespondingCaseToEndYourMarriageActionPlan/data/templates/responding_ending_marriage_action_plan.docx
+++ b/docassemble/RespondingCaseToEndYourMarriageActionPlan/data/templates/responding_ending_marriage_action_plan.docx
@@ -463,7 +463,7 @@
                 </mc:Choice>
                 <mc:Fallback>
                   <w:pict>
-                    <v:group w14:anchorId="3206BA7F" id="Group 1" o:spid="_x0000_s1026" style="position:absolute;margin-left:0;margin-top:13.25pt;width:59.8pt;height:54.75pt;z-index:-503316478;mso-wrap-distance-right:25.2pt" coordsize="0,0" o:gfxdata="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">
+                    <v:group w14:anchorId="5BBCD5F5" id="Group 1" o:spid="_x0000_s1026" style="position:absolute;margin-left:0;margin-top:13.25pt;width:59.8pt;height:54.75pt;z-index:-503316478;mso-wrap-distance-right:25.2pt" coordsize="0,0" o:gfxdata="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">
                       <v:group id="Group 2" o:spid="_x0000_s1027" style="position:absolute;width:591120;height:694800" coordsize="0,0" o:gfxdata="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">
                         <v:shape id="Freeform 3" o:spid="_x0000_s1028" style="position:absolute;top:41400;width:591120;height:653400;visibility:visible;mso-wrap-style:square;v-text-anchor:top" coordsize="915,1071" o:gfxdata="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" path="m85,89l85,,914,r,985l824,985t,85l,1070,,92r573,l573,337r246,l824,1070xe" filled="f" strokecolor="#333" strokeweight=".44mm">
                           <v:path arrowok="t"/>
@@ -1161,7 +1161,224 @@
               </w:rPr>
             </w:pPr>
             <w:r>
-              <w:t>{%tr if type_of_response.all_true('improper service', exclusive = True) %}</w:t>
+              <w:rPr>
+                <w:color w:val="FF0000"/>
+              </w:rPr>
+              <w:t>{%tr if type_of_response.all_true('improper service', exclusive = True)</w:t>
+            </w:r>
+            <w:r>
+              <w:rPr>
+                <w:color w:val="FF0000"/>
+              </w:rPr>
+              <w:t xml:space="preserve"> or (</w:t>
+            </w:r>
+            <w:r>
+              <w:rPr>
+                <w:color w:val="FFC000"/>
+              </w:rPr>
+              <w:t>(</w:t>
+            </w:r>
+            <w:proofErr w:type="spellStart"/>
+            <w:r>
+              <w:rPr>
+                <w:color w:val="92D050"/>
+              </w:rPr>
+              <w:t>type_of_response</w:t>
+            </w:r>
+            <w:r>
+              <w:rPr>
+                <w:color w:val="92D050"/>
+              </w:rPr>
+              <w:t>.all_true</w:t>
+            </w:r>
+            <w:proofErr w:type="spellEnd"/>
+            <w:r>
+              <w:rPr>
+                <w:color w:val="92D050"/>
+              </w:rPr>
+              <w:t>(</w:t>
+            </w:r>
+            <w:r>
+              <w:rPr>
+                <w:color w:val="92D050"/>
+              </w:rPr>
+              <w:t>’improper service’</w:t>
+            </w:r>
+            <w:r>
+              <w:rPr>
+                <w:color w:val="92D050"/>
+              </w:rPr>
+              <w:t xml:space="preserve">, </w:t>
+            </w:r>
+            <w:r>
+              <w:rPr>
+                <w:color w:val="92D050"/>
+              </w:rPr>
+              <w:t>'wrong state'</w:t>
+            </w:r>
+            <w:r>
+              <w:rPr>
+                <w:color w:val="92D050"/>
+              </w:rPr>
+              <w:t>)</w:t>
+            </w:r>
+            <w:r>
+              <w:rPr>
+                <w:color w:val="FFC000"/>
+              </w:rPr>
+              <w:t xml:space="preserve"> </w:t>
+            </w:r>
+            <w:r>
+              <w:rPr>
+                <w:color w:val="92D050"/>
+              </w:rPr>
+              <w:t>or</w:t>
+            </w:r>
+            <w:r>
+              <w:rPr>
+                <w:color w:val="FFC000"/>
+              </w:rPr>
+              <w:t xml:space="preserve"> </w:t>
+            </w:r>
+            <w:r>
+              <w:rPr>
+                <w:color w:val="92D050"/>
+              </w:rPr>
+              <w:t>(</w:t>
+            </w:r>
+            <w:proofErr w:type="spellStart"/>
+            <w:r>
+              <w:rPr>
+                <w:color w:val="00B050"/>
+              </w:rPr>
+              <w:t>type_of_response.all_true</w:t>
+            </w:r>
+            <w:proofErr w:type="spellEnd"/>
+            <w:r>
+              <w:rPr>
+                <w:color w:val="00B050"/>
+              </w:rPr>
+              <w:t>(</w:t>
+            </w:r>
+            <w:r>
+              <w:rPr>
+                <w:color w:val="00B050"/>
+              </w:rPr>
+              <w:t>’improper service’</w:t>
+            </w:r>
+            <w:r>
+              <w:rPr>
+                <w:color w:val="00B050"/>
+              </w:rPr>
+              <w:t xml:space="preserve">, </w:t>
+            </w:r>
+            <w:r>
+              <w:rPr>
+                <w:color w:val="00B050"/>
+              </w:rPr>
+              <w:t>'</w:t>
+            </w:r>
+            <w:r>
+              <w:rPr>
+                <w:color w:val="00B050"/>
+              </w:rPr>
+              <w:t>case in 2 states</w:t>
+            </w:r>
+            <w:r>
+              <w:rPr>
+                <w:color w:val="00B050"/>
+              </w:rPr>
+              <w:t>')</w:t>
+            </w:r>
+            <w:r>
+              <w:rPr>
+                <w:color w:val="00B050"/>
+              </w:rPr>
+              <w:t xml:space="preserve"> and </w:t>
+            </w:r>
+            <w:proofErr w:type="spellStart"/>
+            <w:r>
+              <w:rPr>
+                <w:color w:val="00B050"/>
+              </w:rPr>
+              <w:t>stage_of_other_case</w:t>
+            </w:r>
+            <w:proofErr w:type="spellEnd"/>
+            <w:r>
+              <w:rPr>
+                <w:color w:val="00B050"/>
+              </w:rPr>
+              <w:t xml:space="preserve"> == ‘ended with no order’</w:t>
+            </w:r>
+            <w:r>
+              <w:rPr>
+                <w:color w:val="92D050"/>
+              </w:rPr>
+              <w:t>)</w:t>
+            </w:r>
+            <w:r>
+              <w:rPr>
+                <w:color w:val="FFC000"/>
+              </w:rPr>
+              <w:t>)</w:t>
+            </w:r>
+            <w:r>
+              <w:rPr>
+                <w:color w:val="FF0000"/>
+              </w:rPr>
+              <w:t xml:space="preserve"> </w:t>
+            </w:r>
+            <w:r>
+              <w:rPr>
+                <w:color w:val="FFC000"/>
+              </w:rPr>
+              <w:t xml:space="preserve">and </w:t>
+            </w:r>
+            <w:proofErr w:type="spellStart"/>
+            <w:r>
+              <w:rPr>
+                <w:color w:val="FFC000"/>
+              </w:rPr>
+              <w:t>type_of_response.all_false</w:t>
+            </w:r>
+            <w:proofErr w:type="spellEnd"/>
+            <w:r>
+              <w:rPr>
+                <w:color w:val="FFC000"/>
+              </w:rPr>
+              <w:t>(‘default)</w:t>
+            </w:r>
+            <w:r>
+              <w:rPr>
+                <w:color w:val="FFC000"/>
+              </w:rPr>
+              <w:t xml:space="preserve"> </w:t>
+            </w:r>
+            <w:r>
+              <w:rPr>
+                <w:color w:val="FFC000"/>
+              </w:rPr>
+              <w:t xml:space="preserve">and not </w:t>
+            </w:r>
+            <w:proofErr w:type="spellStart"/>
+            <w:r>
+              <w:rPr>
+                <w:color w:val="FFC000"/>
+              </w:rPr>
+              <w:t>proper_service</w:t>
+            </w:r>
+            <w:proofErr w:type="spellEnd"/>
+            <w:r>
+              <w:rPr>
+                <w:color w:val="FF0000"/>
+              </w:rPr>
+              <w:t xml:space="preserve">) </w:t>
+            </w:r>
+            <w:r>
+              <w:rPr>
+                <w:color w:val="FF0000"/>
+              </w:rPr>
+              <w:t>%}</w:t>
             </w:r>
           </w:p>
         </w:tc>
@@ -1511,7 +1728,14 @@
               <w:rPr>
                 <w:shd w:val="clear" w:color="auto" w:fill="FFFFFF"/>
               </w:rPr>
-              <w:t>{%tr if type_of_response['default'] %}</w:t>
+              <w:t xml:space="preserve">{%tr if </w:t>
+            </w:r>
+            <w:r>
+              <w:rPr>
+                <w:shd w:val="clear" w:color="auto" w:fill="FFFFFF"/>
+              </w:rPr>
+              <w:lastRenderedPageBreak/>
+              <w:t>type_of_response['default'] %}</w:t>
             </w:r>
           </w:p>
         </w:tc>
@@ -1537,6 +1761,7 @@
             </w:pPr>
             <w:proofErr w:type="spellStart"/>
             <w:r>
+              <w:lastRenderedPageBreak/>
               <w:t>default_options_step</w:t>
             </w:r>
             <w:proofErr w:type="spellEnd"/>
@@ -1694,7 +1919,6 @@
               <w:rPr>
                 <w:color w:val="FFC000"/>
               </w:rPr>
-              <w:lastRenderedPageBreak/>
               <w:t>(</w:t>
             </w:r>
             <w:r>
@@ -1763,7 +1987,6 @@
             </w:pPr>
             <w:proofErr w:type="spellStart"/>
             <w:r>
-              <w:lastRenderedPageBreak/>
               <w:t>divorce_legal_separation_diff_step</w:t>
             </w:r>
             <w:proofErr w:type="spellEnd"/>
@@ -1902,6 +2125,7 @@
               <w:ind w:left="404"/>
             </w:pPr>
             <w:r>
+              <w:lastRenderedPageBreak/>
               <w:t>Issue a parenting plan that states:</w:t>
             </w:r>
           </w:p>
@@ -1966,7 +2190,6 @@
               <w:ind w:left="404"/>
             </w:pPr>
             <w:r>
-              <w:lastRenderedPageBreak/>
               <w:t>If you are not sure what you want, you can proceed with a legal separation, and change it to a divorce at any time.</w:t>
             </w:r>
           </w:p>
@@ -2617,7 +2840,15 @@
                 <w:sz w:val="20"/>
                 <w:szCs w:val="20"/>
               </w:rPr>
-              <w:t xml:space="preserve">['case in 2 states'] and </w:t>
+              <w:t xml:space="preserve">['case in </w:t>
+            </w:r>
+            <w:r>
+              <w:rPr>
+                <w:sz w:val="20"/>
+                <w:szCs w:val="20"/>
+              </w:rPr>
+              <w:lastRenderedPageBreak/>
+              <w:t xml:space="preserve">2 states'] and </w:t>
             </w:r>
             <w:r>
               <w:rPr>
@@ -2919,6 +3150,7 @@
               <w:pStyle w:val="Body"/>
             </w:pPr>
             <w:r>
+              <w:lastRenderedPageBreak/>
               <w:t>want_help_to_agree_step</w:t>
             </w:r>
           </w:p>
@@ -2949,7 +3181,6 @@
               <w:outlineLvl w:val="1"/>
             </w:pPr>
             <w:r>
-              <w:lastRenderedPageBreak/>
               <w:t>{{ want_help_to_agree</w:t>
             </w:r>
             <w:r>
@@ -3305,7 +3536,11 @@
               <w:pStyle w:val="Body"/>
             </w:pPr>
             <w:r>
-              <w:t xml:space="preserve">{%tr if (type_of_response['wrong state'] and not jurisdiction) or (type_of_response['case in 2 states'] and stage_of_other_case </w:t>
+              <w:t>{%tr if (type_of_response['wr</w:t>
+            </w:r>
+            <w:r>
+              <w:lastRenderedPageBreak/>
+              <w:t xml:space="preserve">ong state'] and not jurisdiction) or (type_of_response['case in 2 states'] and stage_of_other_case </w:t>
             </w:r>
             <w:r>
               <w:t>in(</w:t>
@@ -3358,6 +3593,7 @@
             </w:pPr>
             <w:proofErr w:type="spellStart"/>
             <w:r>
+              <w:lastRenderedPageBreak/>
               <w:t>dismiss_step</w:t>
             </w:r>
             <w:proofErr w:type="spellEnd"/>
@@ -3390,11 +3626,7 @@
             </w:pPr>
             <w:bookmarkStart w:id="2" w:name="_Hlk226106692"/>
             <w:r>
-              <w:t xml:space="preserve">{{ </w:t>
-            </w:r>
-            <w:r>
-              <w:lastRenderedPageBreak/>
-              <w:t>dismiss_step.subject }}</w:t>
+              <w:t>{{ dismiss_step.subject }}</w:t>
             </w:r>
           </w:p>
         </w:tc>
@@ -3428,7 +3660,6 @@
               <w:spacing w:before="240" w:after="100"/>
             </w:pPr>
             <w:r>
-              <w:lastRenderedPageBreak/>
               <w:t>{{p (include_docx_template("docassemble.AKA2JBranding:dismiss_content.docx")) }}</w:t>
             </w:r>
           </w:p>
@@ -3460,7 +3691,6 @@
               <w:spacing w:before="0" w:after="0"/>
             </w:pPr>
             <w:r>
-              <w:lastRenderedPageBreak/>
               <w:t>{%tr endif %}</w:t>
             </w:r>
           </w:p>
@@ -3913,6 +4143,7 @@
             </w:r>
             <w:proofErr w:type="spellStart"/>
             <w:r>
+              <w:lastRenderedPageBreak/>
               <w:t>sign_step.subject</w:t>
             </w:r>
             <w:proofErr w:type="spellEnd"/>
@@ -3948,6 +4179,7 @@
               <w:spacing w:before="0" w:beforeAutospacing="0" w:after="60" w:afterAutospacing="0"/>
             </w:pPr>
             <w:r>
+              <w:lastRenderedPageBreak/>
               <w:t>{{p (include_docx_template("docassemble.AKA2JBranding:sign_content.docx")) }}</w:t>
             </w:r>
           </w:p>
@@ -3977,6 +4209,7 @@
               <w:pStyle w:val="Body"/>
             </w:pPr>
             <w:r>
+              <w:lastRenderedPageBreak/>
               <w:t>{%tr endif %}</w:t>
             </w:r>
           </w:p>
@@ -4085,7 +4318,6 @@
             </w:r>
             <w:proofErr w:type="spellStart"/>
             <w:r>
-              <w:lastRenderedPageBreak/>
               <w:t>truefiling_file_and_serve_step.subject</w:t>
             </w:r>
             <w:proofErr w:type="spellEnd"/>
@@ -4120,7 +4352,6 @@
               <w:pStyle w:val="Body"/>
             </w:pPr>
             <w:r>
-              <w:lastRenderedPageBreak/>
               <w:t>{{p (include_docx_template("docassemble.AKA2JBranding:truefiling_file_and_serve_content.docx")) }}</w:t>
             </w:r>
           </w:p>
@@ -4154,7 +4385,6 @@
               </w:rPr>
             </w:pPr>
             <w:r>
-              <w:lastRenderedPageBreak/>
               <w:t>{{ truefiling_serve_step.subject }}</w:t>
             </w:r>
           </w:p>
@@ -4307,7 +4537,11 @@
               <w:t>(</w:t>
             </w:r>
             <w:r>
-              <w:t>not ((type_of_response['default'] and stage_of_default == 'judgment entered') or (type_of_response['case in 2 states'] and stage_of_other_case == 'ended with order') or (type_of_response.all_true('wrong state', 'default') and user_need == 'answer custody' and not jurisdiction))</w:t>
+              <w:t xml:space="preserve">not ((type_of_response['default'] and stage_of_default == 'judgment entered') or (type_of_response['case in 2 states'] and stage_of_other_case == 'ended with order') or (type_of_response.all_true('wrong state', 'default') and user_need == 'answer custody' and not </w:t>
+            </w:r>
+            <w:r>
+              <w:lastRenderedPageBreak/>
+              <w:t>jurisdiction))</w:t>
             </w:r>
             <w:r>
               <w:rPr>
@@ -4532,14 +4766,7 @@
               <w:rPr>
                 <w:color w:val="FF0000"/>
               </w:rPr>
-              <w:t xml:space="preserve">{%tr if type_of_response.any_true() and not </w:t>
-            </w:r>
-            <w:r>
-              <w:rPr>
-                <w:color w:val="FF0000"/>
-              </w:rPr>
-              <w:lastRenderedPageBreak/>
-              <w:t>(type_of_response.all_true('stay married', exclusive = True)) %}</w:t>
+              <w:t>{%tr if type_of_response.any_true() and not (type_of_response.all_true('stay married', exclusive = True)) %}</w:t>
             </w:r>
           </w:p>
         </w:tc>
@@ -4840,6 +5067,7 @@
               <w:rPr>
                 <w:rFonts w:eastAsia="Calibri"/>
               </w:rPr>
+              <w:lastRenderedPageBreak/>
               <w:t xml:space="preserve">{{ </w:t>
             </w:r>
             <w:proofErr w:type="spellStart"/>
@@ -5039,11 +5267,7 @@
               </w:rPr>
             </w:pPr>
             <w:r>
-              <w:t xml:space="preserve">{{ </w:t>
-            </w:r>
-            <w:r>
-              <w:lastRenderedPageBreak/>
-              <w:t>answer_domestic_violence_step.subject }}</w:t>
+              <w:t>{{ answer_domestic_violence_step.subject }}</w:t>
             </w:r>
           </w:p>
         </w:tc>
@@ -5073,7 +5297,6 @@
               <w:pStyle w:val="Body"/>
             </w:pPr>
             <w:r>
-              <w:lastRenderedPageBreak/>
               <w:t>{{p (include_docx_template("docassemble.AKA2JBranding:answer_domestic_violence_content.docx")) }}</w:t>
             </w:r>
           </w:p>
@@ -5110,7 +5333,6 @@
               <w:rPr>
                 <w:shd w:val="clear" w:color="auto" w:fill="FFFFFF"/>
               </w:rPr>
-              <w:lastRenderedPageBreak/>
               <w:t>{%tr endif %}</w:t>
             </w:r>
           </w:p>
@@ -5331,7 +5553,15 @@
                 <w:color w:val="92D050"/>
                 <w:shd w:val="clear" w:color="auto" w:fill="FFFFFF"/>
               </w:rPr>
-              <w:t>not minor_children and wife_is_pregnant == 'not husband'</w:t>
+              <w:t xml:space="preserve">not minor_children and wife_is_pregnant </w:t>
+            </w:r>
+            <w:r>
+              <w:rPr>
+                <w:color w:val="92D050"/>
+                <w:shd w:val="clear" w:color="auto" w:fill="FFFFFF"/>
+              </w:rPr>
+              <w:lastRenderedPageBreak/>
+              <w:t>== 'not husband'</w:t>
             </w:r>
             <w:r>
               <w:rPr>
@@ -5371,6 +5601,7 @@
             </w:pPr>
             <w:proofErr w:type="spellStart"/>
             <w:r>
+              <w:lastRenderedPageBreak/>
               <w:t>paternity_step</w:t>
             </w:r>
             <w:proofErr w:type="spellEnd"/>
@@ -5529,11 +5760,7 @@
               </w:rPr>
             </w:pPr>
             <w:r>
-              <w:t>{{ get_help.subje</w:t>
-            </w:r>
-            <w:r>
-              <w:lastRenderedPageBreak/>
-              <w:t>ct }}</w:t>
+              <w:t>{{ get_help.subject }}</w:t>
             </w:r>
           </w:p>
         </w:tc>
@@ -5564,11 +5791,7 @@
               <w:spacing w:before="100" w:after="100"/>
             </w:pPr>
             <w:r>
-              <w:t>{{p (include_docx_template("docassemble.AKA2JBranding:get_help_cont</w:t>
-            </w:r>
-            <w:r>
-              <w:lastRenderedPageBreak/>
-              <w:t>ent.docx")) }}</w:t>
+              <w:t>{{p (include_docx_template("docassemble.AKA2JBranding:get_help_content.docx")) }}</w:t>
             </w:r>
           </w:p>
         </w:tc>
@@ -8532,7 +8755,7 @@
     <w:lsdException w:name="Table Web 2" w:semiHidden="1" w:unhideWhenUsed="1"/>
     <w:lsdException w:name="Table Web 3" w:semiHidden="1" w:unhideWhenUsed="1"/>
     <w:lsdException w:name="Balloon Text" w:semiHidden="1" w:unhideWhenUsed="1"/>
-    <w:lsdException w:name="Table Grid" w:semiHidden="1" w:uiPriority="39" w:unhideWhenUsed="1"/>
+    <w:lsdException w:name="Table Grid" w:uiPriority="39"/>
     <w:lsdException w:name="Table Theme" w:semiHidden="1" w:unhideWhenUsed="1"/>
     <w:lsdException w:name="Placeholder Text" w:semiHidden="1"/>
     <w:lsdException w:name="No Spacing" w:uiPriority="1" w:qFormat="1"/>

</xml_diff>

<commit_message>
default in []s missing 2nd ' in condition for decide after improper service content docx
</commit_message>
<xml_diff>
--- a/docassemble/RespondingCaseToEndYourMarriageActionPlan/data/templates/responding_ending_marriage_action_plan.docx
+++ b/docassemble/RespondingCaseToEndYourMarriageActionPlan/data/templates/responding_ending_marriage_action_plan.docx
@@ -463,7 +463,7 @@
                 </mc:Choice>
                 <mc:Fallback>
                   <w:pict>
-                    <v:group w14:anchorId="5BBCD5F5" id="Group 1" o:spid="_x0000_s1026" style="position:absolute;margin-left:0;margin-top:13.25pt;width:59.8pt;height:54.75pt;z-index:-503316478;mso-wrap-distance-right:25.2pt" coordsize="0,0" o:gfxdata="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">
+                    <v:group w14:anchorId="07D319D7" id="Group 1" o:spid="_x0000_s1026" style="position:absolute;margin-left:0;margin-top:13.25pt;width:59.8pt;height:54.75pt;z-index:-503316478;mso-wrap-distance-right:25.2pt" coordsize="0,0" o:gfxdata="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">
                       <v:group id="Group 2" o:spid="_x0000_s1027" style="position:absolute;width:591120;height:694800" coordsize="0,0" o:gfxdata="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">
                         <v:shape id="Freeform 3" o:spid="_x0000_s1028" style="position:absolute;top:41400;width:591120;height:653400;visibility:visible;mso-wrap-style:square;v-text-anchor:top" coordsize="915,1071" o:gfxdata="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" path="m85,89l85,,914,r,985l824,985t,85l,1070,,92r573,l573,337r246,l824,1070xe" filled="f" strokecolor="#333" strokeweight=".44mm">
                           <v:path arrowok="t"/>
@@ -560,7 +560,31 @@
               <w:spacing w:before="0" w:after="0"/>
             </w:pPr>
             <w:r>
-              <w:t>{%tr if user_need == 'answer divorce' and type_of_response['stay married'] %}</w:t>
+              <w:t xml:space="preserve">{%tr if user_need == </w:t>
+            </w:r>
+            <w:r>
+              <w:t>‘</w:t>
+            </w:r>
+            <w:r>
+              <w:t>answer divorce</w:t>
+            </w:r>
+            <w:r>
+              <w:t>’</w:t>
+            </w:r>
+            <w:r>
+              <w:t xml:space="preserve"> and type_of_response[</w:t>
+            </w:r>
+            <w:r>
+              <w:t>‘</w:t>
+            </w:r>
+            <w:r>
+              <w:t>stay married</w:t>
+            </w:r>
+            <w:r>
+              <w:t>’</w:t>
+            </w:r>
+            <w:r>
+              <w:t>] %}</w:t>
             </w:r>
           </w:p>
         </w:tc>
@@ -740,7 +764,103 @@
               <w:rPr>
                 <w:shd w:val="clear" w:color="auto" w:fill="FFFFFF"/>
               </w:rPr>
-              <w:t>{%tr if type_of_response['wrong state'] or (type_of_response['case in 2 states'] and stage_of_other_case in('still going', 'ended with no order')) %}</w:t>
+              <w:t>{%tr if type_of_response[</w:t>
+            </w:r>
+            <w:r>
+              <w:rPr>
+                <w:shd w:val="clear" w:color="auto" w:fill="FFFFFF"/>
+              </w:rPr>
+              <w:t>‘</w:t>
+            </w:r>
+            <w:r>
+              <w:rPr>
+                <w:shd w:val="clear" w:color="auto" w:fill="FFFFFF"/>
+              </w:rPr>
+              <w:t>wrong state</w:t>
+            </w:r>
+            <w:r>
+              <w:rPr>
+                <w:shd w:val="clear" w:color="auto" w:fill="FFFFFF"/>
+              </w:rPr>
+              <w:t>’</w:t>
+            </w:r>
+            <w:r>
+              <w:rPr>
+                <w:shd w:val="clear" w:color="auto" w:fill="FFFFFF"/>
+              </w:rPr>
+              <w:t>] or (type_of_response[</w:t>
+            </w:r>
+            <w:r>
+              <w:rPr>
+                <w:shd w:val="clear" w:color="auto" w:fill="FFFFFF"/>
+              </w:rPr>
+              <w:t>‘</w:t>
+            </w:r>
+            <w:r>
+              <w:rPr>
+                <w:shd w:val="clear" w:color="auto" w:fill="FFFFFF"/>
+              </w:rPr>
+              <w:t>case in 2 states</w:t>
+            </w:r>
+            <w:r>
+              <w:rPr>
+                <w:shd w:val="clear" w:color="auto" w:fill="FFFFFF"/>
+              </w:rPr>
+              <w:t>’</w:t>
+            </w:r>
+            <w:r>
+              <w:rPr>
+                <w:shd w:val="clear" w:color="auto" w:fill="FFFFFF"/>
+              </w:rPr>
+              <w:t>] and stage_of_other_case in(</w:t>
+            </w:r>
+            <w:r>
+              <w:rPr>
+                <w:shd w:val="clear" w:color="auto" w:fill="FFFFFF"/>
+              </w:rPr>
+              <w:t>‘</w:t>
+            </w:r>
+            <w:r>
+              <w:rPr>
+                <w:shd w:val="clear" w:color="auto" w:fill="FFFFFF"/>
+              </w:rPr>
+              <w:t>still going</w:t>
+            </w:r>
+            <w:r>
+              <w:rPr>
+                <w:shd w:val="clear" w:color="auto" w:fill="FFFFFF"/>
+              </w:rPr>
+              <w:t>’</w:t>
+            </w:r>
+            <w:r>
+              <w:rPr>
+                <w:shd w:val="clear" w:color="auto" w:fill="FFFFFF"/>
+              </w:rPr>
+              <w:t xml:space="preserve">, </w:t>
+            </w:r>
+            <w:r>
+              <w:rPr>
+                <w:shd w:val="clear" w:color="auto" w:fill="FFFFFF"/>
+              </w:rPr>
+              <w:t>‘</w:t>
+            </w:r>
+            <w:r>
+              <w:rPr>
+                <w:shd w:val="clear" w:color="auto" w:fill="FFFFFF"/>
+              </w:rPr>
+              <w:t>ended with no order</w:t>
+            </w:r>
+            <w:r>
+              <w:rPr>
+                <w:shd w:val="clear" w:color="auto" w:fill="FFFFFF"/>
+              </w:rPr>
+              <w:t>’</w:t>
+            </w:r>
+            <w:r>
+              <w:rPr>
+                <w:shd w:val="clear" w:color="auto" w:fill="FFFFFF"/>
+              </w:rPr>
+              <w:t>)) %}</w:t>
             </w:r>
           </w:p>
         </w:tc>
@@ -767,7 +887,31 @@
               <w:rPr>
                 <w:shd w:val="clear" w:color="auto" w:fill="92D050"/>
               </w:rPr>
-              <w:t xml:space="preserve">Green = thinks wrong place; no other case or (other_case and ongoing == 'no') </w:t>
+              <w:t xml:space="preserve">Green = thinks wrong place; no other case or (other_case and ongoing == </w:t>
+            </w:r>
+            <w:r>
+              <w:rPr>
+                <w:shd w:val="clear" w:color="auto" w:fill="92D050"/>
+              </w:rPr>
+              <w:t>‘</w:t>
+            </w:r>
+            <w:r>
+              <w:rPr>
+                <w:shd w:val="clear" w:color="auto" w:fill="92D050"/>
+              </w:rPr>
+              <w:t>no</w:t>
+            </w:r>
+            <w:r>
+              <w:rPr>
+                <w:shd w:val="clear" w:color="auto" w:fill="92D050"/>
+              </w:rPr>
+              <w:t>’</w:t>
+            </w:r>
+            <w:r>
+              <w:rPr>
+                <w:shd w:val="clear" w:color="auto" w:fill="92D050"/>
+              </w:rPr>
+              <w:t xml:space="preserve">) </w:t>
             </w:r>
           </w:p>
           <w:p>
@@ -958,7 +1102,31 @@
               <w:spacing w:before="0" w:after="0"/>
             </w:pPr>
             <w:r>
-              <w:t>{%tr if type_of_response['improper service'] or type_of_response['default'] %}</w:t>
+              <w:t>{%tr if type_of_response[</w:t>
+            </w:r>
+            <w:r>
+              <w:t>‘</w:t>
+            </w:r>
+            <w:r>
+              <w:t>improper service</w:t>
+            </w:r>
+            <w:r>
+              <w:t>’</w:t>
+            </w:r>
+            <w:r>
+              <w:t>] or type_of_response[</w:t>
+            </w:r>
+            <w:r>
+              <w:t>‘</w:t>
+            </w:r>
+            <w:r>
+              <w:t>default</w:t>
+            </w:r>
+            <w:r>
+              <w:t>’</w:t>
+            </w:r>
+            <w:r>
+              <w:t>] %}</w:t>
             </w:r>
           </w:p>
         </w:tc>
@@ -1157,19 +1325,57 @@
               <w:pStyle w:val="Body"/>
               <w:spacing w:before="0" w:after="0"/>
               <w:rPr>
-                <w:highlight w:val="white"/>
+                <w:color w:val="00B050"/>
               </w:rPr>
             </w:pPr>
             <w:r>
               <w:rPr>
                 <w:color w:val="FF0000"/>
               </w:rPr>
-              <w:t>{%tr if type_of_response.all_true('improper service', exclusive = True)</w:t>
-            </w:r>
+              <w:t xml:space="preserve">{%tr if </w:t>
+            </w:r>
+            <w:proofErr w:type="spellStart"/>
             <w:r>
               <w:rPr>
                 <w:color w:val="FF0000"/>
               </w:rPr>
+              <w:t>type_of_response.all_true</w:t>
+            </w:r>
+            <w:proofErr w:type="spellEnd"/>
+            <w:r>
+              <w:rPr>
+                <w:color w:val="FF0000"/>
+              </w:rPr>
+              <w:t>(</w:t>
+            </w:r>
+            <w:r>
+              <w:rPr>
+                <w:color w:val="FF0000"/>
+              </w:rPr>
+              <w:t>‘</w:t>
+            </w:r>
+            <w:r>
+              <w:rPr>
+                <w:color w:val="FF0000"/>
+              </w:rPr>
+              <w:t>improper service</w:t>
+            </w:r>
+            <w:r>
+              <w:rPr>
+                <w:color w:val="FF0000"/>
+              </w:rPr>
+              <w:t>’</w:t>
+            </w:r>
+            <w:r>
+              <w:rPr>
+                <w:color w:val="FF0000"/>
+              </w:rPr>
+              <w:t>, exclusive = True)</w:t>
+            </w:r>
+            <w:r>
+              <w:rPr>
+                <w:color w:val="FF0000"/>
+              </w:rPr>
               <w:t xml:space="preserve"> or (</w:t>
             </w:r>
             <w:r>
@@ -1183,170 +1389,234 @@
               <w:rPr>
                 <w:color w:val="92D050"/>
               </w:rPr>
-              <w:t>type_of_response</w:t>
-            </w:r>
+              <w:t>type_of_response.all_true</w:t>
+            </w:r>
+            <w:proofErr w:type="spellEnd"/>
             <w:r>
               <w:rPr>
                 <w:color w:val="92D050"/>
               </w:rPr>
-              <w:t>.all_true</w:t>
+              <w:t>(</w:t>
+            </w:r>
+            <w:r>
+              <w:rPr>
+                <w:color w:val="92D050"/>
+              </w:rPr>
+              <w:t>‘</w:t>
+            </w:r>
+            <w:r>
+              <w:rPr>
+                <w:color w:val="92D050"/>
+              </w:rPr>
+              <w:t>improper service</w:t>
+            </w:r>
+            <w:r>
+              <w:rPr>
+                <w:color w:val="92D050"/>
+              </w:rPr>
+              <w:t>’</w:t>
+            </w:r>
+            <w:r>
+              <w:rPr>
+                <w:color w:val="92D050"/>
+              </w:rPr>
+              <w:t xml:space="preserve">, </w:t>
+            </w:r>
+            <w:r>
+              <w:rPr>
+                <w:color w:val="92D050"/>
+              </w:rPr>
+              <w:t>‘</w:t>
+            </w:r>
+            <w:r>
+              <w:rPr>
+                <w:color w:val="92D050"/>
+              </w:rPr>
+              <w:t>wrong state</w:t>
+            </w:r>
+            <w:r>
+              <w:rPr>
+                <w:color w:val="92D050"/>
+              </w:rPr>
+              <w:t>’</w:t>
+            </w:r>
+            <w:r>
+              <w:rPr>
+                <w:color w:val="92D050"/>
+              </w:rPr>
+              <w:t>)</w:t>
+            </w:r>
+            <w:r>
+              <w:rPr>
+                <w:color w:val="FFC000"/>
+              </w:rPr>
+              <w:t xml:space="preserve"> </w:t>
+            </w:r>
+            <w:r>
+              <w:rPr>
+                <w:color w:val="92D050"/>
+              </w:rPr>
+              <w:t>or</w:t>
+            </w:r>
+            <w:r>
+              <w:rPr>
+                <w:color w:val="FFC000"/>
+              </w:rPr>
+              <w:t xml:space="preserve"> </w:t>
+            </w:r>
+            <w:r>
+              <w:rPr>
+                <w:color w:val="92D050"/>
+              </w:rPr>
+              <w:t>(</w:t>
+            </w:r>
+            <w:proofErr w:type="spellStart"/>
+            <w:r>
+              <w:rPr>
+                <w:color w:val="00B050"/>
+              </w:rPr>
+              <w:t>type_of_response.all_true</w:t>
             </w:r>
             <w:proofErr w:type="spellEnd"/>
             <w:r>
               <w:rPr>
+                <w:color w:val="00B050"/>
+              </w:rPr>
+              <w:t>(</w:t>
+            </w:r>
+            <w:r>
+              <w:rPr>
+                <w:color w:val="00B050"/>
+              </w:rPr>
+              <w:t>‘</w:t>
+            </w:r>
+            <w:r>
+              <w:rPr>
+                <w:color w:val="00B050"/>
+              </w:rPr>
+              <w:t>improper service</w:t>
+            </w:r>
+            <w:r>
+              <w:rPr>
+                <w:color w:val="00B050"/>
+              </w:rPr>
+              <w:t>’</w:t>
+            </w:r>
+            <w:r>
+              <w:rPr>
+                <w:color w:val="00B050"/>
+              </w:rPr>
+              <w:t xml:space="preserve">, </w:t>
+            </w:r>
+            <w:r>
+              <w:rPr>
+                <w:color w:val="00B050"/>
+              </w:rPr>
+              <w:t>‘</w:t>
+            </w:r>
+            <w:r>
+              <w:rPr>
+                <w:color w:val="00B050"/>
+              </w:rPr>
+              <w:t>case in 2 states</w:t>
+            </w:r>
+            <w:r>
+              <w:rPr>
+                <w:color w:val="00B050"/>
+              </w:rPr>
+              <w:t>’</w:t>
+            </w:r>
+            <w:r>
+              <w:rPr>
+                <w:color w:val="00B050"/>
+              </w:rPr>
+              <w:t>)</w:t>
+            </w:r>
+            <w:r>
+              <w:rPr>
+                <w:color w:val="00B050"/>
+              </w:rPr>
+              <w:t xml:space="preserve"> and stage_of_other_case == </w:t>
+            </w:r>
+            <w:r>
+              <w:rPr>
+                <w:color w:val="00B050"/>
+              </w:rPr>
+              <w:t>‘</w:t>
+            </w:r>
+            <w:r>
+              <w:rPr>
+                <w:color w:val="00B050"/>
+              </w:rPr>
+              <w:t>ended with no order</w:t>
+            </w:r>
+            <w:r>
+              <w:rPr>
+                <w:color w:val="00B050"/>
+              </w:rPr>
+              <w:t>’</w:t>
+            </w:r>
+            <w:r>
+              <w:rPr>
                 <w:color w:val="92D050"/>
               </w:rPr>
+              <w:t>)</w:t>
+            </w:r>
+            <w:r>
+              <w:rPr>
+                <w:color w:val="FFC000"/>
+              </w:rPr>
+              <w:t>)</w:t>
+            </w:r>
+            <w:r>
+              <w:rPr>
+                <w:color w:val="FF0000"/>
+              </w:rPr>
+              <w:t xml:space="preserve"> </w:t>
+            </w:r>
+            <w:r>
+              <w:rPr>
+                <w:color w:val="FFC000"/>
+              </w:rPr>
+              <w:t xml:space="preserve">and </w:t>
+            </w:r>
+            <w:proofErr w:type="spellStart"/>
+            <w:r>
+              <w:rPr>
+                <w:color w:val="FFC000"/>
+              </w:rPr>
+              <w:t>type_of_response.all_false</w:t>
+            </w:r>
+            <w:proofErr w:type="spellEnd"/>
+            <w:r>
+              <w:rPr>
+                <w:color w:val="FFC000"/>
+              </w:rPr>
               <w:t>(</w:t>
             </w:r>
             <w:r>
               <w:rPr>
-                <w:color w:val="92D050"/>
-              </w:rPr>
-              <w:t>’improper service’</w:t>
-            </w:r>
-            <w:r>
-              <w:rPr>
-                <w:color w:val="92D050"/>
-              </w:rPr>
-              <w:t xml:space="preserve">, </w:t>
-            </w:r>
-            <w:r>
-              <w:rPr>
-                <w:color w:val="92D050"/>
-              </w:rPr>
-              <w:t>'wrong state'</w:t>
-            </w:r>
-            <w:r>
-              <w:rPr>
-                <w:color w:val="92D050"/>
+                <w:color w:val="FFC000"/>
+              </w:rPr>
+              <w:t>‘</w:t>
+            </w:r>
+            <w:r>
+              <w:rPr>
+                <w:color w:val="FFC000"/>
+              </w:rPr>
+              <w:t>default</w:t>
+            </w:r>
+            <w:r>
+              <w:rPr>
+                <w:color w:val="FFC000"/>
+              </w:rPr>
+              <w:t>’</w:t>
+            </w:r>
+            <w:r>
+              <w:rPr>
+                <w:color w:val="FFC000"/>
               </w:rPr>
               <w:t>)</w:t>
-            </w:r>
-            <w:r>
-              <w:rPr>
-                <w:color w:val="FFC000"/>
-              </w:rPr>
-              <w:t xml:space="preserve"> </w:t>
-            </w:r>
-            <w:r>
-              <w:rPr>
-                <w:color w:val="92D050"/>
-              </w:rPr>
-              <w:t>or</w:t>
-            </w:r>
-            <w:r>
-              <w:rPr>
-                <w:color w:val="FFC000"/>
-              </w:rPr>
-              <w:t xml:space="preserve"> </w:t>
-            </w:r>
-            <w:r>
-              <w:rPr>
-                <w:color w:val="92D050"/>
-              </w:rPr>
-              <w:t>(</w:t>
-            </w:r>
-            <w:proofErr w:type="spellStart"/>
-            <w:r>
-              <w:rPr>
-                <w:color w:val="00B050"/>
-              </w:rPr>
-              <w:t>type_of_response.all_true</w:t>
-            </w:r>
-            <w:proofErr w:type="spellEnd"/>
-            <w:r>
-              <w:rPr>
-                <w:color w:val="00B050"/>
-              </w:rPr>
-              <w:t>(</w:t>
-            </w:r>
-            <w:r>
-              <w:rPr>
-                <w:color w:val="00B050"/>
-              </w:rPr>
-              <w:t>’improper service’</w:t>
-            </w:r>
-            <w:r>
-              <w:rPr>
-                <w:color w:val="00B050"/>
-              </w:rPr>
-              <w:t xml:space="preserve">, </w:t>
-            </w:r>
-            <w:r>
-              <w:rPr>
-                <w:color w:val="00B050"/>
-              </w:rPr>
-              <w:t>'</w:t>
-            </w:r>
-            <w:r>
-              <w:rPr>
-                <w:color w:val="00B050"/>
-              </w:rPr>
-              <w:t>case in 2 states</w:t>
-            </w:r>
-            <w:r>
-              <w:rPr>
-                <w:color w:val="00B050"/>
-              </w:rPr>
-              <w:t>')</w:t>
-            </w:r>
-            <w:r>
-              <w:rPr>
-                <w:color w:val="00B050"/>
-              </w:rPr>
-              <w:t xml:space="preserve"> and </w:t>
-            </w:r>
-            <w:proofErr w:type="spellStart"/>
-            <w:r>
-              <w:rPr>
-                <w:color w:val="00B050"/>
-              </w:rPr>
-              <w:t>stage_of_other_case</w:t>
-            </w:r>
-            <w:proofErr w:type="spellEnd"/>
-            <w:r>
-              <w:rPr>
-                <w:color w:val="00B050"/>
-              </w:rPr>
-              <w:t xml:space="preserve"> == ‘ended with no order’</w:t>
-            </w:r>
-            <w:r>
-              <w:rPr>
-                <w:color w:val="92D050"/>
-              </w:rPr>
-              <w:t>)</w:t>
-            </w:r>
-            <w:r>
-              <w:rPr>
-                <w:color w:val="FFC000"/>
-              </w:rPr>
-              <w:t>)</w:t>
-            </w:r>
-            <w:r>
-              <w:rPr>
-                <w:color w:val="FF0000"/>
-              </w:rPr>
-              <w:t xml:space="preserve"> </w:t>
-            </w:r>
-            <w:r>
-              <w:rPr>
-                <w:color w:val="FFC000"/>
-              </w:rPr>
-              <w:t xml:space="preserve">and </w:t>
-            </w:r>
-            <w:proofErr w:type="spellStart"/>
-            <w:r>
-              <w:rPr>
-                <w:color w:val="FFC000"/>
-              </w:rPr>
-              <w:t>type_of_response.all_false</w:t>
-            </w:r>
-            <w:proofErr w:type="spellEnd"/>
-            <w:r>
-              <w:rPr>
-                <w:color w:val="FFC000"/>
-              </w:rPr>
-              <w:t>(‘default)</w:t>
             </w:r>
             <w:r>
               <w:rPr>
@@ -1554,7 +1824,31 @@
               <w:spacing w:before="0" w:after="0"/>
             </w:pPr>
             <w:r>
-              <w:t>{%tr if type_of_response['case in 2 states'] and stage_of_other_case == 'still going' %}</w:t>
+              <w:t>{%tr if type_of_response[</w:t>
+            </w:r>
+            <w:r>
+              <w:t>‘</w:t>
+            </w:r>
+            <w:r>
+              <w:t>case in 2 states</w:t>
+            </w:r>
+            <w:r>
+              <w:t>’</w:t>
+            </w:r>
+            <w:r>
+              <w:t xml:space="preserve">] and stage_of_other_case == </w:t>
+            </w:r>
+            <w:r>
+              <w:t>‘</w:t>
+            </w:r>
+            <w:r>
+              <w:t>still going</w:t>
+            </w:r>
+            <w:r>
+              <w:t>’</w:t>
+            </w:r>
+            <w:r>
+              <w:t xml:space="preserve"> %}</w:t>
             </w:r>
           </w:p>
         </w:tc>
@@ -1735,7 +2029,31 @@
                 <w:shd w:val="clear" w:color="auto" w:fill="FFFFFF"/>
               </w:rPr>
               <w:lastRenderedPageBreak/>
-              <w:t>type_of_response['default'] %}</w:t>
+              <w:t>type_of_response[</w:t>
+            </w:r>
+            <w:r>
+              <w:rPr>
+                <w:shd w:val="clear" w:color="auto" w:fill="FFFFFF"/>
+              </w:rPr>
+              <w:t>‘</w:t>
+            </w:r>
+            <w:r>
+              <w:rPr>
+                <w:shd w:val="clear" w:color="auto" w:fill="FFFFFF"/>
+              </w:rPr>
+              <w:t>default</w:t>
+            </w:r>
+            <w:r>
+              <w:rPr>
+                <w:shd w:val="clear" w:color="auto" w:fill="FFFFFF"/>
+              </w:rPr>
+              <w:t>’</w:t>
+            </w:r>
+            <w:r>
+              <w:rPr>
+                <w:shd w:val="clear" w:color="auto" w:fill="FFFFFF"/>
+              </w:rPr>
+              <w:t>] %}</w:t>
             </w:r>
           </w:p>
         </w:tc>
@@ -1913,7 +2231,69 @@
               <w:rPr>
                 <w:color w:val="FF0000"/>
               </w:rPr>
-              <w:t xml:space="preserve">{%tr if user_need == 'answer divorce' and case_type == 'legal separation' and not </w:t>
+              <w:t xml:space="preserve">{%tr if user_need == </w:t>
+            </w:r>
+            <w:r>
+              <w:rPr>
+                <w:color w:val="FF0000"/>
+              </w:rPr>
+              <w:t>‘</w:t>
+            </w:r>
+            <w:r>
+              <w:rPr>
+                <w:color w:val="FF0000"/>
+              </w:rPr>
+              <w:t>answer divorce</w:t>
+            </w:r>
+            <w:r>
+              <w:rPr>
+                <w:color w:val="FF0000"/>
+              </w:rPr>
+              <w:t>’</w:t>
+            </w:r>
+            <w:r>
+              <w:rPr>
+                <w:color w:val="FF0000"/>
+              </w:rPr>
+              <w:t xml:space="preserve"> and </w:t>
+            </w:r>
+            <w:proofErr w:type="spellStart"/>
+            <w:r>
+              <w:rPr>
+                <w:color w:val="FF0000"/>
+              </w:rPr>
+              <w:t>case_type</w:t>
+            </w:r>
+            <w:proofErr w:type="spellEnd"/>
+            <w:r>
+              <w:rPr>
+                <w:color w:val="FF0000"/>
+              </w:rPr>
+              <w:t xml:space="preserve"> == </w:t>
+            </w:r>
+            <w:r>
+              <w:rPr>
+                <w:color w:val="FF0000"/>
+              </w:rPr>
+              <w:t>‘</w:t>
+            </w:r>
+            <w:r>
+              <w:rPr>
+                <w:color w:val="FF0000"/>
+              </w:rPr>
+              <w:t>legal separation</w:t>
+            </w:r>
+            <w:r>
+              <w:rPr>
+                <w:color w:val="FF0000"/>
+              </w:rPr>
+              <w:t>’</w:t>
+            </w:r>
+            <w:r>
+              <w:rPr>
+                <w:color w:val="FF0000"/>
+              </w:rPr>
+              <w:t xml:space="preserve"> and not </w:t>
             </w:r>
             <w:r>
               <w:rPr>
@@ -1925,7 +2305,49 @@
               <w:rPr>
                 <w:color w:val="92D050"/>
               </w:rPr>
-              <w:t>type_of_response[‘case in 2 states’] and stage_of_other_case == ‘ended with order’</w:t>
+              <w:t>type_of_response[</w:t>
+            </w:r>
+            <w:r>
+              <w:rPr>
+                <w:color w:val="92D050"/>
+              </w:rPr>
+              <w:t>‘</w:t>
+            </w:r>
+            <w:r>
+              <w:rPr>
+                <w:color w:val="92D050"/>
+              </w:rPr>
+              <w:t>case in 2 states</w:t>
+            </w:r>
+            <w:r>
+              <w:rPr>
+                <w:color w:val="92D050"/>
+              </w:rPr>
+              <w:t>’</w:t>
+            </w:r>
+            <w:r>
+              <w:rPr>
+                <w:color w:val="92D050"/>
+              </w:rPr>
+              <w:t xml:space="preserve">] and stage_of_other_case == </w:t>
+            </w:r>
+            <w:r>
+              <w:rPr>
+                <w:color w:val="92D050"/>
+              </w:rPr>
+              <w:t>‘</w:t>
+            </w:r>
+            <w:r>
+              <w:rPr>
+                <w:color w:val="92D050"/>
+              </w:rPr>
+              <w:t>ended with order</w:t>
+            </w:r>
+            <w:r>
+              <w:rPr>
+                <w:color w:val="92D050"/>
+              </w:rPr>
+              <w:t>’</w:t>
             </w:r>
             <w:r>
               <w:rPr>
@@ -1949,7 +2371,49 @@
               <w:rPr>
                 <w:color w:val="92D050"/>
               </w:rPr>
-              <w:t>type_of_response[‘default’] and stage_of_default == ‘judgment entered’</w:t>
+              <w:t>type_of_response[</w:t>
+            </w:r>
+            <w:r>
+              <w:rPr>
+                <w:color w:val="92D050"/>
+              </w:rPr>
+              <w:t>‘</w:t>
+            </w:r>
+            <w:r>
+              <w:rPr>
+                <w:color w:val="92D050"/>
+              </w:rPr>
+              <w:t>default</w:t>
+            </w:r>
+            <w:r>
+              <w:rPr>
+                <w:color w:val="92D050"/>
+              </w:rPr>
+              <w:t>’</w:t>
+            </w:r>
+            <w:r>
+              <w:rPr>
+                <w:color w:val="92D050"/>
+              </w:rPr>
+              <w:t xml:space="preserve">] and stage_of_default == </w:t>
+            </w:r>
+            <w:r>
+              <w:rPr>
+                <w:color w:val="92D050"/>
+              </w:rPr>
+              <w:t>‘</w:t>
+            </w:r>
+            <w:r>
+              <w:rPr>
+                <w:color w:val="92D050"/>
+              </w:rPr>
+              <w:t>judgment entered</w:t>
+            </w:r>
+            <w:r>
+              <w:rPr>
+                <w:color w:val="92D050"/>
+              </w:rPr>
+              <w:t>’</w:t>
             </w:r>
             <w:r>
               <w:rPr>
@@ -1961,7 +2425,45 @@
               <w:rPr>
                 <w:color w:val="FF0000"/>
               </w:rPr>
-              <w:t>and want_legal_separation == 'unsure' %}</w:t>
+              <w:t xml:space="preserve">and </w:t>
+            </w:r>
+            <w:proofErr w:type="spellStart"/>
+            <w:r>
+              <w:rPr>
+                <w:color w:val="FF0000"/>
+              </w:rPr>
+              <w:t>want_legal_separation</w:t>
+            </w:r>
+            <w:proofErr w:type="spellEnd"/>
+            <w:r>
+              <w:rPr>
+                <w:color w:val="FF0000"/>
+              </w:rPr>
+              <w:t xml:space="preserve"> == </w:t>
+            </w:r>
+            <w:r>
+              <w:rPr>
+                <w:color w:val="FF0000"/>
+              </w:rPr>
+              <w:t>‘</w:t>
+            </w:r>
+            <w:r>
+              <w:rPr>
+                <w:color w:val="FF0000"/>
+              </w:rPr>
+              <w:t>unsure</w:t>
+            </w:r>
+            <w:r>
+              <w:rPr>
+                <w:color w:val="FF0000"/>
+              </w:rPr>
+              <w:t>’</w:t>
+            </w:r>
+            <w:r>
+              <w:rPr>
+                <w:color w:val="FF0000"/>
+              </w:rPr>
+              <w:t xml:space="preserve"> %}</w:t>
             </w:r>
           </w:p>
         </w:tc>
@@ -2076,7 +2578,13 @@
               <w:t>Legal Separation Decree</w:t>
             </w:r>
             <w:r>
-              <w:t xml:space="preserve"> so if you need your spouse’s medical insurance, talk to a lawyer before the legal separation is finalized to understand your options for continued coverage.</w:t>
+              <w:t xml:space="preserve"> so if you need your spouse</w:t>
+            </w:r>
+            <w:r>
+              <w:t>’</w:t>
+            </w:r>
+            <w:r>
+              <w:t>s medical insurance, talk to a lawyer before the legal separation is finalized to understand your options for continued coverage.</w:t>
             </w:r>
           </w:p>
           <w:p>
@@ -2093,7 +2601,19 @@
               <w:t>Decree of Legal Separation</w:t>
             </w:r>
             <w:r>
-              <w:t>. You will still be married, but the court will {% if not minor_children and wife_is_pregnant == 'not pregnant' %}divide the property and debt earned or received during the marriage.{% else</w:t>
+              <w:t xml:space="preserve">. You will still be married, but the court will {% if not minor_children and wife_is_pregnant == </w:t>
+            </w:r>
+            <w:r>
+              <w:t>‘</w:t>
+            </w:r>
+            <w:r>
+              <w:t>not pregnant</w:t>
+            </w:r>
+            <w:r>
+              <w:t>’</w:t>
+            </w:r>
+            <w:r>
+              <w:t xml:space="preserve"> %}divide the property and debt earned or received during the marriage.{% else</w:t>
             </w:r>
             <w:r>
               <w:t xml:space="preserve"> </w:t>
@@ -2324,7 +2844,39 @@
                 <w:sz w:val="20"/>
                 <w:szCs w:val="20"/>
               </w:rPr>
-              <w:t xml:space="preserve"> == 'answer divorce' </w:t>
+              <w:t xml:space="preserve"> == </w:t>
+            </w:r>
+            <w:r>
+              <w:rPr>
+                <w:color w:val="FF0000"/>
+                <w:sz w:val="20"/>
+                <w:szCs w:val="20"/>
+              </w:rPr>
+              <w:t>‘</w:t>
+            </w:r>
+            <w:r>
+              <w:rPr>
+                <w:color w:val="FF0000"/>
+                <w:sz w:val="20"/>
+                <w:szCs w:val="20"/>
+              </w:rPr>
+              <w:t>answer divorce</w:t>
+            </w:r>
+            <w:r>
+              <w:rPr>
+                <w:color w:val="FF0000"/>
+                <w:sz w:val="20"/>
+                <w:szCs w:val="20"/>
+              </w:rPr>
+              <w:t>’</w:t>
+            </w:r>
+            <w:r>
+              <w:rPr>
+                <w:color w:val="FF0000"/>
+                <w:sz w:val="20"/>
+                <w:szCs w:val="20"/>
+              </w:rPr>
+              <w:t xml:space="preserve"> </w:t>
             </w:r>
             <w:r>
               <w:rPr>
@@ -2364,7 +2916,39 @@
                 <w:sz w:val="20"/>
                 <w:szCs w:val="20"/>
               </w:rPr>
-              <w:t xml:space="preserve">['stay married'] </w:t>
+              <w:t>[</w:t>
+            </w:r>
+            <w:r>
+              <w:rPr>
+                <w:color w:val="FF0000"/>
+                <w:sz w:val="20"/>
+                <w:szCs w:val="20"/>
+              </w:rPr>
+              <w:t>‘</w:t>
+            </w:r>
+            <w:r>
+              <w:rPr>
+                <w:color w:val="FF0000"/>
+                <w:sz w:val="20"/>
+                <w:szCs w:val="20"/>
+              </w:rPr>
+              <w:t>stay married</w:t>
+            </w:r>
+            <w:r>
+              <w:rPr>
+                <w:color w:val="FF0000"/>
+                <w:sz w:val="20"/>
+                <w:szCs w:val="20"/>
+              </w:rPr>
+              <w:t>’</w:t>
+            </w:r>
+            <w:r>
+              <w:rPr>
+                <w:color w:val="FF0000"/>
+                <w:sz w:val="20"/>
+                <w:szCs w:val="20"/>
+              </w:rPr>
+              <w:t xml:space="preserve">] </w:t>
             </w:r>
             <w:r>
               <w:rPr>
@@ -2404,14 +2988,40 @@
                 <w:sz w:val="20"/>
                 <w:szCs w:val="20"/>
               </w:rPr>
-              <w:t>'ak divorce case'</w:t>
-            </w:r>
+              <w:t>‘</w:t>
+            </w:r>
+            <w:proofErr w:type="spellStart"/>
             <w:r>
               <w:rPr>
                 <w:color w:val="FF0000"/>
                 <w:sz w:val="20"/>
                 <w:szCs w:val="20"/>
               </w:rPr>
+              <w:t>ak</w:t>
+            </w:r>
+            <w:proofErr w:type="spellEnd"/>
+            <w:r>
+              <w:rPr>
+                <w:color w:val="FF0000"/>
+                <w:sz w:val="20"/>
+                <w:szCs w:val="20"/>
+              </w:rPr>
+              <w:t xml:space="preserve"> divorce case</w:t>
+            </w:r>
+            <w:r>
+              <w:rPr>
+                <w:color w:val="FF0000"/>
+                <w:sz w:val="20"/>
+                <w:szCs w:val="20"/>
+              </w:rPr>
+              <w:t>’</w:t>
+            </w:r>
+            <w:r>
+              <w:rPr>
+                <w:color w:val="FF0000"/>
+                <w:sz w:val="20"/>
+                <w:szCs w:val="20"/>
+              </w:rPr>
               <w:t>]</w:t>
             </w:r>
             <w:r>
@@ -2438,6 +3048,7 @@
               </w:rPr>
               <w:t xml:space="preserve"> </w:t>
             </w:r>
+            <w:proofErr w:type="spellStart"/>
             <w:r>
               <w:rPr>
                 <w:color w:val="34A853"/>
@@ -2446,13 +3057,46 @@
               </w:rPr>
               <w:t>case_type</w:t>
             </w:r>
+            <w:proofErr w:type="spellEnd"/>
             <w:r>
               <w:rPr>
                 <w:color w:val="FF0000"/>
                 <w:sz w:val="20"/>
                 <w:szCs w:val="20"/>
               </w:rPr>
-              <w:t xml:space="preserve"> == 'legal separation' </w:t>
+              <w:t xml:space="preserve"> == </w:t>
+            </w:r>
+            <w:r>
+              <w:rPr>
+                <w:color w:val="FF0000"/>
+                <w:sz w:val="20"/>
+                <w:szCs w:val="20"/>
+              </w:rPr>
+              <w:t>‘</w:t>
+            </w:r>
+            <w:r>
+              <w:rPr>
+                <w:color w:val="FF0000"/>
+                <w:sz w:val="20"/>
+                <w:szCs w:val="20"/>
+              </w:rPr>
+              <w:t>legal separation</w:t>
+            </w:r>
+            <w:r>
+              <w:rPr>
+                <w:color w:val="FF0000"/>
+                <w:sz w:val="20"/>
+                <w:szCs w:val="20"/>
+              </w:rPr>
+              <w:t>’</w:t>
+            </w:r>
+            <w:r>
+              <w:rPr>
+                <w:color w:val="FF0000"/>
+                <w:sz w:val="20"/>
+                <w:szCs w:val="20"/>
+              </w:rPr>
+              <w:t xml:space="preserve"> </w:t>
             </w:r>
             <w:r>
               <w:rPr>
@@ -2470,6 +3114,7 @@
               </w:rPr>
               <w:t xml:space="preserve"> </w:t>
             </w:r>
+            <w:proofErr w:type="spellStart"/>
             <w:r>
               <w:rPr>
                 <w:color w:val="34A853"/>
@@ -2478,13 +3123,78 @@
               </w:rPr>
               <w:t>want_legal_separation</w:t>
             </w:r>
+            <w:proofErr w:type="spellEnd"/>
             <w:r>
               <w:rPr>
                 <w:color w:val="FF0000"/>
                 <w:sz w:val="20"/>
                 <w:szCs w:val="20"/>
               </w:rPr>
-              <w:t xml:space="preserve"> in('no', 'unsure') </w:t>
+              <w:t xml:space="preserve"> in(</w:t>
+            </w:r>
+            <w:r>
+              <w:rPr>
+                <w:color w:val="FF0000"/>
+                <w:sz w:val="20"/>
+                <w:szCs w:val="20"/>
+              </w:rPr>
+              <w:t>‘</w:t>
+            </w:r>
+            <w:r>
+              <w:rPr>
+                <w:color w:val="FF0000"/>
+                <w:sz w:val="20"/>
+                <w:szCs w:val="20"/>
+              </w:rPr>
+              <w:t>no</w:t>
+            </w:r>
+            <w:r>
+              <w:rPr>
+                <w:color w:val="FF0000"/>
+                <w:sz w:val="20"/>
+                <w:szCs w:val="20"/>
+              </w:rPr>
+              <w:t>’</w:t>
+            </w:r>
+            <w:r>
+              <w:rPr>
+                <w:color w:val="FF0000"/>
+                <w:sz w:val="20"/>
+                <w:szCs w:val="20"/>
+              </w:rPr>
+              <w:t xml:space="preserve">, </w:t>
+            </w:r>
+            <w:r>
+              <w:rPr>
+                <w:color w:val="FF0000"/>
+                <w:sz w:val="20"/>
+                <w:szCs w:val="20"/>
+              </w:rPr>
+              <w:t>‘</w:t>
+            </w:r>
+            <w:r>
+              <w:rPr>
+                <w:color w:val="FF0000"/>
+                <w:sz w:val="20"/>
+                <w:szCs w:val="20"/>
+              </w:rPr>
+              <w:t>unsure</w:t>
+            </w:r>
+            <w:r>
+              <w:rPr>
+                <w:color w:val="FF0000"/>
+                <w:sz w:val="20"/>
+                <w:szCs w:val="20"/>
+              </w:rPr>
+              <w:t>’</w:t>
+            </w:r>
+            <w:r>
+              <w:rPr>
+                <w:color w:val="FF0000"/>
+                <w:sz w:val="20"/>
+                <w:szCs w:val="20"/>
+              </w:rPr>
+              <w:t xml:space="preserve">) </w:t>
             </w:r>
             <w:r>
               <w:rPr>
@@ -2557,7 +3267,63 @@
                 <w:sz w:val="20"/>
                 <w:szCs w:val="20"/>
               </w:rPr>
-              <w:t>in('answer custody', 'answer divorce')</w:t>
+              <w:t>in(</w:t>
+            </w:r>
+            <w:r>
+              <w:rPr>
+                <w:sz w:val="20"/>
+                <w:szCs w:val="20"/>
+              </w:rPr>
+              <w:t>‘</w:t>
+            </w:r>
+            <w:r>
+              <w:rPr>
+                <w:sz w:val="20"/>
+                <w:szCs w:val="20"/>
+              </w:rPr>
+              <w:t>answer custody</w:t>
+            </w:r>
+            <w:r>
+              <w:rPr>
+                <w:sz w:val="20"/>
+                <w:szCs w:val="20"/>
+              </w:rPr>
+              <w:t>’</w:t>
+            </w:r>
+            <w:r>
+              <w:rPr>
+                <w:sz w:val="20"/>
+                <w:szCs w:val="20"/>
+              </w:rPr>
+              <w:t xml:space="preserve">, </w:t>
+            </w:r>
+            <w:r>
+              <w:rPr>
+                <w:sz w:val="20"/>
+                <w:szCs w:val="20"/>
+              </w:rPr>
+              <w:t>‘</w:t>
+            </w:r>
+            <w:r>
+              <w:rPr>
+                <w:sz w:val="20"/>
+                <w:szCs w:val="20"/>
+              </w:rPr>
+              <w:t>answer divorce</w:t>
+            </w:r>
+            <w:r>
+              <w:rPr>
+                <w:sz w:val="20"/>
+                <w:szCs w:val="20"/>
+              </w:rPr>
+              <w:t>’</w:t>
+            </w:r>
+            <w:r>
+              <w:rPr>
+                <w:sz w:val="20"/>
+                <w:szCs w:val="20"/>
+              </w:rPr>
+              <w:t>)</w:t>
             </w:r>
             <w:r>
               <w:rPr>
@@ -2652,7 +3418,7 @@
                 <w:sz w:val="20"/>
                 <w:szCs w:val="20"/>
               </w:rPr>
-              <w:t>'</w:t>
+              <w:t>‘</w:t>
             </w:r>
             <w:proofErr w:type="spellStart"/>
             <w:r>
@@ -2668,7 +3434,14 @@
                 <w:sz w:val="20"/>
                 <w:szCs w:val="20"/>
               </w:rPr>
-              <w:t xml:space="preserve"> custody case'</w:t>
+              <w:t xml:space="preserve"> custody case</w:t>
+            </w:r>
+            <w:r>
+              <w:rPr>
+                <w:sz w:val="20"/>
+                <w:szCs w:val="20"/>
+              </w:rPr>
+              <w:t>’</w:t>
             </w:r>
             <w:r>
               <w:rPr>
@@ -2713,7 +3486,30 @@
                 <w:sz w:val="20"/>
                 <w:szCs w:val="20"/>
               </w:rPr>
-              <w:t>'ak divorce case'</w:t>
+              <w:t>‘</w:t>
+            </w:r>
+            <w:proofErr w:type="spellStart"/>
+            <w:r>
+              <w:rPr>
+                <w:sz w:val="20"/>
+                <w:szCs w:val="20"/>
+              </w:rPr>
+              <w:t>ak</w:t>
+            </w:r>
+            <w:proofErr w:type="spellEnd"/>
+            <w:r>
+              <w:rPr>
+                <w:sz w:val="20"/>
+                <w:szCs w:val="20"/>
+              </w:rPr>
+              <w:t xml:space="preserve"> divorce case</w:t>
+            </w:r>
+            <w:r>
+              <w:rPr>
+                <w:sz w:val="20"/>
+                <w:szCs w:val="20"/>
+              </w:rPr>
+              <w:t>’</w:t>
             </w:r>
             <w:r>
               <w:rPr>
@@ -2729,20 +3525,51 @@
               </w:rPr>
               <w:t xml:space="preserve"> and </w:t>
             </w:r>
+            <w:proofErr w:type="spellStart"/>
             <w:r>
               <w:rPr>
                 <w:color w:val="34A853"/>
                 <w:sz w:val="20"/>
                 <w:szCs w:val="20"/>
               </w:rPr>
-              <w:t xml:space="preserve">case_type </w:t>
-            </w:r>
-            <w:r>
-              <w:rPr>
-                <w:sz w:val="20"/>
-                <w:szCs w:val="20"/>
-              </w:rPr>
-              <w:t>== 'divorce'</w:t>
+              <w:t>case_type</w:t>
+            </w:r>
+            <w:proofErr w:type="spellEnd"/>
+            <w:r>
+              <w:rPr>
+                <w:color w:val="34A853"/>
+                <w:sz w:val="20"/>
+                <w:szCs w:val="20"/>
+              </w:rPr>
+              <w:t xml:space="preserve"> </w:t>
+            </w:r>
+            <w:r>
+              <w:rPr>
+                <w:sz w:val="20"/>
+                <w:szCs w:val="20"/>
+              </w:rPr>
+              <w:t xml:space="preserve">== </w:t>
+            </w:r>
+            <w:r>
+              <w:rPr>
+                <w:sz w:val="20"/>
+                <w:szCs w:val="20"/>
+              </w:rPr>
+              <w:t>‘</w:t>
+            </w:r>
+            <w:r>
+              <w:rPr>
+                <w:sz w:val="20"/>
+                <w:szCs w:val="20"/>
+              </w:rPr>
+              <w:t>divorce</w:t>
+            </w:r>
+            <w:r>
+              <w:rPr>
+                <w:sz w:val="20"/>
+                <w:szCs w:val="20"/>
+              </w:rPr>
+              <w:t>’</w:t>
             </w:r>
             <w:r>
               <w:rPr>
@@ -2773,7 +3600,30 @@
                 <w:sz w:val="20"/>
                 <w:szCs w:val="20"/>
               </w:rPr>
-              <w:t>'ak divorce case'</w:t>
+              <w:t>‘</w:t>
+            </w:r>
+            <w:proofErr w:type="spellStart"/>
+            <w:r>
+              <w:rPr>
+                <w:sz w:val="20"/>
+                <w:szCs w:val="20"/>
+              </w:rPr>
+              <w:t>ak</w:t>
+            </w:r>
+            <w:proofErr w:type="spellEnd"/>
+            <w:r>
+              <w:rPr>
+                <w:sz w:val="20"/>
+                <w:szCs w:val="20"/>
+              </w:rPr>
+              <w:t xml:space="preserve"> divorce case</w:t>
+            </w:r>
+            <w:r>
+              <w:rPr>
+                <w:sz w:val="20"/>
+                <w:szCs w:val="20"/>
+              </w:rPr>
+              <w:t>’</w:t>
             </w:r>
             <w:r>
               <w:rPr>
@@ -2789,35 +3639,104 @@
               </w:rPr>
               <w:t xml:space="preserve"> and </w:t>
             </w:r>
+            <w:proofErr w:type="spellStart"/>
             <w:r>
               <w:rPr>
                 <w:color w:val="34A853"/>
                 <w:sz w:val="20"/>
                 <w:szCs w:val="20"/>
               </w:rPr>
-              <w:t xml:space="preserve">case_type </w:t>
-            </w:r>
-            <w:r>
-              <w:rPr>
-                <w:sz w:val="20"/>
-                <w:szCs w:val="20"/>
-              </w:rPr>
-              <w:t xml:space="preserve">== 'legal separation' and </w:t>
-            </w:r>
+              <w:t>case_type</w:t>
+            </w:r>
+            <w:proofErr w:type="spellEnd"/>
             <w:r>
               <w:rPr>
                 <w:color w:val="34A853"/>
                 <w:sz w:val="20"/>
                 <w:szCs w:val="20"/>
               </w:rPr>
-              <w:t xml:space="preserve">want_legal_separation </w:t>
-            </w:r>
-            <w:r>
-              <w:rPr>
-                <w:sz w:val="20"/>
-                <w:szCs w:val="20"/>
-              </w:rPr>
-              <w:t>== 'yes'</w:t>
+              <w:t xml:space="preserve"> </w:t>
+            </w:r>
+            <w:r>
+              <w:rPr>
+                <w:sz w:val="20"/>
+                <w:szCs w:val="20"/>
+              </w:rPr>
+              <w:t xml:space="preserve">== </w:t>
+            </w:r>
+            <w:r>
+              <w:rPr>
+                <w:sz w:val="20"/>
+                <w:szCs w:val="20"/>
+              </w:rPr>
+              <w:t>‘</w:t>
+            </w:r>
+            <w:r>
+              <w:rPr>
+                <w:sz w:val="20"/>
+                <w:szCs w:val="20"/>
+              </w:rPr>
+              <w:t>legal separation</w:t>
+            </w:r>
+            <w:r>
+              <w:rPr>
+                <w:sz w:val="20"/>
+                <w:szCs w:val="20"/>
+              </w:rPr>
+              <w:t>’</w:t>
+            </w:r>
+            <w:r>
+              <w:rPr>
+                <w:sz w:val="20"/>
+                <w:szCs w:val="20"/>
+              </w:rPr>
+              <w:t xml:space="preserve"> and </w:t>
+            </w:r>
+            <w:proofErr w:type="spellStart"/>
+            <w:r>
+              <w:rPr>
+                <w:color w:val="34A853"/>
+                <w:sz w:val="20"/>
+                <w:szCs w:val="20"/>
+              </w:rPr>
+              <w:t>want_legal_separation</w:t>
+            </w:r>
+            <w:proofErr w:type="spellEnd"/>
+            <w:r>
+              <w:rPr>
+                <w:color w:val="34A853"/>
+                <w:sz w:val="20"/>
+                <w:szCs w:val="20"/>
+              </w:rPr>
+              <w:t xml:space="preserve"> </w:t>
+            </w:r>
+            <w:r>
+              <w:rPr>
+                <w:sz w:val="20"/>
+                <w:szCs w:val="20"/>
+              </w:rPr>
+              <w:t xml:space="preserve">== </w:t>
+            </w:r>
+            <w:r>
+              <w:rPr>
+                <w:sz w:val="20"/>
+                <w:szCs w:val="20"/>
+              </w:rPr>
+              <w:t>‘</w:t>
+            </w:r>
+            <w:r>
+              <w:rPr>
+                <w:sz w:val="20"/>
+                <w:szCs w:val="20"/>
+              </w:rPr>
+              <w:t>yes</w:t>
+            </w:r>
+            <w:r>
+              <w:rPr>
+                <w:sz w:val="20"/>
+                <w:szCs w:val="20"/>
+              </w:rPr>
+              <w:t>’</w:t>
             </w:r>
             <w:r>
               <w:rPr>
@@ -2840,7 +3759,21 @@
                 <w:sz w:val="20"/>
                 <w:szCs w:val="20"/>
               </w:rPr>
-              <w:t xml:space="preserve">['case in </w:t>
+              <w:t>[</w:t>
+            </w:r>
+            <w:r>
+              <w:rPr>
+                <w:sz w:val="20"/>
+                <w:szCs w:val="20"/>
+              </w:rPr>
+              <w:t>‘</w:t>
+            </w:r>
+            <w:r>
+              <w:rPr>
+                <w:sz w:val="20"/>
+                <w:szCs w:val="20"/>
+              </w:rPr>
+              <w:t xml:space="preserve">case in </w:t>
             </w:r>
             <w:r>
               <w:rPr>
@@ -2848,7 +3781,21 @@
                 <w:szCs w:val="20"/>
               </w:rPr>
               <w:lastRenderedPageBreak/>
-              <w:t xml:space="preserve">2 states'] and </w:t>
+              <w:t>2 states</w:t>
+            </w:r>
+            <w:r>
+              <w:rPr>
+                <w:sz w:val="20"/>
+                <w:szCs w:val="20"/>
+              </w:rPr>
+              <w:t>’</w:t>
+            </w:r>
+            <w:r>
+              <w:rPr>
+                <w:sz w:val="20"/>
+                <w:szCs w:val="20"/>
+              </w:rPr>
+              <w:t xml:space="preserve">] and </w:t>
             </w:r>
             <w:r>
               <w:rPr>
@@ -2863,7 +3810,28 @@
                 <w:sz w:val="20"/>
                 <w:szCs w:val="20"/>
               </w:rPr>
-              <w:t>== 'ended with no order'</w:t>
+              <w:t xml:space="preserve">== </w:t>
+            </w:r>
+            <w:r>
+              <w:rPr>
+                <w:sz w:val="20"/>
+                <w:szCs w:val="20"/>
+              </w:rPr>
+              <w:t>‘</w:t>
+            </w:r>
+            <w:r>
+              <w:rPr>
+                <w:sz w:val="20"/>
+                <w:szCs w:val="20"/>
+              </w:rPr>
+              <w:t>ended with no order</w:t>
+            </w:r>
+            <w:r>
+              <w:rPr>
+                <w:sz w:val="20"/>
+                <w:szCs w:val="20"/>
+              </w:rPr>
+              <w:t>’</w:t>
             </w:r>
             <w:r>
               <w:rPr>
@@ -2897,20 +3865,38 @@
               </w:rPr>
               <w:t>and (</w:t>
             </w:r>
+            <w:proofErr w:type="spellStart"/>
             <w:r>
               <w:rPr>
                 <w:color w:val="6AA84F"/>
                 <w:sz w:val="20"/>
                 <w:szCs w:val="20"/>
               </w:rPr>
-              <w:t>response_to_complaint in('</w:t>
-            </w:r>
+              <w:t>response_to_complaint</w:t>
+            </w:r>
+            <w:proofErr w:type="spellEnd"/>
             <w:r>
               <w:rPr>
                 <w:color w:val="6AA84F"/>
                 <w:sz w:val="20"/>
                 <w:szCs w:val="20"/>
               </w:rPr>
+              <w:t xml:space="preserve"> in(</w:t>
+            </w:r>
+            <w:r>
+              <w:rPr>
+                <w:color w:val="6AA84F"/>
+                <w:sz w:val="20"/>
+                <w:szCs w:val="20"/>
+              </w:rPr>
+              <w:t>‘</w:t>
+            </w:r>
+            <w:r>
+              <w:rPr>
+                <w:color w:val="6AA84F"/>
+                <w:sz w:val="20"/>
+                <w:szCs w:val="20"/>
+              </w:rPr>
               <w:t>agree</w:t>
             </w:r>
             <w:r>
@@ -2919,7 +3905,47 @@
                 <w:sz w:val="20"/>
                 <w:szCs w:val="20"/>
               </w:rPr>
-              <w:t xml:space="preserve">', 'some') </w:t>
+              <w:t>’</w:t>
+            </w:r>
+            <w:r>
+              <w:rPr>
+                <w:color w:val="6AA84F"/>
+                <w:sz w:val="20"/>
+                <w:szCs w:val="20"/>
+              </w:rPr>
+              <w:t xml:space="preserve">, </w:t>
+            </w:r>
+            <w:r>
+              <w:rPr>
+                <w:color w:val="6AA84F"/>
+                <w:sz w:val="20"/>
+                <w:szCs w:val="20"/>
+              </w:rPr>
+              <w:t>‘</w:t>
+            </w:r>
+            <w:r>
+              <w:rPr>
+                <w:color w:val="6AA84F"/>
+                <w:sz w:val="20"/>
+                <w:szCs w:val="20"/>
+              </w:rPr>
+              <w:t>some</w:t>
+            </w:r>
+            <w:r>
+              <w:rPr>
+                <w:color w:val="6AA84F"/>
+                <w:sz w:val="20"/>
+                <w:szCs w:val="20"/>
+              </w:rPr>
+              <w:t>’</w:t>
+            </w:r>
+            <w:r>
+              <w:rPr>
+                <w:color w:val="6AA84F"/>
+                <w:sz w:val="20"/>
+                <w:szCs w:val="20"/>
+              </w:rPr>
+              <w:t xml:space="preserve">) </w:t>
             </w:r>
             <w:r>
               <w:rPr>
@@ -2945,13 +3971,55 @@
               </w:rPr>
               <w:t>(</w:t>
             </w:r>
+            <w:proofErr w:type="spellStart"/>
             <w:r>
               <w:rPr>
                 <w:color w:val="6AA84F"/>
                 <w:sz w:val="20"/>
                 <w:szCs w:val="20"/>
               </w:rPr>
-              <w:t xml:space="preserve">response_to_complaint == 'no' and </w:t>
+              <w:t>response_to_complaint</w:t>
+            </w:r>
+            <w:proofErr w:type="spellEnd"/>
+            <w:r>
+              <w:rPr>
+                <w:color w:val="6AA84F"/>
+                <w:sz w:val="20"/>
+                <w:szCs w:val="20"/>
+              </w:rPr>
+              <w:t xml:space="preserve"> == </w:t>
+            </w:r>
+            <w:r>
+              <w:rPr>
+                <w:color w:val="6AA84F"/>
+                <w:sz w:val="20"/>
+                <w:szCs w:val="20"/>
+              </w:rPr>
+              <w:t>‘</w:t>
+            </w:r>
+            <w:r>
+              <w:rPr>
+                <w:color w:val="6AA84F"/>
+                <w:sz w:val="20"/>
+                <w:szCs w:val="20"/>
+              </w:rPr>
+              <w:t>no</w:t>
+            </w:r>
+            <w:r>
+              <w:rPr>
+                <w:color w:val="6AA84F"/>
+                <w:sz w:val="20"/>
+                <w:szCs w:val="20"/>
+              </w:rPr>
+              <w:t>’</w:t>
+            </w:r>
+            <w:r>
+              <w:rPr>
+                <w:color w:val="6AA84F"/>
+                <w:sz w:val="20"/>
+                <w:szCs w:val="20"/>
+              </w:rPr>
+              <w:t xml:space="preserve"> and </w:t>
             </w:r>
             <w:proofErr w:type="spellStart"/>
             <w:r>
@@ -3008,7 +4076,7 @@
                 <w:sz w:val="20"/>
                 <w:szCs w:val="20"/>
               </w:rPr>
-              <w:t>'</w:t>
+              <w:t>‘</w:t>
             </w:r>
             <w:proofErr w:type="spellStart"/>
             <w:r>
@@ -3024,7 +4092,14 @@
                 <w:sz w:val="20"/>
                 <w:szCs w:val="20"/>
               </w:rPr>
-              <w:t xml:space="preserve"> divorce case'</w:t>
+              <w:t xml:space="preserve"> divorce case</w:t>
+            </w:r>
+            <w:r>
+              <w:rPr>
+                <w:sz w:val="20"/>
+                <w:szCs w:val="20"/>
+              </w:rPr>
+              <w:t>’</w:t>
             </w:r>
             <w:r>
               <w:rPr>
@@ -3040,20 +4115,58 @@
               </w:rPr>
               <w:t xml:space="preserve"> and </w:t>
             </w:r>
+            <w:proofErr w:type="spellStart"/>
             <w:r>
               <w:rPr>
                 <w:color w:val="34A853"/>
                 <w:sz w:val="20"/>
                 <w:szCs w:val="20"/>
               </w:rPr>
-              <w:t xml:space="preserve">case_type </w:t>
-            </w:r>
-            <w:r>
-              <w:rPr>
-                <w:sz w:val="20"/>
-                <w:szCs w:val="20"/>
-              </w:rPr>
-              <w:t xml:space="preserve">== 'legal separation' and </w:t>
+              <w:t>case_type</w:t>
+            </w:r>
+            <w:proofErr w:type="spellEnd"/>
+            <w:r>
+              <w:rPr>
+                <w:color w:val="34A853"/>
+                <w:sz w:val="20"/>
+                <w:szCs w:val="20"/>
+              </w:rPr>
+              <w:t xml:space="preserve"> </w:t>
+            </w:r>
+            <w:r>
+              <w:rPr>
+                <w:sz w:val="20"/>
+                <w:szCs w:val="20"/>
+              </w:rPr>
+              <w:t xml:space="preserve">== </w:t>
+            </w:r>
+            <w:r>
+              <w:rPr>
+                <w:sz w:val="20"/>
+                <w:szCs w:val="20"/>
+              </w:rPr>
+              <w:t>‘</w:t>
+            </w:r>
+            <w:r>
+              <w:rPr>
+                <w:sz w:val="20"/>
+                <w:szCs w:val="20"/>
+              </w:rPr>
+              <w:t>legal separation</w:t>
+            </w:r>
+            <w:r>
+              <w:rPr>
+                <w:sz w:val="20"/>
+                <w:szCs w:val="20"/>
+              </w:rPr>
+              <w:t>’</w:t>
+            </w:r>
+            <w:r>
+              <w:rPr>
+                <w:sz w:val="20"/>
+                <w:szCs w:val="20"/>
+              </w:rPr>
+              <w:t xml:space="preserve"> and </w:t>
             </w:r>
             <w:proofErr w:type="spellStart"/>
             <w:r>
@@ -3078,7 +4191,21 @@
                 <w:sz w:val="20"/>
                 <w:szCs w:val="20"/>
               </w:rPr>
-              <w:t>in('no</w:t>
+              <w:t>in(</w:t>
+            </w:r>
+            <w:r>
+              <w:rPr>
+                <w:sz w:val="20"/>
+                <w:szCs w:val="20"/>
+              </w:rPr>
+              <w:t>‘</w:t>
+            </w:r>
+            <w:r>
+              <w:rPr>
+                <w:sz w:val="20"/>
+                <w:szCs w:val="20"/>
+              </w:rPr>
+              <w:t>no</w:t>
             </w:r>
             <w:r>
               <w:rPr>
@@ -3092,7 +4219,42 @@
                 <w:sz w:val="20"/>
                 <w:szCs w:val="20"/>
               </w:rPr>
-              <w:t xml:space="preserve">', 'unsure') and </w:t>
+              <w:t>’</w:t>
+            </w:r>
+            <w:r>
+              <w:rPr>
+                <w:sz w:val="20"/>
+                <w:szCs w:val="20"/>
+              </w:rPr>
+              <w:t xml:space="preserve">, </w:t>
+            </w:r>
+            <w:r>
+              <w:rPr>
+                <w:sz w:val="20"/>
+                <w:szCs w:val="20"/>
+              </w:rPr>
+              <w:t>‘</w:t>
+            </w:r>
+            <w:r>
+              <w:rPr>
+                <w:sz w:val="20"/>
+                <w:szCs w:val="20"/>
+              </w:rPr>
+              <w:t>unsure</w:t>
+            </w:r>
+            <w:r>
+              <w:rPr>
+                <w:sz w:val="20"/>
+                <w:szCs w:val="20"/>
+              </w:rPr>
+              <w:t>’</w:t>
+            </w:r>
+            <w:r>
+              <w:rPr>
+                <w:sz w:val="20"/>
+                <w:szCs w:val="20"/>
+              </w:rPr>
+              <w:t xml:space="preserve">) and </w:t>
             </w:r>
             <w:proofErr w:type="spellStart"/>
             <w:r>
@@ -3308,17 +4470,67 @@
               </w:rPr>
               <w:t xml:space="preserve"> </w:t>
             </w:r>
+            <w:proofErr w:type="spellStart"/>
             <w:r>
               <w:rPr>
                 <w:color w:val="FF0000"/>
               </w:rPr>
-              <w:t>type_of_response.any_true and not(</w:t>
+              <w:t>type_of_response.any_true</w:t>
+            </w:r>
+            <w:proofErr w:type="spellEnd"/>
+            <w:r>
+              <w:rPr>
+                <w:color w:val="FF0000"/>
+              </w:rPr>
+              <w:t xml:space="preserve"> and not(</w:t>
             </w:r>
             <w:r>
               <w:rPr>
                 <w:color w:val="FFC000"/>
               </w:rPr>
-              <w:t>type_of_response['default'] and stage_of_default == 'judgment entered'</w:t>
+              <w:t>type_of_response[</w:t>
+            </w:r>
+            <w:r>
+              <w:rPr>
+                <w:color w:val="FFC000"/>
+              </w:rPr>
+              <w:t>‘</w:t>
+            </w:r>
+            <w:r>
+              <w:rPr>
+                <w:color w:val="FFC000"/>
+              </w:rPr>
+              <w:t>default</w:t>
+            </w:r>
+            <w:r>
+              <w:rPr>
+                <w:color w:val="FFC000"/>
+              </w:rPr>
+              <w:t>’</w:t>
+            </w:r>
+            <w:r>
+              <w:rPr>
+                <w:color w:val="FFC000"/>
+              </w:rPr>
+              <w:t xml:space="preserve">] and stage_of_default == </w:t>
+            </w:r>
+            <w:r>
+              <w:rPr>
+                <w:color w:val="FFC000"/>
+              </w:rPr>
+              <w:t>‘</w:t>
+            </w:r>
+            <w:r>
+              <w:rPr>
+                <w:color w:val="FFC000"/>
+              </w:rPr>
+              <w:t>judgment entered</w:t>
+            </w:r>
+            <w:r>
+              <w:rPr>
+                <w:color w:val="FFC000"/>
+              </w:rPr>
+              <w:t>’</w:t>
             </w:r>
             <w:r>
               <w:rPr>
@@ -3330,7 +4542,49 @@
               <w:rPr>
                 <w:color w:val="FFC000"/>
               </w:rPr>
-              <w:t>type_of_response['case in 2 states'] and stage_of_other_case == 'ended with order'</w:t>
+              <w:t>type_of_response[</w:t>
+            </w:r>
+            <w:r>
+              <w:rPr>
+                <w:color w:val="FFC000"/>
+              </w:rPr>
+              <w:t>‘</w:t>
+            </w:r>
+            <w:r>
+              <w:rPr>
+                <w:color w:val="FFC000"/>
+              </w:rPr>
+              <w:t>case in 2 states</w:t>
+            </w:r>
+            <w:r>
+              <w:rPr>
+                <w:color w:val="FFC000"/>
+              </w:rPr>
+              <w:t>’</w:t>
+            </w:r>
+            <w:r>
+              <w:rPr>
+                <w:color w:val="FFC000"/>
+              </w:rPr>
+              <w:t xml:space="preserve">] and stage_of_other_case == </w:t>
+            </w:r>
+            <w:r>
+              <w:rPr>
+                <w:color w:val="FFC000"/>
+              </w:rPr>
+              <w:t>‘</w:t>
+            </w:r>
+            <w:r>
+              <w:rPr>
+                <w:color w:val="FFC000"/>
+              </w:rPr>
+              <w:t>ended with order</w:t>
+            </w:r>
+            <w:r>
+              <w:rPr>
+                <w:color w:val="FFC000"/>
+              </w:rPr>
+              <w:t>’</w:t>
             </w:r>
             <w:r>
               <w:rPr>
@@ -3348,7 +4602,25 @@
               <w:rPr>
                 <w:color w:val="FFC000"/>
               </w:rPr>
-              <w:t>'stay married'] and not respond</w:t>
+              <w:t>‘</w:t>
+            </w:r>
+            <w:r>
+              <w:rPr>
+                <w:color w:val="FFC000"/>
+              </w:rPr>
+              <w:t>stay married</w:t>
+            </w:r>
+            <w:r>
+              <w:rPr>
+                <w:color w:val="FFC000"/>
+              </w:rPr>
+              <w:t>’</w:t>
+            </w:r>
+            <w:r>
+              <w:rPr>
+                <w:color w:val="FFC000"/>
+              </w:rPr>
+              <w:t>] and not respond</w:t>
             </w:r>
             <w:r>
               <w:rPr>
@@ -3536,29 +4808,59 @@
               <w:pStyle w:val="Body"/>
             </w:pPr>
             <w:r>
-              <w:t>{%tr if (type_of_response['wr</w:t>
+              <w:t>{%tr if (type_of_response[</w:t>
+            </w:r>
+            <w:r>
+              <w:t>‘</w:t>
+            </w:r>
+            <w:r>
+              <w:t>wr</w:t>
             </w:r>
             <w:r>
               <w:lastRenderedPageBreak/>
-              <w:t xml:space="preserve">ong state'] and not jurisdiction) or (type_of_response['case in 2 states'] and stage_of_other_case </w:t>
+              <w:t>ong state</w:t>
+            </w:r>
+            <w:r>
+              <w:t>’</w:t>
+            </w:r>
+            <w:r>
+              <w:t>] and not jurisdiction) or (type_of_response[</w:t>
+            </w:r>
+            <w:r>
+              <w:t>‘</w:t>
+            </w:r>
+            <w:r>
+              <w:t>case in 2 states</w:t>
+            </w:r>
+            <w:r>
+              <w:t>’</w:t>
+            </w:r>
+            <w:r>
+              <w:t xml:space="preserve">] and stage_of_other_case </w:t>
             </w:r>
             <w:r>
               <w:t>in(</w:t>
             </w:r>
             <w:r>
-              <w:t>'still going'</w:t>
+              <w:t>‘</w:t>
+            </w:r>
+            <w:r>
+              <w:t>still going</w:t>
+            </w:r>
+            <w:r>
+              <w:t>’</w:t>
             </w:r>
             <w:r>
               <w:t xml:space="preserve">, </w:t>
             </w:r>
             <w:r>
-              <w:t>'</w:t>
+              <w:t>‘</w:t>
             </w:r>
             <w:r>
               <w:t>ended with order</w:t>
             </w:r>
             <w:r>
-              <w:t>'</w:t>
+              <w:t>’</w:t>
             </w:r>
             <w:r>
               <w:t>)</w:t>
@@ -3567,7 +4869,39 @@
               <w:t>)</w:t>
             </w:r>
             <w:r>
-              <w:t xml:space="preserve"> or (type_of_response['default'] and proper_service == 'neither') %}</w:t>
+              <w:t xml:space="preserve"> or (type_of_response[</w:t>
+            </w:r>
+            <w:r>
+              <w:t>‘</w:t>
+            </w:r>
+            <w:r>
+              <w:t>default</w:t>
+            </w:r>
+            <w:r>
+              <w:t>’</w:t>
+            </w:r>
+            <w:r>
+              <w:t xml:space="preserve">] and </w:t>
+            </w:r>
+            <w:proofErr w:type="spellStart"/>
+            <w:r>
+              <w:t>proper_service</w:t>
+            </w:r>
+            <w:proofErr w:type="spellEnd"/>
+            <w:r>
+              <w:t xml:space="preserve"> == </w:t>
+            </w:r>
+            <w:r>
+              <w:t>‘</w:t>
+            </w:r>
+            <w:r>
+              <w:t>neither</w:t>
+            </w:r>
+            <w:r>
+              <w:t>’</w:t>
+            </w:r>
+            <w:r>
+              <w:t>) %}</w:t>
             </w:r>
           </w:p>
         </w:tc>
@@ -3745,7 +5079,19 @@
               <w:spacing w:before="0" w:after="0"/>
             </w:pPr>
             <w:r>
-              <w:t>{%tr if stage_of_default == 'judgment entered' %}</w:t>
+              <w:t xml:space="preserve">{%tr if stage_of_default == </w:t>
+            </w:r>
+            <w:r>
+              <w:t>‘</w:t>
+            </w:r>
+            <w:r>
+              <w:t>judgment entered</w:t>
+            </w:r>
+            <w:r>
+              <w:t>’</w:t>
+            </w:r>
+            <w:r>
+              <w:t xml:space="preserve"> %}</w:t>
             </w:r>
           </w:p>
         </w:tc>
@@ -4058,26 +5404,99 @@
               <w:pStyle w:val="Body"/>
             </w:pPr>
             <w:r>
-              <w:t>{%tr if type_of_response.any_true() and not (type_of_response.all_true('stay married', exclusive = True))</w:t>
+              <w:t>{%tr if type_of_response.any_true() and not (</w:t>
+            </w:r>
+            <w:proofErr w:type="spellStart"/>
+            <w:r>
+              <w:t>type_of_response.all_true</w:t>
+            </w:r>
+            <w:proofErr w:type="spellEnd"/>
+            <w:r>
+              <w:t>(</w:t>
+            </w:r>
+            <w:r>
+              <w:t>‘</w:t>
+            </w:r>
+            <w:r>
+              <w:t>stay married</w:t>
+            </w:r>
+            <w:r>
+              <w:t>’</w:t>
+            </w:r>
+            <w:r>
+              <w:t>, exclusive = True))</w:t>
             </w:r>
             <w:r>
               <w:t xml:space="preserve"> and (</w:t>
             </w:r>
-            <w:r>
-              <w:t xml:space="preserve">filling_manner in('paper', 'dunno') or filing_method </w:t>
+            <w:proofErr w:type="spellStart"/>
+            <w:r>
+              <w:t>filling_manner</w:t>
+            </w:r>
+            <w:proofErr w:type="spellEnd"/>
+            <w:r>
+              <w:t xml:space="preserve"> in(</w:t>
+            </w:r>
+            <w:r>
+              <w:t>‘</w:t>
+            </w:r>
+            <w:r>
+              <w:t>paper</w:t>
+            </w:r>
+            <w:r>
+              <w:t>’</w:t>
+            </w:r>
+            <w:r>
+              <w:t xml:space="preserve">, </w:t>
+            </w:r>
+            <w:r>
+              <w:t>‘</w:t>
+            </w:r>
+            <w:proofErr w:type="spellStart"/>
+            <w:r>
+              <w:t>dunno</w:t>
+            </w:r>
+            <w:proofErr w:type="spellEnd"/>
+            <w:r>
+              <w:t>’</w:t>
+            </w:r>
+            <w:r>
+              <w:t xml:space="preserve">) or </w:t>
+            </w:r>
+            <w:proofErr w:type="spellStart"/>
+            <w:r>
+              <w:t>filing_method</w:t>
+            </w:r>
+            <w:proofErr w:type="spellEnd"/>
+            <w:r>
+              <w:t xml:space="preserve"> </w:t>
             </w:r>
             <w:r>
               <w:t xml:space="preserve">in </w:t>
             </w:r>
             <w:r>
-              <w:t xml:space="preserve">('mail or in person', </w:t>
+              <w:t>(</w:t>
             </w:r>
             <w:r>
               <w:t>‘</w:t>
             </w:r>
             <w:r>
+              <w:t>mail or in person</w:t>
+            </w:r>
+            <w:r>
+              <w:t>’</w:t>
+            </w:r>
+            <w:r>
+              <w:t xml:space="preserve">, </w:t>
+            </w:r>
+            <w:r>
+              <w:t>‘</w:t>
+            </w:r>
+            <w:proofErr w:type="spellStart"/>
+            <w:r>
               <w:t>dunno</w:t>
             </w:r>
+            <w:proofErr w:type="spellEnd"/>
             <w:r>
               <w:t>’</w:t>
             </w:r>
@@ -4260,7 +5679,27 @@
               <w:pStyle w:val="Body"/>
             </w:pPr>
             <w:r>
-              <w:t>{%tr if type_of_response.any_true() and not (type_of_response.all_true('stay married', exclusive = True)) %}</w:t>
+              <w:t>{%tr if type_of_response.any_true() and not (</w:t>
+            </w:r>
+            <w:proofErr w:type="spellStart"/>
+            <w:r>
+              <w:t>type_of_response.all_true</w:t>
+            </w:r>
+            <w:proofErr w:type="spellEnd"/>
+            <w:r>
+              <w:t>(</w:t>
+            </w:r>
+            <w:r>
+              <w:t>‘</w:t>
+            </w:r>
+            <w:r>
+              <w:t>stay married</w:t>
+            </w:r>
+            <w:r>
+              <w:t>’</w:t>
+            </w:r>
+            <w:r>
+              <w:t>, exclusive = True)) %}</w:t>
             </w:r>
           </w:p>
         </w:tc>
@@ -4516,7 +5955,45 @@
               <w:rPr>
                 <w:color w:val="auto"/>
               </w:rPr>
-              <w:t>type_of_response.any_true() and not (type_of_response.all_true('stay married', exclusive = True))</w:t>
+              <w:t>type_of_response.any_true() and not (</w:t>
+            </w:r>
+            <w:proofErr w:type="spellStart"/>
+            <w:r>
+              <w:rPr>
+                <w:color w:val="auto"/>
+              </w:rPr>
+              <w:t>type_of_response.all_true</w:t>
+            </w:r>
+            <w:proofErr w:type="spellEnd"/>
+            <w:r>
+              <w:rPr>
+                <w:color w:val="auto"/>
+              </w:rPr>
+              <w:t>(</w:t>
+            </w:r>
+            <w:r>
+              <w:rPr>
+                <w:color w:val="auto"/>
+              </w:rPr>
+              <w:t>‘</w:t>
+            </w:r>
+            <w:r>
+              <w:rPr>
+                <w:color w:val="auto"/>
+              </w:rPr>
+              <w:t>stay married</w:t>
+            </w:r>
+            <w:r>
+              <w:rPr>
+                <w:color w:val="auto"/>
+              </w:rPr>
+              <w:t>’</w:t>
+            </w:r>
+            <w:r>
+              <w:rPr>
+                <w:color w:val="auto"/>
+              </w:rPr>
+              <w:t>, exclusive = True))</w:t>
             </w:r>
             <w:r>
               <w:rPr>
@@ -4537,7 +6014,99 @@
               <w:t>(</w:t>
             </w:r>
             <w:r>
-              <w:t xml:space="preserve">not ((type_of_response['default'] and stage_of_default == 'judgment entered') or (type_of_response['case in 2 states'] and stage_of_other_case == 'ended with order') or (type_of_response.all_true('wrong state', 'default') and user_need == 'answer custody' and not </w:t>
+              <w:t>not ((type_of_response[</w:t>
+            </w:r>
+            <w:r>
+              <w:t>‘</w:t>
+            </w:r>
+            <w:r>
+              <w:t>default</w:t>
+            </w:r>
+            <w:r>
+              <w:t>’</w:t>
+            </w:r>
+            <w:r>
+              <w:t xml:space="preserve">] and stage_of_default == </w:t>
+            </w:r>
+            <w:r>
+              <w:t>‘</w:t>
+            </w:r>
+            <w:r>
+              <w:t>judgment entered</w:t>
+            </w:r>
+            <w:r>
+              <w:t>’</w:t>
+            </w:r>
+            <w:r>
+              <w:t>) or (type_of_response[</w:t>
+            </w:r>
+            <w:r>
+              <w:t>‘</w:t>
+            </w:r>
+            <w:r>
+              <w:t>case in 2 states</w:t>
+            </w:r>
+            <w:r>
+              <w:t>’</w:t>
+            </w:r>
+            <w:r>
+              <w:t xml:space="preserve">] and stage_of_other_case == </w:t>
+            </w:r>
+            <w:r>
+              <w:t>‘</w:t>
+            </w:r>
+            <w:r>
+              <w:t>ended with order</w:t>
+            </w:r>
+            <w:r>
+              <w:t>’</w:t>
+            </w:r>
+            <w:r>
+              <w:t>) or (</w:t>
+            </w:r>
+            <w:proofErr w:type="spellStart"/>
+            <w:r>
+              <w:t>type_of_response.all_true</w:t>
+            </w:r>
+            <w:proofErr w:type="spellEnd"/>
+            <w:r>
+              <w:t>(</w:t>
+            </w:r>
+            <w:r>
+              <w:t>‘</w:t>
+            </w:r>
+            <w:r>
+              <w:t>wrong state</w:t>
+            </w:r>
+            <w:r>
+              <w:t>’</w:t>
+            </w:r>
+            <w:r>
+              <w:t xml:space="preserve">, </w:t>
+            </w:r>
+            <w:r>
+              <w:t>‘</w:t>
+            </w:r>
+            <w:r>
+              <w:t>default</w:t>
+            </w:r>
+            <w:r>
+              <w:t>’</w:t>
+            </w:r>
+            <w:r>
+              <w:t xml:space="preserve">) and user_need == </w:t>
+            </w:r>
+            <w:r>
+              <w:t>‘</w:t>
+            </w:r>
+            <w:r>
+              <w:t>answer custody</w:t>
+            </w:r>
+            <w:r>
+              <w:t>’</w:t>
+            </w:r>
+            <w:r>
+              <w:t xml:space="preserve"> and not </w:t>
             </w:r>
             <w:r>
               <w:lastRenderedPageBreak/>
@@ -4766,7 +6335,45 @@
               <w:rPr>
                 <w:color w:val="FF0000"/>
               </w:rPr>
-              <w:t>{%tr if type_of_response.any_true() and not (type_of_response.all_true('stay married', exclusive = True)) %}</w:t>
+              <w:t>{%tr if type_of_response.any_true() and not (</w:t>
+            </w:r>
+            <w:proofErr w:type="spellStart"/>
+            <w:r>
+              <w:rPr>
+                <w:color w:val="FF0000"/>
+              </w:rPr>
+              <w:t>type_of_response.all_true</w:t>
+            </w:r>
+            <w:proofErr w:type="spellEnd"/>
+            <w:r>
+              <w:rPr>
+                <w:color w:val="FF0000"/>
+              </w:rPr>
+              <w:t>(</w:t>
+            </w:r>
+            <w:r>
+              <w:rPr>
+                <w:color w:val="FF0000"/>
+              </w:rPr>
+              <w:t>‘</w:t>
+            </w:r>
+            <w:r>
+              <w:rPr>
+                <w:color w:val="FF0000"/>
+              </w:rPr>
+              <w:t>stay married</w:t>
+            </w:r>
+            <w:r>
+              <w:rPr>
+                <w:color w:val="FF0000"/>
+              </w:rPr>
+              <w:t>’</w:t>
+            </w:r>
+            <w:r>
+              <w:rPr>
+                <w:color w:val="FF0000"/>
+              </w:rPr>
+              <w:t>, exclusive = True)) %}</w:t>
             </w:r>
           </w:p>
         </w:tc>
@@ -4978,7 +6585,107 @@
               <w:t>{%tr if (</w:t>
             </w:r>
             <w:r>
-              <w:t>not ((user_need == 'answer custody' and type_of_response.all_true('wrong state', 'default') and not jurisdiction) or (type_of_response['case in 2 states'] and stage_of_other_case == 'ended with order') or (type_of_response['default'] and stage_of_default == 'judgment entered') or type_of_response.all_false())</w:t>
+              <w:t xml:space="preserve">not ((user_need == </w:t>
+            </w:r>
+            <w:r>
+              <w:t>‘</w:t>
+            </w:r>
+            <w:r>
+              <w:t>answer custody</w:t>
+            </w:r>
+            <w:r>
+              <w:t>’</w:t>
+            </w:r>
+            <w:r>
+              <w:t xml:space="preserve"> and </w:t>
+            </w:r>
+            <w:proofErr w:type="spellStart"/>
+            <w:r>
+              <w:t>type_of_response.all_true</w:t>
+            </w:r>
+            <w:proofErr w:type="spellEnd"/>
+            <w:r>
+              <w:t>(</w:t>
+            </w:r>
+            <w:r>
+              <w:t>‘</w:t>
+            </w:r>
+            <w:r>
+              <w:t>wrong state</w:t>
+            </w:r>
+            <w:r>
+              <w:t>’</w:t>
+            </w:r>
+            <w:r>
+              <w:t xml:space="preserve">, </w:t>
+            </w:r>
+            <w:r>
+              <w:t>‘</w:t>
+            </w:r>
+            <w:r>
+              <w:t>default</w:t>
+            </w:r>
+            <w:r>
+              <w:t>’</w:t>
+            </w:r>
+            <w:r>
+              <w:t>) and not jurisdiction) or (type_of_response[</w:t>
+            </w:r>
+            <w:r>
+              <w:t>‘</w:t>
+            </w:r>
+            <w:r>
+              <w:t>case in 2 states</w:t>
+            </w:r>
+            <w:r>
+              <w:t>’</w:t>
+            </w:r>
+            <w:r>
+              <w:t xml:space="preserve">] and stage_of_other_case == </w:t>
+            </w:r>
+            <w:r>
+              <w:t>‘</w:t>
+            </w:r>
+            <w:r>
+              <w:t>ended with order</w:t>
+            </w:r>
+            <w:r>
+              <w:t>’</w:t>
+            </w:r>
+            <w:r>
+              <w:t>) or (type_of_response[</w:t>
+            </w:r>
+            <w:r>
+              <w:t>‘</w:t>
+            </w:r>
+            <w:r>
+              <w:t>default</w:t>
+            </w:r>
+            <w:r>
+              <w:t>’</w:t>
+            </w:r>
+            <w:r>
+              <w:t xml:space="preserve">] and stage_of_default == </w:t>
+            </w:r>
+            <w:r>
+              <w:t>‘</w:t>
+            </w:r>
+            <w:r>
+              <w:t>judgment entered</w:t>
+            </w:r>
+            <w:r>
+              <w:t>’</w:t>
+            </w:r>
+            <w:r>
+              <w:t xml:space="preserve">) or </w:t>
+            </w:r>
+            <w:proofErr w:type="spellStart"/>
+            <w:r>
+              <w:t>type_of_response.all_false</w:t>
+            </w:r>
+            <w:proofErr w:type="spellEnd"/>
+            <w:r>
+              <w:t>())</w:t>
             </w:r>
             <w:r>
               <w:rPr>
@@ -4992,11 +6699,43 @@
               </w:rPr>
               <w:t xml:space="preserve"> </w:t>
             </w:r>
+            <w:proofErr w:type="spellStart"/>
             <w:r>
               <w:rPr>
                 <w:color w:val="FF0000"/>
               </w:rPr>
-              <w:t>type_of_response.all_true('stay married', exclusive = True)</w:t>
+              <w:t>type_of_response.all_true</w:t>
+            </w:r>
+            <w:proofErr w:type="spellEnd"/>
+            <w:r>
+              <w:rPr>
+                <w:color w:val="FF0000"/>
+              </w:rPr>
+              <w:t>(</w:t>
+            </w:r>
+            <w:r>
+              <w:rPr>
+                <w:color w:val="FF0000"/>
+              </w:rPr>
+              <w:t>‘</w:t>
+            </w:r>
+            <w:r>
+              <w:rPr>
+                <w:color w:val="FF0000"/>
+              </w:rPr>
+              <w:t>stay married</w:t>
+            </w:r>
+            <w:r>
+              <w:rPr>
+                <w:color w:val="FF0000"/>
+              </w:rPr>
+              <w:t>’</w:t>
+            </w:r>
+            <w:r>
+              <w:rPr>
+                <w:color w:val="FF0000"/>
+              </w:rPr>
+              <w:t>, exclusive = True)</w:t>
             </w:r>
             <w:r>
               <w:t xml:space="preserve"> %}</w:t>
@@ -5406,21 +7145,163 @@
                 <w:color w:val="FF0000"/>
                 <w:shd w:val="clear" w:color="auto" w:fill="FFFFFF"/>
               </w:rPr>
-              <w:t xml:space="preserve">user_need == 'answer divorce' and </w:t>
+              <w:t xml:space="preserve">user_need == </w:t>
             </w:r>
             <w:r>
               <w:rPr>
                 <w:color w:val="FF0000"/>
                 <w:shd w:val="clear" w:color="auto" w:fill="FFFFFF"/>
               </w:rPr>
-              <w:t>type_of_response[‘ak divorce case’] and not type_of_response[‘improper service’] and not (</w:t>
+              <w:t>‘</w:t>
+            </w:r>
+            <w:r>
+              <w:rPr>
+                <w:color w:val="FF0000"/>
+                <w:shd w:val="clear" w:color="auto" w:fill="FFFFFF"/>
+              </w:rPr>
+              <w:t>answer divorce</w:t>
+            </w:r>
+            <w:r>
+              <w:rPr>
+                <w:color w:val="FF0000"/>
+                <w:shd w:val="clear" w:color="auto" w:fill="FFFFFF"/>
+              </w:rPr>
+              <w:t>’</w:t>
+            </w:r>
+            <w:r>
+              <w:rPr>
+                <w:color w:val="FF0000"/>
+                <w:shd w:val="clear" w:color="auto" w:fill="FFFFFF"/>
+              </w:rPr>
+              <w:t xml:space="preserve"> and </w:t>
+            </w:r>
+            <w:r>
+              <w:rPr>
+                <w:color w:val="FF0000"/>
+                <w:shd w:val="clear" w:color="auto" w:fill="FFFFFF"/>
+              </w:rPr>
+              <w:t>type_of_response[</w:t>
+            </w:r>
+            <w:r>
+              <w:rPr>
+                <w:color w:val="FF0000"/>
+                <w:shd w:val="clear" w:color="auto" w:fill="FFFFFF"/>
+              </w:rPr>
+              <w:t>‘</w:t>
+            </w:r>
+            <w:proofErr w:type="spellStart"/>
+            <w:r>
+              <w:rPr>
+                <w:color w:val="FF0000"/>
+                <w:shd w:val="clear" w:color="auto" w:fill="FFFFFF"/>
+              </w:rPr>
+              <w:t>ak</w:t>
+            </w:r>
+            <w:proofErr w:type="spellEnd"/>
+            <w:r>
+              <w:rPr>
+                <w:color w:val="FF0000"/>
+                <w:shd w:val="clear" w:color="auto" w:fill="FFFFFF"/>
+              </w:rPr>
+              <w:t xml:space="preserve"> divorce case</w:t>
+            </w:r>
+            <w:r>
+              <w:rPr>
+                <w:color w:val="FF0000"/>
+                <w:shd w:val="clear" w:color="auto" w:fill="FFFFFF"/>
+              </w:rPr>
+              <w:t>’</w:t>
+            </w:r>
+            <w:r>
+              <w:rPr>
+                <w:color w:val="FF0000"/>
+                <w:shd w:val="clear" w:color="auto" w:fill="FFFFFF"/>
+              </w:rPr>
+              <w:t>] and not type_of_response[</w:t>
+            </w:r>
+            <w:r>
+              <w:rPr>
+                <w:color w:val="FF0000"/>
+                <w:shd w:val="clear" w:color="auto" w:fill="FFFFFF"/>
+              </w:rPr>
+              <w:t>‘</w:t>
+            </w:r>
+            <w:r>
+              <w:rPr>
+                <w:color w:val="FF0000"/>
+                <w:shd w:val="clear" w:color="auto" w:fill="FFFFFF"/>
+              </w:rPr>
+              <w:t>improper service</w:t>
+            </w:r>
+            <w:r>
+              <w:rPr>
+                <w:color w:val="FF0000"/>
+                <w:shd w:val="clear" w:color="auto" w:fill="FFFFFF"/>
+              </w:rPr>
+              <w:t>’</w:t>
+            </w:r>
+            <w:r>
+              <w:rPr>
+                <w:color w:val="FF0000"/>
+                <w:shd w:val="clear" w:color="auto" w:fill="FFFFFF"/>
+              </w:rPr>
+              <w:t>] and not (</w:t>
             </w:r>
             <w:r>
               <w:rPr>
                 <w:color w:val="FFC000"/>
                 <w:shd w:val="clear" w:color="auto" w:fill="FFFFFF"/>
               </w:rPr>
-              <w:t>type_of_response[‘case in 2 states’] and stage_of_other_case == ‘ended with order’</w:t>
+              <w:t>type_of_response[</w:t>
+            </w:r>
+            <w:r>
+              <w:rPr>
+                <w:color w:val="FFC000"/>
+                <w:shd w:val="clear" w:color="auto" w:fill="FFFFFF"/>
+              </w:rPr>
+              <w:t>‘</w:t>
+            </w:r>
+            <w:r>
+              <w:rPr>
+                <w:color w:val="FFC000"/>
+                <w:shd w:val="clear" w:color="auto" w:fill="FFFFFF"/>
+              </w:rPr>
+              <w:t>case in 2 states</w:t>
+            </w:r>
+            <w:r>
+              <w:rPr>
+                <w:color w:val="FFC000"/>
+                <w:shd w:val="clear" w:color="auto" w:fill="FFFFFF"/>
+              </w:rPr>
+              <w:t>’</w:t>
+            </w:r>
+            <w:r>
+              <w:rPr>
+                <w:color w:val="FFC000"/>
+                <w:shd w:val="clear" w:color="auto" w:fill="FFFFFF"/>
+              </w:rPr>
+              <w:t xml:space="preserve">] and stage_of_other_case == </w:t>
+            </w:r>
+            <w:r>
+              <w:rPr>
+                <w:color w:val="FFC000"/>
+                <w:shd w:val="clear" w:color="auto" w:fill="FFFFFF"/>
+              </w:rPr>
+              <w:t>‘</w:t>
+            </w:r>
+            <w:r>
+              <w:rPr>
+                <w:color w:val="FFC000"/>
+                <w:shd w:val="clear" w:color="auto" w:fill="FFFFFF"/>
+              </w:rPr>
+              <w:t>ended with order</w:t>
+            </w:r>
+            <w:r>
+              <w:rPr>
+                <w:color w:val="FFC000"/>
+                <w:shd w:val="clear" w:color="auto" w:fill="FFFFFF"/>
+              </w:rPr>
+              <w:t>’</w:t>
             </w:r>
             <w:r>
               <w:rPr>
@@ -5434,7 +7315,56 @@
                 <w:color w:val="FFC000"/>
                 <w:shd w:val="clear" w:color="auto" w:fill="FFFFFF"/>
               </w:rPr>
-              <w:t>type_of_response[‘default’] and stage_of_default == ‘judgment entered’</w:t>
+              <w:t>type_of_response[</w:t>
+            </w:r>
+            <w:r>
+              <w:rPr>
+                <w:color w:val="FFC000"/>
+                <w:shd w:val="clear" w:color="auto" w:fill="FFFFFF"/>
+              </w:rPr>
+              <w:t>‘</w:t>
+            </w:r>
+            <w:r>
+              <w:rPr>
+                <w:color w:val="FFC000"/>
+                <w:shd w:val="clear" w:color="auto" w:fill="FFFFFF"/>
+              </w:rPr>
+              <w:t>default</w:t>
+            </w:r>
+            <w:r>
+              <w:rPr>
+                <w:color w:val="FFC000"/>
+                <w:shd w:val="clear" w:color="auto" w:fill="FFFFFF"/>
+              </w:rPr>
+              <w:t>’</w:t>
+            </w:r>
+            <w:r>
+              <w:rPr>
+                <w:color w:val="FFC000"/>
+                <w:shd w:val="clear" w:color="auto" w:fill="FFFFFF"/>
+              </w:rPr>
+              <w:t xml:space="preserve">] and stage_of_default == </w:t>
+            </w:r>
+            <w:r>
+              <w:rPr>
+                <w:color w:val="FFC000"/>
+                <w:shd w:val="clear" w:color="auto" w:fill="FFFFFF"/>
+              </w:rPr>
+              <w:t>‘</w:t>
+            </w:r>
+            <w:r>
+              <w:rPr>
+                <w:color w:val="FFC000"/>
+                <w:shd w:val="clear" w:color="auto" w:fill="FFFFFF"/>
+              </w:rPr>
+              <w:t>judgment entered</w:t>
+            </w:r>
+            <w:r>
+              <w:rPr>
+                <w:color w:val="FFC000"/>
+                <w:shd w:val="clear" w:color="auto" w:fill="FFFFFF"/>
+              </w:rPr>
+              <w:t>’</w:t>
             </w:r>
             <w:r>
               <w:rPr>
@@ -5539,7 +7469,28 @@
                 <w:color w:val="92D050"/>
                 <w:shd w:val="clear" w:color="auto" w:fill="FFFFFF"/>
               </w:rPr>
-              <w:t>minor_children and not husband_not_father and wife_is_pregnant == 'not husband'</w:t>
+              <w:t xml:space="preserve">minor_children and not husband_not_father and wife_is_pregnant == </w:t>
+            </w:r>
+            <w:r>
+              <w:rPr>
+                <w:color w:val="92D050"/>
+                <w:shd w:val="clear" w:color="auto" w:fill="FFFFFF"/>
+              </w:rPr>
+              <w:t>‘</w:t>
+            </w:r>
+            <w:r>
+              <w:rPr>
+                <w:color w:val="92D050"/>
+                <w:shd w:val="clear" w:color="auto" w:fill="FFFFFF"/>
+              </w:rPr>
+              <w:t>not husband</w:t>
+            </w:r>
+            <w:r>
+              <w:rPr>
+                <w:color w:val="92D050"/>
+                <w:shd w:val="clear" w:color="auto" w:fill="FFFFFF"/>
+              </w:rPr>
+              <w:t>’</w:t>
             </w:r>
             <w:r>
               <w:rPr>
@@ -5561,7 +7512,28 @@
                 <w:shd w:val="clear" w:color="auto" w:fill="FFFFFF"/>
               </w:rPr>
               <w:lastRenderedPageBreak/>
-              <w:t>== 'not husband'</w:t>
+              <w:t xml:space="preserve">== </w:t>
+            </w:r>
+            <w:r>
+              <w:rPr>
+                <w:color w:val="92D050"/>
+                <w:shd w:val="clear" w:color="auto" w:fill="FFFFFF"/>
+              </w:rPr>
+              <w:t>‘</w:t>
+            </w:r>
+            <w:r>
+              <w:rPr>
+                <w:color w:val="92D050"/>
+                <w:shd w:val="clear" w:color="auto" w:fill="FFFFFF"/>
+              </w:rPr>
+              <w:t>not husband</w:t>
+            </w:r>
+            <w:r>
+              <w:rPr>
+                <w:color w:val="92D050"/>
+                <w:shd w:val="clear" w:color="auto" w:fill="FFFFFF"/>
+              </w:rPr>
+              <w:t>’</w:t>
             </w:r>
             <w:r>
               <w:rPr>

</xml_diff>

<commit_message>
fixing docx template tweaks
</commit_message>
<xml_diff>
--- a/docassemble/RespondingCaseToEndYourMarriageActionPlan/data/templates/responding_ending_marriage_action_plan.docx
+++ b/docassemble/RespondingCaseToEndYourMarriageActionPlan/data/templates/responding_ending_marriage_action_plan.docx
@@ -463,7 +463,7 @@
                 </mc:Choice>
                 <mc:Fallback>
                   <w:pict>
-                    <v:group w14:anchorId="07D319D7" id="Group 1" o:spid="_x0000_s1026" style="position:absolute;margin-left:0;margin-top:13.25pt;width:59.8pt;height:54.75pt;z-index:-503316478;mso-wrap-distance-right:25.2pt" coordsize="0,0" o:gfxdata="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">
+                    <v:group w14:anchorId="5A0BEBAC" id="Group 1" o:spid="_x0000_s1026" style="position:absolute;margin-left:0;margin-top:13.25pt;width:59.8pt;height:54.75pt;z-index:-503316478;mso-wrap-distance-right:25.2pt" coordsize="0,0" o:gfxdata="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">
                       <v:group id="Group 2" o:spid="_x0000_s1027" style="position:absolute;width:591120;height:694800" coordsize="0,0" o:gfxdata="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">
                         <v:shape id="Freeform 3" o:spid="_x0000_s1028" style="position:absolute;top:41400;width:591120;height:653400;visibility:visible;mso-wrap-style:square;v-text-anchor:top" coordsize="915,1071" o:gfxdata="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" path="m85,89l85,,914,r,985l824,985t,85l,1070,,92r573,l573,337r246,l824,1070xe" filled="f" strokecolor="#333" strokeweight=".44mm">
                           <v:path arrowok="t"/>
@@ -951,11 +951,9 @@
                 <w:highlight w:val="white"/>
               </w:rPr>
             </w:pPr>
-            <w:proofErr w:type="spellStart"/>
             <w:r>
               <w:t>answer_jurisdiction_step</w:t>
             </w:r>
-            <w:proofErr w:type="spellEnd"/>
           </w:p>
         </w:tc>
       </w:tr>
@@ -1153,11 +1151,9 @@
                 <w:highlight w:val="white"/>
               </w:rPr>
             </w:pPr>
-            <w:proofErr w:type="spellStart"/>
             <w:r>
               <w:t>proper_service_step</w:t>
             </w:r>
-            <w:proofErr w:type="spellEnd"/>
           </w:p>
         </w:tc>
       </w:tr>
@@ -1186,19 +1182,14 @@
               <w:outlineLvl w:val="1"/>
             </w:pPr>
             <w:r>
+              <w:t xml:space="preserve">{{ </w:t>
+            </w:r>
+            <w:r>
               <w:lastRenderedPageBreak/>
-              <w:t xml:space="preserve">{{ </w:t>
-            </w:r>
-            <w:proofErr w:type="spellStart"/>
-            <w:r>
               <w:t>proper_service_step</w:t>
             </w:r>
             <w:r>
-              <w:t>.subject</w:t>
-            </w:r>
-            <w:proofErr w:type="spellEnd"/>
-            <w:r>
-              <w:t xml:space="preserve"> }}</w:t>
+              <w:t>.subject }}</w:t>
             </w:r>
           </w:p>
         </w:tc>
@@ -1229,6 +1220,7 @@
               <w:spacing w:before="100" w:after="100"/>
             </w:pPr>
             <w:r>
+              <w:lastRenderedPageBreak/>
               <w:t>{{p (include_docx_template("</w:t>
             </w:r>
             <w:r>
@@ -1271,6 +1263,7 @@
               </w:rPr>
             </w:pPr>
             <w:r>
+              <w:lastRenderedPageBreak/>
               <w:t>{%tr endif %}</w:t>
             </w:r>
           </w:p>
@@ -1332,117 +1325,245 @@
               <w:rPr>
                 <w:color w:val="FF0000"/>
               </w:rPr>
-              <w:t xml:space="preserve">{%tr if </w:t>
-            </w:r>
-            <w:proofErr w:type="spellStart"/>
+              <w:t>{%tr if type_of_response.all_true(</w:t>
+            </w:r>
             <w:r>
               <w:rPr>
                 <w:color w:val="FF0000"/>
               </w:rPr>
-              <w:t>type_of_response.all_true</w:t>
-            </w:r>
-            <w:proofErr w:type="spellEnd"/>
+              <w:t>‘</w:t>
+            </w:r>
             <w:r>
               <w:rPr>
                 <w:color w:val="FF0000"/>
               </w:rPr>
+              <w:t>improper service</w:t>
+            </w:r>
+            <w:r>
+              <w:rPr>
+                <w:color w:val="FF0000"/>
+              </w:rPr>
+              <w:t>’</w:t>
+            </w:r>
+            <w:r>
+              <w:rPr>
+                <w:color w:val="FF0000"/>
+              </w:rPr>
+              <w:t>, exclusive = True)</w:t>
+            </w:r>
+            <w:r>
+              <w:rPr>
+                <w:color w:val="FF0000"/>
+              </w:rPr>
+              <w:t xml:space="preserve"> or (</w:t>
+            </w:r>
+            <w:r>
+              <w:rPr>
+                <w:color w:val="FFC000"/>
+              </w:rPr>
               <w:t>(</w:t>
             </w:r>
             <w:r>
               <w:rPr>
-                <w:color w:val="FF0000"/>
+                <w:color w:val="92D050"/>
+              </w:rPr>
+              <w:t>type_of_response.all_true(</w:t>
+            </w:r>
+            <w:r>
+              <w:rPr>
+                <w:color w:val="92D050"/>
               </w:rPr>
               <w:t>‘</w:t>
             </w:r>
             <w:r>
               <w:rPr>
-                <w:color w:val="FF0000"/>
+                <w:color w:val="92D050"/>
               </w:rPr>
               <w:t>improper service</w:t>
             </w:r>
             <w:r>
               <w:rPr>
-                <w:color w:val="FF0000"/>
+                <w:color w:val="92D050"/>
               </w:rPr>
               <w:t>’</w:t>
             </w:r>
             <w:r>
               <w:rPr>
-                <w:color w:val="FF0000"/>
-              </w:rPr>
-              <w:t>, exclusive = True)</w:t>
-            </w:r>
-            <w:r>
-              <w:rPr>
-                <w:color w:val="FF0000"/>
-              </w:rPr>
-              <w:t xml:space="preserve"> or (</w:t>
+                <w:color w:val="92D050"/>
+              </w:rPr>
+              <w:t xml:space="preserve">, </w:t>
+            </w:r>
+            <w:r>
+              <w:rPr>
+                <w:color w:val="92D050"/>
+              </w:rPr>
+              <w:t>‘</w:t>
+            </w:r>
+            <w:r>
+              <w:rPr>
+                <w:color w:val="92D050"/>
+              </w:rPr>
+              <w:t>wrong state</w:t>
+            </w:r>
+            <w:r>
+              <w:rPr>
+                <w:color w:val="92D050"/>
+              </w:rPr>
+              <w:t>’</w:t>
+            </w:r>
+            <w:r>
+              <w:rPr>
+                <w:color w:val="92D050"/>
+              </w:rPr>
+              <w:t>)</w:t>
             </w:r>
             <w:r>
               <w:rPr>
                 <w:color w:val="FFC000"/>
               </w:rPr>
+              <w:t xml:space="preserve"> </w:t>
+            </w:r>
+            <w:r>
+              <w:rPr>
+                <w:color w:val="92D050"/>
+              </w:rPr>
+              <w:t>or</w:t>
+            </w:r>
+            <w:r>
+              <w:rPr>
+                <w:color w:val="FFC000"/>
+              </w:rPr>
+              <w:t xml:space="preserve"> </w:t>
+            </w:r>
+            <w:r>
+              <w:rPr>
+                <w:color w:val="92D050"/>
+              </w:rPr>
               <w:t>(</w:t>
             </w:r>
-            <w:proofErr w:type="spellStart"/>
+            <w:r>
+              <w:rPr>
+                <w:color w:val="00B050"/>
+              </w:rPr>
+              <w:t>type_of_response.all_true(</w:t>
+            </w:r>
+            <w:r>
+              <w:rPr>
+                <w:color w:val="00B050"/>
+              </w:rPr>
+              <w:t>‘</w:t>
+            </w:r>
+            <w:r>
+              <w:rPr>
+                <w:color w:val="00B050"/>
+              </w:rPr>
+              <w:t>improper service</w:t>
+            </w:r>
+            <w:r>
+              <w:rPr>
+                <w:color w:val="00B050"/>
+              </w:rPr>
+              <w:t>’</w:t>
+            </w:r>
+            <w:r>
+              <w:rPr>
+                <w:color w:val="00B050"/>
+              </w:rPr>
+              <w:t xml:space="preserve">, </w:t>
+            </w:r>
+            <w:r>
+              <w:rPr>
+                <w:color w:val="00B050"/>
+              </w:rPr>
+              <w:t>‘</w:t>
+            </w:r>
+            <w:r>
+              <w:rPr>
+                <w:color w:val="00B050"/>
+              </w:rPr>
+              <w:t>case in 2 states</w:t>
+            </w:r>
+            <w:r>
+              <w:rPr>
+                <w:color w:val="00B050"/>
+              </w:rPr>
+              <w:t>’</w:t>
+            </w:r>
+            <w:r>
+              <w:rPr>
+                <w:color w:val="00B050"/>
+              </w:rPr>
+              <w:t>)</w:t>
+            </w:r>
+            <w:r>
+              <w:rPr>
+                <w:color w:val="00B050"/>
+              </w:rPr>
+              <w:t xml:space="preserve"> and stage_of_other_case == </w:t>
+            </w:r>
+            <w:r>
+              <w:rPr>
+                <w:color w:val="00B050"/>
+              </w:rPr>
+              <w:t>‘</w:t>
+            </w:r>
+            <w:r>
+              <w:rPr>
+                <w:color w:val="00B050"/>
+              </w:rPr>
+              <w:t>ended with no order</w:t>
+            </w:r>
+            <w:r>
+              <w:rPr>
+                <w:color w:val="00B050"/>
+              </w:rPr>
+              <w:t>’</w:t>
+            </w:r>
             <w:r>
               <w:rPr>
                 <w:color w:val="92D050"/>
               </w:rPr>
-              <w:t>type_of_response.all_true</w:t>
-            </w:r>
-            <w:proofErr w:type="spellEnd"/>
-            <w:r>
-              <w:rPr>
-                <w:color w:val="92D050"/>
-              </w:rPr>
-              <w:t>(</w:t>
-            </w:r>
-            <w:r>
-              <w:rPr>
-                <w:color w:val="92D050"/>
+              <w:t>)</w:t>
+            </w:r>
+            <w:r>
+              <w:rPr>
+                <w:color w:val="FFC000"/>
+              </w:rPr>
+              <w:t>)</w:t>
+            </w:r>
+            <w:r>
+              <w:rPr>
+                <w:color w:val="FFC000"/>
+              </w:rPr>
+              <w:t xml:space="preserve"> </w:t>
+            </w:r>
+            <w:r>
+              <w:rPr>
+                <w:color w:val="FFC000"/>
+              </w:rPr>
+              <w:t>and type_of_response.all_false(</w:t>
+            </w:r>
+            <w:r>
+              <w:rPr>
+                <w:color w:val="FFC000"/>
               </w:rPr>
               <w:t>‘</w:t>
             </w:r>
             <w:r>
               <w:rPr>
-                <w:color w:val="92D050"/>
-              </w:rPr>
-              <w:t>improper service</w:t>
-            </w:r>
-            <w:r>
-              <w:rPr>
-                <w:color w:val="92D050"/>
+                <w:color w:val="FFC000"/>
+              </w:rPr>
+              <w:t>default</w:t>
+            </w:r>
+            <w:r>
+              <w:rPr>
+                <w:color w:val="FFC000"/>
               </w:rPr>
               <w:t>’</w:t>
             </w:r>
             <w:r>
               <w:rPr>
-                <w:color w:val="92D050"/>
-              </w:rPr>
-              <w:t xml:space="preserve">, </w:t>
-            </w:r>
-            <w:r>
-              <w:rPr>
-                <w:color w:val="92D050"/>
-              </w:rPr>
-              <w:t>‘</w:t>
-            </w:r>
-            <w:r>
-              <w:rPr>
-                <w:color w:val="92D050"/>
-              </w:rPr>
-              <w:t>wrong state</w:t>
-            </w:r>
-            <w:r>
-              <w:rPr>
-                <w:color w:val="92D050"/>
-              </w:rPr>
-              <w:t>’</w:t>
-            </w:r>
-            <w:r>
-              <w:rPr>
-                <w:color w:val="92D050"/>
+                <w:color w:val="FFC000"/>
               </w:rPr>
               <w:t>)</w:t>
             </w:r>
@@ -1454,190 +1575,10 @@
             </w:r>
             <w:r>
               <w:rPr>
-                <w:color w:val="92D050"/>
-              </w:rPr>
-              <w:t>or</w:t>
-            </w:r>
-            <w:r>
-              <w:rPr>
                 <w:color w:val="FFC000"/>
               </w:rPr>
-              <w:t xml:space="preserve"> </w:t>
-            </w:r>
-            <w:r>
-              <w:rPr>
-                <w:color w:val="92D050"/>
-              </w:rPr>
-              <w:t>(</w:t>
-            </w:r>
-            <w:proofErr w:type="spellStart"/>
-            <w:r>
-              <w:rPr>
-                <w:color w:val="00B050"/>
-              </w:rPr>
-              <w:t>type_of_response.all_true</w:t>
-            </w:r>
-            <w:proofErr w:type="spellEnd"/>
-            <w:r>
-              <w:rPr>
-                <w:color w:val="00B050"/>
-              </w:rPr>
-              <w:t>(</w:t>
-            </w:r>
-            <w:r>
-              <w:rPr>
-                <w:color w:val="00B050"/>
-              </w:rPr>
-              <w:t>‘</w:t>
-            </w:r>
-            <w:r>
-              <w:rPr>
-                <w:color w:val="00B050"/>
-              </w:rPr>
-              <w:t>improper service</w:t>
-            </w:r>
-            <w:r>
-              <w:rPr>
-                <w:color w:val="00B050"/>
-              </w:rPr>
-              <w:t>’</w:t>
-            </w:r>
-            <w:r>
-              <w:rPr>
-                <w:color w:val="00B050"/>
-              </w:rPr>
-              <w:t xml:space="preserve">, </w:t>
-            </w:r>
-            <w:r>
-              <w:rPr>
-                <w:color w:val="00B050"/>
-              </w:rPr>
-              <w:t>‘</w:t>
-            </w:r>
-            <w:r>
-              <w:rPr>
-                <w:color w:val="00B050"/>
-              </w:rPr>
-              <w:t>case in 2 states</w:t>
-            </w:r>
-            <w:r>
-              <w:rPr>
-                <w:color w:val="00B050"/>
-              </w:rPr>
-              <w:t>’</w:t>
-            </w:r>
-            <w:r>
-              <w:rPr>
-                <w:color w:val="00B050"/>
-              </w:rPr>
-              <w:t>)</w:t>
-            </w:r>
-            <w:r>
-              <w:rPr>
-                <w:color w:val="00B050"/>
-              </w:rPr>
-              <w:t xml:space="preserve"> and stage_of_other_case == </w:t>
-            </w:r>
-            <w:r>
-              <w:rPr>
-                <w:color w:val="00B050"/>
-              </w:rPr>
-              <w:t>‘</w:t>
-            </w:r>
-            <w:r>
-              <w:rPr>
-                <w:color w:val="00B050"/>
-              </w:rPr>
-              <w:t>ended with no order</w:t>
-            </w:r>
-            <w:r>
-              <w:rPr>
-                <w:color w:val="00B050"/>
-              </w:rPr>
-              <w:t>’</w:t>
-            </w:r>
-            <w:r>
-              <w:rPr>
-                <w:color w:val="92D050"/>
-              </w:rPr>
-              <w:t>)</w:t>
-            </w:r>
-            <w:r>
-              <w:rPr>
-                <w:color w:val="FFC000"/>
-              </w:rPr>
-              <w:t>)</w:t>
-            </w:r>
-            <w:r>
-              <w:rPr>
-                <w:color w:val="FF0000"/>
-              </w:rPr>
-              <w:t xml:space="preserve"> </w:t>
-            </w:r>
-            <w:r>
-              <w:rPr>
-                <w:color w:val="FFC000"/>
-              </w:rPr>
-              <w:t xml:space="preserve">and </w:t>
-            </w:r>
-            <w:proofErr w:type="spellStart"/>
-            <w:r>
-              <w:rPr>
-                <w:color w:val="FFC000"/>
-              </w:rPr>
-              <w:t>type_of_response.all_false</w:t>
-            </w:r>
-            <w:proofErr w:type="spellEnd"/>
-            <w:r>
-              <w:rPr>
-                <w:color w:val="FFC000"/>
-              </w:rPr>
-              <w:t>(</w:t>
-            </w:r>
-            <w:r>
-              <w:rPr>
-                <w:color w:val="FFC000"/>
-              </w:rPr>
-              <w:t>‘</w:t>
-            </w:r>
-            <w:r>
-              <w:rPr>
-                <w:color w:val="FFC000"/>
-              </w:rPr>
-              <w:t>default</w:t>
-            </w:r>
-            <w:r>
-              <w:rPr>
-                <w:color w:val="FFC000"/>
-              </w:rPr>
-              <w:t>’</w:t>
-            </w:r>
-            <w:r>
-              <w:rPr>
-                <w:color w:val="FFC000"/>
-              </w:rPr>
-              <w:t>)</w:t>
-            </w:r>
-            <w:r>
-              <w:rPr>
-                <w:color w:val="FFC000"/>
-              </w:rPr>
-              <w:t xml:space="preserve"> </w:t>
-            </w:r>
-            <w:r>
-              <w:rPr>
-                <w:color w:val="FFC000"/>
-              </w:rPr>
-              <w:t xml:space="preserve">and not </w:t>
-            </w:r>
-            <w:proofErr w:type="spellStart"/>
-            <w:r>
-              <w:rPr>
-                <w:color w:val="FFC000"/>
-              </w:rPr>
-              <w:t>proper_service</w:t>
-            </w:r>
-            <w:proofErr w:type="spellEnd"/>
+              <w:t>and not proper_service</w:t>
+            </w:r>
             <w:r>
               <w:rPr>
                 <w:color w:val="FF0000"/>
@@ -1671,11 +1612,9 @@
             <w:pPr>
               <w:pStyle w:val="Body"/>
             </w:pPr>
-            <w:proofErr w:type="spellStart"/>
             <w:r>
               <w:t>decide_after_improper_service_step</w:t>
             </w:r>
-            <w:proofErr w:type="spellEnd"/>
           </w:p>
         </w:tc>
       </w:tr>
@@ -1711,7 +1650,21 @@
                 <w:rFonts w:eastAsia="Calibri"/>
                 <w:shd w:val="clear" w:color="auto" w:fill="FFFFFF"/>
               </w:rPr>
-              <w:t>{{ decide_after_improper_service_step }}</w:t>
+              <w:t>{{ decide_after_improper_service_step</w:t>
+            </w:r>
+            <w:r>
+              <w:rPr>
+                <w:rFonts w:eastAsia="Calibri"/>
+                <w:shd w:val="clear" w:color="auto" w:fill="FFFFFF"/>
+              </w:rPr>
+              <w:t>.subject</w:t>
+            </w:r>
+            <w:r>
+              <w:rPr>
+                <w:rFonts w:eastAsia="Calibri"/>
+                <w:shd w:val="clear" w:color="auto" w:fill="FFFFFF"/>
+              </w:rPr>
+              <w:t xml:space="preserve"> }}</w:t>
             </w:r>
           </w:p>
         </w:tc>
@@ -2022,26 +1975,26 @@
               <w:rPr>
                 <w:shd w:val="clear" w:color="auto" w:fill="FFFFFF"/>
               </w:rPr>
-              <w:t xml:space="preserve">{%tr if </w:t>
+              <w:t>{%tr if type_of_response[</w:t>
             </w:r>
             <w:r>
               <w:rPr>
                 <w:shd w:val="clear" w:color="auto" w:fill="FFFFFF"/>
               </w:rPr>
+              <w:t>‘</w:t>
+            </w:r>
+            <w:r>
+              <w:rPr>
+                <w:shd w:val="clear" w:color="auto" w:fill="FFFFFF"/>
+              </w:rPr>
+              <w:t>def</w:t>
+            </w:r>
+            <w:r>
+              <w:rPr>
+                <w:shd w:val="clear" w:color="auto" w:fill="FFFFFF"/>
+              </w:rPr>
               <w:lastRenderedPageBreak/>
-              <w:t>type_of_response[</w:t>
-            </w:r>
-            <w:r>
-              <w:rPr>
-                <w:shd w:val="clear" w:color="auto" w:fill="FFFFFF"/>
-              </w:rPr>
-              <w:t>‘</w:t>
-            </w:r>
-            <w:r>
-              <w:rPr>
-                <w:shd w:val="clear" w:color="auto" w:fill="FFFFFF"/>
-              </w:rPr>
-              <w:t>default</w:t>
+              <w:t>ault</w:t>
             </w:r>
             <w:r>
               <w:rPr>
@@ -2077,12 +2030,10 @@
               <w:pStyle w:val="Body"/>
               <w:spacing w:before="0" w:after="0"/>
             </w:pPr>
-            <w:proofErr w:type="spellStart"/>
             <w:r>
               <w:lastRenderedPageBreak/>
               <w:t>default_options_step</w:t>
             </w:r>
-            <w:proofErr w:type="spellEnd"/>
           </w:p>
         </w:tc>
       </w:tr>
@@ -2255,191 +2206,163 @@
               <w:rPr>
                 <w:color w:val="FF0000"/>
               </w:rPr>
-              <w:t xml:space="preserve"> and </w:t>
-            </w:r>
-            <w:proofErr w:type="spellStart"/>
+              <w:t xml:space="preserve"> and case_type == </w:t>
+            </w:r>
             <w:r>
               <w:rPr>
                 <w:color w:val="FF0000"/>
               </w:rPr>
-              <w:t>case_type</w:t>
-            </w:r>
-            <w:proofErr w:type="spellEnd"/>
+              <w:t>‘</w:t>
+            </w:r>
             <w:r>
               <w:rPr>
                 <w:color w:val="FF0000"/>
               </w:rPr>
-              <w:t xml:space="preserve"> == </w:t>
+              <w:t>legal separation</w:t>
             </w:r>
             <w:r>
               <w:rPr>
                 <w:color w:val="FF0000"/>
               </w:rPr>
+              <w:t>’</w:t>
+            </w:r>
+            <w:r>
+              <w:rPr>
+                <w:color w:val="FF0000"/>
+              </w:rPr>
+              <w:t xml:space="preserve"> and not </w:t>
+            </w:r>
+            <w:r>
+              <w:rPr>
+                <w:color w:val="FFC000"/>
+              </w:rPr>
+              <w:t>(</w:t>
+            </w:r>
+            <w:r>
+              <w:rPr>
+                <w:color w:val="92D050"/>
+              </w:rPr>
+              <w:t>type_of_response[</w:t>
+            </w:r>
+            <w:r>
+              <w:rPr>
+                <w:color w:val="92D050"/>
+              </w:rPr>
               <w:t>‘</w:t>
             </w:r>
             <w:r>
               <w:rPr>
+                <w:color w:val="92D050"/>
+              </w:rPr>
+              <w:t>case in 2 states</w:t>
+            </w:r>
+            <w:r>
+              <w:rPr>
+                <w:color w:val="92D050"/>
+              </w:rPr>
+              <w:t>’</w:t>
+            </w:r>
+            <w:r>
+              <w:rPr>
+                <w:color w:val="92D050"/>
+              </w:rPr>
+              <w:t xml:space="preserve">] and stage_of_other_case == </w:t>
+            </w:r>
+            <w:r>
+              <w:rPr>
+                <w:color w:val="92D050"/>
+              </w:rPr>
+              <w:t>‘</w:t>
+            </w:r>
+            <w:r>
+              <w:rPr>
+                <w:color w:val="92D050"/>
+              </w:rPr>
+              <w:t>ended with order</w:t>
+            </w:r>
+            <w:r>
+              <w:rPr>
+                <w:color w:val="92D050"/>
+              </w:rPr>
+              <w:t>’</w:t>
+            </w:r>
+            <w:r>
+              <w:rPr>
+                <w:color w:val="FFC000"/>
+              </w:rPr>
+              <w:t>)</w:t>
+            </w:r>
+            <w:r>
+              <w:rPr>
                 <w:color w:val="FF0000"/>
               </w:rPr>
-              <w:t>legal separation</w:t>
+              <w:t xml:space="preserve"> and not </w:t>
+            </w:r>
+            <w:r>
+              <w:rPr>
+                <w:color w:val="FFC000"/>
+              </w:rPr>
+              <w:t>(</w:t>
+            </w:r>
+            <w:r>
+              <w:rPr>
+                <w:color w:val="92D050"/>
+              </w:rPr>
+              <w:t>type_of_response[</w:t>
+            </w:r>
+            <w:r>
+              <w:rPr>
+                <w:color w:val="92D050"/>
+              </w:rPr>
+              <w:t>‘</w:t>
+            </w:r>
+            <w:r>
+              <w:rPr>
+                <w:color w:val="92D050"/>
+              </w:rPr>
+              <w:t>default</w:t>
+            </w:r>
+            <w:r>
+              <w:rPr>
+                <w:color w:val="92D050"/>
+              </w:rPr>
+              <w:t>’</w:t>
+            </w:r>
+            <w:r>
+              <w:rPr>
+                <w:color w:val="92D050"/>
+              </w:rPr>
+              <w:t xml:space="preserve">] and stage_of_default == </w:t>
+            </w:r>
+            <w:r>
+              <w:rPr>
+                <w:color w:val="92D050"/>
+              </w:rPr>
+              <w:t>‘</w:t>
+            </w:r>
+            <w:r>
+              <w:rPr>
+                <w:color w:val="92D050"/>
+              </w:rPr>
+              <w:t>judgment entered</w:t>
+            </w:r>
+            <w:r>
+              <w:rPr>
+                <w:color w:val="92D050"/>
+              </w:rPr>
+              <w:t>’</w:t>
+            </w:r>
+            <w:r>
+              <w:rPr>
+                <w:color w:val="FFC000"/>
+              </w:rPr>
+              <w:t xml:space="preserve">) </w:t>
             </w:r>
             <w:r>
               <w:rPr>
                 <w:color w:val="FF0000"/>
               </w:rPr>
-              <w:t>’</w:t>
-            </w:r>
-            <w:r>
-              <w:rPr>
-                <w:color w:val="FF0000"/>
-              </w:rPr>
-              <w:t xml:space="preserve"> and not </w:t>
-            </w:r>
-            <w:r>
-              <w:rPr>
-                <w:color w:val="FFC000"/>
-              </w:rPr>
-              <w:t>(</w:t>
-            </w:r>
-            <w:r>
-              <w:rPr>
-                <w:color w:val="92D050"/>
-              </w:rPr>
-              <w:t>type_of_response[</w:t>
-            </w:r>
-            <w:r>
-              <w:rPr>
-                <w:color w:val="92D050"/>
-              </w:rPr>
-              <w:t>‘</w:t>
-            </w:r>
-            <w:r>
-              <w:rPr>
-                <w:color w:val="92D050"/>
-              </w:rPr>
-              <w:t>case in 2 states</w:t>
-            </w:r>
-            <w:r>
-              <w:rPr>
-                <w:color w:val="92D050"/>
-              </w:rPr>
-              <w:t>’</w:t>
-            </w:r>
-            <w:r>
-              <w:rPr>
-                <w:color w:val="92D050"/>
-              </w:rPr>
-              <w:t xml:space="preserve">] and stage_of_other_case == </w:t>
-            </w:r>
-            <w:r>
-              <w:rPr>
-                <w:color w:val="92D050"/>
-              </w:rPr>
-              <w:t>‘</w:t>
-            </w:r>
-            <w:r>
-              <w:rPr>
-                <w:color w:val="92D050"/>
-              </w:rPr>
-              <w:t>ended with order</w:t>
-            </w:r>
-            <w:r>
-              <w:rPr>
-                <w:color w:val="92D050"/>
-              </w:rPr>
-              <w:t>’</w:t>
-            </w:r>
-            <w:r>
-              <w:rPr>
-                <w:color w:val="FFC000"/>
-              </w:rPr>
-              <w:t>)</w:t>
-            </w:r>
-            <w:r>
-              <w:rPr>
-                <w:color w:val="FF0000"/>
-              </w:rPr>
-              <w:t xml:space="preserve"> and not </w:t>
-            </w:r>
-            <w:r>
-              <w:rPr>
-                <w:color w:val="FFC000"/>
-              </w:rPr>
-              <w:t>(</w:t>
-            </w:r>
-            <w:r>
-              <w:rPr>
-                <w:color w:val="92D050"/>
-              </w:rPr>
-              <w:t>type_of_response[</w:t>
-            </w:r>
-            <w:r>
-              <w:rPr>
-                <w:color w:val="92D050"/>
-              </w:rPr>
-              <w:t>‘</w:t>
-            </w:r>
-            <w:r>
-              <w:rPr>
-                <w:color w:val="92D050"/>
-              </w:rPr>
-              <w:t>default</w:t>
-            </w:r>
-            <w:r>
-              <w:rPr>
-                <w:color w:val="92D050"/>
-              </w:rPr>
-              <w:t>’</w:t>
-            </w:r>
-            <w:r>
-              <w:rPr>
-                <w:color w:val="92D050"/>
-              </w:rPr>
-              <w:t xml:space="preserve">] and stage_of_default == </w:t>
-            </w:r>
-            <w:r>
-              <w:rPr>
-                <w:color w:val="92D050"/>
-              </w:rPr>
-              <w:t>‘</w:t>
-            </w:r>
-            <w:r>
-              <w:rPr>
-                <w:color w:val="92D050"/>
-              </w:rPr>
-              <w:t>judgment entered</w:t>
-            </w:r>
-            <w:r>
-              <w:rPr>
-                <w:color w:val="92D050"/>
-              </w:rPr>
-              <w:t>’</w:t>
-            </w:r>
-            <w:r>
-              <w:rPr>
-                <w:color w:val="FFC000"/>
-              </w:rPr>
-              <w:t xml:space="preserve">) </w:t>
-            </w:r>
-            <w:r>
-              <w:rPr>
-                <w:color w:val="FF0000"/>
-              </w:rPr>
-              <w:t xml:space="preserve">and </w:t>
-            </w:r>
-            <w:proofErr w:type="spellStart"/>
-            <w:r>
-              <w:rPr>
-                <w:color w:val="FF0000"/>
-              </w:rPr>
-              <w:t>want_legal_separation</w:t>
-            </w:r>
-            <w:proofErr w:type="spellEnd"/>
-            <w:r>
-              <w:rPr>
-                <w:color w:val="FF0000"/>
-              </w:rPr>
-              <w:t xml:space="preserve"> == </w:t>
+              <w:t xml:space="preserve">and want_legal_separation == </w:t>
             </w:r>
             <w:r>
               <w:rPr>
@@ -2487,11 +2410,9 @@
               <w:pStyle w:val="Body"/>
               <w:spacing w:before="0" w:after="0"/>
             </w:pPr>
-            <w:proofErr w:type="spellStart"/>
             <w:r>
               <w:t>divorce_legal_separation_diff_step</w:t>
             </w:r>
-            <w:proofErr w:type="spellEnd"/>
           </w:p>
         </w:tc>
       </w:tr>
@@ -2522,16 +2443,11 @@
             <w:r>
               <w:t xml:space="preserve">{{ </w:t>
             </w:r>
-            <w:proofErr w:type="spellStart"/>
             <w:r>
               <w:t>divorce_legal_separation_diff_step</w:t>
             </w:r>
             <w:r>
-              <w:t>.subject</w:t>
-            </w:r>
-            <w:proofErr w:type="spellEnd"/>
-            <w:r>
-              <w:t xml:space="preserve"> }}</w:t>
+              <w:t>.subject }}</w:t>
             </w:r>
           </w:p>
         </w:tc>
@@ -2645,15 +2561,15 @@
               <w:ind w:left="404"/>
             </w:pPr>
             <w:r>
+              <w:t>Issue a parenting plan that states:</w:t>
+            </w:r>
+          </w:p>
+          <w:p>
+            <w:pPr>
+              <w:pStyle w:val="Body"/>
+            </w:pPr>
+            <w:r>
               <w:lastRenderedPageBreak/>
-              <w:t>Issue a parenting plan that states:</w:t>
-            </w:r>
-          </w:p>
-          <w:p>
-            <w:pPr>
-              <w:pStyle w:val="Body"/>
-            </w:pPr>
-            <w:r>
               <w:t xml:space="preserve">      1. A schedule for each parent to spend time with the children and</w:t>
             </w:r>
           </w:p>
@@ -2990,23 +2906,21 @@
               </w:rPr>
               <w:t>‘</w:t>
             </w:r>
-            <w:proofErr w:type="spellStart"/>
             <w:r>
               <w:rPr>
                 <w:color w:val="FF0000"/>
                 <w:sz w:val="20"/>
                 <w:szCs w:val="20"/>
               </w:rPr>
-              <w:t>ak</w:t>
-            </w:r>
-            <w:proofErr w:type="spellEnd"/>
+              <w:t>ak divorce case</w:t>
+            </w:r>
             <w:r>
               <w:rPr>
                 <w:color w:val="FF0000"/>
                 <w:sz w:val="20"/>
                 <w:szCs w:val="20"/>
               </w:rPr>
-              <w:t xml:space="preserve"> divorce case</w:t>
+              <w:t>’</w:t>
             </w:r>
             <w:r>
               <w:rPr>
@@ -3014,6 +2928,70 @@
                 <w:sz w:val="20"/>
                 <w:szCs w:val="20"/>
               </w:rPr>
+              <w:t>]</w:t>
+            </w:r>
+            <w:r>
+              <w:rPr>
+                <w:color w:val="FF0000"/>
+                <w:sz w:val="20"/>
+                <w:szCs w:val="20"/>
+              </w:rPr>
+              <w:t xml:space="preserve"> </w:t>
+            </w:r>
+            <w:r>
+              <w:rPr>
+                <w:color w:val="4285F4"/>
+                <w:sz w:val="20"/>
+                <w:szCs w:val="20"/>
+              </w:rPr>
+              <w:t>and</w:t>
+            </w:r>
+            <w:r>
+              <w:rPr>
+                <w:color w:val="FF0000"/>
+                <w:sz w:val="20"/>
+                <w:szCs w:val="20"/>
+              </w:rPr>
+              <w:t xml:space="preserve"> </w:t>
+            </w:r>
+            <w:r>
+              <w:rPr>
+                <w:color w:val="34A853"/>
+                <w:sz w:val="20"/>
+                <w:szCs w:val="20"/>
+              </w:rPr>
+              <w:t>case_type</w:t>
+            </w:r>
+            <w:r>
+              <w:rPr>
+                <w:color w:val="FF0000"/>
+                <w:sz w:val="20"/>
+                <w:szCs w:val="20"/>
+              </w:rPr>
+              <w:t xml:space="preserve"> == </w:t>
+            </w:r>
+            <w:r>
+              <w:rPr>
+                <w:color w:val="FF0000"/>
+                <w:sz w:val="20"/>
+                <w:szCs w:val="20"/>
+              </w:rPr>
+              <w:t>‘</w:t>
+            </w:r>
+            <w:r>
+              <w:rPr>
+                <w:color w:val="FF0000"/>
+                <w:sz w:val="20"/>
+                <w:szCs w:val="20"/>
+              </w:rPr>
+              <w:t>legal separation</w:t>
+            </w:r>
+            <w:r>
+              <w:rPr>
+                <w:color w:val="FF0000"/>
+                <w:sz w:val="20"/>
+                <w:szCs w:val="20"/>
+              </w:rPr>
               <w:t>’</w:t>
             </w:r>
             <w:r>
@@ -3022,11 +3000,339 @@
                 <w:sz w:val="20"/>
                 <w:szCs w:val="20"/>
               </w:rPr>
+              <w:t xml:space="preserve"> </w:t>
+            </w:r>
+            <w:r>
+              <w:rPr>
+                <w:color w:val="4285F4"/>
+                <w:sz w:val="20"/>
+                <w:szCs w:val="20"/>
+              </w:rPr>
+              <w:t>and</w:t>
+            </w:r>
+            <w:r>
+              <w:rPr>
+                <w:color w:val="FF0000"/>
+                <w:sz w:val="20"/>
+                <w:szCs w:val="20"/>
+              </w:rPr>
+              <w:t xml:space="preserve"> </w:t>
+            </w:r>
+            <w:r>
+              <w:rPr>
+                <w:color w:val="34A853"/>
+                <w:sz w:val="20"/>
+                <w:szCs w:val="20"/>
+              </w:rPr>
+              <w:t>want_legal_separation</w:t>
+            </w:r>
+            <w:r>
+              <w:rPr>
+                <w:color w:val="FF0000"/>
+                <w:sz w:val="20"/>
+                <w:szCs w:val="20"/>
+              </w:rPr>
+              <w:t xml:space="preserve"> in(</w:t>
+            </w:r>
+            <w:r>
+              <w:rPr>
+                <w:color w:val="FF0000"/>
+                <w:sz w:val="20"/>
+                <w:szCs w:val="20"/>
+              </w:rPr>
+              <w:t>‘</w:t>
+            </w:r>
+            <w:r>
+              <w:rPr>
+                <w:color w:val="FF0000"/>
+                <w:sz w:val="20"/>
+                <w:szCs w:val="20"/>
+              </w:rPr>
+              <w:t>no</w:t>
+            </w:r>
+            <w:r>
+              <w:rPr>
+                <w:color w:val="FF0000"/>
+                <w:sz w:val="20"/>
+                <w:szCs w:val="20"/>
+              </w:rPr>
+              <w:t>’</w:t>
+            </w:r>
+            <w:r>
+              <w:rPr>
+                <w:color w:val="FF0000"/>
+                <w:sz w:val="20"/>
+                <w:szCs w:val="20"/>
+              </w:rPr>
+              <w:t xml:space="preserve">, </w:t>
+            </w:r>
+            <w:r>
+              <w:rPr>
+                <w:color w:val="FF0000"/>
+                <w:sz w:val="20"/>
+                <w:szCs w:val="20"/>
+              </w:rPr>
+              <w:t>‘</w:t>
+            </w:r>
+            <w:r>
+              <w:rPr>
+                <w:color w:val="FF0000"/>
+                <w:sz w:val="20"/>
+                <w:szCs w:val="20"/>
+              </w:rPr>
+              <w:t>unsure</w:t>
+            </w:r>
+            <w:r>
+              <w:rPr>
+                <w:color w:val="FF0000"/>
+                <w:sz w:val="20"/>
+                <w:szCs w:val="20"/>
+              </w:rPr>
+              <w:t>’</w:t>
+            </w:r>
+            <w:r>
+              <w:rPr>
+                <w:color w:val="FF0000"/>
+                <w:sz w:val="20"/>
+                <w:szCs w:val="20"/>
+              </w:rPr>
+              <w:t xml:space="preserve">) </w:t>
+            </w:r>
+            <w:r>
+              <w:rPr>
+                <w:color w:val="4285F4"/>
+                <w:sz w:val="20"/>
+                <w:szCs w:val="20"/>
+              </w:rPr>
+              <w:t>and</w:t>
+            </w:r>
+            <w:r>
+              <w:rPr>
+                <w:color w:val="FF0000"/>
+                <w:sz w:val="20"/>
+                <w:szCs w:val="20"/>
+              </w:rPr>
+              <w:t xml:space="preserve"> </w:t>
+            </w:r>
+            <w:r>
+              <w:rPr>
+                <w:color w:val="34A853"/>
+                <w:sz w:val="20"/>
+                <w:szCs w:val="20"/>
+              </w:rPr>
+              <w:t>want_help_to_agree)</w:t>
+            </w:r>
+            <w:r>
+              <w:rPr>
+                <w:color w:val="FF9900"/>
+                <w:sz w:val="20"/>
+                <w:szCs w:val="20"/>
+              </w:rPr>
+              <w:t>)</w:t>
+            </w:r>
+            <w:r>
+              <w:rPr>
+                <w:color w:val="FF0000"/>
+                <w:sz w:val="20"/>
+                <w:szCs w:val="20"/>
+              </w:rPr>
+              <w:t>) or (</w:t>
+            </w:r>
+            <w:r>
+              <w:rPr>
+                <w:color w:val="34A853"/>
+                <w:sz w:val="20"/>
+                <w:szCs w:val="20"/>
+              </w:rPr>
+              <w:t>user_need</w:t>
+            </w:r>
+            <w:r>
+              <w:rPr>
+                <w:color w:val="FF9900"/>
+                <w:sz w:val="20"/>
+                <w:szCs w:val="20"/>
+              </w:rPr>
+              <w:t xml:space="preserve"> </w:t>
+            </w:r>
+            <w:r>
+              <w:rPr>
+                <w:sz w:val="20"/>
+                <w:szCs w:val="20"/>
+              </w:rPr>
+              <w:t>in(</w:t>
+            </w:r>
+            <w:r>
+              <w:rPr>
+                <w:sz w:val="20"/>
+                <w:szCs w:val="20"/>
+              </w:rPr>
+              <w:t>‘</w:t>
+            </w:r>
+            <w:r>
+              <w:rPr>
+                <w:sz w:val="20"/>
+                <w:szCs w:val="20"/>
+              </w:rPr>
+              <w:t>answer custody</w:t>
+            </w:r>
+            <w:r>
+              <w:rPr>
+                <w:sz w:val="20"/>
+                <w:szCs w:val="20"/>
+              </w:rPr>
+              <w:t>’</w:t>
+            </w:r>
+            <w:r>
+              <w:rPr>
+                <w:sz w:val="20"/>
+                <w:szCs w:val="20"/>
+              </w:rPr>
+              <w:t xml:space="preserve">, </w:t>
+            </w:r>
+            <w:r>
+              <w:rPr>
+                <w:sz w:val="20"/>
+                <w:szCs w:val="20"/>
+              </w:rPr>
+              <w:t>‘</w:t>
+            </w:r>
+            <w:r>
+              <w:rPr>
+                <w:sz w:val="20"/>
+                <w:szCs w:val="20"/>
+              </w:rPr>
+              <w:t>answer divorce</w:t>
+            </w:r>
+            <w:r>
+              <w:rPr>
+                <w:sz w:val="20"/>
+                <w:szCs w:val="20"/>
+              </w:rPr>
+              <w:t>’</w:t>
+            </w:r>
+            <w:r>
+              <w:rPr>
+                <w:sz w:val="20"/>
+                <w:szCs w:val="20"/>
+              </w:rPr>
+              <w:t>)</w:t>
+            </w:r>
+            <w:r>
+              <w:rPr>
+                <w:color w:val="FF9900"/>
+                <w:sz w:val="20"/>
+                <w:szCs w:val="20"/>
+              </w:rPr>
+              <w:t xml:space="preserve"> and (</w:t>
+            </w:r>
+            <w:r>
+              <w:rPr>
+                <w:color w:val="34A853"/>
+                <w:sz w:val="20"/>
+                <w:szCs w:val="20"/>
+              </w:rPr>
+              <w:t>type_of_response</w:t>
+            </w:r>
+            <w:r>
+              <w:rPr>
+                <w:color w:val="34A853"/>
+                <w:sz w:val="20"/>
+                <w:szCs w:val="20"/>
+              </w:rPr>
+              <w:t>.all_false</w:t>
+            </w:r>
+            <w:r>
+              <w:rPr>
+                <w:color w:val="34A853"/>
+                <w:sz w:val="20"/>
+                <w:szCs w:val="20"/>
+              </w:rPr>
+              <w:t>()</w:t>
+            </w:r>
+            <w:r>
+              <w:rPr>
+                <w:sz w:val="20"/>
+                <w:szCs w:val="20"/>
+              </w:rPr>
+              <w:t xml:space="preserve"> </w:t>
+            </w:r>
+            <w:r>
+              <w:rPr>
+                <w:color w:val="00B050"/>
+                <w:sz w:val="20"/>
+                <w:szCs w:val="20"/>
+              </w:rPr>
+              <w:t>or</w:t>
+            </w:r>
+            <w:r>
+              <w:rPr>
+                <w:color w:val="92D050"/>
+                <w:sz w:val="20"/>
+                <w:szCs w:val="20"/>
+              </w:rPr>
+              <w:t xml:space="preserve"> </w:t>
+            </w:r>
+            <w:r>
+              <w:rPr>
+                <w:color w:val="00B050"/>
+                <w:sz w:val="20"/>
+                <w:szCs w:val="20"/>
+              </w:rPr>
+              <w:t>(</w:t>
+            </w:r>
+            <w:r>
+              <w:rPr>
+                <w:color w:val="00B0F0"/>
+                <w:sz w:val="20"/>
+                <w:szCs w:val="20"/>
+              </w:rPr>
+              <w:t>(</w:t>
+            </w:r>
+            <w:r>
+              <w:rPr>
+                <w:color w:val="9900FF"/>
+                <w:sz w:val="20"/>
+                <w:szCs w:val="20"/>
+              </w:rPr>
+              <w:t>type_of_response</w:t>
+            </w:r>
+            <w:r>
+              <w:rPr>
+                <w:sz w:val="20"/>
+                <w:szCs w:val="20"/>
+              </w:rPr>
+              <w:t>[</w:t>
+            </w:r>
+            <w:r>
+              <w:rPr>
+                <w:sz w:val="20"/>
+                <w:szCs w:val="20"/>
+              </w:rPr>
+              <w:t>‘</w:t>
+            </w:r>
+            <w:r>
+              <w:rPr>
+                <w:sz w:val="20"/>
+                <w:szCs w:val="20"/>
+              </w:rPr>
+              <w:t>ak custody case</w:t>
+            </w:r>
+            <w:r>
+              <w:rPr>
+                <w:sz w:val="20"/>
+                <w:szCs w:val="20"/>
+              </w:rPr>
+              <w:t>’</w:t>
+            </w:r>
+            <w:r>
+              <w:rPr>
+                <w:sz w:val="20"/>
+                <w:szCs w:val="20"/>
+              </w:rPr>
               <w:t>]</w:t>
             </w:r>
             <w:r>
               <w:rPr>
-                <w:color w:val="FF0000"/>
                 <w:sz w:val="20"/>
                 <w:szCs w:val="20"/>
               </w:rPr>
@@ -3034,41 +3340,376 @@
             </w:r>
             <w:r>
               <w:rPr>
+                <w:color w:val="9900FF"/>
+                <w:sz w:val="20"/>
+                <w:szCs w:val="20"/>
+              </w:rPr>
+              <w:t>or (</w:t>
+            </w:r>
+            <w:r>
+              <w:rPr>
+                <w:color w:val="34A853"/>
+                <w:sz w:val="20"/>
+                <w:szCs w:val="20"/>
+              </w:rPr>
+              <w:t>type_of_response</w:t>
+            </w:r>
+            <w:r>
+              <w:rPr>
+                <w:color w:val="34A853"/>
+                <w:sz w:val="20"/>
+                <w:szCs w:val="20"/>
+              </w:rPr>
+              <w:t>[</w:t>
+            </w:r>
+            <w:r>
+              <w:rPr>
+                <w:sz w:val="20"/>
+                <w:szCs w:val="20"/>
+              </w:rPr>
+              <w:t>‘</w:t>
+            </w:r>
+            <w:r>
+              <w:rPr>
+                <w:sz w:val="20"/>
+                <w:szCs w:val="20"/>
+              </w:rPr>
+              <w:t>ak divorce case</w:t>
+            </w:r>
+            <w:r>
+              <w:rPr>
+                <w:sz w:val="20"/>
+                <w:szCs w:val="20"/>
+              </w:rPr>
+              <w:t>’</w:t>
+            </w:r>
+            <w:r>
+              <w:rPr>
+                <w:sz w:val="20"/>
+                <w:szCs w:val="20"/>
+              </w:rPr>
+              <w:t>]</w:t>
+            </w:r>
+            <w:r>
+              <w:rPr>
+                <w:sz w:val="20"/>
+                <w:szCs w:val="20"/>
+              </w:rPr>
+              <w:t xml:space="preserve"> and </w:t>
+            </w:r>
+            <w:r>
+              <w:rPr>
+                <w:color w:val="34A853"/>
+                <w:sz w:val="20"/>
+                <w:szCs w:val="20"/>
+              </w:rPr>
+              <w:t xml:space="preserve">case_type </w:t>
+            </w:r>
+            <w:r>
+              <w:rPr>
+                <w:sz w:val="20"/>
+                <w:szCs w:val="20"/>
+              </w:rPr>
+              <w:t xml:space="preserve">== </w:t>
+            </w:r>
+            <w:r>
+              <w:rPr>
+                <w:sz w:val="20"/>
+                <w:szCs w:val="20"/>
+              </w:rPr>
+              <w:t>‘</w:t>
+            </w:r>
+            <w:r>
+              <w:rPr>
+                <w:sz w:val="20"/>
+                <w:szCs w:val="20"/>
+              </w:rPr>
+              <w:t>divorce</w:t>
+            </w:r>
+            <w:r>
+              <w:rPr>
+                <w:sz w:val="20"/>
+                <w:szCs w:val="20"/>
+              </w:rPr>
+              <w:t>’</w:t>
+            </w:r>
+            <w:r>
+              <w:rPr>
+                <w:color w:val="9900FF"/>
+                <w:sz w:val="20"/>
+                <w:szCs w:val="20"/>
+              </w:rPr>
+              <w:t>) or (</w:t>
+            </w:r>
+            <w:r>
+              <w:rPr>
+                <w:color w:val="34A853"/>
+                <w:sz w:val="20"/>
+                <w:szCs w:val="20"/>
+              </w:rPr>
+              <w:t>type_of_response</w:t>
+            </w:r>
+            <w:r>
+              <w:rPr>
+                <w:color w:val="34A853"/>
+                <w:sz w:val="20"/>
+                <w:szCs w:val="20"/>
+              </w:rPr>
+              <w:t>[</w:t>
+            </w:r>
+            <w:r>
+              <w:rPr>
+                <w:sz w:val="20"/>
+                <w:szCs w:val="20"/>
+              </w:rPr>
+              <w:t>‘</w:t>
+            </w:r>
+            <w:r>
+              <w:rPr>
+                <w:sz w:val="20"/>
+                <w:szCs w:val="20"/>
+              </w:rPr>
+              <w:t>ak divorce case</w:t>
+            </w:r>
+            <w:r>
+              <w:rPr>
+                <w:sz w:val="20"/>
+                <w:szCs w:val="20"/>
+              </w:rPr>
+              <w:t>’</w:t>
+            </w:r>
+            <w:r>
+              <w:rPr>
+                <w:sz w:val="20"/>
+                <w:szCs w:val="20"/>
+              </w:rPr>
+              <w:t>]</w:t>
+            </w:r>
+            <w:r>
+              <w:rPr>
+                <w:sz w:val="20"/>
+                <w:szCs w:val="20"/>
+              </w:rPr>
+              <w:t xml:space="preserve"> and </w:t>
+            </w:r>
+            <w:r>
+              <w:rPr>
+                <w:color w:val="34A853"/>
+                <w:sz w:val="20"/>
+                <w:szCs w:val="20"/>
+              </w:rPr>
+              <w:t xml:space="preserve">case_type </w:t>
+            </w:r>
+            <w:r>
+              <w:rPr>
+                <w:sz w:val="20"/>
+                <w:szCs w:val="20"/>
+              </w:rPr>
+              <w:t xml:space="preserve">== </w:t>
+            </w:r>
+            <w:r>
+              <w:rPr>
+                <w:sz w:val="20"/>
+                <w:szCs w:val="20"/>
+              </w:rPr>
+              <w:t>‘</w:t>
+            </w:r>
+            <w:r>
+              <w:rPr>
+                <w:sz w:val="20"/>
+                <w:szCs w:val="20"/>
+              </w:rPr>
+              <w:t>legal separation</w:t>
+            </w:r>
+            <w:r>
+              <w:rPr>
+                <w:sz w:val="20"/>
+                <w:szCs w:val="20"/>
+              </w:rPr>
+              <w:t>’</w:t>
+            </w:r>
+            <w:r>
+              <w:rPr>
+                <w:sz w:val="20"/>
+                <w:szCs w:val="20"/>
+              </w:rPr>
+              <w:t xml:space="preserve"> and </w:t>
+            </w:r>
+            <w:r>
+              <w:rPr>
+                <w:color w:val="34A853"/>
+                <w:sz w:val="20"/>
+                <w:szCs w:val="20"/>
+              </w:rPr>
+              <w:t xml:space="preserve">want_legal_separation </w:t>
+            </w:r>
+            <w:r>
+              <w:rPr>
+                <w:sz w:val="20"/>
+                <w:szCs w:val="20"/>
+              </w:rPr>
+              <w:t xml:space="preserve">== </w:t>
+            </w:r>
+            <w:r>
+              <w:rPr>
+                <w:sz w:val="20"/>
+                <w:szCs w:val="20"/>
+              </w:rPr>
+              <w:t>‘</w:t>
+            </w:r>
+            <w:r>
+              <w:rPr>
+                <w:sz w:val="20"/>
+                <w:szCs w:val="20"/>
+              </w:rPr>
+              <w:t>yes</w:t>
+            </w:r>
+            <w:r>
+              <w:rPr>
+                <w:sz w:val="20"/>
+                <w:szCs w:val="20"/>
+              </w:rPr>
+              <w:t>’</w:t>
+            </w:r>
+            <w:r>
+              <w:rPr>
+                <w:color w:val="9900FF"/>
+                <w:sz w:val="20"/>
+                <w:szCs w:val="20"/>
+              </w:rPr>
+              <w:t>) or (</w:t>
+            </w:r>
+            <w:r>
+              <w:rPr>
+                <w:color w:val="34A853"/>
+                <w:sz w:val="20"/>
+                <w:szCs w:val="20"/>
+              </w:rPr>
+              <w:t>type_of_response</w:t>
+            </w:r>
+            <w:r>
+              <w:rPr>
+                <w:sz w:val="20"/>
+                <w:szCs w:val="20"/>
+              </w:rPr>
+              <w:t>[</w:t>
+            </w:r>
+            <w:r>
+              <w:rPr>
+                <w:sz w:val="20"/>
+                <w:szCs w:val="20"/>
+              </w:rPr>
+              <w:t>‘</w:t>
+            </w:r>
+            <w:r>
+              <w:rPr>
+                <w:sz w:val="20"/>
+                <w:szCs w:val="20"/>
+              </w:rPr>
+              <w:t>case in 2 states</w:t>
+            </w:r>
+            <w:r>
+              <w:rPr>
+                <w:sz w:val="20"/>
+                <w:szCs w:val="20"/>
+              </w:rPr>
+              <w:t>’</w:t>
+            </w:r>
+            <w:r>
+              <w:rPr>
+                <w:sz w:val="20"/>
+                <w:szCs w:val="20"/>
+              </w:rPr>
+              <w:t xml:space="preserve">] and </w:t>
+            </w:r>
+            <w:r>
+              <w:rPr>
+                <w:color w:val="34A853"/>
+                <w:sz w:val="20"/>
+                <w:szCs w:val="20"/>
+              </w:rPr>
+              <w:t xml:space="preserve">stage_of_other_case </w:t>
+            </w:r>
+            <w:r>
+              <w:rPr>
+                <w:sz w:val="20"/>
+                <w:szCs w:val="20"/>
+              </w:rPr>
+              <w:t xml:space="preserve">== </w:t>
+            </w:r>
+            <w:r>
+              <w:rPr>
+                <w:sz w:val="20"/>
+                <w:szCs w:val="20"/>
+              </w:rPr>
+              <w:t>‘</w:t>
+            </w:r>
+            <w:r>
+              <w:rPr>
+                <w:sz w:val="20"/>
+                <w:szCs w:val="20"/>
+              </w:rPr>
+              <w:t>ended with no order</w:t>
+            </w:r>
+            <w:r>
+              <w:rPr>
+                <w:sz w:val="20"/>
+                <w:szCs w:val="20"/>
+              </w:rPr>
+              <w:t>’</w:t>
+            </w:r>
+            <w:r>
+              <w:rPr>
+                <w:color w:val="9900FF"/>
+                <w:sz w:val="20"/>
+                <w:szCs w:val="20"/>
+              </w:rPr>
+              <w:t>)</w:t>
+            </w:r>
+            <w:r>
+              <w:rPr>
                 <w:color w:val="4285F4"/>
                 <w:sz w:val="20"/>
                 <w:szCs w:val="20"/>
               </w:rPr>
-              <w:t>and</w:t>
-            </w:r>
-            <w:r>
-              <w:rPr>
-                <w:color w:val="FF0000"/>
+              <w:t>)</w:t>
+            </w:r>
+            <w:r>
+              <w:rPr>
+                <w:color w:val="00B050"/>
                 <w:sz w:val="20"/>
                 <w:szCs w:val="20"/>
               </w:rPr>
               <w:t xml:space="preserve"> </w:t>
             </w:r>
-            <w:proofErr w:type="spellStart"/>
-            <w:r>
-              <w:rPr>
-                <w:color w:val="34A853"/>
-                <w:sz w:val="20"/>
-                <w:szCs w:val="20"/>
-              </w:rPr>
-              <w:t>case_type</w:t>
-            </w:r>
-            <w:proofErr w:type="spellEnd"/>
-            <w:r>
-              <w:rPr>
-                <w:color w:val="FF0000"/>
-                <w:sz w:val="20"/>
-                <w:szCs w:val="20"/>
-              </w:rPr>
-              <w:t xml:space="preserve"> == </w:t>
-            </w:r>
-            <w:r>
-              <w:rPr>
-                <w:color w:val="FF0000"/>
+            <w:r>
+              <w:rPr>
+                <w:color w:val="4285F4"/>
+                <w:sz w:val="20"/>
+                <w:szCs w:val="20"/>
+              </w:rPr>
+              <w:t>and (</w:t>
+            </w:r>
+            <w:r>
+              <w:rPr>
+                <w:color w:val="6AA84F"/>
+                <w:sz w:val="20"/>
+                <w:szCs w:val="20"/>
+              </w:rPr>
+              <w:t xml:space="preserve">response_to_complaint </w:t>
+            </w:r>
+            <w:r>
+              <w:rPr>
+                <w:color w:val="6AA84F"/>
+                <w:sz w:val="20"/>
+                <w:szCs w:val="20"/>
+              </w:rPr>
+              <w:lastRenderedPageBreak/>
+              <w:t>in(</w:t>
+            </w:r>
+            <w:r>
+              <w:rPr>
+                <w:color w:val="6AA84F"/>
                 <w:sz w:val="20"/>
                 <w:szCs w:val="20"/>
               </w:rPr>
@@ -3076,15 +3717,15 @@
             </w:r>
             <w:r>
               <w:rPr>
-                <w:color w:val="FF0000"/>
-                <w:sz w:val="20"/>
-                <w:szCs w:val="20"/>
-              </w:rPr>
-              <w:t>legal separation</w:t>
-            </w:r>
-            <w:r>
-              <w:rPr>
-                <w:color w:val="FF0000"/>
+                <w:color w:val="6AA84F"/>
+                <w:sz w:val="20"/>
+                <w:szCs w:val="20"/>
+              </w:rPr>
+              <w:t>agree</w:t>
+            </w:r>
+            <w:r>
+              <w:rPr>
+                <w:color w:val="6AA84F"/>
                 <w:sz w:val="20"/>
                 <w:szCs w:val="20"/>
               </w:rPr>
@@ -3092,7 +3733,55 @@
             </w:r>
             <w:r>
               <w:rPr>
-                <w:color w:val="FF0000"/>
+                <w:color w:val="6AA84F"/>
+                <w:sz w:val="20"/>
+                <w:szCs w:val="20"/>
+              </w:rPr>
+              <w:t xml:space="preserve">, </w:t>
+            </w:r>
+            <w:r>
+              <w:rPr>
+                <w:color w:val="6AA84F"/>
+                <w:sz w:val="20"/>
+                <w:szCs w:val="20"/>
+              </w:rPr>
+              <w:t>‘</w:t>
+            </w:r>
+            <w:r>
+              <w:rPr>
+                <w:color w:val="6AA84F"/>
+                <w:sz w:val="20"/>
+                <w:szCs w:val="20"/>
+              </w:rPr>
+              <w:t>some</w:t>
+            </w:r>
+            <w:r>
+              <w:rPr>
+                <w:color w:val="6AA84F"/>
+                <w:sz w:val="20"/>
+                <w:szCs w:val="20"/>
+              </w:rPr>
+              <w:t>’</w:t>
+            </w:r>
+            <w:r>
+              <w:rPr>
+                <w:color w:val="6AA84F"/>
+                <w:sz w:val="20"/>
+                <w:szCs w:val="20"/>
+              </w:rPr>
+              <w:t xml:space="preserve">) </w:t>
+            </w:r>
+            <w:r>
+              <w:rPr>
+                <w:color w:val="9900FF"/>
+                <w:sz w:val="20"/>
+                <w:szCs w:val="20"/>
+              </w:rPr>
+              <w:t>or</w:t>
+            </w:r>
+            <w:r>
+              <w:rPr>
+                <w:color w:val="6AA84F"/>
                 <w:sz w:val="20"/>
                 <w:szCs w:val="20"/>
               </w:rPr>
@@ -3100,1175 +3789,79 @@
             </w:r>
             <w:r>
               <w:rPr>
+                <w:color w:val="7030A0"/>
+                <w:sz w:val="20"/>
+                <w:szCs w:val="20"/>
+              </w:rPr>
+              <w:t>(</w:t>
+            </w:r>
+            <w:r>
+              <w:rPr>
+                <w:color w:val="6AA84F"/>
+                <w:sz w:val="20"/>
+                <w:szCs w:val="20"/>
+              </w:rPr>
+              <w:t xml:space="preserve">response_to_complaint == </w:t>
+            </w:r>
+            <w:r>
+              <w:rPr>
+                <w:color w:val="6AA84F"/>
+                <w:sz w:val="20"/>
+                <w:szCs w:val="20"/>
+              </w:rPr>
+              <w:t>‘</w:t>
+            </w:r>
+            <w:r>
+              <w:rPr>
+                <w:color w:val="6AA84F"/>
+                <w:sz w:val="20"/>
+                <w:szCs w:val="20"/>
+              </w:rPr>
+              <w:t>no</w:t>
+            </w:r>
+            <w:r>
+              <w:rPr>
+                <w:color w:val="6AA84F"/>
+                <w:sz w:val="20"/>
+                <w:szCs w:val="20"/>
+              </w:rPr>
+              <w:t>ne</w:t>
+            </w:r>
+            <w:r>
+              <w:rPr>
+                <w:color w:val="6AA84F"/>
+                <w:sz w:val="20"/>
+                <w:szCs w:val="20"/>
+              </w:rPr>
+              <w:t>’</w:t>
+            </w:r>
+            <w:r>
+              <w:rPr>
+                <w:color w:val="6AA84F"/>
+                <w:sz w:val="20"/>
+                <w:szCs w:val="20"/>
+              </w:rPr>
+              <w:t xml:space="preserve"> and want_help_to_agree</w:t>
+            </w:r>
+            <w:r>
+              <w:rPr>
+                <w:color w:val="9900FF"/>
+                <w:sz w:val="20"/>
+                <w:szCs w:val="20"/>
+              </w:rPr>
+              <w:t>)</w:t>
+            </w:r>
+            <w:r>
+              <w:rPr>
                 <w:color w:val="4285F4"/>
                 <w:sz w:val="20"/>
                 <w:szCs w:val="20"/>
               </w:rPr>
-              <w:t>and</w:t>
-            </w:r>
-            <w:r>
-              <w:rPr>
-                <w:color w:val="FF0000"/>
-                <w:sz w:val="20"/>
-                <w:szCs w:val="20"/>
-              </w:rPr>
-              <w:t xml:space="preserve"> </w:t>
-            </w:r>
-            <w:proofErr w:type="spellStart"/>
-            <w:r>
-              <w:rPr>
-                <w:color w:val="34A853"/>
-                <w:sz w:val="20"/>
-                <w:szCs w:val="20"/>
-              </w:rPr>
-              <w:t>want_legal_separation</w:t>
-            </w:r>
-            <w:proofErr w:type="spellEnd"/>
-            <w:r>
-              <w:rPr>
-                <w:color w:val="FF0000"/>
-                <w:sz w:val="20"/>
-                <w:szCs w:val="20"/>
-              </w:rPr>
-              <w:t xml:space="preserve"> in(</w:t>
-            </w:r>
-            <w:r>
-              <w:rPr>
-                <w:color w:val="FF0000"/>
-                <w:sz w:val="20"/>
-                <w:szCs w:val="20"/>
-              </w:rPr>
-              <w:t>‘</w:t>
-            </w:r>
-            <w:r>
-              <w:rPr>
-                <w:color w:val="FF0000"/>
-                <w:sz w:val="20"/>
-                <w:szCs w:val="20"/>
-              </w:rPr>
-              <w:t>no</w:t>
-            </w:r>
-            <w:r>
-              <w:rPr>
-                <w:color w:val="FF0000"/>
-                <w:sz w:val="20"/>
-                <w:szCs w:val="20"/>
-              </w:rPr>
-              <w:t>’</w:t>
-            </w:r>
-            <w:r>
-              <w:rPr>
-                <w:color w:val="FF0000"/>
-                <w:sz w:val="20"/>
-                <w:szCs w:val="20"/>
-              </w:rPr>
-              <w:t xml:space="preserve">, </w:t>
-            </w:r>
-            <w:r>
-              <w:rPr>
-                <w:color w:val="FF0000"/>
-                <w:sz w:val="20"/>
-                <w:szCs w:val="20"/>
-              </w:rPr>
-              <w:t>‘</w:t>
-            </w:r>
-            <w:r>
-              <w:rPr>
-                <w:color w:val="FF0000"/>
-                <w:sz w:val="20"/>
-                <w:szCs w:val="20"/>
-              </w:rPr>
-              <w:t>unsure</w:t>
-            </w:r>
-            <w:r>
-              <w:rPr>
-                <w:color w:val="FF0000"/>
-                <w:sz w:val="20"/>
-                <w:szCs w:val="20"/>
-              </w:rPr>
-              <w:t>’</w:t>
-            </w:r>
-            <w:r>
-              <w:rPr>
-                <w:color w:val="FF0000"/>
-                <w:sz w:val="20"/>
-                <w:szCs w:val="20"/>
-              </w:rPr>
-              <w:t xml:space="preserve">) </w:t>
-            </w:r>
-            <w:r>
-              <w:rPr>
-                <w:color w:val="4285F4"/>
-                <w:sz w:val="20"/>
-                <w:szCs w:val="20"/>
-              </w:rPr>
-              <w:t>and</w:t>
-            </w:r>
-            <w:r>
-              <w:rPr>
-                <w:color w:val="FF0000"/>
-                <w:sz w:val="20"/>
-                <w:szCs w:val="20"/>
-              </w:rPr>
-              <w:t xml:space="preserve"> </w:t>
-            </w:r>
-            <w:proofErr w:type="spellStart"/>
-            <w:r>
-              <w:rPr>
-                <w:color w:val="34A853"/>
-                <w:sz w:val="20"/>
-                <w:szCs w:val="20"/>
-              </w:rPr>
-              <w:t>want_help_to_agree</w:t>
-            </w:r>
-            <w:proofErr w:type="spellEnd"/>
-            <w:r>
-              <w:rPr>
-                <w:color w:val="34A853"/>
-                <w:sz w:val="20"/>
-                <w:szCs w:val="20"/>
-              </w:rPr>
               <w:t>)</w:t>
             </w:r>
             <w:r>
               <w:rPr>
-                <w:color w:val="FF9900"/>
-                <w:sz w:val="20"/>
-                <w:szCs w:val="20"/>
-              </w:rPr>
-              <w:t>)</w:t>
-            </w:r>
-            <w:r>
-              <w:rPr>
-                <w:color w:val="FF0000"/>
-                <w:sz w:val="20"/>
-                <w:szCs w:val="20"/>
-              </w:rPr>
-              <w:t>) or (</w:t>
-            </w:r>
-            <w:r>
-              <w:rPr>
-                <w:color w:val="34A853"/>
-                <w:sz w:val="20"/>
-                <w:szCs w:val="20"/>
-              </w:rPr>
-              <w:t>user_need</w:t>
-            </w:r>
-            <w:r>
-              <w:rPr>
-                <w:color w:val="FF9900"/>
-                <w:sz w:val="20"/>
-                <w:szCs w:val="20"/>
-              </w:rPr>
-              <w:t xml:space="preserve"> </w:t>
-            </w:r>
-            <w:r>
-              <w:rPr>
-                <w:sz w:val="20"/>
-                <w:szCs w:val="20"/>
-              </w:rPr>
-              <w:t>in(</w:t>
-            </w:r>
-            <w:r>
-              <w:rPr>
-                <w:sz w:val="20"/>
-                <w:szCs w:val="20"/>
-              </w:rPr>
-              <w:t>‘</w:t>
-            </w:r>
-            <w:r>
-              <w:rPr>
-                <w:sz w:val="20"/>
-                <w:szCs w:val="20"/>
-              </w:rPr>
-              <w:t>answer custody</w:t>
-            </w:r>
-            <w:r>
-              <w:rPr>
-                <w:sz w:val="20"/>
-                <w:szCs w:val="20"/>
-              </w:rPr>
-              <w:t>’</w:t>
-            </w:r>
-            <w:r>
-              <w:rPr>
-                <w:sz w:val="20"/>
-                <w:szCs w:val="20"/>
-              </w:rPr>
-              <w:t xml:space="preserve">, </w:t>
-            </w:r>
-            <w:r>
-              <w:rPr>
-                <w:sz w:val="20"/>
-                <w:szCs w:val="20"/>
-              </w:rPr>
-              <w:t>‘</w:t>
-            </w:r>
-            <w:r>
-              <w:rPr>
-                <w:sz w:val="20"/>
-                <w:szCs w:val="20"/>
-              </w:rPr>
-              <w:t>answer divorce</w:t>
-            </w:r>
-            <w:r>
-              <w:rPr>
-                <w:sz w:val="20"/>
-                <w:szCs w:val="20"/>
-              </w:rPr>
-              <w:t>’</w:t>
-            </w:r>
-            <w:r>
-              <w:rPr>
-                <w:sz w:val="20"/>
-                <w:szCs w:val="20"/>
-              </w:rPr>
-              <w:t>)</w:t>
-            </w:r>
-            <w:r>
-              <w:rPr>
-                <w:color w:val="FF9900"/>
-                <w:sz w:val="20"/>
-                <w:szCs w:val="20"/>
-              </w:rPr>
-              <w:t xml:space="preserve"> and (</w:t>
-            </w:r>
-            <w:proofErr w:type="spellStart"/>
-            <w:r>
-              <w:rPr>
-                <w:color w:val="34A853"/>
-                <w:sz w:val="20"/>
-                <w:szCs w:val="20"/>
-              </w:rPr>
-              <w:t>type_of_response</w:t>
-            </w:r>
-            <w:r>
-              <w:rPr>
-                <w:color w:val="34A853"/>
-                <w:sz w:val="20"/>
-                <w:szCs w:val="20"/>
-              </w:rPr>
-              <w:t>.all_false</w:t>
-            </w:r>
-            <w:proofErr w:type="spellEnd"/>
-            <w:r>
-              <w:rPr>
-                <w:color w:val="34A853"/>
-                <w:sz w:val="20"/>
-                <w:szCs w:val="20"/>
-              </w:rPr>
-              <w:t>()</w:t>
-            </w:r>
-            <w:r>
-              <w:rPr>
-                <w:sz w:val="20"/>
-                <w:szCs w:val="20"/>
-              </w:rPr>
-              <w:t xml:space="preserve"> </w:t>
-            </w:r>
-            <w:r>
-              <w:rPr>
                 <w:color w:val="00B050"/>
-                <w:sz w:val="20"/>
-                <w:szCs w:val="20"/>
-              </w:rPr>
-              <w:t>or</w:t>
-            </w:r>
-            <w:r>
-              <w:rPr>
-                <w:color w:val="92D050"/>
-                <w:sz w:val="20"/>
-                <w:szCs w:val="20"/>
-              </w:rPr>
-              <w:t xml:space="preserve"> </w:t>
-            </w:r>
-            <w:r>
-              <w:rPr>
-                <w:color w:val="00B050"/>
-                <w:sz w:val="20"/>
-                <w:szCs w:val="20"/>
-              </w:rPr>
-              <w:t>(</w:t>
-            </w:r>
-            <w:r>
-              <w:rPr>
-                <w:color w:val="00B0F0"/>
-                <w:sz w:val="20"/>
-                <w:szCs w:val="20"/>
-              </w:rPr>
-              <w:t>(</w:t>
-            </w:r>
-            <w:r>
-              <w:rPr>
-                <w:color w:val="9900FF"/>
-                <w:sz w:val="20"/>
-                <w:szCs w:val="20"/>
-              </w:rPr>
-              <w:t>type_of_response</w:t>
-            </w:r>
-            <w:r>
-              <w:rPr>
-                <w:sz w:val="20"/>
-                <w:szCs w:val="20"/>
-              </w:rPr>
-              <w:t>[</w:t>
-            </w:r>
-            <w:r>
-              <w:rPr>
-                <w:sz w:val="20"/>
-                <w:szCs w:val="20"/>
-              </w:rPr>
-              <w:t>‘</w:t>
-            </w:r>
-            <w:proofErr w:type="spellStart"/>
-            <w:r>
-              <w:rPr>
-                <w:sz w:val="20"/>
-                <w:szCs w:val="20"/>
-              </w:rPr>
-              <w:t>ak</w:t>
-            </w:r>
-            <w:proofErr w:type="spellEnd"/>
-            <w:r>
-              <w:rPr>
-                <w:sz w:val="20"/>
-                <w:szCs w:val="20"/>
-              </w:rPr>
-              <w:t xml:space="preserve"> custody case</w:t>
-            </w:r>
-            <w:r>
-              <w:rPr>
-                <w:sz w:val="20"/>
-                <w:szCs w:val="20"/>
-              </w:rPr>
-              <w:t>’</w:t>
-            </w:r>
-            <w:r>
-              <w:rPr>
-                <w:sz w:val="20"/>
-                <w:szCs w:val="20"/>
-              </w:rPr>
-              <w:t>]</w:t>
-            </w:r>
-            <w:r>
-              <w:rPr>
-                <w:sz w:val="20"/>
-                <w:szCs w:val="20"/>
-              </w:rPr>
-              <w:t xml:space="preserve"> </w:t>
-            </w:r>
-            <w:r>
-              <w:rPr>
-                <w:color w:val="9900FF"/>
-                <w:sz w:val="20"/>
-                <w:szCs w:val="20"/>
-              </w:rPr>
-              <w:t>or (</w:t>
-            </w:r>
-            <w:r>
-              <w:rPr>
-                <w:color w:val="34A853"/>
-                <w:sz w:val="20"/>
-                <w:szCs w:val="20"/>
-              </w:rPr>
-              <w:t>type_of_response</w:t>
-            </w:r>
-            <w:r>
-              <w:rPr>
-                <w:color w:val="34A853"/>
-                <w:sz w:val="20"/>
-                <w:szCs w:val="20"/>
-              </w:rPr>
-              <w:t>[</w:t>
-            </w:r>
-            <w:r>
-              <w:rPr>
-                <w:sz w:val="20"/>
-                <w:szCs w:val="20"/>
-              </w:rPr>
-              <w:t>‘</w:t>
-            </w:r>
-            <w:proofErr w:type="spellStart"/>
-            <w:r>
-              <w:rPr>
-                <w:sz w:val="20"/>
-                <w:szCs w:val="20"/>
-              </w:rPr>
-              <w:t>ak</w:t>
-            </w:r>
-            <w:proofErr w:type="spellEnd"/>
-            <w:r>
-              <w:rPr>
-                <w:sz w:val="20"/>
-                <w:szCs w:val="20"/>
-              </w:rPr>
-              <w:t xml:space="preserve"> divorce case</w:t>
-            </w:r>
-            <w:r>
-              <w:rPr>
-                <w:sz w:val="20"/>
-                <w:szCs w:val="20"/>
-              </w:rPr>
-              <w:t>’</w:t>
-            </w:r>
-            <w:r>
-              <w:rPr>
-                <w:sz w:val="20"/>
-                <w:szCs w:val="20"/>
-              </w:rPr>
-              <w:t>]</w:t>
-            </w:r>
-            <w:r>
-              <w:rPr>
-                <w:sz w:val="20"/>
-                <w:szCs w:val="20"/>
-              </w:rPr>
-              <w:t xml:space="preserve"> and </w:t>
-            </w:r>
-            <w:proofErr w:type="spellStart"/>
-            <w:r>
-              <w:rPr>
-                <w:color w:val="34A853"/>
-                <w:sz w:val="20"/>
-                <w:szCs w:val="20"/>
-              </w:rPr>
-              <w:t>case_type</w:t>
-            </w:r>
-            <w:proofErr w:type="spellEnd"/>
-            <w:r>
-              <w:rPr>
-                <w:color w:val="34A853"/>
-                <w:sz w:val="20"/>
-                <w:szCs w:val="20"/>
-              </w:rPr>
-              <w:t xml:space="preserve"> </w:t>
-            </w:r>
-            <w:r>
-              <w:rPr>
-                <w:sz w:val="20"/>
-                <w:szCs w:val="20"/>
-              </w:rPr>
-              <w:t xml:space="preserve">== </w:t>
-            </w:r>
-            <w:r>
-              <w:rPr>
-                <w:sz w:val="20"/>
-                <w:szCs w:val="20"/>
-              </w:rPr>
-              <w:t>‘</w:t>
-            </w:r>
-            <w:r>
-              <w:rPr>
-                <w:sz w:val="20"/>
-                <w:szCs w:val="20"/>
-              </w:rPr>
-              <w:t>divorce</w:t>
-            </w:r>
-            <w:r>
-              <w:rPr>
-                <w:sz w:val="20"/>
-                <w:szCs w:val="20"/>
-              </w:rPr>
-              <w:t>’</w:t>
-            </w:r>
-            <w:r>
-              <w:rPr>
-                <w:color w:val="9900FF"/>
-                <w:sz w:val="20"/>
-                <w:szCs w:val="20"/>
-              </w:rPr>
-              <w:t>) or (</w:t>
-            </w:r>
-            <w:r>
-              <w:rPr>
-                <w:color w:val="34A853"/>
-                <w:sz w:val="20"/>
-                <w:szCs w:val="20"/>
-              </w:rPr>
-              <w:t>type_of_response</w:t>
-            </w:r>
-            <w:r>
-              <w:rPr>
-                <w:color w:val="34A853"/>
-                <w:sz w:val="20"/>
-                <w:szCs w:val="20"/>
-              </w:rPr>
-              <w:t>[</w:t>
-            </w:r>
-            <w:r>
-              <w:rPr>
-                <w:sz w:val="20"/>
-                <w:szCs w:val="20"/>
-              </w:rPr>
-              <w:t>‘</w:t>
-            </w:r>
-            <w:proofErr w:type="spellStart"/>
-            <w:r>
-              <w:rPr>
-                <w:sz w:val="20"/>
-                <w:szCs w:val="20"/>
-              </w:rPr>
-              <w:t>ak</w:t>
-            </w:r>
-            <w:proofErr w:type="spellEnd"/>
-            <w:r>
-              <w:rPr>
-                <w:sz w:val="20"/>
-                <w:szCs w:val="20"/>
-              </w:rPr>
-              <w:t xml:space="preserve"> divorce case</w:t>
-            </w:r>
-            <w:r>
-              <w:rPr>
-                <w:sz w:val="20"/>
-                <w:szCs w:val="20"/>
-              </w:rPr>
-              <w:t>’</w:t>
-            </w:r>
-            <w:r>
-              <w:rPr>
-                <w:sz w:val="20"/>
-                <w:szCs w:val="20"/>
-              </w:rPr>
-              <w:t>]</w:t>
-            </w:r>
-            <w:r>
-              <w:rPr>
-                <w:sz w:val="20"/>
-                <w:szCs w:val="20"/>
-              </w:rPr>
-              <w:t xml:space="preserve"> and </w:t>
-            </w:r>
-            <w:proofErr w:type="spellStart"/>
-            <w:r>
-              <w:rPr>
-                <w:color w:val="34A853"/>
-                <w:sz w:val="20"/>
-                <w:szCs w:val="20"/>
-              </w:rPr>
-              <w:t>case_type</w:t>
-            </w:r>
-            <w:proofErr w:type="spellEnd"/>
-            <w:r>
-              <w:rPr>
-                <w:color w:val="34A853"/>
-                <w:sz w:val="20"/>
-                <w:szCs w:val="20"/>
-              </w:rPr>
-              <w:t xml:space="preserve"> </w:t>
-            </w:r>
-            <w:r>
-              <w:rPr>
-                <w:sz w:val="20"/>
-                <w:szCs w:val="20"/>
-              </w:rPr>
-              <w:t xml:space="preserve">== </w:t>
-            </w:r>
-            <w:r>
-              <w:rPr>
-                <w:sz w:val="20"/>
-                <w:szCs w:val="20"/>
-              </w:rPr>
-              <w:t>‘</w:t>
-            </w:r>
-            <w:r>
-              <w:rPr>
-                <w:sz w:val="20"/>
-                <w:szCs w:val="20"/>
-              </w:rPr>
-              <w:t>legal separation</w:t>
-            </w:r>
-            <w:r>
-              <w:rPr>
-                <w:sz w:val="20"/>
-                <w:szCs w:val="20"/>
-              </w:rPr>
-              <w:t>’</w:t>
-            </w:r>
-            <w:r>
-              <w:rPr>
-                <w:sz w:val="20"/>
-                <w:szCs w:val="20"/>
-              </w:rPr>
-              <w:t xml:space="preserve"> and </w:t>
-            </w:r>
-            <w:proofErr w:type="spellStart"/>
-            <w:r>
-              <w:rPr>
-                <w:color w:val="34A853"/>
-                <w:sz w:val="20"/>
-                <w:szCs w:val="20"/>
-              </w:rPr>
-              <w:t>want_legal_separation</w:t>
-            </w:r>
-            <w:proofErr w:type="spellEnd"/>
-            <w:r>
-              <w:rPr>
-                <w:color w:val="34A853"/>
-                <w:sz w:val="20"/>
-                <w:szCs w:val="20"/>
-              </w:rPr>
-              <w:t xml:space="preserve"> </w:t>
-            </w:r>
-            <w:r>
-              <w:rPr>
-                <w:sz w:val="20"/>
-                <w:szCs w:val="20"/>
-              </w:rPr>
-              <w:t xml:space="preserve">== </w:t>
-            </w:r>
-            <w:r>
-              <w:rPr>
-                <w:sz w:val="20"/>
-                <w:szCs w:val="20"/>
-              </w:rPr>
-              <w:t>‘</w:t>
-            </w:r>
-            <w:r>
-              <w:rPr>
-                <w:sz w:val="20"/>
-                <w:szCs w:val="20"/>
-              </w:rPr>
-              <w:t>yes</w:t>
-            </w:r>
-            <w:r>
-              <w:rPr>
-                <w:sz w:val="20"/>
-                <w:szCs w:val="20"/>
-              </w:rPr>
-              <w:t>’</w:t>
-            </w:r>
-            <w:r>
-              <w:rPr>
-                <w:color w:val="9900FF"/>
-                <w:sz w:val="20"/>
-                <w:szCs w:val="20"/>
-              </w:rPr>
-              <w:t>) or (</w:t>
-            </w:r>
-            <w:r>
-              <w:rPr>
-                <w:color w:val="34A853"/>
-                <w:sz w:val="20"/>
-                <w:szCs w:val="20"/>
-              </w:rPr>
-              <w:t>type_of_response</w:t>
-            </w:r>
-            <w:r>
-              <w:rPr>
-                <w:sz w:val="20"/>
-                <w:szCs w:val="20"/>
-              </w:rPr>
-              <w:t>[</w:t>
-            </w:r>
-            <w:r>
-              <w:rPr>
-                <w:sz w:val="20"/>
-                <w:szCs w:val="20"/>
-              </w:rPr>
-              <w:t>‘</w:t>
-            </w:r>
-            <w:r>
-              <w:rPr>
-                <w:sz w:val="20"/>
-                <w:szCs w:val="20"/>
-              </w:rPr>
-              <w:t xml:space="preserve">case in </w:t>
-            </w:r>
-            <w:r>
-              <w:rPr>
-                <w:sz w:val="20"/>
-                <w:szCs w:val="20"/>
-              </w:rPr>
-              <w:lastRenderedPageBreak/>
-              <w:t>2 states</w:t>
-            </w:r>
-            <w:r>
-              <w:rPr>
-                <w:sz w:val="20"/>
-                <w:szCs w:val="20"/>
-              </w:rPr>
-              <w:t>’</w:t>
-            </w:r>
-            <w:r>
-              <w:rPr>
-                <w:sz w:val="20"/>
-                <w:szCs w:val="20"/>
-              </w:rPr>
-              <w:t xml:space="preserve">] and </w:t>
-            </w:r>
-            <w:r>
-              <w:rPr>
-                <w:color w:val="34A853"/>
-                <w:sz w:val="20"/>
-                <w:szCs w:val="20"/>
-              </w:rPr>
-              <w:t xml:space="preserve">stage_of_other_case </w:t>
-            </w:r>
-            <w:r>
-              <w:rPr>
-                <w:sz w:val="20"/>
-                <w:szCs w:val="20"/>
-              </w:rPr>
-              <w:t xml:space="preserve">== </w:t>
-            </w:r>
-            <w:r>
-              <w:rPr>
-                <w:sz w:val="20"/>
-                <w:szCs w:val="20"/>
-              </w:rPr>
-              <w:t>‘</w:t>
-            </w:r>
-            <w:r>
-              <w:rPr>
-                <w:sz w:val="20"/>
-                <w:szCs w:val="20"/>
-              </w:rPr>
-              <w:t>ended with no order</w:t>
-            </w:r>
-            <w:r>
-              <w:rPr>
-                <w:sz w:val="20"/>
-                <w:szCs w:val="20"/>
-              </w:rPr>
-              <w:t>’</w:t>
-            </w:r>
-            <w:r>
-              <w:rPr>
-                <w:color w:val="9900FF"/>
-                <w:sz w:val="20"/>
-                <w:szCs w:val="20"/>
-              </w:rPr>
-              <w:t>)</w:t>
-            </w:r>
-            <w:r>
-              <w:rPr>
-                <w:color w:val="4285F4"/>
-                <w:sz w:val="20"/>
-                <w:szCs w:val="20"/>
-              </w:rPr>
-              <w:t>)</w:t>
-            </w:r>
-            <w:r>
-              <w:rPr>
-                <w:color w:val="00B050"/>
-                <w:sz w:val="20"/>
-                <w:szCs w:val="20"/>
-              </w:rPr>
-              <w:t xml:space="preserve"> </w:t>
-            </w:r>
-            <w:r>
-              <w:rPr>
-                <w:color w:val="4285F4"/>
-                <w:sz w:val="20"/>
-                <w:szCs w:val="20"/>
-              </w:rPr>
-              <w:t>and (</w:t>
-            </w:r>
-            <w:proofErr w:type="spellStart"/>
-            <w:r>
-              <w:rPr>
-                <w:color w:val="6AA84F"/>
-                <w:sz w:val="20"/>
-                <w:szCs w:val="20"/>
-              </w:rPr>
-              <w:t>response_to_complaint</w:t>
-            </w:r>
-            <w:proofErr w:type="spellEnd"/>
-            <w:r>
-              <w:rPr>
-                <w:color w:val="6AA84F"/>
-                <w:sz w:val="20"/>
-                <w:szCs w:val="20"/>
-              </w:rPr>
-              <w:t xml:space="preserve"> in(</w:t>
-            </w:r>
-            <w:r>
-              <w:rPr>
-                <w:color w:val="6AA84F"/>
-                <w:sz w:val="20"/>
-                <w:szCs w:val="20"/>
-              </w:rPr>
-              <w:t>‘</w:t>
-            </w:r>
-            <w:r>
-              <w:rPr>
-                <w:color w:val="6AA84F"/>
-                <w:sz w:val="20"/>
-                <w:szCs w:val="20"/>
-              </w:rPr>
-              <w:t>agree</w:t>
-            </w:r>
-            <w:r>
-              <w:rPr>
-                <w:color w:val="6AA84F"/>
-                <w:sz w:val="20"/>
-                <w:szCs w:val="20"/>
-              </w:rPr>
-              <w:t>’</w:t>
-            </w:r>
-            <w:r>
-              <w:rPr>
-                <w:color w:val="6AA84F"/>
-                <w:sz w:val="20"/>
-                <w:szCs w:val="20"/>
-              </w:rPr>
-              <w:t xml:space="preserve">, </w:t>
-            </w:r>
-            <w:r>
-              <w:rPr>
-                <w:color w:val="6AA84F"/>
-                <w:sz w:val="20"/>
-                <w:szCs w:val="20"/>
-              </w:rPr>
-              <w:t>‘</w:t>
-            </w:r>
-            <w:r>
-              <w:rPr>
-                <w:color w:val="6AA84F"/>
-                <w:sz w:val="20"/>
-                <w:szCs w:val="20"/>
-              </w:rPr>
-              <w:t>some</w:t>
-            </w:r>
-            <w:r>
-              <w:rPr>
-                <w:color w:val="6AA84F"/>
-                <w:sz w:val="20"/>
-                <w:szCs w:val="20"/>
-              </w:rPr>
-              <w:t>’</w:t>
-            </w:r>
-            <w:r>
-              <w:rPr>
-                <w:color w:val="6AA84F"/>
-                <w:sz w:val="20"/>
-                <w:szCs w:val="20"/>
-              </w:rPr>
-              <w:t xml:space="preserve">) </w:t>
-            </w:r>
-            <w:r>
-              <w:rPr>
-                <w:color w:val="9900FF"/>
-                <w:sz w:val="20"/>
-                <w:szCs w:val="20"/>
-              </w:rPr>
-              <w:t>or</w:t>
-            </w:r>
-            <w:r>
-              <w:rPr>
-                <w:color w:val="6AA84F"/>
-                <w:sz w:val="20"/>
-                <w:szCs w:val="20"/>
-              </w:rPr>
-              <w:t xml:space="preserve"> </w:t>
-            </w:r>
-            <w:r>
-              <w:rPr>
-                <w:color w:val="7030A0"/>
-                <w:sz w:val="20"/>
-                <w:szCs w:val="20"/>
-              </w:rPr>
-              <w:t>(</w:t>
-            </w:r>
-            <w:proofErr w:type="spellStart"/>
-            <w:r>
-              <w:rPr>
-                <w:color w:val="6AA84F"/>
-                <w:sz w:val="20"/>
-                <w:szCs w:val="20"/>
-              </w:rPr>
-              <w:t>response_to_complaint</w:t>
-            </w:r>
-            <w:proofErr w:type="spellEnd"/>
-            <w:r>
-              <w:rPr>
-                <w:color w:val="6AA84F"/>
-                <w:sz w:val="20"/>
-                <w:szCs w:val="20"/>
-              </w:rPr>
-              <w:t xml:space="preserve"> == </w:t>
-            </w:r>
-            <w:r>
-              <w:rPr>
-                <w:color w:val="6AA84F"/>
-                <w:sz w:val="20"/>
-                <w:szCs w:val="20"/>
-              </w:rPr>
-              <w:t>‘</w:t>
-            </w:r>
-            <w:r>
-              <w:rPr>
-                <w:color w:val="6AA84F"/>
-                <w:sz w:val="20"/>
-                <w:szCs w:val="20"/>
-              </w:rPr>
-              <w:t>no</w:t>
-            </w:r>
-            <w:r>
-              <w:rPr>
-                <w:color w:val="6AA84F"/>
-                <w:sz w:val="20"/>
-                <w:szCs w:val="20"/>
-              </w:rPr>
-              <w:t>’</w:t>
-            </w:r>
-            <w:r>
-              <w:rPr>
-                <w:color w:val="6AA84F"/>
-                <w:sz w:val="20"/>
-                <w:szCs w:val="20"/>
-              </w:rPr>
-              <w:t xml:space="preserve"> and </w:t>
-            </w:r>
-            <w:proofErr w:type="spellStart"/>
-            <w:r>
-              <w:rPr>
-                <w:color w:val="6AA84F"/>
-                <w:sz w:val="20"/>
-                <w:szCs w:val="20"/>
-              </w:rPr>
-              <w:t>want_help_to_agree</w:t>
-            </w:r>
-            <w:proofErr w:type="spellEnd"/>
-            <w:r>
-              <w:rPr>
-                <w:color w:val="9900FF"/>
-                <w:sz w:val="20"/>
-                <w:szCs w:val="20"/>
-              </w:rPr>
-              <w:t>)</w:t>
-            </w:r>
-            <w:r>
-              <w:rPr>
-                <w:color w:val="4285F4"/>
-                <w:sz w:val="20"/>
-                <w:szCs w:val="20"/>
-              </w:rPr>
-              <w:t>)</w:t>
-            </w:r>
-            <w:r>
-              <w:rPr>
-                <w:color w:val="00B050"/>
-                <w:sz w:val="20"/>
-                <w:szCs w:val="20"/>
-              </w:rPr>
-              <w:t xml:space="preserve">) or </w:t>
-            </w:r>
-            <w:r>
-              <w:rPr>
-                <w:color w:val="34A853"/>
-                <w:sz w:val="20"/>
-                <w:szCs w:val="20"/>
-              </w:rPr>
-              <w:t>(type_of_response</w:t>
-            </w:r>
-            <w:r>
-              <w:rPr>
-                <w:color w:val="34A853"/>
-                <w:sz w:val="20"/>
-                <w:szCs w:val="20"/>
-              </w:rPr>
-              <w:t>[</w:t>
-            </w:r>
-            <w:r>
-              <w:rPr>
-                <w:sz w:val="20"/>
-                <w:szCs w:val="20"/>
-              </w:rPr>
-              <w:t>‘</w:t>
-            </w:r>
-            <w:proofErr w:type="spellStart"/>
-            <w:r>
-              <w:rPr>
-                <w:sz w:val="20"/>
-                <w:szCs w:val="20"/>
-              </w:rPr>
-              <w:t>ak</w:t>
-            </w:r>
-            <w:proofErr w:type="spellEnd"/>
-            <w:r>
-              <w:rPr>
-                <w:sz w:val="20"/>
-                <w:szCs w:val="20"/>
-              </w:rPr>
-              <w:t xml:space="preserve"> divorce case</w:t>
-            </w:r>
-            <w:r>
-              <w:rPr>
-                <w:sz w:val="20"/>
-                <w:szCs w:val="20"/>
-              </w:rPr>
-              <w:t>’</w:t>
-            </w:r>
-            <w:r>
-              <w:rPr>
-                <w:sz w:val="20"/>
-                <w:szCs w:val="20"/>
-              </w:rPr>
-              <w:t>]</w:t>
-            </w:r>
-            <w:r>
-              <w:rPr>
-                <w:sz w:val="20"/>
-                <w:szCs w:val="20"/>
-              </w:rPr>
-              <w:t xml:space="preserve"> and </w:t>
-            </w:r>
-            <w:proofErr w:type="spellStart"/>
-            <w:r>
-              <w:rPr>
-                <w:color w:val="34A853"/>
-                <w:sz w:val="20"/>
-                <w:szCs w:val="20"/>
-              </w:rPr>
-              <w:t>case_type</w:t>
-            </w:r>
-            <w:proofErr w:type="spellEnd"/>
-            <w:r>
-              <w:rPr>
-                <w:color w:val="34A853"/>
-                <w:sz w:val="20"/>
-                <w:szCs w:val="20"/>
-              </w:rPr>
-              <w:t xml:space="preserve"> </w:t>
-            </w:r>
-            <w:r>
-              <w:rPr>
-                <w:sz w:val="20"/>
-                <w:szCs w:val="20"/>
-              </w:rPr>
-              <w:t xml:space="preserve">== </w:t>
-            </w:r>
-            <w:r>
-              <w:rPr>
-                <w:sz w:val="20"/>
-                <w:szCs w:val="20"/>
-              </w:rPr>
-              <w:t>‘</w:t>
-            </w:r>
-            <w:r>
-              <w:rPr>
-                <w:sz w:val="20"/>
-                <w:szCs w:val="20"/>
-              </w:rPr>
-              <w:t>legal separation</w:t>
-            </w:r>
-            <w:r>
-              <w:rPr>
-                <w:sz w:val="20"/>
-                <w:szCs w:val="20"/>
-              </w:rPr>
-              <w:t>’</w:t>
-            </w:r>
-            <w:r>
-              <w:rPr>
-                <w:sz w:val="20"/>
-                <w:szCs w:val="20"/>
-              </w:rPr>
-              <w:t xml:space="preserve"> and </w:t>
-            </w:r>
-            <w:proofErr w:type="spellStart"/>
-            <w:r>
-              <w:rPr>
-                <w:color w:val="34A853"/>
-                <w:sz w:val="20"/>
-                <w:szCs w:val="20"/>
-              </w:rPr>
-              <w:t>want_legal_separation</w:t>
-            </w:r>
-            <w:proofErr w:type="spellEnd"/>
-            <w:r>
-              <w:rPr>
-                <w:color w:val="34A853"/>
-                <w:sz w:val="20"/>
-                <w:szCs w:val="20"/>
-              </w:rPr>
-              <w:t xml:space="preserve"> </w:t>
-            </w:r>
-            <w:r>
-              <w:rPr>
-                <w:sz w:val="20"/>
-                <w:szCs w:val="20"/>
-              </w:rPr>
-              <w:t>in(</w:t>
-            </w:r>
-            <w:r>
-              <w:rPr>
-                <w:sz w:val="20"/>
-                <w:szCs w:val="20"/>
-              </w:rPr>
-              <w:t>‘</w:t>
-            </w:r>
-            <w:r>
-              <w:rPr>
-                <w:sz w:val="20"/>
-                <w:szCs w:val="20"/>
-              </w:rPr>
-              <w:t>no</w:t>
-            </w:r>
-            <w:r>
-              <w:rPr>
-                <w:sz w:val="20"/>
-                <w:szCs w:val="20"/>
-              </w:rPr>
-              <w:t>ne</w:t>
-            </w:r>
-            <w:r>
-              <w:rPr>
-                <w:sz w:val="20"/>
-                <w:szCs w:val="20"/>
-              </w:rPr>
-              <w:t>’</w:t>
-            </w:r>
-            <w:r>
-              <w:rPr>
-                <w:sz w:val="20"/>
-                <w:szCs w:val="20"/>
-              </w:rPr>
-              <w:t xml:space="preserve">, </w:t>
-            </w:r>
-            <w:r>
-              <w:rPr>
-                <w:sz w:val="20"/>
-                <w:szCs w:val="20"/>
-              </w:rPr>
-              <w:t>‘</w:t>
-            </w:r>
-            <w:r>
-              <w:rPr>
-                <w:sz w:val="20"/>
-                <w:szCs w:val="20"/>
-              </w:rPr>
-              <w:t>unsure</w:t>
-            </w:r>
-            <w:r>
-              <w:rPr>
-                <w:sz w:val="20"/>
-                <w:szCs w:val="20"/>
-              </w:rPr>
-              <w:t>’</w:t>
-            </w:r>
-            <w:r>
-              <w:rPr>
-                <w:sz w:val="20"/>
-                <w:szCs w:val="20"/>
-              </w:rPr>
-              <w:t xml:space="preserve">) and </w:t>
-            </w:r>
-            <w:proofErr w:type="spellStart"/>
-            <w:r>
-              <w:rPr>
-                <w:color w:val="34A853"/>
-                <w:sz w:val="20"/>
-                <w:szCs w:val="20"/>
-              </w:rPr>
-              <w:t>want_help_to_agree</w:t>
-            </w:r>
-            <w:proofErr w:type="spellEnd"/>
-            <w:r>
-              <w:rPr>
-                <w:color w:val="34A853"/>
                 <w:sz w:val="20"/>
                 <w:szCs w:val="20"/>
               </w:rPr>
@@ -4470,19 +4063,11 @@
               </w:rPr>
               <w:t xml:space="preserve"> </w:t>
             </w:r>
-            <w:proofErr w:type="spellStart"/>
             <w:r>
               <w:rPr>
                 <w:color w:val="FF0000"/>
               </w:rPr>
-              <w:t>type_of_response.any_true</w:t>
-            </w:r>
-            <w:proofErr w:type="spellEnd"/>
-            <w:r>
-              <w:rPr>
-                <w:color w:val="FF0000"/>
-              </w:rPr>
-              <w:t xml:space="preserve"> and not(</w:t>
+              <w:t>type_of_response.any_true and not(</w:t>
             </w:r>
             <w:r>
               <w:rPr>
@@ -4688,15 +4273,7 @@
             <w:bookmarkStart w:id="1" w:name="_Step_8:_Fill"/>
             <w:bookmarkEnd w:id="1"/>
             <w:r>
-              <w:t xml:space="preserve">{{ </w:t>
-            </w:r>
-            <w:proofErr w:type="spellStart"/>
-            <w:r>
-              <w:t>answer_step.subject</w:t>
-            </w:r>
-            <w:proofErr w:type="spellEnd"/>
-            <w:r>
-              <w:t xml:space="preserve"> }}</w:t>
+              <w:t>{{ answer_step.subject }}</w:t>
             </w:r>
           </w:p>
         </w:tc>
@@ -4814,11 +4391,7 @@
               <w:t>‘</w:t>
             </w:r>
             <w:r>
-              <w:t>wr</w:t>
-            </w:r>
-            <w:r>
-              <w:lastRenderedPageBreak/>
-              <w:t>ong state</w:t>
+              <w:t>wrong state</w:t>
             </w:r>
             <w:r>
               <w:t>’</w:t>
@@ -4881,15 +4454,7 @@
               <w:t>’</w:t>
             </w:r>
             <w:r>
-              <w:t xml:space="preserve">] and </w:t>
-            </w:r>
-            <w:proofErr w:type="spellStart"/>
-            <w:r>
-              <w:t>proper_service</w:t>
-            </w:r>
-            <w:proofErr w:type="spellEnd"/>
-            <w:r>
-              <w:t xml:space="preserve"> == </w:t>
+              <w:t xml:space="preserve">] and proper_service == </w:t>
             </w:r>
             <w:r>
               <w:t>‘</w:t>
@@ -4925,12 +4490,9 @@
               <w:pStyle w:val="Body"/>
               <w:spacing w:before="0" w:after="0"/>
             </w:pPr>
-            <w:proofErr w:type="spellStart"/>
-            <w:r>
-              <w:lastRenderedPageBreak/>
+            <w:r>
               <w:t>dismiss_step</w:t>
             </w:r>
-            <w:proofErr w:type="spellEnd"/>
           </w:p>
         </w:tc>
       </w:tr>
@@ -4960,6 +4522,7 @@
             </w:pPr>
             <w:bookmarkStart w:id="2" w:name="_Hlk226106692"/>
             <w:r>
+              <w:lastRenderedPageBreak/>
               <w:t>{{ dismiss_step.subject }}</w:t>
             </w:r>
           </w:p>
@@ -5115,11 +4678,9 @@
               <w:pStyle w:val="Body"/>
               <w:spacing w:before="0" w:after="0"/>
             </w:pPr>
-            <w:proofErr w:type="spellStart"/>
             <w:r>
               <w:t>learn_set_aside_step</w:t>
             </w:r>
-            <w:proofErr w:type="spellEnd"/>
           </w:p>
         </w:tc>
       </w:tr>
@@ -5154,7 +4715,6 @@
               </w:rPr>
               <w:t xml:space="preserve">{{ </w:t>
             </w:r>
-            <w:proofErr w:type="spellStart"/>
             <w:r>
               <w:rPr>
                 <w:rFonts w:eastAsia="Calibri"/>
@@ -5167,15 +4727,7 @@
                 <w:rFonts w:eastAsia="Calibri"/>
                 <w:shd w:val="clear" w:color="auto" w:fill="FFFFFF"/>
               </w:rPr>
-              <w:t>.subject</w:t>
-            </w:r>
-            <w:proofErr w:type="spellEnd"/>
-            <w:r>
-              <w:rPr>
-                <w:rFonts w:eastAsia="Calibri"/>
-                <w:shd w:val="clear" w:color="auto" w:fill="FFFFFF"/>
-              </w:rPr>
-              <w:t xml:space="preserve"> }}</w:t>
+              <w:t>.subject }}</w:t>
             </w:r>
           </w:p>
         </w:tc>
@@ -5260,37 +4812,21 @@
                 <w:rFonts w:eastAsia="Calibri"/>
                 <w:shd w:val="clear" w:color="auto" w:fill="FFFFFF"/>
               </w:rPr>
-              <w:t xml:space="preserve">{{ </w:t>
-            </w:r>
-            <w:proofErr w:type="spellStart"/>
+              <w:t>{{ fill</w:t>
+            </w:r>
             <w:r>
               <w:rPr>
                 <w:rFonts w:eastAsia="Calibri"/>
                 <w:shd w:val="clear" w:color="auto" w:fill="FFFFFF"/>
               </w:rPr>
-              <w:t>fill</w:t>
+              <w:t>_set_aside_step</w:t>
             </w:r>
             <w:r>
               <w:rPr>
                 <w:rFonts w:eastAsia="Calibri"/>
                 <w:shd w:val="clear" w:color="auto" w:fill="FFFFFF"/>
               </w:rPr>
-              <w:t>_set_aside_step</w:t>
-            </w:r>
-            <w:r>
-              <w:rPr>
-                <w:rFonts w:eastAsia="Calibri"/>
-                <w:shd w:val="clear" w:color="auto" w:fill="FFFFFF"/>
-              </w:rPr>
-              <w:t>.subject</w:t>
-            </w:r>
-            <w:proofErr w:type="spellEnd"/>
-            <w:r>
-              <w:rPr>
-                <w:rFonts w:eastAsia="Calibri"/>
-                <w:shd w:val="clear" w:color="auto" w:fill="FFFFFF"/>
-              </w:rPr>
-              <w:t xml:space="preserve"> }}</w:t>
+              <w:t>.subject }}</w:t>
             </w:r>
           </w:p>
         </w:tc>
@@ -5404,13 +4940,53 @@
               <w:pStyle w:val="Body"/>
             </w:pPr>
             <w:r>
-              <w:t>{%tr if type_of_response.any_true() and not (</w:t>
-            </w:r>
-            <w:proofErr w:type="spellStart"/>
-            <w:r>
-              <w:t>type_of_response.all_true</w:t>
-            </w:r>
-            <w:proofErr w:type="spellEnd"/>
+              <w:t>{%tr if type_of_response.any_true() and not (type_of_response.all_true(</w:t>
+            </w:r>
+            <w:r>
+              <w:t>‘</w:t>
+            </w:r>
+            <w:r>
+              <w:t>stay married</w:t>
+            </w:r>
+            <w:r>
+              <w:t>’</w:t>
+            </w:r>
+            <w:r>
+              <w:t>, exclusive = True))</w:t>
+            </w:r>
+            <w:r>
+              <w:t xml:space="preserve"> and (</w:t>
+            </w:r>
+            <w:r>
+              <w:t>filling_manner in(</w:t>
+            </w:r>
+            <w:r>
+              <w:t>‘</w:t>
+            </w:r>
+            <w:r>
+              <w:t>paper</w:t>
+            </w:r>
+            <w:r>
+              <w:t>’</w:t>
+            </w:r>
+            <w:r>
+              <w:t xml:space="preserve">, </w:t>
+            </w:r>
+            <w:r>
+              <w:t>‘</w:t>
+            </w:r>
+            <w:r>
+              <w:t>dunno</w:t>
+            </w:r>
+            <w:r>
+              <w:t>’</w:t>
+            </w:r>
+            <w:r>
+              <w:t xml:space="preserve">) or filing_method </w:t>
+            </w:r>
+            <w:r>
+              <w:t xml:space="preserve">in </w:t>
+            </w:r>
             <w:r>
               <w:t>(</w:t>
             </w:r>
@@ -5418,85 +4994,20 @@
               <w:t>‘</w:t>
             </w:r>
             <w:r>
-              <w:t>stay married</w:t>
+              <w:t>mail or in person</w:t>
             </w:r>
             <w:r>
               <w:t>’</w:t>
             </w:r>
             <w:r>
-              <w:t>, exclusive = True))</w:t>
-            </w:r>
-            <w:r>
-              <w:t xml:space="preserve"> and (</w:t>
-            </w:r>
-            <w:proofErr w:type="spellStart"/>
-            <w:r>
-              <w:t>filling_manner</w:t>
-            </w:r>
-            <w:proofErr w:type="spellEnd"/>
-            <w:r>
-              <w:t xml:space="preserve"> in(</w:t>
+              <w:t xml:space="preserve">, </w:t>
             </w:r>
             <w:r>
               <w:t>‘</w:t>
             </w:r>
             <w:r>
-              <w:t>paper</w:t>
-            </w:r>
-            <w:r>
-              <w:t>’</w:t>
-            </w:r>
-            <w:r>
-              <w:t xml:space="preserve">, </w:t>
-            </w:r>
-            <w:r>
-              <w:t>‘</w:t>
-            </w:r>
-            <w:proofErr w:type="spellStart"/>
-            <w:r>
               <w:t>dunno</w:t>
             </w:r>
-            <w:proofErr w:type="spellEnd"/>
-            <w:r>
-              <w:t>’</w:t>
-            </w:r>
-            <w:r>
-              <w:t xml:space="preserve">) or </w:t>
-            </w:r>
-            <w:proofErr w:type="spellStart"/>
-            <w:r>
-              <w:t>filing_method</w:t>
-            </w:r>
-            <w:proofErr w:type="spellEnd"/>
-            <w:r>
-              <w:t xml:space="preserve"> </w:t>
-            </w:r>
-            <w:r>
-              <w:t xml:space="preserve">in </w:t>
-            </w:r>
-            <w:r>
-              <w:t>(</w:t>
-            </w:r>
-            <w:r>
-              <w:t>‘</w:t>
-            </w:r>
-            <w:r>
-              <w:t>mail or in person</w:t>
-            </w:r>
-            <w:r>
-              <w:t>’</w:t>
-            </w:r>
-            <w:r>
-              <w:t xml:space="preserve">, </w:t>
-            </w:r>
-            <w:r>
-              <w:t>‘</w:t>
-            </w:r>
-            <w:proofErr w:type="spellStart"/>
-            <w:r>
-              <w:t>dunno</w:t>
-            </w:r>
-            <w:proofErr w:type="spellEnd"/>
             <w:r>
               <w:t>’</w:t>
             </w:r>
@@ -5558,16 +5069,7 @@
               <w:outlineLvl w:val="1"/>
             </w:pPr>
             <w:r>
-              <w:t xml:space="preserve">{{ </w:t>
-            </w:r>
-            <w:proofErr w:type="spellStart"/>
-            <w:r>
-              <w:lastRenderedPageBreak/>
-              <w:t>sign_step.subject</w:t>
-            </w:r>
-            <w:proofErr w:type="spellEnd"/>
-            <w:r>
-              <w:t xml:space="preserve"> }}</w:t>
+              <w:t>{{ sign_step.subject }}</w:t>
             </w:r>
           </w:p>
         </w:tc>
@@ -5598,7 +5100,6 @@
               <w:spacing w:before="0" w:beforeAutospacing="0" w:after="60" w:afterAutospacing="0"/>
             </w:pPr>
             <w:r>
-              <w:lastRenderedPageBreak/>
               <w:t>{{p (include_docx_template("docassemble.AKA2JBranding:sign_content.docx")) }}</w:t>
             </w:r>
           </w:p>
@@ -5628,7 +5129,6 @@
               <w:pStyle w:val="Body"/>
             </w:pPr>
             <w:r>
-              <w:lastRenderedPageBreak/>
               <w:t>{%tr endif %}</w:t>
             </w:r>
           </w:p>
@@ -5679,15 +5179,7 @@
               <w:pStyle w:val="Body"/>
             </w:pPr>
             <w:r>
-              <w:t>{%tr if type_of_response.any_true() and not (</w:t>
-            </w:r>
-            <w:proofErr w:type="spellStart"/>
-            <w:r>
-              <w:t>type_of_response.all_true</w:t>
-            </w:r>
-            <w:proofErr w:type="spellEnd"/>
-            <w:r>
-              <w:t>(</w:t>
+              <w:t>{%tr if type_of_response.any_true() and not (type_of_response.all_true(</w:t>
             </w:r>
             <w:r>
               <w:t>‘</w:t>
@@ -5755,13 +5247,9 @@
             <w:r>
               <w:t xml:space="preserve">{{ </w:t>
             </w:r>
-            <w:proofErr w:type="spellStart"/>
-            <w:r>
-              <w:t>truefiling_file_and_serve_step.subject</w:t>
-            </w:r>
-            <w:proofErr w:type="spellEnd"/>
-            <w:r>
-              <w:t xml:space="preserve"> }}</w:t>
+            <w:r>
+              <w:lastRenderedPageBreak/>
+              <w:t>truefiling_file_and_serve_step.subject }}</w:t>
             </w:r>
           </w:p>
         </w:tc>
@@ -5791,6 +5279,7 @@
               <w:pStyle w:val="Body"/>
             </w:pPr>
             <w:r>
+              <w:lastRenderedPageBreak/>
               <w:t>{{p (include_docx_template("docassemble.AKA2JBranding:truefiling_file_and_serve_content.docx")) }}</w:t>
             </w:r>
           </w:p>
@@ -5824,6 +5313,7 @@
               </w:rPr>
             </w:pPr>
             <w:r>
+              <w:lastRenderedPageBreak/>
               <w:t>{{ truefiling_serve_step.subject }}</w:t>
             </w:r>
           </w:p>
@@ -5955,162 +5445,136 @@
               <w:rPr>
                 <w:color w:val="auto"/>
               </w:rPr>
-              <w:t>type_of_response.any_true() and not (</w:t>
-            </w:r>
-            <w:proofErr w:type="spellStart"/>
+              <w:t>type_of_response.any_true() and not (type_of_response.all_true(</w:t>
+            </w:r>
             <w:r>
               <w:rPr>
                 <w:color w:val="auto"/>
               </w:rPr>
-              <w:t>type_of_response.all_true</w:t>
-            </w:r>
-            <w:proofErr w:type="spellEnd"/>
+              <w:t>‘</w:t>
+            </w:r>
             <w:r>
               <w:rPr>
                 <w:color w:val="auto"/>
               </w:rPr>
+              <w:t>stay married</w:t>
+            </w:r>
+            <w:r>
+              <w:rPr>
+                <w:color w:val="auto"/>
+              </w:rPr>
+              <w:t>’</w:t>
+            </w:r>
+            <w:r>
+              <w:rPr>
+                <w:color w:val="auto"/>
+              </w:rPr>
+              <w:t>, exclusive = True))</w:t>
+            </w:r>
+            <w:r>
+              <w:rPr>
+                <w:color w:val="FF0000"/>
+              </w:rPr>
+              <w:t>) and</w:t>
+            </w:r>
+            <w:r>
+              <w:rPr>
+                <w:color w:val="FF0000"/>
+              </w:rPr>
+              <w:t xml:space="preserve"> </w:t>
+            </w:r>
+            <w:r>
+              <w:rPr>
+                <w:color w:val="FF0000"/>
+              </w:rPr>
               <w:t>(</w:t>
             </w:r>
             <w:r>
-              <w:rPr>
-                <w:color w:val="auto"/>
-              </w:rPr>
+              <w:t>not ((type_of_response[</w:t>
+            </w:r>
+            <w:r>
               <w:t>‘</w:t>
             </w:r>
             <w:r>
-              <w:rPr>
-                <w:color w:val="auto"/>
-              </w:rPr>
-              <w:t>stay married</w:t>
-            </w:r>
-            <w:r>
-              <w:rPr>
-                <w:color w:val="auto"/>
-              </w:rPr>
+              <w:t>default</w:t>
+            </w:r>
+            <w:r>
               <w:t>’</w:t>
             </w:r>
             <w:r>
-              <w:rPr>
-                <w:color w:val="auto"/>
-              </w:rPr>
-              <w:t>, exclusive = True))</w:t>
-            </w:r>
-            <w:r>
-              <w:rPr>
-                <w:color w:val="FF0000"/>
-              </w:rPr>
-              <w:t>) and</w:t>
-            </w:r>
-            <w:r>
-              <w:rPr>
-                <w:color w:val="FF0000"/>
-              </w:rPr>
-              <w:t xml:space="preserve"> </w:t>
-            </w:r>
-            <w:r>
-              <w:rPr>
-                <w:color w:val="FF0000"/>
-              </w:rPr>
-              <w:t>(</w:t>
-            </w:r>
-            <w:r>
-              <w:t>not ((type_of_response[</w:t>
+              <w:t xml:space="preserve">] and stage_of_default == </w:t>
             </w:r>
             <w:r>
               <w:t>‘</w:t>
             </w:r>
             <w:r>
+              <w:t>judgment entered</w:t>
+            </w:r>
+            <w:r>
+              <w:t>’</w:t>
+            </w:r>
+            <w:r>
+              <w:t>) or (type_of_response[</w:t>
+            </w:r>
+            <w:r>
+              <w:t>‘</w:t>
+            </w:r>
+            <w:r>
+              <w:t>case in 2 states</w:t>
+            </w:r>
+            <w:r>
+              <w:t>’</w:t>
+            </w:r>
+            <w:r>
+              <w:t xml:space="preserve">] and stage_of_other_case == </w:t>
+            </w:r>
+            <w:r>
+              <w:t>‘</w:t>
+            </w:r>
+            <w:r>
+              <w:t>ended with order</w:t>
+            </w:r>
+            <w:r>
+              <w:t>’</w:t>
+            </w:r>
+            <w:r>
+              <w:t>) or (type_of_response.all_true(</w:t>
+            </w:r>
+            <w:r>
+              <w:t>‘</w:t>
+            </w:r>
+            <w:r>
+              <w:t>wrong state</w:t>
+            </w:r>
+            <w:r>
+              <w:t>’</w:t>
+            </w:r>
+            <w:r>
+              <w:t xml:space="preserve">, </w:t>
+            </w:r>
+            <w:r>
+              <w:t>‘</w:t>
+            </w:r>
+            <w:r>
               <w:t>default</w:t>
             </w:r>
             <w:r>
               <w:t>’</w:t>
             </w:r>
             <w:r>
-              <w:t xml:space="preserve">] and stage_of_default == </w:t>
+              <w:t xml:space="preserve">) and user_need == </w:t>
             </w:r>
             <w:r>
               <w:t>‘</w:t>
             </w:r>
             <w:r>
-              <w:t>judgment entered</w:t>
+              <w:t>answer custody</w:t>
             </w:r>
             <w:r>
               <w:t>’</w:t>
             </w:r>
             <w:r>
-              <w:t>) or (type_of_response[</w:t>
-            </w:r>
-            <w:r>
-              <w:t>‘</w:t>
-            </w:r>
-            <w:r>
-              <w:t>case in 2 states</w:t>
-            </w:r>
-            <w:r>
-              <w:t>’</w:t>
-            </w:r>
-            <w:r>
-              <w:t xml:space="preserve">] and stage_of_other_case == </w:t>
-            </w:r>
-            <w:r>
-              <w:t>‘</w:t>
-            </w:r>
-            <w:r>
-              <w:t>ended with order</w:t>
-            </w:r>
-            <w:r>
-              <w:t>’</w:t>
-            </w:r>
-            <w:r>
-              <w:t>) or (</w:t>
-            </w:r>
-            <w:proofErr w:type="spellStart"/>
-            <w:r>
-              <w:t>type_of_response.all_true</w:t>
-            </w:r>
-            <w:proofErr w:type="spellEnd"/>
-            <w:r>
-              <w:t>(</w:t>
-            </w:r>
-            <w:r>
-              <w:t>‘</w:t>
-            </w:r>
-            <w:r>
-              <w:t>wrong state</w:t>
-            </w:r>
-            <w:r>
-              <w:t>’</w:t>
-            </w:r>
-            <w:r>
-              <w:t xml:space="preserve">, </w:t>
-            </w:r>
-            <w:r>
-              <w:t>‘</w:t>
-            </w:r>
-            <w:r>
-              <w:t>default</w:t>
-            </w:r>
-            <w:r>
-              <w:t>’</w:t>
-            </w:r>
-            <w:r>
-              <w:t xml:space="preserve">) and user_need == </w:t>
-            </w:r>
-            <w:r>
-              <w:t>‘</w:t>
-            </w:r>
-            <w:r>
-              <w:t>answer custody</w:t>
-            </w:r>
-            <w:r>
-              <w:t>’</w:t>
-            </w:r>
-            <w:r>
-              <w:t xml:space="preserve"> and not </w:t>
-            </w:r>
-            <w:r>
-              <w:lastRenderedPageBreak/>
-              <w:t>jurisdiction))</w:t>
+              <w:t xml:space="preserve"> and not jurisdiction))</w:t>
             </w:r>
             <w:r>
               <w:rPr>
@@ -6175,7 +5639,6 @@
               </w:rPr>
               <w:t xml:space="preserve">{{ </w:t>
             </w:r>
-            <w:proofErr w:type="spellStart"/>
             <w:r>
               <w:rPr>
                 <w:rFonts w:eastAsia="Calibri"/>
@@ -6198,14 +5661,7 @@
               <w:rPr>
                 <w:rFonts w:eastAsia="Calibri"/>
               </w:rPr>
-              <w:t>.subject</w:t>
-            </w:r>
-            <w:proofErr w:type="spellEnd"/>
-            <w:r>
-              <w:rPr>
-                <w:rFonts w:eastAsia="Calibri"/>
-              </w:rPr>
-              <w:t xml:space="preserve"> }}</w:t>
+              <w:t>.subject }}</w:t>
             </w:r>
           </w:p>
         </w:tc>
@@ -6335,21 +5791,14 @@
               <w:rPr>
                 <w:color w:val="FF0000"/>
               </w:rPr>
-              <w:t>{%tr if type_of_response.any_true() and not (</w:t>
-            </w:r>
-            <w:proofErr w:type="spellStart"/>
+              <w:t>{%tr if type_of_response.any_true() and not (type_of_response.all_</w:t>
+            </w:r>
             <w:r>
               <w:rPr>
                 <w:color w:val="FF0000"/>
               </w:rPr>
-              <w:t>type_of_response.all_true</w:t>
-            </w:r>
-            <w:proofErr w:type="spellEnd"/>
-            <w:r>
-              <w:rPr>
-                <w:color w:val="FF0000"/>
-              </w:rPr>
-              <w:t>(</w:t>
+              <w:lastRenderedPageBreak/>
+              <w:t>true(</w:t>
             </w:r>
             <w:r>
               <w:rPr>
@@ -6432,7 +5881,6 @@
               </w:rPr>
               <w:t xml:space="preserve">{{ </w:t>
             </w:r>
-            <w:proofErr w:type="spellStart"/>
             <w:r>
               <w:rPr>
                 <w:rFonts w:eastAsia="Calibri"/>
@@ -6443,14 +5891,7 @@
               <w:rPr>
                 <w:rFonts w:eastAsia="Calibri"/>
               </w:rPr>
-              <w:t>.subject</w:t>
-            </w:r>
-            <w:proofErr w:type="spellEnd"/>
-            <w:r>
-              <w:rPr>
-                <w:rFonts w:eastAsia="Calibri"/>
-              </w:rPr>
-              <w:t xml:space="preserve"> }}</w:t>
+              <w:t>.subject }}</w:t>
             </w:r>
           </w:p>
         </w:tc>
@@ -6597,15 +6038,7 @@
               <w:t>’</w:t>
             </w:r>
             <w:r>
-              <w:t xml:space="preserve"> and </w:t>
-            </w:r>
-            <w:proofErr w:type="spellStart"/>
-            <w:r>
-              <w:t>type_of_response.all_true</w:t>
-            </w:r>
-            <w:proofErr w:type="spellEnd"/>
-            <w:r>
-              <w:t>(</w:t>
+              <w:t xml:space="preserve"> and type_of_response.all_true(</w:t>
             </w:r>
             <w:r>
               <w:t>‘</w:t>
@@ -6677,15 +6110,7 @@
               <w:t>’</w:t>
             </w:r>
             <w:r>
-              <w:t xml:space="preserve">) or </w:t>
-            </w:r>
-            <w:proofErr w:type="spellStart"/>
-            <w:r>
-              <w:t>type_of_response.all_false</w:t>
-            </w:r>
-            <w:proofErr w:type="spellEnd"/>
-            <w:r>
-              <w:t>())</w:t>
+              <w:t>) or type_of_response.all_false())</w:t>
             </w:r>
             <w:r>
               <w:rPr>
@@ -6699,19 +6124,11 @@
               </w:rPr>
               <w:t xml:space="preserve"> </w:t>
             </w:r>
-            <w:proofErr w:type="spellStart"/>
             <w:r>
               <w:rPr>
                 <w:color w:val="FF0000"/>
               </w:rPr>
-              <w:t>type_of_response.all_true</w:t>
-            </w:r>
-            <w:proofErr w:type="spellEnd"/>
-            <w:r>
-              <w:rPr>
-                <w:color w:val="FF0000"/>
-              </w:rPr>
-              <w:t>(</w:t>
+              <w:t>type_of_response.all_true(</w:t>
             </w:r>
             <w:r>
               <w:rPr>
@@ -6761,7 +6178,6 @@
             <w:pPr>
               <w:pStyle w:val="Body"/>
             </w:pPr>
-            <w:proofErr w:type="spellStart"/>
             <w:r>
               <w:t>learn_more_about_</w:t>
             </w:r>
@@ -6771,7 +6187,6 @@
             <w:r>
               <w:t>process_step</w:t>
             </w:r>
-            <w:proofErr w:type="spellEnd"/>
           </w:p>
         </w:tc>
       </w:tr>
@@ -6806,10 +6221,8 @@
               <w:rPr>
                 <w:rFonts w:eastAsia="Calibri"/>
               </w:rPr>
-              <w:lastRenderedPageBreak/>
               <w:t xml:space="preserve">{{ </w:t>
             </w:r>
-            <w:proofErr w:type="spellStart"/>
             <w:r>
               <w:rPr>
                 <w:rFonts w:eastAsia="Calibri"/>
@@ -6820,14 +6233,7 @@
               <w:rPr>
                 <w:rFonts w:eastAsia="Calibri"/>
               </w:rPr>
-              <w:t>.subject</w:t>
-            </w:r>
-            <w:proofErr w:type="spellEnd"/>
-            <w:r>
-              <w:rPr>
-                <w:rFonts w:eastAsia="Calibri"/>
-              </w:rPr>
-              <w:t xml:space="preserve"> }}</w:t>
+              <w:t>.subject }}</w:t>
             </w:r>
           </w:p>
         </w:tc>
@@ -6966,11 +6372,9 @@
               <w:pStyle w:val="Body"/>
               <w:spacing w:before="0" w:after="0"/>
             </w:pPr>
-            <w:proofErr w:type="spellStart"/>
             <w:r>
               <w:t>answer_domestic_violence_step</w:t>
             </w:r>
-            <w:proofErr w:type="spellEnd"/>
             <w:r>
               <w:br/>
               <w:t>2026-04-02</w:t>
@@ -7006,7 +6410,11 @@
               </w:rPr>
             </w:pPr>
             <w:r>
-              <w:t>{{ answer_domestic_violence_step.subject }}</w:t>
+              <w:t>{{ answer_domestic_violence_st</w:t>
+            </w:r>
+            <w:r>
+              <w:lastRenderedPageBreak/>
+              <w:t>ep.subject }}</w:t>
             </w:r>
           </w:p>
         </w:tc>
@@ -7036,7 +6444,11 @@
               <w:pStyle w:val="Body"/>
             </w:pPr>
             <w:r>
-              <w:t>{{p (include_docx_template("docassemble.AKA2JBranding:answer_domestic_violence_content.docx")) }}</w:t>
+              <w:t>{{p (include_docx_template("docassemble.AKA2JBranding:answer_dome</w:t>
+            </w:r>
+            <w:r>
+              <w:lastRenderedPageBreak/>
+              <w:t>stic_violence_content.docx")) }}</w:t>
             </w:r>
           </w:p>
         </w:tc>
@@ -7072,6 +6484,7 @@
               <w:rPr>
                 <w:shd w:val="clear" w:color="auto" w:fill="FFFFFF"/>
               </w:rPr>
+              <w:lastRenderedPageBreak/>
               <w:t>{%tr endif %}</w:t>
             </w:r>
           </w:p>
@@ -7189,55 +6602,109 @@
               </w:rPr>
               <w:t>‘</w:t>
             </w:r>
-            <w:proofErr w:type="spellStart"/>
             <w:r>
               <w:rPr>
                 <w:color w:val="FF0000"/>
                 <w:shd w:val="clear" w:color="auto" w:fill="FFFFFF"/>
               </w:rPr>
-              <w:t>ak</w:t>
-            </w:r>
-            <w:proofErr w:type="spellEnd"/>
+              <w:t>ak divorce case</w:t>
+            </w:r>
             <w:r>
               <w:rPr>
                 <w:color w:val="FF0000"/>
                 <w:shd w:val="clear" w:color="auto" w:fill="FFFFFF"/>
               </w:rPr>
-              <w:t xml:space="preserve"> divorce case</w:t>
+              <w:t>’</w:t>
             </w:r>
             <w:r>
               <w:rPr>
                 <w:color w:val="FF0000"/>
                 <w:shd w:val="clear" w:color="auto" w:fill="FFFFFF"/>
               </w:rPr>
-              <w:t>’</w:t>
+              <w:t>] and not type_of_response[</w:t>
             </w:r>
             <w:r>
               <w:rPr>
                 <w:color w:val="FF0000"/>
                 <w:shd w:val="clear" w:color="auto" w:fill="FFFFFF"/>
               </w:rPr>
-              <w:t>] and not type_of_response[</w:t>
+              <w:t>‘</w:t>
             </w:r>
             <w:r>
               <w:rPr>
                 <w:color w:val="FF0000"/>
                 <w:shd w:val="clear" w:color="auto" w:fill="FFFFFF"/>
               </w:rPr>
-              <w:t>‘</w:t>
+              <w:t>improper service</w:t>
             </w:r>
             <w:r>
               <w:rPr>
                 <w:color w:val="FF0000"/>
                 <w:shd w:val="clear" w:color="auto" w:fill="FFFFFF"/>
               </w:rPr>
-              <w:t>improper service</w:t>
+              <w:t>’</w:t>
             </w:r>
             <w:r>
               <w:rPr>
                 <w:color w:val="FF0000"/>
                 <w:shd w:val="clear" w:color="auto" w:fill="FFFFFF"/>
               </w:rPr>
+              <w:t>] and not (</w:t>
+            </w:r>
+            <w:r>
+              <w:rPr>
+                <w:color w:val="FFC000"/>
+                <w:shd w:val="clear" w:color="auto" w:fill="FFFFFF"/>
+              </w:rPr>
+              <w:t>type_of_response[</w:t>
+            </w:r>
+            <w:r>
+              <w:rPr>
+                <w:color w:val="FFC000"/>
+                <w:shd w:val="clear" w:color="auto" w:fill="FFFFFF"/>
+              </w:rPr>
+              <w:t>‘</w:t>
+            </w:r>
+            <w:r>
+              <w:rPr>
+                <w:color w:val="FFC000"/>
+                <w:shd w:val="clear" w:color="auto" w:fill="FFFFFF"/>
+              </w:rPr>
+              <w:t>case in 2 states</w:t>
+            </w:r>
+            <w:r>
+              <w:rPr>
+                <w:color w:val="FFC000"/>
+                <w:shd w:val="clear" w:color="auto" w:fill="FFFFFF"/>
+              </w:rPr>
+              <w:t>’</w:t>
+            </w:r>
+            <w:r>
+              <w:rPr>
+                <w:color w:val="FFC000"/>
+                <w:shd w:val="clear" w:color="auto" w:fill="FFFFFF"/>
+              </w:rPr>
+              <w:t xml:space="preserve">] and stage_of_other_case == </w:t>
+            </w:r>
+            <w:r>
+              <w:rPr>
+                <w:color w:val="FFC000"/>
+                <w:shd w:val="clear" w:color="auto" w:fill="FFFFFF"/>
+              </w:rPr>
+              <w:t>‘</w:t>
+            </w:r>
+            <w:r>
+              <w:rPr>
+                <w:color w:val="FFC000"/>
+                <w:shd w:val="clear" w:color="auto" w:fill="FFFFFF"/>
+              </w:rPr>
+              <w:t>ended with order</w:t>
+            </w:r>
+            <w:r>
+              <w:rPr>
+                <w:color w:val="FFC000"/>
+                <w:shd w:val="clear" w:color="auto" w:fill="FFFFFF"/>
+              </w:rPr>
               <w:t>’</w:t>
             </w:r>
             <w:r>
@@ -7245,7 +6712,7 @@
                 <w:color w:val="FF0000"/>
                 <w:shd w:val="clear" w:color="auto" w:fill="FFFFFF"/>
               </w:rPr>
-              <w:t>] and not (</w:t>
+              <w:t>) and not (</w:t>
             </w:r>
             <w:r>
               <w:rPr>
@@ -7266,7 +6733,7 @@
                 <w:color w:val="FFC000"/>
                 <w:shd w:val="clear" w:color="auto" w:fill="FFFFFF"/>
               </w:rPr>
-              <w:t>case in 2 states</w:t>
+              <w:t>default</w:t>
             </w:r>
             <w:r>
               <w:rPr>
@@ -7280,7 +6747,7 @@
                 <w:color w:val="FFC000"/>
                 <w:shd w:val="clear" w:color="auto" w:fill="FFFFFF"/>
               </w:rPr>
-              <w:t xml:space="preserve">] and stage_of_other_case == </w:t>
+              <w:t xml:space="preserve">] and stage_of_default == </w:t>
             </w:r>
             <w:r>
               <w:rPr>
@@ -7294,7 +6761,7 @@
                 <w:color w:val="FFC000"/>
                 <w:shd w:val="clear" w:color="auto" w:fill="FFFFFF"/>
               </w:rPr>
-              <w:t>ended with order</w:t>
+              <w:t>judgment entered</w:t>
             </w:r>
             <w:r>
               <w:rPr>
@@ -7308,34 +6775,125 @@
                 <w:color w:val="FF0000"/>
                 <w:shd w:val="clear" w:color="auto" w:fill="FFFFFF"/>
               </w:rPr>
-              <w:t>) and not (</w:t>
+              <w:t xml:space="preserve">) and </w:t>
+            </w:r>
+            <w:r>
+              <w:rPr>
+                <w:color w:val="FF0000"/>
+                <w:shd w:val="clear" w:color="auto" w:fill="FFFFFF"/>
+              </w:rPr>
+              <w:t>(</w:t>
             </w:r>
             <w:r>
               <w:rPr>
                 <w:color w:val="FFC000"/>
                 <w:shd w:val="clear" w:color="auto" w:fill="FFFFFF"/>
               </w:rPr>
-              <w:t>type_of_response[</w:t>
+              <w:t>(</w:t>
+            </w:r>
+            <w:r>
+              <w:rPr>
+                <w:color w:val="92D050"/>
+                <w:shd w:val="clear" w:color="auto" w:fill="FFFFFF"/>
+              </w:rPr>
+              <w:t>minor_children an</w:t>
+            </w:r>
+            <w:r>
+              <w:rPr>
+                <w:color w:val="92D050"/>
+                <w:shd w:val="clear" w:color="auto" w:fill="FFFFFF"/>
+              </w:rPr>
+              <w:t>d husban</w:t>
+            </w:r>
+            <w:r>
+              <w:rPr>
+                <w:color w:val="92D050"/>
+                <w:shd w:val="clear" w:color="auto" w:fill="FFFFFF"/>
+              </w:rPr>
+              <w:t>d</w:t>
+            </w:r>
+            <w:r>
+              <w:rPr>
+                <w:color w:val="92D050"/>
+                <w:shd w:val="clear" w:color="auto" w:fill="FFFFFF"/>
+              </w:rPr>
+              <w:t>_not_father</w:t>
             </w:r>
             <w:r>
               <w:rPr>
                 <w:color w:val="FFC000"/>
                 <w:shd w:val="clear" w:color="auto" w:fill="FFFFFF"/>
               </w:rPr>
-              <w:t>‘</w:t>
+              <w:t>)</w:t>
+            </w:r>
+            <w:r>
+              <w:rPr>
+                <w:color w:val="92D050"/>
+                <w:shd w:val="clear" w:color="auto" w:fill="FFFFFF"/>
+              </w:rPr>
+              <w:t xml:space="preserve"> </w:t>
             </w:r>
             <w:r>
               <w:rPr>
                 <w:color w:val="FFC000"/>
                 <w:shd w:val="clear" w:color="auto" w:fill="FFFFFF"/>
               </w:rPr>
-              <w:t>default</w:t>
+              <w:t>or (</w:t>
+            </w:r>
+            <w:r>
+              <w:rPr>
+                <w:color w:val="92D050"/>
+                <w:shd w:val="clear" w:color="auto" w:fill="FFFFFF"/>
+              </w:rPr>
+              <w:t>minor_chil</w:t>
+            </w:r>
+            <w:r>
+              <w:rPr>
+                <w:color w:val="92D050"/>
+                <w:shd w:val="clear" w:color="auto" w:fill="FFFFFF"/>
+              </w:rPr>
+              <w:t>dren and husband_not_father is n</w:t>
+            </w:r>
+            <w:r>
+              <w:rPr>
+                <w:color w:val="92D050"/>
+                <w:shd w:val="clear" w:color="auto" w:fill="FFFFFF"/>
+              </w:rPr>
+              <w:t>one</w:t>
             </w:r>
             <w:r>
               <w:rPr>
                 <w:color w:val="FFC000"/>
                 <w:shd w:val="clear" w:color="auto" w:fill="FFFFFF"/>
               </w:rPr>
+              <w:t>) or (</w:t>
+            </w:r>
+            <w:r>
+              <w:rPr>
+                <w:color w:val="92D050"/>
+                <w:shd w:val="clear" w:color="auto" w:fill="FFFFFF"/>
+              </w:rPr>
+              <w:t xml:space="preserve">minor_children and not husband_not_father and wife_is_pregnant == </w:t>
+            </w:r>
+            <w:r>
+              <w:rPr>
+                <w:color w:val="92D050"/>
+                <w:shd w:val="clear" w:color="auto" w:fill="FFFFFF"/>
+              </w:rPr>
+              <w:t>‘</w:t>
+            </w:r>
+            <w:r>
+              <w:rPr>
+                <w:color w:val="92D050"/>
+                <w:shd w:val="clear" w:color="auto" w:fill="FFFFFF"/>
+              </w:rPr>
+              <w:t>not husband</w:t>
+            </w:r>
+            <w:r>
+              <w:rPr>
+                <w:color w:val="92D050"/>
+                <w:shd w:val="clear" w:color="auto" w:fill="FFFFFF"/>
+              </w:rPr>
               <w:t>’</w:t>
             </w:r>
             <w:r>
@@ -7343,176 +6901,14 @@
                 <w:color w:val="FFC000"/>
                 <w:shd w:val="clear" w:color="auto" w:fill="FFFFFF"/>
               </w:rPr>
-              <w:t xml:space="preserve">] and stage_of_default == </w:t>
-            </w:r>
-            <w:r>
-              <w:rPr>
-                <w:color w:val="FFC000"/>
-                <w:shd w:val="clear" w:color="auto" w:fill="FFFFFF"/>
-              </w:rPr>
-              <w:t>‘</w:t>
-            </w:r>
-            <w:r>
-              <w:rPr>
-                <w:color w:val="FFC000"/>
-                <w:shd w:val="clear" w:color="auto" w:fill="FFFFFF"/>
-              </w:rPr>
-              <w:t>judgment entered</w:t>
-            </w:r>
-            <w:r>
-              <w:rPr>
-                <w:color w:val="FFC000"/>
-                <w:shd w:val="clear" w:color="auto" w:fill="FFFFFF"/>
-              </w:rPr>
-              <w:t>’</w:t>
-            </w:r>
-            <w:r>
-              <w:rPr>
-                <w:color w:val="FF0000"/>
-                <w:shd w:val="clear" w:color="auto" w:fill="FFFFFF"/>
-              </w:rPr>
-              <w:t xml:space="preserve">) and </w:t>
-            </w:r>
-            <w:r>
-              <w:rPr>
-                <w:color w:val="FF0000"/>
-                <w:shd w:val="clear" w:color="auto" w:fill="FFFFFF"/>
-              </w:rPr>
-              <w:t>(</w:t>
-            </w:r>
-            <w:r>
-              <w:rPr>
-                <w:color w:val="FFC000"/>
-                <w:shd w:val="clear" w:color="auto" w:fill="FFFFFF"/>
-              </w:rPr>
-              <w:t>(</w:t>
+              <w:t>) or (</w:t>
             </w:r>
             <w:r>
               <w:rPr>
                 <w:color w:val="92D050"/>
                 <w:shd w:val="clear" w:color="auto" w:fill="FFFFFF"/>
               </w:rPr>
-              <w:t>minor_children an</w:t>
-            </w:r>
-            <w:r>
-              <w:rPr>
-                <w:color w:val="92D050"/>
-                <w:shd w:val="clear" w:color="auto" w:fill="FFFFFF"/>
-              </w:rPr>
-              <w:t>d husban</w:t>
-            </w:r>
-            <w:r>
-              <w:rPr>
-                <w:color w:val="92D050"/>
-                <w:shd w:val="clear" w:color="auto" w:fill="FFFFFF"/>
-              </w:rPr>
-              <w:t>d</w:t>
-            </w:r>
-            <w:r>
-              <w:rPr>
-                <w:color w:val="92D050"/>
-                <w:shd w:val="clear" w:color="auto" w:fill="FFFFFF"/>
-              </w:rPr>
-              <w:t>_not_father</w:t>
-            </w:r>
-            <w:r>
-              <w:rPr>
-                <w:color w:val="FFC000"/>
-                <w:shd w:val="clear" w:color="auto" w:fill="FFFFFF"/>
-              </w:rPr>
-              <w:t>)</w:t>
-            </w:r>
-            <w:r>
-              <w:rPr>
-                <w:color w:val="92D050"/>
-                <w:shd w:val="clear" w:color="auto" w:fill="FFFFFF"/>
-              </w:rPr>
-              <w:t xml:space="preserve"> </w:t>
-            </w:r>
-            <w:r>
-              <w:rPr>
-                <w:color w:val="FFC000"/>
-                <w:shd w:val="clear" w:color="auto" w:fill="FFFFFF"/>
-              </w:rPr>
-              <w:t>or (</w:t>
-            </w:r>
-            <w:r>
-              <w:rPr>
-                <w:color w:val="92D050"/>
-                <w:shd w:val="clear" w:color="auto" w:fill="FFFFFF"/>
-              </w:rPr>
-              <w:t>minor_chil</w:t>
-            </w:r>
-            <w:r>
-              <w:rPr>
-                <w:color w:val="92D050"/>
-                <w:shd w:val="clear" w:color="auto" w:fill="FFFFFF"/>
-              </w:rPr>
-              <w:t>dren and husband_not_father is n</w:t>
-            </w:r>
-            <w:r>
-              <w:rPr>
-                <w:color w:val="92D050"/>
-                <w:shd w:val="clear" w:color="auto" w:fill="FFFFFF"/>
-              </w:rPr>
-              <w:t>one</w:t>
-            </w:r>
-            <w:r>
-              <w:rPr>
-                <w:color w:val="FFC000"/>
-                <w:shd w:val="clear" w:color="auto" w:fill="FFFFFF"/>
-              </w:rPr>
-              <w:t>) or (</w:t>
-            </w:r>
-            <w:r>
-              <w:rPr>
-                <w:color w:val="92D050"/>
-                <w:shd w:val="clear" w:color="auto" w:fill="FFFFFF"/>
-              </w:rPr>
-              <w:t xml:space="preserve">minor_children and not husband_not_father and wife_is_pregnant == </w:t>
-            </w:r>
-            <w:r>
-              <w:rPr>
-                <w:color w:val="92D050"/>
-                <w:shd w:val="clear" w:color="auto" w:fill="FFFFFF"/>
-              </w:rPr>
-              <w:t>‘</w:t>
-            </w:r>
-            <w:r>
-              <w:rPr>
-                <w:color w:val="92D050"/>
-                <w:shd w:val="clear" w:color="auto" w:fill="FFFFFF"/>
-              </w:rPr>
-              <w:t>not husband</w:t>
-            </w:r>
-            <w:r>
-              <w:rPr>
-                <w:color w:val="92D050"/>
-                <w:shd w:val="clear" w:color="auto" w:fill="FFFFFF"/>
-              </w:rPr>
-              <w:t>’</w:t>
-            </w:r>
-            <w:r>
-              <w:rPr>
-                <w:color w:val="FFC000"/>
-                <w:shd w:val="clear" w:color="auto" w:fill="FFFFFF"/>
-              </w:rPr>
-              <w:t>) or (</w:t>
-            </w:r>
-            <w:r>
-              <w:rPr>
-                <w:color w:val="92D050"/>
-                <w:shd w:val="clear" w:color="auto" w:fill="FFFFFF"/>
-              </w:rPr>
-              <w:t xml:space="preserve">not minor_children and wife_is_pregnant </w:t>
-            </w:r>
-            <w:r>
-              <w:rPr>
-                <w:color w:val="92D050"/>
-                <w:shd w:val="clear" w:color="auto" w:fill="FFFFFF"/>
-              </w:rPr>
-              <w:lastRenderedPageBreak/>
-              <w:t xml:space="preserve">== </w:t>
+              <w:t xml:space="preserve">not minor_children and wife_is_pregnant == </w:t>
             </w:r>
             <w:r>
               <w:rPr>
@@ -7571,12 +6967,9 @@
               <w:pStyle w:val="Body"/>
               <w:spacing w:before="0" w:after="0"/>
             </w:pPr>
-            <w:proofErr w:type="spellStart"/>
-            <w:r>
-              <w:lastRenderedPageBreak/>
+            <w:r>
               <w:t>paternity_step</w:t>
             </w:r>
-            <w:proofErr w:type="spellEnd"/>
           </w:p>
         </w:tc>
       </w:tr>
@@ -7775,12 +7168,7 @@
       </w:pPr>
     </w:p>
     <w:sectPr>
-      <w:headerReference w:type="even" r:id="rId8"/>
-      <w:headerReference w:type="default" r:id="rId9"/>
-      <w:footerReference w:type="even" r:id="rId10"/>
-      <w:footerReference w:type="default" r:id="rId11"/>
-      <w:headerReference w:type="first" r:id="rId12"/>
-      <w:footerReference w:type="first" r:id="rId13"/>
+      <w:footerReference w:type="default" r:id="rId8"/>
       <w:pgSz w:w="12240" w:h="15840"/>
       <w:pgMar w:top="245" w:right="1440" w:bottom="274" w:left="1440" w:header="0" w:footer="720" w:gutter="0"/>
       <w:cols w:space="720"/>
@@ -7818,16 +7206,6 @@
 </file>
 
 <file path=word/footer1.xml><?xml version="1.0" encoding="utf-8"?>
-<w:ftr xmlns:wpc="http://schemas.microsoft.com/office/word/2010/wordprocessingCanvas" xmlns:cx="http://schemas.microsoft.com/office/drawing/2014/chartex" xmlns:cx1="http://schemas.microsoft.com/office/drawing/2015/9/8/chartex" xmlns:cx2="http://schemas.microsoft.com/office/drawing/2015/10/21/chartex" xmlns:cx3="http://schemas.microsoft.com/office/drawing/2016/5/9/chartex" xmlns:cx4="http://schemas.microsoft.com/office/drawing/2016/5/10/chartex" xmlns:cx5="http://schemas.microsoft.com/office/drawing/2016/5/11/chartex" xmlns:cx6="http://schemas.microsoft.com/office/drawing/2016/5/12/chartex" xmlns:cx7="http://schemas.microsoft.com/office/drawing/2016/5/13/chartex" xmlns:cx8="http://schemas.microsoft.com/office/drawing/2016/5/14/chartex" xmlns:mc="http://schemas.openxmlformats.org/markup-compatibility/2006" xmlns:aink="http://schemas.microsoft.com/office/drawing/2016/ink" xmlns:am3d="http://schemas.microsoft.com/office/drawing/2017/model3d" xmlns:o="urn:schemas-microsoft-com:office:office" xmlns:r="http://schemas.openxmlformats.org/officeDocument/2006/relationships" xmlns:m="http://schemas.openxmlformats.org/officeDocument/2006/math" xmlns:v="urn:schemas-microsoft-com:vml" xmlns:wp14="http://schemas.microsoft.com/office/word/2010/wordprocessingDrawing" xmlns:wp="http://schemas.openxmlformats.org/drawingml/2006/wordprocessingDrawing" xmlns:w10="urn:schemas-microsoft-com:office:word" xmlns:w="http://schemas.openxmlformats.org/wordprocessingml/2006/main" xmlns:w14="http://schemas.microsoft.com/office/word/2010/wordml" xmlns:w15="http://schemas.microsoft.com/office/word/2012/wordml" xmlns:w16cex="http://schemas.microsoft.com/office/word/2018/wordml/cex" xmlns:w16cid="http://schemas.microsoft.com/office/word/2016/wordml/cid" xmlns:w16="http://schemas.microsoft.com/office/word/2018/wordml" xmlns:w16sdtdh="http://schemas.microsoft.com/office/word/2020/wordml/sdtdatahash" xmlns:w16se="http://schemas.microsoft.com/office/word/2015/wordml/symex" xmlns:wpg="http://schemas.microsoft.com/office/word/2010/wordprocessingGroup" xmlns:wpi="http://schemas.microsoft.com/office/word/2010/wordprocessingInk" xmlns:wne="http://schemas.microsoft.com/office/word/2006/wordml" xmlns:wps="http://schemas.microsoft.com/office/word/2010/wordprocessingShape" mc:Ignorable="w14 w15 w16se w16cid w16 w16cex w16sdtdh wp14">
-  <w:p>
-    <w:pPr>
-      <w:pStyle w:val="Footer"/>
-    </w:pPr>
-  </w:p>
-</w:ftr>
-</file>
-
-<file path=word/footer2.xml><?xml version="1.0" encoding="utf-8"?>
 <w:ftr xmlns:wpc="http://schemas.microsoft.com/office/word/2010/wordprocessingCanvas" xmlns:cx="http://schemas.microsoft.com/office/drawing/2014/chartex" xmlns:cx1="http://schemas.microsoft.com/office/drawing/2015/9/8/chartex" xmlns:cx2="http://schemas.microsoft.com/office/drawing/2015/10/21/chartex" xmlns:cx3="http://schemas.microsoft.com/office/drawing/2016/5/9/chartex" xmlns:cx4="http://schemas.microsoft.com/office/drawing/2016/5/10/chartex" xmlns:cx5="http://schemas.microsoft.com/office/drawing/2016/5/11/chartex" xmlns:cx6="http://schemas.microsoft.com/office/drawing/2016/5/12/chartex" xmlns:cx7="http://schemas.microsoft.com/office/drawing/2016/5/13/chartex" xmlns:cx8="http://schemas.microsoft.com/office/drawing/2016/5/14/chartex" xmlns:mc="http://schemas.openxmlformats.org/markup-compatibility/2006" xmlns:aink="http://schemas.microsoft.com/office/drawing/2016/ink" xmlns:am3d="http://schemas.microsoft.com/office/drawing/2017/model3d" xmlns:o="urn:schemas-microsoft-com:office:office" xmlns:r="http://schemas.openxmlformats.org/officeDocument/2006/relationships" xmlns:m="http://schemas.openxmlformats.org/officeDocument/2006/math" xmlns:v="urn:schemas-microsoft-com:vml" xmlns:wp14="http://schemas.microsoft.com/office/word/2010/wordprocessingDrawing" xmlns:wp="http://schemas.openxmlformats.org/drawingml/2006/wordprocessingDrawing" xmlns:w10="urn:schemas-microsoft-com:office:word" xmlns:w="http://schemas.openxmlformats.org/wordprocessingml/2006/main" xmlns:w14="http://schemas.microsoft.com/office/word/2010/wordml" xmlns:w15="http://schemas.microsoft.com/office/word/2012/wordml" xmlns:w16cex="http://schemas.microsoft.com/office/word/2018/wordml/cex" xmlns:w16cid="http://schemas.microsoft.com/office/word/2016/wordml/cid" xmlns:w16="http://schemas.microsoft.com/office/word/2018/wordml" xmlns:w16sdtdh="http://schemas.microsoft.com/office/word/2020/wordml/sdtdatahash" xmlns:w16se="http://schemas.microsoft.com/office/word/2015/wordml/symex" xmlns:wpg="http://schemas.microsoft.com/office/word/2010/wordprocessingGroup" xmlns:wpi="http://schemas.microsoft.com/office/word/2010/wordprocessingInk" xmlns:wne="http://schemas.microsoft.com/office/word/2006/wordml" xmlns:wps="http://schemas.microsoft.com/office/word/2010/wordprocessingShape" mc:Ignorable="w14 w15 w16se w16cid w16 w16cex w16sdtdh wp14">
   <w:p>
     <w:pPr>
@@ -7887,21 +7265,11 @@
       <w:t xml:space="preserve">May </w:t>
     </w:r>
     <w:r>
-      <w:t>8</w:t>
+      <w:t>9</w:t>
     </w:r>
     <w:r>
       <w:t>, 2026</w:t>
     </w:r>
-  </w:p>
-</w:ftr>
-</file>
-
-<file path=word/footer3.xml><?xml version="1.0" encoding="utf-8"?>
-<w:ftr xmlns:wpc="http://schemas.microsoft.com/office/word/2010/wordprocessingCanvas" xmlns:cx="http://schemas.microsoft.com/office/drawing/2014/chartex" xmlns:cx1="http://schemas.microsoft.com/office/drawing/2015/9/8/chartex" xmlns:cx2="http://schemas.microsoft.com/office/drawing/2015/10/21/chartex" xmlns:cx3="http://schemas.microsoft.com/office/drawing/2016/5/9/chartex" xmlns:cx4="http://schemas.microsoft.com/office/drawing/2016/5/10/chartex" xmlns:cx5="http://schemas.microsoft.com/office/drawing/2016/5/11/chartex" xmlns:cx6="http://schemas.microsoft.com/office/drawing/2016/5/12/chartex" xmlns:cx7="http://schemas.microsoft.com/office/drawing/2016/5/13/chartex" xmlns:cx8="http://schemas.microsoft.com/office/drawing/2016/5/14/chartex" xmlns:mc="http://schemas.openxmlformats.org/markup-compatibility/2006" xmlns:aink="http://schemas.microsoft.com/office/drawing/2016/ink" xmlns:am3d="http://schemas.microsoft.com/office/drawing/2017/model3d" xmlns:o="urn:schemas-microsoft-com:office:office" xmlns:r="http://schemas.openxmlformats.org/officeDocument/2006/relationships" xmlns:m="http://schemas.openxmlformats.org/officeDocument/2006/math" xmlns:v="urn:schemas-microsoft-com:vml" xmlns:wp14="http://schemas.microsoft.com/office/word/2010/wordprocessingDrawing" xmlns:wp="http://schemas.openxmlformats.org/drawingml/2006/wordprocessingDrawing" xmlns:w10="urn:schemas-microsoft-com:office:word" xmlns:w="http://schemas.openxmlformats.org/wordprocessingml/2006/main" xmlns:w14="http://schemas.microsoft.com/office/word/2010/wordml" xmlns:w15="http://schemas.microsoft.com/office/word/2012/wordml" xmlns:w16cex="http://schemas.microsoft.com/office/word/2018/wordml/cex" xmlns:w16cid="http://schemas.microsoft.com/office/word/2016/wordml/cid" xmlns:w16="http://schemas.microsoft.com/office/word/2018/wordml" xmlns:w16sdtdh="http://schemas.microsoft.com/office/word/2020/wordml/sdtdatahash" xmlns:w16se="http://schemas.microsoft.com/office/word/2015/wordml/symex" xmlns:wpg="http://schemas.microsoft.com/office/word/2010/wordprocessingGroup" xmlns:wpi="http://schemas.microsoft.com/office/word/2010/wordprocessingInk" xmlns:wne="http://schemas.microsoft.com/office/word/2006/wordml" xmlns:wps="http://schemas.microsoft.com/office/word/2010/wordprocessingShape" mc:Ignorable="w14 w15 w16se w16cid w16 w16cex w16sdtdh wp14">
-  <w:p>
-    <w:pPr>
-      <w:pStyle w:val="Footer"/>
-    </w:pPr>
   </w:p>
 </w:ftr>
 </file>
@@ -7930,36 +7298,6 @@
     </w:p>
   </w:footnote>
 </w:footnotes>
-</file>
-
-<file path=word/header1.xml><?xml version="1.0" encoding="utf-8"?>
-<w:hdr xmlns:wpc="http://schemas.microsoft.com/office/word/2010/wordprocessingCanvas" xmlns:cx="http://schemas.microsoft.com/office/drawing/2014/chartex" xmlns:cx1="http://schemas.microsoft.com/office/drawing/2015/9/8/chartex" xmlns:cx2="http://schemas.microsoft.com/office/drawing/2015/10/21/chartex" xmlns:cx3="http://schemas.microsoft.com/office/drawing/2016/5/9/chartex" xmlns:cx4="http://schemas.microsoft.com/office/drawing/2016/5/10/chartex" xmlns:cx5="http://schemas.microsoft.com/office/drawing/2016/5/11/chartex" xmlns:cx6="http://schemas.microsoft.com/office/drawing/2016/5/12/chartex" xmlns:cx7="http://schemas.microsoft.com/office/drawing/2016/5/13/chartex" xmlns:cx8="http://schemas.microsoft.com/office/drawing/2016/5/14/chartex" xmlns:mc="http://schemas.openxmlformats.org/markup-compatibility/2006" xmlns:aink="http://schemas.microsoft.com/office/drawing/2016/ink" xmlns:am3d="http://schemas.microsoft.com/office/drawing/2017/model3d" xmlns:o="urn:schemas-microsoft-com:office:office" xmlns:r="http://schemas.openxmlformats.org/officeDocument/2006/relationships" xmlns:m="http://schemas.openxmlformats.org/officeDocument/2006/math" xmlns:v="urn:schemas-microsoft-com:vml" xmlns:wp14="http://schemas.microsoft.com/office/word/2010/wordprocessingDrawing" xmlns:wp="http://schemas.openxmlformats.org/drawingml/2006/wordprocessingDrawing" xmlns:w10="urn:schemas-microsoft-com:office:word" xmlns:w="http://schemas.openxmlformats.org/wordprocessingml/2006/main" xmlns:w14="http://schemas.microsoft.com/office/word/2010/wordml" xmlns:w15="http://schemas.microsoft.com/office/word/2012/wordml" xmlns:w16cex="http://schemas.microsoft.com/office/word/2018/wordml/cex" xmlns:w16cid="http://schemas.microsoft.com/office/word/2016/wordml/cid" xmlns:w16="http://schemas.microsoft.com/office/word/2018/wordml" xmlns:w16sdtdh="http://schemas.microsoft.com/office/word/2020/wordml/sdtdatahash" xmlns:w16se="http://schemas.microsoft.com/office/word/2015/wordml/symex" xmlns:wpg="http://schemas.microsoft.com/office/word/2010/wordprocessingGroup" xmlns:wpi="http://schemas.microsoft.com/office/word/2010/wordprocessingInk" xmlns:wne="http://schemas.microsoft.com/office/word/2006/wordml" xmlns:wps="http://schemas.microsoft.com/office/word/2010/wordprocessingShape" mc:Ignorable="w14 w15 w16se w16cid w16 w16cex w16sdtdh wp14">
-  <w:p>
-    <w:pPr>
-      <w:pStyle w:val="Header"/>
-    </w:pPr>
-  </w:p>
-</w:hdr>
-</file>
-
-<file path=word/header2.xml><?xml version="1.0" encoding="utf-8"?>
-<w:hdr xmlns:wpc="http://schemas.microsoft.com/office/word/2010/wordprocessingCanvas" xmlns:cx="http://schemas.microsoft.com/office/drawing/2014/chartex" xmlns:cx1="http://schemas.microsoft.com/office/drawing/2015/9/8/chartex" xmlns:cx2="http://schemas.microsoft.com/office/drawing/2015/10/21/chartex" xmlns:cx3="http://schemas.microsoft.com/office/drawing/2016/5/9/chartex" xmlns:cx4="http://schemas.microsoft.com/office/drawing/2016/5/10/chartex" xmlns:cx5="http://schemas.microsoft.com/office/drawing/2016/5/11/chartex" xmlns:cx6="http://schemas.microsoft.com/office/drawing/2016/5/12/chartex" xmlns:cx7="http://schemas.microsoft.com/office/drawing/2016/5/13/chartex" xmlns:cx8="http://schemas.microsoft.com/office/drawing/2016/5/14/chartex" xmlns:mc="http://schemas.openxmlformats.org/markup-compatibility/2006" xmlns:aink="http://schemas.microsoft.com/office/drawing/2016/ink" xmlns:am3d="http://schemas.microsoft.com/office/drawing/2017/model3d" xmlns:o="urn:schemas-microsoft-com:office:office" xmlns:r="http://schemas.openxmlformats.org/officeDocument/2006/relationships" xmlns:m="http://schemas.openxmlformats.org/officeDocument/2006/math" xmlns:v="urn:schemas-microsoft-com:vml" xmlns:wp14="http://schemas.microsoft.com/office/word/2010/wordprocessingDrawing" xmlns:wp="http://schemas.openxmlformats.org/drawingml/2006/wordprocessingDrawing" xmlns:w10="urn:schemas-microsoft-com:office:word" xmlns:w="http://schemas.openxmlformats.org/wordprocessingml/2006/main" xmlns:w14="http://schemas.microsoft.com/office/word/2010/wordml" xmlns:w15="http://schemas.microsoft.com/office/word/2012/wordml" xmlns:w16cex="http://schemas.microsoft.com/office/word/2018/wordml/cex" xmlns:w16cid="http://schemas.microsoft.com/office/word/2016/wordml/cid" xmlns:w16="http://schemas.microsoft.com/office/word/2018/wordml" xmlns:w16sdtdh="http://schemas.microsoft.com/office/word/2020/wordml/sdtdatahash" xmlns:w16se="http://schemas.microsoft.com/office/word/2015/wordml/symex" xmlns:wpg="http://schemas.microsoft.com/office/word/2010/wordprocessingGroup" xmlns:wpi="http://schemas.microsoft.com/office/word/2010/wordprocessingInk" xmlns:wne="http://schemas.microsoft.com/office/word/2006/wordml" xmlns:wps="http://schemas.microsoft.com/office/word/2010/wordprocessingShape" mc:Ignorable="w14 w15 w16se w16cid w16 w16cex w16sdtdh wp14">
-  <w:p>
-    <w:pPr>
-      <w:pStyle w:val="Header"/>
-    </w:pPr>
-  </w:p>
-</w:hdr>
-</file>
-
-<file path=word/header3.xml><?xml version="1.0" encoding="utf-8"?>
-<w:hdr xmlns:wpc="http://schemas.microsoft.com/office/word/2010/wordprocessingCanvas" xmlns:cx="http://schemas.microsoft.com/office/drawing/2014/chartex" xmlns:cx1="http://schemas.microsoft.com/office/drawing/2015/9/8/chartex" xmlns:cx2="http://schemas.microsoft.com/office/drawing/2015/10/21/chartex" xmlns:cx3="http://schemas.microsoft.com/office/drawing/2016/5/9/chartex" xmlns:cx4="http://schemas.microsoft.com/office/drawing/2016/5/10/chartex" xmlns:cx5="http://schemas.microsoft.com/office/drawing/2016/5/11/chartex" xmlns:cx6="http://schemas.microsoft.com/office/drawing/2016/5/12/chartex" xmlns:cx7="http://schemas.microsoft.com/office/drawing/2016/5/13/chartex" xmlns:cx8="http://schemas.microsoft.com/office/drawing/2016/5/14/chartex" xmlns:mc="http://schemas.openxmlformats.org/markup-compatibility/2006" xmlns:aink="http://schemas.microsoft.com/office/drawing/2016/ink" xmlns:am3d="http://schemas.microsoft.com/office/drawing/2017/model3d" xmlns:o="urn:schemas-microsoft-com:office:office" xmlns:r="http://schemas.openxmlformats.org/officeDocument/2006/relationships" xmlns:m="http://schemas.openxmlformats.org/officeDocument/2006/math" xmlns:v="urn:schemas-microsoft-com:vml" xmlns:wp14="http://schemas.microsoft.com/office/word/2010/wordprocessingDrawing" xmlns:wp="http://schemas.openxmlformats.org/drawingml/2006/wordprocessingDrawing" xmlns:w10="urn:schemas-microsoft-com:office:word" xmlns:w="http://schemas.openxmlformats.org/wordprocessingml/2006/main" xmlns:w14="http://schemas.microsoft.com/office/word/2010/wordml" xmlns:w15="http://schemas.microsoft.com/office/word/2012/wordml" xmlns:w16cex="http://schemas.microsoft.com/office/word/2018/wordml/cex" xmlns:w16cid="http://schemas.microsoft.com/office/word/2016/wordml/cid" xmlns:w16="http://schemas.microsoft.com/office/word/2018/wordml" xmlns:w16sdtdh="http://schemas.microsoft.com/office/word/2020/wordml/sdtdatahash" xmlns:w16se="http://schemas.microsoft.com/office/word/2015/wordml/symex" xmlns:wpg="http://schemas.microsoft.com/office/word/2010/wordprocessingGroup" xmlns:wpi="http://schemas.microsoft.com/office/word/2010/wordprocessingInk" xmlns:wne="http://schemas.microsoft.com/office/word/2006/wordml" xmlns:wps="http://schemas.microsoft.com/office/word/2010/wordprocessingShape" mc:Ignorable="w14 w15 w16se w16cid w16 w16cex w16sdtdh wp14">
-  <w:p>
-    <w:pPr>
-      <w:pStyle w:val="Header"/>
-    </w:pPr>
-  </w:p>
-</w:hdr>
 </file>
 
 <file path=word/numbering.xml><?xml version="1.0" encoding="utf-8"?>

</xml_diff>